<commit_message>
o Highlight duplicate client number in red o Book Time dialog loads faster for user that doesn’t have authority to book time for other users
</commit_message>
<xml_diff>
--- a/BluePrints/Views/ChangeLog.docx
+++ b/BluePrints/Views/ChangeLog.docx
@@ -12,7 +12,115 @@
         <w:rPr>
           <w:lang w:val="en-US"/>
         </w:rPr>
+        <w:t>Change Log 26</w:t>
+      </w:r>
+      <w:r>
+        <w:rPr>
+          <w:vertAlign w:val="superscript"/>
+          <w:lang w:val="en-US"/>
+        </w:rPr>
+        <w:t>th</w:t>
+      </w:r>
+      <w:r>
+        <w:rPr>
+          <w:lang w:val="en-US"/>
+        </w:rPr>
+        <w:t xml:space="preserve"> June 2020</w:t>
+      </w:r>
+    </w:p>
+    <w:p>
+      <w:pPr>
+        <w:pStyle w:val="ListParagraph"/>
+        <w:numPr>
+          <w:ilvl w:val="0"/>
+          <w:numId w:val="5"/>
+        </w:numPr>
+        <w:rPr>
+          <w:lang w:val="en-US"/>
+        </w:rPr>
+      </w:pPr>
+      <w:r>
+        <w:rPr>
+          <w:lang w:val="en-US"/>
+        </w:rPr>
+        <w:t>Design -&gt; Deliverables</w:t>
+      </w:r>
+    </w:p>
+    <w:p>
+      <w:pPr>
+        <w:pStyle w:val="ListParagraph"/>
+        <w:numPr>
+          <w:ilvl w:val="1"/>
+          <w:numId w:val="5"/>
+        </w:numPr>
+        <w:rPr>
+          <w:lang w:val="en-US"/>
+        </w:rPr>
+      </w:pPr>
+      <w:r>
+        <w:rPr>
+          <w:lang w:val="en-US"/>
+        </w:rPr>
+        <w:t>Highlight duplicate client number in red</w:t>
+      </w:r>
+    </w:p>
+    <w:p>
+      <w:pPr>
+        <w:pStyle w:val="ListParagraph"/>
+        <w:numPr>
+          <w:ilvl w:val="1"/>
+          <w:numId w:val="5"/>
+        </w:numPr>
+        <w:rPr>
+          <w:lang w:val="en-US"/>
+        </w:rPr>
+      </w:pPr>
+      <w:r>
+        <w:rPr>
+          <w:lang w:val="en-US"/>
+        </w:rPr>
+        <w:t>Book Time dialog loads faster for user that doesn’t have authority to book time for other users</w:t>
+      </w:r>
+    </w:p>
+    <w:p>
+      <w:pPr>
+        <w:pStyle w:val="ListParagraph"/>
+        <w:ind w:left="1440"/>
+        <w:rPr>
+          <w:lang w:val="en-US"/>
+        </w:rPr>
+      </w:pPr>
+    </w:p>
+    <w:p>
+      <w:pPr>
+        <w:rPr>
+          <w:lang w:val="en-US"/>
+        </w:rPr>
+      </w:pPr>
+      <w:r>
+        <w:rPr>
+          <w:lang w:val="en-US"/>
+        </w:rPr>
         <w:t>Change Log</w:t>
+      </w:r>
+      <w:r>
+        <w:rPr>
+          <w:lang w:val="en-US"/>
+        </w:rPr>
+        <w:t xml:space="preserve"> 25</w:t>
+      </w:r>
+      <w:r>
+        <w:rPr>
+          <w:vertAlign w:val="superscript"/>
+          <w:lang w:val="en-US"/>
+        </w:rPr>
+        <w:t>th</w:t>
+      </w:r>
+      <w:r>
+        <w:rPr>
+          <w:lang w:val="en-US"/>
+        </w:rPr>
+        <w:t xml:space="preserve"> June 2020</w:t>
       </w:r>
     </w:p>
     <w:p>
@@ -30,7 +138,7 @@
         <w:rPr>
           <w:lang w:val="en-US"/>
         </w:rPr>
-        <w:t>Indirect Forecast</w:t>
+        <w:t>Forecast</w:t>
       </w:r>
     </w:p>
     <w:p>
@@ -48,22 +156,53 @@
         <w:rPr>
           <w:lang w:val="en-US"/>
         </w:rPr>
-        <w:t xml:space="preserve">Fixed an issue with copy paste new entries </w:t>
+        <w:t>Uncommitted values can only be entered on procurement jobs</w:t>
       </w:r>
-      <w:proofErr w:type="gramStart"/>
+    </w:p>
+    <w:p>
+      <w:pPr>
+        <w:pStyle w:val="ListParagraph"/>
+        <w:numPr>
+          <w:ilvl w:val="1"/>
+          <w:numId w:val="4"/>
+        </w:numPr>
+        <w:rPr>
+          <w:lang w:val="en-US"/>
+        </w:rPr>
+      </w:pPr>
       <w:r>
         <w:rPr>
           <w:lang w:val="en-US"/>
         </w:rPr>
-        <w:t>doesn’t</w:t>
+        <w:t>Pasting uncommitted values on non-procurement jobs will show no results</w:t>
       </w:r>
-      <w:proofErr w:type="gramEnd"/>
-      <w:r>
-        <w:rPr>
-          <w:lang w:val="en-US"/>
-        </w:rPr>
-        <w:t xml:space="preserve"> commit to database</w:t>
-      </w:r>
+    </w:p>
+    <w:p>
+      <w:pPr>
+        <w:pStyle w:val="ListParagraph"/>
+        <w:ind w:left="1440"/>
+        <w:rPr>
+          <w:lang w:val="en-US"/>
+        </w:rPr>
+      </w:pPr>
+    </w:p>
+    <w:p>
+      <w:pPr>
+        <w:pStyle w:val="ListParagraph"/>
+        <w:ind w:left="1440"/>
+        <w:rPr>
+          <w:lang w:val="en-US"/>
+        </w:rPr>
+      </w:pPr>
+      <w:hyperlink r:id="rId5" w:history="1">
+        <w:r>
+          <w:rPr>
+            <w:rStyle w:val="Hyperlink"/>
+            <w:lang w:val="en-US"/>
+          </w:rPr>
+          <w:t>Test Case Clip</w:t>
+        </w:r>
+      </w:hyperlink>
     </w:p>
     <w:sectPr>
       <w:pgSz w:w="11906" w:h="16838"/>
@@ -500,6 +639,118 @@
       </w:rPr>
     </w:lvl>
   </w:abstractNum>
+  <w:abstractNum w:abstractNumId="4" w15:restartNumberingAfterBreak="0">
+    <w:nsid w:val="5C8347BF"/>
+    <w:multiLevelType w:val="hybridMultilevel"/>
+    <w:tmpl w:val="D2F46B88"/>
+    <w:lvl w:ilvl="0" w:tplc="FE6AB762">
+      <w:numFmt w:val="bullet"/>
+      <w:lvlText w:val="-"/>
+      <w:lvlJc w:val="left"/>
+      <w:pPr>
+        <w:ind w:left="720" w:hanging="360"/>
+      </w:pPr>
+      <w:rPr>
+        <w:rFonts w:ascii="Calibri" w:eastAsiaTheme="minorEastAsia" w:hAnsi="Calibri" w:cs="Calibri" w:hint="default"/>
+      </w:rPr>
+    </w:lvl>
+    <w:lvl w:ilvl="1" w:tplc="44090003">
+      <w:start w:val="1"/>
+      <w:numFmt w:val="bullet"/>
+      <w:lvlText w:val="o"/>
+      <w:lvlJc w:val="left"/>
+      <w:pPr>
+        <w:ind w:left="1440" w:hanging="360"/>
+      </w:pPr>
+      <w:rPr>
+        <w:rFonts w:ascii="Courier New" w:hAnsi="Courier New" w:cs="Courier New" w:hint="default"/>
+      </w:rPr>
+    </w:lvl>
+    <w:lvl w:ilvl="2" w:tplc="44090005" w:tentative="1">
+      <w:start w:val="1"/>
+      <w:numFmt w:val="bullet"/>
+      <w:lvlText w:val=""/>
+      <w:lvlJc w:val="left"/>
+      <w:pPr>
+        <w:ind w:left="2160" w:hanging="360"/>
+      </w:pPr>
+      <w:rPr>
+        <w:rFonts w:ascii="Wingdings" w:hAnsi="Wingdings" w:hint="default"/>
+      </w:rPr>
+    </w:lvl>
+    <w:lvl w:ilvl="3" w:tplc="44090001" w:tentative="1">
+      <w:start w:val="1"/>
+      <w:numFmt w:val="bullet"/>
+      <w:lvlText w:val=""/>
+      <w:lvlJc w:val="left"/>
+      <w:pPr>
+        <w:ind w:left="2880" w:hanging="360"/>
+      </w:pPr>
+      <w:rPr>
+        <w:rFonts w:ascii="Symbol" w:hAnsi="Symbol" w:hint="default"/>
+      </w:rPr>
+    </w:lvl>
+    <w:lvl w:ilvl="4" w:tplc="44090003" w:tentative="1">
+      <w:start w:val="1"/>
+      <w:numFmt w:val="bullet"/>
+      <w:lvlText w:val="o"/>
+      <w:lvlJc w:val="left"/>
+      <w:pPr>
+        <w:ind w:left="3600" w:hanging="360"/>
+      </w:pPr>
+      <w:rPr>
+        <w:rFonts w:ascii="Courier New" w:hAnsi="Courier New" w:cs="Courier New" w:hint="default"/>
+      </w:rPr>
+    </w:lvl>
+    <w:lvl w:ilvl="5" w:tplc="44090005" w:tentative="1">
+      <w:start w:val="1"/>
+      <w:numFmt w:val="bullet"/>
+      <w:lvlText w:val=""/>
+      <w:lvlJc w:val="left"/>
+      <w:pPr>
+        <w:ind w:left="4320" w:hanging="360"/>
+      </w:pPr>
+      <w:rPr>
+        <w:rFonts w:ascii="Wingdings" w:hAnsi="Wingdings" w:hint="default"/>
+      </w:rPr>
+    </w:lvl>
+    <w:lvl w:ilvl="6" w:tplc="44090001" w:tentative="1">
+      <w:start w:val="1"/>
+      <w:numFmt w:val="bullet"/>
+      <w:lvlText w:val=""/>
+      <w:lvlJc w:val="left"/>
+      <w:pPr>
+        <w:ind w:left="5040" w:hanging="360"/>
+      </w:pPr>
+      <w:rPr>
+        <w:rFonts w:ascii="Symbol" w:hAnsi="Symbol" w:hint="default"/>
+      </w:rPr>
+    </w:lvl>
+    <w:lvl w:ilvl="7" w:tplc="44090003" w:tentative="1">
+      <w:start w:val="1"/>
+      <w:numFmt w:val="bullet"/>
+      <w:lvlText w:val="o"/>
+      <w:lvlJc w:val="left"/>
+      <w:pPr>
+        <w:ind w:left="5760" w:hanging="360"/>
+      </w:pPr>
+      <w:rPr>
+        <w:rFonts w:ascii="Courier New" w:hAnsi="Courier New" w:cs="Courier New" w:hint="default"/>
+      </w:rPr>
+    </w:lvl>
+    <w:lvl w:ilvl="8" w:tplc="44090005" w:tentative="1">
+      <w:start w:val="1"/>
+      <w:numFmt w:val="bullet"/>
+      <w:lvlText w:val=""/>
+      <w:lvlJc w:val="left"/>
+      <w:pPr>
+        <w:ind w:left="6480" w:hanging="360"/>
+      </w:pPr>
+      <w:rPr>
+        <w:rFonts w:ascii="Wingdings" w:hAnsi="Wingdings" w:hint="default"/>
+      </w:rPr>
+    </w:lvl>
+  </w:abstractNum>
   <w:num w:numId="1">
     <w:abstractNumId w:val="2"/>
   </w:num>
@@ -511,6 +762,9 @@
   </w:num>
   <w:num w:numId="4">
     <w:abstractNumId w:val="0"/>
+  </w:num>
+  <w:num w:numId="5">
+    <w:abstractNumId w:val="4"/>
   </w:num>
 </w:numbering>
 </file>
@@ -1060,6 +1314,29 @@
       <w:contextualSpacing/>
     </w:pPr>
   </w:style>
+  <w:style w:type="character" w:styleId="Hyperlink">
+    <w:name w:val="Hyperlink"/>
+    <w:basedOn w:val="DefaultParagraphFont"/>
+    <w:uiPriority w:val="99"/>
+    <w:unhideWhenUsed/>
+    <w:rsid w:val="000A7994"/>
+    <w:rPr>
+      <w:color w:val="0563C1" w:themeColor="hyperlink"/>
+      <w:u w:val="single"/>
+    </w:rPr>
+  </w:style>
+  <w:style w:type="character" w:styleId="UnresolvedMention">
+    <w:name w:val="Unresolved Mention"/>
+    <w:basedOn w:val="DefaultParagraphFont"/>
+    <w:uiPriority w:val="99"/>
+    <w:semiHidden/>
+    <w:unhideWhenUsed/>
+    <w:rsid w:val="000A7994"/>
+    <w:rPr>
+      <w:color w:val="605E5C"/>
+      <w:shd w:val="clear" w:color="auto" w:fill="E1DFDD"/>
+    </w:rPr>
+  </w:style>
 </w:styles>
 </file>
 

</xml_diff>

<commit_message>
- Change log update
</commit_message>
<xml_diff>
--- a/BluePrints/Views/ChangeLog.docx
+++ b/BluePrints/Views/ChangeLog.docx
@@ -2,6 +2,122 @@
 <file path=word/document.xml><?xml version="1.0" encoding="utf-8"?>
 <w:document xmlns:wpc="http://schemas.microsoft.com/office/word/2010/wordprocessingCanvas" xmlns:cx="http://schemas.microsoft.com/office/drawing/2014/chartex" xmlns:cx1="http://schemas.microsoft.com/office/drawing/2015/9/8/chartex" xmlns:cx2="http://schemas.microsoft.com/office/drawing/2015/10/21/chartex" xmlns:cx3="http://schemas.microsoft.com/office/drawing/2016/5/9/chartex" xmlns:cx4="http://schemas.microsoft.com/office/drawing/2016/5/10/chartex" xmlns:cx5="http://schemas.microsoft.com/office/drawing/2016/5/11/chartex" xmlns:cx6="http://schemas.microsoft.com/office/drawing/2016/5/12/chartex" xmlns:cx7="http://schemas.microsoft.com/office/drawing/2016/5/13/chartex" xmlns:cx8="http://schemas.microsoft.com/office/drawing/2016/5/14/chartex" xmlns:mc="http://schemas.openxmlformats.org/markup-compatibility/2006" xmlns:aink="http://schemas.microsoft.com/office/drawing/2016/ink" xmlns:am3d="http://schemas.microsoft.com/office/drawing/2017/model3d" xmlns:o="urn:schemas-microsoft-com:office:office" xmlns:r="http://schemas.openxmlformats.org/officeDocument/2006/relationships" xmlns:m="http://schemas.openxmlformats.org/officeDocument/2006/math" xmlns:v="urn:schemas-microsoft-com:vml" xmlns:wp14="http://schemas.microsoft.com/office/word/2010/wordprocessingDrawing" xmlns:wp="http://schemas.openxmlformats.org/drawingml/2006/wordprocessingDrawing" xmlns:w10="urn:schemas-microsoft-com:office:word" xmlns:w="http://schemas.openxmlformats.org/wordprocessingml/2006/main" xmlns:w14="http://schemas.microsoft.com/office/word/2010/wordml" xmlns:w15="http://schemas.microsoft.com/office/word/2012/wordml" xmlns:w16cex="http://schemas.microsoft.com/office/word/2018/wordml/cex" xmlns:w16cid="http://schemas.microsoft.com/office/word/2016/wordml/cid" xmlns:w16="http://schemas.microsoft.com/office/word/2018/wordml" xmlns:w16se="http://schemas.microsoft.com/office/word/2015/wordml/symex" xmlns:wpg="http://schemas.microsoft.com/office/word/2010/wordprocessingGroup" xmlns:wpi="http://schemas.microsoft.com/office/word/2010/wordprocessingInk" xmlns:wne="http://schemas.microsoft.com/office/word/2006/wordml" xmlns:wps="http://schemas.microsoft.com/office/word/2010/wordprocessingShape" mc:Ignorable="w14 w15 w16se w16cid w16 w16cex wp14">
   <w:body>
+    <w:p>
+      <w:pPr>
+        <w:rPr>
+          <w:lang w:val="en-US"/>
+        </w:rPr>
+      </w:pPr>
+      <w:r>
+        <w:rPr>
+          <w:lang w:val="en-US"/>
+        </w:rPr>
+        <w:t>Change Log 1</w:t>
+      </w:r>
+      <w:r>
+        <w:rPr>
+          <w:vertAlign w:val="superscript"/>
+          <w:lang w:val="en-US"/>
+        </w:rPr>
+        <w:t>st</w:t>
+      </w:r>
+      <w:r>
+        <w:rPr>
+          <w:lang w:val="en-US"/>
+        </w:rPr>
+        <w:t xml:space="preserve"> July 2020</w:t>
+      </w:r>
+    </w:p>
+    <w:p>
+      <w:pPr>
+        <w:pStyle w:val="ListParagraph"/>
+        <w:numPr>
+          <w:ilvl w:val="0"/>
+          <w:numId w:val="6"/>
+        </w:numPr>
+      </w:pPr>
+      <w:r>
+        <w:rPr>
+          <w:rFonts w:cs="Calibri"/>
+        </w:rPr>
+        <w:t>A</w:t>
+      </w:r>
+      <w:r>
+        <w:rPr>
+          <w:rFonts w:cs="Calibri"/>
+        </w:rPr>
+        <w:t xml:space="preserve">llow user with permission to edit </w:t>
+      </w:r>
+      <w:r>
+        <w:rPr>
+          <w:rFonts w:cs="Calibri"/>
+        </w:rPr>
+        <w:t>Exo -&gt; Transaction quantity</w:t>
+      </w:r>
+    </w:p>
+    <w:p>
+      <w:pPr>
+        <w:pStyle w:val="ListParagraph"/>
+        <w:numPr>
+          <w:ilvl w:val="0"/>
+          <w:numId w:val="6"/>
+        </w:numPr>
+      </w:pPr>
+      <w:r>
+        <w:rPr>
+          <w:rFonts w:cs="Calibri"/>
+        </w:rPr>
+        <w:t>E</w:t>
+      </w:r>
+      <w:r>
+        <w:rPr>
+          <w:rFonts w:cs="Calibri"/>
+        </w:rPr>
+        <w:t xml:space="preserve">diting </w:t>
+      </w:r>
+      <w:r>
+        <w:rPr>
+          <w:rFonts w:cs="Calibri"/>
+        </w:rPr>
+        <w:t>Exo -&gt; Transaction</w:t>
+      </w:r>
+      <w:r>
+        <w:rPr>
+          <w:rFonts w:cs="Calibri"/>
+        </w:rPr>
+        <w:t xml:space="preserve"> quantity will adjust line cost, line charge, line total, line total tax, line tax and linetotal incl tax</w:t>
+      </w:r>
+      <w:r>
+        <w:rPr>
+          <w:rFonts w:cs="Calibri"/>
+        </w:rPr>
+        <w:t xml:space="preserve"> in EXO</w:t>
+      </w:r>
+    </w:p>
+    <w:p>
+      <w:pPr>
+        <w:pStyle w:val="ListParagraph"/>
+        <w:numPr>
+          <w:ilvl w:val="0"/>
+          <w:numId w:val="6"/>
+        </w:numPr>
+      </w:pPr>
+      <w:r>
+        <w:t xml:space="preserve">Exo -&gt; Timesheet </w:t>
+      </w:r>
+      <w:r>
+        <w:rPr>
+          <w:rFonts w:cs="Calibri"/>
+        </w:rPr>
+        <w:t>narrative will be saved on day with hours</w:t>
+      </w:r>
+      <w:r>
+        <w:rPr>
+          <w:rFonts w:cs="Calibri"/>
+        </w:rPr>
+        <w:t xml:space="preserve"> so that when it’s approved the narrative will be transferred over</w:t>
+      </w:r>
+    </w:p>
     <w:p>
       <w:pPr>
         <w:rPr>
@@ -640,6 +756,118 @@
     </w:lvl>
   </w:abstractNum>
   <w:abstractNum w:abstractNumId="4" w15:restartNumberingAfterBreak="0">
+    <w:nsid w:val="589D37B7"/>
+    <w:multiLevelType w:val="hybridMultilevel"/>
+    <w:tmpl w:val="9262429A"/>
+    <w:lvl w:ilvl="0" w:tplc="FE6AB762">
+      <w:numFmt w:val="bullet"/>
+      <w:lvlText w:val="-"/>
+      <w:lvlJc w:val="left"/>
+      <w:pPr>
+        <w:ind w:left="720" w:hanging="360"/>
+      </w:pPr>
+      <w:rPr>
+        <w:rFonts w:ascii="Calibri" w:eastAsiaTheme="minorEastAsia" w:hAnsi="Calibri" w:cs="Calibri" w:hint="default"/>
+      </w:rPr>
+    </w:lvl>
+    <w:lvl w:ilvl="1" w:tplc="44090003" w:tentative="1">
+      <w:start w:val="1"/>
+      <w:numFmt w:val="bullet"/>
+      <w:lvlText w:val="o"/>
+      <w:lvlJc w:val="left"/>
+      <w:pPr>
+        <w:ind w:left="1440" w:hanging="360"/>
+      </w:pPr>
+      <w:rPr>
+        <w:rFonts w:ascii="Courier New" w:hAnsi="Courier New" w:cs="Courier New" w:hint="default"/>
+      </w:rPr>
+    </w:lvl>
+    <w:lvl w:ilvl="2" w:tplc="44090005" w:tentative="1">
+      <w:start w:val="1"/>
+      <w:numFmt w:val="bullet"/>
+      <w:lvlText w:val=""/>
+      <w:lvlJc w:val="left"/>
+      <w:pPr>
+        <w:ind w:left="2160" w:hanging="360"/>
+      </w:pPr>
+      <w:rPr>
+        <w:rFonts w:ascii="Wingdings" w:hAnsi="Wingdings" w:hint="default"/>
+      </w:rPr>
+    </w:lvl>
+    <w:lvl w:ilvl="3" w:tplc="44090001" w:tentative="1">
+      <w:start w:val="1"/>
+      <w:numFmt w:val="bullet"/>
+      <w:lvlText w:val=""/>
+      <w:lvlJc w:val="left"/>
+      <w:pPr>
+        <w:ind w:left="2880" w:hanging="360"/>
+      </w:pPr>
+      <w:rPr>
+        <w:rFonts w:ascii="Symbol" w:hAnsi="Symbol" w:hint="default"/>
+      </w:rPr>
+    </w:lvl>
+    <w:lvl w:ilvl="4" w:tplc="44090003" w:tentative="1">
+      <w:start w:val="1"/>
+      <w:numFmt w:val="bullet"/>
+      <w:lvlText w:val="o"/>
+      <w:lvlJc w:val="left"/>
+      <w:pPr>
+        <w:ind w:left="3600" w:hanging="360"/>
+      </w:pPr>
+      <w:rPr>
+        <w:rFonts w:ascii="Courier New" w:hAnsi="Courier New" w:cs="Courier New" w:hint="default"/>
+      </w:rPr>
+    </w:lvl>
+    <w:lvl w:ilvl="5" w:tplc="44090005" w:tentative="1">
+      <w:start w:val="1"/>
+      <w:numFmt w:val="bullet"/>
+      <w:lvlText w:val=""/>
+      <w:lvlJc w:val="left"/>
+      <w:pPr>
+        <w:ind w:left="4320" w:hanging="360"/>
+      </w:pPr>
+      <w:rPr>
+        <w:rFonts w:ascii="Wingdings" w:hAnsi="Wingdings" w:hint="default"/>
+      </w:rPr>
+    </w:lvl>
+    <w:lvl w:ilvl="6" w:tplc="44090001" w:tentative="1">
+      <w:start w:val="1"/>
+      <w:numFmt w:val="bullet"/>
+      <w:lvlText w:val=""/>
+      <w:lvlJc w:val="left"/>
+      <w:pPr>
+        <w:ind w:left="5040" w:hanging="360"/>
+      </w:pPr>
+      <w:rPr>
+        <w:rFonts w:ascii="Symbol" w:hAnsi="Symbol" w:hint="default"/>
+      </w:rPr>
+    </w:lvl>
+    <w:lvl w:ilvl="7" w:tplc="44090003" w:tentative="1">
+      <w:start w:val="1"/>
+      <w:numFmt w:val="bullet"/>
+      <w:lvlText w:val="o"/>
+      <w:lvlJc w:val="left"/>
+      <w:pPr>
+        <w:ind w:left="5760" w:hanging="360"/>
+      </w:pPr>
+      <w:rPr>
+        <w:rFonts w:ascii="Courier New" w:hAnsi="Courier New" w:cs="Courier New" w:hint="default"/>
+      </w:rPr>
+    </w:lvl>
+    <w:lvl w:ilvl="8" w:tplc="44090005" w:tentative="1">
+      <w:start w:val="1"/>
+      <w:numFmt w:val="bullet"/>
+      <w:lvlText w:val=""/>
+      <w:lvlJc w:val="left"/>
+      <w:pPr>
+        <w:ind w:left="6480" w:hanging="360"/>
+      </w:pPr>
+      <w:rPr>
+        <w:rFonts w:ascii="Wingdings" w:hAnsi="Wingdings" w:hint="default"/>
+      </w:rPr>
+    </w:lvl>
+  </w:abstractNum>
+  <w:abstractNum w:abstractNumId="5" w15:restartNumberingAfterBreak="0">
     <w:nsid w:val="5C8347BF"/>
     <w:multiLevelType w:val="hybridMultilevel"/>
     <w:tmpl w:val="D2F46B88"/>
@@ -764,6 +992,9 @@
     <w:abstractNumId w:val="0"/>
   </w:num>
   <w:num w:numId="5">
+    <w:abstractNumId w:val="5"/>
+  </w:num>
+  <w:num w:numId="6">
     <w:abstractNumId w:val="4"/>
   </w:num>
 </w:numbering>

</xml_diff>

<commit_message>
- fixed an error where newly added user isn't reflected in Design -> Job Permission after refreshing - show only active users in Design -> Job Permission
</commit_message>
<xml_diff>
--- a/BluePrints/Views/ChangeLog.docx
+++ b/BluePrints/Views/ChangeLog.docx
@@ -12,6 +12,118 @@
         <w:rPr>
           <w:lang w:val="en-US"/>
         </w:rPr>
+        <w:t>Change Log 7</w:t>
+      </w:r>
+      <w:r>
+        <w:rPr>
+          <w:vertAlign w:val="superscript"/>
+          <w:lang w:val="en-US"/>
+        </w:rPr>
+        <w:t>th</w:t>
+      </w:r>
+      <w:r>
+        <w:rPr>
+          <w:lang w:val="en-US"/>
+        </w:rPr>
+        <w:t xml:space="preserve"> July 2020</w:t>
+      </w:r>
+    </w:p>
+    <w:p>
+      <w:pPr>
+        <w:pStyle w:val="ListParagraph"/>
+        <w:numPr>
+          <w:ilvl w:val="0"/>
+          <w:numId w:val="10"/>
+        </w:numPr>
+        <w:rPr>
+          <w:lang w:val="en-US"/>
+        </w:rPr>
+      </w:pPr>
+      <w:r>
+        <w:rPr>
+          <w:lang w:val="en-US"/>
+        </w:rPr>
+        <w:t>Design -&gt; Job Permission</w:t>
+      </w:r>
+    </w:p>
+    <w:p>
+      <w:pPr>
+        <w:pStyle w:val="ListParagraph"/>
+        <w:numPr>
+          <w:ilvl w:val="0"/>
+          <w:numId w:val="11"/>
+        </w:numPr>
+        <w:rPr>
+          <w:lang w:val="en-US"/>
+        </w:rPr>
+      </w:pPr>
+      <w:r>
+        <w:rPr>
+          <w:lang w:val="en-US"/>
+        </w:rPr>
+        <w:t>F</w:t>
+      </w:r>
+      <w:r>
+        <w:rPr>
+          <w:lang w:val="en-US"/>
+        </w:rPr>
+        <w:t xml:space="preserve">ixed an error where newly added user </w:t>
+      </w:r>
+      <w:proofErr w:type="gramStart"/>
+      <w:r>
+        <w:rPr>
+          <w:lang w:val="en-US"/>
+        </w:rPr>
+        <w:t>isn't</w:t>
+      </w:r>
+      <w:proofErr w:type="gramEnd"/>
+      <w:r>
+        <w:rPr>
+          <w:lang w:val="en-US"/>
+        </w:rPr>
+        <w:t xml:space="preserve"> </w:t>
+      </w:r>
+      <w:r>
+        <w:rPr>
+          <w:lang w:val="en-US"/>
+        </w:rPr>
+        <w:t>shown after refresh</w:t>
+      </w:r>
+    </w:p>
+    <w:p>
+      <w:pPr>
+        <w:pStyle w:val="ListParagraph"/>
+        <w:numPr>
+          <w:ilvl w:val="0"/>
+          <w:numId w:val="11"/>
+        </w:numPr>
+        <w:rPr>
+          <w:lang w:val="en-US"/>
+        </w:rPr>
+      </w:pPr>
+      <w:r>
+        <w:rPr>
+          <w:lang w:val="en-US"/>
+        </w:rPr>
+        <w:t>S</w:t>
+      </w:r>
+      <w:r>
+        <w:rPr>
+          <w:lang w:val="en-US"/>
+        </w:rPr>
+        <w:t>how only active users</w:t>
+      </w:r>
+    </w:p>
+    <w:p>
+      <w:pPr>
+        <w:rPr>
+          <w:lang w:val="en-US"/>
+        </w:rPr>
+      </w:pPr>
+      <w:r>
+        <w:rPr>
+          <w:lang w:val="en-US"/>
+        </w:rPr>
         <w:t>Change Log 3</w:t>
       </w:r>
       <w:r>
@@ -67,7 +179,35 @@
         <w:rPr>
           <w:lang w:val="en-US"/>
         </w:rPr>
-        <w:t>ixed an issue where subjob variation code doesn't show up in book time</w:t>
+        <w:t xml:space="preserve">ixed an issue where </w:t>
+      </w:r>
+      <w:proofErr w:type="spellStart"/>
+      <w:r>
+        <w:rPr>
+          <w:lang w:val="en-US"/>
+        </w:rPr>
+        <w:t>subjob</w:t>
+      </w:r>
+      <w:proofErr w:type="spellEnd"/>
+      <w:r>
+        <w:rPr>
+          <w:lang w:val="en-US"/>
+        </w:rPr>
+        <w:t xml:space="preserve"> variation code </w:t>
+      </w:r>
+      <w:proofErr w:type="gramStart"/>
+      <w:r>
+        <w:rPr>
+          <w:lang w:val="en-US"/>
+        </w:rPr>
+        <w:t>doesn't</w:t>
+      </w:r>
+      <w:proofErr w:type="gramEnd"/>
+      <w:r>
+        <w:rPr>
+          <w:lang w:val="en-US"/>
+        </w:rPr>
+        <w:t xml:space="preserve"> show up in book time</w:t>
       </w:r>
     </w:p>
     <w:p>
@@ -273,7 +413,21 @@
         <w:rPr>
           <w:lang w:val="en-US"/>
         </w:rPr>
-        <w:t>llow construction jobs cells to be edited when P6 project doesn't exists</w:t>
+        <w:t xml:space="preserve">llow construction jobs cells to be edited when P6 project </w:t>
+      </w:r>
+      <w:proofErr w:type="gramStart"/>
+      <w:r>
+        <w:rPr>
+          <w:lang w:val="en-US"/>
+        </w:rPr>
+        <w:t>doesn't</w:t>
+      </w:r>
+      <w:proofErr w:type="gramEnd"/>
+      <w:r>
+        <w:rPr>
+          <w:lang w:val="en-US"/>
+        </w:rPr>
+        <w:t xml:space="preserve"> exists</w:t>
       </w:r>
     </w:p>
     <w:p>
@@ -329,7 +483,35 @@
         <w:rPr>
           <w:rFonts w:cs="Calibri"/>
         </w:rPr>
-        <w:t>Editing Exo -&gt; Transaction quantity will adjust line cost, line charge, line total, line total tax, line tax and linetotal incl tax in EXO</w:t>
+        <w:t xml:space="preserve">Editing Exo -&gt; Transaction quantity will adjust line cost, line charge, line total, line total tax, line tax and </w:t>
+      </w:r>
+      <w:proofErr w:type="spellStart"/>
+      <w:r>
+        <w:rPr>
+          <w:rFonts w:cs="Calibri"/>
+        </w:rPr>
+        <w:t>linetotal</w:t>
+      </w:r>
+      <w:proofErr w:type="spellEnd"/>
+      <w:r>
+        <w:rPr>
+          <w:rFonts w:cs="Calibri"/>
+        </w:rPr>
+        <w:t xml:space="preserve"> </w:t>
+      </w:r>
+      <w:proofErr w:type="spellStart"/>
+      <w:r>
+        <w:rPr>
+          <w:rFonts w:cs="Calibri"/>
+        </w:rPr>
+        <w:t>incl</w:t>
+      </w:r>
+      <w:proofErr w:type="spellEnd"/>
+      <w:r>
+        <w:rPr>
+          <w:rFonts w:cs="Calibri"/>
+        </w:rPr>
+        <w:t xml:space="preserve"> tax in EXO</w:t>
       </w:r>
     </w:p>
     <w:p>
@@ -347,7 +529,21 @@
         <w:rPr>
           <w:rFonts w:cs="Calibri"/>
         </w:rPr>
-        <w:t>narrative will be saved on day with hours so that when it’s approved the narrative will be transferred over</w:t>
+        <w:t xml:space="preserve">narrative will be saved on day with hours so that when </w:t>
+      </w:r>
+      <w:proofErr w:type="gramStart"/>
+      <w:r>
+        <w:rPr>
+          <w:rFonts w:cs="Calibri"/>
+        </w:rPr>
+        <w:t>it’s</w:t>
+      </w:r>
+      <w:proofErr w:type="gramEnd"/>
+      <w:r>
+        <w:rPr>
+          <w:rFonts w:cs="Calibri"/>
+        </w:rPr>
+        <w:t xml:space="preserve"> approved the narrative will be transferred over</w:t>
       </w:r>
     </w:p>
     <w:p>
@@ -427,7 +623,21 @@
         <w:rPr>
           <w:lang w:val="en-US"/>
         </w:rPr>
-        <w:t>Book Time dialog loads faster for user that doesn’t have authority to book time for other users</w:t>
+        <w:t xml:space="preserve">Book Time dialog loads faster for user that </w:t>
+      </w:r>
+      <w:proofErr w:type="gramStart"/>
+      <w:r>
+        <w:rPr>
+          <w:lang w:val="en-US"/>
+        </w:rPr>
+        <w:t>doesn’t</w:t>
+      </w:r>
+      <w:proofErr w:type="gramEnd"/>
+      <w:r>
+        <w:rPr>
+          <w:lang w:val="en-US"/>
+        </w:rPr>
+        <w:t xml:space="preserve"> have authority to book time for other users</w:t>
       </w:r>
     </w:p>
     <w:p>
@@ -1325,6 +1535,118 @@
     </w:lvl>
   </w:abstractNum>
   <w:abstractNum w:abstractNumId="7" w15:restartNumberingAfterBreak="0">
+    <w:nsid w:val="557D5C95"/>
+    <w:multiLevelType w:val="hybridMultilevel"/>
+    <w:tmpl w:val="DC122E1C"/>
+    <w:lvl w:ilvl="0" w:tplc="FE6AB762">
+      <w:numFmt w:val="bullet"/>
+      <w:lvlText w:val="-"/>
+      <w:lvlJc w:val="left"/>
+      <w:pPr>
+        <w:ind w:left="720" w:hanging="360"/>
+      </w:pPr>
+      <w:rPr>
+        <w:rFonts w:ascii="Calibri" w:eastAsiaTheme="minorEastAsia" w:hAnsi="Calibri" w:cs="Calibri" w:hint="default"/>
+      </w:rPr>
+    </w:lvl>
+    <w:lvl w:ilvl="1" w:tplc="44090003" w:tentative="1">
+      <w:start w:val="1"/>
+      <w:numFmt w:val="bullet"/>
+      <w:lvlText w:val="o"/>
+      <w:lvlJc w:val="left"/>
+      <w:pPr>
+        <w:ind w:left="1440" w:hanging="360"/>
+      </w:pPr>
+      <w:rPr>
+        <w:rFonts w:ascii="Courier New" w:hAnsi="Courier New" w:cs="Courier New" w:hint="default"/>
+      </w:rPr>
+    </w:lvl>
+    <w:lvl w:ilvl="2" w:tplc="44090005" w:tentative="1">
+      <w:start w:val="1"/>
+      <w:numFmt w:val="bullet"/>
+      <w:lvlText w:val=""/>
+      <w:lvlJc w:val="left"/>
+      <w:pPr>
+        <w:ind w:left="2160" w:hanging="360"/>
+      </w:pPr>
+      <w:rPr>
+        <w:rFonts w:ascii="Wingdings" w:hAnsi="Wingdings" w:hint="default"/>
+      </w:rPr>
+    </w:lvl>
+    <w:lvl w:ilvl="3" w:tplc="44090001" w:tentative="1">
+      <w:start w:val="1"/>
+      <w:numFmt w:val="bullet"/>
+      <w:lvlText w:val=""/>
+      <w:lvlJc w:val="left"/>
+      <w:pPr>
+        <w:ind w:left="2880" w:hanging="360"/>
+      </w:pPr>
+      <w:rPr>
+        <w:rFonts w:ascii="Symbol" w:hAnsi="Symbol" w:hint="default"/>
+      </w:rPr>
+    </w:lvl>
+    <w:lvl w:ilvl="4" w:tplc="44090003" w:tentative="1">
+      <w:start w:val="1"/>
+      <w:numFmt w:val="bullet"/>
+      <w:lvlText w:val="o"/>
+      <w:lvlJc w:val="left"/>
+      <w:pPr>
+        <w:ind w:left="3600" w:hanging="360"/>
+      </w:pPr>
+      <w:rPr>
+        <w:rFonts w:ascii="Courier New" w:hAnsi="Courier New" w:cs="Courier New" w:hint="default"/>
+      </w:rPr>
+    </w:lvl>
+    <w:lvl w:ilvl="5" w:tplc="44090005" w:tentative="1">
+      <w:start w:val="1"/>
+      <w:numFmt w:val="bullet"/>
+      <w:lvlText w:val=""/>
+      <w:lvlJc w:val="left"/>
+      <w:pPr>
+        <w:ind w:left="4320" w:hanging="360"/>
+      </w:pPr>
+      <w:rPr>
+        <w:rFonts w:ascii="Wingdings" w:hAnsi="Wingdings" w:hint="default"/>
+      </w:rPr>
+    </w:lvl>
+    <w:lvl w:ilvl="6" w:tplc="44090001" w:tentative="1">
+      <w:start w:val="1"/>
+      <w:numFmt w:val="bullet"/>
+      <w:lvlText w:val=""/>
+      <w:lvlJc w:val="left"/>
+      <w:pPr>
+        <w:ind w:left="5040" w:hanging="360"/>
+      </w:pPr>
+      <w:rPr>
+        <w:rFonts w:ascii="Symbol" w:hAnsi="Symbol" w:hint="default"/>
+      </w:rPr>
+    </w:lvl>
+    <w:lvl w:ilvl="7" w:tplc="44090003" w:tentative="1">
+      <w:start w:val="1"/>
+      <w:numFmt w:val="bullet"/>
+      <w:lvlText w:val="o"/>
+      <w:lvlJc w:val="left"/>
+      <w:pPr>
+        <w:ind w:left="5760" w:hanging="360"/>
+      </w:pPr>
+      <w:rPr>
+        <w:rFonts w:ascii="Courier New" w:hAnsi="Courier New" w:cs="Courier New" w:hint="default"/>
+      </w:rPr>
+    </w:lvl>
+    <w:lvl w:ilvl="8" w:tplc="44090005" w:tentative="1">
+      <w:start w:val="1"/>
+      <w:numFmt w:val="bullet"/>
+      <w:lvlText w:val=""/>
+      <w:lvlJc w:val="left"/>
+      <w:pPr>
+        <w:ind w:left="6480" w:hanging="360"/>
+      </w:pPr>
+      <w:rPr>
+        <w:rFonts w:ascii="Wingdings" w:hAnsi="Wingdings" w:hint="default"/>
+      </w:rPr>
+    </w:lvl>
+  </w:abstractNum>
+  <w:abstractNum w:abstractNumId="8" w15:restartNumberingAfterBreak="0">
     <w:nsid w:val="589D37B7"/>
     <w:multiLevelType w:val="hybridMultilevel"/>
     <w:tmpl w:val="9262429A"/>
@@ -1436,7 +1758,120 @@
       </w:rPr>
     </w:lvl>
   </w:abstractNum>
-  <w:abstractNum w:abstractNumId="8" w15:restartNumberingAfterBreak="0">
+  <w:abstractNum w:abstractNumId="9" w15:restartNumberingAfterBreak="0">
+    <w:nsid w:val="58AA443D"/>
+    <w:multiLevelType w:val="hybridMultilevel"/>
+    <w:tmpl w:val="56F0D18E"/>
+    <w:lvl w:ilvl="0" w:tplc="44090003">
+      <w:start w:val="1"/>
+      <w:numFmt w:val="bullet"/>
+      <w:lvlText w:val="o"/>
+      <w:lvlJc w:val="left"/>
+      <w:pPr>
+        <w:ind w:left="1440" w:hanging="360"/>
+      </w:pPr>
+      <w:rPr>
+        <w:rFonts w:ascii="Courier New" w:hAnsi="Courier New" w:cs="Courier New" w:hint="default"/>
+      </w:rPr>
+    </w:lvl>
+    <w:lvl w:ilvl="1" w:tplc="44090003" w:tentative="1">
+      <w:start w:val="1"/>
+      <w:numFmt w:val="bullet"/>
+      <w:lvlText w:val="o"/>
+      <w:lvlJc w:val="left"/>
+      <w:pPr>
+        <w:ind w:left="2160" w:hanging="360"/>
+      </w:pPr>
+      <w:rPr>
+        <w:rFonts w:ascii="Courier New" w:hAnsi="Courier New" w:cs="Courier New" w:hint="default"/>
+      </w:rPr>
+    </w:lvl>
+    <w:lvl w:ilvl="2" w:tplc="44090005" w:tentative="1">
+      <w:start w:val="1"/>
+      <w:numFmt w:val="bullet"/>
+      <w:lvlText w:val=""/>
+      <w:lvlJc w:val="left"/>
+      <w:pPr>
+        <w:ind w:left="2880" w:hanging="360"/>
+      </w:pPr>
+      <w:rPr>
+        <w:rFonts w:ascii="Wingdings" w:hAnsi="Wingdings" w:hint="default"/>
+      </w:rPr>
+    </w:lvl>
+    <w:lvl w:ilvl="3" w:tplc="44090001" w:tentative="1">
+      <w:start w:val="1"/>
+      <w:numFmt w:val="bullet"/>
+      <w:lvlText w:val=""/>
+      <w:lvlJc w:val="left"/>
+      <w:pPr>
+        <w:ind w:left="3600" w:hanging="360"/>
+      </w:pPr>
+      <w:rPr>
+        <w:rFonts w:ascii="Symbol" w:hAnsi="Symbol" w:hint="default"/>
+      </w:rPr>
+    </w:lvl>
+    <w:lvl w:ilvl="4" w:tplc="44090003" w:tentative="1">
+      <w:start w:val="1"/>
+      <w:numFmt w:val="bullet"/>
+      <w:lvlText w:val="o"/>
+      <w:lvlJc w:val="left"/>
+      <w:pPr>
+        <w:ind w:left="4320" w:hanging="360"/>
+      </w:pPr>
+      <w:rPr>
+        <w:rFonts w:ascii="Courier New" w:hAnsi="Courier New" w:cs="Courier New" w:hint="default"/>
+      </w:rPr>
+    </w:lvl>
+    <w:lvl w:ilvl="5" w:tplc="44090005" w:tentative="1">
+      <w:start w:val="1"/>
+      <w:numFmt w:val="bullet"/>
+      <w:lvlText w:val=""/>
+      <w:lvlJc w:val="left"/>
+      <w:pPr>
+        <w:ind w:left="5040" w:hanging="360"/>
+      </w:pPr>
+      <w:rPr>
+        <w:rFonts w:ascii="Wingdings" w:hAnsi="Wingdings" w:hint="default"/>
+      </w:rPr>
+    </w:lvl>
+    <w:lvl w:ilvl="6" w:tplc="44090001" w:tentative="1">
+      <w:start w:val="1"/>
+      <w:numFmt w:val="bullet"/>
+      <w:lvlText w:val=""/>
+      <w:lvlJc w:val="left"/>
+      <w:pPr>
+        <w:ind w:left="5760" w:hanging="360"/>
+      </w:pPr>
+      <w:rPr>
+        <w:rFonts w:ascii="Symbol" w:hAnsi="Symbol" w:hint="default"/>
+      </w:rPr>
+    </w:lvl>
+    <w:lvl w:ilvl="7" w:tplc="44090003" w:tentative="1">
+      <w:start w:val="1"/>
+      <w:numFmt w:val="bullet"/>
+      <w:lvlText w:val="o"/>
+      <w:lvlJc w:val="left"/>
+      <w:pPr>
+        <w:ind w:left="6480" w:hanging="360"/>
+      </w:pPr>
+      <w:rPr>
+        <w:rFonts w:ascii="Courier New" w:hAnsi="Courier New" w:cs="Courier New" w:hint="default"/>
+      </w:rPr>
+    </w:lvl>
+    <w:lvl w:ilvl="8" w:tplc="44090005" w:tentative="1">
+      <w:start w:val="1"/>
+      <w:numFmt w:val="bullet"/>
+      <w:lvlText w:val=""/>
+      <w:lvlJc w:val="left"/>
+      <w:pPr>
+        <w:ind w:left="7200" w:hanging="360"/>
+      </w:pPr>
+      <w:rPr>
+        <w:rFonts w:ascii="Wingdings" w:hAnsi="Wingdings" w:hint="default"/>
+      </w:rPr>
+    </w:lvl>
+  </w:abstractNum>
+  <w:abstractNum w:abstractNumId="10" w15:restartNumberingAfterBreak="0">
     <w:nsid w:val="5C8347BF"/>
     <w:multiLevelType w:val="hybridMultilevel"/>
     <w:tmpl w:val="D2F46B88"/>
@@ -1561,10 +1996,10 @@
     <w:abstractNumId w:val="0"/>
   </w:num>
   <w:num w:numId="5">
-    <w:abstractNumId w:val="8"/>
+    <w:abstractNumId w:val="10"/>
   </w:num>
   <w:num w:numId="6">
-    <w:abstractNumId w:val="7"/>
+    <w:abstractNumId w:val="8"/>
   </w:num>
   <w:num w:numId="7">
     <w:abstractNumId w:val="1"/>
@@ -1574,6 +2009,12 @@
   </w:num>
   <w:num w:numId="9">
     <w:abstractNumId w:val="2"/>
+  </w:num>
+  <w:num w:numId="10">
+    <w:abstractNumId w:val="7"/>
+  </w:num>
+  <w:num w:numId="11">
+    <w:abstractNumId w:val="9"/>
   </w:num>
 </w:numbering>
 </file>

</xml_diff>

<commit_message>
- Added permission to allow user to edit construction forecast as uncommitted
</commit_message>
<xml_diff>
--- a/BluePrints/Views/ChangeLog.docx
+++ b/BluePrints/Views/ChangeLog.docx
@@ -12,6 +12,68 @@
         <w:rPr>
           <w:lang w:val="en-US"/>
         </w:rPr>
+        <w:t>Change Log 14</w:t>
+      </w:r>
+      <w:r>
+        <w:rPr>
+          <w:vertAlign w:val="superscript"/>
+          <w:lang w:val="en-US"/>
+        </w:rPr>
+        <w:t>th</w:t>
+      </w:r>
+      <w:r>
+        <w:rPr>
+          <w:lang w:val="en-US"/>
+        </w:rPr>
+        <w:t xml:space="preserve"> July 2020</w:t>
+      </w:r>
+    </w:p>
+    <w:p>
+      <w:pPr>
+        <w:pStyle w:val="ListParagraph"/>
+        <w:numPr>
+          <w:ilvl w:val="0"/>
+          <w:numId w:val="15"/>
+        </w:numPr>
+        <w:rPr>
+          <w:lang w:val="en-US"/>
+        </w:rPr>
+      </w:pPr>
+      <w:r>
+        <w:rPr>
+          <w:lang w:val="en-US"/>
+        </w:rPr>
+        <w:t>Forecast -&gt; Forecast</w:t>
+      </w:r>
+    </w:p>
+    <w:p>
+      <w:pPr>
+        <w:pStyle w:val="ListParagraph"/>
+        <w:numPr>
+          <w:ilvl w:val="1"/>
+          <w:numId w:val="15"/>
+        </w:numPr>
+        <w:rPr>
+          <w:lang w:val="en-US"/>
+        </w:rPr>
+      </w:pPr>
+      <w:r>
+        <w:rPr>
+          <w:lang w:val="en-US"/>
+        </w:rPr>
+        <w:t>Added permission to allow user to edit construction forecast as uncommitted</w:t>
+      </w:r>
+    </w:p>
+    <w:p>
+      <w:pPr>
+        <w:rPr>
+          <w:lang w:val="en-US"/>
+        </w:rPr>
+      </w:pPr>
+      <w:r>
+        <w:rPr>
+          <w:lang w:val="en-US"/>
+        </w:rPr>
         <w:t>Change Log 7</w:t>
       </w:r>
       <w:r>
@@ -67,21 +129,7 @@
         <w:rPr>
           <w:lang w:val="en-US"/>
         </w:rPr>
-        <w:t xml:space="preserve">ixed an error where newly added user </w:t>
-      </w:r>
-      <w:proofErr w:type="gramStart"/>
-      <w:r>
-        <w:rPr>
-          <w:lang w:val="en-US"/>
-        </w:rPr>
-        <w:t>isn't</w:t>
-      </w:r>
-      <w:proofErr w:type="gramEnd"/>
-      <w:r>
-        <w:rPr>
-          <w:lang w:val="en-US"/>
-        </w:rPr>
-        <w:t xml:space="preserve"> </w:t>
+        <w:t xml:space="preserve">ixed an error where newly added user isn't </w:t>
       </w:r>
       <w:r>
         <w:rPr>
@@ -179,35 +227,7 @@
         <w:rPr>
           <w:lang w:val="en-US"/>
         </w:rPr>
-        <w:t xml:space="preserve">ixed an issue where </w:t>
-      </w:r>
-      <w:proofErr w:type="spellStart"/>
-      <w:r>
-        <w:rPr>
-          <w:lang w:val="en-US"/>
-        </w:rPr>
-        <w:t>subjob</w:t>
-      </w:r>
-      <w:proofErr w:type="spellEnd"/>
-      <w:r>
-        <w:rPr>
-          <w:lang w:val="en-US"/>
-        </w:rPr>
-        <w:t xml:space="preserve"> variation code </w:t>
-      </w:r>
-      <w:proofErr w:type="gramStart"/>
-      <w:r>
-        <w:rPr>
-          <w:lang w:val="en-US"/>
-        </w:rPr>
-        <w:t>doesn't</w:t>
-      </w:r>
-      <w:proofErr w:type="gramEnd"/>
-      <w:r>
-        <w:rPr>
-          <w:lang w:val="en-US"/>
-        </w:rPr>
-        <w:t xml:space="preserve"> show up in book time</w:t>
+        <w:t>ixed an issue where subjob variation code doesn't show up in book time</w:t>
       </w:r>
     </w:p>
     <w:p>
@@ -413,21 +433,7 @@
         <w:rPr>
           <w:lang w:val="en-US"/>
         </w:rPr>
-        <w:t xml:space="preserve">llow construction jobs cells to be edited when P6 project </w:t>
-      </w:r>
-      <w:proofErr w:type="gramStart"/>
-      <w:r>
-        <w:rPr>
-          <w:lang w:val="en-US"/>
-        </w:rPr>
-        <w:t>doesn't</w:t>
-      </w:r>
-      <w:proofErr w:type="gramEnd"/>
-      <w:r>
-        <w:rPr>
-          <w:lang w:val="en-US"/>
-        </w:rPr>
-        <w:t xml:space="preserve"> exists</w:t>
+        <w:t>llow construction jobs cells to be edited when P6 project doesn't exists</w:t>
       </w:r>
     </w:p>
     <w:p>
@@ -483,35 +489,7 @@
         <w:rPr>
           <w:rFonts w:cs="Calibri"/>
         </w:rPr>
-        <w:t xml:space="preserve">Editing Exo -&gt; Transaction quantity will adjust line cost, line charge, line total, line total tax, line tax and </w:t>
-      </w:r>
-      <w:proofErr w:type="spellStart"/>
-      <w:r>
-        <w:rPr>
-          <w:rFonts w:cs="Calibri"/>
-        </w:rPr>
-        <w:t>linetotal</w:t>
-      </w:r>
-      <w:proofErr w:type="spellEnd"/>
-      <w:r>
-        <w:rPr>
-          <w:rFonts w:cs="Calibri"/>
-        </w:rPr>
-        <w:t xml:space="preserve"> </w:t>
-      </w:r>
-      <w:proofErr w:type="spellStart"/>
-      <w:r>
-        <w:rPr>
-          <w:rFonts w:cs="Calibri"/>
-        </w:rPr>
-        <w:t>incl</w:t>
-      </w:r>
-      <w:proofErr w:type="spellEnd"/>
-      <w:r>
-        <w:rPr>
-          <w:rFonts w:cs="Calibri"/>
-        </w:rPr>
-        <w:t xml:space="preserve"> tax in EXO</w:t>
+        <w:t>Editing Exo -&gt; Transaction quantity will adjust line cost, line charge, line total, line total tax, line tax and linetotal incl tax in EXO</w:t>
       </w:r>
     </w:p>
     <w:p>
@@ -529,21 +507,7 @@
         <w:rPr>
           <w:rFonts w:cs="Calibri"/>
         </w:rPr>
-        <w:t xml:space="preserve">narrative will be saved on day with hours so that when </w:t>
-      </w:r>
-      <w:proofErr w:type="gramStart"/>
-      <w:r>
-        <w:rPr>
-          <w:rFonts w:cs="Calibri"/>
-        </w:rPr>
-        <w:t>it’s</w:t>
-      </w:r>
-      <w:proofErr w:type="gramEnd"/>
-      <w:r>
-        <w:rPr>
-          <w:rFonts w:cs="Calibri"/>
-        </w:rPr>
-        <w:t xml:space="preserve"> approved the narrative will be transferred over</w:t>
+        <w:t>narrative will be saved on day with hours so that when it’s approved the narrative will be transferred over</w:t>
       </w:r>
     </w:p>
     <w:p>
@@ -623,31 +587,8 @@
         <w:rPr>
           <w:lang w:val="en-US"/>
         </w:rPr>
-        <w:t xml:space="preserve">Book Time dialog loads faster for user that </w:t>
-      </w:r>
-      <w:proofErr w:type="gramStart"/>
-      <w:r>
-        <w:rPr>
-          <w:lang w:val="en-US"/>
-        </w:rPr>
-        <w:t>doesn’t</w:t>
-      </w:r>
-      <w:proofErr w:type="gramEnd"/>
-      <w:r>
-        <w:rPr>
-          <w:lang w:val="en-US"/>
-        </w:rPr>
-        <w:t xml:space="preserve"> have authority to book time for other users</w:t>
-      </w:r>
-    </w:p>
-    <w:p>
-      <w:pPr>
-        <w:pStyle w:val="ListParagraph"/>
-        <w:ind w:left="1440"/>
-        <w:rPr>
-          <w:lang w:val="en-US"/>
-        </w:rPr>
-      </w:pPr>
+        <w:t>Book Time dialog loads faster for user that doesn’t have authority to book time for other users</w:t>
+      </w:r>
     </w:p>
     <w:p>
       <w:pPr>
@@ -1225,6 +1166,231 @@
     </w:lvl>
   </w:abstractNum>
   <w:abstractNum w:abstractNumId="4" w15:restartNumberingAfterBreak="0">
+    <w:nsid w:val="3C5C6580"/>
+    <w:multiLevelType w:val="hybridMultilevel"/>
+    <w:tmpl w:val="6874B70A"/>
+    <w:lvl w:ilvl="0" w:tplc="44090003">
+      <w:start w:val="1"/>
+      <w:numFmt w:val="bullet"/>
+      <w:lvlText w:val="o"/>
+      <w:lvlJc w:val="left"/>
+      <w:pPr>
+        <w:ind w:left="1080" w:hanging="360"/>
+      </w:pPr>
+      <w:rPr>
+        <w:rFonts w:ascii="Courier New" w:hAnsi="Courier New" w:cs="Courier New" w:hint="default"/>
+      </w:rPr>
+    </w:lvl>
+    <w:lvl w:ilvl="1" w:tplc="44090003" w:tentative="1">
+      <w:start w:val="1"/>
+      <w:numFmt w:val="bullet"/>
+      <w:lvlText w:val="o"/>
+      <w:lvlJc w:val="left"/>
+      <w:pPr>
+        <w:ind w:left="1800" w:hanging="360"/>
+      </w:pPr>
+      <w:rPr>
+        <w:rFonts w:ascii="Courier New" w:hAnsi="Courier New" w:cs="Courier New" w:hint="default"/>
+      </w:rPr>
+    </w:lvl>
+    <w:lvl w:ilvl="2" w:tplc="44090005" w:tentative="1">
+      <w:start w:val="1"/>
+      <w:numFmt w:val="bullet"/>
+      <w:lvlText w:val=""/>
+      <w:lvlJc w:val="left"/>
+      <w:pPr>
+        <w:ind w:left="2520" w:hanging="360"/>
+      </w:pPr>
+      <w:rPr>
+        <w:rFonts w:ascii="Wingdings" w:hAnsi="Wingdings" w:hint="default"/>
+      </w:rPr>
+    </w:lvl>
+    <w:lvl w:ilvl="3" w:tplc="44090001" w:tentative="1">
+      <w:start w:val="1"/>
+      <w:numFmt w:val="bullet"/>
+      <w:lvlText w:val=""/>
+      <w:lvlJc w:val="left"/>
+      <w:pPr>
+        <w:ind w:left="3240" w:hanging="360"/>
+      </w:pPr>
+      <w:rPr>
+        <w:rFonts w:ascii="Symbol" w:hAnsi="Symbol" w:hint="default"/>
+      </w:rPr>
+    </w:lvl>
+    <w:lvl w:ilvl="4" w:tplc="44090003" w:tentative="1">
+      <w:start w:val="1"/>
+      <w:numFmt w:val="bullet"/>
+      <w:lvlText w:val="o"/>
+      <w:lvlJc w:val="left"/>
+      <w:pPr>
+        <w:ind w:left="3960" w:hanging="360"/>
+      </w:pPr>
+      <w:rPr>
+        <w:rFonts w:ascii="Courier New" w:hAnsi="Courier New" w:cs="Courier New" w:hint="default"/>
+      </w:rPr>
+    </w:lvl>
+    <w:lvl w:ilvl="5" w:tplc="44090005" w:tentative="1">
+      <w:start w:val="1"/>
+      <w:numFmt w:val="bullet"/>
+      <w:lvlText w:val=""/>
+      <w:lvlJc w:val="left"/>
+      <w:pPr>
+        <w:ind w:left="4680" w:hanging="360"/>
+      </w:pPr>
+      <w:rPr>
+        <w:rFonts w:ascii="Wingdings" w:hAnsi="Wingdings" w:hint="default"/>
+      </w:rPr>
+    </w:lvl>
+    <w:lvl w:ilvl="6" w:tplc="44090001" w:tentative="1">
+      <w:start w:val="1"/>
+      <w:numFmt w:val="bullet"/>
+      <w:lvlText w:val=""/>
+      <w:lvlJc w:val="left"/>
+      <w:pPr>
+        <w:ind w:left="5400" w:hanging="360"/>
+      </w:pPr>
+      <w:rPr>
+        <w:rFonts w:ascii="Symbol" w:hAnsi="Symbol" w:hint="default"/>
+      </w:rPr>
+    </w:lvl>
+    <w:lvl w:ilvl="7" w:tplc="44090003" w:tentative="1">
+      <w:start w:val="1"/>
+      <w:numFmt w:val="bullet"/>
+      <w:lvlText w:val="o"/>
+      <w:lvlJc w:val="left"/>
+      <w:pPr>
+        <w:ind w:left="6120" w:hanging="360"/>
+      </w:pPr>
+      <w:rPr>
+        <w:rFonts w:ascii="Courier New" w:hAnsi="Courier New" w:cs="Courier New" w:hint="default"/>
+      </w:rPr>
+    </w:lvl>
+    <w:lvl w:ilvl="8" w:tplc="44090005" w:tentative="1">
+      <w:start w:val="1"/>
+      <w:numFmt w:val="bullet"/>
+      <w:lvlText w:val=""/>
+      <w:lvlJc w:val="left"/>
+      <w:pPr>
+        <w:ind w:left="6840" w:hanging="360"/>
+      </w:pPr>
+      <w:rPr>
+        <w:rFonts w:ascii="Wingdings" w:hAnsi="Wingdings" w:hint="default"/>
+      </w:rPr>
+    </w:lvl>
+  </w:abstractNum>
+  <w:abstractNum w:abstractNumId="5" w15:restartNumberingAfterBreak="0">
+    <w:nsid w:val="4691596C"/>
+    <w:multiLevelType w:val="hybridMultilevel"/>
+    <w:tmpl w:val="ECEEF302"/>
+    <w:lvl w:ilvl="0" w:tplc="0F6A93CE">
+      <w:numFmt w:val="bullet"/>
+      <w:lvlText w:val="-"/>
+      <w:lvlJc w:val="left"/>
+      <w:pPr>
+        <w:ind w:left="1080" w:hanging="360"/>
+      </w:pPr>
+      <w:rPr>
+        <w:rFonts w:ascii="Calibri" w:eastAsiaTheme="minorEastAsia" w:hAnsi="Calibri" w:cs="Calibri" w:hint="default"/>
+      </w:rPr>
+    </w:lvl>
+    <w:lvl w:ilvl="1" w:tplc="44090003" w:tentative="1">
+      <w:start w:val="1"/>
+      <w:numFmt w:val="bullet"/>
+      <w:lvlText w:val="o"/>
+      <w:lvlJc w:val="left"/>
+      <w:pPr>
+        <w:ind w:left="1800" w:hanging="360"/>
+      </w:pPr>
+      <w:rPr>
+        <w:rFonts w:ascii="Courier New" w:hAnsi="Courier New" w:cs="Courier New" w:hint="default"/>
+      </w:rPr>
+    </w:lvl>
+    <w:lvl w:ilvl="2" w:tplc="44090005" w:tentative="1">
+      <w:start w:val="1"/>
+      <w:numFmt w:val="bullet"/>
+      <w:lvlText w:val=""/>
+      <w:lvlJc w:val="left"/>
+      <w:pPr>
+        <w:ind w:left="2520" w:hanging="360"/>
+      </w:pPr>
+      <w:rPr>
+        <w:rFonts w:ascii="Wingdings" w:hAnsi="Wingdings" w:hint="default"/>
+      </w:rPr>
+    </w:lvl>
+    <w:lvl w:ilvl="3" w:tplc="44090001" w:tentative="1">
+      <w:start w:val="1"/>
+      <w:numFmt w:val="bullet"/>
+      <w:lvlText w:val=""/>
+      <w:lvlJc w:val="left"/>
+      <w:pPr>
+        <w:ind w:left="3240" w:hanging="360"/>
+      </w:pPr>
+      <w:rPr>
+        <w:rFonts w:ascii="Symbol" w:hAnsi="Symbol" w:hint="default"/>
+      </w:rPr>
+    </w:lvl>
+    <w:lvl w:ilvl="4" w:tplc="44090003" w:tentative="1">
+      <w:start w:val="1"/>
+      <w:numFmt w:val="bullet"/>
+      <w:lvlText w:val="o"/>
+      <w:lvlJc w:val="left"/>
+      <w:pPr>
+        <w:ind w:left="3960" w:hanging="360"/>
+      </w:pPr>
+      <w:rPr>
+        <w:rFonts w:ascii="Courier New" w:hAnsi="Courier New" w:cs="Courier New" w:hint="default"/>
+      </w:rPr>
+    </w:lvl>
+    <w:lvl w:ilvl="5" w:tplc="44090005" w:tentative="1">
+      <w:start w:val="1"/>
+      <w:numFmt w:val="bullet"/>
+      <w:lvlText w:val=""/>
+      <w:lvlJc w:val="left"/>
+      <w:pPr>
+        <w:ind w:left="4680" w:hanging="360"/>
+      </w:pPr>
+      <w:rPr>
+        <w:rFonts w:ascii="Wingdings" w:hAnsi="Wingdings" w:hint="default"/>
+      </w:rPr>
+    </w:lvl>
+    <w:lvl w:ilvl="6" w:tplc="44090001" w:tentative="1">
+      <w:start w:val="1"/>
+      <w:numFmt w:val="bullet"/>
+      <w:lvlText w:val=""/>
+      <w:lvlJc w:val="left"/>
+      <w:pPr>
+        <w:ind w:left="5400" w:hanging="360"/>
+      </w:pPr>
+      <w:rPr>
+        <w:rFonts w:ascii="Symbol" w:hAnsi="Symbol" w:hint="default"/>
+      </w:rPr>
+    </w:lvl>
+    <w:lvl w:ilvl="7" w:tplc="44090003" w:tentative="1">
+      <w:start w:val="1"/>
+      <w:numFmt w:val="bullet"/>
+      <w:lvlText w:val="o"/>
+      <w:lvlJc w:val="left"/>
+      <w:pPr>
+        <w:ind w:left="6120" w:hanging="360"/>
+      </w:pPr>
+      <w:rPr>
+        <w:rFonts w:ascii="Courier New" w:hAnsi="Courier New" w:cs="Courier New" w:hint="default"/>
+      </w:rPr>
+    </w:lvl>
+    <w:lvl w:ilvl="8" w:tplc="44090005" w:tentative="1">
+      <w:start w:val="1"/>
+      <w:numFmt w:val="bullet"/>
+      <w:lvlText w:val=""/>
+      <w:lvlJc w:val="left"/>
+      <w:pPr>
+        <w:ind w:left="6840" w:hanging="360"/>
+      </w:pPr>
+      <w:rPr>
+        <w:rFonts w:ascii="Wingdings" w:hAnsi="Wingdings" w:hint="default"/>
+      </w:rPr>
+    </w:lvl>
+  </w:abstractNum>
+  <w:abstractNum w:abstractNumId="6" w15:restartNumberingAfterBreak="0">
     <w:nsid w:val="47F951B0"/>
     <w:multiLevelType w:val="multilevel"/>
     <w:tmpl w:val="00D8A7E8"/>
@@ -1310,7 +1476,7 @@
       </w:pPr>
     </w:lvl>
   </w:abstractNum>
-  <w:abstractNum w:abstractNumId="5" w15:restartNumberingAfterBreak="0">
+  <w:abstractNum w:abstractNumId="7" w15:restartNumberingAfterBreak="0">
     <w:nsid w:val="4D6E34D5"/>
     <w:multiLevelType w:val="hybridMultilevel"/>
     <w:tmpl w:val="6BC866D0"/>
@@ -1422,7 +1588,7 @@
       </w:rPr>
     </w:lvl>
   </w:abstractNum>
-  <w:abstractNum w:abstractNumId="6" w15:restartNumberingAfterBreak="0">
+  <w:abstractNum w:abstractNumId="8" w15:restartNumberingAfterBreak="0">
     <w:nsid w:val="52606647"/>
     <w:multiLevelType w:val="hybridMultilevel"/>
     <w:tmpl w:val="34FAD1A0"/>
@@ -1534,7 +1700,7 @@
       </w:rPr>
     </w:lvl>
   </w:abstractNum>
-  <w:abstractNum w:abstractNumId="7" w15:restartNumberingAfterBreak="0">
+  <w:abstractNum w:abstractNumId="9" w15:restartNumberingAfterBreak="0">
     <w:nsid w:val="557D5C95"/>
     <w:multiLevelType w:val="hybridMultilevel"/>
     <w:tmpl w:val="DC122E1C"/>
@@ -1646,7 +1812,7 @@
       </w:rPr>
     </w:lvl>
   </w:abstractNum>
-  <w:abstractNum w:abstractNumId="8" w15:restartNumberingAfterBreak="0">
+  <w:abstractNum w:abstractNumId="10" w15:restartNumberingAfterBreak="0">
     <w:nsid w:val="589D37B7"/>
     <w:multiLevelType w:val="hybridMultilevel"/>
     <w:tmpl w:val="9262429A"/>
@@ -1758,7 +1924,7 @@
       </w:rPr>
     </w:lvl>
   </w:abstractNum>
-  <w:abstractNum w:abstractNumId="9" w15:restartNumberingAfterBreak="0">
+  <w:abstractNum w:abstractNumId="11" w15:restartNumberingAfterBreak="0">
     <w:nsid w:val="58AA443D"/>
     <w:multiLevelType w:val="hybridMultilevel"/>
     <w:tmpl w:val="56F0D18E"/>
@@ -1871,7 +2037,7 @@
       </w:rPr>
     </w:lvl>
   </w:abstractNum>
-  <w:abstractNum w:abstractNumId="10" w15:restartNumberingAfterBreak="0">
+  <w:abstractNum w:abstractNumId="12" w15:restartNumberingAfterBreak="0">
     <w:nsid w:val="5C8347BF"/>
     <w:multiLevelType w:val="hybridMultilevel"/>
     <w:tmpl w:val="D2F46B88"/>
@@ -1983,38 +2149,275 @@
       </w:rPr>
     </w:lvl>
   </w:abstractNum>
+  <w:abstractNum w:abstractNumId="13" w15:restartNumberingAfterBreak="0">
+    <w:nsid w:val="6AC268F7"/>
+    <w:multiLevelType w:val="hybridMultilevel"/>
+    <w:tmpl w:val="12F21194"/>
+    <w:lvl w:ilvl="0" w:tplc="04BCE210">
+      <w:numFmt w:val="bullet"/>
+      <w:lvlText w:val="-"/>
+      <w:lvlJc w:val="left"/>
+      <w:pPr>
+        <w:ind w:left="720" w:hanging="360"/>
+      </w:pPr>
+      <w:rPr>
+        <w:rFonts w:ascii="Calibri" w:eastAsiaTheme="minorEastAsia" w:hAnsi="Calibri" w:cs="Calibri" w:hint="default"/>
+      </w:rPr>
+    </w:lvl>
+    <w:lvl w:ilvl="1" w:tplc="44090003">
+      <w:start w:val="1"/>
+      <w:numFmt w:val="bullet"/>
+      <w:lvlText w:val="o"/>
+      <w:lvlJc w:val="left"/>
+      <w:pPr>
+        <w:ind w:left="1440" w:hanging="360"/>
+      </w:pPr>
+      <w:rPr>
+        <w:rFonts w:ascii="Courier New" w:hAnsi="Courier New" w:cs="Courier New" w:hint="default"/>
+      </w:rPr>
+    </w:lvl>
+    <w:lvl w:ilvl="2" w:tplc="44090005" w:tentative="1">
+      <w:start w:val="1"/>
+      <w:numFmt w:val="bullet"/>
+      <w:lvlText w:val=""/>
+      <w:lvlJc w:val="left"/>
+      <w:pPr>
+        <w:ind w:left="2160" w:hanging="360"/>
+      </w:pPr>
+      <w:rPr>
+        <w:rFonts w:ascii="Wingdings" w:hAnsi="Wingdings" w:hint="default"/>
+      </w:rPr>
+    </w:lvl>
+    <w:lvl w:ilvl="3" w:tplc="44090001" w:tentative="1">
+      <w:start w:val="1"/>
+      <w:numFmt w:val="bullet"/>
+      <w:lvlText w:val=""/>
+      <w:lvlJc w:val="left"/>
+      <w:pPr>
+        <w:ind w:left="2880" w:hanging="360"/>
+      </w:pPr>
+      <w:rPr>
+        <w:rFonts w:ascii="Symbol" w:hAnsi="Symbol" w:hint="default"/>
+      </w:rPr>
+    </w:lvl>
+    <w:lvl w:ilvl="4" w:tplc="44090003" w:tentative="1">
+      <w:start w:val="1"/>
+      <w:numFmt w:val="bullet"/>
+      <w:lvlText w:val="o"/>
+      <w:lvlJc w:val="left"/>
+      <w:pPr>
+        <w:ind w:left="3600" w:hanging="360"/>
+      </w:pPr>
+      <w:rPr>
+        <w:rFonts w:ascii="Courier New" w:hAnsi="Courier New" w:cs="Courier New" w:hint="default"/>
+      </w:rPr>
+    </w:lvl>
+    <w:lvl w:ilvl="5" w:tplc="44090005" w:tentative="1">
+      <w:start w:val="1"/>
+      <w:numFmt w:val="bullet"/>
+      <w:lvlText w:val=""/>
+      <w:lvlJc w:val="left"/>
+      <w:pPr>
+        <w:ind w:left="4320" w:hanging="360"/>
+      </w:pPr>
+      <w:rPr>
+        <w:rFonts w:ascii="Wingdings" w:hAnsi="Wingdings" w:hint="default"/>
+      </w:rPr>
+    </w:lvl>
+    <w:lvl w:ilvl="6" w:tplc="44090001" w:tentative="1">
+      <w:start w:val="1"/>
+      <w:numFmt w:val="bullet"/>
+      <w:lvlText w:val=""/>
+      <w:lvlJc w:val="left"/>
+      <w:pPr>
+        <w:ind w:left="5040" w:hanging="360"/>
+      </w:pPr>
+      <w:rPr>
+        <w:rFonts w:ascii="Symbol" w:hAnsi="Symbol" w:hint="default"/>
+      </w:rPr>
+    </w:lvl>
+    <w:lvl w:ilvl="7" w:tplc="44090003" w:tentative="1">
+      <w:start w:val="1"/>
+      <w:numFmt w:val="bullet"/>
+      <w:lvlText w:val="o"/>
+      <w:lvlJc w:val="left"/>
+      <w:pPr>
+        <w:ind w:left="5760" w:hanging="360"/>
+      </w:pPr>
+      <w:rPr>
+        <w:rFonts w:ascii="Courier New" w:hAnsi="Courier New" w:cs="Courier New" w:hint="default"/>
+      </w:rPr>
+    </w:lvl>
+    <w:lvl w:ilvl="8" w:tplc="44090005" w:tentative="1">
+      <w:start w:val="1"/>
+      <w:numFmt w:val="bullet"/>
+      <w:lvlText w:val=""/>
+      <w:lvlJc w:val="left"/>
+      <w:pPr>
+        <w:ind w:left="6480" w:hanging="360"/>
+      </w:pPr>
+      <w:rPr>
+        <w:rFonts w:ascii="Wingdings" w:hAnsi="Wingdings" w:hint="default"/>
+      </w:rPr>
+    </w:lvl>
+  </w:abstractNum>
+  <w:abstractNum w:abstractNumId="14" w15:restartNumberingAfterBreak="0">
+    <w:nsid w:val="7D5B508C"/>
+    <w:multiLevelType w:val="hybridMultilevel"/>
+    <w:tmpl w:val="7FAC5656"/>
+    <w:lvl w:ilvl="0" w:tplc="44090003">
+      <w:start w:val="1"/>
+      <w:numFmt w:val="bullet"/>
+      <w:lvlText w:val="o"/>
+      <w:lvlJc w:val="left"/>
+      <w:pPr>
+        <w:ind w:left="1080" w:hanging="360"/>
+      </w:pPr>
+      <w:rPr>
+        <w:rFonts w:ascii="Courier New" w:hAnsi="Courier New" w:cs="Courier New" w:hint="default"/>
+      </w:rPr>
+    </w:lvl>
+    <w:lvl w:ilvl="1" w:tplc="44090003" w:tentative="1">
+      <w:start w:val="1"/>
+      <w:numFmt w:val="bullet"/>
+      <w:lvlText w:val="o"/>
+      <w:lvlJc w:val="left"/>
+      <w:pPr>
+        <w:ind w:left="1800" w:hanging="360"/>
+      </w:pPr>
+      <w:rPr>
+        <w:rFonts w:ascii="Courier New" w:hAnsi="Courier New" w:cs="Courier New" w:hint="default"/>
+      </w:rPr>
+    </w:lvl>
+    <w:lvl w:ilvl="2" w:tplc="44090005" w:tentative="1">
+      <w:start w:val="1"/>
+      <w:numFmt w:val="bullet"/>
+      <w:lvlText w:val=""/>
+      <w:lvlJc w:val="left"/>
+      <w:pPr>
+        <w:ind w:left="2520" w:hanging="360"/>
+      </w:pPr>
+      <w:rPr>
+        <w:rFonts w:ascii="Wingdings" w:hAnsi="Wingdings" w:hint="default"/>
+      </w:rPr>
+    </w:lvl>
+    <w:lvl w:ilvl="3" w:tplc="44090001" w:tentative="1">
+      <w:start w:val="1"/>
+      <w:numFmt w:val="bullet"/>
+      <w:lvlText w:val=""/>
+      <w:lvlJc w:val="left"/>
+      <w:pPr>
+        <w:ind w:left="3240" w:hanging="360"/>
+      </w:pPr>
+      <w:rPr>
+        <w:rFonts w:ascii="Symbol" w:hAnsi="Symbol" w:hint="default"/>
+      </w:rPr>
+    </w:lvl>
+    <w:lvl w:ilvl="4" w:tplc="44090003" w:tentative="1">
+      <w:start w:val="1"/>
+      <w:numFmt w:val="bullet"/>
+      <w:lvlText w:val="o"/>
+      <w:lvlJc w:val="left"/>
+      <w:pPr>
+        <w:ind w:left="3960" w:hanging="360"/>
+      </w:pPr>
+      <w:rPr>
+        <w:rFonts w:ascii="Courier New" w:hAnsi="Courier New" w:cs="Courier New" w:hint="default"/>
+      </w:rPr>
+    </w:lvl>
+    <w:lvl w:ilvl="5" w:tplc="44090005" w:tentative="1">
+      <w:start w:val="1"/>
+      <w:numFmt w:val="bullet"/>
+      <w:lvlText w:val=""/>
+      <w:lvlJc w:val="left"/>
+      <w:pPr>
+        <w:ind w:left="4680" w:hanging="360"/>
+      </w:pPr>
+      <w:rPr>
+        <w:rFonts w:ascii="Wingdings" w:hAnsi="Wingdings" w:hint="default"/>
+      </w:rPr>
+    </w:lvl>
+    <w:lvl w:ilvl="6" w:tplc="44090001" w:tentative="1">
+      <w:start w:val="1"/>
+      <w:numFmt w:val="bullet"/>
+      <w:lvlText w:val=""/>
+      <w:lvlJc w:val="left"/>
+      <w:pPr>
+        <w:ind w:left="5400" w:hanging="360"/>
+      </w:pPr>
+      <w:rPr>
+        <w:rFonts w:ascii="Symbol" w:hAnsi="Symbol" w:hint="default"/>
+      </w:rPr>
+    </w:lvl>
+    <w:lvl w:ilvl="7" w:tplc="44090003" w:tentative="1">
+      <w:start w:val="1"/>
+      <w:numFmt w:val="bullet"/>
+      <w:lvlText w:val="o"/>
+      <w:lvlJc w:val="left"/>
+      <w:pPr>
+        <w:ind w:left="6120" w:hanging="360"/>
+      </w:pPr>
+      <w:rPr>
+        <w:rFonts w:ascii="Courier New" w:hAnsi="Courier New" w:cs="Courier New" w:hint="default"/>
+      </w:rPr>
+    </w:lvl>
+    <w:lvl w:ilvl="8" w:tplc="44090005" w:tentative="1">
+      <w:start w:val="1"/>
+      <w:numFmt w:val="bullet"/>
+      <w:lvlText w:val=""/>
+      <w:lvlJc w:val="left"/>
+      <w:pPr>
+        <w:ind w:left="6840" w:hanging="360"/>
+      </w:pPr>
+      <w:rPr>
+        <w:rFonts w:ascii="Wingdings" w:hAnsi="Wingdings" w:hint="default"/>
+      </w:rPr>
+    </w:lvl>
+  </w:abstractNum>
   <w:num w:numId="1">
-    <w:abstractNumId w:val="4"/>
+    <w:abstractNumId w:val="6"/>
   </w:num>
   <w:num w:numId="2">
     <w:abstractNumId w:val="3"/>
   </w:num>
   <w:num w:numId="3">
-    <w:abstractNumId w:val="5"/>
+    <w:abstractNumId w:val="7"/>
   </w:num>
   <w:num w:numId="4">
     <w:abstractNumId w:val="0"/>
   </w:num>
   <w:num w:numId="5">
-    <w:abstractNumId w:val="10"/>
+    <w:abstractNumId w:val="12"/>
   </w:num>
   <w:num w:numId="6">
-    <w:abstractNumId w:val="8"/>
+    <w:abstractNumId w:val="10"/>
   </w:num>
   <w:num w:numId="7">
     <w:abstractNumId w:val="1"/>
   </w:num>
   <w:num w:numId="8">
-    <w:abstractNumId w:val="6"/>
+    <w:abstractNumId w:val="8"/>
   </w:num>
   <w:num w:numId="9">
     <w:abstractNumId w:val="2"/>
   </w:num>
   <w:num w:numId="10">
-    <w:abstractNumId w:val="7"/>
+    <w:abstractNumId w:val="9"/>
   </w:num>
   <w:num w:numId="11">
-    <w:abstractNumId w:val="9"/>
+    <w:abstractNumId w:val="11"/>
+  </w:num>
+  <w:num w:numId="12">
+    <w:abstractNumId w:val="5"/>
+  </w:num>
+  <w:num w:numId="13">
+    <w:abstractNumId w:val="14"/>
+  </w:num>
+  <w:num w:numId="14">
+    <w:abstractNumId w:val="4"/>
+  </w:num>
+  <w:num w:numId="15">
+    <w:abstractNumId w:val="13"/>
   </w:num>
 </w:numbering>
 </file>

</xml_diff>

<commit_message>
- added feature to allow design subcontract hours to be excluded from forecast
</commit_message>
<xml_diff>
--- a/BluePrints/Views/ChangeLog.docx
+++ b/BluePrints/Views/ChangeLog.docx
@@ -12,6 +12,95 @@
         <w:rPr>
           <w:lang w:val="en-US"/>
         </w:rPr>
+        <w:t>Change Log 15</w:t>
+      </w:r>
+      <w:r>
+        <w:rPr>
+          <w:vertAlign w:val="superscript"/>
+          <w:lang w:val="en-US"/>
+        </w:rPr>
+        <w:t>th</w:t>
+      </w:r>
+      <w:r>
+        <w:rPr>
+          <w:lang w:val="en-US"/>
+        </w:rPr>
+        <w:t xml:space="preserve"> July 2020</w:t>
+      </w:r>
+    </w:p>
+    <w:p>
+      <w:pPr>
+        <w:pStyle w:val="ListParagraph"/>
+        <w:numPr>
+          <w:ilvl w:val="0"/>
+          <w:numId w:val="17"/>
+        </w:numPr>
+        <w:rPr>
+          <w:lang w:val="en-US"/>
+        </w:rPr>
+      </w:pPr>
+      <w:r>
+        <w:rPr>
+          <w:lang w:val="en-US"/>
+        </w:rPr>
+        <w:t>Design -&gt; Deliverables</w:t>
+      </w:r>
+    </w:p>
+    <w:p>
+      <w:pPr>
+        <w:pStyle w:val="ListParagraph"/>
+        <w:numPr>
+          <w:ilvl w:val="1"/>
+          <w:numId w:val="17"/>
+        </w:numPr>
+        <w:rPr>
+          <w:lang w:val="en-US"/>
+        </w:rPr>
+      </w:pPr>
+      <w:r>
+        <w:rPr>
+          <w:lang w:val="en-US"/>
+        </w:rPr>
+        <w:t>Added hidden column to allow subcontract hours to be excluded from forecast</w:t>
+      </w:r>
+    </w:p>
+    <w:p>
+      <w:pPr>
+        <w:pStyle w:val="ListParagraph"/>
+        <w:ind w:left="1440"/>
+        <w:rPr>
+          <w:lang w:val="en-US"/>
+        </w:rPr>
+      </w:pPr>
+      <w:hyperlink r:id="rId5" w:history="1">
+        <w:r>
+          <w:rPr>
+            <w:rStyle w:val="Hyperlink"/>
+            <w:lang w:val="en-US"/>
+          </w:rPr>
+          <w:t>How to exclude subcontract hours from forecast</w:t>
+        </w:r>
+      </w:hyperlink>
+    </w:p>
+    <w:p>
+      <w:pPr>
+        <w:pStyle w:val="ListParagraph"/>
+        <w:ind w:left="1440"/>
+        <w:rPr>
+          <w:lang w:val="en-US"/>
+        </w:rPr>
+      </w:pPr>
+    </w:p>
+    <w:p>
+      <w:pPr>
+        <w:rPr>
+          <w:lang w:val="en-US"/>
+        </w:rPr>
+      </w:pPr>
+      <w:r>
+        <w:rPr>
+          <w:lang w:val="en-US"/>
+        </w:rPr>
         <w:t>Change Log 14</w:t>
       </w:r>
       <w:r>
@@ -129,7 +218,21 @@
         <w:rPr>
           <w:lang w:val="en-US"/>
         </w:rPr>
-        <w:t xml:space="preserve">ixed an error where newly added user isn't </w:t>
+        <w:t xml:space="preserve">ixed an error where newly added user </w:t>
+      </w:r>
+      <w:proofErr w:type="gramStart"/>
+      <w:r>
+        <w:rPr>
+          <w:lang w:val="en-US"/>
+        </w:rPr>
+        <w:t>isn't</w:t>
+      </w:r>
+      <w:proofErr w:type="gramEnd"/>
+      <w:r>
+        <w:rPr>
+          <w:lang w:val="en-US"/>
+        </w:rPr>
+        <w:t xml:space="preserve"> </w:t>
       </w:r>
       <w:r>
         <w:rPr>
@@ -227,7 +330,35 @@
         <w:rPr>
           <w:lang w:val="en-US"/>
         </w:rPr>
-        <w:t>ixed an issue where subjob variation code doesn't show up in book time</w:t>
+        <w:t xml:space="preserve">ixed an issue where </w:t>
+      </w:r>
+      <w:proofErr w:type="spellStart"/>
+      <w:r>
+        <w:rPr>
+          <w:lang w:val="en-US"/>
+        </w:rPr>
+        <w:t>subjob</w:t>
+      </w:r>
+      <w:proofErr w:type="spellEnd"/>
+      <w:r>
+        <w:rPr>
+          <w:lang w:val="en-US"/>
+        </w:rPr>
+        <w:t xml:space="preserve"> variation code </w:t>
+      </w:r>
+      <w:proofErr w:type="gramStart"/>
+      <w:r>
+        <w:rPr>
+          <w:lang w:val="en-US"/>
+        </w:rPr>
+        <w:t>doesn't</w:t>
+      </w:r>
+      <w:proofErr w:type="gramEnd"/>
+      <w:r>
+        <w:rPr>
+          <w:lang w:val="en-US"/>
+        </w:rPr>
+        <w:t xml:space="preserve"> show up in book time</w:t>
       </w:r>
     </w:p>
     <w:p>
@@ -433,7 +564,21 @@
         <w:rPr>
           <w:lang w:val="en-US"/>
         </w:rPr>
-        <w:t>llow construction jobs cells to be edited when P6 project doesn't exists</w:t>
+        <w:t xml:space="preserve">llow construction jobs cells to be edited when P6 project </w:t>
+      </w:r>
+      <w:proofErr w:type="gramStart"/>
+      <w:r>
+        <w:rPr>
+          <w:lang w:val="en-US"/>
+        </w:rPr>
+        <w:t>doesn't</w:t>
+      </w:r>
+      <w:proofErr w:type="gramEnd"/>
+      <w:r>
+        <w:rPr>
+          <w:lang w:val="en-US"/>
+        </w:rPr>
+        <w:t xml:space="preserve"> exists</w:t>
       </w:r>
     </w:p>
     <w:p>
@@ -489,7 +634,35 @@
         <w:rPr>
           <w:rFonts w:cs="Calibri"/>
         </w:rPr>
-        <w:t>Editing Exo -&gt; Transaction quantity will adjust line cost, line charge, line total, line total tax, line tax and linetotal incl tax in EXO</w:t>
+        <w:t xml:space="preserve">Editing Exo -&gt; Transaction quantity will adjust line cost, line charge, line total, line total tax, line tax and </w:t>
+      </w:r>
+      <w:proofErr w:type="spellStart"/>
+      <w:r>
+        <w:rPr>
+          <w:rFonts w:cs="Calibri"/>
+        </w:rPr>
+        <w:t>linetotal</w:t>
+      </w:r>
+      <w:proofErr w:type="spellEnd"/>
+      <w:r>
+        <w:rPr>
+          <w:rFonts w:cs="Calibri"/>
+        </w:rPr>
+        <w:t xml:space="preserve"> </w:t>
+      </w:r>
+      <w:proofErr w:type="spellStart"/>
+      <w:r>
+        <w:rPr>
+          <w:rFonts w:cs="Calibri"/>
+        </w:rPr>
+        <w:t>incl</w:t>
+      </w:r>
+      <w:proofErr w:type="spellEnd"/>
+      <w:r>
+        <w:rPr>
+          <w:rFonts w:cs="Calibri"/>
+        </w:rPr>
+        <w:t xml:space="preserve"> tax in EXO</w:t>
       </w:r>
     </w:p>
     <w:p>
@@ -507,7 +680,21 @@
         <w:rPr>
           <w:rFonts w:cs="Calibri"/>
         </w:rPr>
-        <w:t>narrative will be saved on day with hours so that when it’s approved the narrative will be transferred over</w:t>
+        <w:t xml:space="preserve">narrative will be saved on day with hours so that when </w:t>
+      </w:r>
+      <w:proofErr w:type="gramStart"/>
+      <w:r>
+        <w:rPr>
+          <w:rFonts w:cs="Calibri"/>
+        </w:rPr>
+        <w:t>it’s</w:t>
+      </w:r>
+      <w:proofErr w:type="gramEnd"/>
+      <w:r>
+        <w:rPr>
+          <w:rFonts w:cs="Calibri"/>
+        </w:rPr>
+        <w:t xml:space="preserve"> approved the narrative will be transferred over</w:t>
       </w:r>
     </w:p>
     <w:p>
@@ -587,7 +774,21 @@
         <w:rPr>
           <w:lang w:val="en-US"/>
         </w:rPr>
-        <w:t>Book Time dialog loads faster for user that doesn’t have authority to book time for other users</w:t>
+        <w:t xml:space="preserve">Book Time dialog loads faster for user that </w:t>
+      </w:r>
+      <w:proofErr w:type="gramStart"/>
+      <w:r>
+        <w:rPr>
+          <w:lang w:val="en-US"/>
+        </w:rPr>
+        <w:t>doesn’t</w:t>
+      </w:r>
+      <w:proofErr w:type="gramEnd"/>
+      <w:r>
+        <w:rPr>
+          <w:lang w:val="en-US"/>
+        </w:rPr>
+        <w:t xml:space="preserve"> have authority to book time for other users</w:t>
       </w:r>
     </w:p>
     <w:p>
@@ -596,10 +797,18 @@
           <w:lang w:val="en-US"/>
         </w:rPr>
       </w:pPr>
-      <w:r>
-        <w:rPr>
-          <w:lang w:val="en-US"/>
-        </w:rPr>
+    </w:p>
+    <w:p>
+      <w:pPr>
+        <w:rPr>
+          <w:lang w:val="en-US"/>
+        </w:rPr>
+      </w:pPr>
+      <w:r>
+        <w:rPr>
+          <w:lang w:val="en-US"/>
+        </w:rPr>
+        <w:lastRenderedPageBreak/>
         <w:t>Change Log</w:t>
       </w:r>
       <w:r>
@@ -693,7 +902,7 @@
           <w:lang w:val="en-US"/>
         </w:rPr>
       </w:pPr>
-      <w:hyperlink r:id="rId5" w:history="1">
+      <w:hyperlink r:id="rId6" w:history="1">
         <w:r>
           <w:rPr>
             <w:rStyle w:val="Hyperlink"/>
@@ -828,6 +1037,118 @@
     </w:lvl>
   </w:abstractNum>
   <w:abstractNum w:abstractNumId="1" w15:restartNumberingAfterBreak="0">
+    <w:nsid w:val="0B4E5795"/>
+    <w:multiLevelType w:val="hybridMultilevel"/>
+    <w:tmpl w:val="F8C43A90"/>
+    <w:lvl w:ilvl="0" w:tplc="7FF69D66">
+      <w:numFmt w:val="bullet"/>
+      <w:lvlText w:val="-"/>
+      <w:lvlJc w:val="left"/>
+      <w:pPr>
+        <w:ind w:left="720" w:hanging="360"/>
+      </w:pPr>
+      <w:rPr>
+        <w:rFonts w:ascii="Calibri" w:eastAsiaTheme="minorEastAsia" w:hAnsi="Calibri" w:cs="Calibri" w:hint="default"/>
+      </w:rPr>
+    </w:lvl>
+    <w:lvl w:ilvl="1" w:tplc="44090003" w:tentative="1">
+      <w:start w:val="1"/>
+      <w:numFmt w:val="bullet"/>
+      <w:lvlText w:val="o"/>
+      <w:lvlJc w:val="left"/>
+      <w:pPr>
+        <w:ind w:left="1440" w:hanging="360"/>
+      </w:pPr>
+      <w:rPr>
+        <w:rFonts w:ascii="Courier New" w:hAnsi="Courier New" w:cs="Courier New" w:hint="default"/>
+      </w:rPr>
+    </w:lvl>
+    <w:lvl w:ilvl="2" w:tplc="44090005" w:tentative="1">
+      <w:start w:val="1"/>
+      <w:numFmt w:val="bullet"/>
+      <w:lvlText w:val=""/>
+      <w:lvlJc w:val="left"/>
+      <w:pPr>
+        <w:ind w:left="2160" w:hanging="360"/>
+      </w:pPr>
+      <w:rPr>
+        <w:rFonts w:ascii="Wingdings" w:hAnsi="Wingdings" w:hint="default"/>
+      </w:rPr>
+    </w:lvl>
+    <w:lvl w:ilvl="3" w:tplc="44090001" w:tentative="1">
+      <w:start w:val="1"/>
+      <w:numFmt w:val="bullet"/>
+      <w:lvlText w:val=""/>
+      <w:lvlJc w:val="left"/>
+      <w:pPr>
+        <w:ind w:left="2880" w:hanging="360"/>
+      </w:pPr>
+      <w:rPr>
+        <w:rFonts w:ascii="Symbol" w:hAnsi="Symbol" w:hint="default"/>
+      </w:rPr>
+    </w:lvl>
+    <w:lvl w:ilvl="4" w:tplc="44090003" w:tentative="1">
+      <w:start w:val="1"/>
+      <w:numFmt w:val="bullet"/>
+      <w:lvlText w:val="o"/>
+      <w:lvlJc w:val="left"/>
+      <w:pPr>
+        <w:ind w:left="3600" w:hanging="360"/>
+      </w:pPr>
+      <w:rPr>
+        <w:rFonts w:ascii="Courier New" w:hAnsi="Courier New" w:cs="Courier New" w:hint="default"/>
+      </w:rPr>
+    </w:lvl>
+    <w:lvl w:ilvl="5" w:tplc="44090005" w:tentative="1">
+      <w:start w:val="1"/>
+      <w:numFmt w:val="bullet"/>
+      <w:lvlText w:val=""/>
+      <w:lvlJc w:val="left"/>
+      <w:pPr>
+        <w:ind w:left="4320" w:hanging="360"/>
+      </w:pPr>
+      <w:rPr>
+        <w:rFonts w:ascii="Wingdings" w:hAnsi="Wingdings" w:hint="default"/>
+      </w:rPr>
+    </w:lvl>
+    <w:lvl w:ilvl="6" w:tplc="44090001" w:tentative="1">
+      <w:start w:val="1"/>
+      <w:numFmt w:val="bullet"/>
+      <w:lvlText w:val=""/>
+      <w:lvlJc w:val="left"/>
+      <w:pPr>
+        <w:ind w:left="5040" w:hanging="360"/>
+      </w:pPr>
+      <w:rPr>
+        <w:rFonts w:ascii="Symbol" w:hAnsi="Symbol" w:hint="default"/>
+      </w:rPr>
+    </w:lvl>
+    <w:lvl w:ilvl="7" w:tplc="44090003" w:tentative="1">
+      <w:start w:val="1"/>
+      <w:numFmt w:val="bullet"/>
+      <w:lvlText w:val="o"/>
+      <w:lvlJc w:val="left"/>
+      <w:pPr>
+        <w:ind w:left="5760" w:hanging="360"/>
+      </w:pPr>
+      <w:rPr>
+        <w:rFonts w:ascii="Courier New" w:hAnsi="Courier New" w:cs="Courier New" w:hint="default"/>
+      </w:rPr>
+    </w:lvl>
+    <w:lvl w:ilvl="8" w:tplc="44090005" w:tentative="1">
+      <w:start w:val="1"/>
+      <w:numFmt w:val="bullet"/>
+      <w:lvlText w:val=""/>
+      <w:lvlJc w:val="left"/>
+      <w:pPr>
+        <w:ind w:left="6480" w:hanging="360"/>
+      </w:pPr>
+      <w:rPr>
+        <w:rFonts w:ascii="Wingdings" w:hAnsi="Wingdings" w:hint="default"/>
+      </w:rPr>
+    </w:lvl>
+  </w:abstractNum>
+  <w:abstractNum w:abstractNumId="2" w15:restartNumberingAfterBreak="0">
     <w:nsid w:val="1D377B89"/>
     <w:multiLevelType w:val="hybridMultilevel"/>
     <w:tmpl w:val="1744FA72"/>
@@ -940,7 +1261,119 @@
       </w:rPr>
     </w:lvl>
   </w:abstractNum>
-  <w:abstractNum w:abstractNumId="2" w15:restartNumberingAfterBreak="0">
+  <w:abstractNum w:abstractNumId="3" w15:restartNumberingAfterBreak="0">
+    <w:nsid w:val="1DCB2786"/>
+    <w:multiLevelType w:val="hybridMultilevel"/>
+    <w:tmpl w:val="DA046A8A"/>
+    <w:lvl w:ilvl="0" w:tplc="8B20C7DC">
+      <w:numFmt w:val="bullet"/>
+      <w:lvlText w:val="-"/>
+      <w:lvlJc w:val="left"/>
+      <w:pPr>
+        <w:ind w:left="720" w:hanging="360"/>
+      </w:pPr>
+      <w:rPr>
+        <w:rFonts w:ascii="Calibri" w:eastAsiaTheme="minorEastAsia" w:hAnsi="Calibri" w:cs="Calibri" w:hint="default"/>
+      </w:rPr>
+    </w:lvl>
+    <w:lvl w:ilvl="1" w:tplc="44090003">
+      <w:start w:val="1"/>
+      <w:numFmt w:val="bullet"/>
+      <w:lvlText w:val="o"/>
+      <w:lvlJc w:val="left"/>
+      <w:pPr>
+        <w:ind w:left="1440" w:hanging="360"/>
+      </w:pPr>
+      <w:rPr>
+        <w:rFonts w:ascii="Courier New" w:hAnsi="Courier New" w:cs="Courier New" w:hint="default"/>
+      </w:rPr>
+    </w:lvl>
+    <w:lvl w:ilvl="2" w:tplc="44090005" w:tentative="1">
+      <w:start w:val="1"/>
+      <w:numFmt w:val="bullet"/>
+      <w:lvlText w:val=""/>
+      <w:lvlJc w:val="left"/>
+      <w:pPr>
+        <w:ind w:left="2160" w:hanging="360"/>
+      </w:pPr>
+      <w:rPr>
+        <w:rFonts w:ascii="Wingdings" w:hAnsi="Wingdings" w:hint="default"/>
+      </w:rPr>
+    </w:lvl>
+    <w:lvl w:ilvl="3" w:tplc="44090001" w:tentative="1">
+      <w:start w:val="1"/>
+      <w:numFmt w:val="bullet"/>
+      <w:lvlText w:val=""/>
+      <w:lvlJc w:val="left"/>
+      <w:pPr>
+        <w:ind w:left="2880" w:hanging="360"/>
+      </w:pPr>
+      <w:rPr>
+        <w:rFonts w:ascii="Symbol" w:hAnsi="Symbol" w:hint="default"/>
+      </w:rPr>
+    </w:lvl>
+    <w:lvl w:ilvl="4" w:tplc="44090003" w:tentative="1">
+      <w:start w:val="1"/>
+      <w:numFmt w:val="bullet"/>
+      <w:lvlText w:val="o"/>
+      <w:lvlJc w:val="left"/>
+      <w:pPr>
+        <w:ind w:left="3600" w:hanging="360"/>
+      </w:pPr>
+      <w:rPr>
+        <w:rFonts w:ascii="Courier New" w:hAnsi="Courier New" w:cs="Courier New" w:hint="default"/>
+      </w:rPr>
+    </w:lvl>
+    <w:lvl w:ilvl="5" w:tplc="44090005" w:tentative="1">
+      <w:start w:val="1"/>
+      <w:numFmt w:val="bullet"/>
+      <w:lvlText w:val=""/>
+      <w:lvlJc w:val="left"/>
+      <w:pPr>
+        <w:ind w:left="4320" w:hanging="360"/>
+      </w:pPr>
+      <w:rPr>
+        <w:rFonts w:ascii="Wingdings" w:hAnsi="Wingdings" w:hint="default"/>
+      </w:rPr>
+    </w:lvl>
+    <w:lvl w:ilvl="6" w:tplc="44090001" w:tentative="1">
+      <w:start w:val="1"/>
+      <w:numFmt w:val="bullet"/>
+      <w:lvlText w:val=""/>
+      <w:lvlJc w:val="left"/>
+      <w:pPr>
+        <w:ind w:left="5040" w:hanging="360"/>
+      </w:pPr>
+      <w:rPr>
+        <w:rFonts w:ascii="Symbol" w:hAnsi="Symbol" w:hint="default"/>
+      </w:rPr>
+    </w:lvl>
+    <w:lvl w:ilvl="7" w:tplc="44090003" w:tentative="1">
+      <w:start w:val="1"/>
+      <w:numFmt w:val="bullet"/>
+      <w:lvlText w:val="o"/>
+      <w:lvlJc w:val="left"/>
+      <w:pPr>
+        <w:ind w:left="5760" w:hanging="360"/>
+      </w:pPr>
+      <w:rPr>
+        <w:rFonts w:ascii="Courier New" w:hAnsi="Courier New" w:cs="Courier New" w:hint="default"/>
+      </w:rPr>
+    </w:lvl>
+    <w:lvl w:ilvl="8" w:tplc="44090005" w:tentative="1">
+      <w:start w:val="1"/>
+      <w:numFmt w:val="bullet"/>
+      <w:lvlText w:val=""/>
+      <w:lvlJc w:val="left"/>
+      <w:pPr>
+        <w:ind w:left="6480" w:hanging="360"/>
+      </w:pPr>
+      <w:rPr>
+        <w:rFonts w:ascii="Wingdings" w:hAnsi="Wingdings" w:hint="default"/>
+      </w:rPr>
+    </w:lvl>
+  </w:abstractNum>
+  <w:abstractNum w:abstractNumId="4" w15:restartNumberingAfterBreak="0">
     <w:nsid w:val="1F4D0C5A"/>
     <w:multiLevelType w:val="hybridMultilevel"/>
     <w:tmpl w:val="58644CA6"/>
@@ -1052,7 +1485,7 @@
       </w:rPr>
     </w:lvl>
   </w:abstractNum>
-  <w:abstractNum w:abstractNumId="3" w15:restartNumberingAfterBreak="0">
+  <w:abstractNum w:abstractNumId="5" w15:restartNumberingAfterBreak="0">
     <w:nsid w:val="22100513"/>
     <w:multiLevelType w:val="multilevel"/>
     <w:tmpl w:val="9DA06E12"/>
@@ -1165,7 +1598,7 @@
       </w:pPr>
     </w:lvl>
   </w:abstractNum>
-  <w:abstractNum w:abstractNumId="4" w15:restartNumberingAfterBreak="0">
+  <w:abstractNum w:abstractNumId="6" w15:restartNumberingAfterBreak="0">
     <w:nsid w:val="3C5C6580"/>
     <w:multiLevelType w:val="hybridMultilevel"/>
     <w:tmpl w:val="6874B70A"/>
@@ -1278,7 +1711,7 @@
       </w:rPr>
     </w:lvl>
   </w:abstractNum>
-  <w:abstractNum w:abstractNumId="5" w15:restartNumberingAfterBreak="0">
+  <w:abstractNum w:abstractNumId="7" w15:restartNumberingAfterBreak="0">
     <w:nsid w:val="4691596C"/>
     <w:multiLevelType w:val="hybridMultilevel"/>
     <w:tmpl w:val="ECEEF302"/>
@@ -1390,7 +1823,7 @@
       </w:rPr>
     </w:lvl>
   </w:abstractNum>
-  <w:abstractNum w:abstractNumId="6" w15:restartNumberingAfterBreak="0">
+  <w:abstractNum w:abstractNumId="8" w15:restartNumberingAfterBreak="0">
     <w:nsid w:val="47F951B0"/>
     <w:multiLevelType w:val="multilevel"/>
     <w:tmpl w:val="00D8A7E8"/>
@@ -1476,7 +1909,7 @@
       </w:pPr>
     </w:lvl>
   </w:abstractNum>
-  <w:abstractNum w:abstractNumId="7" w15:restartNumberingAfterBreak="0">
+  <w:abstractNum w:abstractNumId="9" w15:restartNumberingAfterBreak="0">
     <w:nsid w:val="4D6E34D5"/>
     <w:multiLevelType w:val="hybridMultilevel"/>
     <w:tmpl w:val="6BC866D0"/>
@@ -1588,7 +2021,7 @@
       </w:rPr>
     </w:lvl>
   </w:abstractNum>
-  <w:abstractNum w:abstractNumId="8" w15:restartNumberingAfterBreak="0">
+  <w:abstractNum w:abstractNumId="10" w15:restartNumberingAfterBreak="0">
     <w:nsid w:val="52606647"/>
     <w:multiLevelType w:val="hybridMultilevel"/>
     <w:tmpl w:val="34FAD1A0"/>
@@ -1700,7 +2133,7 @@
       </w:rPr>
     </w:lvl>
   </w:abstractNum>
-  <w:abstractNum w:abstractNumId="9" w15:restartNumberingAfterBreak="0">
+  <w:abstractNum w:abstractNumId="11" w15:restartNumberingAfterBreak="0">
     <w:nsid w:val="557D5C95"/>
     <w:multiLevelType w:val="hybridMultilevel"/>
     <w:tmpl w:val="DC122E1C"/>
@@ -1812,7 +2245,7 @@
       </w:rPr>
     </w:lvl>
   </w:abstractNum>
-  <w:abstractNum w:abstractNumId="10" w15:restartNumberingAfterBreak="0">
+  <w:abstractNum w:abstractNumId="12" w15:restartNumberingAfterBreak="0">
     <w:nsid w:val="589D37B7"/>
     <w:multiLevelType w:val="hybridMultilevel"/>
     <w:tmpl w:val="9262429A"/>
@@ -1924,7 +2357,7 @@
       </w:rPr>
     </w:lvl>
   </w:abstractNum>
-  <w:abstractNum w:abstractNumId="11" w15:restartNumberingAfterBreak="0">
+  <w:abstractNum w:abstractNumId="13" w15:restartNumberingAfterBreak="0">
     <w:nsid w:val="58AA443D"/>
     <w:multiLevelType w:val="hybridMultilevel"/>
     <w:tmpl w:val="56F0D18E"/>
@@ -2037,7 +2470,7 @@
       </w:rPr>
     </w:lvl>
   </w:abstractNum>
-  <w:abstractNum w:abstractNumId="12" w15:restartNumberingAfterBreak="0">
+  <w:abstractNum w:abstractNumId="14" w15:restartNumberingAfterBreak="0">
     <w:nsid w:val="5C8347BF"/>
     <w:multiLevelType w:val="hybridMultilevel"/>
     <w:tmpl w:val="D2F46B88"/>
@@ -2149,7 +2582,7 @@
       </w:rPr>
     </w:lvl>
   </w:abstractNum>
-  <w:abstractNum w:abstractNumId="13" w15:restartNumberingAfterBreak="0">
+  <w:abstractNum w:abstractNumId="15" w15:restartNumberingAfterBreak="0">
     <w:nsid w:val="6AC268F7"/>
     <w:multiLevelType w:val="hybridMultilevel"/>
     <w:tmpl w:val="12F21194"/>
@@ -2261,7 +2694,7 @@
       </w:rPr>
     </w:lvl>
   </w:abstractNum>
-  <w:abstractNum w:abstractNumId="14" w15:restartNumberingAfterBreak="0">
+  <w:abstractNum w:abstractNumId="16" w15:restartNumberingAfterBreak="0">
     <w:nsid w:val="7D5B508C"/>
     <w:multiLevelType w:val="hybridMultilevel"/>
     <w:tmpl w:val="7FAC5656"/>
@@ -2375,49 +2808,55 @@
     </w:lvl>
   </w:abstractNum>
   <w:num w:numId="1">
-    <w:abstractNumId w:val="6"/>
+    <w:abstractNumId w:val="8"/>
   </w:num>
   <w:num w:numId="2">
-    <w:abstractNumId w:val="3"/>
+    <w:abstractNumId w:val="5"/>
   </w:num>
   <w:num w:numId="3">
-    <w:abstractNumId w:val="7"/>
+    <w:abstractNumId w:val="9"/>
   </w:num>
   <w:num w:numId="4">
     <w:abstractNumId w:val="0"/>
   </w:num>
   <w:num w:numId="5">
+    <w:abstractNumId w:val="14"/>
+  </w:num>
+  <w:num w:numId="6">
     <w:abstractNumId w:val="12"/>
   </w:num>
-  <w:num w:numId="6">
+  <w:num w:numId="7">
+    <w:abstractNumId w:val="2"/>
+  </w:num>
+  <w:num w:numId="8">
     <w:abstractNumId w:val="10"/>
   </w:num>
-  <w:num w:numId="7">
+  <w:num w:numId="9">
+    <w:abstractNumId w:val="4"/>
+  </w:num>
+  <w:num w:numId="10">
+    <w:abstractNumId w:val="11"/>
+  </w:num>
+  <w:num w:numId="11">
+    <w:abstractNumId w:val="13"/>
+  </w:num>
+  <w:num w:numId="12">
+    <w:abstractNumId w:val="7"/>
+  </w:num>
+  <w:num w:numId="13">
+    <w:abstractNumId w:val="16"/>
+  </w:num>
+  <w:num w:numId="14">
+    <w:abstractNumId w:val="6"/>
+  </w:num>
+  <w:num w:numId="15">
+    <w:abstractNumId w:val="15"/>
+  </w:num>
+  <w:num w:numId="16">
     <w:abstractNumId w:val="1"/>
   </w:num>
-  <w:num w:numId="8">
-    <w:abstractNumId w:val="8"/>
-  </w:num>
-  <w:num w:numId="9">
-    <w:abstractNumId w:val="2"/>
-  </w:num>
-  <w:num w:numId="10">
-    <w:abstractNumId w:val="9"/>
-  </w:num>
-  <w:num w:numId="11">
-    <w:abstractNumId w:val="11"/>
-  </w:num>
-  <w:num w:numId="12">
-    <w:abstractNumId w:val="5"/>
-  </w:num>
-  <w:num w:numId="13">
-    <w:abstractNumId w:val="14"/>
-  </w:num>
-  <w:num w:numId="14">
-    <w:abstractNumId w:val="4"/>
-  </w:num>
-  <w:num w:numId="15">
-    <w:abstractNumId w:val="13"/>
+  <w:num w:numId="17">
+    <w:abstractNumId w:val="3"/>
   </w:num>
 </w:numbering>
 </file>

</xml_diff>

<commit_message>
- show error when variation code exceeds 50 characters in Exo -> Jobs - show variation name and units in deliverables and progress list
</commit_message>
<xml_diff>
--- a/BluePrints/Views/ChangeLog.docx
+++ b/BluePrints/Views/ChangeLog.docx
@@ -2,6 +2,126 @@
 <file path=word/document.xml><?xml version="1.0" encoding="utf-8"?>
 <w:document xmlns:wpc="http://schemas.microsoft.com/office/word/2010/wordprocessingCanvas" xmlns:cx="http://schemas.microsoft.com/office/drawing/2014/chartex" xmlns:cx1="http://schemas.microsoft.com/office/drawing/2015/9/8/chartex" xmlns:cx2="http://schemas.microsoft.com/office/drawing/2015/10/21/chartex" xmlns:cx3="http://schemas.microsoft.com/office/drawing/2016/5/9/chartex" xmlns:cx4="http://schemas.microsoft.com/office/drawing/2016/5/10/chartex" xmlns:cx5="http://schemas.microsoft.com/office/drawing/2016/5/11/chartex" xmlns:cx6="http://schemas.microsoft.com/office/drawing/2016/5/12/chartex" xmlns:cx7="http://schemas.microsoft.com/office/drawing/2016/5/13/chartex" xmlns:cx8="http://schemas.microsoft.com/office/drawing/2016/5/14/chartex" xmlns:mc="http://schemas.openxmlformats.org/markup-compatibility/2006" xmlns:aink="http://schemas.microsoft.com/office/drawing/2016/ink" xmlns:am3d="http://schemas.microsoft.com/office/drawing/2017/model3d" xmlns:o="urn:schemas-microsoft-com:office:office" xmlns:r="http://schemas.openxmlformats.org/officeDocument/2006/relationships" xmlns:m="http://schemas.openxmlformats.org/officeDocument/2006/math" xmlns:v="urn:schemas-microsoft-com:vml" xmlns:wp14="http://schemas.microsoft.com/office/word/2010/wordprocessingDrawing" xmlns:wp="http://schemas.openxmlformats.org/drawingml/2006/wordprocessingDrawing" xmlns:w10="urn:schemas-microsoft-com:office:word" xmlns:w="http://schemas.openxmlformats.org/wordprocessingml/2006/main" xmlns:w14="http://schemas.microsoft.com/office/word/2010/wordml" xmlns:w15="http://schemas.microsoft.com/office/word/2012/wordml" xmlns:w16cex="http://schemas.microsoft.com/office/word/2018/wordml/cex" xmlns:w16cid="http://schemas.microsoft.com/office/word/2016/wordml/cid" xmlns:w16="http://schemas.microsoft.com/office/word/2018/wordml" xmlns:w16se="http://schemas.microsoft.com/office/word/2015/wordml/symex" xmlns:wpg="http://schemas.microsoft.com/office/word/2010/wordprocessingGroup" xmlns:wpi="http://schemas.microsoft.com/office/word/2010/wordprocessingInk" xmlns:wne="http://schemas.microsoft.com/office/word/2006/wordml" xmlns:wps="http://schemas.microsoft.com/office/word/2010/wordprocessingShape" mc:Ignorable="w14 w15 w16se w16cid w16 w16cex wp14">
   <w:body>
+    <w:p>
+      <w:pPr>
+        <w:rPr>
+          <w:lang w:val="en-US"/>
+        </w:rPr>
+      </w:pPr>
+      <w:r>
+        <w:rPr>
+          <w:lang w:val="en-US"/>
+        </w:rPr>
+        <w:t>Change Log 17</w:t>
+      </w:r>
+      <w:r>
+        <w:rPr>
+          <w:vertAlign w:val="superscript"/>
+          <w:lang w:val="en-US"/>
+        </w:rPr>
+        <w:t>th</w:t>
+      </w:r>
+      <w:r>
+        <w:rPr>
+          <w:lang w:val="en-US"/>
+        </w:rPr>
+        <w:t xml:space="preserve"> July 2020</w:t>
+      </w:r>
+    </w:p>
+    <w:p>
+      <w:pPr>
+        <w:pStyle w:val="ListParagraph"/>
+        <w:numPr>
+          <w:ilvl w:val="0"/>
+          <w:numId w:val="18"/>
+        </w:numPr>
+        <w:rPr>
+          <w:lang w:val="en-US"/>
+        </w:rPr>
+      </w:pPr>
+      <w:r>
+        <w:rPr>
+          <w:lang w:val="en-US"/>
+        </w:rPr>
+        <w:t>Design -&gt; Deliverables / Progress</w:t>
+      </w:r>
+    </w:p>
+    <w:p>
+      <w:pPr>
+        <w:pStyle w:val="ListParagraph"/>
+        <w:numPr>
+          <w:ilvl w:val="1"/>
+          <w:numId w:val="18"/>
+        </w:numPr>
+        <w:rPr>
+          <w:lang w:val="en-US"/>
+        </w:rPr>
+      </w:pPr>
+      <w:r>
+        <w:rPr>
+          <w:lang w:val="en-US"/>
+        </w:rPr>
+        <w:t xml:space="preserve">Added show variation name and approve </w:t>
+      </w:r>
+      <w:proofErr w:type="gramStart"/>
+      <w:r>
+        <w:rPr>
+          <w:lang w:val="en-US"/>
+        </w:rPr>
+        <w:t>units</w:t>
+      </w:r>
+      <w:proofErr w:type="gramEnd"/>
+      <w:r>
+        <w:rPr>
+          <w:lang w:val="en-US"/>
+        </w:rPr>
+        <w:t xml:space="preserve"> column</w:t>
+      </w:r>
+    </w:p>
+    <w:p>
+      <w:pPr>
+        <w:ind w:left="1080"/>
+        <w:rPr>
+          <w:lang w:val="en-US"/>
+        </w:rPr>
+      </w:pPr>
+      <w:r>
+        <w:rPr>
+          <w:lang w:val="en-US"/>
+        </w:rPr>
+        <w:fldChar w:fldCharType="begin"/>
+      </w:r>
+      <w:r>
+        <w:rPr>
+          <w:lang w:val="en-US"/>
+        </w:rPr>
+        <w:instrText xml:space="preserve"> HYPERLINK "\\\\Fileserver\\Data3\\General\\BLUEPRINTS\\How to\\ShowVariationNameUnits.mp4" </w:instrText>
+      </w:r>
+      <w:r>
+        <w:rPr>
+          <w:lang w:val="en-US"/>
+        </w:rPr>
+      </w:r>
+      <w:r>
+        <w:rPr>
+          <w:lang w:val="en-US"/>
+        </w:rPr>
+        <w:fldChar w:fldCharType="separate"/>
+      </w:r>
+      <w:r>
+        <w:rPr>
+          <w:rStyle w:val="Hyperlink"/>
+          <w:lang w:val="en-US"/>
+        </w:rPr>
+        <w:t>How to check variation name and approved units</w:t>
+      </w:r>
+      <w:r>
+        <w:rPr>
+          <w:lang w:val="en-US"/>
+        </w:rPr>
+        <w:fldChar w:fldCharType="end"/>
+      </w:r>
+    </w:p>
     <w:p>
       <w:pPr>
         <w:rPr>
@@ -738,6 +858,7 @@
         <w:rPr>
           <w:lang w:val="en-US"/>
         </w:rPr>
+        <w:lastRenderedPageBreak/>
         <w:t>Design -&gt; Deliverables</w:t>
       </w:r>
     </w:p>
@@ -808,7 +929,6 @@
         <w:rPr>
           <w:lang w:val="en-US"/>
         </w:rPr>
-        <w:lastRenderedPageBreak/>
         <w:t>Change Log</w:t>
       </w:r>
       <w:r>
@@ -1486,6 +1606,118 @@
     </w:lvl>
   </w:abstractNum>
   <w:abstractNum w:abstractNumId="5" w15:restartNumberingAfterBreak="0">
+    <w:nsid w:val="21223E97"/>
+    <w:multiLevelType w:val="hybridMultilevel"/>
+    <w:tmpl w:val="68E6E128"/>
+    <w:lvl w:ilvl="0" w:tplc="2BBAFA86">
+      <w:numFmt w:val="bullet"/>
+      <w:lvlText w:val="-"/>
+      <w:lvlJc w:val="left"/>
+      <w:pPr>
+        <w:ind w:left="720" w:hanging="360"/>
+      </w:pPr>
+      <w:rPr>
+        <w:rFonts w:ascii="Calibri" w:eastAsiaTheme="minorEastAsia" w:hAnsi="Calibri" w:cs="Calibri" w:hint="default"/>
+      </w:rPr>
+    </w:lvl>
+    <w:lvl w:ilvl="1" w:tplc="44090003">
+      <w:start w:val="1"/>
+      <w:numFmt w:val="bullet"/>
+      <w:lvlText w:val="o"/>
+      <w:lvlJc w:val="left"/>
+      <w:pPr>
+        <w:ind w:left="1440" w:hanging="360"/>
+      </w:pPr>
+      <w:rPr>
+        <w:rFonts w:ascii="Courier New" w:hAnsi="Courier New" w:cs="Courier New" w:hint="default"/>
+      </w:rPr>
+    </w:lvl>
+    <w:lvl w:ilvl="2" w:tplc="44090005" w:tentative="1">
+      <w:start w:val="1"/>
+      <w:numFmt w:val="bullet"/>
+      <w:lvlText w:val=""/>
+      <w:lvlJc w:val="left"/>
+      <w:pPr>
+        <w:ind w:left="2160" w:hanging="360"/>
+      </w:pPr>
+      <w:rPr>
+        <w:rFonts w:ascii="Wingdings" w:hAnsi="Wingdings" w:hint="default"/>
+      </w:rPr>
+    </w:lvl>
+    <w:lvl w:ilvl="3" w:tplc="44090001" w:tentative="1">
+      <w:start w:val="1"/>
+      <w:numFmt w:val="bullet"/>
+      <w:lvlText w:val=""/>
+      <w:lvlJc w:val="left"/>
+      <w:pPr>
+        <w:ind w:left="2880" w:hanging="360"/>
+      </w:pPr>
+      <w:rPr>
+        <w:rFonts w:ascii="Symbol" w:hAnsi="Symbol" w:hint="default"/>
+      </w:rPr>
+    </w:lvl>
+    <w:lvl w:ilvl="4" w:tplc="44090003" w:tentative="1">
+      <w:start w:val="1"/>
+      <w:numFmt w:val="bullet"/>
+      <w:lvlText w:val="o"/>
+      <w:lvlJc w:val="left"/>
+      <w:pPr>
+        <w:ind w:left="3600" w:hanging="360"/>
+      </w:pPr>
+      <w:rPr>
+        <w:rFonts w:ascii="Courier New" w:hAnsi="Courier New" w:cs="Courier New" w:hint="default"/>
+      </w:rPr>
+    </w:lvl>
+    <w:lvl w:ilvl="5" w:tplc="44090005" w:tentative="1">
+      <w:start w:val="1"/>
+      <w:numFmt w:val="bullet"/>
+      <w:lvlText w:val=""/>
+      <w:lvlJc w:val="left"/>
+      <w:pPr>
+        <w:ind w:left="4320" w:hanging="360"/>
+      </w:pPr>
+      <w:rPr>
+        <w:rFonts w:ascii="Wingdings" w:hAnsi="Wingdings" w:hint="default"/>
+      </w:rPr>
+    </w:lvl>
+    <w:lvl w:ilvl="6" w:tplc="44090001" w:tentative="1">
+      <w:start w:val="1"/>
+      <w:numFmt w:val="bullet"/>
+      <w:lvlText w:val=""/>
+      <w:lvlJc w:val="left"/>
+      <w:pPr>
+        <w:ind w:left="5040" w:hanging="360"/>
+      </w:pPr>
+      <w:rPr>
+        <w:rFonts w:ascii="Symbol" w:hAnsi="Symbol" w:hint="default"/>
+      </w:rPr>
+    </w:lvl>
+    <w:lvl w:ilvl="7" w:tplc="44090003" w:tentative="1">
+      <w:start w:val="1"/>
+      <w:numFmt w:val="bullet"/>
+      <w:lvlText w:val="o"/>
+      <w:lvlJc w:val="left"/>
+      <w:pPr>
+        <w:ind w:left="5760" w:hanging="360"/>
+      </w:pPr>
+      <w:rPr>
+        <w:rFonts w:ascii="Courier New" w:hAnsi="Courier New" w:cs="Courier New" w:hint="default"/>
+      </w:rPr>
+    </w:lvl>
+    <w:lvl w:ilvl="8" w:tplc="44090005" w:tentative="1">
+      <w:start w:val="1"/>
+      <w:numFmt w:val="bullet"/>
+      <w:lvlText w:val=""/>
+      <w:lvlJc w:val="left"/>
+      <w:pPr>
+        <w:ind w:left="6480" w:hanging="360"/>
+      </w:pPr>
+      <w:rPr>
+        <w:rFonts w:ascii="Wingdings" w:hAnsi="Wingdings" w:hint="default"/>
+      </w:rPr>
+    </w:lvl>
+  </w:abstractNum>
+  <w:abstractNum w:abstractNumId="6" w15:restartNumberingAfterBreak="0">
     <w:nsid w:val="22100513"/>
     <w:multiLevelType w:val="multilevel"/>
     <w:tmpl w:val="9DA06E12"/>
@@ -1598,7 +1830,7 @@
       </w:pPr>
     </w:lvl>
   </w:abstractNum>
-  <w:abstractNum w:abstractNumId="6" w15:restartNumberingAfterBreak="0">
+  <w:abstractNum w:abstractNumId="7" w15:restartNumberingAfterBreak="0">
     <w:nsid w:val="3C5C6580"/>
     <w:multiLevelType w:val="hybridMultilevel"/>
     <w:tmpl w:val="6874B70A"/>
@@ -1711,7 +1943,7 @@
       </w:rPr>
     </w:lvl>
   </w:abstractNum>
-  <w:abstractNum w:abstractNumId="7" w15:restartNumberingAfterBreak="0">
+  <w:abstractNum w:abstractNumId="8" w15:restartNumberingAfterBreak="0">
     <w:nsid w:val="4691596C"/>
     <w:multiLevelType w:val="hybridMultilevel"/>
     <w:tmpl w:val="ECEEF302"/>
@@ -1823,7 +2055,7 @@
       </w:rPr>
     </w:lvl>
   </w:abstractNum>
-  <w:abstractNum w:abstractNumId="8" w15:restartNumberingAfterBreak="0">
+  <w:abstractNum w:abstractNumId="9" w15:restartNumberingAfterBreak="0">
     <w:nsid w:val="47F951B0"/>
     <w:multiLevelType w:val="multilevel"/>
     <w:tmpl w:val="00D8A7E8"/>
@@ -1909,7 +2141,7 @@
       </w:pPr>
     </w:lvl>
   </w:abstractNum>
-  <w:abstractNum w:abstractNumId="9" w15:restartNumberingAfterBreak="0">
+  <w:abstractNum w:abstractNumId="10" w15:restartNumberingAfterBreak="0">
     <w:nsid w:val="4D6E34D5"/>
     <w:multiLevelType w:val="hybridMultilevel"/>
     <w:tmpl w:val="6BC866D0"/>
@@ -2021,7 +2253,7 @@
       </w:rPr>
     </w:lvl>
   </w:abstractNum>
-  <w:abstractNum w:abstractNumId="10" w15:restartNumberingAfterBreak="0">
+  <w:abstractNum w:abstractNumId="11" w15:restartNumberingAfterBreak="0">
     <w:nsid w:val="52606647"/>
     <w:multiLevelType w:val="hybridMultilevel"/>
     <w:tmpl w:val="34FAD1A0"/>
@@ -2133,7 +2365,7 @@
       </w:rPr>
     </w:lvl>
   </w:abstractNum>
-  <w:abstractNum w:abstractNumId="11" w15:restartNumberingAfterBreak="0">
+  <w:abstractNum w:abstractNumId="12" w15:restartNumberingAfterBreak="0">
     <w:nsid w:val="557D5C95"/>
     <w:multiLevelType w:val="hybridMultilevel"/>
     <w:tmpl w:val="DC122E1C"/>
@@ -2245,7 +2477,7 @@
       </w:rPr>
     </w:lvl>
   </w:abstractNum>
-  <w:abstractNum w:abstractNumId="12" w15:restartNumberingAfterBreak="0">
+  <w:abstractNum w:abstractNumId="13" w15:restartNumberingAfterBreak="0">
     <w:nsid w:val="589D37B7"/>
     <w:multiLevelType w:val="hybridMultilevel"/>
     <w:tmpl w:val="9262429A"/>
@@ -2357,7 +2589,7 @@
       </w:rPr>
     </w:lvl>
   </w:abstractNum>
-  <w:abstractNum w:abstractNumId="13" w15:restartNumberingAfterBreak="0">
+  <w:abstractNum w:abstractNumId="14" w15:restartNumberingAfterBreak="0">
     <w:nsid w:val="58AA443D"/>
     <w:multiLevelType w:val="hybridMultilevel"/>
     <w:tmpl w:val="56F0D18E"/>
@@ -2470,7 +2702,7 @@
       </w:rPr>
     </w:lvl>
   </w:abstractNum>
-  <w:abstractNum w:abstractNumId="14" w15:restartNumberingAfterBreak="0">
+  <w:abstractNum w:abstractNumId="15" w15:restartNumberingAfterBreak="0">
     <w:nsid w:val="5C8347BF"/>
     <w:multiLevelType w:val="hybridMultilevel"/>
     <w:tmpl w:val="D2F46B88"/>
@@ -2582,7 +2814,7 @@
       </w:rPr>
     </w:lvl>
   </w:abstractNum>
-  <w:abstractNum w:abstractNumId="15" w15:restartNumberingAfterBreak="0">
+  <w:abstractNum w:abstractNumId="16" w15:restartNumberingAfterBreak="0">
     <w:nsid w:val="6AC268F7"/>
     <w:multiLevelType w:val="hybridMultilevel"/>
     <w:tmpl w:val="12F21194"/>
@@ -2694,7 +2926,7 @@
       </w:rPr>
     </w:lvl>
   </w:abstractNum>
-  <w:abstractNum w:abstractNumId="16" w15:restartNumberingAfterBreak="0">
+  <w:abstractNum w:abstractNumId="17" w15:restartNumberingAfterBreak="0">
     <w:nsid w:val="7D5B508C"/>
     <w:multiLevelType w:val="hybridMultilevel"/>
     <w:tmpl w:val="7FAC5656"/>
@@ -2808,55 +3040,58 @@
     </w:lvl>
   </w:abstractNum>
   <w:num w:numId="1">
-    <w:abstractNumId w:val="8"/>
+    <w:abstractNumId w:val="9"/>
   </w:num>
   <w:num w:numId="2">
-    <w:abstractNumId w:val="5"/>
+    <w:abstractNumId w:val="6"/>
   </w:num>
   <w:num w:numId="3">
-    <w:abstractNumId w:val="9"/>
+    <w:abstractNumId w:val="10"/>
   </w:num>
   <w:num w:numId="4">
     <w:abstractNumId w:val="0"/>
   </w:num>
   <w:num w:numId="5">
-    <w:abstractNumId w:val="14"/>
+    <w:abstractNumId w:val="15"/>
   </w:num>
   <w:num w:numId="6">
-    <w:abstractNumId w:val="12"/>
+    <w:abstractNumId w:val="13"/>
   </w:num>
   <w:num w:numId="7">
     <w:abstractNumId w:val="2"/>
   </w:num>
   <w:num w:numId="8">
-    <w:abstractNumId w:val="10"/>
+    <w:abstractNumId w:val="11"/>
   </w:num>
   <w:num w:numId="9">
     <w:abstractNumId w:val="4"/>
   </w:num>
   <w:num w:numId="10">
-    <w:abstractNumId w:val="11"/>
+    <w:abstractNumId w:val="12"/>
   </w:num>
   <w:num w:numId="11">
-    <w:abstractNumId w:val="13"/>
+    <w:abstractNumId w:val="14"/>
   </w:num>
   <w:num w:numId="12">
+    <w:abstractNumId w:val="8"/>
+  </w:num>
+  <w:num w:numId="13">
+    <w:abstractNumId w:val="17"/>
+  </w:num>
+  <w:num w:numId="14">
     <w:abstractNumId w:val="7"/>
   </w:num>
-  <w:num w:numId="13">
+  <w:num w:numId="15">
     <w:abstractNumId w:val="16"/>
-  </w:num>
-  <w:num w:numId="14">
-    <w:abstractNumId w:val="6"/>
-  </w:num>
-  <w:num w:numId="15">
-    <w:abstractNumId w:val="15"/>
   </w:num>
   <w:num w:numId="16">
     <w:abstractNumId w:val="1"/>
   </w:num>
   <w:num w:numId="17">
     <w:abstractNumId w:val="3"/>
+  </w:num>
+  <w:num w:numId="18">
+    <w:abstractNumId w:val="5"/>
   </w:num>
 </w:numbering>
 </file>

</xml_diff>

<commit_message>
- added stock code to transaction and PO query
</commit_message>
<xml_diff>
--- a/BluePrints/Views/ChangeLog.docx
+++ b/BluePrints/Views/ChangeLog.docx
@@ -2,6 +2,68 @@
 <file path=word/document.xml><?xml version="1.0" encoding="utf-8"?>
 <w:document xmlns:wpc="http://schemas.microsoft.com/office/word/2010/wordprocessingCanvas" xmlns:cx="http://schemas.microsoft.com/office/drawing/2014/chartex" xmlns:cx1="http://schemas.microsoft.com/office/drawing/2015/9/8/chartex" xmlns:cx2="http://schemas.microsoft.com/office/drawing/2015/10/21/chartex" xmlns:cx3="http://schemas.microsoft.com/office/drawing/2016/5/9/chartex" xmlns:cx4="http://schemas.microsoft.com/office/drawing/2016/5/10/chartex" xmlns:cx5="http://schemas.microsoft.com/office/drawing/2016/5/11/chartex" xmlns:cx6="http://schemas.microsoft.com/office/drawing/2016/5/12/chartex" xmlns:cx7="http://schemas.microsoft.com/office/drawing/2016/5/13/chartex" xmlns:cx8="http://schemas.microsoft.com/office/drawing/2016/5/14/chartex" xmlns:mc="http://schemas.openxmlformats.org/markup-compatibility/2006" xmlns:aink="http://schemas.microsoft.com/office/drawing/2016/ink" xmlns:am3d="http://schemas.microsoft.com/office/drawing/2017/model3d" xmlns:o="urn:schemas-microsoft-com:office:office" xmlns:r="http://schemas.openxmlformats.org/officeDocument/2006/relationships" xmlns:m="http://schemas.openxmlformats.org/officeDocument/2006/math" xmlns:v="urn:schemas-microsoft-com:vml" xmlns:wp14="http://schemas.microsoft.com/office/word/2010/wordprocessingDrawing" xmlns:wp="http://schemas.openxmlformats.org/drawingml/2006/wordprocessingDrawing" xmlns:w10="urn:schemas-microsoft-com:office:word" xmlns:w="http://schemas.openxmlformats.org/wordprocessingml/2006/main" xmlns:w14="http://schemas.microsoft.com/office/word/2010/wordml" xmlns:w15="http://schemas.microsoft.com/office/word/2012/wordml" xmlns:w16cex="http://schemas.microsoft.com/office/word/2018/wordml/cex" xmlns:w16cid="http://schemas.microsoft.com/office/word/2016/wordml/cid" xmlns:w16="http://schemas.microsoft.com/office/word/2018/wordml" xmlns:w16se="http://schemas.microsoft.com/office/word/2015/wordml/symex" xmlns:wpg="http://schemas.microsoft.com/office/word/2010/wordprocessingGroup" xmlns:wpi="http://schemas.microsoft.com/office/word/2010/wordprocessingInk" xmlns:wne="http://schemas.microsoft.com/office/word/2006/wordml" xmlns:wps="http://schemas.microsoft.com/office/word/2010/wordprocessingShape" mc:Ignorable="w14 w15 w16se w16cid w16 w16cex wp14">
   <w:body>
+    <w:p>
+      <w:pPr>
+        <w:rPr>
+          <w:lang w:val="en-US"/>
+        </w:rPr>
+      </w:pPr>
+      <w:r>
+        <w:rPr>
+          <w:lang w:val="en-US"/>
+        </w:rPr>
+        <w:t>Change Log 21</w:t>
+      </w:r>
+      <w:r>
+        <w:rPr>
+          <w:vertAlign w:val="superscript"/>
+          <w:lang w:val="en-US"/>
+        </w:rPr>
+        <w:t>st</w:t>
+      </w:r>
+      <w:r>
+        <w:rPr>
+          <w:lang w:val="en-US"/>
+        </w:rPr>
+        <w:t xml:space="preserve"> July 2020</w:t>
+      </w:r>
+    </w:p>
+    <w:p>
+      <w:pPr>
+        <w:pStyle w:val="ListParagraph"/>
+        <w:numPr>
+          <w:ilvl w:val="0"/>
+          <w:numId w:val="19"/>
+        </w:numPr>
+        <w:rPr>
+          <w:lang w:val="en-US"/>
+        </w:rPr>
+      </w:pPr>
+      <w:r>
+        <w:rPr>
+          <w:lang w:val="en-US"/>
+        </w:rPr>
+        <w:t>Exo -&gt; Transaction, Exo -&gt; Purchase Orders</w:t>
+      </w:r>
+    </w:p>
+    <w:p>
+      <w:pPr>
+        <w:pStyle w:val="ListParagraph"/>
+        <w:numPr>
+          <w:ilvl w:val="1"/>
+          <w:numId w:val="19"/>
+        </w:numPr>
+        <w:rPr>
+          <w:lang w:val="en-US"/>
+        </w:rPr>
+      </w:pPr>
+      <w:r>
+        <w:rPr>
+          <w:lang w:val="en-US"/>
+        </w:rPr>
+        <w:t>Added stock code</w:t>
+      </w:r>
+    </w:p>
     <w:p>
       <w:pPr>
         <w:rPr>
@@ -61,21 +123,7 @@
         <w:rPr>
           <w:lang w:val="en-US"/>
         </w:rPr>
-        <w:t xml:space="preserve">Added show variation name and approve </w:t>
-      </w:r>
-      <w:proofErr w:type="gramStart"/>
-      <w:r>
-        <w:rPr>
-          <w:lang w:val="en-US"/>
-        </w:rPr>
-        <w:t>units</w:t>
-      </w:r>
-      <w:proofErr w:type="gramEnd"/>
-      <w:r>
-        <w:rPr>
-          <w:lang w:val="en-US"/>
-        </w:rPr>
-        <w:t xml:space="preserve"> column</w:t>
+        <w:t>Added show variation name and approve units column</w:t>
       </w:r>
     </w:p>
     <w:p>
@@ -85,42 +133,15 @@
           <w:lang w:val="en-US"/>
         </w:rPr>
       </w:pPr>
-      <w:r>
-        <w:rPr>
-          <w:lang w:val="en-US"/>
-        </w:rPr>
-        <w:fldChar w:fldCharType="begin"/>
-      </w:r>
-      <w:r>
-        <w:rPr>
-          <w:lang w:val="en-US"/>
-        </w:rPr>
-        <w:instrText xml:space="preserve"> HYPERLINK "\\\\Fileserver\\Data3\\General\\BLUEPRINTS\\How to\\ShowVariationNameUnits.mp4" </w:instrText>
-      </w:r>
-      <w:r>
-        <w:rPr>
-          <w:lang w:val="en-US"/>
-        </w:rPr>
-      </w:r>
-      <w:r>
-        <w:rPr>
-          <w:lang w:val="en-US"/>
-        </w:rPr>
-        <w:fldChar w:fldCharType="separate"/>
-      </w:r>
-      <w:r>
-        <w:rPr>
-          <w:rStyle w:val="Hyperlink"/>
-          <w:lang w:val="en-US"/>
-        </w:rPr>
-        <w:t>How to check variation name and approved units</w:t>
-      </w:r>
-      <w:r>
-        <w:rPr>
-          <w:lang w:val="en-US"/>
-        </w:rPr>
-        <w:fldChar w:fldCharType="end"/>
-      </w:r>
+      <w:hyperlink r:id="rId5" w:history="1">
+        <w:r>
+          <w:rPr>
+            <w:rStyle w:val="Hyperlink"/>
+            <w:lang w:val="en-US"/>
+          </w:rPr>
+          <w:t>How to check variation name and approved units</w:t>
+        </w:r>
+      </w:hyperlink>
     </w:p>
     <w:p>
       <w:pPr>
@@ -192,7 +213,7 @@
           <w:lang w:val="en-US"/>
         </w:rPr>
       </w:pPr>
-      <w:hyperlink r:id="rId5" w:history="1">
+      <w:hyperlink r:id="rId6" w:history="1">
         <w:r>
           <w:rPr>
             <w:rStyle w:val="Hyperlink"/>
@@ -338,21 +359,7 @@
         <w:rPr>
           <w:lang w:val="en-US"/>
         </w:rPr>
-        <w:t xml:space="preserve">ixed an error where newly added user </w:t>
-      </w:r>
-      <w:proofErr w:type="gramStart"/>
-      <w:r>
-        <w:rPr>
-          <w:lang w:val="en-US"/>
-        </w:rPr>
-        <w:t>isn't</w:t>
-      </w:r>
-      <w:proofErr w:type="gramEnd"/>
-      <w:r>
-        <w:rPr>
-          <w:lang w:val="en-US"/>
-        </w:rPr>
-        <w:t xml:space="preserve"> </w:t>
+        <w:t xml:space="preserve">ixed an error where newly added user isn't </w:t>
       </w:r>
       <w:r>
         <w:rPr>
@@ -450,35 +457,7 @@
         <w:rPr>
           <w:lang w:val="en-US"/>
         </w:rPr>
-        <w:t xml:space="preserve">ixed an issue where </w:t>
-      </w:r>
-      <w:proofErr w:type="spellStart"/>
-      <w:r>
-        <w:rPr>
-          <w:lang w:val="en-US"/>
-        </w:rPr>
-        <w:t>subjob</w:t>
-      </w:r>
-      <w:proofErr w:type="spellEnd"/>
-      <w:r>
-        <w:rPr>
-          <w:lang w:val="en-US"/>
-        </w:rPr>
-        <w:t xml:space="preserve"> variation code </w:t>
-      </w:r>
-      <w:proofErr w:type="gramStart"/>
-      <w:r>
-        <w:rPr>
-          <w:lang w:val="en-US"/>
-        </w:rPr>
-        <w:t>doesn't</w:t>
-      </w:r>
-      <w:proofErr w:type="gramEnd"/>
-      <w:r>
-        <w:rPr>
-          <w:lang w:val="en-US"/>
-        </w:rPr>
-        <w:t xml:space="preserve"> show up in book time</w:t>
+        <w:t>ixed an issue where subjob variation code doesn't show up in book time</w:t>
       </w:r>
     </w:p>
     <w:p>
@@ -684,21 +663,7 @@
         <w:rPr>
           <w:lang w:val="en-US"/>
         </w:rPr>
-        <w:t xml:space="preserve">llow construction jobs cells to be edited when P6 project </w:t>
-      </w:r>
-      <w:proofErr w:type="gramStart"/>
-      <w:r>
-        <w:rPr>
-          <w:lang w:val="en-US"/>
-        </w:rPr>
-        <w:t>doesn't</w:t>
-      </w:r>
-      <w:proofErr w:type="gramEnd"/>
-      <w:r>
-        <w:rPr>
-          <w:lang w:val="en-US"/>
-        </w:rPr>
-        <w:t xml:space="preserve"> exists</w:t>
+        <w:t>llow construction jobs cells to be edited when P6 project doesn't exists</w:t>
       </w:r>
     </w:p>
     <w:p>
@@ -754,35 +719,7 @@
         <w:rPr>
           <w:rFonts w:cs="Calibri"/>
         </w:rPr>
-        <w:t xml:space="preserve">Editing Exo -&gt; Transaction quantity will adjust line cost, line charge, line total, line total tax, line tax and </w:t>
-      </w:r>
-      <w:proofErr w:type="spellStart"/>
-      <w:r>
-        <w:rPr>
-          <w:rFonts w:cs="Calibri"/>
-        </w:rPr>
-        <w:t>linetotal</w:t>
-      </w:r>
-      <w:proofErr w:type="spellEnd"/>
-      <w:r>
-        <w:rPr>
-          <w:rFonts w:cs="Calibri"/>
-        </w:rPr>
-        <w:t xml:space="preserve"> </w:t>
-      </w:r>
-      <w:proofErr w:type="spellStart"/>
-      <w:r>
-        <w:rPr>
-          <w:rFonts w:cs="Calibri"/>
-        </w:rPr>
-        <w:t>incl</w:t>
-      </w:r>
-      <w:proofErr w:type="spellEnd"/>
-      <w:r>
-        <w:rPr>
-          <w:rFonts w:cs="Calibri"/>
-        </w:rPr>
-        <w:t xml:space="preserve"> tax in EXO</w:t>
+        <w:t>Editing Exo -&gt; Transaction quantity will adjust line cost, line charge, line total, line total tax, line tax and linetotal incl tax in EXO</w:t>
       </w:r>
     </w:p>
     <w:p>
@@ -794,27 +731,14 @@
         </w:numPr>
       </w:pPr>
       <w:r>
+        <w:lastRenderedPageBreak/>
         <w:t xml:space="preserve">Exo -&gt; Timesheet </w:t>
       </w:r>
       <w:r>
         <w:rPr>
           <w:rFonts w:cs="Calibri"/>
         </w:rPr>
-        <w:t xml:space="preserve">narrative will be saved on day with hours so that when </w:t>
-      </w:r>
-      <w:proofErr w:type="gramStart"/>
-      <w:r>
-        <w:rPr>
-          <w:rFonts w:cs="Calibri"/>
-        </w:rPr>
-        <w:t>it’s</w:t>
-      </w:r>
-      <w:proofErr w:type="gramEnd"/>
-      <w:r>
-        <w:rPr>
-          <w:rFonts w:cs="Calibri"/>
-        </w:rPr>
-        <w:t xml:space="preserve"> approved the narrative will be transferred over</w:t>
+        <w:t>narrative will be saved on day with hours so that when it’s approved the narrative will be transferred over</w:t>
       </w:r>
     </w:p>
     <w:p>
@@ -858,7 +782,6 @@
         <w:rPr>
           <w:lang w:val="en-US"/>
         </w:rPr>
-        <w:lastRenderedPageBreak/>
         <w:t>Design -&gt; Deliverables</w:t>
       </w:r>
     </w:p>
@@ -895,21 +818,7 @@
         <w:rPr>
           <w:lang w:val="en-US"/>
         </w:rPr>
-        <w:t xml:space="preserve">Book Time dialog loads faster for user that </w:t>
-      </w:r>
-      <w:proofErr w:type="gramStart"/>
-      <w:r>
-        <w:rPr>
-          <w:lang w:val="en-US"/>
-        </w:rPr>
-        <w:t>doesn’t</w:t>
-      </w:r>
-      <w:proofErr w:type="gramEnd"/>
-      <w:r>
-        <w:rPr>
-          <w:lang w:val="en-US"/>
-        </w:rPr>
-        <w:t xml:space="preserve"> have authority to book time for other users</w:t>
+        <w:t>Book Time dialog loads faster for user that doesn’t have authority to book time for other users</w:t>
       </w:r>
     </w:p>
     <w:p>
@@ -1022,7 +931,7 @@
           <w:lang w:val="en-US"/>
         </w:rPr>
       </w:pPr>
-      <w:hyperlink r:id="rId6" w:history="1">
+      <w:hyperlink r:id="rId7" w:history="1">
         <w:r>
           <w:rPr>
             <w:rStyle w:val="Hyperlink"/>
@@ -1269,6 +1178,118 @@
     </w:lvl>
   </w:abstractNum>
   <w:abstractNum w:abstractNumId="2" w15:restartNumberingAfterBreak="0">
+    <w:nsid w:val="0FC80B97"/>
+    <w:multiLevelType w:val="hybridMultilevel"/>
+    <w:tmpl w:val="DFECF1EE"/>
+    <w:lvl w:ilvl="0" w:tplc="75D85E66">
+      <w:numFmt w:val="bullet"/>
+      <w:lvlText w:val="-"/>
+      <w:lvlJc w:val="left"/>
+      <w:pPr>
+        <w:ind w:left="720" w:hanging="360"/>
+      </w:pPr>
+      <w:rPr>
+        <w:rFonts w:ascii="Calibri" w:eastAsiaTheme="minorEastAsia" w:hAnsi="Calibri" w:cs="Calibri" w:hint="default"/>
+      </w:rPr>
+    </w:lvl>
+    <w:lvl w:ilvl="1" w:tplc="44090003">
+      <w:start w:val="1"/>
+      <w:numFmt w:val="bullet"/>
+      <w:lvlText w:val="o"/>
+      <w:lvlJc w:val="left"/>
+      <w:pPr>
+        <w:ind w:left="1440" w:hanging="360"/>
+      </w:pPr>
+      <w:rPr>
+        <w:rFonts w:ascii="Courier New" w:hAnsi="Courier New" w:cs="Courier New" w:hint="default"/>
+      </w:rPr>
+    </w:lvl>
+    <w:lvl w:ilvl="2" w:tplc="44090005" w:tentative="1">
+      <w:start w:val="1"/>
+      <w:numFmt w:val="bullet"/>
+      <w:lvlText w:val=""/>
+      <w:lvlJc w:val="left"/>
+      <w:pPr>
+        <w:ind w:left="2160" w:hanging="360"/>
+      </w:pPr>
+      <w:rPr>
+        <w:rFonts w:ascii="Wingdings" w:hAnsi="Wingdings" w:hint="default"/>
+      </w:rPr>
+    </w:lvl>
+    <w:lvl w:ilvl="3" w:tplc="44090001" w:tentative="1">
+      <w:start w:val="1"/>
+      <w:numFmt w:val="bullet"/>
+      <w:lvlText w:val=""/>
+      <w:lvlJc w:val="left"/>
+      <w:pPr>
+        <w:ind w:left="2880" w:hanging="360"/>
+      </w:pPr>
+      <w:rPr>
+        <w:rFonts w:ascii="Symbol" w:hAnsi="Symbol" w:hint="default"/>
+      </w:rPr>
+    </w:lvl>
+    <w:lvl w:ilvl="4" w:tplc="44090003" w:tentative="1">
+      <w:start w:val="1"/>
+      <w:numFmt w:val="bullet"/>
+      <w:lvlText w:val="o"/>
+      <w:lvlJc w:val="left"/>
+      <w:pPr>
+        <w:ind w:left="3600" w:hanging="360"/>
+      </w:pPr>
+      <w:rPr>
+        <w:rFonts w:ascii="Courier New" w:hAnsi="Courier New" w:cs="Courier New" w:hint="default"/>
+      </w:rPr>
+    </w:lvl>
+    <w:lvl w:ilvl="5" w:tplc="44090005" w:tentative="1">
+      <w:start w:val="1"/>
+      <w:numFmt w:val="bullet"/>
+      <w:lvlText w:val=""/>
+      <w:lvlJc w:val="left"/>
+      <w:pPr>
+        <w:ind w:left="4320" w:hanging="360"/>
+      </w:pPr>
+      <w:rPr>
+        <w:rFonts w:ascii="Wingdings" w:hAnsi="Wingdings" w:hint="default"/>
+      </w:rPr>
+    </w:lvl>
+    <w:lvl w:ilvl="6" w:tplc="44090001" w:tentative="1">
+      <w:start w:val="1"/>
+      <w:numFmt w:val="bullet"/>
+      <w:lvlText w:val=""/>
+      <w:lvlJc w:val="left"/>
+      <w:pPr>
+        <w:ind w:left="5040" w:hanging="360"/>
+      </w:pPr>
+      <w:rPr>
+        <w:rFonts w:ascii="Symbol" w:hAnsi="Symbol" w:hint="default"/>
+      </w:rPr>
+    </w:lvl>
+    <w:lvl w:ilvl="7" w:tplc="44090003" w:tentative="1">
+      <w:start w:val="1"/>
+      <w:numFmt w:val="bullet"/>
+      <w:lvlText w:val="o"/>
+      <w:lvlJc w:val="left"/>
+      <w:pPr>
+        <w:ind w:left="5760" w:hanging="360"/>
+      </w:pPr>
+      <w:rPr>
+        <w:rFonts w:ascii="Courier New" w:hAnsi="Courier New" w:cs="Courier New" w:hint="default"/>
+      </w:rPr>
+    </w:lvl>
+    <w:lvl w:ilvl="8" w:tplc="44090005" w:tentative="1">
+      <w:start w:val="1"/>
+      <w:numFmt w:val="bullet"/>
+      <w:lvlText w:val=""/>
+      <w:lvlJc w:val="left"/>
+      <w:pPr>
+        <w:ind w:left="6480" w:hanging="360"/>
+      </w:pPr>
+      <w:rPr>
+        <w:rFonts w:ascii="Wingdings" w:hAnsi="Wingdings" w:hint="default"/>
+      </w:rPr>
+    </w:lvl>
+  </w:abstractNum>
+  <w:abstractNum w:abstractNumId="3" w15:restartNumberingAfterBreak="0">
     <w:nsid w:val="1D377B89"/>
     <w:multiLevelType w:val="hybridMultilevel"/>
     <w:tmpl w:val="1744FA72"/>
@@ -1381,7 +1402,7 @@
       </w:rPr>
     </w:lvl>
   </w:abstractNum>
-  <w:abstractNum w:abstractNumId="3" w15:restartNumberingAfterBreak="0">
+  <w:abstractNum w:abstractNumId="4" w15:restartNumberingAfterBreak="0">
     <w:nsid w:val="1DCB2786"/>
     <w:multiLevelType w:val="hybridMultilevel"/>
     <w:tmpl w:val="DA046A8A"/>
@@ -1493,7 +1514,7 @@
       </w:rPr>
     </w:lvl>
   </w:abstractNum>
-  <w:abstractNum w:abstractNumId="4" w15:restartNumberingAfterBreak="0">
+  <w:abstractNum w:abstractNumId="5" w15:restartNumberingAfterBreak="0">
     <w:nsid w:val="1F4D0C5A"/>
     <w:multiLevelType w:val="hybridMultilevel"/>
     <w:tmpl w:val="58644CA6"/>
@@ -1605,7 +1626,7 @@
       </w:rPr>
     </w:lvl>
   </w:abstractNum>
-  <w:abstractNum w:abstractNumId="5" w15:restartNumberingAfterBreak="0">
+  <w:abstractNum w:abstractNumId="6" w15:restartNumberingAfterBreak="0">
     <w:nsid w:val="21223E97"/>
     <w:multiLevelType w:val="hybridMultilevel"/>
     <w:tmpl w:val="68E6E128"/>
@@ -1717,7 +1738,7 @@
       </w:rPr>
     </w:lvl>
   </w:abstractNum>
-  <w:abstractNum w:abstractNumId="6" w15:restartNumberingAfterBreak="0">
+  <w:abstractNum w:abstractNumId="7" w15:restartNumberingAfterBreak="0">
     <w:nsid w:val="22100513"/>
     <w:multiLevelType w:val="multilevel"/>
     <w:tmpl w:val="9DA06E12"/>
@@ -1830,7 +1851,7 @@
       </w:pPr>
     </w:lvl>
   </w:abstractNum>
-  <w:abstractNum w:abstractNumId="7" w15:restartNumberingAfterBreak="0">
+  <w:abstractNum w:abstractNumId="8" w15:restartNumberingAfterBreak="0">
     <w:nsid w:val="3C5C6580"/>
     <w:multiLevelType w:val="hybridMultilevel"/>
     <w:tmpl w:val="6874B70A"/>
@@ -1943,7 +1964,7 @@
       </w:rPr>
     </w:lvl>
   </w:abstractNum>
-  <w:abstractNum w:abstractNumId="8" w15:restartNumberingAfterBreak="0">
+  <w:abstractNum w:abstractNumId="9" w15:restartNumberingAfterBreak="0">
     <w:nsid w:val="4691596C"/>
     <w:multiLevelType w:val="hybridMultilevel"/>
     <w:tmpl w:val="ECEEF302"/>
@@ -2055,7 +2076,7 @@
       </w:rPr>
     </w:lvl>
   </w:abstractNum>
-  <w:abstractNum w:abstractNumId="9" w15:restartNumberingAfterBreak="0">
+  <w:abstractNum w:abstractNumId="10" w15:restartNumberingAfterBreak="0">
     <w:nsid w:val="47F951B0"/>
     <w:multiLevelType w:val="multilevel"/>
     <w:tmpl w:val="00D8A7E8"/>
@@ -2141,7 +2162,7 @@
       </w:pPr>
     </w:lvl>
   </w:abstractNum>
-  <w:abstractNum w:abstractNumId="10" w15:restartNumberingAfterBreak="0">
+  <w:abstractNum w:abstractNumId="11" w15:restartNumberingAfterBreak="0">
     <w:nsid w:val="4D6E34D5"/>
     <w:multiLevelType w:val="hybridMultilevel"/>
     <w:tmpl w:val="6BC866D0"/>
@@ -2253,7 +2274,7 @@
       </w:rPr>
     </w:lvl>
   </w:abstractNum>
-  <w:abstractNum w:abstractNumId="11" w15:restartNumberingAfterBreak="0">
+  <w:abstractNum w:abstractNumId="12" w15:restartNumberingAfterBreak="0">
     <w:nsid w:val="52606647"/>
     <w:multiLevelType w:val="hybridMultilevel"/>
     <w:tmpl w:val="34FAD1A0"/>
@@ -2365,7 +2386,7 @@
       </w:rPr>
     </w:lvl>
   </w:abstractNum>
-  <w:abstractNum w:abstractNumId="12" w15:restartNumberingAfterBreak="0">
+  <w:abstractNum w:abstractNumId="13" w15:restartNumberingAfterBreak="0">
     <w:nsid w:val="557D5C95"/>
     <w:multiLevelType w:val="hybridMultilevel"/>
     <w:tmpl w:val="DC122E1C"/>
@@ -2477,7 +2498,7 @@
       </w:rPr>
     </w:lvl>
   </w:abstractNum>
-  <w:abstractNum w:abstractNumId="13" w15:restartNumberingAfterBreak="0">
+  <w:abstractNum w:abstractNumId="14" w15:restartNumberingAfterBreak="0">
     <w:nsid w:val="589D37B7"/>
     <w:multiLevelType w:val="hybridMultilevel"/>
     <w:tmpl w:val="9262429A"/>
@@ -2589,7 +2610,7 @@
       </w:rPr>
     </w:lvl>
   </w:abstractNum>
-  <w:abstractNum w:abstractNumId="14" w15:restartNumberingAfterBreak="0">
+  <w:abstractNum w:abstractNumId="15" w15:restartNumberingAfterBreak="0">
     <w:nsid w:val="58AA443D"/>
     <w:multiLevelType w:val="hybridMultilevel"/>
     <w:tmpl w:val="56F0D18E"/>
@@ -2702,7 +2723,7 @@
       </w:rPr>
     </w:lvl>
   </w:abstractNum>
-  <w:abstractNum w:abstractNumId="15" w15:restartNumberingAfterBreak="0">
+  <w:abstractNum w:abstractNumId="16" w15:restartNumberingAfterBreak="0">
     <w:nsid w:val="5C8347BF"/>
     <w:multiLevelType w:val="hybridMultilevel"/>
     <w:tmpl w:val="D2F46B88"/>
@@ -2814,7 +2835,7 @@
       </w:rPr>
     </w:lvl>
   </w:abstractNum>
-  <w:abstractNum w:abstractNumId="16" w15:restartNumberingAfterBreak="0">
+  <w:abstractNum w:abstractNumId="17" w15:restartNumberingAfterBreak="0">
     <w:nsid w:val="6AC268F7"/>
     <w:multiLevelType w:val="hybridMultilevel"/>
     <w:tmpl w:val="12F21194"/>
@@ -2926,7 +2947,7 @@
       </w:rPr>
     </w:lvl>
   </w:abstractNum>
-  <w:abstractNum w:abstractNumId="17" w15:restartNumberingAfterBreak="0">
+  <w:abstractNum w:abstractNumId="18" w15:restartNumberingAfterBreak="0">
     <w:nsid w:val="7D5B508C"/>
     <w:multiLevelType w:val="hybridMultilevel"/>
     <w:tmpl w:val="7FAC5656"/>
@@ -3040,58 +3061,61 @@
     </w:lvl>
   </w:abstractNum>
   <w:num w:numId="1">
-    <w:abstractNumId w:val="9"/>
+    <w:abstractNumId w:val="10"/>
   </w:num>
   <w:num w:numId="2">
-    <w:abstractNumId w:val="6"/>
+    <w:abstractNumId w:val="7"/>
   </w:num>
   <w:num w:numId="3">
-    <w:abstractNumId w:val="10"/>
+    <w:abstractNumId w:val="11"/>
   </w:num>
   <w:num w:numId="4">
     <w:abstractNumId w:val="0"/>
   </w:num>
   <w:num w:numId="5">
+    <w:abstractNumId w:val="16"/>
+  </w:num>
+  <w:num w:numId="6">
+    <w:abstractNumId w:val="14"/>
+  </w:num>
+  <w:num w:numId="7">
+    <w:abstractNumId w:val="3"/>
+  </w:num>
+  <w:num w:numId="8">
+    <w:abstractNumId w:val="12"/>
+  </w:num>
+  <w:num w:numId="9">
+    <w:abstractNumId w:val="5"/>
+  </w:num>
+  <w:num w:numId="10">
+    <w:abstractNumId w:val="13"/>
+  </w:num>
+  <w:num w:numId="11">
     <w:abstractNumId w:val="15"/>
   </w:num>
-  <w:num w:numId="6">
-    <w:abstractNumId w:val="13"/>
+  <w:num w:numId="12">
+    <w:abstractNumId w:val="9"/>
   </w:num>
-  <w:num w:numId="7">
-    <w:abstractNumId w:val="2"/>
+  <w:num w:numId="13">
+    <w:abstractNumId w:val="18"/>
   </w:num>
-  <w:num w:numId="8">
-    <w:abstractNumId w:val="11"/>
-  </w:num>
-  <w:num w:numId="9">
-    <w:abstractNumId w:val="4"/>
-  </w:num>
-  <w:num w:numId="10">
-    <w:abstractNumId w:val="12"/>
-  </w:num>
-  <w:num w:numId="11">
-    <w:abstractNumId w:val="14"/>
-  </w:num>
-  <w:num w:numId="12">
+  <w:num w:numId="14">
     <w:abstractNumId w:val="8"/>
   </w:num>
-  <w:num w:numId="13">
+  <w:num w:numId="15">
     <w:abstractNumId w:val="17"/>
-  </w:num>
-  <w:num w:numId="14">
-    <w:abstractNumId w:val="7"/>
-  </w:num>
-  <w:num w:numId="15">
-    <w:abstractNumId w:val="16"/>
   </w:num>
   <w:num w:numId="16">
     <w:abstractNumId w:val="1"/>
   </w:num>
   <w:num w:numId="17">
-    <w:abstractNumId w:val="3"/>
+    <w:abstractNumId w:val="4"/>
   </w:num>
   <w:num w:numId="18">
-    <w:abstractNumId w:val="5"/>
+    <w:abstractNumId w:val="6"/>
+  </w:num>
+  <w:num w:numId="19">
+    <w:abstractNumId w:val="2"/>
   </w:num>
 </w:numbering>
 </file>

</xml_diff>

<commit_message>
- fixed an issue where summary total doesn't refresh immediately on rate, hours changes in construction variation
</commit_message>
<xml_diff>
--- a/BluePrints/Views/ChangeLog.docx
+++ b/BluePrints/Views/ChangeLog.docx
@@ -2,6 +2,68 @@
 <file path=word/document.xml><?xml version="1.0" encoding="utf-8"?>
 <w:document xmlns:wpc="http://schemas.microsoft.com/office/word/2010/wordprocessingCanvas" xmlns:cx="http://schemas.microsoft.com/office/drawing/2014/chartex" xmlns:cx1="http://schemas.microsoft.com/office/drawing/2015/9/8/chartex" xmlns:cx2="http://schemas.microsoft.com/office/drawing/2015/10/21/chartex" xmlns:cx3="http://schemas.microsoft.com/office/drawing/2016/5/9/chartex" xmlns:cx4="http://schemas.microsoft.com/office/drawing/2016/5/10/chartex" xmlns:cx5="http://schemas.microsoft.com/office/drawing/2016/5/11/chartex" xmlns:cx6="http://schemas.microsoft.com/office/drawing/2016/5/12/chartex" xmlns:cx7="http://schemas.microsoft.com/office/drawing/2016/5/13/chartex" xmlns:cx8="http://schemas.microsoft.com/office/drawing/2016/5/14/chartex" xmlns:mc="http://schemas.openxmlformats.org/markup-compatibility/2006" xmlns:aink="http://schemas.microsoft.com/office/drawing/2016/ink" xmlns:am3d="http://schemas.microsoft.com/office/drawing/2017/model3d" xmlns:o="urn:schemas-microsoft-com:office:office" xmlns:r="http://schemas.openxmlformats.org/officeDocument/2006/relationships" xmlns:m="http://schemas.openxmlformats.org/officeDocument/2006/math" xmlns:v="urn:schemas-microsoft-com:vml" xmlns:wp14="http://schemas.microsoft.com/office/word/2010/wordprocessingDrawing" xmlns:wp="http://schemas.openxmlformats.org/drawingml/2006/wordprocessingDrawing" xmlns:w10="urn:schemas-microsoft-com:office:word" xmlns:w="http://schemas.openxmlformats.org/wordprocessingml/2006/main" xmlns:w14="http://schemas.microsoft.com/office/word/2010/wordml" xmlns:w15="http://schemas.microsoft.com/office/word/2012/wordml" xmlns:w16cex="http://schemas.microsoft.com/office/word/2018/wordml/cex" xmlns:w16cid="http://schemas.microsoft.com/office/word/2016/wordml/cid" xmlns:w16="http://schemas.microsoft.com/office/word/2018/wordml" xmlns:w16se="http://schemas.microsoft.com/office/word/2015/wordml/symex" xmlns:wpg="http://schemas.microsoft.com/office/word/2010/wordprocessingGroup" xmlns:wpi="http://schemas.microsoft.com/office/word/2010/wordprocessingInk" xmlns:wne="http://schemas.microsoft.com/office/word/2006/wordml" xmlns:wps="http://schemas.microsoft.com/office/word/2010/wordprocessingShape" mc:Ignorable="w14 w15 w16se w16cid w16 w16cex wp14">
   <w:body>
+    <w:p>
+      <w:pPr>
+        <w:rPr>
+          <w:lang w:val="en-US"/>
+        </w:rPr>
+      </w:pPr>
+      <w:r>
+        <w:rPr>
+          <w:lang w:val="en-US"/>
+        </w:rPr>
+        <w:t>Change Log 24</w:t>
+      </w:r>
+      <w:r>
+        <w:rPr>
+          <w:vertAlign w:val="superscript"/>
+          <w:lang w:val="en-US"/>
+        </w:rPr>
+        <w:t>th</w:t>
+      </w:r>
+      <w:r>
+        <w:rPr>
+          <w:lang w:val="en-US"/>
+        </w:rPr>
+        <w:t xml:space="preserve"> August 2020</w:t>
+      </w:r>
+    </w:p>
+    <w:p>
+      <w:pPr>
+        <w:pStyle w:val="ListParagraph"/>
+        <w:numPr>
+          <w:ilvl w:val="0"/>
+          <w:numId w:val="22"/>
+        </w:numPr>
+        <w:rPr>
+          <w:lang w:val="en-US"/>
+        </w:rPr>
+      </w:pPr>
+      <w:r>
+        <w:rPr>
+          <w:lang w:val="en-US"/>
+        </w:rPr>
+        <w:t>Construction -&gt; Variation</w:t>
+      </w:r>
+    </w:p>
+    <w:p>
+      <w:pPr>
+        <w:pStyle w:val="ListParagraph"/>
+        <w:numPr>
+          <w:ilvl w:val="1"/>
+          <w:numId w:val="22"/>
+        </w:numPr>
+        <w:rPr>
+          <w:lang w:val="en-US"/>
+        </w:rPr>
+      </w:pPr>
+      <w:r>
+        <w:rPr>
+          <w:lang w:val="en-US"/>
+        </w:rPr>
+        <w:t>Added construction variation module</w:t>
+      </w:r>
+    </w:p>
     <w:p>
       <w:pPr>
         <w:rPr>
@@ -625,6 +687,7 @@
         <w:rPr>
           <w:lang w:val="en-US"/>
         </w:rPr>
+        <w:lastRenderedPageBreak/>
         <w:t>Forecast -&gt; Forecast</w:t>
       </w:r>
     </w:p>
@@ -721,7 +784,6 @@
         <w:rPr>
           <w:lang w:val="en-US"/>
         </w:rPr>
-        <w:lastRenderedPageBreak/>
         <w:t>Try to fix summary calculation</w:t>
       </w:r>
       <w:r>
@@ -3184,6 +3246,118 @@
     </w:lvl>
   </w:abstractNum>
   <w:abstractNum w:abstractNumId="19" w15:restartNumberingAfterBreak="0">
+    <w:nsid w:val="6A047A76"/>
+    <w:multiLevelType w:val="hybridMultilevel"/>
+    <w:tmpl w:val="50CADEB2"/>
+    <w:lvl w:ilvl="0" w:tplc="953A3D98">
+      <w:numFmt w:val="bullet"/>
+      <w:lvlText w:val="-"/>
+      <w:lvlJc w:val="left"/>
+      <w:pPr>
+        <w:ind w:left="720" w:hanging="360"/>
+      </w:pPr>
+      <w:rPr>
+        <w:rFonts w:ascii="Calibri" w:eastAsiaTheme="minorEastAsia" w:hAnsi="Calibri" w:cs="Calibri" w:hint="default"/>
+      </w:rPr>
+    </w:lvl>
+    <w:lvl w:ilvl="1" w:tplc="44090003">
+      <w:start w:val="1"/>
+      <w:numFmt w:val="bullet"/>
+      <w:lvlText w:val="o"/>
+      <w:lvlJc w:val="left"/>
+      <w:pPr>
+        <w:ind w:left="1440" w:hanging="360"/>
+      </w:pPr>
+      <w:rPr>
+        <w:rFonts w:ascii="Courier New" w:hAnsi="Courier New" w:cs="Courier New" w:hint="default"/>
+      </w:rPr>
+    </w:lvl>
+    <w:lvl w:ilvl="2" w:tplc="44090005" w:tentative="1">
+      <w:start w:val="1"/>
+      <w:numFmt w:val="bullet"/>
+      <w:lvlText w:val=""/>
+      <w:lvlJc w:val="left"/>
+      <w:pPr>
+        <w:ind w:left="2160" w:hanging="360"/>
+      </w:pPr>
+      <w:rPr>
+        <w:rFonts w:ascii="Wingdings" w:hAnsi="Wingdings" w:hint="default"/>
+      </w:rPr>
+    </w:lvl>
+    <w:lvl w:ilvl="3" w:tplc="44090001" w:tentative="1">
+      <w:start w:val="1"/>
+      <w:numFmt w:val="bullet"/>
+      <w:lvlText w:val=""/>
+      <w:lvlJc w:val="left"/>
+      <w:pPr>
+        <w:ind w:left="2880" w:hanging="360"/>
+      </w:pPr>
+      <w:rPr>
+        <w:rFonts w:ascii="Symbol" w:hAnsi="Symbol" w:hint="default"/>
+      </w:rPr>
+    </w:lvl>
+    <w:lvl w:ilvl="4" w:tplc="44090003" w:tentative="1">
+      <w:start w:val="1"/>
+      <w:numFmt w:val="bullet"/>
+      <w:lvlText w:val="o"/>
+      <w:lvlJc w:val="left"/>
+      <w:pPr>
+        <w:ind w:left="3600" w:hanging="360"/>
+      </w:pPr>
+      <w:rPr>
+        <w:rFonts w:ascii="Courier New" w:hAnsi="Courier New" w:cs="Courier New" w:hint="default"/>
+      </w:rPr>
+    </w:lvl>
+    <w:lvl w:ilvl="5" w:tplc="44090005" w:tentative="1">
+      <w:start w:val="1"/>
+      <w:numFmt w:val="bullet"/>
+      <w:lvlText w:val=""/>
+      <w:lvlJc w:val="left"/>
+      <w:pPr>
+        <w:ind w:left="4320" w:hanging="360"/>
+      </w:pPr>
+      <w:rPr>
+        <w:rFonts w:ascii="Wingdings" w:hAnsi="Wingdings" w:hint="default"/>
+      </w:rPr>
+    </w:lvl>
+    <w:lvl w:ilvl="6" w:tplc="44090001" w:tentative="1">
+      <w:start w:val="1"/>
+      <w:numFmt w:val="bullet"/>
+      <w:lvlText w:val=""/>
+      <w:lvlJc w:val="left"/>
+      <w:pPr>
+        <w:ind w:left="5040" w:hanging="360"/>
+      </w:pPr>
+      <w:rPr>
+        <w:rFonts w:ascii="Symbol" w:hAnsi="Symbol" w:hint="default"/>
+      </w:rPr>
+    </w:lvl>
+    <w:lvl w:ilvl="7" w:tplc="44090003" w:tentative="1">
+      <w:start w:val="1"/>
+      <w:numFmt w:val="bullet"/>
+      <w:lvlText w:val="o"/>
+      <w:lvlJc w:val="left"/>
+      <w:pPr>
+        <w:ind w:left="5760" w:hanging="360"/>
+      </w:pPr>
+      <w:rPr>
+        <w:rFonts w:ascii="Courier New" w:hAnsi="Courier New" w:cs="Courier New" w:hint="default"/>
+      </w:rPr>
+    </w:lvl>
+    <w:lvl w:ilvl="8" w:tplc="44090005" w:tentative="1">
+      <w:start w:val="1"/>
+      <w:numFmt w:val="bullet"/>
+      <w:lvlText w:val=""/>
+      <w:lvlJc w:val="left"/>
+      <w:pPr>
+        <w:ind w:left="6480" w:hanging="360"/>
+      </w:pPr>
+      <w:rPr>
+        <w:rFonts w:ascii="Wingdings" w:hAnsi="Wingdings" w:hint="default"/>
+      </w:rPr>
+    </w:lvl>
+  </w:abstractNum>
+  <w:abstractNum w:abstractNumId="20" w15:restartNumberingAfterBreak="0">
     <w:nsid w:val="6AC268F7"/>
     <w:multiLevelType w:val="hybridMultilevel"/>
     <w:tmpl w:val="12F21194"/>
@@ -3295,7 +3469,7 @@
       </w:rPr>
     </w:lvl>
   </w:abstractNum>
-  <w:abstractNum w:abstractNumId="20" w15:restartNumberingAfterBreak="0">
+  <w:abstractNum w:abstractNumId="21" w15:restartNumberingAfterBreak="0">
     <w:nsid w:val="7D5B508C"/>
     <w:multiLevelType w:val="hybridMultilevel"/>
     <w:tmpl w:val="7FAC5656"/>
@@ -3445,13 +3619,13 @@
     <w:abstractNumId w:val="11"/>
   </w:num>
   <w:num w:numId="13">
-    <w:abstractNumId w:val="20"/>
+    <w:abstractNumId w:val="21"/>
   </w:num>
   <w:num w:numId="14">
     <w:abstractNumId w:val="10"/>
   </w:num>
   <w:num w:numId="15">
-    <w:abstractNumId w:val="19"/>
+    <w:abstractNumId w:val="20"/>
   </w:num>
   <w:num w:numId="16">
     <w:abstractNumId w:val="2"/>
@@ -3470,6 +3644,9 @@
   </w:num>
   <w:num w:numId="21">
     <w:abstractNumId w:val="0"/>
+  </w:num>
+  <w:num w:numId="22">
+    <w:abstractNumId w:val="19"/>
   </w:num>
 </w:numbering>
 </file>

</xml_diff>

<commit_message>
- fixed an issue where commit to exo message shows error on commodity code in Construction Variation - updated change log
</commit_message>
<xml_diff>
--- a/BluePrints/Views/ChangeLog.docx
+++ b/BluePrints/Views/ChangeLog.docx
@@ -66,6 +66,24 @@
     </w:p>
     <w:p>
       <w:pPr>
+        <w:pStyle w:val="ListParagraph"/>
+        <w:ind w:left="1440"/>
+        <w:rPr>
+          <w:lang w:val="en-US"/>
+        </w:rPr>
+      </w:pPr>
+      <w:hyperlink r:id="rId5" w:history="1">
+        <w:r>
+          <w:rPr>
+            <w:rStyle w:val="Hyperlink"/>
+            <w:lang w:val="en-US"/>
+          </w:rPr>
+          <w:t>Tutorial</w:t>
+        </w:r>
+      </w:hyperlink>
+    </w:p>
+    <w:p>
+      <w:pPr>
         <w:rPr>
           <w:lang w:val="en-US"/>
         </w:rPr>
@@ -123,7 +141,21 @@
         <w:rPr>
           <w:lang w:val="en-US"/>
         </w:rPr>
-        <w:t>Added column to show actual labour units post data date</w:t>
+        <w:t xml:space="preserve">Added column to show actual </w:t>
+      </w:r>
+      <w:proofErr w:type="spellStart"/>
+      <w:r>
+        <w:rPr>
+          <w:lang w:val="en-US"/>
+        </w:rPr>
+        <w:t>labour</w:t>
+      </w:r>
+      <w:proofErr w:type="spellEnd"/>
+      <w:r>
+        <w:rPr>
+          <w:lang w:val="en-US"/>
+        </w:rPr>
+        <w:t xml:space="preserve"> units post data date</w:t>
       </w:r>
     </w:p>
     <w:p>
@@ -319,7 +351,7 @@
           <w:lang w:val="en-US"/>
         </w:rPr>
       </w:pPr>
-      <w:hyperlink r:id="rId5" w:history="1">
+      <w:hyperlink r:id="rId6" w:history="1">
         <w:r>
           <w:rPr>
             <w:rStyle w:val="Hyperlink"/>
@@ -399,7 +431,7 @@
           <w:lang w:val="en-US"/>
         </w:rPr>
       </w:pPr>
-      <w:hyperlink r:id="rId6" w:history="1">
+      <w:hyperlink r:id="rId7" w:history="1">
         <w:r>
           <w:rPr>
             <w:rStyle w:val="Hyperlink"/>
@@ -643,7 +675,21 @@
         <w:rPr>
           <w:lang w:val="en-US"/>
         </w:rPr>
-        <w:t>ixed an issue where subjob variation code doesn't show up in book time</w:t>
+        <w:t xml:space="preserve">ixed an issue where </w:t>
+      </w:r>
+      <w:proofErr w:type="spellStart"/>
+      <w:r>
+        <w:rPr>
+          <w:lang w:val="en-US"/>
+        </w:rPr>
+        <w:t>subjob</w:t>
+      </w:r>
+      <w:proofErr w:type="spellEnd"/>
+      <w:r>
+        <w:rPr>
+          <w:lang w:val="en-US"/>
+        </w:rPr>
+        <w:t xml:space="preserve"> variation code doesn't show up in book time</w:t>
       </w:r>
     </w:p>
     <w:p>
@@ -906,7 +952,35 @@
         <w:rPr>
           <w:rFonts w:cs="Calibri"/>
         </w:rPr>
-        <w:t>Editing Exo -&gt; Transaction quantity will adjust line cost, line charge, line total, line total tax, line tax and linetotal incl tax in EXO</w:t>
+        <w:t xml:space="preserve">Editing Exo -&gt; Transaction quantity will adjust line cost, line charge, line total, line total tax, line tax and </w:t>
+      </w:r>
+      <w:proofErr w:type="spellStart"/>
+      <w:r>
+        <w:rPr>
+          <w:rFonts w:cs="Calibri"/>
+        </w:rPr>
+        <w:t>linetotal</w:t>
+      </w:r>
+      <w:proofErr w:type="spellEnd"/>
+      <w:r>
+        <w:rPr>
+          <w:rFonts w:cs="Calibri"/>
+        </w:rPr>
+        <w:t xml:space="preserve"> </w:t>
+      </w:r>
+      <w:proofErr w:type="spellStart"/>
+      <w:r>
+        <w:rPr>
+          <w:rFonts w:cs="Calibri"/>
+        </w:rPr>
+        <w:t>incl</w:t>
+      </w:r>
+      <w:proofErr w:type="spellEnd"/>
+      <w:r>
+        <w:rPr>
+          <w:rFonts w:cs="Calibri"/>
+        </w:rPr>
+        <w:t xml:space="preserve"> tax in EXO</w:t>
       </w:r>
     </w:p>
     <w:p>
@@ -1117,7 +1191,7 @@
           <w:lang w:val="en-US"/>
         </w:rPr>
       </w:pPr>
-      <w:hyperlink r:id="rId7" w:history="1">
+      <w:hyperlink r:id="rId8" w:history="1">
         <w:r>
           <w:rPr>
             <w:rStyle w:val="Hyperlink"/>

</xml_diff>

<commit_message>
- update change log
</commit_message>
<xml_diff>
--- a/BluePrints/Views/ChangeLog.docx
+++ b/BluePrints/Views/ChangeLog.docx
@@ -2,6 +2,260 @@
 <file path=word/document.xml><?xml version="1.0" encoding="utf-8"?>
 <w:document xmlns:wpc="http://schemas.microsoft.com/office/word/2010/wordprocessingCanvas" xmlns:cx="http://schemas.microsoft.com/office/drawing/2014/chartex" xmlns:cx1="http://schemas.microsoft.com/office/drawing/2015/9/8/chartex" xmlns:cx2="http://schemas.microsoft.com/office/drawing/2015/10/21/chartex" xmlns:cx3="http://schemas.microsoft.com/office/drawing/2016/5/9/chartex" xmlns:cx4="http://schemas.microsoft.com/office/drawing/2016/5/10/chartex" xmlns:cx5="http://schemas.microsoft.com/office/drawing/2016/5/11/chartex" xmlns:cx6="http://schemas.microsoft.com/office/drawing/2016/5/12/chartex" xmlns:cx7="http://schemas.microsoft.com/office/drawing/2016/5/13/chartex" xmlns:cx8="http://schemas.microsoft.com/office/drawing/2016/5/14/chartex" xmlns:mc="http://schemas.openxmlformats.org/markup-compatibility/2006" xmlns:aink="http://schemas.microsoft.com/office/drawing/2016/ink" xmlns:am3d="http://schemas.microsoft.com/office/drawing/2017/model3d" xmlns:o="urn:schemas-microsoft-com:office:office" xmlns:r="http://schemas.openxmlformats.org/officeDocument/2006/relationships" xmlns:m="http://schemas.openxmlformats.org/officeDocument/2006/math" xmlns:v="urn:schemas-microsoft-com:vml" xmlns:wp14="http://schemas.microsoft.com/office/word/2010/wordprocessingDrawing" xmlns:wp="http://schemas.openxmlformats.org/drawingml/2006/wordprocessingDrawing" xmlns:w10="urn:schemas-microsoft-com:office:word" xmlns:w="http://schemas.openxmlformats.org/wordprocessingml/2006/main" xmlns:w14="http://schemas.microsoft.com/office/word/2010/wordml" xmlns:w15="http://schemas.microsoft.com/office/word/2012/wordml" xmlns:w16cex="http://schemas.microsoft.com/office/word/2018/wordml/cex" xmlns:w16cid="http://schemas.microsoft.com/office/word/2016/wordml/cid" xmlns:w16="http://schemas.microsoft.com/office/word/2018/wordml" xmlns:w16se="http://schemas.microsoft.com/office/word/2015/wordml/symex" xmlns:wpg="http://schemas.microsoft.com/office/word/2010/wordprocessingGroup" xmlns:wpi="http://schemas.microsoft.com/office/word/2010/wordprocessingInk" xmlns:wne="http://schemas.microsoft.com/office/word/2006/wordml" xmlns:wps="http://schemas.microsoft.com/office/word/2010/wordprocessingShape" mc:Ignorable="w14 w15 w16se w16cid w16 w16cex wp14">
   <w:body>
+    <w:p>
+      <w:pPr>
+        <w:rPr>
+          <w:lang w:val="en-US"/>
+        </w:rPr>
+      </w:pPr>
+      <w:r>
+        <w:rPr>
+          <w:lang w:val="en-US"/>
+        </w:rPr>
+        <w:t>Change Log 1</w:t>
+      </w:r>
+      <w:r>
+        <w:rPr>
+          <w:vertAlign w:val="superscript"/>
+          <w:lang w:val="en-US"/>
+        </w:rPr>
+        <w:t>st</w:t>
+      </w:r>
+      <w:r>
+        <w:rPr>
+          <w:lang w:val="en-US"/>
+        </w:rPr>
+        <w:t xml:space="preserve"> September 2020</w:t>
+      </w:r>
+    </w:p>
+    <w:p>
+      <w:pPr>
+        <w:pStyle w:val="ListParagraph"/>
+        <w:numPr>
+          <w:ilvl w:val="0"/>
+          <w:numId w:val="23"/>
+        </w:numPr>
+        <w:rPr>
+          <w:lang w:val="en-US"/>
+        </w:rPr>
+      </w:pPr>
+      <w:r>
+        <w:rPr>
+          <w:lang w:val="en-US"/>
+        </w:rPr>
+        <w:t>Exo -&gt; Jobs</w:t>
+      </w:r>
+    </w:p>
+    <w:p>
+      <w:pPr>
+        <w:pStyle w:val="ListParagraph"/>
+        <w:numPr>
+          <w:ilvl w:val="1"/>
+          <w:numId w:val="23"/>
+        </w:numPr>
+        <w:rPr>
+          <w:lang w:val="en-US"/>
+        </w:rPr>
+      </w:pPr>
+      <w:r>
+        <w:rPr>
+          <w:lang w:val="en-US"/>
+        </w:rPr>
+        <w:t>Not</w:t>
+      </w:r>
+      <w:r>
+        <w:rPr>
+          <w:lang w:val="en-US"/>
+        </w:rPr>
+        <w:t xml:space="preserve"> validat</w:t>
+      </w:r>
+      <w:r>
+        <w:rPr>
+          <w:lang w:val="en-US"/>
+        </w:rPr>
+        <w:t>ing</w:t>
+      </w:r>
+      <w:r>
+        <w:rPr>
+          <w:lang w:val="en-US"/>
+        </w:rPr>
+        <w:t>/show error</w:t>
+      </w:r>
+      <w:r>
+        <w:rPr>
+          <w:lang w:val="en-US"/>
+        </w:rPr>
+        <w:t>s</w:t>
+      </w:r>
+      <w:r>
+        <w:rPr>
+          <w:lang w:val="en-US"/>
+        </w:rPr>
+        <w:t xml:space="preserve"> on cost group and cost type when variation </w:t>
+      </w:r>
+      <w:r>
+        <w:rPr>
+          <w:lang w:val="en-US"/>
+        </w:rPr>
+        <w:t>stock</w:t>
+      </w:r>
+      <w:r>
+        <w:rPr>
+          <w:lang w:val="en-US"/>
+        </w:rPr>
+        <w:t xml:space="preserve"> code is used</w:t>
+      </w:r>
+    </w:p>
+    <w:p>
+      <w:pPr>
+        <w:pStyle w:val="ListParagraph"/>
+        <w:ind w:left="1440"/>
+        <w:rPr>
+          <w:lang w:val="en-US"/>
+        </w:rPr>
+      </w:pPr>
+    </w:p>
+    <w:p>
+      <w:pPr>
+        <w:pStyle w:val="ListParagraph"/>
+        <w:numPr>
+          <w:ilvl w:val="0"/>
+          <w:numId w:val="23"/>
+        </w:numPr>
+        <w:rPr>
+          <w:lang w:val="en-US"/>
+        </w:rPr>
+      </w:pPr>
+      <w:r>
+        <w:rPr>
+          <w:lang w:val="en-US"/>
+        </w:rPr>
+        <w:t>Construction -&gt; Variation</w:t>
+      </w:r>
+    </w:p>
+    <w:p>
+      <w:pPr>
+        <w:pStyle w:val="ListParagraph"/>
+        <w:numPr>
+          <w:ilvl w:val="1"/>
+          <w:numId w:val="23"/>
+        </w:numPr>
+        <w:rPr>
+          <w:lang w:val="en-US"/>
+        </w:rPr>
+      </w:pPr>
+      <w:r>
+        <w:rPr>
+          <w:lang w:val="en-US"/>
+        </w:rPr>
+        <w:t>G</w:t>
+      </w:r>
+      <w:r>
+        <w:rPr>
+          <w:lang w:val="en-US"/>
+        </w:rPr>
+        <w:t xml:space="preserve">roup jobs by </w:t>
+      </w:r>
+      <w:r>
+        <w:rPr>
+          <w:lang w:val="en-US"/>
+        </w:rPr>
+        <w:t>Sub</w:t>
+      </w:r>
+      <w:r>
+        <w:rPr>
+          <w:lang w:val="en-US"/>
+        </w:rPr>
+        <w:t xml:space="preserve"> </w:t>
+      </w:r>
+      <w:r>
+        <w:rPr>
+          <w:lang w:val="en-US"/>
+        </w:rPr>
+        <w:t>Job</w:t>
+      </w:r>
+      <w:r>
+        <w:rPr>
+          <w:lang w:val="en-US"/>
+        </w:rPr>
+        <w:t xml:space="preserve"> code and commit to </w:t>
+      </w:r>
+      <w:r>
+        <w:rPr>
+          <w:lang w:val="en-US"/>
+        </w:rPr>
+        <w:t>Exo</w:t>
+      </w:r>
+      <w:r>
+        <w:rPr>
+          <w:lang w:val="en-US"/>
+        </w:rPr>
+        <w:t xml:space="preserve"> using default </w:t>
+      </w:r>
+      <w:r>
+        <w:rPr>
+          <w:lang w:val="en-US"/>
+        </w:rPr>
+        <w:t>stock</w:t>
+      </w:r>
+      <w:r>
+        <w:rPr>
+          <w:lang w:val="en-US"/>
+        </w:rPr>
+        <w:t xml:space="preserve"> code</w:t>
+      </w:r>
+    </w:p>
+    <w:p>
+      <w:pPr>
+        <w:pStyle w:val="ListParagraph"/>
+        <w:ind w:left="1440"/>
+        <w:rPr>
+          <w:lang w:val="en-US"/>
+        </w:rPr>
+      </w:pPr>
+    </w:p>
+    <w:p>
+      <w:pPr>
+        <w:pStyle w:val="ListParagraph"/>
+        <w:numPr>
+          <w:ilvl w:val="0"/>
+          <w:numId w:val="23"/>
+        </w:numPr>
+        <w:rPr>
+          <w:lang w:val="en-US"/>
+        </w:rPr>
+      </w:pPr>
+      <w:r>
+        <w:rPr>
+          <w:lang w:val="en-US"/>
+        </w:rPr>
+        <w:t>Forecast -&gt; Forecast</w:t>
+      </w:r>
+    </w:p>
+    <w:p>
+      <w:pPr>
+        <w:pStyle w:val="ListParagraph"/>
+        <w:numPr>
+          <w:ilvl w:val="1"/>
+          <w:numId w:val="23"/>
+        </w:numPr>
+        <w:rPr>
+          <w:lang w:val="en-US"/>
+        </w:rPr>
+      </w:pPr>
+      <w:r>
+        <w:rPr>
+          <w:lang w:val="en-US"/>
+        </w:rPr>
+        <w:t>U</w:t>
+      </w:r>
+      <w:r>
+        <w:rPr>
+          <w:lang w:val="en-US"/>
+        </w:rPr>
+        <w:t>se total unapproved variation revenue to show unapproved revenue in forecast view</w:t>
+      </w:r>
+    </w:p>
     <w:p>
       <w:pPr>
         <w:rPr>
@@ -141,21 +395,7 @@
         <w:rPr>
           <w:lang w:val="en-US"/>
         </w:rPr>
-        <w:t xml:space="preserve">Added column to show actual </w:t>
-      </w:r>
-      <w:proofErr w:type="spellStart"/>
-      <w:r>
-        <w:rPr>
-          <w:lang w:val="en-US"/>
-        </w:rPr>
-        <w:t>labour</w:t>
-      </w:r>
-      <w:proofErr w:type="spellEnd"/>
-      <w:r>
-        <w:rPr>
-          <w:lang w:val="en-US"/>
-        </w:rPr>
-        <w:t xml:space="preserve"> units post data date</w:t>
+        <w:t>Added column to show actual labour units post data date</w:t>
       </w:r>
     </w:p>
     <w:p>
@@ -491,6 +731,7 @@
         <w:rPr>
           <w:lang w:val="en-US"/>
         </w:rPr>
+        <w:lastRenderedPageBreak/>
         <w:t>Forecast -&gt; Forecast</w:t>
       </w:r>
     </w:p>
@@ -675,21 +916,7 @@
         <w:rPr>
           <w:lang w:val="en-US"/>
         </w:rPr>
-        <w:t xml:space="preserve">ixed an issue where </w:t>
-      </w:r>
-      <w:proofErr w:type="spellStart"/>
-      <w:r>
-        <w:rPr>
-          <w:lang w:val="en-US"/>
-        </w:rPr>
-        <w:t>subjob</w:t>
-      </w:r>
-      <w:proofErr w:type="spellEnd"/>
-      <w:r>
-        <w:rPr>
-          <w:lang w:val="en-US"/>
-        </w:rPr>
-        <w:t xml:space="preserve"> variation code doesn't show up in book time</w:t>
+        <w:t>ixed an issue where subjob variation code doesn't show up in book time</w:t>
       </w:r>
     </w:p>
     <w:p>
@@ -733,7 +960,6 @@
         <w:rPr>
           <w:lang w:val="en-US"/>
         </w:rPr>
-        <w:lastRenderedPageBreak/>
         <w:t>Forecast -&gt; Forecast</w:t>
       </w:r>
     </w:p>
@@ -952,35 +1178,7 @@
         <w:rPr>
           <w:rFonts w:cs="Calibri"/>
         </w:rPr>
-        <w:t xml:space="preserve">Editing Exo -&gt; Transaction quantity will adjust line cost, line charge, line total, line total tax, line tax and </w:t>
-      </w:r>
-      <w:proofErr w:type="spellStart"/>
-      <w:r>
-        <w:rPr>
-          <w:rFonts w:cs="Calibri"/>
-        </w:rPr>
-        <w:t>linetotal</w:t>
-      </w:r>
-      <w:proofErr w:type="spellEnd"/>
-      <w:r>
-        <w:rPr>
-          <w:rFonts w:cs="Calibri"/>
-        </w:rPr>
-        <w:t xml:space="preserve"> </w:t>
-      </w:r>
-      <w:proofErr w:type="spellStart"/>
-      <w:r>
-        <w:rPr>
-          <w:rFonts w:cs="Calibri"/>
-        </w:rPr>
-        <w:t>incl</w:t>
-      </w:r>
-      <w:proofErr w:type="spellEnd"/>
-      <w:r>
-        <w:rPr>
-          <w:rFonts w:cs="Calibri"/>
-        </w:rPr>
-        <w:t xml:space="preserve"> tax in EXO</w:t>
+        <w:t>Editing Exo -&gt; Transaction quantity will adjust line cost, line charge, line total, line total tax, line tax and linetotal incl tax in EXO</w:t>
       </w:r>
     </w:p>
     <w:p>
@@ -3544,6 +3742,118 @@
     </w:lvl>
   </w:abstractNum>
   <w:abstractNum w:abstractNumId="21" w15:restartNumberingAfterBreak="0">
+    <w:nsid w:val="6CE7392E"/>
+    <w:multiLevelType w:val="hybridMultilevel"/>
+    <w:tmpl w:val="2E2C9BDE"/>
+    <w:lvl w:ilvl="0" w:tplc="2DA21E08">
+      <w:numFmt w:val="bullet"/>
+      <w:lvlText w:val="-"/>
+      <w:lvlJc w:val="left"/>
+      <w:pPr>
+        <w:ind w:left="720" w:hanging="360"/>
+      </w:pPr>
+      <w:rPr>
+        <w:rFonts w:ascii="Calibri" w:eastAsiaTheme="minorEastAsia" w:hAnsi="Calibri" w:cs="Calibri" w:hint="default"/>
+      </w:rPr>
+    </w:lvl>
+    <w:lvl w:ilvl="1" w:tplc="44090003">
+      <w:start w:val="1"/>
+      <w:numFmt w:val="bullet"/>
+      <w:lvlText w:val="o"/>
+      <w:lvlJc w:val="left"/>
+      <w:pPr>
+        <w:ind w:left="1440" w:hanging="360"/>
+      </w:pPr>
+      <w:rPr>
+        <w:rFonts w:ascii="Courier New" w:hAnsi="Courier New" w:cs="Courier New" w:hint="default"/>
+      </w:rPr>
+    </w:lvl>
+    <w:lvl w:ilvl="2" w:tplc="44090005" w:tentative="1">
+      <w:start w:val="1"/>
+      <w:numFmt w:val="bullet"/>
+      <w:lvlText w:val=""/>
+      <w:lvlJc w:val="left"/>
+      <w:pPr>
+        <w:ind w:left="2160" w:hanging="360"/>
+      </w:pPr>
+      <w:rPr>
+        <w:rFonts w:ascii="Wingdings" w:hAnsi="Wingdings" w:hint="default"/>
+      </w:rPr>
+    </w:lvl>
+    <w:lvl w:ilvl="3" w:tplc="44090001" w:tentative="1">
+      <w:start w:val="1"/>
+      <w:numFmt w:val="bullet"/>
+      <w:lvlText w:val=""/>
+      <w:lvlJc w:val="left"/>
+      <w:pPr>
+        <w:ind w:left="2880" w:hanging="360"/>
+      </w:pPr>
+      <w:rPr>
+        <w:rFonts w:ascii="Symbol" w:hAnsi="Symbol" w:hint="default"/>
+      </w:rPr>
+    </w:lvl>
+    <w:lvl w:ilvl="4" w:tplc="44090003" w:tentative="1">
+      <w:start w:val="1"/>
+      <w:numFmt w:val="bullet"/>
+      <w:lvlText w:val="o"/>
+      <w:lvlJc w:val="left"/>
+      <w:pPr>
+        <w:ind w:left="3600" w:hanging="360"/>
+      </w:pPr>
+      <w:rPr>
+        <w:rFonts w:ascii="Courier New" w:hAnsi="Courier New" w:cs="Courier New" w:hint="default"/>
+      </w:rPr>
+    </w:lvl>
+    <w:lvl w:ilvl="5" w:tplc="44090005" w:tentative="1">
+      <w:start w:val="1"/>
+      <w:numFmt w:val="bullet"/>
+      <w:lvlText w:val=""/>
+      <w:lvlJc w:val="left"/>
+      <w:pPr>
+        <w:ind w:left="4320" w:hanging="360"/>
+      </w:pPr>
+      <w:rPr>
+        <w:rFonts w:ascii="Wingdings" w:hAnsi="Wingdings" w:hint="default"/>
+      </w:rPr>
+    </w:lvl>
+    <w:lvl w:ilvl="6" w:tplc="44090001" w:tentative="1">
+      <w:start w:val="1"/>
+      <w:numFmt w:val="bullet"/>
+      <w:lvlText w:val=""/>
+      <w:lvlJc w:val="left"/>
+      <w:pPr>
+        <w:ind w:left="5040" w:hanging="360"/>
+      </w:pPr>
+      <w:rPr>
+        <w:rFonts w:ascii="Symbol" w:hAnsi="Symbol" w:hint="default"/>
+      </w:rPr>
+    </w:lvl>
+    <w:lvl w:ilvl="7" w:tplc="44090003" w:tentative="1">
+      <w:start w:val="1"/>
+      <w:numFmt w:val="bullet"/>
+      <w:lvlText w:val="o"/>
+      <w:lvlJc w:val="left"/>
+      <w:pPr>
+        <w:ind w:left="5760" w:hanging="360"/>
+      </w:pPr>
+      <w:rPr>
+        <w:rFonts w:ascii="Courier New" w:hAnsi="Courier New" w:cs="Courier New" w:hint="default"/>
+      </w:rPr>
+    </w:lvl>
+    <w:lvl w:ilvl="8" w:tplc="44090005" w:tentative="1">
+      <w:start w:val="1"/>
+      <w:numFmt w:val="bullet"/>
+      <w:lvlText w:val=""/>
+      <w:lvlJc w:val="left"/>
+      <w:pPr>
+        <w:ind w:left="6480" w:hanging="360"/>
+      </w:pPr>
+      <w:rPr>
+        <w:rFonts w:ascii="Wingdings" w:hAnsi="Wingdings" w:hint="default"/>
+      </w:rPr>
+    </w:lvl>
+  </w:abstractNum>
+  <w:abstractNum w:abstractNumId="22" w15:restartNumberingAfterBreak="0">
     <w:nsid w:val="7D5B508C"/>
     <w:multiLevelType w:val="hybridMultilevel"/>
     <w:tmpl w:val="7FAC5656"/>
@@ -3693,7 +4003,7 @@
     <w:abstractNumId w:val="11"/>
   </w:num>
   <w:num w:numId="13">
-    <w:abstractNumId w:val="21"/>
+    <w:abstractNumId w:val="22"/>
   </w:num>
   <w:num w:numId="14">
     <w:abstractNumId w:val="10"/>
@@ -3721,6 +4031,9 @@
   </w:num>
   <w:num w:numId="22">
     <w:abstractNumId w:val="19"/>
+  </w:num>
+  <w:num w:numId="23">
+    <w:abstractNumId w:val="21"/>
   </w:num>
 </w:numbering>
 </file>

</xml_diff>

<commit_message>
- Data date will automatically change to current week data date when current day is the day of week for current week’s data date
</commit_message>
<xml_diff>
--- a/BluePrints/Views/ChangeLog.docx
+++ b/BluePrints/Views/ChangeLog.docx
@@ -45,6 +45,7 @@
         </w:rPr>
         <w:t>Design -&gt; Progress</w:t>
       </w:r>
+      <w:bookmarkStart w:id="0" w:name="_Hlk50115514"/>
     </w:p>
     <w:p>
       <w:pPr>
@@ -57,12 +58,23 @@
           <w:lang w:val="en-US"/>
         </w:rPr>
       </w:pPr>
-      <w:bookmarkStart w:id="0" w:name="_Hlk50115514"/>
-      <w:r>
-        <w:rPr>
-          <w:lang w:val="en-US"/>
-        </w:rPr>
-        <w:t>Prevent data date from reverting to previous week if current day is the day of week for current week’s data date</w:t>
+      <w:r>
+        <w:rPr>
+          <w:lang w:val="en-US"/>
+        </w:rPr>
+        <w:t xml:space="preserve">Data date will </w:t>
+      </w:r>
+      <w:r>
+        <w:rPr>
+          <w:lang w:val="en-US"/>
+        </w:rPr>
+        <w:t xml:space="preserve">automatically </w:t>
+      </w:r>
+      <w:r>
+        <w:rPr>
+          <w:lang w:val="en-US"/>
+        </w:rPr>
+        <w:t>change to current week data date when current day is the day of week for current week’s data date</w:t>
       </w:r>
     </w:p>
     <w:bookmarkEnd w:id="0"/>

</xml_diff>

<commit_message>
- update change log - pipeline database scaffolding
</commit_message>
<xml_diff>
--- a/BluePrints/Views/ChangeLog.docx
+++ b/BluePrints/Views/ChangeLog.docx
@@ -2,6 +2,68 @@
 <file path=word/document.xml><?xml version="1.0" encoding="utf-8"?>
 <w:document xmlns:wpc="http://schemas.microsoft.com/office/word/2010/wordprocessingCanvas" xmlns:cx="http://schemas.microsoft.com/office/drawing/2014/chartex" xmlns:cx1="http://schemas.microsoft.com/office/drawing/2015/9/8/chartex" xmlns:cx2="http://schemas.microsoft.com/office/drawing/2015/10/21/chartex" xmlns:cx3="http://schemas.microsoft.com/office/drawing/2016/5/9/chartex" xmlns:cx4="http://schemas.microsoft.com/office/drawing/2016/5/10/chartex" xmlns:cx5="http://schemas.microsoft.com/office/drawing/2016/5/11/chartex" xmlns:cx6="http://schemas.microsoft.com/office/drawing/2016/5/12/chartex" xmlns:cx7="http://schemas.microsoft.com/office/drawing/2016/5/13/chartex" xmlns:cx8="http://schemas.microsoft.com/office/drawing/2016/5/14/chartex" xmlns:mc="http://schemas.openxmlformats.org/markup-compatibility/2006" xmlns:aink="http://schemas.microsoft.com/office/drawing/2016/ink" xmlns:am3d="http://schemas.microsoft.com/office/drawing/2017/model3d" xmlns:o="urn:schemas-microsoft-com:office:office" xmlns:r="http://schemas.openxmlformats.org/officeDocument/2006/relationships" xmlns:m="http://schemas.openxmlformats.org/officeDocument/2006/math" xmlns:v="urn:schemas-microsoft-com:vml" xmlns:wp14="http://schemas.microsoft.com/office/word/2010/wordprocessingDrawing" xmlns:wp="http://schemas.openxmlformats.org/drawingml/2006/wordprocessingDrawing" xmlns:w10="urn:schemas-microsoft-com:office:word" xmlns:w="http://schemas.openxmlformats.org/wordprocessingml/2006/main" xmlns:w14="http://schemas.microsoft.com/office/word/2010/wordml" xmlns:w15="http://schemas.microsoft.com/office/word/2012/wordml" xmlns:w16cex="http://schemas.microsoft.com/office/word/2018/wordml/cex" xmlns:w16cid="http://schemas.microsoft.com/office/word/2016/wordml/cid" xmlns:w16="http://schemas.microsoft.com/office/word/2018/wordml" xmlns:w16se="http://schemas.microsoft.com/office/word/2015/wordml/symex" xmlns:wpg="http://schemas.microsoft.com/office/word/2010/wordprocessingGroup" xmlns:wpi="http://schemas.microsoft.com/office/word/2010/wordprocessingInk" xmlns:wne="http://schemas.microsoft.com/office/word/2006/wordml" xmlns:wps="http://schemas.microsoft.com/office/word/2010/wordprocessingShape" mc:Ignorable="w14 w15 w16se w16cid w16 w16cex wp14">
   <w:body>
+    <w:p>
+      <w:pPr>
+        <w:rPr>
+          <w:lang w:val="en-US"/>
+        </w:rPr>
+      </w:pPr>
+      <w:r>
+        <w:rPr>
+          <w:lang w:val="en-US"/>
+        </w:rPr>
+        <w:t>Change Log 7</w:t>
+      </w:r>
+      <w:r>
+        <w:rPr>
+          <w:vertAlign w:val="superscript"/>
+          <w:lang w:val="en-US"/>
+        </w:rPr>
+        <w:t>th</w:t>
+      </w:r>
+      <w:r>
+        <w:rPr>
+          <w:lang w:val="en-US"/>
+        </w:rPr>
+        <w:t xml:space="preserve"> September 2020</w:t>
+      </w:r>
+    </w:p>
+    <w:p>
+      <w:pPr>
+        <w:pStyle w:val="ListParagraph"/>
+        <w:numPr>
+          <w:ilvl w:val="0"/>
+          <w:numId w:val="25"/>
+        </w:numPr>
+        <w:rPr>
+          <w:lang w:val="en-US"/>
+        </w:rPr>
+      </w:pPr>
+      <w:r>
+        <w:rPr>
+          <w:lang w:val="en-US"/>
+        </w:rPr>
+        <w:t>Design -&gt; Progress</w:t>
+      </w:r>
+    </w:p>
+    <w:p>
+      <w:pPr>
+        <w:pStyle w:val="ListParagraph"/>
+        <w:numPr>
+          <w:ilvl w:val="1"/>
+          <w:numId w:val="25"/>
+        </w:numPr>
+        <w:rPr>
+          <w:lang w:val="en-US"/>
+        </w:rPr>
+      </w:pPr>
+      <w:r>
+        <w:rPr>
+          <w:lang w:val="en-US"/>
+        </w:rPr>
+        <w:t>Fixed an issue where at completion units doesn’t match budgeted units when pushing to P6</w:t>
+      </w:r>
+    </w:p>
     <w:p>
       <w:pPr>
         <w:rPr>
@@ -465,21 +527,7 @@
         <w:rPr>
           <w:lang w:val="en-US"/>
         </w:rPr>
-        <w:t xml:space="preserve">Added column to show actual </w:t>
-      </w:r>
-      <w:proofErr w:type="spellStart"/>
-      <w:r>
-        <w:rPr>
-          <w:lang w:val="en-US"/>
-        </w:rPr>
-        <w:t>labour</w:t>
-      </w:r>
-      <w:proofErr w:type="spellEnd"/>
-      <w:r>
-        <w:rPr>
-          <w:lang w:val="en-US"/>
-        </w:rPr>
-        <w:t xml:space="preserve"> units post data date</w:t>
+        <w:t>Added column to show actual labour units post data date</w:t>
       </w:r>
     </w:p>
     <w:p>
@@ -665,21 +713,7 @@
         <w:rPr>
           <w:lang w:val="en-US"/>
         </w:rPr>
-        <w:t xml:space="preserve">Added show variation name and approve </w:t>
-      </w:r>
-      <w:proofErr w:type="gramStart"/>
-      <w:r>
-        <w:rPr>
-          <w:lang w:val="en-US"/>
-        </w:rPr>
-        <w:t>units</w:t>
-      </w:r>
-      <w:proofErr w:type="gramEnd"/>
-      <w:r>
-        <w:rPr>
-          <w:lang w:val="en-US"/>
-        </w:rPr>
-        <w:t xml:space="preserve"> column</w:t>
+        <w:t>Added show variation name and approve units column</w:t>
       </w:r>
     </w:p>
     <w:p>
@@ -758,7 +792,6 @@
         <w:rPr>
           <w:lang w:val="en-US"/>
         </w:rPr>
-        <w:lastRenderedPageBreak/>
         <w:t>Added hidden column to allow subcontract hours to be excluded from forecast</w:t>
       </w:r>
     </w:p>
@@ -916,21 +949,7 @@
         <w:rPr>
           <w:lang w:val="en-US"/>
         </w:rPr>
-        <w:t xml:space="preserve">ixed an error where newly added user </w:t>
-      </w:r>
-      <w:proofErr w:type="gramStart"/>
-      <w:r>
-        <w:rPr>
-          <w:lang w:val="en-US"/>
-        </w:rPr>
-        <w:t>isn't</w:t>
-      </w:r>
-      <w:proofErr w:type="gramEnd"/>
-      <w:r>
-        <w:rPr>
-          <w:lang w:val="en-US"/>
-        </w:rPr>
-        <w:t xml:space="preserve"> </w:t>
+        <w:t xml:space="preserve">ixed an error where newly added user isn't </w:t>
       </w:r>
       <w:r>
         <w:rPr>
@@ -1028,35 +1047,7 @@
         <w:rPr>
           <w:lang w:val="en-US"/>
         </w:rPr>
-        <w:t xml:space="preserve">ixed an issue where </w:t>
-      </w:r>
-      <w:proofErr w:type="spellStart"/>
-      <w:r>
-        <w:rPr>
-          <w:lang w:val="en-US"/>
-        </w:rPr>
-        <w:t>subjob</w:t>
-      </w:r>
-      <w:proofErr w:type="spellEnd"/>
-      <w:r>
-        <w:rPr>
-          <w:lang w:val="en-US"/>
-        </w:rPr>
-        <w:t xml:space="preserve"> variation code </w:t>
-      </w:r>
-      <w:proofErr w:type="gramStart"/>
-      <w:r>
-        <w:rPr>
-          <w:lang w:val="en-US"/>
-        </w:rPr>
-        <w:t>doesn't</w:t>
-      </w:r>
-      <w:proofErr w:type="gramEnd"/>
-      <w:r>
-        <w:rPr>
-          <w:lang w:val="en-US"/>
-        </w:rPr>
-        <w:t xml:space="preserve"> show up in book time</w:t>
+        <w:t>ixed an issue where subjob variation code doesn't show up in book time</w:t>
       </w:r>
     </w:p>
     <w:p>
@@ -1262,21 +1253,7 @@
         <w:rPr>
           <w:lang w:val="en-US"/>
         </w:rPr>
-        <w:t xml:space="preserve">llow construction jobs cells to be edited when P6 project </w:t>
-      </w:r>
-      <w:proofErr w:type="gramStart"/>
-      <w:r>
-        <w:rPr>
-          <w:lang w:val="en-US"/>
-        </w:rPr>
-        <w:t>doesn't</w:t>
-      </w:r>
-      <w:proofErr w:type="gramEnd"/>
-      <w:r>
-        <w:rPr>
-          <w:lang w:val="en-US"/>
-        </w:rPr>
-        <w:t xml:space="preserve"> exists</w:t>
+        <w:t>llow construction jobs cells to be edited when P6 project doesn't exists</w:t>
       </w:r>
     </w:p>
     <w:p>
@@ -1332,35 +1309,7 @@
         <w:rPr>
           <w:rFonts w:cs="Calibri"/>
         </w:rPr>
-        <w:t xml:space="preserve">Editing Exo -&gt; Transaction quantity will adjust line cost, line charge, line total, line total tax, line tax and </w:t>
-      </w:r>
-      <w:proofErr w:type="spellStart"/>
-      <w:r>
-        <w:rPr>
-          <w:rFonts w:cs="Calibri"/>
-        </w:rPr>
-        <w:t>linetotal</w:t>
-      </w:r>
-      <w:proofErr w:type="spellEnd"/>
-      <w:r>
-        <w:rPr>
-          <w:rFonts w:cs="Calibri"/>
-        </w:rPr>
-        <w:t xml:space="preserve"> </w:t>
-      </w:r>
-      <w:proofErr w:type="spellStart"/>
-      <w:r>
-        <w:rPr>
-          <w:rFonts w:cs="Calibri"/>
-        </w:rPr>
-        <w:t>incl</w:t>
-      </w:r>
-      <w:proofErr w:type="spellEnd"/>
-      <w:r>
-        <w:rPr>
-          <w:rFonts w:cs="Calibri"/>
-        </w:rPr>
-        <w:t xml:space="preserve"> tax in EXO</w:t>
+        <w:t>Editing Exo -&gt; Transaction quantity will adjust line cost, line charge, line total, line total tax, line tax and linetotal incl tax in EXO</w:t>
       </w:r>
     </w:p>
     <w:p>
@@ -1378,21 +1327,7 @@
         <w:rPr>
           <w:rFonts w:cs="Calibri"/>
         </w:rPr>
-        <w:t xml:space="preserve">narrative will be saved on day with hours so that when </w:t>
-      </w:r>
-      <w:proofErr w:type="gramStart"/>
-      <w:r>
-        <w:rPr>
-          <w:rFonts w:cs="Calibri"/>
-        </w:rPr>
-        <w:t>it’s</w:t>
-      </w:r>
-      <w:proofErr w:type="gramEnd"/>
-      <w:r>
-        <w:rPr>
-          <w:rFonts w:cs="Calibri"/>
-        </w:rPr>
-        <w:t xml:space="preserve"> approved the narrative will be transferred over</w:t>
+        <w:t>narrative will be saved on day with hours so that when it’s approved the narrative will be transferred over</w:t>
       </w:r>
     </w:p>
     <w:p>
@@ -1472,21 +1407,7 @@
         <w:rPr>
           <w:lang w:val="en-US"/>
         </w:rPr>
-        <w:t xml:space="preserve">Book Time dialog loads faster for user that </w:t>
-      </w:r>
-      <w:proofErr w:type="gramStart"/>
-      <w:r>
-        <w:rPr>
-          <w:lang w:val="en-US"/>
-        </w:rPr>
-        <w:t>doesn’t</w:t>
-      </w:r>
-      <w:proofErr w:type="gramEnd"/>
-      <w:r>
-        <w:rPr>
-          <w:lang w:val="en-US"/>
-        </w:rPr>
-        <w:t xml:space="preserve"> have authority to book time for other users</w:t>
+        <w:t>Book Time dialog loads faster for user that doesn’t have authority to book time for other users</w:t>
       </w:r>
     </w:p>
     <w:p>
@@ -1561,7 +1482,6 @@
         <w:rPr>
           <w:lang w:val="en-US"/>
         </w:rPr>
-        <w:lastRenderedPageBreak/>
         <w:t>Uncommitted values can only be entered on procurement jobs</w:t>
       </w:r>
     </w:p>
@@ -1623,6 +1543,118 @@
 <file path=word/numbering.xml><?xml version="1.0" encoding="utf-8"?>
 <w:numbering xmlns:wpc="http://schemas.microsoft.com/office/word/2010/wordprocessingCanvas" xmlns:cx="http://schemas.microsoft.com/office/drawing/2014/chartex" xmlns:cx1="http://schemas.microsoft.com/office/drawing/2015/9/8/chartex" xmlns:cx2="http://schemas.microsoft.com/office/drawing/2015/10/21/chartex" xmlns:cx3="http://schemas.microsoft.com/office/drawing/2016/5/9/chartex" xmlns:cx4="http://schemas.microsoft.com/office/drawing/2016/5/10/chartex" xmlns:cx5="http://schemas.microsoft.com/office/drawing/2016/5/11/chartex" xmlns:cx6="http://schemas.microsoft.com/office/drawing/2016/5/12/chartex" xmlns:cx7="http://schemas.microsoft.com/office/drawing/2016/5/13/chartex" xmlns:cx8="http://schemas.microsoft.com/office/drawing/2016/5/14/chartex" xmlns:mc="http://schemas.openxmlformats.org/markup-compatibility/2006" xmlns:aink="http://schemas.microsoft.com/office/drawing/2016/ink" xmlns:am3d="http://schemas.microsoft.com/office/drawing/2017/model3d" xmlns:o="urn:schemas-microsoft-com:office:office" xmlns:r="http://schemas.openxmlformats.org/officeDocument/2006/relationships" xmlns:m="http://schemas.openxmlformats.org/officeDocument/2006/math" xmlns:v="urn:schemas-microsoft-com:vml" xmlns:wp14="http://schemas.microsoft.com/office/word/2010/wordprocessingDrawing" xmlns:wp="http://schemas.openxmlformats.org/drawingml/2006/wordprocessingDrawing" xmlns:w10="urn:schemas-microsoft-com:office:word" xmlns:w="http://schemas.openxmlformats.org/wordprocessingml/2006/main" xmlns:w14="http://schemas.microsoft.com/office/word/2010/wordml" xmlns:w15="http://schemas.microsoft.com/office/word/2012/wordml" xmlns:w16cex="http://schemas.microsoft.com/office/word/2018/wordml/cex" xmlns:w16cid="http://schemas.microsoft.com/office/word/2016/wordml/cid" xmlns:w16="http://schemas.microsoft.com/office/word/2018/wordml" xmlns:w16se="http://schemas.microsoft.com/office/word/2015/wordml/symex" xmlns:wpg="http://schemas.microsoft.com/office/word/2010/wordprocessingGroup" xmlns:wpi="http://schemas.microsoft.com/office/word/2010/wordprocessingInk" xmlns:wne="http://schemas.microsoft.com/office/word/2006/wordml" xmlns:wps="http://schemas.microsoft.com/office/word/2010/wordprocessingShape" mc:Ignorable="w14 w15 w16se w16cid w16 w16cex wp14">
   <w:abstractNum w:abstractNumId="0" w15:restartNumberingAfterBreak="0">
+    <w:nsid w:val="02FA5961"/>
+    <w:multiLevelType w:val="hybridMultilevel"/>
+    <w:tmpl w:val="D43A3B0C"/>
+    <w:lvl w:ilvl="0" w:tplc="E5A207BA">
+      <w:numFmt w:val="bullet"/>
+      <w:lvlText w:val="-"/>
+      <w:lvlJc w:val="left"/>
+      <w:pPr>
+        <w:ind w:left="720" w:hanging="360"/>
+      </w:pPr>
+      <w:rPr>
+        <w:rFonts w:ascii="Calibri" w:eastAsiaTheme="minorEastAsia" w:hAnsi="Calibri" w:cs="Calibri" w:hint="default"/>
+      </w:rPr>
+    </w:lvl>
+    <w:lvl w:ilvl="1" w:tplc="44090003">
+      <w:start w:val="1"/>
+      <w:numFmt w:val="bullet"/>
+      <w:lvlText w:val="o"/>
+      <w:lvlJc w:val="left"/>
+      <w:pPr>
+        <w:ind w:left="1440" w:hanging="360"/>
+      </w:pPr>
+      <w:rPr>
+        <w:rFonts w:ascii="Courier New" w:hAnsi="Courier New" w:cs="Courier New" w:hint="default"/>
+      </w:rPr>
+    </w:lvl>
+    <w:lvl w:ilvl="2" w:tplc="44090005" w:tentative="1">
+      <w:start w:val="1"/>
+      <w:numFmt w:val="bullet"/>
+      <w:lvlText w:val=""/>
+      <w:lvlJc w:val="left"/>
+      <w:pPr>
+        <w:ind w:left="2160" w:hanging="360"/>
+      </w:pPr>
+      <w:rPr>
+        <w:rFonts w:ascii="Wingdings" w:hAnsi="Wingdings" w:hint="default"/>
+      </w:rPr>
+    </w:lvl>
+    <w:lvl w:ilvl="3" w:tplc="44090001" w:tentative="1">
+      <w:start w:val="1"/>
+      <w:numFmt w:val="bullet"/>
+      <w:lvlText w:val=""/>
+      <w:lvlJc w:val="left"/>
+      <w:pPr>
+        <w:ind w:left="2880" w:hanging="360"/>
+      </w:pPr>
+      <w:rPr>
+        <w:rFonts w:ascii="Symbol" w:hAnsi="Symbol" w:hint="default"/>
+      </w:rPr>
+    </w:lvl>
+    <w:lvl w:ilvl="4" w:tplc="44090003" w:tentative="1">
+      <w:start w:val="1"/>
+      <w:numFmt w:val="bullet"/>
+      <w:lvlText w:val="o"/>
+      <w:lvlJc w:val="left"/>
+      <w:pPr>
+        <w:ind w:left="3600" w:hanging="360"/>
+      </w:pPr>
+      <w:rPr>
+        <w:rFonts w:ascii="Courier New" w:hAnsi="Courier New" w:cs="Courier New" w:hint="default"/>
+      </w:rPr>
+    </w:lvl>
+    <w:lvl w:ilvl="5" w:tplc="44090005" w:tentative="1">
+      <w:start w:val="1"/>
+      <w:numFmt w:val="bullet"/>
+      <w:lvlText w:val=""/>
+      <w:lvlJc w:val="left"/>
+      <w:pPr>
+        <w:ind w:left="4320" w:hanging="360"/>
+      </w:pPr>
+      <w:rPr>
+        <w:rFonts w:ascii="Wingdings" w:hAnsi="Wingdings" w:hint="default"/>
+      </w:rPr>
+    </w:lvl>
+    <w:lvl w:ilvl="6" w:tplc="44090001" w:tentative="1">
+      <w:start w:val="1"/>
+      <w:numFmt w:val="bullet"/>
+      <w:lvlText w:val=""/>
+      <w:lvlJc w:val="left"/>
+      <w:pPr>
+        <w:ind w:left="5040" w:hanging="360"/>
+      </w:pPr>
+      <w:rPr>
+        <w:rFonts w:ascii="Symbol" w:hAnsi="Symbol" w:hint="default"/>
+      </w:rPr>
+    </w:lvl>
+    <w:lvl w:ilvl="7" w:tplc="44090003" w:tentative="1">
+      <w:start w:val="1"/>
+      <w:numFmt w:val="bullet"/>
+      <w:lvlText w:val="o"/>
+      <w:lvlJc w:val="left"/>
+      <w:pPr>
+        <w:ind w:left="5760" w:hanging="360"/>
+      </w:pPr>
+      <w:rPr>
+        <w:rFonts w:ascii="Courier New" w:hAnsi="Courier New" w:cs="Courier New" w:hint="default"/>
+      </w:rPr>
+    </w:lvl>
+    <w:lvl w:ilvl="8" w:tplc="44090005" w:tentative="1">
+      <w:start w:val="1"/>
+      <w:numFmt w:val="bullet"/>
+      <w:lvlText w:val=""/>
+      <w:lvlJc w:val="left"/>
+      <w:pPr>
+        <w:ind w:left="6480" w:hanging="360"/>
+      </w:pPr>
+      <w:rPr>
+        <w:rFonts w:ascii="Wingdings" w:hAnsi="Wingdings" w:hint="default"/>
+      </w:rPr>
+    </w:lvl>
+  </w:abstractNum>
+  <w:abstractNum w:abstractNumId="1" w15:restartNumberingAfterBreak="0">
     <w:nsid w:val="06E2467D"/>
     <w:multiLevelType w:val="hybridMultilevel"/>
     <w:tmpl w:val="F6804664"/>
@@ -1734,7 +1766,7 @@
       </w:rPr>
     </w:lvl>
   </w:abstractNum>
-  <w:abstractNum w:abstractNumId="1" w15:restartNumberingAfterBreak="0">
+  <w:abstractNum w:abstractNumId="2" w15:restartNumberingAfterBreak="0">
     <w:nsid w:val="08997AC4"/>
     <w:multiLevelType w:val="hybridMultilevel"/>
     <w:tmpl w:val="754444C6"/>
@@ -1846,7 +1878,7 @@
       </w:rPr>
     </w:lvl>
   </w:abstractNum>
-  <w:abstractNum w:abstractNumId="2" w15:restartNumberingAfterBreak="0">
+  <w:abstractNum w:abstractNumId="3" w15:restartNumberingAfterBreak="0">
     <w:nsid w:val="0B4E5795"/>
     <w:multiLevelType w:val="hybridMultilevel"/>
     <w:tmpl w:val="F8C43A90"/>
@@ -1958,7 +1990,7 @@
       </w:rPr>
     </w:lvl>
   </w:abstractNum>
-  <w:abstractNum w:abstractNumId="3" w15:restartNumberingAfterBreak="0">
+  <w:abstractNum w:abstractNumId="4" w15:restartNumberingAfterBreak="0">
     <w:nsid w:val="0CF53711"/>
     <w:multiLevelType w:val="hybridMultilevel"/>
     <w:tmpl w:val="980C9F1A"/>
@@ -2070,7 +2102,7 @@
       </w:rPr>
     </w:lvl>
   </w:abstractNum>
-  <w:abstractNum w:abstractNumId="4" w15:restartNumberingAfterBreak="0">
+  <w:abstractNum w:abstractNumId="5" w15:restartNumberingAfterBreak="0">
     <w:nsid w:val="0FC80B97"/>
     <w:multiLevelType w:val="hybridMultilevel"/>
     <w:tmpl w:val="DFECF1EE"/>
@@ -2182,7 +2214,7 @@
       </w:rPr>
     </w:lvl>
   </w:abstractNum>
-  <w:abstractNum w:abstractNumId="5" w15:restartNumberingAfterBreak="0">
+  <w:abstractNum w:abstractNumId="6" w15:restartNumberingAfterBreak="0">
     <w:nsid w:val="178E49A5"/>
     <w:multiLevelType w:val="hybridMultilevel"/>
     <w:tmpl w:val="40880C56"/>
@@ -2294,7 +2326,7 @@
       </w:rPr>
     </w:lvl>
   </w:abstractNum>
-  <w:abstractNum w:abstractNumId="6" w15:restartNumberingAfterBreak="0">
+  <w:abstractNum w:abstractNumId="7" w15:restartNumberingAfterBreak="0">
     <w:nsid w:val="1D377B89"/>
     <w:multiLevelType w:val="hybridMultilevel"/>
     <w:tmpl w:val="1744FA72"/>
@@ -2407,7 +2439,7 @@
       </w:rPr>
     </w:lvl>
   </w:abstractNum>
-  <w:abstractNum w:abstractNumId="7" w15:restartNumberingAfterBreak="0">
+  <w:abstractNum w:abstractNumId="8" w15:restartNumberingAfterBreak="0">
     <w:nsid w:val="1DCB2786"/>
     <w:multiLevelType w:val="hybridMultilevel"/>
     <w:tmpl w:val="DA046A8A"/>
@@ -2519,7 +2551,7 @@
       </w:rPr>
     </w:lvl>
   </w:abstractNum>
-  <w:abstractNum w:abstractNumId="8" w15:restartNumberingAfterBreak="0">
+  <w:abstractNum w:abstractNumId="9" w15:restartNumberingAfterBreak="0">
     <w:nsid w:val="1F4D0C5A"/>
     <w:multiLevelType w:val="hybridMultilevel"/>
     <w:tmpl w:val="58644CA6"/>
@@ -2631,7 +2663,7 @@
       </w:rPr>
     </w:lvl>
   </w:abstractNum>
-  <w:abstractNum w:abstractNumId="9" w15:restartNumberingAfterBreak="0">
+  <w:abstractNum w:abstractNumId="10" w15:restartNumberingAfterBreak="0">
     <w:nsid w:val="21223E97"/>
     <w:multiLevelType w:val="hybridMultilevel"/>
     <w:tmpl w:val="68E6E128"/>
@@ -2743,7 +2775,7 @@
       </w:rPr>
     </w:lvl>
   </w:abstractNum>
-  <w:abstractNum w:abstractNumId="10" w15:restartNumberingAfterBreak="0">
+  <w:abstractNum w:abstractNumId="11" w15:restartNumberingAfterBreak="0">
     <w:nsid w:val="22100513"/>
     <w:multiLevelType w:val="multilevel"/>
     <w:tmpl w:val="9DA06E12"/>
@@ -2856,7 +2888,7 @@
       </w:pPr>
     </w:lvl>
   </w:abstractNum>
-  <w:abstractNum w:abstractNumId="11" w15:restartNumberingAfterBreak="0">
+  <w:abstractNum w:abstractNumId="12" w15:restartNumberingAfterBreak="0">
     <w:nsid w:val="3C5C6580"/>
     <w:multiLevelType w:val="hybridMultilevel"/>
     <w:tmpl w:val="6874B70A"/>
@@ -2969,7 +3001,7 @@
       </w:rPr>
     </w:lvl>
   </w:abstractNum>
-  <w:abstractNum w:abstractNumId="12" w15:restartNumberingAfterBreak="0">
+  <w:abstractNum w:abstractNumId="13" w15:restartNumberingAfterBreak="0">
     <w:nsid w:val="4691596C"/>
     <w:multiLevelType w:val="hybridMultilevel"/>
     <w:tmpl w:val="ECEEF302"/>
@@ -3081,7 +3113,7 @@
       </w:rPr>
     </w:lvl>
   </w:abstractNum>
-  <w:abstractNum w:abstractNumId="13" w15:restartNumberingAfterBreak="0">
+  <w:abstractNum w:abstractNumId="14" w15:restartNumberingAfterBreak="0">
     <w:nsid w:val="47F951B0"/>
     <w:multiLevelType w:val="multilevel"/>
     <w:tmpl w:val="00D8A7E8"/>
@@ -3167,7 +3199,7 @@
       </w:pPr>
     </w:lvl>
   </w:abstractNum>
-  <w:abstractNum w:abstractNumId="14" w15:restartNumberingAfterBreak="0">
+  <w:abstractNum w:abstractNumId="15" w15:restartNumberingAfterBreak="0">
     <w:nsid w:val="4D6E34D5"/>
     <w:multiLevelType w:val="hybridMultilevel"/>
     <w:tmpl w:val="6BC866D0"/>
@@ -3279,7 +3311,7 @@
       </w:rPr>
     </w:lvl>
   </w:abstractNum>
-  <w:abstractNum w:abstractNumId="15" w15:restartNumberingAfterBreak="0">
+  <w:abstractNum w:abstractNumId="16" w15:restartNumberingAfterBreak="0">
     <w:nsid w:val="52606647"/>
     <w:multiLevelType w:val="hybridMultilevel"/>
     <w:tmpl w:val="34FAD1A0"/>
@@ -3391,7 +3423,7 @@
       </w:rPr>
     </w:lvl>
   </w:abstractNum>
-  <w:abstractNum w:abstractNumId="16" w15:restartNumberingAfterBreak="0">
+  <w:abstractNum w:abstractNumId="17" w15:restartNumberingAfterBreak="0">
     <w:nsid w:val="557D5C95"/>
     <w:multiLevelType w:val="hybridMultilevel"/>
     <w:tmpl w:val="DC122E1C"/>
@@ -3503,7 +3535,7 @@
       </w:rPr>
     </w:lvl>
   </w:abstractNum>
-  <w:abstractNum w:abstractNumId="17" w15:restartNumberingAfterBreak="0">
+  <w:abstractNum w:abstractNumId="18" w15:restartNumberingAfterBreak="0">
     <w:nsid w:val="589D37B7"/>
     <w:multiLevelType w:val="hybridMultilevel"/>
     <w:tmpl w:val="9262429A"/>
@@ -3615,7 +3647,7 @@
       </w:rPr>
     </w:lvl>
   </w:abstractNum>
-  <w:abstractNum w:abstractNumId="18" w15:restartNumberingAfterBreak="0">
+  <w:abstractNum w:abstractNumId="19" w15:restartNumberingAfterBreak="0">
     <w:nsid w:val="58AA443D"/>
     <w:multiLevelType w:val="hybridMultilevel"/>
     <w:tmpl w:val="56F0D18E"/>
@@ -3728,7 +3760,7 @@
       </w:rPr>
     </w:lvl>
   </w:abstractNum>
-  <w:abstractNum w:abstractNumId="19" w15:restartNumberingAfterBreak="0">
+  <w:abstractNum w:abstractNumId="20" w15:restartNumberingAfterBreak="0">
     <w:nsid w:val="5C8347BF"/>
     <w:multiLevelType w:val="hybridMultilevel"/>
     <w:tmpl w:val="D2F46B88"/>
@@ -3840,7 +3872,7 @@
       </w:rPr>
     </w:lvl>
   </w:abstractNum>
-  <w:abstractNum w:abstractNumId="20" w15:restartNumberingAfterBreak="0">
+  <w:abstractNum w:abstractNumId="21" w15:restartNumberingAfterBreak="0">
     <w:nsid w:val="6A047A76"/>
     <w:multiLevelType w:val="hybridMultilevel"/>
     <w:tmpl w:val="50CADEB2"/>
@@ -3952,7 +3984,7 @@
       </w:rPr>
     </w:lvl>
   </w:abstractNum>
-  <w:abstractNum w:abstractNumId="21" w15:restartNumberingAfterBreak="0">
+  <w:abstractNum w:abstractNumId="22" w15:restartNumberingAfterBreak="0">
     <w:nsid w:val="6AC268F7"/>
     <w:multiLevelType w:val="hybridMultilevel"/>
     <w:tmpl w:val="12F21194"/>
@@ -4064,7 +4096,7 @@
       </w:rPr>
     </w:lvl>
   </w:abstractNum>
-  <w:abstractNum w:abstractNumId="22" w15:restartNumberingAfterBreak="0">
+  <w:abstractNum w:abstractNumId="23" w15:restartNumberingAfterBreak="0">
     <w:nsid w:val="6CE7392E"/>
     <w:multiLevelType w:val="hybridMultilevel"/>
     <w:tmpl w:val="2E2C9BDE"/>
@@ -4176,7 +4208,7 @@
       </w:rPr>
     </w:lvl>
   </w:abstractNum>
-  <w:abstractNum w:abstractNumId="23" w15:restartNumberingAfterBreak="0">
+  <w:abstractNum w:abstractNumId="24" w15:restartNumberingAfterBreak="0">
     <w:nsid w:val="7D5B508C"/>
     <w:multiLevelType w:val="hybridMultilevel"/>
     <w:tmpl w:val="7FAC5656"/>
@@ -4290,76 +4322,79 @@
     </w:lvl>
   </w:abstractNum>
   <w:num w:numId="1">
+    <w:abstractNumId w:val="14"/>
+  </w:num>
+  <w:num w:numId="2">
+    <w:abstractNumId w:val="11"/>
+  </w:num>
+  <w:num w:numId="3">
+    <w:abstractNumId w:val="15"/>
+  </w:num>
+  <w:num w:numId="4">
+    <w:abstractNumId w:val="2"/>
+  </w:num>
+  <w:num w:numId="5">
+    <w:abstractNumId w:val="20"/>
+  </w:num>
+  <w:num w:numId="6">
+    <w:abstractNumId w:val="18"/>
+  </w:num>
+  <w:num w:numId="7">
+    <w:abstractNumId w:val="7"/>
+  </w:num>
+  <w:num w:numId="8">
+    <w:abstractNumId w:val="16"/>
+  </w:num>
+  <w:num w:numId="9">
+    <w:abstractNumId w:val="9"/>
+  </w:num>
+  <w:num w:numId="10">
+    <w:abstractNumId w:val="17"/>
+  </w:num>
+  <w:num w:numId="11">
+    <w:abstractNumId w:val="19"/>
+  </w:num>
+  <w:num w:numId="12">
     <w:abstractNumId w:val="13"/>
   </w:num>
-  <w:num w:numId="2">
+  <w:num w:numId="13">
+    <w:abstractNumId w:val="24"/>
+  </w:num>
+  <w:num w:numId="14">
+    <w:abstractNumId w:val="12"/>
+  </w:num>
+  <w:num w:numId="15">
+    <w:abstractNumId w:val="22"/>
+  </w:num>
+  <w:num w:numId="16">
+    <w:abstractNumId w:val="3"/>
+  </w:num>
+  <w:num w:numId="17">
+    <w:abstractNumId w:val="8"/>
+  </w:num>
+  <w:num w:numId="18">
     <w:abstractNumId w:val="10"/>
   </w:num>
-  <w:num w:numId="3">
-    <w:abstractNumId w:val="14"/>
+  <w:num w:numId="19">
+    <w:abstractNumId w:val="5"/>
   </w:num>
-  <w:num w:numId="4">
+  <w:num w:numId="20">
+    <w:abstractNumId w:val="4"/>
+  </w:num>
+  <w:num w:numId="21">
     <w:abstractNumId w:val="1"/>
   </w:num>
-  <w:num w:numId="5">
-    <w:abstractNumId w:val="19"/>
+  <w:num w:numId="22">
+    <w:abstractNumId w:val="21"/>
   </w:num>
-  <w:num w:numId="6">
-    <w:abstractNumId w:val="17"/>
+  <w:num w:numId="23">
+    <w:abstractNumId w:val="23"/>
   </w:num>
-  <w:num w:numId="7">
+  <w:num w:numId="24">
     <w:abstractNumId w:val="6"/>
   </w:num>
-  <w:num w:numId="8">
-    <w:abstractNumId w:val="15"/>
-  </w:num>
-  <w:num w:numId="9">
-    <w:abstractNumId w:val="8"/>
-  </w:num>
-  <w:num w:numId="10">
-    <w:abstractNumId w:val="16"/>
-  </w:num>
-  <w:num w:numId="11">
-    <w:abstractNumId w:val="18"/>
-  </w:num>
-  <w:num w:numId="12">
-    <w:abstractNumId w:val="12"/>
-  </w:num>
-  <w:num w:numId="13">
-    <w:abstractNumId w:val="23"/>
-  </w:num>
-  <w:num w:numId="14">
-    <w:abstractNumId w:val="11"/>
-  </w:num>
-  <w:num w:numId="15">
-    <w:abstractNumId w:val="21"/>
-  </w:num>
-  <w:num w:numId="16">
-    <w:abstractNumId w:val="2"/>
-  </w:num>
-  <w:num w:numId="17">
-    <w:abstractNumId w:val="7"/>
-  </w:num>
-  <w:num w:numId="18">
-    <w:abstractNumId w:val="9"/>
-  </w:num>
-  <w:num w:numId="19">
-    <w:abstractNumId w:val="4"/>
-  </w:num>
-  <w:num w:numId="20">
-    <w:abstractNumId w:val="3"/>
-  </w:num>
-  <w:num w:numId="21">
+  <w:num w:numId="25">
     <w:abstractNumId w:val="0"/>
-  </w:num>
-  <w:num w:numId="22">
-    <w:abstractNumId w:val="20"/>
-  </w:num>
-  <w:num w:numId="23">
-    <w:abstractNumId w:val="22"/>
-  </w:num>
-  <w:num w:numId="24">
-    <w:abstractNumId w:val="5"/>
   </w:num>
 </w:numbering>
 </file>

</xml_diff>

<commit_message>
- show empty cost group and cost type in forecast to accomodate variations without cost group and cost type coming from construction variation module
</commit_message>
<xml_diff>
--- a/BluePrints/Views/ChangeLog.docx
+++ b/BluePrints/Views/ChangeLog.docx
@@ -2,6 +2,88 @@
 <file path=word/document.xml><?xml version="1.0" encoding="utf-8"?>
 <w:document xmlns:wpc="http://schemas.microsoft.com/office/word/2010/wordprocessingCanvas" xmlns:cx="http://schemas.microsoft.com/office/drawing/2014/chartex" xmlns:cx1="http://schemas.microsoft.com/office/drawing/2015/9/8/chartex" xmlns:cx2="http://schemas.microsoft.com/office/drawing/2015/10/21/chartex" xmlns:cx3="http://schemas.microsoft.com/office/drawing/2016/5/9/chartex" xmlns:cx4="http://schemas.microsoft.com/office/drawing/2016/5/10/chartex" xmlns:cx5="http://schemas.microsoft.com/office/drawing/2016/5/11/chartex" xmlns:cx6="http://schemas.microsoft.com/office/drawing/2016/5/12/chartex" xmlns:cx7="http://schemas.microsoft.com/office/drawing/2016/5/13/chartex" xmlns:cx8="http://schemas.microsoft.com/office/drawing/2016/5/14/chartex" xmlns:mc="http://schemas.openxmlformats.org/markup-compatibility/2006" xmlns:aink="http://schemas.microsoft.com/office/drawing/2016/ink" xmlns:am3d="http://schemas.microsoft.com/office/drawing/2017/model3d" xmlns:o="urn:schemas-microsoft-com:office:office" xmlns:r="http://schemas.openxmlformats.org/officeDocument/2006/relationships" xmlns:m="http://schemas.openxmlformats.org/officeDocument/2006/math" xmlns:v="urn:schemas-microsoft-com:vml" xmlns:wp14="http://schemas.microsoft.com/office/word/2010/wordprocessingDrawing" xmlns:wp="http://schemas.openxmlformats.org/drawingml/2006/wordprocessingDrawing" xmlns:w10="urn:schemas-microsoft-com:office:word" xmlns:w="http://schemas.openxmlformats.org/wordprocessingml/2006/main" xmlns:w14="http://schemas.microsoft.com/office/word/2010/wordml" xmlns:w15="http://schemas.microsoft.com/office/word/2012/wordml" xmlns:w16cex="http://schemas.microsoft.com/office/word/2018/wordml/cex" xmlns:w16cid="http://schemas.microsoft.com/office/word/2016/wordml/cid" xmlns:w16="http://schemas.microsoft.com/office/word/2018/wordml" xmlns:w16se="http://schemas.microsoft.com/office/word/2015/wordml/symex" xmlns:wpg="http://schemas.microsoft.com/office/word/2010/wordprocessingGroup" xmlns:wpi="http://schemas.microsoft.com/office/word/2010/wordprocessingInk" xmlns:wne="http://schemas.microsoft.com/office/word/2006/wordml" xmlns:wps="http://schemas.microsoft.com/office/word/2010/wordprocessingShape" mc:Ignorable="w14 w15 w16se w16cid w16 w16cex wp14">
   <w:body>
+    <w:p>
+      <w:pPr>
+        <w:rPr>
+          <w:lang w:val="en-US"/>
+        </w:rPr>
+      </w:pPr>
+      <w:r>
+        <w:rPr>
+          <w:lang w:val="en-US"/>
+        </w:rPr>
+        <w:t>Change Log 10</w:t>
+      </w:r>
+      <w:r>
+        <w:rPr>
+          <w:vertAlign w:val="superscript"/>
+          <w:lang w:val="en-US"/>
+        </w:rPr>
+        <w:t>th</w:t>
+      </w:r>
+      <w:r>
+        <w:rPr>
+          <w:lang w:val="en-US"/>
+        </w:rPr>
+        <w:t xml:space="preserve"> September 2020</w:t>
+      </w:r>
+    </w:p>
+    <w:p>
+      <w:pPr>
+        <w:pStyle w:val="ListParagraph"/>
+        <w:numPr>
+          <w:ilvl w:val="0"/>
+          <w:numId w:val="27"/>
+        </w:numPr>
+        <w:rPr>
+          <w:lang w:val="en-US"/>
+        </w:rPr>
+      </w:pPr>
+      <w:r>
+        <w:rPr>
+          <w:lang w:val="en-US"/>
+        </w:rPr>
+        <w:t>Forecast -&gt; Forecast</w:t>
+      </w:r>
+    </w:p>
+    <w:p>
+      <w:pPr>
+        <w:pStyle w:val="ListParagraph"/>
+        <w:numPr>
+          <w:ilvl w:val="1"/>
+          <w:numId w:val="27"/>
+        </w:numPr>
+        <w:rPr>
+          <w:lang w:val="en-US"/>
+        </w:rPr>
+      </w:pPr>
+      <w:r>
+        <w:rPr>
+          <w:lang w:val="en-US"/>
+        </w:rPr>
+        <w:t>S</w:t>
+      </w:r>
+      <w:r>
+        <w:rPr>
+          <w:lang w:val="en-US"/>
+        </w:rPr>
+        <w:t xml:space="preserve">how empty cost group and cost type in forecast to </w:t>
+      </w:r>
+      <w:proofErr w:type="spellStart"/>
+      <w:r>
+        <w:rPr>
+          <w:lang w:val="en-US"/>
+        </w:rPr>
+        <w:t>accomodate</w:t>
+      </w:r>
+      <w:proofErr w:type="spellEnd"/>
+      <w:r>
+        <w:rPr>
+          <w:lang w:val="en-US"/>
+        </w:rPr>
+        <w:t xml:space="preserve"> variations without cost group and cost type coming from construction variation module</w:t>
+      </w:r>
+    </w:p>
     <w:p>
       <w:pPr>
         <w:rPr>
@@ -684,6 +766,7 @@
         <w:rPr>
           <w:lang w:val="en-US"/>
         </w:rPr>
+        <w:lastRenderedPageBreak/>
         <w:t>Forecast -&gt; Forecast</w:t>
       </w:r>
     </w:p>
@@ -760,7 +843,6 @@
         <w:rPr>
           <w:lang w:val="en-US"/>
         </w:rPr>
-        <w:lastRenderedPageBreak/>
         <w:t>Forecast -&gt; Forecast</w:t>
       </w:r>
     </w:p>
@@ -1493,6 +1575,7 @@
         <w:rPr>
           <w:lang w:val="en-US"/>
         </w:rPr>
+        <w:lastRenderedPageBreak/>
         <w:t>A</w:t>
       </w:r>
       <w:r>
@@ -1569,7 +1652,6 @@
         <w:rPr>
           <w:rFonts w:cs="Calibri"/>
         </w:rPr>
-        <w:lastRenderedPageBreak/>
         <w:t xml:space="preserve">Editing Exo -&gt; Transaction quantity will adjust line cost, line charge, line total, line total tax, line tax and </w:t>
       </w:r>
       <w:proofErr w:type="spellStart"/>
@@ -4190,6 +4272,118 @@
     </w:lvl>
   </w:abstractNum>
   <w:abstractNum w:abstractNumId="21" w15:restartNumberingAfterBreak="0">
+    <w:nsid w:val="5B4B0EE2"/>
+    <w:multiLevelType w:val="hybridMultilevel"/>
+    <w:tmpl w:val="E8129FD8"/>
+    <w:lvl w:ilvl="0" w:tplc="0E6EEEC0">
+      <w:numFmt w:val="bullet"/>
+      <w:lvlText w:val="-"/>
+      <w:lvlJc w:val="left"/>
+      <w:pPr>
+        <w:ind w:left="720" w:hanging="360"/>
+      </w:pPr>
+      <w:rPr>
+        <w:rFonts w:ascii="Calibri" w:eastAsiaTheme="minorEastAsia" w:hAnsi="Calibri" w:cs="Calibri" w:hint="default"/>
+      </w:rPr>
+    </w:lvl>
+    <w:lvl w:ilvl="1" w:tplc="44090003">
+      <w:start w:val="1"/>
+      <w:numFmt w:val="bullet"/>
+      <w:lvlText w:val="o"/>
+      <w:lvlJc w:val="left"/>
+      <w:pPr>
+        <w:ind w:left="1440" w:hanging="360"/>
+      </w:pPr>
+      <w:rPr>
+        <w:rFonts w:ascii="Courier New" w:hAnsi="Courier New" w:cs="Courier New" w:hint="default"/>
+      </w:rPr>
+    </w:lvl>
+    <w:lvl w:ilvl="2" w:tplc="44090005" w:tentative="1">
+      <w:start w:val="1"/>
+      <w:numFmt w:val="bullet"/>
+      <w:lvlText w:val=""/>
+      <w:lvlJc w:val="left"/>
+      <w:pPr>
+        <w:ind w:left="2160" w:hanging="360"/>
+      </w:pPr>
+      <w:rPr>
+        <w:rFonts w:ascii="Wingdings" w:hAnsi="Wingdings" w:hint="default"/>
+      </w:rPr>
+    </w:lvl>
+    <w:lvl w:ilvl="3" w:tplc="44090001" w:tentative="1">
+      <w:start w:val="1"/>
+      <w:numFmt w:val="bullet"/>
+      <w:lvlText w:val=""/>
+      <w:lvlJc w:val="left"/>
+      <w:pPr>
+        <w:ind w:left="2880" w:hanging="360"/>
+      </w:pPr>
+      <w:rPr>
+        <w:rFonts w:ascii="Symbol" w:hAnsi="Symbol" w:hint="default"/>
+      </w:rPr>
+    </w:lvl>
+    <w:lvl w:ilvl="4" w:tplc="44090003" w:tentative="1">
+      <w:start w:val="1"/>
+      <w:numFmt w:val="bullet"/>
+      <w:lvlText w:val="o"/>
+      <w:lvlJc w:val="left"/>
+      <w:pPr>
+        <w:ind w:left="3600" w:hanging="360"/>
+      </w:pPr>
+      <w:rPr>
+        <w:rFonts w:ascii="Courier New" w:hAnsi="Courier New" w:cs="Courier New" w:hint="default"/>
+      </w:rPr>
+    </w:lvl>
+    <w:lvl w:ilvl="5" w:tplc="44090005" w:tentative="1">
+      <w:start w:val="1"/>
+      <w:numFmt w:val="bullet"/>
+      <w:lvlText w:val=""/>
+      <w:lvlJc w:val="left"/>
+      <w:pPr>
+        <w:ind w:left="4320" w:hanging="360"/>
+      </w:pPr>
+      <w:rPr>
+        <w:rFonts w:ascii="Wingdings" w:hAnsi="Wingdings" w:hint="default"/>
+      </w:rPr>
+    </w:lvl>
+    <w:lvl w:ilvl="6" w:tplc="44090001" w:tentative="1">
+      <w:start w:val="1"/>
+      <w:numFmt w:val="bullet"/>
+      <w:lvlText w:val=""/>
+      <w:lvlJc w:val="left"/>
+      <w:pPr>
+        <w:ind w:left="5040" w:hanging="360"/>
+      </w:pPr>
+      <w:rPr>
+        <w:rFonts w:ascii="Symbol" w:hAnsi="Symbol" w:hint="default"/>
+      </w:rPr>
+    </w:lvl>
+    <w:lvl w:ilvl="7" w:tplc="44090003" w:tentative="1">
+      <w:start w:val="1"/>
+      <w:numFmt w:val="bullet"/>
+      <w:lvlText w:val="o"/>
+      <w:lvlJc w:val="left"/>
+      <w:pPr>
+        <w:ind w:left="5760" w:hanging="360"/>
+      </w:pPr>
+      <w:rPr>
+        <w:rFonts w:ascii="Courier New" w:hAnsi="Courier New" w:cs="Courier New" w:hint="default"/>
+      </w:rPr>
+    </w:lvl>
+    <w:lvl w:ilvl="8" w:tplc="44090005" w:tentative="1">
+      <w:start w:val="1"/>
+      <w:numFmt w:val="bullet"/>
+      <w:lvlText w:val=""/>
+      <w:lvlJc w:val="left"/>
+      <w:pPr>
+        <w:ind w:left="6480" w:hanging="360"/>
+      </w:pPr>
+      <w:rPr>
+        <w:rFonts w:ascii="Wingdings" w:hAnsi="Wingdings" w:hint="default"/>
+      </w:rPr>
+    </w:lvl>
+  </w:abstractNum>
+  <w:abstractNum w:abstractNumId="22" w15:restartNumberingAfterBreak="0">
     <w:nsid w:val="5C8347BF"/>
     <w:multiLevelType w:val="hybridMultilevel"/>
     <w:tmpl w:val="D2F46B88"/>
@@ -4301,7 +4495,7 @@
       </w:rPr>
     </w:lvl>
   </w:abstractNum>
-  <w:abstractNum w:abstractNumId="22" w15:restartNumberingAfterBreak="0">
+  <w:abstractNum w:abstractNumId="23" w15:restartNumberingAfterBreak="0">
     <w:nsid w:val="6A047A76"/>
     <w:multiLevelType w:val="hybridMultilevel"/>
     <w:tmpl w:val="50CADEB2"/>
@@ -4413,7 +4607,7 @@
       </w:rPr>
     </w:lvl>
   </w:abstractNum>
-  <w:abstractNum w:abstractNumId="23" w15:restartNumberingAfterBreak="0">
+  <w:abstractNum w:abstractNumId="24" w15:restartNumberingAfterBreak="0">
     <w:nsid w:val="6AC268F7"/>
     <w:multiLevelType w:val="hybridMultilevel"/>
     <w:tmpl w:val="12F21194"/>
@@ -4525,7 +4719,7 @@
       </w:rPr>
     </w:lvl>
   </w:abstractNum>
-  <w:abstractNum w:abstractNumId="24" w15:restartNumberingAfterBreak="0">
+  <w:abstractNum w:abstractNumId="25" w15:restartNumberingAfterBreak="0">
     <w:nsid w:val="6CE7392E"/>
     <w:multiLevelType w:val="hybridMultilevel"/>
     <w:tmpl w:val="2E2C9BDE"/>
@@ -4637,7 +4831,7 @@
       </w:rPr>
     </w:lvl>
   </w:abstractNum>
-  <w:abstractNum w:abstractNumId="25" w15:restartNumberingAfterBreak="0">
+  <w:abstractNum w:abstractNumId="26" w15:restartNumberingAfterBreak="0">
     <w:nsid w:val="7D5B508C"/>
     <w:multiLevelType w:val="hybridMultilevel"/>
     <w:tmpl w:val="7FAC5656"/>
@@ -4763,7 +4957,7 @@
     <w:abstractNumId w:val="2"/>
   </w:num>
   <w:num w:numId="5">
-    <w:abstractNumId w:val="21"/>
+    <w:abstractNumId w:val="22"/>
   </w:num>
   <w:num w:numId="6">
     <w:abstractNumId w:val="19"/>
@@ -4787,13 +4981,13 @@
     <w:abstractNumId w:val="14"/>
   </w:num>
   <w:num w:numId="13">
-    <w:abstractNumId w:val="25"/>
+    <w:abstractNumId w:val="26"/>
   </w:num>
   <w:num w:numId="14">
     <w:abstractNumId w:val="13"/>
   </w:num>
   <w:num w:numId="15">
-    <w:abstractNumId w:val="23"/>
+    <w:abstractNumId w:val="24"/>
   </w:num>
   <w:num w:numId="16">
     <w:abstractNumId w:val="3"/>
@@ -4814,10 +5008,10 @@
     <w:abstractNumId w:val="1"/>
   </w:num>
   <w:num w:numId="22">
-    <w:abstractNumId w:val="22"/>
+    <w:abstractNumId w:val="23"/>
   </w:num>
   <w:num w:numId="23">
-    <w:abstractNumId w:val="24"/>
+    <w:abstractNumId w:val="25"/>
   </w:num>
   <w:num w:numId="24">
     <w:abstractNumId w:val="7"/>
@@ -4827,6 +5021,9 @@
   </w:num>
   <w:num w:numId="26">
     <w:abstractNumId w:val="4"/>
+  </w:num>
+  <w:num w:numId="27">
+    <w:abstractNumId w:val="21"/>
   </w:num>
 </w:numbering>
 </file>

</xml_diff>

<commit_message>
- remove cost group and cost type from construction variation - filter subjob in construction variation to show valid sub job codes only - show cell error when sub job codes isn't valid for chosen type - allow negative values for revenue
</commit_message>
<xml_diff>
--- a/BluePrints/Views/ChangeLog.docx
+++ b/BluePrints/Views/ChangeLog.docx
@@ -12,6 +12,176 @@
         <w:rPr>
           <w:lang w:val="en-US"/>
         </w:rPr>
+        <w:t>Change Log 11</w:t>
+      </w:r>
+      <w:r>
+        <w:rPr>
+          <w:vertAlign w:val="superscript"/>
+          <w:lang w:val="en-US"/>
+        </w:rPr>
+        <w:t>th</w:t>
+      </w:r>
+      <w:r>
+        <w:rPr>
+          <w:lang w:val="en-US"/>
+        </w:rPr>
+        <w:t xml:space="preserve"> September 2020</w:t>
+      </w:r>
+    </w:p>
+    <w:p>
+      <w:pPr>
+        <w:pStyle w:val="ListParagraph"/>
+        <w:numPr>
+          <w:ilvl w:val="0"/>
+          <w:numId w:val="28"/>
+        </w:numPr>
+        <w:rPr>
+          <w:lang w:val="en-US"/>
+        </w:rPr>
+      </w:pPr>
+      <w:r>
+        <w:rPr>
+          <w:lang w:val="en-US"/>
+        </w:rPr>
+        <w:t>Construction -&gt; Variation</w:t>
+      </w:r>
+    </w:p>
+    <w:p>
+      <w:pPr>
+        <w:pStyle w:val="ListParagraph"/>
+        <w:numPr>
+          <w:ilvl w:val="1"/>
+          <w:numId w:val="28"/>
+        </w:numPr>
+        <w:rPr>
+          <w:lang w:val="en-US"/>
+        </w:rPr>
+      </w:pPr>
+      <w:r>
+        <w:rPr>
+          <w:lang w:val="en-US"/>
+        </w:rPr>
+        <w:t>A</w:t>
+      </w:r>
+      <w:r>
+        <w:rPr>
+          <w:lang w:val="en-US"/>
+        </w:rPr>
+        <w:t>llow negative values for revenue</w:t>
+      </w:r>
+    </w:p>
+    <w:p>
+      <w:pPr>
+        <w:pStyle w:val="ListParagraph"/>
+        <w:numPr>
+          <w:ilvl w:val="0"/>
+          <w:numId w:val="28"/>
+        </w:numPr>
+        <w:rPr>
+          <w:lang w:val="en-US"/>
+        </w:rPr>
+      </w:pPr>
+      <w:r>
+        <w:rPr>
+          <w:lang w:val="en-US"/>
+        </w:rPr>
+        <w:t>Construction -&gt; Variation -&gt; Variation Items</w:t>
+      </w:r>
+    </w:p>
+    <w:p>
+      <w:pPr>
+        <w:pStyle w:val="ListParagraph"/>
+        <w:numPr>
+          <w:ilvl w:val="1"/>
+          <w:numId w:val="28"/>
+        </w:numPr>
+        <w:rPr>
+          <w:lang w:val="en-US"/>
+        </w:rPr>
+      </w:pPr>
+      <w:r>
+        <w:rPr>
+          <w:lang w:val="en-US"/>
+        </w:rPr>
+        <w:t>R</w:t>
+      </w:r>
+      <w:r>
+        <w:rPr>
+          <w:lang w:val="en-US"/>
+        </w:rPr>
+        <w:t>emove cost group and cost type</w:t>
+      </w:r>
+    </w:p>
+    <w:p>
+      <w:pPr>
+        <w:pStyle w:val="ListParagraph"/>
+        <w:numPr>
+          <w:ilvl w:val="1"/>
+          <w:numId w:val="28"/>
+        </w:numPr>
+        <w:rPr>
+          <w:lang w:val="en-US"/>
+        </w:rPr>
+      </w:pPr>
+      <w:r>
+        <w:rPr>
+          <w:lang w:val="en-US"/>
+        </w:rPr>
+        <w:t>F</w:t>
+      </w:r>
+      <w:r>
+        <w:rPr>
+          <w:lang w:val="en-US"/>
+        </w:rPr>
+        <w:t>ilter sub</w:t>
+      </w:r>
+      <w:r>
+        <w:rPr>
+          <w:lang w:val="en-US"/>
+        </w:rPr>
+        <w:t xml:space="preserve"> </w:t>
+      </w:r>
+      <w:r>
+        <w:rPr>
+          <w:lang w:val="en-US"/>
+        </w:rPr>
+        <w:t>job in construction variation to show valid sub job codes only</w:t>
+      </w:r>
+    </w:p>
+    <w:p>
+      <w:pPr>
+        <w:pStyle w:val="ListParagraph"/>
+        <w:numPr>
+          <w:ilvl w:val="1"/>
+          <w:numId w:val="28"/>
+        </w:numPr>
+        <w:rPr>
+          <w:lang w:val="en-US"/>
+        </w:rPr>
+      </w:pPr>
+      <w:r>
+        <w:rPr>
+          <w:lang w:val="en-US"/>
+        </w:rPr>
+        <w:t>S</w:t>
+      </w:r>
+      <w:r>
+        <w:rPr>
+          <w:lang w:val="en-US"/>
+        </w:rPr>
+        <w:t>how cell error when sub job codes isn't valid for chosen type</w:t>
+      </w:r>
+    </w:p>
+    <w:p>
+      <w:pPr>
+        <w:rPr>
+          <w:lang w:val="en-US"/>
+        </w:rPr>
+      </w:pPr>
+      <w:r>
+        <w:rPr>
+          <w:lang w:val="en-US"/>
+        </w:rPr>
         <w:t>Change Log 10</w:t>
       </w:r>
       <w:r>
@@ -67,21 +237,7 @@
         <w:rPr>
           <w:lang w:val="en-US"/>
         </w:rPr>
-        <w:t xml:space="preserve">how empty cost group and cost type in forecast to </w:t>
-      </w:r>
-      <w:proofErr w:type="spellStart"/>
-      <w:r>
-        <w:rPr>
-          <w:lang w:val="en-US"/>
-        </w:rPr>
-        <w:t>accomodate</w:t>
-      </w:r>
-      <w:proofErr w:type="spellEnd"/>
-      <w:r>
-        <w:rPr>
-          <w:lang w:val="en-US"/>
-        </w:rPr>
-        <w:t xml:space="preserve"> variations without cost group and cost type coming from construction variation module</w:t>
+        <w:t>how empty cost group and cost type in forecast to accomodate variations without cost group and cost type coming from construction variation module</w:t>
       </w:r>
     </w:p>
     <w:p>
@@ -268,21 +424,7 @@
         <w:rPr>
           <w:lang w:val="en-US"/>
         </w:rPr>
-        <w:t xml:space="preserve">Fixed an issue where at completion units </w:t>
-      </w:r>
-      <w:proofErr w:type="gramStart"/>
-      <w:r>
-        <w:rPr>
-          <w:lang w:val="en-US"/>
-        </w:rPr>
-        <w:t>doesn’t</w:t>
-      </w:r>
-      <w:proofErr w:type="gramEnd"/>
-      <w:r>
-        <w:rPr>
-          <w:lang w:val="en-US"/>
-        </w:rPr>
-        <w:t xml:space="preserve"> match budgeted units when pushing to P6</w:t>
+        <w:t>Fixed an issue where at completion units doesn’t match budgeted units when pushing to P6</w:t>
       </w:r>
     </w:p>
     <w:p>
@@ -642,6 +784,7 @@
         <w:rPr>
           <w:lang w:val="en-US"/>
         </w:rPr>
+        <w:lastRenderedPageBreak/>
         <w:t>Use total unapproved variation revenue to show unapproved revenue in forecast view</w:t>
       </w:r>
     </w:p>
@@ -766,7 +909,6 @@
         <w:rPr>
           <w:lang w:val="en-US"/>
         </w:rPr>
-        <w:lastRenderedPageBreak/>
         <w:t>Forecast -&gt; Forecast</w:t>
       </w:r>
     </w:p>
@@ -785,21 +927,7 @@
         <w:rPr>
           <w:lang w:val="en-US"/>
         </w:rPr>
-        <w:t xml:space="preserve">Added column to show actual </w:t>
-      </w:r>
-      <w:proofErr w:type="spellStart"/>
-      <w:r>
-        <w:rPr>
-          <w:lang w:val="en-US"/>
-        </w:rPr>
-        <w:t>labour</w:t>
-      </w:r>
-      <w:proofErr w:type="spellEnd"/>
-      <w:r>
-        <w:rPr>
-          <w:lang w:val="en-US"/>
-        </w:rPr>
-        <w:t xml:space="preserve"> units post data date</w:t>
+        <w:t>Added column to show actual labour units post data date</w:t>
       </w:r>
     </w:p>
     <w:p>
@@ -985,21 +1113,7 @@
         <w:rPr>
           <w:lang w:val="en-US"/>
         </w:rPr>
-        <w:t xml:space="preserve">Added show variation name and approve </w:t>
-      </w:r>
-      <w:proofErr w:type="gramStart"/>
-      <w:r>
-        <w:rPr>
-          <w:lang w:val="en-US"/>
-        </w:rPr>
-        <w:t>units</w:t>
-      </w:r>
-      <w:proofErr w:type="gramEnd"/>
-      <w:r>
-        <w:rPr>
-          <w:lang w:val="en-US"/>
-        </w:rPr>
-        <w:t xml:space="preserve"> column</w:t>
+        <w:t>Added show variation name and approve units column</w:t>
       </w:r>
     </w:p>
     <w:p>
@@ -1235,21 +1349,7 @@
         <w:rPr>
           <w:lang w:val="en-US"/>
         </w:rPr>
-        <w:t xml:space="preserve">ixed an error where newly added user </w:t>
-      </w:r>
-      <w:proofErr w:type="gramStart"/>
-      <w:r>
-        <w:rPr>
-          <w:lang w:val="en-US"/>
-        </w:rPr>
-        <w:t>isn't</w:t>
-      </w:r>
-      <w:proofErr w:type="gramEnd"/>
-      <w:r>
-        <w:rPr>
-          <w:lang w:val="en-US"/>
-        </w:rPr>
-        <w:t xml:space="preserve"> </w:t>
+        <w:t xml:space="preserve">ixed an error where newly added user isn't </w:t>
       </w:r>
       <w:r>
         <w:rPr>
@@ -1341,41 +1441,14 @@
         <w:rPr>
           <w:lang w:val="en-US"/>
         </w:rPr>
+        <w:lastRenderedPageBreak/>
         <w:t>F</w:t>
       </w:r>
       <w:r>
         <w:rPr>
           <w:lang w:val="en-US"/>
         </w:rPr>
-        <w:t xml:space="preserve">ixed an issue where </w:t>
-      </w:r>
-      <w:proofErr w:type="spellStart"/>
-      <w:r>
-        <w:rPr>
-          <w:lang w:val="en-US"/>
-        </w:rPr>
-        <w:t>subjob</w:t>
-      </w:r>
-      <w:proofErr w:type="spellEnd"/>
-      <w:r>
-        <w:rPr>
-          <w:lang w:val="en-US"/>
-        </w:rPr>
-        <w:t xml:space="preserve"> variation code </w:t>
-      </w:r>
-      <w:proofErr w:type="gramStart"/>
-      <w:r>
-        <w:rPr>
-          <w:lang w:val="en-US"/>
-        </w:rPr>
-        <w:t>doesn't</w:t>
-      </w:r>
-      <w:proofErr w:type="gramEnd"/>
-      <w:r>
-        <w:rPr>
-          <w:lang w:val="en-US"/>
-        </w:rPr>
-        <w:t xml:space="preserve"> show up in book time</w:t>
+        <w:t>ixed an issue where subjob variation code doesn't show up in book time</w:t>
       </w:r>
     </w:p>
     <w:p>
@@ -1575,28 +1648,13 @@
         <w:rPr>
           <w:lang w:val="en-US"/>
         </w:rPr>
-        <w:lastRenderedPageBreak/>
         <w:t>A</w:t>
       </w:r>
       <w:r>
         <w:rPr>
           <w:lang w:val="en-US"/>
         </w:rPr>
-        <w:t xml:space="preserve">llow construction jobs cells to be edited when P6 project </w:t>
-      </w:r>
-      <w:proofErr w:type="gramStart"/>
-      <w:r>
-        <w:rPr>
-          <w:lang w:val="en-US"/>
-        </w:rPr>
-        <w:t>doesn't</w:t>
-      </w:r>
-      <w:proofErr w:type="gramEnd"/>
-      <w:r>
-        <w:rPr>
-          <w:lang w:val="en-US"/>
-        </w:rPr>
-        <w:t xml:space="preserve"> exists</w:t>
+        <w:t>llow construction jobs cells to be edited when P6 project doesn't exists</w:t>
       </w:r>
     </w:p>
     <w:p>
@@ -1652,35 +1710,7 @@
         <w:rPr>
           <w:rFonts w:cs="Calibri"/>
         </w:rPr>
-        <w:t xml:space="preserve">Editing Exo -&gt; Transaction quantity will adjust line cost, line charge, line total, line total tax, line tax and </w:t>
-      </w:r>
-      <w:proofErr w:type="spellStart"/>
-      <w:r>
-        <w:rPr>
-          <w:rFonts w:cs="Calibri"/>
-        </w:rPr>
-        <w:t>linetotal</w:t>
-      </w:r>
-      <w:proofErr w:type="spellEnd"/>
-      <w:r>
-        <w:rPr>
-          <w:rFonts w:cs="Calibri"/>
-        </w:rPr>
-        <w:t xml:space="preserve"> </w:t>
-      </w:r>
-      <w:proofErr w:type="spellStart"/>
-      <w:r>
-        <w:rPr>
-          <w:rFonts w:cs="Calibri"/>
-        </w:rPr>
-        <w:t>incl</w:t>
-      </w:r>
-      <w:proofErr w:type="spellEnd"/>
-      <w:r>
-        <w:rPr>
-          <w:rFonts w:cs="Calibri"/>
-        </w:rPr>
-        <w:t xml:space="preserve"> tax in EXO</w:t>
+        <w:t>Editing Exo -&gt; Transaction quantity will adjust line cost, line charge, line total, line total tax, line tax and linetotal incl tax in EXO</w:t>
       </w:r>
     </w:p>
     <w:p>
@@ -1698,21 +1728,7 @@
         <w:rPr>
           <w:rFonts w:cs="Calibri"/>
         </w:rPr>
-        <w:t xml:space="preserve">narrative will be saved on day with hours so that when </w:t>
-      </w:r>
-      <w:proofErr w:type="gramStart"/>
-      <w:r>
-        <w:rPr>
-          <w:rFonts w:cs="Calibri"/>
-        </w:rPr>
-        <w:t>it’s</w:t>
-      </w:r>
-      <w:proofErr w:type="gramEnd"/>
-      <w:r>
-        <w:rPr>
-          <w:rFonts w:cs="Calibri"/>
-        </w:rPr>
-        <w:t xml:space="preserve"> approved the narrative will be transferred over</w:t>
+        <w:t>narrative will be saved on day with hours so that when it’s approved the narrative will be transferred over</w:t>
       </w:r>
     </w:p>
     <w:p>
@@ -1792,21 +1808,7 @@
         <w:rPr>
           <w:lang w:val="en-US"/>
         </w:rPr>
-        <w:t xml:space="preserve">Book Time dialog loads faster for user that </w:t>
-      </w:r>
-      <w:proofErr w:type="gramStart"/>
-      <w:r>
-        <w:rPr>
-          <w:lang w:val="en-US"/>
-        </w:rPr>
-        <w:t>doesn’t</w:t>
-      </w:r>
-      <w:proofErr w:type="gramEnd"/>
-      <w:r>
-        <w:rPr>
-          <w:lang w:val="en-US"/>
-        </w:rPr>
-        <w:t xml:space="preserve"> have authority to book time for other users</w:t>
+        <w:t>Book Time dialog loads faster for user that doesn’t have authority to book time for other users</w:t>
       </w:r>
     </w:p>
     <w:p>
@@ -3711,6 +3713,118 @@
     </w:lvl>
   </w:abstractNum>
   <w:abstractNum w:abstractNumId="16" w15:restartNumberingAfterBreak="0">
+    <w:nsid w:val="4A9D1EBF"/>
+    <w:multiLevelType w:val="hybridMultilevel"/>
+    <w:tmpl w:val="3DEACDCC"/>
+    <w:lvl w:ilvl="0" w:tplc="30B02622">
+      <w:numFmt w:val="bullet"/>
+      <w:lvlText w:val="-"/>
+      <w:lvlJc w:val="left"/>
+      <w:pPr>
+        <w:ind w:left="720" w:hanging="360"/>
+      </w:pPr>
+      <w:rPr>
+        <w:rFonts w:ascii="Calibri" w:eastAsiaTheme="minorEastAsia" w:hAnsi="Calibri" w:cs="Calibri" w:hint="default"/>
+      </w:rPr>
+    </w:lvl>
+    <w:lvl w:ilvl="1" w:tplc="44090003">
+      <w:start w:val="1"/>
+      <w:numFmt w:val="bullet"/>
+      <w:lvlText w:val="o"/>
+      <w:lvlJc w:val="left"/>
+      <w:pPr>
+        <w:ind w:left="1440" w:hanging="360"/>
+      </w:pPr>
+      <w:rPr>
+        <w:rFonts w:ascii="Courier New" w:hAnsi="Courier New" w:cs="Courier New" w:hint="default"/>
+      </w:rPr>
+    </w:lvl>
+    <w:lvl w:ilvl="2" w:tplc="44090005" w:tentative="1">
+      <w:start w:val="1"/>
+      <w:numFmt w:val="bullet"/>
+      <w:lvlText w:val=""/>
+      <w:lvlJc w:val="left"/>
+      <w:pPr>
+        <w:ind w:left="2160" w:hanging="360"/>
+      </w:pPr>
+      <w:rPr>
+        <w:rFonts w:ascii="Wingdings" w:hAnsi="Wingdings" w:hint="default"/>
+      </w:rPr>
+    </w:lvl>
+    <w:lvl w:ilvl="3" w:tplc="44090001" w:tentative="1">
+      <w:start w:val="1"/>
+      <w:numFmt w:val="bullet"/>
+      <w:lvlText w:val=""/>
+      <w:lvlJc w:val="left"/>
+      <w:pPr>
+        <w:ind w:left="2880" w:hanging="360"/>
+      </w:pPr>
+      <w:rPr>
+        <w:rFonts w:ascii="Symbol" w:hAnsi="Symbol" w:hint="default"/>
+      </w:rPr>
+    </w:lvl>
+    <w:lvl w:ilvl="4" w:tplc="44090003" w:tentative="1">
+      <w:start w:val="1"/>
+      <w:numFmt w:val="bullet"/>
+      <w:lvlText w:val="o"/>
+      <w:lvlJc w:val="left"/>
+      <w:pPr>
+        <w:ind w:left="3600" w:hanging="360"/>
+      </w:pPr>
+      <w:rPr>
+        <w:rFonts w:ascii="Courier New" w:hAnsi="Courier New" w:cs="Courier New" w:hint="default"/>
+      </w:rPr>
+    </w:lvl>
+    <w:lvl w:ilvl="5" w:tplc="44090005" w:tentative="1">
+      <w:start w:val="1"/>
+      <w:numFmt w:val="bullet"/>
+      <w:lvlText w:val=""/>
+      <w:lvlJc w:val="left"/>
+      <w:pPr>
+        <w:ind w:left="4320" w:hanging="360"/>
+      </w:pPr>
+      <w:rPr>
+        <w:rFonts w:ascii="Wingdings" w:hAnsi="Wingdings" w:hint="default"/>
+      </w:rPr>
+    </w:lvl>
+    <w:lvl w:ilvl="6" w:tplc="44090001" w:tentative="1">
+      <w:start w:val="1"/>
+      <w:numFmt w:val="bullet"/>
+      <w:lvlText w:val=""/>
+      <w:lvlJc w:val="left"/>
+      <w:pPr>
+        <w:ind w:left="5040" w:hanging="360"/>
+      </w:pPr>
+      <w:rPr>
+        <w:rFonts w:ascii="Symbol" w:hAnsi="Symbol" w:hint="default"/>
+      </w:rPr>
+    </w:lvl>
+    <w:lvl w:ilvl="7" w:tplc="44090003" w:tentative="1">
+      <w:start w:val="1"/>
+      <w:numFmt w:val="bullet"/>
+      <w:lvlText w:val="o"/>
+      <w:lvlJc w:val="left"/>
+      <w:pPr>
+        <w:ind w:left="5760" w:hanging="360"/>
+      </w:pPr>
+      <w:rPr>
+        <w:rFonts w:ascii="Courier New" w:hAnsi="Courier New" w:cs="Courier New" w:hint="default"/>
+      </w:rPr>
+    </w:lvl>
+    <w:lvl w:ilvl="8" w:tplc="44090005" w:tentative="1">
+      <w:start w:val="1"/>
+      <w:numFmt w:val="bullet"/>
+      <w:lvlText w:val=""/>
+      <w:lvlJc w:val="left"/>
+      <w:pPr>
+        <w:ind w:left="6480" w:hanging="360"/>
+      </w:pPr>
+      <w:rPr>
+        <w:rFonts w:ascii="Wingdings" w:hAnsi="Wingdings" w:hint="default"/>
+      </w:rPr>
+    </w:lvl>
+  </w:abstractNum>
+  <w:abstractNum w:abstractNumId="17" w15:restartNumberingAfterBreak="0">
     <w:nsid w:val="4D6E34D5"/>
     <w:multiLevelType w:val="hybridMultilevel"/>
     <w:tmpl w:val="6BC866D0"/>
@@ -3822,7 +3936,7 @@
       </w:rPr>
     </w:lvl>
   </w:abstractNum>
-  <w:abstractNum w:abstractNumId="17" w15:restartNumberingAfterBreak="0">
+  <w:abstractNum w:abstractNumId="18" w15:restartNumberingAfterBreak="0">
     <w:nsid w:val="52606647"/>
     <w:multiLevelType w:val="hybridMultilevel"/>
     <w:tmpl w:val="34FAD1A0"/>
@@ -3934,7 +4048,7 @@
       </w:rPr>
     </w:lvl>
   </w:abstractNum>
-  <w:abstractNum w:abstractNumId="18" w15:restartNumberingAfterBreak="0">
+  <w:abstractNum w:abstractNumId="19" w15:restartNumberingAfterBreak="0">
     <w:nsid w:val="557D5C95"/>
     <w:multiLevelType w:val="hybridMultilevel"/>
     <w:tmpl w:val="DC122E1C"/>
@@ -4046,7 +4160,7 @@
       </w:rPr>
     </w:lvl>
   </w:abstractNum>
-  <w:abstractNum w:abstractNumId="19" w15:restartNumberingAfterBreak="0">
+  <w:abstractNum w:abstractNumId="20" w15:restartNumberingAfterBreak="0">
     <w:nsid w:val="589D37B7"/>
     <w:multiLevelType w:val="hybridMultilevel"/>
     <w:tmpl w:val="9262429A"/>
@@ -4158,7 +4272,7 @@
       </w:rPr>
     </w:lvl>
   </w:abstractNum>
-  <w:abstractNum w:abstractNumId="20" w15:restartNumberingAfterBreak="0">
+  <w:abstractNum w:abstractNumId="21" w15:restartNumberingAfterBreak="0">
     <w:nsid w:val="58AA443D"/>
     <w:multiLevelType w:val="hybridMultilevel"/>
     <w:tmpl w:val="56F0D18E"/>
@@ -4271,7 +4385,7 @@
       </w:rPr>
     </w:lvl>
   </w:abstractNum>
-  <w:abstractNum w:abstractNumId="21" w15:restartNumberingAfterBreak="0">
+  <w:abstractNum w:abstractNumId="22" w15:restartNumberingAfterBreak="0">
     <w:nsid w:val="5B4B0EE2"/>
     <w:multiLevelType w:val="hybridMultilevel"/>
     <w:tmpl w:val="E8129FD8"/>
@@ -4383,7 +4497,7 @@
       </w:rPr>
     </w:lvl>
   </w:abstractNum>
-  <w:abstractNum w:abstractNumId="22" w15:restartNumberingAfterBreak="0">
+  <w:abstractNum w:abstractNumId="23" w15:restartNumberingAfterBreak="0">
     <w:nsid w:val="5C8347BF"/>
     <w:multiLevelType w:val="hybridMultilevel"/>
     <w:tmpl w:val="D2F46B88"/>
@@ -4495,7 +4609,7 @@
       </w:rPr>
     </w:lvl>
   </w:abstractNum>
-  <w:abstractNum w:abstractNumId="23" w15:restartNumberingAfterBreak="0">
+  <w:abstractNum w:abstractNumId="24" w15:restartNumberingAfterBreak="0">
     <w:nsid w:val="6A047A76"/>
     <w:multiLevelType w:val="hybridMultilevel"/>
     <w:tmpl w:val="50CADEB2"/>
@@ -4607,7 +4721,7 @@
       </w:rPr>
     </w:lvl>
   </w:abstractNum>
-  <w:abstractNum w:abstractNumId="24" w15:restartNumberingAfterBreak="0">
+  <w:abstractNum w:abstractNumId="25" w15:restartNumberingAfterBreak="0">
     <w:nsid w:val="6AC268F7"/>
     <w:multiLevelType w:val="hybridMultilevel"/>
     <w:tmpl w:val="12F21194"/>
@@ -4719,7 +4833,7 @@
       </w:rPr>
     </w:lvl>
   </w:abstractNum>
-  <w:abstractNum w:abstractNumId="25" w15:restartNumberingAfterBreak="0">
+  <w:abstractNum w:abstractNumId="26" w15:restartNumberingAfterBreak="0">
     <w:nsid w:val="6CE7392E"/>
     <w:multiLevelType w:val="hybridMultilevel"/>
     <w:tmpl w:val="2E2C9BDE"/>
@@ -4831,7 +4945,7 @@
       </w:rPr>
     </w:lvl>
   </w:abstractNum>
-  <w:abstractNum w:abstractNumId="26" w15:restartNumberingAfterBreak="0">
+  <w:abstractNum w:abstractNumId="27" w15:restartNumberingAfterBreak="0">
     <w:nsid w:val="7D5B508C"/>
     <w:multiLevelType w:val="hybridMultilevel"/>
     <w:tmpl w:val="7FAC5656"/>
@@ -4951,43 +5065,43 @@
     <w:abstractNumId w:val="12"/>
   </w:num>
   <w:num w:numId="3">
-    <w:abstractNumId w:val="16"/>
+    <w:abstractNumId w:val="17"/>
   </w:num>
   <w:num w:numId="4">
     <w:abstractNumId w:val="2"/>
   </w:num>
   <w:num w:numId="5">
-    <w:abstractNumId w:val="22"/>
+    <w:abstractNumId w:val="23"/>
   </w:num>
   <w:num w:numId="6">
-    <w:abstractNumId w:val="19"/>
+    <w:abstractNumId w:val="20"/>
   </w:num>
   <w:num w:numId="7">
     <w:abstractNumId w:val="8"/>
   </w:num>
   <w:num w:numId="8">
-    <w:abstractNumId w:val="17"/>
+    <w:abstractNumId w:val="18"/>
   </w:num>
   <w:num w:numId="9">
     <w:abstractNumId w:val="10"/>
   </w:num>
   <w:num w:numId="10">
-    <w:abstractNumId w:val="18"/>
+    <w:abstractNumId w:val="19"/>
   </w:num>
   <w:num w:numId="11">
-    <w:abstractNumId w:val="20"/>
+    <w:abstractNumId w:val="21"/>
   </w:num>
   <w:num w:numId="12">
     <w:abstractNumId w:val="14"/>
   </w:num>
   <w:num w:numId="13">
-    <w:abstractNumId w:val="26"/>
+    <w:abstractNumId w:val="27"/>
   </w:num>
   <w:num w:numId="14">
     <w:abstractNumId w:val="13"/>
   </w:num>
   <w:num w:numId="15">
-    <w:abstractNumId w:val="24"/>
+    <w:abstractNumId w:val="25"/>
   </w:num>
   <w:num w:numId="16">
     <w:abstractNumId w:val="3"/>
@@ -5008,10 +5122,10 @@
     <w:abstractNumId w:val="1"/>
   </w:num>
   <w:num w:numId="22">
-    <w:abstractNumId w:val="23"/>
+    <w:abstractNumId w:val="24"/>
   </w:num>
   <w:num w:numId="23">
-    <w:abstractNumId w:val="25"/>
+    <w:abstractNumId w:val="26"/>
   </w:num>
   <w:num w:numId="24">
     <w:abstractNumId w:val="7"/>
@@ -5023,7 +5137,10 @@
     <w:abstractNumId w:val="4"/>
   </w:num>
   <w:num w:numId="27">
-    <w:abstractNumId w:val="21"/>
+    <w:abstractNumId w:val="22"/>
+  </w:num>
+  <w:num w:numId="28">
+    <w:abstractNumId w:val="16"/>
   </w:num>
 </w:numbering>
 </file>

</xml_diff>

<commit_message>
o Add a checkbox to allow certain projects to have current week ending data date o Added a button to copy start date to target start date and due date to target end date
</commit_message>
<xml_diff>
--- a/BluePrints/Views/ChangeLog.docx
+++ b/BluePrints/Views/ChangeLog.docx
@@ -61,7 +61,57 @@
         <w:rPr>
           <w:lang w:val="en-US"/>
         </w:rPr>
-        <w:t>Fixed an issue where at completion units doesn’t match budgeted units when pushing to P6</w:t>
+        <w:t xml:space="preserve">Fixed an issue where at completion units </w:t>
+      </w:r>
+      <w:proofErr w:type="gramStart"/>
+      <w:r>
+        <w:rPr>
+          <w:lang w:val="en-US"/>
+        </w:rPr>
+        <w:t>doesn’t</w:t>
+      </w:r>
+      <w:proofErr w:type="gramEnd"/>
+      <w:r>
+        <w:rPr>
+          <w:lang w:val="en-US"/>
+        </w:rPr>
+        <w:t xml:space="preserve"> match budgeted units when pushing to P6</w:t>
+      </w:r>
+    </w:p>
+    <w:p>
+      <w:pPr>
+        <w:pStyle w:val="ListParagraph"/>
+        <w:numPr>
+          <w:ilvl w:val="1"/>
+          <w:numId w:val="25"/>
+        </w:numPr>
+        <w:rPr>
+          <w:lang w:val="en-US"/>
+        </w:rPr>
+      </w:pPr>
+      <w:r>
+        <w:rPr>
+          <w:lang w:val="en-US"/>
+        </w:rPr>
+        <w:t>Add a checkbox to allow certain projects to have current week ending data date</w:t>
+      </w:r>
+    </w:p>
+    <w:p>
+      <w:pPr>
+        <w:pStyle w:val="ListParagraph"/>
+        <w:numPr>
+          <w:ilvl w:val="1"/>
+          <w:numId w:val="25"/>
+        </w:numPr>
+        <w:rPr>
+          <w:lang w:val="en-US"/>
+        </w:rPr>
+      </w:pPr>
+      <w:r>
+        <w:rPr>
+          <w:lang w:val="en-US"/>
+        </w:rPr>
+        <w:t>Added a button to copy start date to target start date and due date to target end date</w:t>
       </w:r>
     </w:p>
     <w:p>
@@ -527,7 +577,21 @@
         <w:rPr>
           <w:lang w:val="en-US"/>
         </w:rPr>
-        <w:t>Added column to show actual labour units post data date</w:t>
+        <w:t xml:space="preserve">Added column to show actual </w:t>
+      </w:r>
+      <w:proofErr w:type="spellStart"/>
+      <w:r>
+        <w:rPr>
+          <w:lang w:val="en-US"/>
+        </w:rPr>
+        <w:t>labour</w:t>
+      </w:r>
+      <w:proofErr w:type="spellEnd"/>
+      <w:r>
+        <w:rPr>
+          <w:lang w:val="en-US"/>
+        </w:rPr>
+        <w:t xml:space="preserve"> units post data date</w:t>
       </w:r>
     </w:p>
     <w:p>
@@ -695,6 +759,7 @@
         <w:rPr>
           <w:lang w:val="en-US"/>
         </w:rPr>
+        <w:lastRenderedPageBreak/>
         <w:t>Design -&gt; Deliverables / Progress</w:t>
       </w:r>
     </w:p>
@@ -713,7 +778,21 @@
         <w:rPr>
           <w:lang w:val="en-US"/>
         </w:rPr>
-        <w:t>Added show variation name and approve units column</w:t>
+        <w:t xml:space="preserve">Added show variation name and approve </w:t>
+      </w:r>
+      <w:proofErr w:type="gramStart"/>
+      <w:r>
+        <w:rPr>
+          <w:lang w:val="en-US"/>
+        </w:rPr>
+        <w:t>units</w:t>
+      </w:r>
+      <w:proofErr w:type="gramEnd"/>
+      <w:r>
+        <w:rPr>
+          <w:lang w:val="en-US"/>
+        </w:rPr>
+        <w:t xml:space="preserve"> column</w:t>
       </w:r>
     </w:p>
     <w:p>
@@ -949,7 +1028,21 @@
         <w:rPr>
           <w:lang w:val="en-US"/>
         </w:rPr>
-        <w:t xml:space="preserve">ixed an error where newly added user isn't </w:t>
+        <w:t xml:space="preserve">ixed an error where newly added user </w:t>
+      </w:r>
+      <w:proofErr w:type="gramStart"/>
+      <w:r>
+        <w:rPr>
+          <w:lang w:val="en-US"/>
+        </w:rPr>
+        <w:t>isn't</w:t>
+      </w:r>
+      <w:proofErr w:type="gramEnd"/>
+      <w:r>
+        <w:rPr>
+          <w:lang w:val="en-US"/>
+        </w:rPr>
+        <w:t xml:space="preserve"> </w:t>
       </w:r>
       <w:r>
         <w:rPr>
@@ -1047,7 +1140,35 @@
         <w:rPr>
           <w:lang w:val="en-US"/>
         </w:rPr>
-        <w:t>ixed an issue where subjob variation code doesn't show up in book time</w:t>
+        <w:t xml:space="preserve">ixed an issue where </w:t>
+      </w:r>
+      <w:proofErr w:type="spellStart"/>
+      <w:r>
+        <w:rPr>
+          <w:lang w:val="en-US"/>
+        </w:rPr>
+        <w:t>subjob</w:t>
+      </w:r>
+      <w:proofErr w:type="spellEnd"/>
+      <w:r>
+        <w:rPr>
+          <w:lang w:val="en-US"/>
+        </w:rPr>
+        <w:t xml:space="preserve"> variation code </w:t>
+      </w:r>
+      <w:proofErr w:type="gramStart"/>
+      <w:r>
+        <w:rPr>
+          <w:lang w:val="en-US"/>
+        </w:rPr>
+        <w:t>doesn't</w:t>
+      </w:r>
+      <w:proofErr w:type="gramEnd"/>
+      <w:r>
+        <w:rPr>
+          <w:lang w:val="en-US"/>
+        </w:rPr>
+        <w:t xml:space="preserve"> show up in book time</w:t>
       </w:r>
     </w:p>
     <w:p>
@@ -1253,7 +1374,21 @@
         <w:rPr>
           <w:lang w:val="en-US"/>
         </w:rPr>
-        <w:t>llow construction jobs cells to be edited when P6 project doesn't exists</w:t>
+        <w:t xml:space="preserve">llow construction jobs cells to be edited when P6 project </w:t>
+      </w:r>
+      <w:proofErr w:type="gramStart"/>
+      <w:r>
+        <w:rPr>
+          <w:lang w:val="en-US"/>
+        </w:rPr>
+        <w:t>doesn't</w:t>
+      </w:r>
+      <w:proofErr w:type="gramEnd"/>
+      <w:r>
+        <w:rPr>
+          <w:lang w:val="en-US"/>
+        </w:rPr>
+        <w:t xml:space="preserve"> exists</w:t>
       </w:r>
     </w:p>
     <w:p>
@@ -1309,7 +1444,35 @@
         <w:rPr>
           <w:rFonts w:cs="Calibri"/>
         </w:rPr>
-        <w:t>Editing Exo -&gt; Transaction quantity will adjust line cost, line charge, line total, line total tax, line tax and linetotal incl tax in EXO</w:t>
+        <w:t xml:space="preserve">Editing Exo -&gt; Transaction quantity will adjust line cost, line charge, line total, line total tax, line tax and </w:t>
+      </w:r>
+      <w:proofErr w:type="spellStart"/>
+      <w:r>
+        <w:rPr>
+          <w:rFonts w:cs="Calibri"/>
+        </w:rPr>
+        <w:t>linetotal</w:t>
+      </w:r>
+      <w:proofErr w:type="spellEnd"/>
+      <w:r>
+        <w:rPr>
+          <w:rFonts w:cs="Calibri"/>
+        </w:rPr>
+        <w:t xml:space="preserve"> </w:t>
+      </w:r>
+      <w:proofErr w:type="spellStart"/>
+      <w:r>
+        <w:rPr>
+          <w:rFonts w:cs="Calibri"/>
+        </w:rPr>
+        <w:t>incl</w:t>
+      </w:r>
+      <w:proofErr w:type="spellEnd"/>
+      <w:r>
+        <w:rPr>
+          <w:rFonts w:cs="Calibri"/>
+        </w:rPr>
+        <w:t xml:space="preserve"> tax in EXO</w:t>
       </w:r>
     </w:p>
     <w:p>
@@ -1327,7 +1490,21 @@
         <w:rPr>
           <w:rFonts w:cs="Calibri"/>
         </w:rPr>
-        <w:t>narrative will be saved on day with hours so that when it’s approved the narrative will be transferred over</w:t>
+        <w:t xml:space="preserve">narrative will be saved on day with hours so that when </w:t>
+      </w:r>
+      <w:proofErr w:type="gramStart"/>
+      <w:r>
+        <w:rPr>
+          <w:rFonts w:cs="Calibri"/>
+        </w:rPr>
+        <w:t>it’s</w:t>
+      </w:r>
+      <w:proofErr w:type="gramEnd"/>
+      <w:r>
+        <w:rPr>
+          <w:rFonts w:cs="Calibri"/>
+        </w:rPr>
+        <w:t xml:space="preserve"> approved the narrative will be transferred over</w:t>
       </w:r>
     </w:p>
     <w:p>
@@ -1407,7 +1584,22 @@
         <w:rPr>
           <w:lang w:val="en-US"/>
         </w:rPr>
-        <w:t>Book Time dialog loads faster for user that doesn’t have authority to book time for other users</w:t>
+        <w:lastRenderedPageBreak/>
+        <w:t xml:space="preserve">Book Time dialog loads faster for user that </w:t>
+      </w:r>
+      <w:proofErr w:type="gramStart"/>
+      <w:r>
+        <w:rPr>
+          <w:lang w:val="en-US"/>
+        </w:rPr>
+        <w:t>doesn’t</w:t>
+      </w:r>
+      <w:proofErr w:type="gramEnd"/>
+      <w:r>
+        <w:rPr>
+          <w:lang w:val="en-US"/>
+        </w:rPr>
+        <w:t xml:space="preserve"> have authority to book time for other users</w:t>
       </w:r>
     </w:p>
     <w:p>

</xml_diff>

<commit_message>
- Don't show cost group and cost type error when stock code is VA001 - Fix an issue where job audit crash program when empty subjob, costgroup or cost type is logged - Only validate cost group and cost type for new item in master job - Design variation now pushes variation as default stock code item without cost group and cost type
</commit_message>
<xml_diff>
--- a/BluePrints/Views/ChangeLog.docx
+++ b/BluePrints/Views/ChangeLog.docx
@@ -12,6 +12,176 @@
         <w:rPr>
           <w:lang w:val="en-US"/>
         </w:rPr>
+        <w:t>Change Log 30</w:t>
+      </w:r>
+      <w:r>
+        <w:rPr>
+          <w:vertAlign w:val="superscript"/>
+          <w:lang w:val="en-US"/>
+        </w:rPr>
+        <w:t>th</w:t>
+      </w:r>
+      <w:r>
+        <w:rPr>
+          <w:lang w:val="en-US"/>
+        </w:rPr>
+        <w:t xml:space="preserve"> September 2020</w:t>
+      </w:r>
+    </w:p>
+    <w:p>
+      <w:pPr>
+        <w:pStyle w:val="ListParagraph"/>
+        <w:numPr>
+          <w:ilvl w:val="0"/>
+          <w:numId w:val="29"/>
+        </w:numPr>
+        <w:rPr>
+          <w:lang w:val="en-US"/>
+        </w:rPr>
+      </w:pPr>
+      <w:r>
+        <w:rPr>
+          <w:lang w:val="en-US"/>
+        </w:rPr>
+        <w:t>Exo -&gt; Jobs</w:t>
+      </w:r>
+    </w:p>
+    <w:p>
+      <w:pPr>
+        <w:pStyle w:val="ListParagraph"/>
+        <w:numPr>
+          <w:ilvl w:val="1"/>
+          <w:numId w:val="29"/>
+        </w:numPr>
+        <w:rPr>
+          <w:lang w:val="en-US"/>
+        </w:rPr>
+      </w:pPr>
+      <w:r>
+        <w:rPr>
+          <w:lang w:val="en-US"/>
+        </w:rPr>
+        <w:t>Not</w:t>
+      </w:r>
+      <w:r>
+        <w:rPr>
+          <w:lang w:val="en-US"/>
+        </w:rPr>
+        <w:t xml:space="preserve"> show</w:t>
+      </w:r>
+      <w:r>
+        <w:rPr>
+          <w:lang w:val="en-US"/>
+        </w:rPr>
+        <w:t>ing</w:t>
+      </w:r>
+      <w:r>
+        <w:rPr>
+          <w:lang w:val="en-US"/>
+        </w:rPr>
+        <w:t xml:space="preserve"> cost group and cost type error when stock code is VA001</w:t>
+      </w:r>
+    </w:p>
+    <w:p>
+      <w:pPr>
+        <w:pStyle w:val="ListParagraph"/>
+        <w:numPr>
+          <w:ilvl w:val="1"/>
+          <w:numId w:val="29"/>
+        </w:numPr>
+        <w:rPr>
+          <w:lang w:val="en-US"/>
+        </w:rPr>
+      </w:pPr>
+      <w:r>
+        <w:rPr>
+          <w:lang w:val="en-US"/>
+        </w:rPr>
+        <w:t>Only validate cost group and cost type for new item in master job</w:t>
+      </w:r>
+    </w:p>
+    <w:p>
+      <w:pPr>
+        <w:pStyle w:val="ListParagraph"/>
+        <w:numPr>
+          <w:ilvl w:val="1"/>
+          <w:numId w:val="29"/>
+        </w:numPr>
+        <w:rPr>
+          <w:lang w:val="en-US"/>
+        </w:rPr>
+      </w:pPr>
+      <w:r>
+        <w:rPr>
+          <w:lang w:val="en-US"/>
+        </w:rPr>
+        <w:t xml:space="preserve">Show duplicate error when committing to </w:t>
+      </w:r>
+      <w:r>
+        <w:rPr>
+          <w:lang w:val="en-US"/>
+        </w:rPr>
+        <w:t>EXO</w:t>
+      </w:r>
+    </w:p>
+    <w:p>
+      <w:pPr>
+        <w:pStyle w:val="ListParagraph"/>
+        <w:numPr>
+          <w:ilvl w:val="0"/>
+          <w:numId w:val="29"/>
+        </w:numPr>
+        <w:rPr>
+          <w:lang w:val="en-US"/>
+        </w:rPr>
+      </w:pPr>
+      <w:r>
+        <w:rPr>
+          <w:lang w:val="en-US"/>
+        </w:rPr>
+        <w:t>Design -&gt; Variations</w:t>
+      </w:r>
+    </w:p>
+    <w:p>
+      <w:pPr>
+        <w:pStyle w:val="ListParagraph"/>
+        <w:numPr>
+          <w:ilvl w:val="1"/>
+          <w:numId w:val="29"/>
+        </w:numPr>
+        <w:rPr>
+          <w:lang w:val="en-US"/>
+        </w:rPr>
+      </w:pPr>
+      <w:r>
+        <w:rPr>
+          <w:lang w:val="en-US"/>
+        </w:rPr>
+        <w:t>Variation codes are pushes with</w:t>
+      </w:r>
+      <w:r>
+        <w:rPr>
+          <w:lang w:val="en-US"/>
+        </w:rPr>
+        <w:t xml:space="preserve"> default stock code item without cost group and cost type</w:t>
+      </w:r>
+      <w:r>
+        <w:rPr>
+          <w:lang w:val="en-US"/>
+        </w:rPr>
+        <w:t xml:space="preserve"> so that it doesn’t clutter up forecast view</w:t>
+      </w:r>
+    </w:p>
+    <w:p>
+      <w:pPr>
+        <w:rPr>
+          <w:lang w:val="en-US"/>
+        </w:rPr>
+      </w:pPr>
+      <w:r>
+        <w:rPr>
+          <w:lang w:val="en-US"/>
+        </w:rPr>
         <w:t>Change Log 11</w:t>
       </w:r>
       <w:r>
@@ -580,6 +750,7 @@
         <w:rPr>
           <w:lang w:val="en-US"/>
         </w:rPr>
+        <w:lastRenderedPageBreak/>
         <w:t>Exo -&gt; Jobs</w:t>
       </w:r>
     </w:p>
@@ -784,7 +955,6 @@
         <w:rPr>
           <w:lang w:val="en-US"/>
         </w:rPr>
-        <w:lastRenderedPageBreak/>
         <w:t>Use total unapproved variation revenue to show unapproved revenue in forecast view</w:t>
       </w:r>
     </w:p>
@@ -1294,6 +1464,7 @@
         <w:rPr>
           <w:lang w:val="en-US"/>
         </w:rPr>
+        <w:lastRenderedPageBreak/>
         <w:t>Change Log 7</w:t>
       </w:r>
       <w:r>
@@ -1441,7 +1612,6 @@
         <w:rPr>
           <w:lang w:val="en-US"/>
         </w:rPr>
-        <w:lastRenderedPageBreak/>
         <w:t>F</w:t>
       </w:r>
       <w:r>
@@ -3065,6 +3235,118 @@
     </w:lvl>
   </w:abstractNum>
   <w:abstractNum w:abstractNumId="10" w15:restartNumberingAfterBreak="0">
+    <w:nsid w:val="1E2528E1"/>
+    <w:multiLevelType w:val="hybridMultilevel"/>
+    <w:tmpl w:val="04B6187A"/>
+    <w:lvl w:ilvl="0" w:tplc="0E6EEEC0">
+      <w:numFmt w:val="bullet"/>
+      <w:lvlText w:val="-"/>
+      <w:lvlJc w:val="left"/>
+      <w:pPr>
+        <w:ind w:left="720" w:hanging="360"/>
+      </w:pPr>
+      <w:rPr>
+        <w:rFonts w:ascii="Calibri" w:eastAsiaTheme="minorEastAsia" w:hAnsi="Calibri" w:cs="Calibri" w:hint="default"/>
+      </w:rPr>
+    </w:lvl>
+    <w:lvl w:ilvl="1" w:tplc="44090003">
+      <w:start w:val="1"/>
+      <w:numFmt w:val="bullet"/>
+      <w:lvlText w:val="o"/>
+      <w:lvlJc w:val="left"/>
+      <w:pPr>
+        <w:ind w:left="1440" w:hanging="360"/>
+      </w:pPr>
+      <w:rPr>
+        <w:rFonts w:ascii="Courier New" w:hAnsi="Courier New" w:cs="Courier New" w:hint="default"/>
+      </w:rPr>
+    </w:lvl>
+    <w:lvl w:ilvl="2" w:tplc="44090005" w:tentative="1">
+      <w:start w:val="1"/>
+      <w:numFmt w:val="bullet"/>
+      <w:lvlText w:val=""/>
+      <w:lvlJc w:val="left"/>
+      <w:pPr>
+        <w:ind w:left="2160" w:hanging="360"/>
+      </w:pPr>
+      <w:rPr>
+        <w:rFonts w:ascii="Wingdings" w:hAnsi="Wingdings" w:hint="default"/>
+      </w:rPr>
+    </w:lvl>
+    <w:lvl w:ilvl="3" w:tplc="44090001" w:tentative="1">
+      <w:start w:val="1"/>
+      <w:numFmt w:val="bullet"/>
+      <w:lvlText w:val=""/>
+      <w:lvlJc w:val="left"/>
+      <w:pPr>
+        <w:ind w:left="2880" w:hanging="360"/>
+      </w:pPr>
+      <w:rPr>
+        <w:rFonts w:ascii="Symbol" w:hAnsi="Symbol" w:hint="default"/>
+      </w:rPr>
+    </w:lvl>
+    <w:lvl w:ilvl="4" w:tplc="44090003" w:tentative="1">
+      <w:start w:val="1"/>
+      <w:numFmt w:val="bullet"/>
+      <w:lvlText w:val="o"/>
+      <w:lvlJc w:val="left"/>
+      <w:pPr>
+        <w:ind w:left="3600" w:hanging="360"/>
+      </w:pPr>
+      <w:rPr>
+        <w:rFonts w:ascii="Courier New" w:hAnsi="Courier New" w:cs="Courier New" w:hint="default"/>
+      </w:rPr>
+    </w:lvl>
+    <w:lvl w:ilvl="5" w:tplc="44090005" w:tentative="1">
+      <w:start w:val="1"/>
+      <w:numFmt w:val="bullet"/>
+      <w:lvlText w:val=""/>
+      <w:lvlJc w:val="left"/>
+      <w:pPr>
+        <w:ind w:left="4320" w:hanging="360"/>
+      </w:pPr>
+      <w:rPr>
+        <w:rFonts w:ascii="Wingdings" w:hAnsi="Wingdings" w:hint="default"/>
+      </w:rPr>
+    </w:lvl>
+    <w:lvl w:ilvl="6" w:tplc="44090001" w:tentative="1">
+      <w:start w:val="1"/>
+      <w:numFmt w:val="bullet"/>
+      <w:lvlText w:val=""/>
+      <w:lvlJc w:val="left"/>
+      <w:pPr>
+        <w:ind w:left="5040" w:hanging="360"/>
+      </w:pPr>
+      <w:rPr>
+        <w:rFonts w:ascii="Symbol" w:hAnsi="Symbol" w:hint="default"/>
+      </w:rPr>
+    </w:lvl>
+    <w:lvl w:ilvl="7" w:tplc="44090003" w:tentative="1">
+      <w:start w:val="1"/>
+      <w:numFmt w:val="bullet"/>
+      <w:lvlText w:val="o"/>
+      <w:lvlJc w:val="left"/>
+      <w:pPr>
+        <w:ind w:left="5760" w:hanging="360"/>
+      </w:pPr>
+      <w:rPr>
+        <w:rFonts w:ascii="Courier New" w:hAnsi="Courier New" w:cs="Courier New" w:hint="default"/>
+      </w:rPr>
+    </w:lvl>
+    <w:lvl w:ilvl="8" w:tplc="44090005" w:tentative="1">
+      <w:start w:val="1"/>
+      <w:numFmt w:val="bullet"/>
+      <w:lvlText w:val=""/>
+      <w:lvlJc w:val="left"/>
+      <w:pPr>
+        <w:ind w:left="6480" w:hanging="360"/>
+      </w:pPr>
+      <w:rPr>
+        <w:rFonts w:ascii="Wingdings" w:hAnsi="Wingdings" w:hint="default"/>
+      </w:rPr>
+    </w:lvl>
+  </w:abstractNum>
+  <w:abstractNum w:abstractNumId="11" w15:restartNumberingAfterBreak="0">
     <w:nsid w:val="1F4D0C5A"/>
     <w:multiLevelType w:val="hybridMultilevel"/>
     <w:tmpl w:val="58644CA6"/>
@@ -3176,7 +3458,7 @@
       </w:rPr>
     </w:lvl>
   </w:abstractNum>
-  <w:abstractNum w:abstractNumId="11" w15:restartNumberingAfterBreak="0">
+  <w:abstractNum w:abstractNumId="12" w15:restartNumberingAfterBreak="0">
     <w:nsid w:val="21223E97"/>
     <w:multiLevelType w:val="hybridMultilevel"/>
     <w:tmpl w:val="68E6E128"/>
@@ -3288,7 +3570,7 @@
       </w:rPr>
     </w:lvl>
   </w:abstractNum>
-  <w:abstractNum w:abstractNumId="12" w15:restartNumberingAfterBreak="0">
+  <w:abstractNum w:abstractNumId="13" w15:restartNumberingAfterBreak="0">
     <w:nsid w:val="22100513"/>
     <w:multiLevelType w:val="multilevel"/>
     <w:tmpl w:val="9DA06E12"/>
@@ -3401,7 +3683,7 @@
       </w:pPr>
     </w:lvl>
   </w:abstractNum>
-  <w:abstractNum w:abstractNumId="13" w15:restartNumberingAfterBreak="0">
+  <w:abstractNum w:abstractNumId="14" w15:restartNumberingAfterBreak="0">
     <w:nsid w:val="3C5C6580"/>
     <w:multiLevelType w:val="hybridMultilevel"/>
     <w:tmpl w:val="6874B70A"/>
@@ -3514,7 +3796,7 @@
       </w:rPr>
     </w:lvl>
   </w:abstractNum>
-  <w:abstractNum w:abstractNumId="14" w15:restartNumberingAfterBreak="0">
+  <w:abstractNum w:abstractNumId="15" w15:restartNumberingAfterBreak="0">
     <w:nsid w:val="4691596C"/>
     <w:multiLevelType w:val="hybridMultilevel"/>
     <w:tmpl w:val="ECEEF302"/>
@@ -3626,7 +3908,7 @@
       </w:rPr>
     </w:lvl>
   </w:abstractNum>
-  <w:abstractNum w:abstractNumId="15" w15:restartNumberingAfterBreak="0">
+  <w:abstractNum w:abstractNumId="16" w15:restartNumberingAfterBreak="0">
     <w:nsid w:val="47F951B0"/>
     <w:multiLevelType w:val="multilevel"/>
     <w:tmpl w:val="00D8A7E8"/>
@@ -3712,7 +3994,7 @@
       </w:pPr>
     </w:lvl>
   </w:abstractNum>
-  <w:abstractNum w:abstractNumId="16" w15:restartNumberingAfterBreak="0">
+  <w:abstractNum w:abstractNumId="17" w15:restartNumberingAfterBreak="0">
     <w:nsid w:val="4A9D1EBF"/>
     <w:multiLevelType w:val="hybridMultilevel"/>
     <w:tmpl w:val="3DEACDCC"/>
@@ -3824,7 +4106,7 @@
       </w:rPr>
     </w:lvl>
   </w:abstractNum>
-  <w:abstractNum w:abstractNumId="17" w15:restartNumberingAfterBreak="0">
+  <w:abstractNum w:abstractNumId="18" w15:restartNumberingAfterBreak="0">
     <w:nsid w:val="4D6E34D5"/>
     <w:multiLevelType w:val="hybridMultilevel"/>
     <w:tmpl w:val="6BC866D0"/>
@@ -3936,7 +4218,7 @@
       </w:rPr>
     </w:lvl>
   </w:abstractNum>
-  <w:abstractNum w:abstractNumId="18" w15:restartNumberingAfterBreak="0">
+  <w:abstractNum w:abstractNumId="19" w15:restartNumberingAfterBreak="0">
     <w:nsid w:val="52606647"/>
     <w:multiLevelType w:val="hybridMultilevel"/>
     <w:tmpl w:val="34FAD1A0"/>
@@ -4048,7 +4330,7 @@
       </w:rPr>
     </w:lvl>
   </w:abstractNum>
-  <w:abstractNum w:abstractNumId="19" w15:restartNumberingAfterBreak="0">
+  <w:abstractNum w:abstractNumId="20" w15:restartNumberingAfterBreak="0">
     <w:nsid w:val="557D5C95"/>
     <w:multiLevelType w:val="hybridMultilevel"/>
     <w:tmpl w:val="DC122E1C"/>
@@ -4160,7 +4442,7 @@
       </w:rPr>
     </w:lvl>
   </w:abstractNum>
-  <w:abstractNum w:abstractNumId="20" w15:restartNumberingAfterBreak="0">
+  <w:abstractNum w:abstractNumId="21" w15:restartNumberingAfterBreak="0">
     <w:nsid w:val="589D37B7"/>
     <w:multiLevelType w:val="hybridMultilevel"/>
     <w:tmpl w:val="9262429A"/>
@@ -4272,7 +4554,7 @@
       </w:rPr>
     </w:lvl>
   </w:abstractNum>
-  <w:abstractNum w:abstractNumId="21" w15:restartNumberingAfterBreak="0">
+  <w:abstractNum w:abstractNumId="22" w15:restartNumberingAfterBreak="0">
     <w:nsid w:val="58AA443D"/>
     <w:multiLevelType w:val="hybridMultilevel"/>
     <w:tmpl w:val="56F0D18E"/>
@@ -4385,7 +4667,7 @@
       </w:rPr>
     </w:lvl>
   </w:abstractNum>
-  <w:abstractNum w:abstractNumId="22" w15:restartNumberingAfterBreak="0">
+  <w:abstractNum w:abstractNumId="23" w15:restartNumberingAfterBreak="0">
     <w:nsid w:val="5B4B0EE2"/>
     <w:multiLevelType w:val="hybridMultilevel"/>
     <w:tmpl w:val="E8129FD8"/>
@@ -4497,7 +4779,7 @@
       </w:rPr>
     </w:lvl>
   </w:abstractNum>
-  <w:abstractNum w:abstractNumId="23" w15:restartNumberingAfterBreak="0">
+  <w:abstractNum w:abstractNumId="24" w15:restartNumberingAfterBreak="0">
     <w:nsid w:val="5C8347BF"/>
     <w:multiLevelType w:val="hybridMultilevel"/>
     <w:tmpl w:val="D2F46B88"/>
@@ -4609,7 +4891,7 @@
       </w:rPr>
     </w:lvl>
   </w:abstractNum>
-  <w:abstractNum w:abstractNumId="24" w15:restartNumberingAfterBreak="0">
+  <w:abstractNum w:abstractNumId="25" w15:restartNumberingAfterBreak="0">
     <w:nsid w:val="6A047A76"/>
     <w:multiLevelType w:val="hybridMultilevel"/>
     <w:tmpl w:val="50CADEB2"/>
@@ -4721,7 +5003,7 @@
       </w:rPr>
     </w:lvl>
   </w:abstractNum>
-  <w:abstractNum w:abstractNumId="25" w15:restartNumberingAfterBreak="0">
+  <w:abstractNum w:abstractNumId="26" w15:restartNumberingAfterBreak="0">
     <w:nsid w:val="6AC268F7"/>
     <w:multiLevelType w:val="hybridMultilevel"/>
     <w:tmpl w:val="12F21194"/>
@@ -4833,7 +5115,7 @@
       </w:rPr>
     </w:lvl>
   </w:abstractNum>
-  <w:abstractNum w:abstractNumId="26" w15:restartNumberingAfterBreak="0">
+  <w:abstractNum w:abstractNumId="27" w15:restartNumberingAfterBreak="0">
     <w:nsid w:val="6CE7392E"/>
     <w:multiLevelType w:val="hybridMultilevel"/>
     <w:tmpl w:val="2E2C9BDE"/>
@@ -4945,7 +5227,7 @@
       </w:rPr>
     </w:lvl>
   </w:abstractNum>
-  <w:abstractNum w:abstractNumId="27" w15:restartNumberingAfterBreak="0">
+  <w:abstractNum w:abstractNumId="28" w15:restartNumberingAfterBreak="0">
     <w:nsid w:val="7D5B508C"/>
     <w:multiLevelType w:val="hybridMultilevel"/>
     <w:tmpl w:val="7FAC5656"/>
@@ -5059,49 +5341,49 @@
     </w:lvl>
   </w:abstractNum>
   <w:num w:numId="1">
-    <w:abstractNumId w:val="15"/>
+    <w:abstractNumId w:val="16"/>
   </w:num>
   <w:num w:numId="2">
-    <w:abstractNumId w:val="12"/>
+    <w:abstractNumId w:val="13"/>
   </w:num>
   <w:num w:numId="3">
-    <w:abstractNumId w:val="17"/>
+    <w:abstractNumId w:val="18"/>
   </w:num>
   <w:num w:numId="4">
     <w:abstractNumId w:val="2"/>
   </w:num>
   <w:num w:numId="5">
-    <w:abstractNumId w:val="23"/>
+    <w:abstractNumId w:val="24"/>
   </w:num>
   <w:num w:numId="6">
-    <w:abstractNumId w:val="20"/>
+    <w:abstractNumId w:val="21"/>
   </w:num>
   <w:num w:numId="7">
     <w:abstractNumId w:val="8"/>
   </w:num>
   <w:num w:numId="8">
-    <w:abstractNumId w:val="18"/>
+    <w:abstractNumId w:val="19"/>
   </w:num>
   <w:num w:numId="9">
-    <w:abstractNumId w:val="10"/>
+    <w:abstractNumId w:val="11"/>
   </w:num>
   <w:num w:numId="10">
-    <w:abstractNumId w:val="19"/>
+    <w:abstractNumId w:val="20"/>
   </w:num>
   <w:num w:numId="11">
-    <w:abstractNumId w:val="21"/>
+    <w:abstractNumId w:val="22"/>
   </w:num>
   <w:num w:numId="12">
+    <w:abstractNumId w:val="15"/>
+  </w:num>
+  <w:num w:numId="13">
+    <w:abstractNumId w:val="28"/>
+  </w:num>
+  <w:num w:numId="14">
     <w:abstractNumId w:val="14"/>
   </w:num>
-  <w:num w:numId="13">
-    <w:abstractNumId w:val="27"/>
-  </w:num>
-  <w:num w:numId="14">
-    <w:abstractNumId w:val="13"/>
-  </w:num>
   <w:num w:numId="15">
-    <w:abstractNumId w:val="25"/>
+    <w:abstractNumId w:val="26"/>
   </w:num>
   <w:num w:numId="16">
     <w:abstractNumId w:val="3"/>
@@ -5110,7 +5392,7 @@
     <w:abstractNumId w:val="9"/>
   </w:num>
   <w:num w:numId="18">
-    <w:abstractNumId w:val="11"/>
+    <w:abstractNumId w:val="12"/>
   </w:num>
   <w:num w:numId="19">
     <w:abstractNumId w:val="6"/>
@@ -5122,10 +5404,10 @@
     <w:abstractNumId w:val="1"/>
   </w:num>
   <w:num w:numId="22">
-    <w:abstractNumId w:val="24"/>
+    <w:abstractNumId w:val="25"/>
   </w:num>
   <w:num w:numId="23">
-    <w:abstractNumId w:val="26"/>
+    <w:abstractNumId w:val="27"/>
   </w:num>
   <w:num w:numId="24">
     <w:abstractNumId w:val="7"/>
@@ -5137,10 +5419,13 @@
     <w:abstractNumId w:val="4"/>
   </w:num>
   <w:num w:numId="27">
-    <w:abstractNumId w:val="22"/>
+    <w:abstractNumId w:val="23"/>
   </w:num>
   <w:num w:numId="28">
-    <w:abstractNumId w:val="16"/>
+    <w:abstractNumId w:val="17"/>
+  </w:num>
+  <w:num w:numId="29">
+    <w:abstractNumId w:val="10"/>
   </w:num>
 </w:numbering>
 </file>

</xml_diff>

<commit_message>
- show backward/forward buttons when user can change data date - report date is used instead when user that have permission changes data date on progress view
</commit_message>
<xml_diff>
--- a/BluePrints/Views/ChangeLog.docx
+++ b/BluePrints/Views/ChangeLog.docx
@@ -61,39 +61,31 @@
         <w:rPr>
           <w:lang w:val="en-US"/>
         </w:rPr>
-        <w:t>Remove the ability to edit/backward/forward data date</w:t>
-      </w:r>
-    </w:p>
-    <w:p>
-      <w:pPr>
-        <w:pStyle w:val="ListParagraph"/>
-        <w:numPr>
-          <w:ilvl w:val="1"/>
-          <w:numId w:val="30"/>
-        </w:numPr>
-        <w:rPr>
-          <w:lang w:val="en-US"/>
-        </w:rPr>
-      </w:pPr>
-      <w:r>
-        <w:rPr>
-          <w:lang w:val="en-US"/>
-        </w:rPr>
         <w:t xml:space="preserve">Certain users will always </w:t>
       </w:r>
-      <w:proofErr w:type="gramStart"/>
-      <w:r>
-        <w:rPr>
-          <w:lang w:val="en-US"/>
-        </w:rPr>
-        <w:t>open up</w:t>
-      </w:r>
-      <w:proofErr w:type="gramEnd"/>
-      <w:r>
-        <w:rPr>
-          <w:lang w:val="en-US"/>
-        </w:rPr>
-        <w:t xml:space="preserve"> progress screen with previous week’s data date. The permission is as follows</w:t>
+      <w:r>
+        <w:rPr>
+          <w:lang w:val="en-US"/>
+        </w:rPr>
+        <w:t>open</w:t>
+      </w:r>
+      <w:r>
+        <w:rPr>
+          <w:lang w:val="en-US"/>
+        </w:rPr>
+        <w:t xml:space="preserve"> progress screen with previous week’s data date. </w:t>
+      </w:r>
+      <w:r>
+        <w:rPr>
+          <w:lang w:val="en-US"/>
+        </w:rPr>
+        <w:t xml:space="preserve">These users can also change progress data date, and it will not interfere with the data date for user that does not have the permission uses. </w:t>
+      </w:r>
+      <w:r>
+        <w:rPr>
+          <w:lang w:val="en-US"/>
+        </w:rPr>
+        <w:t>The permission is as follows</w:t>
       </w:r>
     </w:p>
     <w:p>
@@ -110,10 +102,10 @@
           <w:lang w:val="en-US"/>
         </w:rPr>
         <w:drawing>
-          <wp:inline distT="0" distB="0" distL="0" distR="0" wp14:anchorId="1F9DC5B4" wp14:editId="5D06BEE9">
-            <wp:extent cx="5720080" cy="3476625"/>
-            <wp:effectExtent l="0" t="0" r="0" b="9525"/>
-            <wp:docPr id="2" name="Picture 2"/>
+          <wp:inline distT="0" distB="0" distL="0" distR="0" wp14:anchorId="188DA907" wp14:editId="44932F01">
+            <wp:extent cx="5730875" cy="4954905"/>
+            <wp:effectExtent l="0" t="0" r="3175" b="0"/>
+            <wp:docPr id="1" name="Picture 1"/>
             <wp:cNvGraphicFramePr>
               <a:graphicFrameLocks xmlns:a="http://schemas.openxmlformats.org/drawingml/2006/main" noChangeAspect="1"/>
             </wp:cNvGraphicFramePr>
@@ -142,7 +134,7 @@
                   <pic:spPr bwMode="auto">
                     <a:xfrm>
                       <a:off x="0" y="0"/>
-                      <a:ext cx="5720080" cy="3476625"/>
+                      <a:ext cx="5730875" cy="4954905"/>
                     </a:xfrm>
                     <a:prstGeom prst="rect">
                       <a:avLst/>
@@ -326,21 +318,7 @@
         <w:rPr>
           <w:lang w:val="en-US"/>
         </w:rPr>
-        <w:t xml:space="preserve"> so that it </w:t>
-      </w:r>
-      <w:proofErr w:type="gramStart"/>
-      <w:r>
-        <w:rPr>
-          <w:lang w:val="en-US"/>
-        </w:rPr>
-        <w:t>doesn’t</w:t>
-      </w:r>
-      <w:proofErr w:type="gramEnd"/>
-      <w:r>
-        <w:rPr>
-          <w:lang w:val="en-US"/>
-        </w:rPr>
-        <w:t xml:space="preserve"> clutter up forecast view</w:t>
+        <w:t xml:space="preserve"> so that it doesn’t clutter up forecast view</w:t>
       </w:r>
     </w:p>
     <w:p>
@@ -402,6 +380,7 @@
         <w:rPr>
           <w:lang w:val="en-US"/>
         </w:rPr>
+        <w:lastRenderedPageBreak/>
         <w:t>A</w:t>
       </w:r>
       <w:r>
@@ -510,21 +489,7 @@
         <w:rPr>
           <w:lang w:val="en-US"/>
         </w:rPr>
-        <w:t xml:space="preserve">how cell error when sub job codes </w:t>
-      </w:r>
-      <w:proofErr w:type="gramStart"/>
-      <w:r>
-        <w:rPr>
-          <w:lang w:val="en-US"/>
-        </w:rPr>
-        <w:t>isn't</w:t>
-      </w:r>
-      <w:proofErr w:type="gramEnd"/>
-      <w:r>
-        <w:rPr>
-          <w:lang w:val="en-US"/>
-        </w:rPr>
-        <w:t xml:space="preserve"> valid for chosen type</w:t>
+        <w:t>how cell error when sub job codes isn't valid for chosen type</w:t>
       </w:r>
     </w:p>
     <w:p>
@@ -586,7 +551,6 @@
         <w:rPr>
           <w:lang w:val="en-US"/>
         </w:rPr>
-        <w:lastRenderedPageBreak/>
         <w:t>S</w:t>
       </w:r>
       <w:r>
@@ -794,21 +758,7 @@
         <w:rPr>
           <w:lang w:val="en-US"/>
         </w:rPr>
-        <w:t xml:space="preserve">Fixed an issue where at completion units </w:t>
-      </w:r>
-      <w:proofErr w:type="gramStart"/>
-      <w:r>
-        <w:rPr>
-          <w:lang w:val="en-US"/>
-        </w:rPr>
-        <w:t>doesn’t</w:t>
-      </w:r>
-      <w:proofErr w:type="gramEnd"/>
-      <w:r>
-        <w:rPr>
-          <w:lang w:val="en-US"/>
-        </w:rPr>
-        <w:t xml:space="preserve"> match budgeted units when pushing to P6</w:t>
+        <w:t>Fixed an issue where at completion units doesn’t match budgeted units when pushing to P6</w:t>
       </w:r>
     </w:p>
     <w:p>
@@ -1212,6 +1162,7 @@
         <w:rPr>
           <w:lang w:val="en-US"/>
         </w:rPr>
+        <w:lastRenderedPageBreak/>
         <w:t>Construction -&gt; Variation</w:t>
       </w:r>
     </w:p>
@@ -1337,7 +1288,6 @@
         <w:rPr>
           <w:lang w:val="en-US"/>
         </w:rPr>
-        <w:lastRenderedPageBreak/>
         <w:t>Change Log 22</w:t>
       </w:r>
       <w:r>
@@ -1511,21 +1461,7 @@
         <w:rPr>
           <w:lang w:val="en-US"/>
         </w:rPr>
-        <w:t xml:space="preserve">Added show variation name and approve </w:t>
-      </w:r>
-      <w:proofErr w:type="gramStart"/>
-      <w:r>
-        <w:rPr>
-          <w:lang w:val="en-US"/>
-        </w:rPr>
-        <w:t>units</w:t>
-      </w:r>
-      <w:proofErr w:type="gramEnd"/>
-      <w:r>
-        <w:rPr>
-          <w:lang w:val="en-US"/>
-        </w:rPr>
-        <w:t xml:space="preserve"> column</w:t>
+        <w:t>Added show variation name and approve units column</w:t>
       </w:r>
     </w:p>
     <w:p>
@@ -1761,21 +1697,7 @@
         <w:rPr>
           <w:lang w:val="en-US"/>
         </w:rPr>
-        <w:t xml:space="preserve">ixed an error where newly added user </w:t>
-      </w:r>
-      <w:proofErr w:type="gramStart"/>
-      <w:r>
-        <w:rPr>
-          <w:lang w:val="en-US"/>
-        </w:rPr>
-        <w:t>isn't</w:t>
-      </w:r>
-      <w:proofErr w:type="gramEnd"/>
-      <w:r>
-        <w:rPr>
-          <w:lang w:val="en-US"/>
-        </w:rPr>
-        <w:t xml:space="preserve"> </w:t>
+        <w:t xml:space="preserve">ixed an error where newly added user isn't </w:t>
       </w:r>
       <w:r>
         <w:rPr>
@@ -1887,21 +1809,7 @@
         <w:rPr>
           <w:lang w:val="en-US"/>
         </w:rPr>
-        <w:t xml:space="preserve"> variation code </w:t>
-      </w:r>
-      <w:proofErr w:type="gramStart"/>
-      <w:r>
-        <w:rPr>
-          <w:lang w:val="en-US"/>
-        </w:rPr>
-        <w:t>doesn't</w:t>
-      </w:r>
-      <w:proofErr w:type="gramEnd"/>
-      <w:r>
-        <w:rPr>
-          <w:lang w:val="en-US"/>
-        </w:rPr>
-        <w:t xml:space="preserve"> show up in book time</w:t>
+        <w:t xml:space="preserve"> variation code doesn't show up in book time</w:t>
       </w:r>
     </w:p>
     <w:p>
@@ -1963,6 +1871,7 @@
         <w:rPr>
           <w:lang w:val="en-US"/>
         </w:rPr>
+        <w:lastRenderedPageBreak/>
         <w:t>Try to fix an issue where module loads partial data</w:t>
       </w:r>
     </w:p>
@@ -2107,21 +2016,7 @@
         <w:rPr>
           <w:lang w:val="en-US"/>
         </w:rPr>
-        <w:t xml:space="preserve">llow construction jobs cells to be edited when P6 project </w:t>
-      </w:r>
-      <w:proofErr w:type="gramStart"/>
-      <w:r>
-        <w:rPr>
-          <w:lang w:val="en-US"/>
-        </w:rPr>
-        <w:t>doesn't</w:t>
-      </w:r>
-      <w:proofErr w:type="gramEnd"/>
-      <w:r>
-        <w:rPr>
-          <w:lang w:val="en-US"/>
-        </w:rPr>
-        <w:t xml:space="preserve"> exists</w:t>
+        <w:t>llow construction jobs cells to be edited when P6 project doesn't exists</w:t>
       </w:r>
     </w:p>
     <w:p>
@@ -2162,7 +2057,6 @@
         <w:rPr>
           <w:rFonts w:cs="Calibri"/>
         </w:rPr>
-        <w:lastRenderedPageBreak/>
         <w:t>Allow user with permission to edit Exo -&gt; Transaction quantity</w:t>
       </w:r>
     </w:p>
@@ -2224,21 +2118,7 @@
         <w:rPr>
           <w:rFonts w:cs="Calibri"/>
         </w:rPr>
-        <w:t xml:space="preserve">narrative will be saved on day with hours so that when </w:t>
-      </w:r>
-      <w:proofErr w:type="gramStart"/>
-      <w:r>
-        <w:rPr>
-          <w:rFonts w:cs="Calibri"/>
-        </w:rPr>
-        <w:t>it’s</w:t>
-      </w:r>
-      <w:proofErr w:type="gramEnd"/>
-      <w:r>
-        <w:rPr>
-          <w:rFonts w:cs="Calibri"/>
-        </w:rPr>
-        <w:t xml:space="preserve"> approved the narrative will be transferred over</w:t>
+        <w:t>narrative will be saved on day with hours so that when it’s approved the narrative will be transferred over</w:t>
       </w:r>
     </w:p>
     <w:p>
@@ -2318,21 +2198,7 @@
         <w:rPr>
           <w:lang w:val="en-US"/>
         </w:rPr>
-        <w:t xml:space="preserve">Book Time dialog loads faster for user that </w:t>
-      </w:r>
-      <w:proofErr w:type="gramStart"/>
-      <w:r>
-        <w:rPr>
-          <w:lang w:val="en-US"/>
-        </w:rPr>
-        <w:t>doesn’t</w:t>
-      </w:r>
-      <w:proofErr w:type="gramEnd"/>
-      <w:r>
-        <w:rPr>
-          <w:lang w:val="en-US"/>
-        </w:rPr>
-        <w:t xml:space="preserve"> have authority to book time for other users</w:t>
+        <w:t>Book Time dialog loads faster for user that doesn’t have authority to book time for other users</w:t>
       </w:r>
     </w:p>
     <w:p>

</xml_diff>

<commit_message>
- deliverables gates goes by phases to support differentiation between D1, D2
</commit_message>
<xml_diff>
--- a/BluePrints/Views/ChangeLog.docx
+++ b/BluePrints/Views/ChangeLog.docx
@@ -2,6 +2,74 @@
 <file path=word/document.xml><?xml version="1.0" encoding="utf-8"?>
 <w:document xmlns:wpc="http://schemas.microsoft.com/office/word/2010/wordprocessingCanvas" xmlns:cx="http://schemas.microsoft.com/office/drawing/2014/chartex" xmlns:cx1="http://schemas.microsoft.com/office/drawing/2015/9/8/chartex" xmlns:cx2="http://schemas.microsoft.com/office/drawing/2015/10/21/chartex" xmlns:cx3="http://schemas.microsoft.com/office/drawing/2016/5/9/chartex" xmlns:cx4="http://schemas.microsoft.com/office/drawing/2016/5/10/chartex" xmlns:cx5="http://schemas.microsoft.com/office/drawing/2016/5/11/chartex" xmlns:cx6="http://schemas.microsoft.com/office/drawing/2016/5/12/chartex" xmlns:cx7="http://schemas.microsoft.com/office/drawing/2016/5/13/chartex" xmlns:cx8="http://schemas.microsoft.com/office/drawing/2016/5/14/chartex" xmlns:mc="http://schemas.openxmlformats.org/markup-compatibility/2006" xmlns:aink="http://schemas.microsoft.com/office/drawing/2016/ink" xmlns:am3d="http://schemas.microsoft.com/office/drawing/2017/model3d" xmlns:o="urn:schemas-microsoft-com:office:office" xmlns:r="http://schemas.openxmlformats.org/officeDocument/2006/relationships" xmlns:m="http://schemas.openxmlformats.org/officeDocument/2006/math" xmlns:v="urn:schemas-microsoft-com:vml" xmlns:wp14="http://schemas.microsoft.com/office/word/2010/wordprocessingDrawing" xmlns:wp="http://schemas.openxmlformats.org/drawingml/2006/wordprocessingDrawing" xmlns:w10="urn:schemas-microsoft-com:office:word" xmlns:w="http://schemas.openxmlformats.org/wordprocessingml/2006/main" xmlns:w14="http://schemas.microsoft.com/office/word/2010/wordml" xmlns:w15="http://schemas.microsoft.com/office/word/2012/wordml" xmlns:w16cex="http://schemas.microsoft.com/office/word/2018/wordml/cex" xmlns:w16cid="http://schemas.microsoft.com/office/word/2016/wordml/cid" xmlns:w16="http://schemas.microsoft.com/office/word/2018/wordml" xmlns:w16se="http://schemas.microsoft.com/office/word/2015/wordml/symex" xmlns:wpg="http://schemas.microsoft.com/office/word/2010/wordprocessingGroup" xmlns:wpi="http://schemas.microsoft.com/office/word/2010/wordprocessingInk" xmlns:wne="http://schemas.microsoft.com/office/word/2006/wordml" xmlns:wps="http://schemas.microsoft.com/office/word/2010/wordprocessingShape" mc:Ignorable="w14 w15 w16se w16cid w16 w16cex wp14">
   <w:body>
+    <w:p>
+      <w:pPr>
+        <w:rPr>
+          <w:lang w:val="en-US"/>
+        </w:rPr>
+      </w:pPr>
+      <w:r>
+        <w:rPr>
+          <w:lang w:val="en-US"/>
+        </w:rPr>
+        <w:t>Change Log 12</w:t>
+      </w:r>
+      <w:r>
+        <w:rPr>
+          <w:vertAlign w:val="superscript"/>
+          <w:lang w:val="en-US"/>
+        </w:rPr>
+        <w:t>th</w:t>
+      </w:r>
+      <w:r>
+        <w:rPr>
+          <w:lang w:val="en-US"/>
+        </w:rPr>
+        <w:t xml:space="preserve"> Nov 2020</w:t>
+      </w:r>
+    </w:p>
+    <w:p>
+      <w:pPr>
+        <w:pStyle w:val="ListParagraph"/>
+        <w:numPr>
+          <w:ilvl w:val="0"/>
+          <w:numId w:val="31"/>
+        </w:numPr>
+        <w:rPr>
+          <w:lang w:val="en-US"/>
+        </w:rPr>
+      </w:pPr>
+      <w:r>
+        <w:rPr>
+          <w:lang w:val="en-US"/>
+        </w:rPr>
+        <w:t>Design -&gt; Deliverables Gates</w:t>
+      </w:r>
+    </w:p>
+    <w:p>
+      <w:pPr>
+        <w:pStyle w:val="ListParagraph"/>
+        <w:numPr>
+          <w:ilvl w:val="1"/>
+          <w:numId w:val="31"/>
+        </w:numPr>
+        <w:rPr>
+          <w:lang w:val="en-US"/>
+        </w:rPr>
+      </w:pPr>
+      <w:r>
+        <w:rPr>
+          <w:lang w:val="en-US"/>
+        </w:rPr>
+        <w:t>Deliverable</w:t>
+      </w:r>
+      <w:r>
+        <w:rPr>
+          <w:lang w:val="en-US"/>
+        </w:rPr>
+        <w:t xml:space="preserve"> gates goes by phases to support differentiation between D1, D2</w:t>
+      </w:r>
+    </w:p>
     <w:p>
       <w:pPr>
         <w:rPr>
@@ -306,6 +374,7 @@
         <w:rPr>
           <w:lang w:val="en-US"/>
         </w:rPr>
+        <w:lastRenderedPageBreak/>
         <w:t>Variation codes are pushes with</w:t>
       </w:r>
       <w:r>
@@ -380,7 +449,6 @@
         <w:rPr>
           <w:lang w:val="en-US"/>
         </w:rPr>
-        <w:lastRenderedPageBreak/>
         <w:t>A</w:t>
       </w:r>
       <w:r>
@@ -557,21 +625,7 @@
         <w:rPr>
           <w:lang w:val="en-US"/>
         </w:rPr>
-        <w:t xml:space="preserve">how empty cost group and cost type in forecast to </w:t>
-      </w:r>
-      <w:proofErr w:type="spellStart"/>
-      <w:r>
-        <w:rPr>
-          <w:lang w:val="en-US"/>
-        </w:rPr>
-        <w:t>accomodate</w:t>
-      </w:r>
-      <w:proofErr w:type="spellEnd"/>
-      <w:r>
-        <w:rPr>
-          <w:lang w:val="en-US"/>
-        </w:rPr>
-        <w:t xml:space="preserve"> variations without cost group and cost type coming from construction variation module</w:t>
+        <w:t>how empty cost group and cost type in forecast to accomodate variations without cost group and cost type coming from construction variation module</w:t>
       </w:r>
     </w:p>
     <w:p>
@@ -1162,7 +1216,6 @@
         <w:rPr>
           <w:lang w:val="en-US"/>
         </w:rPr>
-        <w:lastRenderedPageBreak/>
         <w:t>Construction -&gt; Variation</w:t>
       </w:r>
     </w:p>
@@ -1261,21 +1314,7 @@
         <w:rPr>
           <w:lang w:val="en-US"/>
         </w:rPr>
-        <w:t xml:space="preserve">Added column to show actual </w:t>
-      </w:r>
-      <w:proofErr w:type="spellStart"/>
-      <w:r>
-        <w:rPr>
-          <w:lang w:val="en-US"/>
-        </w:rPr>
-        <w:t>labour</w:t>
-      </w:r>
-      <w:proofErr w:type="spellEnd"/>
-      <w:r>
-        <w:rPr>
-          <w:lang w:val="en-US"/>
-        </w:rPr>
-        <w:t xml:space="preserve"> units post data date</w:t>
+        <w:t>Added column to show actual labour units post data date</w:t>
       </w:r>
     </w:p>
     <w:p>
@@ -1740,6 +1779,7 @@
         <w:rPr>
           <w:lang w:val="en-US"/>
         </w:rPr>
+        <w:lastRenderedPageBreak/>
         <w:t>Change Log 3</w:t>
       </w:r>
       <w:r>
@@ -1795,21 +1835,7 @@
         <w:rPr>
           <w:lang w:val="en-US"/>
         </w:rPr>
-        <w:t xml:space="preserve">ixed an issue where </w:t>
-      </w:r>
-      <w:proofErr w:type="spellStart"/>
-      <w:r>
-        <w:rPr>
-          <w:lang w:val="en-US"/>
-        </w:rPr>
-        <w:t>subjob</w:t>
-      </w:r>
-      <w:proofErr w:type="spellEnd"/>
-      <w:r>
-        <w:rPr>
-          <w:lang w:val="en-US"/>
-        </w:rPr>
-        <w:t xml:space="preserve"> variation code doesn't show up in book time</w:t>
+        <w:t>ixed an issue where subjob variation code doesn't show up in book time</w:t>
       </w:r>
     </w:p>
     <w:p>
@@ -1871,7 +1897,6 @@
         <w:rPr>
           <w:lang w:val="en-US"/>
         </w:rPr>
-        <w:lastRenderedPageBreak/>
         <w:t>Try to fix an issue where module loads partial data</w:t>
       </w:r>
     </w:p>
@@ -2072,35 +2097,7 @@
         <w:rPr>
           <w:rFonts w:cs="Calibri"/>
         </w:rPr>
-        <w:t xml:space="preserve">Editing Exo -&gt; Transaction quantity will adjust line cost, line charge, line total, line total tax, line tax and </w:t>
-      </w:r>
-      <w:proofErr w:type="spellStart"/>
-      <w:r>
-        <w:rPr>
-          <w:rFonts w:cs="Calibri"/>
-        </w:rPr>
-        <w:t>linetotal</w:t>
-      </w:r>
-      <w:proofErr w:type="spellEnd"/>
-      <w:r>
-        <w:rPr>
-          <w:rFonts w:cs="Calibri"/>
-        </w:rPr>
-        <w:t xml:space="preserve"> </w:t>
-      </w:r>
-      <w:proofErr w:type="spellStart"/>
-      <w:r>
-        <w:rPr>
-          <w:rFonts w:cs="Calibri"/>
-        </w:rPr>
-        <w:t>incl</w:t>
-      </w:r>
-      <w:proofErr w:type="spellEnd"/>
-      <w:r>
-        <w:rPr>
-          <w:rFonts w:cs="Calibri"/>
-        </w:rPr>
-        <w:t xml:space="preserve"> tax in EXO</w:t>
+        <w:t>Editing Exo -&gt; Transaction quantity will adjust line cost, line charge, line total, line total tax, line tax and linetotal incl tax in EXO</w:t>
       </w:r>
     </w:p>
     <w:p>
@@ -4016,6 +4013,118 @@
     </w:lvl>
   </w:abstractNum>
   <w:abstractNum w:abstractNumId="15" w15:restartNumberingAfterBreak="0">
+    <w:nsid w:val="24E10BB5"/>
+    <w:multiLevelType w:val="hybridMultilevel"/>
+    <w:tmpl w:val="F8FEBADA"/>
+    <w:lvl w:ilvl="0" w:tplc="DCC27D78">
+      <w:numFmt w:val="bullet"/>
+      <w:lvlText w:val="-"/>
+      <w:lvlJc w:val="left"/>
+      <w:pPr>
+        <w:ind w:left="720" w:hanging="360"/>
+      </w:pPr>
+      <w:rPr>
+        <w:rFonts w:ascii="Calibri" w:eastAsiaTheme="minorEastAsia" w:hAnsi="Calibri" w:cs="Calibri" w:hint="default"/>
+      </w:rPr>
+    </w:lvl>
+    <w:lvl w:ilvl="1" w:tplc="0C090003">
+      <w:start w:val="1"/>
+      <w:numFmt w:val="bullet"/>
+      <w:lvlText w:val="o"/>
+      <w:lvlJc w:val="left"/>
+      <w:pPr>
+        <w:ind w:left="1440" w:hanging="360"/>
+      </w:pPr>
+      <w:rPr>
+        <w:rFonts w:ascii="Courier New" w:hAnsi="Courier New" w:cs="Courier New" w:hint="default"/>
+      </w:rPr>
+    </w:lvl>
+    <w:lvl w:ilvl="2" w:tplc="0C090005" w:tentative="1">
+      <w:start w:val="1"/>
+      <w:numFmt w:val="bullet"/>
+      <w:lvlText w:val=""/>
+      <w:lvlJc w:val="left"/>
+      <w:pPr>
+        <w:ind w:left="2160" w:hanging="360"/>
+      </w:pPr>
+      <w:rPr>
+        <w:rFonts w:ascii="Wingdings" w:hAnsi="Wingdings" w:hint="default"/>
+      </w:rPr>
+    </w:lvl>
+    <w:lvl w:ilvl="3" w:tplc="0C090001" w:tentative="1">
+      <w:start w:val="1"/>
+      <w:numFmt w:val="bullet"/>
+      <w:lvlText w:val=""/>
+      <w:lvlJc w:val="left"/>
+      <w:pPr>
+        <w:ind w:left="2880" w:hanging="360"/>
+      </w:pPr>
+      <w:rPr>
+        <w:rFonts w:ascii="Symbol" w:hAnsi="Symbol" w:hint="default"/>
+      </w:rPr>
+    </w:lvl>
+    <w:lvl w:ilvl="4" w:tplc="0C090003" w:tentative="1">
+      <w:start w:val="1"/>
+      <w:numFmt w:val="bullet"/>
+      <w:lvlText w:val="o"/>
+      <w:lvlJc w:val="left"/>
+      <w:pPr>
+        <w:ind w:left="3600" w:hanging="360"/>
+      </w:pPr>
+      <w:rPr>
+        <w:rFonts w:ascii="Courier New" w:hAnsi="Courier New" w:cs="Courier New" w:hint="default"/>
+      </w:rPr>
+    </w:lvl>
+    <w:lvl w:ilvl="5" w:tplc="0C090005" w:tentative="1">
+      <w:start w:val="1"/>
+      <w:numFmt w:val="bullet"/>
+      <w:lvlText w:val=""/>
+      <w:lvlJc w:val="left"/>
+      <w:pPr>
+        <w:ind w:left="4320" w:hanging="360"/>
+      </w:pPr>
+      <w:rPr>
+        <w:rFonts w:ascii="Wingdings" w:hAnsi="Wingdings" w:hint="default"/>
+      </w:rPr>
+    </w:lvl>
+    <w:lvl w:ilvl="6" w:tplc="0C090001" w:tentative="1">
+      <w:start w:val="1"/>
+      <w:numFmt w:val="bullet"/>
+      <w:lvlText w:val=""/>
+      <w:lvlJc w:val="left"/>
+      <w:pPr>
+        <w:ind w:left="5040" w:hanging="360"/>
+      </w:pPr>
+      <w:rPr>
+        <w:rFonts w:ascii="Symbol" w:hAnsi="Symbol" w:hint="default"/>
+      </w:rPr>
+    </w:lvl>
+    <w:lvl w:ilvl="7" w:tplc="0C090003" w:tentative="1">
+      <w:start w:val="1"/>
+      <w:numFmt w:val="bullet"/>
+      <w:lvlText w:val="o"/>
+      <w:lvlJc w:val="left"/>
+      <w:pPr>
+        <w:ind w:left="5760" w:hanging="360"/>
+      </w:pPr>
+      <w:rPr>
+        <w:rFonts w:ascii="Courier New" w:hAnsi="Courier New" w:cs="Courier New" w:hint="default"/>
+      </w:rPr>
+    </w:lvl>
+    <w:lvl w:ilvl="8" w:tplc="0C090005" w:tentative="1">
+      <w:start w:val="1"/>
+      <w:numFmt w:val="bullet"/>
+      <w:lvlText w:val=""/>
+      <w:lvlJc w:val="left"/>
+      <w:pPr>
+        <w:ind w:left="6480" w:hanging="360"/>
+      </w:pPr>
+      <w:rPr>
+        <w:rFonts w:ascii="Wingdings" w:hAnsi="Wingdings" w:hint="default"/>
+      </w:rPr>
+    </w:lvl>
+  </w:abstractNum>
+  <w:abstractNum w:abstractNumId="16" w15:restartNumberingAfterBreak="0">
     <w:nsid w:val="3C5C6580"/>
     <w:multiLevelType w:val="hybridMultilevel"/>
     <w:tmpl w:val="6874B70A"/>
@@ -4128,7 +4237,7 @@
       </w:rPr>
     </w:lvl>
   </w:abstractNum>
-  <w:abstractNum w:abstractNumId="16" w15:restartNumberingAfterBreak="0">
+  <w:abstractNum w:abstractNumId="17" w15:restartNumberingAfterBreak="0">
     <w:nsid w:val="4691596C"/>
     <w:multiLevelType w:val="hybridMultilevel"/>
     <w:tmpl w:val="ECEEF302"/>
@@ -4240,7 +4349,7 @@
       </w:rPr>
     </w:lvl>
   </w:abstractNum>
-  <w:abstractNum w:abstractNumId="17" w15:restartNumberingAfterBreak="0">
+  <w:abstractNum w:abstractNumId="18" w15:restartNumberingAfterBreak="0">
     <w:nsid w:val="47F951B0"/>
     <w:multiLevelType w:val="multilevel"/>
     <w:tmpl w:val="00D8A7E8"/>
@@ -4326,7 +4435,7 @@
       </w:pPr>
     </w:lvl>
   </w:abstractNum>
-  <w:abstractNum w:abstractNumId="18" w15:restartNumberingAfterBreak="0">
+  <w:abstractNum w:abstractNumId="19" w15:restartNumberingAfterBreak="0">
     <w:nsid w:val="4A9D1EBF"/>
     <w:multiLevelType w:val="hybridMultilevel"/>
     <w:tmpl w:val="3DEACDCC"/>
@@ -4438,7 +4547,7 @@
       </w:rPr>
     </w:lvl>
   </w:abstractNum>
-  <w:abstractNum w:abstractNumId="19" w15:restartNumberingAfterBreak="0">
+  <w:abstractNum w:abstractNumId="20" w15:restartNumberingAfterBreak="0">
     <w:nsid w:val="4D6E34D5"/>
     <w:multiLevelType w:val="hybridMultilevel"/>
     <w:tmpl w:val="6BC866D0"/>
@@ -4550,7 +4659,7 @@
       </w:rPr>
     </w:lvl>
   </w:abstractNum>
-  <w:abstractNum w:abstractNumId="20" w15:restartNumberingAfterBreak="0">
+  <w:abstractNum w:abstractNumId="21" w15:restartNumberingAfterBreak="0">
     <w:nsid w:val="52606647"/>
     <w:multiLevelType w:val="hybridMultilevel"/>
     <w:tmpl w:val="34FAD1A0"/>
@@ -4662,7 +4771,7 @@
       </w:rPr>
     </w:lvl>
   </w:abstractNum>
-  <w:abstractNum w:abstractNumId="21" w15:restartNumberingAfterBreak="0">
+  <w:abstractNum w:abstractNumId="22" w15:restartNumberingAfterBreak="0">
     <w:nsid w:val="557D5C95"/>
     <w:multiLevelType w:val="hybridMultilevel"/>
     <w:tmpl w:val="DC122E1C"/>
@@ -4774,7 +4883,7 @@
       </w:rPr>
     </w:lvl>
   </w:abstractNum>
-  <w:abstractNum w:abstractNumId="22" w15:restartNumberingAfterBreak="0">
+  <w:abstractNum w:abstractNumId="23" w15:restartNumberingAfterBreak="0">
     <w:nsid w:val="589D37B7"/>
     <w:multiLevelType w:val="hybridMultilevel"/>
     <w:tmpl w:val="9262429A"/>
@@ -4886,7 +4995,7 @@
       </w:rPr>
     </w:lvl>
   </w:abstractNum>
-  <w:abstractNum w:abstractNumId="23" w15:restartNumberingAfterBreak="0">
+  <w:abstractNum w:abstractNumId="24" w15:restartNumberingAfterBreak="0">
     <w:nsid w:val="58AA443D"/>
     <w:multiLevelType w:val="hybridMultilevel"/>
     <w:tmpl w:val="56F0D18E"/>
@@ -4999,7 +5108,7 @@
       </w:rPr>
     </w:lvl>
   </w:abstractNum>
-  <w:abstractNum w:abstractNumId="24" w15:restartNumberingAfterBreak="0">
+  <w:abstractNum w:abstractNumId="25" w15:restartNumberingAfterBreak="0">
     <w:nsid w:val="5B4B0EE2"/>
     <w:multiLevelType w:val="hybridMultilevel"/>
     <w:tmpl w:val="E8129FD8"/>
@@ -5111,7 +5220,7 @@
       </w:rPr>
     </w:lvl>
   </w:abstractNum>
-  <w:abstractNum w:abstractNumId="25" w15:restartNumberingAfterBreak="0">
+  <w:abstractNum w:abstractNumId="26" w15:restartNumberingAfterBreak="0">
     <w:nsid w:val="5C8347BF"/>
     <w:multiLevelType w:val="hybridMultilevel"/>
     <w:tmpl w:val="D2F46B88"/>
@@ -5223,7 +5332,7 @@
       </w:rPr>
     </w:lvl>
   </w:abstractNum>
-  <w:abstractNum w:abstractNumId="26" w15:restartNumberingAfterBreak="0">
+  <w:abstractNum w:abstractNumId="27" w15:restartNumberingAfterBreak="0">
     <w:nsid w:val="6A047A76"/>
     <w:multiLevelType w:val="hybridMultilevel"/>
     <w:tmpl w:val="50CADEB2"/>
@@ -5335,7 +5444,7 @@
       </w:rPr>
     </w:lvl>
   </w:abstractNum>
-  <w:abstractNum w:abstractNumId="27" w15:restartNumberingAfterBreak="0">
+  <w:abstractNum w:abstractNumId="28" w15:restartNumberingAfterBreak="0">
     <w:nsid w:val="6AC268F7"/>
     <w:multiLevelType w:val="hybridMultilevel"/>
     <w:tmpl w:val="12F21194"/>
@@ -5447,7 +5556,7 @@
       </w:rPr>
     </w:lvl>
   </w:abstractNum>
-  <w:abstractNum w:abstractNumId="28" w15:restartNumberingAfterBreak="0">
+  <w:abstractNum w:abstractNumId="29" w15:restartNumberingAfterBreak="0">
     <w:nsid w:val="6CE7392E"/>
     <w:multiLevelType w:val="hybridMultilevel"/>
     <w:tmpl w:val="2E2C9BDE"/>
@@ -5559,7 +5668,7 @@
       </w:rPr>
     </w:lvl>
   </w:abstractNum>
-  <w:abstractNum w:abstractNumId="29" w15:restartNumberingAfterBreak="0">
+  <w:abstractNum w:abstractNumId="30" w15:restartNumberingAfterBreak="0">
     <w:nsid w:val="7D5B508C"/>
     <w:multiLevelType w:val="hybridMultilevel"/>
     <w:tmpl w:val="7FAC5656"/>
@@ -5673,49 +5782,49 @@
     </w:lvl>
   </w:abstractNum>
   <w:num w:numId="1">
-    <w:abstractNumId w:val="17"/>
+    <w:abstractNumId w:val="18"/>
   </w:num>
   <w:num w:numId="2">
     <w:abstractNumId w:val="14"/>
   </w:num>
   <w:num w:numId="3">
-    <w:abstractNumId w:val="19"/>
+    <w:abstractNumId w:val="20"/>
   </w:num>
   <w:num w:numId="4">
     <w:abstractNumId w:val="2"/>
   </w:num>
   <w:num w:numId="5">
-    <w:abstractNumId w:val="25"/>
+    <w:abstractNumId w:val="26"/>
   </w:num>
   <w:num w:numId="6">
-    <w:abstractNumId w:val="22"/>
+    <w:abstractNumId w:val="23"/>
   </w:num>
   <w:num w:numId="7">
     <w:abstractNumId w:val="9"/>
   </w:num>
   <w:num w:numId="8">
-    <w:abstractNumId w:val="20"/>
+    <w:abstractNumId w:val="21"/>
   </w:num>
   <w:num w:numId="9">
     <w:abstractNumId w:val="12"/>
   </w:num>
   <w:num w:numId="10">
-    <w:abstractNumId w:val="21"/>
+    <w:abstractNumId w:val="22"/>
   </w:num>
   <w:num w:numId="11">
-    <w:abstractNumId w:val="23"/>
+    <w:abstractNumId w:val="24"/>
   </w:num>
   <w:num w:numId="12">
+    <w:abstractNumId w:val="17"/>
+  </w:num>
+  <w:num w:numId="13">
+    <w:abstractNumId w:val="30"/>
+  </w:num>
+  <w:num w:numId="14">
     <w:abstractNumId w:val="16"/>
   </w:num>
-  <w:num w:numId="13">
-    <w:abstractNumId w:val="29"/>
-  </w:num>
-  <w:num w:numId="14">
-    <w:abstractNumId w:val="15"/>
-  </w:num>
   <w:num w:numId="15">
-    <w:abstractNumId w:val="27"/>
+    <w:abstractNumId w:val="28"/>
   </w:num>
   <w:num w:numId="16">
     <w:abstractNumId w:val="3"/>
@@ -5736,10 +5845,10 @@
     <w:abstractNumId w:val="1"/>
   </w:num>
   <w:num w:numId="22">
-    <w:abstractNumId w:val="26"/>
+    <w:abstractNumId w:val="27"/>
   </w:num>
   <w:num w:numId="23">
-    <w:abstractNumId w:val="28"/>
+    <w:abstractNumId w:val="29"/>
   </w:num>
   <w:num w:numId="24">
     <w:abstractNumId w:val="8"/>
@@ -5751,16 +5860,19 @@
     <w:abstractNumId w:val="4"/>
   </w:num>
   <w:num w:numId="27">
-    <w:abstractNumId w:val="24"/>
+    <w:abstractNumId w:val="25"/>
   </w:num>
   <w:num w:numId="28">
-    <w:abstractNumId w:val="18"/>
+    <w:abstractNumId w:val="19"/>
   </w:num>
   <w:num w:numId="29">
     <w:abstractNumId w:val="11"/>
   </w:num>
   <w:num w:numId="30">
     <w:abstractNumId w:val="7"/>
+  </w:num>
+  <w:num w:numId="31">
+    <w:abstractNumId w:val="15"/>
   </w:num>
 </w:numbering>
 </file>

</xml_diff>

<commit_message>
- updated change log
</commit_message>
<xml_diff>
--- a/BluePrints/Views/ChangeLog.docx
+++ b/BluePrints/Views/ChangeLog.docx
@@ -12,6 +12,193 @@
         <w:rPr>
           <w:lang w:val="en-US"/>
         </w:rPr>
+        <w:t>Change Log 13</w:t>
+      </w:r>
+      <w:r>
+        <w:rPr>
+          <w:vertAlign w:val="superscript"/>
+          <w:lang w:val="en-US"/>
+        </w:rPr>
+        <w:t>th</w:t>
+      </w:r>
+      <w:r>
+        <w:rPr>
+          <w:lang w:val="en-US"/>
+        </w:rPr>
+        <w:t xml:space="preserve"> Jan 2021</w:t>
+      </w:r>
+    </w:p>
+    <w:p>
+      <w:pPr>
+        <w:pStyle w:val="ListParagraph"/>
+        <w:numPr>
+          <w:ilvl w:val="0"/>
+          <w:numId w:val="33"/>
+        </w:numPr>
+        <w:rPr>
+          <w:lang w:val="en-US"/>
+        </w:rPr>
+      </w:pPr>
+      <w:r>
+        <w:rPr>
+          <w:lang w:val="en-US"/>
+        </w:rPr>
+        <w:t>Register -&gt; Change Register</w:t>
+      </w:r>
+    </w:p>
+    <w:p>
+      <w:pPr>
+        <w:pStyle w:val="ListParagraph"/>
+        <w:numPr>
+          <w:ilvl w:val="1"/>
+          <w:numId w:val="33"/>
+        </w:numPr>
+        <w:rPr>
+          <w:lang w:val="en-US"/>
+        </w:rPr>
+      </w:pPr>
+      <w:r>
+        <w:rPr>
+          <w:lang w:val="en-US"/>
+        </w:rPr>
+        <w:t>Added design change notice</w:t>
+      </w:r>
+    </w:p>
+    <w:p>
+      <w:pPr>
+        <w:pStyle w:val="ListParagraph"/>
+        <w:ind w:left="1440"/>
+        <w:rPr>
+          <w:lang w:val="en-US"/>
+        </w:rPr>
+      </w:pPr>
+      <w:r>
+        <w:rPr>
+          <w:noProof/>
+          <w:lang w:val="en-US"/>
+        </w:rPr>
+        <w:drawing>
+          <wp:inline distT="0" distB="0" distL="0" distR="0" wp14:anchorId="2C862980" wp14:editId="75BC0CF7">
+            <wp:extent cx="5730875" cy="1765300"/>
+            <wp:effectExtent l="0" t="0" r="3175" b="6350"/>
+            <wp:docPr id="5" name="Picture 5"/>
+            <wp:cNvGraphicFramePr>
+              <a:graphicFrameLocks xmlns:a="http://schemas.openxmlformats.org/drawingml/2006/main" noChangeAspect="1"/>
+            </wp:cNvGraphicFramePr>
+            <a:graphic xmlns:a="http://schemas.openxmlformats.org/drawingml/2006/main">
+              <a:graphicData uri="http://schemas.openxmlformats.org/drawingml/2006/picture">
+                <pic:pic xmlns:pic="http://schemas.openxmlformats.org/drawingml/2006/picture">
+                  <pic:nvPicPr>
+                    <pic:cNvPr id="0" name="Picture 1"/>
+                    <pic:cNvPicPr>
+                      <a:picLocks noChangeAspect="1" noChangeArrowheads="1"/>
+                    </pic:cNvPicPr>
+                  </pic:nvPicPr>
+                  <pic:blipFill>
+                    <a:blip r:embed="rId5" cstate="print">
+                      <a:extLst>
+                        <a:ext uri="{28A0092B-C50C-407E-A947-70E740481C1C}">
+                          <a14:useLocalDpi xmlns:a14="http://schemas.microsoft.com/office/drawing/2010/main" val="0"/>
+                        </a:ext>
+                      </a:extLst>
+                    </a:blip>
+                    <a:srcRect/>
+                    <a:stretch>
+                      <a:fillRect/>
+                    </a:stretch>
+                  </pic:blipFill>
+                  <pic:spPr bwMode="auto">
+                    <a:xfrm>
+                      <a:off x="0" y="0"/>
+                      <a:ext cx="5730875" cy="1765300"/>
+                    </a:xfrm>
+                    <a:prstGeom prst="rect">
+                      <a:avLst/>
+                    </a:prstGeom>
+                    <a:noFill/>
+                    <a:ln>
+                      <a:noFill/>
+                    </a:ln>
+                  </pic:spPr>
+                </pic:pic>
+              </a:graphicData>
+            </a:graphic>
+          </wp:inline>
+        </w:drawing>
+      </w:r>
+    </w:p>
+    <w:p>
+      <w:pPr>
+        <w:ind w:left="720" w:firstLine="720"/>
+        <w:rPr>
+          <w:lang w:val="en-US"/>
+        </w:rPr>
+      </w:pPr>
+      <w:r>
+        <w:rPr>
+          <w:noProof/>
+          <w:lang w:val="en-US"/>
+        </w:rPr>
+        <w:drawing>
+          <wp:inline distT="0" distB="0" distL="0" distR="0" wp14:anchorId="22511AB3" wp14:editId="71FF1C45">
+            <wp:extent cx="5730875" cy="5092700"/>
+            <wp:effectExtent l="0" t="0" r="3175" b="0"/>
+            <wp:docPr id="6" name="Picture 6"/>
+            <wp:cNvGraphicFramePr>
+              <a:graphicFrameLocks xmlns:a="http://schemas.openxmlformats.org/drawingml/2006/main" noChangeAspect="1"/>
+            </wp:cNvGraphicFramePr>
+            <a:graphic xmlns:a="http://schemas.openxmlformats.org/drawingml/2006/main">
+              <a:graphicData uri="http://schemas.openxmlformats.org/drawingml/2006/picture">
+                <pic:pic xmlns:pic="http://schemas.openxmlformats.org/drawingml/2006/picture">
+                  <pic:nvPicPr>
+                    <pic:cNvPr id="0" name="Picture 2"/>
+                    <pic:cNvPicPr>
+                      <a:picLocks noChangeAspect="1" noChangeArrowheads="1"/>
+                    </pic:cNvPicPr>
+                  </pic:nvPicPr>
+                  <pic:blipFill>
+                    <a:blip r:embed="rId6">
+                      <a:extLst>
+                        <a:ext uri="{28A0092B-C50C-407E-A947-70E740481C1C}">
+                          <a14:useLocalDpi xmlns:a14="http://schemas.microsoft.com/office/drawing/2010/main" val="0"/>
+                        </a:ext>
+                      </a:extLst>
+                    </a:blip>
+                    <a:srcRect/>
+                    <a:stretch>
+                      <a:fillRect/>
+                    </a:stretch>
+                  </pic:blipFill>
+                  <pic:spPr bwMode="auto">
+                    <a:xfrm>
+                      <a:off x="0" y="0"/>
+                      <a:ext cx="5730875" cy="5092700"/>
+                    </a:xfrm>
+                    <a:prstGeom prst="rect">
+                      <a:avLst/>
+                    </a:prstGeom>
+                    <a:noFill/>
+                    <a:ln>
+                      <a:noFill/>
+                    </a:ln>
+                  </pic:spPr>
+                </pic:pic>
+              </a:graphicData>
+            </a:graphic>
+          </wp:inline>
+        </w:drawing>
+      </w:r>
+    </w:p>
+    <w:p>
+      <w:pPr>
+        <w:rPr>
+          <w:lang w:val="en-US"/>
+        </w:rPr>
+      </w:pPr>
+      <w:r>
+        <w:rPr>
+          <w:lang w:val="en-US"/>
+        </w:rPr>
         <w:t>Change Log 8</w:t>
       </w:r>
       <w:r>
@@ -77,6 +264,7 @@
           <w:noProof/>
           <w:lang w:val="en-US"/>
         </w:rPr>
+        <w:lastRenderedPageBreak/>
         <w:drawing>
           <wp:inline distT="0" distB="0" distL="0" distR="0" wp14:anchorId="7DCB3097" wp14:editId="60AEE04D">
             <wp:extent cx="5731510" cy="1684020"/>
@@ -95,7 +283,7 @@
                     </pic:cNvPicPr>
                   </pic:nvPicPr>
                   <pic:blipFill>
-                    <a:blip r:embed="rId5">
+                    <a:blip r:embed="rId7">
                       <a:extLst>
                         <a:ext uri="{28A0092B-C50C-407E-A947-70E740481C1C}">
                           <a14:useLocalDpi xmlns:a14="http://schemas.microsoft.com/office/drawing/2010/main" val="0"/>
@@ -194,7 +382,7 @@
                     </pic:cNvPicPr>
                   </pic:nvPicPr>
                   <pic:blipFill>
-                    <a:blip r:embed="rId6">
+                    <a:blip r:embed="rId8">
                       <a:extLst>
                         <a:ext uri="{28A0092B-C50C-407E-A947-70E740481C1C}">
                           <a14:useLocalDpi xmlns:a14="http://schemas.microsoft.com/office/drawing/2010/main" val="0"/>
@@ -257,7 +445,7 @@
                     </pic:cNvPicPr>
                   </pic:nvPicPr>
                   <pic:blipFill>
-                    <a:blip r:embed="rId7">
+                    <a:blip r:embed="rId9">
                       <a:extLst>
                         <a:ext uri="{28A0092B-C50C-407E-A947-70E740481C1C}">
                           <a14:useLocalDpi xmlns:a14="http://schemas.microsoft.com/office/drawing/2010/main" val="0"/>
@@ -299,7 +487,6 @@
         <w:rPr>
           <w:lang w:val="en-US"/>
         </w:rPr>
-        <w:lastRenderedPageBreak/>
         <w:t>Change Log 12</w:t>
       </w:r>
       <w:r>
@@ -382,6 +569,7 @@
         <w:rPr>
           <w:lang w:val="en-US"/>
         </w:rPr>
+        <w:lastRenderedPageBreak/>
         <w:t>Change Log 5</w:t>
       </w:r>
       <w:r>
@@ -489,7 +677,7 @@
                     </pic:cNvPicPr>
                   </pic:nvPicPr>
                   <pic:blipFill>
-                    <a:blip r:embed="rId8">
+                    <a:blip r:embed="rId10">
                       <a:extLst>
                         <a:ext uri="{28A0092B-C50C-407E-A947-70E740481C1C}">
                           <a14:useLocalDpi xmlns:a14="http://schemas.microsoft.com/office/drawing/2010/main" val="0"/>
@@ -676,7 +864,6 @@
         <w:rPr>
           <w:lang w:val="en-US"/>
         </w:rPr>
-        <w:lastRenderedPageBreak/>
         <w:t>Variation codes are pushes with</w:t>
       </w:r>
       <w:r>
@@ -765,6 +952,7 @@
         <w:rPr>
           <w:lang w:val="en-US"/>
         </w:rPr>
+        <w:lastRenderedPageBreak/>
         <w:t>A</w:t>
       </w:r>
       <w:r>
@@ -955,21 +1143,7 @@
         <w:rPr>
           <w:lang w:val="en-US"/>
         </w:rPr>
-        <w:t xml:space="preserve">how empty cost group and cost type in forecast to </w:t>
-      </w:r>
-      <w:proofErr w:type="spellStart"/>
-      <w:r>
-        <w:rPr>
-          <w:lang w:val="en-US"/>
-        </w:rPr>
-        <w:t>accomodate</w:t>
-      </w:r>
-      <w:proofErr w:type="spellEnd"/>
-      <w:r>
-        <w:rPr>
-          <w:lang w:val="en-US"/>
-        </w:rPr>
-        <w:t xml:space="preserve"> variations without cost group and cost type coming from construction variation module</w:t>
+        <w:t>how empty cost group and cost type in forecast to accomodate variations without cost group and cost type coming from construction variation module</w:t>
       </w:r>
     </w:p>
     <w:p>
@@ -1574,6 +1748,7 @@
         <w:rPr>
           <w:lang w:val="en-US"/>
         </w:rPr>
+        <w:lastRenderedPageBreak/>
         <w:t>Construction -&gt; Variation</w:t>
       </w:r>
     </w:p>
@@ -1603,7 +1778,7 @@
           <w:lang w:val="en-US"/>
         </w:rPr>
       </w:pPr>
-      <w:hyperlink r:id="rId9" w:history="1">
+      <w:hyperlink r:id="rId11" w:history="1">
         <w:r>
           <w:rPr>
             <w:rStyle w:val="Hyperlink"/>
@@ -1672,21 +1847,7 @@
         <w:rPr>
           <w:lang w:val="en-US"/>
         </w:rPr>
-        <w:t xml:space="preserve">Added column to show actual </w:t>
-      </w:r>
-      <w:proofErr w:type="spellStart"/>
-      <w:r>
-        <w:rPr>
-          <w:lang w:val="en-US"/>
-        </w:rPr>
-        <w:t>labour</w:t>
-      </w:r>
-      <w:proofErr w:type="spellEnd"/>
-      <w:r>
-        <w:rPr>
-          <w:lang w:val="en-US"/>
-        </w:rPr>
-        <w:t xml:space="preserve"> units post data date</w:t>
+        <w:t>Added column to show actual labour units post data date</w:t>
       </w:r>
     </w:p>
     <w:p>
@@ -1896,7 +2057,7 @@
           <w:lang w:val="en-US"/>
         </w:rPr>
       </w:pPr>
-      <w:hyperlink r:id="rId10" w:history="1">
+      <w:hyperlink r:id="rId12" w:history="1">
         <w:r>
           <w:rPr>
             <w:rStyle w:val="Hyperlink"/>
@@ -1976,7 +2137,7 @@
           <w:lang w:val="en-US"/>
         </w:rPr>
       </w:pPr>
-      <w:hyperlink r:id="rId11" w:history="1">
+      <w:hyperlink r:id="rId13" w:history="1">
         <w:r>
           <w:rPr>
             <w:rStyle w:val="Hyperlink"/>
@@ -2179,7 +2340,6 @@
         <w:rPr>
           <w:lang w:val="en-US"/>
         </w:rPr>
-        <w:lastRenderedPageBreak/>
         <w:t>Change Log 3</w:t>
       </w:r>
       <w:r>
@@ -2235,21 +2395,7 @@
         <w:rPr>
           <w:lang w:val="en-US"/>
         </w:rPr>
-        <w:t xml:space="preserve">ixed an issue where </w:t>
-      </w:r>
-      <w:proofErr w:type="spellStart"/>
-      <w:r>
-        <w:rPr>
-          <w:lang w:val="en-US"/>
-        </w:rPr>
-        <w:t>subjob</w:t>
-      </w:r>
-      <w:proofErr w:type="spellEnd"/>
-      <w:r>
-        <w:rPr>
-          <w:lang w:val="en-US"/>
-        </w:rPr>
-        <w:t xml:space="preserve"> variation code </w:t>
+        <w:t xml:space="preserve">ixed an issue where subjob variation code </w:t>
       </w:r>
       <w:proofErr w:type="gramStart"/>
       <w:r>
@@ -2325,6 +2471,7 @@
         <w:rPr>
           <w:lang w:val="en-US"/>
         </w:rPr>
+        <w:lastRenderedPageBreak/>
         <w:t>Try to fix an issue where module loads partial data</w:t>
       </w:r>
     </w:p>
@@ -2539,35 +2686,7 @@
         <w:rPr>
           <w:rFonts w:cs="Calibri"/>
         </w:rPr>
-        <w:t xml:space="preserve">Editing Exo -&gt; Transaction quantity will adjust line cost, line charge, line total, line total tax, line tax and </w:t>
-      </w:r>
-      <w:proofErr w:type="spellStart"/>
-      <w:r>
-        <w:rPr>
-          <w:rFonts w:cs="Calibri"/>
-        </w:rPr>
-        <w:t>linetotal</w:t>
-      </w:r>
-      <w:proofErr w:type="spellEnd"/>
-      <w:r>
-        <w:rPr>
-          <w:rFonts w:cs="Calibri"/>
-        </w:rPr>
-        <w:t xml:space="preserve"> </w:t>
-      </w:r>
-      <w:proofErr w:type="spellStart"/>
-      <w:r>
-        <w:rPr>
-          <w:rFonts w:cs="Calibri"/>
-        </w:rPr>
-        <w:t>incl</w:t>
-      </w:r>
-      <w:proofErr w:type="spellEnd"/>
-      <w:r>
-        <w:rPr>
-          <w:rFonts w:cs="Calibri"/>
-        </w:rPr>
-        <w:t xml:space="preserve"> tax in EXO</w:t>
+        <w:t>Editing Exo -&gt; Transaction quantity will adjust line cost, line charge, line total, line total tax, line tax and linetotal incl tax in EXO</w:t>
       </w:r>
     </w:p>
     <w:p>
@@ -2806,7 +2925,7 @@
           <w:lang w:val="en-US"/>
         </w:rPr>
       </w:pPr>
-      <w:hyperlink r:id="rId12" w:history="1">
+      <w:hyperlink r:id="rId14" w:history="1">
         <w:r>
           <w:rPr>
             <w:rStyle w:val="Hyperlink"/>
@@ -6279,6 +6398,118 @@
     </w:lvl>
   </w:abstractNum>
   <w:abstractNum w:abstractNumId="31" w15:restartNumberingAfterBreak="0">
+    <w:nsid w:val="6E3F3F9F"/>
+    <w:multiLevelType w:val="hybridMultilevel"/>
+    <w:tmpl w:val="A13CFC48"/>
+    <w:lvl w:ilvl="0" w:tplc="7BDC14A8">
+      <w:numFmt w:val="bullet"/>
+      <w:lvlText w:val="-"/>
+      <w:lvlJc w:val="left"/>
+      <w:pPr>
+        <w:ind w:left="720" w:hanging="360"/>
+      </w:pPr>
+      <w:rPr>
+        <w:rFonts w:ascii="Calibri" w:eastAsiaTheme="minorEastAsia" w:hAnsi="Calibri" w:cs="Calibri" w:hint="default"/>
+      </w:rPr>
+    </w:lvl>
+    <w:lvl w:ilvl="1" w:tplc="44090003">
+      <w:start w:val="1"/>
+      <w:numFmt w:val="bullet"/>
+      <w:lvlText w:val="o"/>
+      <w:lvlJc w:val="left"/>
+      <w:pPr>
+        <w:ind w:left="1440" w:hanging="360"/>
+      </w:pPr>
+      <w:rPr>
+        <w:rFonts w:ascii="Courier New" w:hAnsi="Courier New" w:cs="Courier New" w:hint="default"/>
+      </w:rPr>
+    </w:lvl>
+    <w:lvl w:ilvl="2" w:tplc="44090005" w:tentative="1">
+      <w:start w:val="1"/>
+      <w:numFmt w:val="bullet"/>
+      <w:lvlText w:val=""/>
+      <w:lvlJc w:val="left"/>
+      <w:pPr>
+        <w:ind w:left="2160" w:hanging="360"/>
+      </w:pPr>
+      <w:rPr>
+        <w:rFonts w:ascii="Wingdings" w:hAnsi="Wingdings" w:hint="default"/>
+      </w:rPr>
+    </w:lvl>
+    <w:lvl w:ilvl="3" w:tplc="44090001" w:tentative="1">
+      <w:start w:val="1"/>
+      <w:numFmt w:val="bullet"/>
+      <w:lvlText w:val=""/>
+      <w:lvlJc w:val="left"/>
+      <w:pPr>
+        <w:ind w:left="2880" w:hanging="360"/>
+      </w:pPr>
+      <w:rPr>
+        <w:rFonts w:ascii="Symbol" w:hAnsi="Symbol" w:hint="default"/>
+      </w:rPr>
+    </w:lvl>
+    <w:lvl w:ilvl="4" w:tplc="44090003" w:tentative="1">
+      <w:start w:val="1"/>
+      <w:numFmt w:val="bullet"/>
+      <w:lvlText w:val="o"/>
+      <w:lvlJc w:val="left"/>
+      <w:pPr>
+        <w:ind w:left="3600" w:hanging="360"/>
+      </w:pPr>
+      <w:rPr>
+        <w:rFonts w:ascii="Courier New" w:hAnsi="Courier New" w:cs="Courier New" w:hint="default"/>
+      </w:rPr>
+    </w:lvl>
+    <w:lvl w:ilvl="5" w:tplc="44090005" w:tentative="1">
+      <w:start w:val="1"/>
+      <w:numFmt w:val="bullet"/>
+      <w:lvlText w:val=""/>
+      <w:lvlJc w:val="left"/>
+      <w:pPr>
+        <w:ind w:left="4320" w:hanging="360"/>
+      </w:pPr>
+      <w:rPr>
+        <w:rFonts w:ascii="Wingdings" w:hAnsi="Wingdings" w:hint="default"/>
+      </w:rPr>
+    </w:lvl>
+    <w:lvl w:ilvl="6" w:tplc="44090001" w:tentative="1">
+      <w:start w:val="1"/>
+      <w:numFmt w:val="bullet"/>
+      <w:lvlText w:val=""/>
+      <w:lvlJc w:val="left"/>
+      <w:pPr>
+        <w:ind w:left="5040" w:hanging="360"/>
+      </w:pPr>
+      <w:rPr>
+        <w:rFonts w:ascii="Symbol" w:hAnsi="Symbol" w:hint="default"/>
+      </w:rPr>
+    </w:lvl>
+    <w:lvl w:ilvl="7" w:tplc="44090003" w:tentative="1">
+      <w:start w:val="1"/>
+      <w:numFmt w:val="bullet"/>
+      <w:lvlText w:val="o"/>
+      <w:lvlJc w:val="left"/>
+      <w:pPr>
+        <w:ind w:left="5760" w:hanging="360"/>
+      </w:pPr>
+      <w:rPr>
+        <w:rFonts w:ascii="Courier New" w:hAnsi="Courier New" w:cs="Courier New" w:hint="default"/>
+      </w:rPr>
+    </w:lvl>
+    <w:lvl w:ilvl="8" w:tplc="44090005" w:tentative="1">
+      <w:start w:val="1"/>
+      <w:numFmt w:val="bullet"/>
+      <w:lvlText w:val=""/>
+      <w:lvlJc w:val="left"/>
+      <w:pPr>
+        <w:ind w:left="6480" w:hanging="360"/>
+      </w:pPr>
+      <w:rPr>
+        <w:rFonts w:ascii="Wingdings" w:hAnsi="Wingdings" w:hint="default"/>
+      </w:rPr>
+    </w:lvl>
+  </w:abstractNum>
+  <w:abstractNum w:abstractNumId="32" w15:restartNumberingAfterBreak="0">
     <w:nsid w:val="7D5B508C"/>
     <w:multiLevelType w:val="hybridMultilevel"/>
     <w:tmpl w:val="7FAC5656"/>
@@ -6428,7 +6659,7 @@
     <w:abstractNumId w:val="17"/>
   </w:num>
   <w:num w:numId="13">
-    <w:abstractNumId w:val="31"/>
+    <w:abstractNumId w:val="32"/>
   </w:num>
   <w:num w:numId="14">
     <w:abstractNumId w:val="16"/>
@@ -6486,6 +6717,9 @@
   </w:num>
   <w:num w:numId="32">
     <w:abstractNumId w:val="28"/>
+  </w:num>
+  <w:num w:numId="33">
+    <w:abstractNumId w:val="31"/>
   </w:num>
 </w:numbering>
 </file>

</xml_diff>

<commit_message>
- updated change log - added option to disable auto report date in progress screen
</commit_message>
<xml_diff>
--- a/BluePrints/Views/ChangeLog.docx
+++ b/BluePrints/Views/ChangeLog.docx
@@ -2,6 +2,248 @@
 <file path=word/document.xml><?xml version="1.0" encoding="utf-8"?>
 <w:document xmlns:wpc="http://schemas.microsoft.com/office/word/2010/wordprocessingCanvas" xmlns:cx="http://schemas.microsoft.com/office/drawing/2014/chartex" xmlns:cx1="http://schemas.microsoft.com/office/drawing/2015/9/8/chartex" xmlns:cx2="http://schemas.microsoft.com/office/drawing/2015/10/21/chartex" xmlns:cx3="http://schemas.microsoft.com/office/drawing/2016/5/9/chartex" xmlns:cx4="http://schemas.microsoft.com/office/drawing/2016/5/10/chartex" xmlns:cx5="http://schemas.microsoft.com/office/drawing/2016/5/11/chartex" xmlns:cx6="http://schemas.microsoft.com/office/drawing/2016/5/12/chartex" xmlns:cx7="http://schemas.microsoft.com/office/drawing/2016/5/13/chartex" xmlns:cx8="http://schemas.microsoft.com/office/drawing/2016/5/14/chartex" xmlns:mc="http://schemas.openxmlformats.org/markup-compatibility/2006" xmlns:aink="http://schemas.microsoft.com/office/drawing/2016/ink" xmlns:am3d="http://schemas.microsoft.com/office/drawing/2017/model3d" xmlns:o="urn:schemas-microsoft-com:office:office" xmlns:r="http://schemas.openxmlformats.org/officeDocument/2006/relationships" xmlns:m="http://schemas.openxmlformats.org/officeDocument/2006/math" xmlns:v="urn:schemas-microsoft-com:vml" xmlns:wp14="http://schemas.microsoft.com/office/word/2010/wordprocessingDrawing" xmlns:wp="http://schemas.openxmlformats.org/drawingml/2006/wordprocessingDrawing" xmlns:w10="urn:schemas-microsoft-com:office:word" xmlns:w="http://schemas.openxmlformats.org/wordprocessingml/2006/main" xmlns:w14="http://schemas.microsoft.com/office/word/2010/wordml" xmlns:w15="http://schemas.microsoft.com/office/word/2012/wordml" xmlns:w16cex="http://schemas.microsoft.com/office/word/2018/wordml/cex" xmlns:w16cid="http://schemas.microsoft.com/office/word/2016/wordml/cid" xmlns:w16="http://schemas.microsoft.com/office/word/2018/wordml" xmlns:w16se="http://schemas.microsoft.com/office/word/2015/wordml/symex" xmlns:wpg="http://schemas.microsoft.com/office/word/2010/wordprocessingGroup" xmlns:wpi="http://schemas.microsoft.com/office/word/2010/wordprocessingInk" xmlns:wne="http://schemas.microsoft.com/office/word/2006/wordml" xmlns:wps="http://schemas.microsoft.com/office/word/2010/wordprocessingShape" mc:Ignorable="w14 w15 w16se w16cid w16 w16cex wp14">
   <w:body>
+    <w:p>
+      <w:pPr>
+        <w:rPr>
+          <w:lang w:val="en-US"/>
+        </w:rPr>
+      </w:pPr>
+      <w:r>
+        <w:rPr>
+          <w:lang w:val="en-US"/>
+        </w:rPr>
+        <w:t>Change Log 25</w:t>
+      </w:r>
+      <w:r>
+        <w:rPr>
+          <w:vertAlign w:val="superscript"/>
+          <w:lang w:val="en-US"/>
+        </w:rPr>
+        <w:t>th</w:t>
+      </w:r>
+      <w:r>
+        <w:rPr>
+          <w:lang w:val="en-US"/>
+        </w:rPr>
+        <w:t xml:space="preserve"> Jan 2021</w:t>
+      </w:r>
+    </w:p>
+    <w:p>
+      <w:pPr>
+        <w:pStyle w:val="ListParagraph"/>
+        <w:numPr>
+          <w:ilvl w:val="0"/>
+          <w:numId w:val="34"/>
+        </w:numPr>
+        <w:rPr>
+          <w:lang w:val="en-US"/>
+        </w:rPr>
+      </w:pPr>
+      <w:r>
+        <w:rPr>
+          <w:lang w:val="en-US"/>
+        </w:rPr>
+        <w:t>Project S-Curve</w:t>
+      </w:r>
+    </w:p>
+    <w:p>
+      <w:pPr>
+        <w:pStyle w:val="ListParagraph"/>
+        <w:numPr>
+          <w:ilvl w:val="1"/>
+          <w:numId w:val="34"/>
+        </w:numPr>
+        <w:rPr>
+          <w:lang w:val="en-US"/>
+        </w:rPr>
+      </w:pPr>
+      <w:r>
+        <w:rPr>
+          <w:lang w:val="en-US"/>
+        </w:rPr>
+        <w:t>Added ability to move data date forward/backward</w:t>
+      </w:r>
+    </w:p>
+    <w:p>
+      <w:pPr>
+        <w:pStyle w:val="ListParagraph"/>
+        <w:numPr>
+          <w:ilvl w:val="1"/>
+          <w:numId w:val="34"/>
+        </w:numPr>
+        <w:rPr>
+          <w:lang w:val="en-US"/>
+        </w:rPr>
+      </w:pPr>
+      <w:r>
+        <w:rPr>
+          <w:lang w:val="en-US"/>
+        </w:rPr>
+        <w:t>Added ability to disable report date auto change to previous period ending</w:t>
+      </w:r>
+    </w:p>
+    <w:p>
+      <w:pPr>
+        <w:pStyle w:val="ListParagraph"/>
+        <w:ind w:left="1440"/>
+        <w:rPr>
+          <w:lang w:val="en-US"/>
+        </w:rPr>
+      </w:pPr>
+      <w:r>
+        <w:rPr>
+          <w:noProof/>
+          <w:lang w:val="en-US"/>
+        </w:rPr>
+        <w:drawing>
+          <wp:inline distT="0" distB="0" distL="0" distR="0" wp14:anchorId="6D0B8E94" wp14:editId="63DB6A5B">
+            <wp:extent cx="4423410" cy="329565"/>
+            <wp:effectExtent l="0" t="0" r="0" b="0"/>
+            <wp:docPr id="7" name="Picture 7"/>
+            <wp:cNvGraphicFramePr>
+              <a:graphicFrameLocks xmlns:a="http://schemas.openxmlformats.org/drawingml/2006/main" noChangeAspect="1"/>
+            </wp:cNvGraphicFramePr>
+            <a:graphic xmlns:a="http://schemas.openxmlformats.org/drawingml/2006/main">
+              <a:graphicData uri="http://schemas.openxmlformats.org/drawingml/2006/picture">
+                <pic:pic xmlns:pic="http://schemas.openxmlformats.org/drawingml/2006/picture">
+                  <pic:nvPicPr>
+                    <pic:cNvPr id="0" name="Picture 1"/>
+                    <pic:cNvPicPr>
+                      <a:picLocks noChangeAspect="1" noChangeArrowheads="1"/>
+                    </pic:cNvPicPr>
+                  </pic:nvPicPr>
+                  <pic:blipFill>
+                    <a:blip r:embed="rId5">
+                      <a:extLst>
+                        <a:ext uri="{28A0092B-C50C-407E-A947-70E740481C1C}">
+                          <a14:useLocalDpi xmlns:a14="http://schemas.microsoft.com/office/drawing/2010/main" val="0"/>
+                        </a:ext>
+                      </a:extLst>
+                    </a:blip>
+                    <a:srcRect/>
+                    <a:stretch>
+                      <a:fillRect/>
+                    </a:stretch>
+                  </pic:blipFill>
+                  <pic:spPr bwMode="auto">
+                    <a:xfrm>
+                      <a:off x="0" y="0"/>
+                      <a:ext cx="4423410" cy="329565"/>
+                    </a:xfrm>
+                    <a:prstGeom prst="rect">
+                      <a:avLst/>
+                    </a:prstGeom>
+                    <a:noFill/>
+                    <a:ln>
+                      <a:noFill/>
+                    </a:ln>
+                  </pic:spPr>
+                </pic:pic>
+              </a:graphicData>
+            </a:graphic>
+          </wp:inline>
+        </w:drawing>
+      </w:r>
+    </w:p>
+    <w:p>
+      <w:pPr>
+        <w:pStyle w:val="ListParagraph"/>
+        <w:numPr>
+          <w:ilvl w:val="0"/>
+          <w:numId w:val="34"/>
+        </w:numPr>
+        <w:rPr>
+          <w:lang w:val="en-US"/>
+        </w:rPr>
+      </w:pPr>
+      <w:r>
+        <w:rPr>
+          <w:lang w:val="en-US"/>
+        </w:rPr>
+        <w:t>Progress</w:t>
+      </w:r>
+    </w:p>
+    <w:p>
+      <w:pPr>
+        <w:pStyle w:val="ListParagraph"/>
+        <w:numPr>
+          <w:ilvl w:val="1"/>
+          <w:numId w:val="34"/>
+        </w:numPr>
+        <w:rPr>
+          <w:lang w:val="en-US"/>
+        </w:rPr>
+      </w:pPr>
+      <w:r>
+        <w:rPr>
+          <w:lang w:val="en-US"/>
+        </w:rPr>
+        <w:t>Added ability to disable report date auto change to previous period ending</w:t>
+      </w:r>
+    </w:p>
+    <w:p>
+      <w:pPr>
+        <w:pStyle w:val="ListParagraph"/>
+        <w:ind w:left="1440"/>
+        <w:rPr>
+          <w:lang w:val="en-US"/>
+        </w:rPr>
+      </w:pPr>
+      <w:r>
+        <w:rPr>
+          <w:noProof/>
+          <w:lang w:val="en-US"/>
+        </w:rPr>
+        <w:drawing>
+          <wp:inline distT="0" distB="0" distL="0" distR="0" wp14:anchorId="0CACE3D8" wp14:editId="5177CD65">
+            <wp:extent cx="5709920" cy="1839595"/>
+            <wp:effectExtent l="0" t="0" r="5080" b="8255"/>
+            <wp:docPr id="8" name="Picture 8"/>
+            <wp:cNvGraphicFramePr>
+              <a:graphicFrameLocks xmlns:a="http://schemas.openxmlformats.org/drawingml/2006/main" noChangeAspect="1"/>
+            </wp:cNvGraphicFramePr>
+            <a:graphic xmlns:a="http://schemas.openxmlformats.org/drawingml/2006/main">
+              <a:graphicData uri="http://schemas.openxmlformats.org/drawingml/2006/picture">
+                <pic:pic xmlns:pic="http://schemas.openxmlformats.org/drawingml/2006/picture">
+                  <pic:nvPicPr>
+                    <pic:cNvPr id="0" name="Picture 2"/>
+                    <pic:cNvPicPr>
+                      <a:picLocks noChangeAspect="1" noChangeArrowheads="1"/>
+                    </pic:cNvPicPr>
+                  </pic:nvPicPr>
+                  <pic:blipFill>
+                    <a:blip r:embed="rId6">
+                      <a:extLst>
+                        <a:ext uri="{28A0092B-C50C-407E-A947-70E740481C1C}">
+                          <a14:useLocalDpi xmlns:a14="http://schemas.microsoft.com/office/drawing/2010/main" val="0"/>
+                        </a:ext>
+                      </a:extLst>
+                    </a:blip>
+                    <a:srcRect/>
+                    <a:stretch>
+                      <a:fillRect/>
+                    </a:stretch>
+                  </pic:blipFill>
+                  <pic:spPr bwMode="auto">
+                    <a:xfrm>
+                      <a:off x="0" y="0"/>
+                      <a:ext cx="5709920" cy="1839595"/>
+                    </a:xfrm>
+                    <a:prstGeom prst="rect">
+                      <a:avLst/>
+                    </a:prstGeom>
+                    <a:noFill/>
+                    <a:ln>
+                      <a:noFill/>
+                    </a:ln>
+                  </pic:spPr>
+                </pic:pic>
+              </a:graphicData>
+            </a:graphic>
+          </wp:inline>
+        </w:drawing>
+      </w:r>
+    </w:p>
     <w:p>
       <w:pPr>
         <w:rPr>
@@ -95,7 +337,7 @@
                     </pic:cNvPicPr>
                   </pic:nvPicPr>
                   <pic:blipFill>
-                    <a:blip r:embed="rId5" cstate="print">
+                    <a:blip r:embed="rId7" cstate="print">
                       <a:extLst>
                         <a:ext uri="{28A0092B-C50C-407E-A947-70E740481C1C}">
                           <a14:useLocalDpi xmlns:a14="http://schemas.microsoft.com/office/drawing/2010/main" val="0"/>
@@ -139,6 +381,7 @@
           <w:noProof/>
           <w:lang w:val="en-US"/>
         </w:rPr>
+        <w:lastRenderedPageBreak/>
         <w:drawing>
           <wp:inline distT="0" distB="0" distL="0" distR="0" wp14:anchorId="22511AB3" wp14:editId="71FF1C45">
             <wp:extent cx="5730875" cy="5092700"/>
@@ -157,7 +400,7 @@
                     </pic:cNvPicPr>
                   </pic:nvPicPr>
                   <pic:blipFill>
-                    <a:blip r:embed="rId6">
+                    <a:blip r:embed="rId8">
                       <a:extLst>
                         <a:ext uri="{28A0092B-C50C-407E-A947-70E740481C1C}">
                           <a14:useLocalDpi xmlns:a14="http://schemas.microsoft.com/office/drawing/2010/main" val="0"/>
@@ -264,7 +507,6 @@
           <w:noProof/>
           <w:lang w:val="en-US"/>
         </w:rPr>
-        <w:lastRenderedPageBreak/>
         <w:drawing>
           <wp:inline distT="0" distB="0" distL="0" distR="0" wp14:anchorId="7DCB3097" wp14:editId="60AEE04D">
             <wp:extent cx="5731510" cy="1684020"/>
@@ -283,7 +525,7 @@
                     </pic:cNvPicPr>
                   </pic:nvPicPr>
                   <pic:blipFill>
-                    <a:blip r:embed="rId7">
+                    <a:blip r:embed="rId9">
                       <a:extLst>
                         <a:ext uri="{28A0092B-C50C-407E-A947-70E740481C1C}">
                           <a14:useLocalDpi xmlns:a14="http://schemas.microsoft.com/office/drawing/2010/main" val="0"/>
@@ -364,6 +606,7 @@
           <w:noProof/>
           <w:lang w:val="en-US"/>
         </w:rPr>
+        <w:lastRenderedPageBreak/>
         <w:drawing>
           <wp:inline distT="0" distB="0" distL="0" distR="0" wp14:anchorId="7A5818A9" wp14:editId="08BE196E">
             <wp:extent cx="1754505" cy="2222500"/>
@@ -382,7 +625,7 @@
                     </pic:cNvPicPr>
                   </pic:nvPicPr>
                   <pic:blipFill>
-                    <a:blip r:embed="rId8">
+                    <a:blip r:embed="rId10">
                       <a:extLst>
                         <a:ext uri="{28A0092B-C50C-407E-A947-70E740481C1C}">
                           <a14:useLocalDpi xmlns:a14="http://schemas.microsoft.com/office/drawing/2010/main" val="0"/>
@@ -445,7 +688,7 @@
                     </pic:cNvPicPr>
                   </pic:nvPicPr>
                   <pic:blipFill>
-                    <a:blip r:embed="rId9">
+                    <a:blip r:embed="rId11">
                       <a:extLst>
                         <a:ext uri="{28A0092B-C50C-407E-A947-70E740481C1C}">
                           <a14:useLocalDpi xmlns:a14="http://schemas.microsoft.com/office/drawing/2010/main" val="0"/>
@@ -542,34 +785,19 @@
         <w:rPr>
           <w:lang w:val="en-US"/>
         </w:rPr>
-        <w:t xml:space="preserve"> gates </w:t>
-      </w:r>
-      <w:proofErr w:type="gramStart"/>
-      <w:r>
-        <w:rPr>
-          <w:lang w:val="en-US"/>
-        </w:rPr>
-        <w:t>goes</w:t>
-      </w:r>
-      <w:proofErr w:type="gramEnd"/>
-      <w:r>
-        <w:rPr>
-          <w:lang w:val="en-US"/>
-        </w:rPr>
-        <w:t xml:space="preserve"> by phases to support differentiation between D1, D2</w:t>
-      </w:r>
-    </w:p>
-    <w:p>
-      <w:pPr>
-        <w:rPr>
-          <w:lang w:val="en-US"/>
-        </w:rPr>
-      </w:pPr>
-      <w:r>
-        <w:rPr>
-          <w:lang w:val="en-US"/>
-        </w:rPr>
-        <w:lastRenderedPageBreak/>
+        <w:t xml:space="preserve"> gates goes by phases to support differentiation between D1, D2</w:t>
+      </w:r>
+    </w:p>
+    <w:p>
+      <w:pPr>
+        <w:rPr>
+          <w:lang w:val="en-US"/>
+        </w:rPr>
+      </w:pPr>
+      <w:r>
+        <w:rPr>
+          <w:lang w:val="en-US"/>
+        </w:rPr>
         <w:t>Change Log 5</w:t>
       </w:r>
       <w:r>
@@ -659,6 +887,7 @@
           <w:noProof/>
           <w:lang w:val="en-US"/>
         </w:rPr>
+        <w:lastRenderedPageBreak/>
         <w:drawing>
           <wp:inline distT="0" distB="0" distL="0" distR="0" wp14:anchorId="188DA907" wp14:editId="44932F01">
             <wp:extent cx="5730875" cy="4954905"/>
@@ -677,7 +906,7 @@
                     </pic:cNvPicPr>
                   </pic:nvPicPr>
                   <pic:blipFill>
-                    <a:blip r:embed="rId10">
+                    <a:blip r:embed="rId12">
                       <a:extLst>
                         <a:ext uri="{28A0092B-C50C-407E-A947-70E740481C1C}">
                           <a14:useLocalDpi xmlns:a14="http://schemas.microsoft.com/office/drawing/2010/main" val="0"/>
@@ -876,21 +1105,7 @@
         <w:rPr>
           <w:lang w:val="en-US"/>
         </w:rPr>
-        <w:t xml:space="preserve"> so that it </w:t>
-      </w:r>
-      <w:proofErr w:type="gramStart"/>
-      <w:r>
-        <w:rPr>
-          <w:lang w:val="en-US"/>
-        </w:rPr>
-        <w:t>doesn’t</w:t>
-      </w:r>
-      <w:proofErr w:type="gramEnd"/>
-      <w:r>
-        <w:rPr>
-          <w:lang w:val="en-US"/>
-        </w:rPr>
-        <w:t xml:space="preserve"> clutter up forecast view</w:t>
+        <w:t xml:space="preserve"> so that it doesn’t clutter up forecast view</w:t>
       </w:r>
     </w:p>
     <w:p>
@@ -952,7 +1167,6 @@
         <w:rPr>
           <w:lang w:val="en-US"/>
         </w:rPr>
-        <w:lastRenderedPageBreak/>
         <w:t>A</w:t>
       </w:r>
       <w:r>
@@ -1061,21 +1275,7 @@
         <w:rPr>
           <w:lang w:val="en-US"/>
         </w:rPr>
-        <w:t xml:space="preserve">how cell error when sub job codes </w:t>
-      </w:r>
-      <w:proofErr w:type="gramStart"/>
-      <w:r>
-        <w:rPr>
-          <w:lang w:val="en-US"/>
-        </w:rPr>
-        <w:t>isn't</w:t>
-      </w:r>
-      <w:proofErr w:type="gramEnd"/>
-      <w:r>
-        <w:rPr>
-          <w:lang w:val="en-US"/>
-        </w:rPr>
-        <w:t xml:space="preserve"> valid for chosen type</w:t>
+        <w:t>how cell error when sub job codes isn't valid for chosen type</w:t>
       </w:r>
     </w:p>
     <w:p>
@@ -1119,6 +1319,7 @@
         <w:rPr>
           <w:lang w:val="en-US"/>
         </w:rPr>
+        <w:lastRenderedPageBreak/>
         <w:t>Forecast -&gt; Forecast</w:t>
       </w:r>
     </w:p>
@@ -1330,21 +1531,7 @@
         <w:rPr>
           <w:lang w:val="en-US"/>
         </w:rPr>
-        <w:t xml:space="preserve">Fixed an issue where at completion units </w:t>
-      </w:r>
-      <w:proofErr w:type="gramStart"/>
-      <w:r>
-        <w:rPr>
-          <w:lang w:val="en-US"/>
-        </w:rPr>
-        <w:t>doesn’t</w:t>
-      </w:r>
-      <w:proofErr w:type="gramEnd"/>
-      <w:r>
-        <w:rPr>
-          <w:lang w:val="en-US"/>
-        </w:rPr>
-        <w:t xml:space="preserve"> match budgeted units when pushing to P6</w:t>
+        <w:t>Fixed an issue where at completion units doesn’t match budgeted units when pushing to P6</w:t>
       </w:r>
     </w:p>
     <w:p>
@@ -1748,7 +1935,6 @@
         <w:rPr>
           <w:lang w:val="en-US"/>
         </w:rPr>
-        <w:lastRenderedPageBreak/>
         <w:t>Construction -&gt; Variation</w:t>
       </w:r>
     </w:p>
@@ -1778,7 +1964,7 @@
           <w:lang w:val="en-US"/>
         </w:rPr>
       </w:pPr>
-      <w:hyperlink r:id="rId11" w:history="1">
+      <w:hyperlink r:id="rId13" w:history="1">
         <w:r>
           <w:rPr>
             <w:rStyle w:val="Hyperlink"/>
@@ -1847,6 +2033,7 @@
         <w:rPr>
           <w:lang w:val="en-US"/>
         </w:rPr>
+        <w:lastRenderedPageBreak/>
         <w:t>Added column to show actual labour units post data date</w:t>
       </w:r>
     </w:p>
@@ -2033,21 +2220,7 @@
         <w:rPr>
           <w:lang w:val="en-US"/>
         </w:rPr>
-        <w:t xml:space="preserve">Added show variation name and approve </w:t>
-      </w:r>
-      <w:proofErr w:type="gramStart"/>
-      <w:r>
-        <w:rPr>
-          <w:lang w:val="en-US"/>
-        </w:rPr>
-        <w:t>units</w:t>
-      </w:r>
-      <w:proofErr w:type="gramEnd"/>
-      <w:r>
-        <w:rPr>
-          <w:lang w:val="en-US"/>
-        </w:rPr>
-        <w:t xml:space="preserve"> column</w:t>
+        <w:t>Added show variation name and approve units column</w:t>
       </w:r>
     </w:p>
     <w:p>
@@ -2057,7 +2230,7 @@
           <w:lang w:val="en-US"/>
         </w:rPr>
       </w:pPr>
-      <w:hyperlink r:id="rId12" w:history="1">
+      <w:hyperlink r:id="rId14" w:history="1">
         <w:r>
           <w:rPr>
             <w:rStyle w:val="Hyperlink"/>
@@ -2137,7 +2310,7 @@
           <w:lang w:val="en-US"/>
         </w:rPr>
       </w:pPr>
-      <w:hyperlink r:id="rId13" w:history="1">
+      <w:hyperlink r:id="rId15" w:history="1">
         <w:r>
           <w:rPr>
             <w:rStyle w:val="Hyperlink"/>
@@ -2283,21 +2456,7 @@
         <w:rPr>
           <w:lang w:val="en-US"/>
         </w:rPr>
-        <w:t xml:space="preserve">ixed an error where newly added user </w:t>
-      </w:r>
-      <w:proofErr w:type="gramStart"/>
-      <w:r>
-        <w:rPr>
-          <w:lang w:val="en-US"/>
-        </w:rPr>
-        <w:t>isn't</w:t>
-      </w:r>
-      <w:proofErr w:type="gramEnd"/>
-      <w:r>
-        <w:rPr>
-          <w:lang w:val="en-US"/>
-        </w:rPr>
-        <w:t xml:space="preserve"> </w:t>
+        <w:t xml:space="preserve">ixed an error where newly added user isn't </w:t>
       </w:r>
       <w:r>
         <w:rPr>
@@ -2395,21 +2554,7 @@
         <w:rPr>
           <w:lang w:val="en-US"/>
         </w:rPr>
-        <w:t xml:space="preserve">ixed an issue where subjob variation code </w:t>
-      </w:r>
-      <w:proofErr w:type="gramStart"/>
-      <w:r>
-        <w:rPr>
-          <w:lang w:val="en-US"/>
-        </w:rPr>
-        <w:t>doesn't</w:t>
-      </w:r>
-      <w:proofErr w:type="gramEnd"/>
-      <w:r>
-        <w:rPr>
-          <w:lang w:val="en-US"/>
-        </w:rPr>
-        <w:t xml:space="preserve"> show up in book time</w:t>
+        <w:t>ixed an issue where subjob variation code doesn't show up in book time</w:t>
       </w:r>
     </w:p>
     <w:p>
@@ -2471,7 +2616,6 @@
         <w:rPr>
           <w:lang w:val="en-US"/>
         </w:rPr>
-        <w:lastRenderedPageBreak/>
         <w:t>Try to fix an issue where module loads partial data</w:t>
       </w:r>
     </w:p>
@@ -2616,33 +2760,20 @@
         <w:rPr>
           <w:lang w:val="en-US"/>
         </w:rPr>
-        <w:t xml:space="preserve">llow construction jobs cells to be edited when P6 project </w:t>
-      </w:r>
-      <w:proofErr w:type="gramStart"/>
-      <w:r>
-        <w:rPr>
-          <w:lang w:val="en-US"/>
-        </w:rPr>
-        <w:t>doesn't</w:t>
-      </w:r>
-      <w:proofErr w:type="gramEnd"/>
-      <w:r>
-        <w:rPr>
-          <w:lang w:val="en-US"/>
-        </w:rPr>
-        <w:t xml:space="preserve"> exists</w:t>
-      </w:r>
-    </w:p>
-    <w:p>
-      <w:pPr>
-        <w:rPr>
-          <w:lang w:val="en-US"/>
-        </w:rPr>
-      </w:pPr>
-      <w:r>
-        <w:rPr>
-          <w:lang w:val="en-US"/>
-        </w:rPr>
+        <w:t>llow construction jobs cells to be edited when P6 project doesn't exists</w:t>
+      </w:r>
+    </w:p>
+    <w:p>
+      <w:pPr>
+        <w:rPr>
+          <w:lang w:val="en-US"/>
+        </w:rPr>
+      </w:pPr>
+      <w:r>
+        <w:rPr>
+          <w:lang w:val="en-US"/>
+        </w:rPr>
+        <w:lastRenderedPageBreak/>
         <w:t>Change Log 1</w:t>
       </w:r>
       <w:r>
@@ -2704,21 +2835,7 @@
         <w:rPr>
           <w:rFonts w:cs="Calibri"/>
         </w:rPr>
-        <w:t xml:space="preserve">narrative will be saved on day with hours so that when </w:t>
-      </w:r>
-      <w:proofErr w:type="gramStart"/>
-      <w:r>
-        <w:rPr>
-          <w:rFonts w:cs="Calibri"/>
-        </w:rPr>
-        <w:t>it’s</w:t>
-      </w:r>
-      <w:proofErr w:type="gramEnd"/>
-      <w:r>
-        <w:rPr>
-          <w:rFonts w:cs="Calibri"/>
-        </w:rPr>
-        <w:t xml:space="preserve"> approved the narrative will be transferred over</w:t>
+        <w:t>narrative will be saved on day with hours so that when it’s approved the narrative will be transferred over</w:t>
       </w:r>
     </w:p>
     <w:p>
@@ -2798,21 +2915,7 @@
         <w:rPr>
           <w:lang w:val="en-US"/>
         </w:rPr>
-        <w:t xml:space="preserve">Book Time dialog loads faster for user that </w:t>
-      </w:r>
-      <w:proofErr w:type="gramStart"/>
-      <w:r>
-        <w:rPr>
-          <w:lang w:val="en-US"/>
-        </w:rPr>
-        <w:t>doesn’t</w:t>
-      </w:r>
-      <w:proofErr w:type="gramEnd"/>
-      <w:r>
-        <w:rPr>
-          <w:lang w:val="en-US"/>
-        </w:rPr>
-        <w:t xml:space="preserve"> have authority to book time for other users</w:t>
+        <w:t>Book Time dialog loads faster for user that doesn’t have authority to book time for other users</w:t>
       </w:r>
     </w:p>
     <w:p>
@@ -2925,7 +3028,7 @@
           <w:lang w:val="en-US"/>
         </w:rPr>
       </w:pPr>
-      <w:hyperlink r:id="rId14" w:history="1">
+      <w:hyperlink r:id="rId16" w:history="1">
         <w:r>
           <w:rPr>
             <w:rStyle w:val="Hyperlink"/>
@@ -4855,6 +4958,118 @@
     </w:lvl>
   </w:abstractNum>
   <w:abstractNum w:abstractNumId="17" w15:restartNumberingAfterBreak="0">
+    <w:nsid w:val="3C704EE1"/>
+    <w:multiLevelType w:val="hybridMultilevel"/>
+    <w:tmpl w:val="41A6D382"/>
+    <w:lvl w:ilvl="0" w:tplc="06FA0EBA">
+      <w:numFmt w:val="bullet"/>
+      <w:lvlText w:val="-"/>
+      <w:lvlJc w:val="left"/>
+      <w:pPr>
+        <w:ind w:left="720" w:hanging="360"/>
+      </w:pPr>
+      <w:rPr>
+        <w:rFonts w:ascii="Calibri" w:eastAsiaTheme="minorEastAsia" w:hAnsi="Calibri" w:cs="Calibri" w:hint="default"/>
+      </w:rPr>
+    </w:lvl>
+    <w:lvl w:ilvl="1" w:tplc="44090003">
+      <w:start w:val="1"/>
+      <w:numFmt w:val="bullet"/>
+      <w:lvlText w:val="o"/>
+      <w:lvlJc w:val="left"/>
+      <w:pPr>
+        <w:ind w:left="1440" w:hanging="360"/>
+      </w:pPr>
+      <w:rPr>
+        <w:rFonts w:ascii="Courier New" w:hAnsi="Courier New" w:cs="Courier New" w:hint="default"/>
+      </w:rPr>
+    </w:lvl>
+    <w:lvl w:ilvl="2" w:tplc="44090005" w:tentative="1">
+      <w:start w:val="1"/>
+      <w:numFmt w:val="bullet"/>
+      <w:lvlText w:val=""/>
+      <w:lvlJc w:val="left"/>
+      <w:pPr>
+        <w:ind w:left="2160" w:hanging="360"/>
+      </w:pPr>
+      <w:rPr>
+        <w:rFonts w:ascii="Wingdings" w:hAnsi="Wingdings" w:hint="default"/>
+      </w:rPr>
+    </w:lvl>
+    <w:lvl w:ilvl="3" w:tplc="44090001" w:tentative="1">
+      <w:start w:val="1"/>
+      <w:numFmt w:val="bullet"/>
+      <w:lvlText w:val=""/>
+      <w:lvlJc w:val="left"/>
+      <w:pPr>
+        <w:ind w:left="2880" w:hanging="360"/>
+      </w:pPr>
+      <w:rPr>
+        <w:rFonts w:ascii="Symbol" w:hAnsi="Symbol" w:hint="default"/>
+      </w:rPr>
+    </w:lvl>
+    <w:lvl w:ilvl="4" w:tplc="44090003" w:tentative="1">
+      <w:start w:val="1"/>
+      <w:numFmt w:val="bullet"/>
+      <w:lvlText w:val="o"/>
+      <w:lvlJc w:val="left"/>
+      <w:pPr>
+        <w:ind w:left="3600" w:hanging="360"/>
+      </w:pPr>
+      <w:rPr>
+        <w:rFonts w:ascii="Courier New" w:hAnsi="Courier New" w:cs="Courier New" w:hint="default"/>
+      </w:rPr>
+    </w:lvl>
+    <w:lvl w:ilvl="5" w:tplc="44090005" w:tentative="1">
+      <w:start w:val="1"/>
+      <w:numFmt w:val="bullet"/>
+      <w:lvlText w:val=""/>
+      <w:lvlJc w:val="left"/>
+      <w:pPr>
+        <w:ind w:left="4320" w:hanging="360"/>
+      </w:pPr>
+      <w:rPr>
+        <w:rFonts w:ascii="Wingdings" w:hAnsi="Wingdings" w:hint="default"/>
+      </w:rPr>
+    </w:lvl>
+    <w:lvl w:ilvl="6" w:tplc="44090001" w:tentative="1">
+      <w:start w:val="1"/>
+      <w:numFmt w:val="bullet"/>
+      <w:lvlText w:val=""/>
+      <w:lvlJc w:val="left"/>
+      <w:pPr>
+        <w:ind w:left="5040" w:hanging="360"/>
+      </w:pPr>
+      <w:rPr>
+        <w:rFonts w:ascii="Symbol" w:hAnsi="Symbol" w:hint="default"/>
+      </w:rPr>
+    </w:lvl>
+    <w:lvl w:ilvl="7" w:tplc="44090003" w:tentative="1">
+      <w:start w:val="1"/>
+      <w:numFmt w:val="bullet"/>
+      <w:lvlText w:val="o"/>
+      <w:lvlJc w:val="left"/>
+      <w:pPr>
+        <w:ind w:left="5760" w:hanging="360"/>
+      </w:pPr>
+      <w:rPr>
+        <w:rFonts w:ascii="Courier New" w:hAnsi="Courier New" w:cs="Courier New" w:hint="default"/>
+      </w:rPr>
+    </w:lvl>
+    <w:lvl w:ilvl="8" w:tplc="44090005" w:tentative="1">
+      <w:start w:val="1"/>
+      <w:numFmt w:val="bullet"/>
+      <w:lvlText w:val=""/>
+      <w:lvlJc w:val="left"/>
+      <w:pPr>
+        <w:ind w:left="6480" w:hanging="360"/>
+      </w:pPr>
+      <w:rPr>
+        <w:rFonts w:ascii="Wingdings" w:hAnsi="Wingdings" w:hint="default"/>
+      </w:rPr>
+    </w:lvl>
+  </w:abstractNum>
+  <w:abstractNum w:abstractNumId="18" w15:restartNumberingAfterBreak="0">
     <w:nsid w:val="4691596C"/>
     <w:multiLevelType w:val="hybridMultilevel"/>
     <w:tmpl w:val="ECEEF302"/>
@@ -4966,7 +5181,7 @@
       </w:rPr>
     </w:lvl>
   </w:abstractNum>
-  <w:abstractNum w:abstractNumId="18" w15:restartNumberingAfterBreak="0">
+  <w:abstractNum w:abstractNumId="19" w15:restartNumberingAfterBreak="0">
     <w:nsid w:val="47F951B0"/>
     <w:multiLevelType w:val="multilevel"/>
     <w:tmpl w:val="00D8A7E8"/>
@@ -5052,7 +5267,7 @@
       </w:pPr>
     </w:lvl>
   </w:abstractNum>
-  <w:abstractNum w:abstractNumId="19" w15:restartNumberingAfterBreak="0">
+  <w:abstractNum w:abstractNumId="20" w15:restartNumberingAfterBreak="0">
     <w:nsid w:val="4A9D1EBF"/>
     <w:multiLevelType w:val="hybridMultilevel"/>
     <w:tmpl w:val="3DEACDCC"/>
@@ -5164,7 +5379,7 @@
       </w:rPr>
     </w:lvl>
   </w:abstractNum>
-  <w:abstractNum w:abstractNumId="20" w15:restartNumberingAfterBreak="0">
+  <w:abstractNum w:abstractNumId="21" w15:restartNumberingAfterBreak="0">
     <w:nsid w:val="4D6E34D5"/>
     <w:multiLevelType w:val="hybridMultilevel"/>
     <w:tmpl w:val="6BC866D0"/>
@@ -5276,7 +5491,7 @@
       </w:rPr>
     </w:lvl>
   </w:abstractNum>
-  <w:abstractNum w:abstractNumId="21" w15:restartNumberingAfterBreak="0">
+  <w:abstractNum w:abstractNumId="22" w15:restartNumberingAfterBreak="0">
     <w:nsid w:val="52606647"/>
     <w:multiLevelType w:val="hybridMultilevel"/>
     <w:tmpl w:val="34FAD1A0"/>
@@ -5388,7 +5603,7 @@
       </w:rPr>
     </w:lvl>
   </w:abstractNum>
-  <w:abstractNum w:abstractNumId="22" w15:restartNumberingAfterBreak="0">
+  <w:abstractNum w:abstractNumId="23" w15:restartNumberingAfterBreak="0">
     <w:nsid w:val="557D5C95"/>
     <w:multiLevelType w:val="hybridMultilevel"/>
     <w:tmpl w:val="DC122E1C"/>
@@ -5500,7 +5715,7 @@
       </w:rPr>
     </w:lvl>
   </w:abstractNum>
-  <w:abstractNum w:abstractNumId="23" w15:restartNumberingAfterBreak="0">
+  <w:abstractNum w:abstractNumId="24" w15:restartNumberingAfterBreak="0">
     <w:nsid w:val="589D37B7"/>
     <w:multiLevelType w:val="hybridMultilevel"/>
     <w:tmpl w:val="9262429A"/>
@@ -5612,7 +5827,7 @@
       </w:rPr>
     </w:lvl>
   </w:abstractNum>
-  <w:abstractNum w:abstractNumId="24" w15:restartNumberingAfterBreak="0">
+  <w:abstractNum w:abstractNumId="25" w15:restartNumberingAfterBreak="0">
     <w:nsid w:val="58AA443D"/>
     <w:multiLevelType w:val="hybridMultilevel"/>
     <w:tmpl w:val="56F0D18E"/>
@@ -5725,7 +5940,7 @@
       </w:rPr>
     </w:lvl>
   </w:abstractNum>
-  <w:abstractNum w:abstractNumId="25" w15:restartNumberingAfterBreak="0">
+  <w:abstractNum w:abstractNumId="26" w15:restartNumberingAfterBreak="0">
     <w:nsid w:val="5B4B0EE2"/>
     <w:multiLevelType w:val="hybridMultilevel"/>
     <w:tmpl w:val="E8129FD8"/>
@@ -5837,7 +6052,7 @@
       </w:rPr>
     </w:lvl>
   </w:abstractNum>
-  <w:abstractNum w:abstractNumId="26" w15:restartNumberingAfterBreak="0">
+  <w:abstractNum w:abstractNumId="27" w15:restartNumberingAfterBreak="0">
     <w:nsid w:val="5C8347BF"/>
     <w:multiLevelType w:val="hybridMultilevel"/>
     <w:tmpl w:val="D2F46B88"/>
@@ -5949,7 +6164,7 @@
       </w:rPr>
     </w:lvl>
   </w:abstractNum>
-  <w:abstractNum w:abstractNumId="27" w15:restartNumberingAfterBreak="0">
+  <w:abstractNum w:abstractNumId="28" w15:restartNumberingAfterBreak="0">
     <w:nsid w:val="6A047A76"/>
     <w:multiLevelType w:val="hybridMultilevel"/>
     <w:tmpl w:val="50CADEB2"/>
@@ -6061,7 +6276,7 @@
       </w:rPr>
     </w:lvl>
   </w:abstractNum>
-  <w:abstractNum w:abstractNumId="28" w15:restartNumberingAfterBreak="0">
+  <w:abstractNum w:abstractNumId="29" w15:restartNumberingAfterBreak="0">
     <w:nsid w:val="6A3A0B6E"/>
     <w:multiLevelType w:val="hybridMultilevel"/>
     <w:tmpl w:val="759C482E"/>
@@ -6173,7 +6388,7 @@
       </w:rPr>
     </w:lvl>
   </w:abstractNum>
-  <w:abstractNum w:abstractNumId="29" w15:restartNumberingAfterBreak="0">
+  <w:abstractNum w:abstractNumId="30" w15:restartNumberingAfterBreak="0">
     <w:nsid w:val="6AC268F7"/>
     <w:multiLevelType w:val="hybridMultilevel"/>
     <w:tmpl w:val="12F21194"/>
@@ -6285,7 +6500,7 @@
       </w:rPr>
     </w:lvl>
   </w:abstractNum>
-  <w:abstractNum w:abstractNumId="30" w15:restartNumberingAfterBreak="0">
+  <w:abstractNum w:abstractNumId="31" w15:restartNumberingAfterBreak="0">
     <w:nsid w:val="6CE7392E"/>
     <w:multiLevelType w:val="hybridMultilevel"/>
     <w:tmpl w:val="2E2C9BDE"/>
@@ -6397,7 +6612,7 @@
       </w:rPr>
     </w:lvl>
   </w:abstractNum>
-  <w:abstractNum w:abstractNumId="31" w15:restartNumberingAfterBreak="0">
+  <w:abstractNum w:abstractNumId="32" w15:restartNumberingAfterBreak="0">
     <w:nsid w:val="6E3F3F9F"/>
     <w:multiLevelType w:val="hybridMultilevel"/>
     <w:tmpl w:val="A13CFC48"/>
@@ -6509,7 +6724,7 @@
       </w:rPr>
     </w:lvl>
   </w:abstractNum>
-  <w:abstractNum w:abstractNumId="32" w15:restartNumberingAfterBreak="0">
+  <w:abstractNum w:abstractNumId="33" w15:restartNumberingAfterBreak="0">
     <w:nsid w:val="7D5B508C"/>
     <w:multiLevelType w:val="hybridMultilevel"/>
     <w:tmpl w:val="7FAC5656"/>
@@ -6623,49 +6838,49 @@
     </w:lvl>
   </w:abstractNum>
   <w:num w:numId="1">
-    <w:abstractNumId w:val="18"/>
+    <w:abstractNumId w:val="19"/>
   </w:num>
   <w:num w:numId="2">
     <w:abstractNumId w:val="14"/>
   </w:num>
   <w:num w:numId="3">
-    <w:abstractNumId w:val="20"/>
+    <w:abstractNumId w:val="21"/>
   </w:num>
   <w:num w:numId="4">
     <w:abstractNumId w:val="2"/>
   </w:num>
   <w:num w:numId="5">
-    <w:abstractNumId w:val="26"/>
+    <w:abstractNumId w:val="27"/>
   </w:num>
   <w:num w:numId="6">
-    <w:abstractNumId w:val="23"/>
+    <w:abstractNumId w:val="24"/>
   </w:num>
   <w:num w:numId="7">
     <w:abstractNumId w:val="9"/>
   </w:num>
   <w:num w:numId="8">
-    <w:abstractNumId w:val="21"/>
+    <w:abstractNumId w:val="22"/>
   </w:num>
   <w:num w:numId="9">
     <w:abstractNumId w:val="12"/>
   </w:num>
   <w:num w:numId="10">
-    <w:abstractNumId w:val="22"/>
+    <w:abstractNumId w:val="23"/>
   </w:num>
   <w:num w:numId="11">
-    <w:abstractNumId w:val="24"/>
+    <w:abstractNumId w:val="25"/>
   </w:num>
   <w:num w:numId="12">
-    <w:abstractNumId w:val="17"/>
+    <w:abstractNumId w:val="18"/>
   </w:num>
   <w:num w:numId="13">
-    <w:abstractNumId w:val="32"/>
+    <w:abstractNumId w:val="33"/>
   </w:num>
   <w:num w:numId="14">
     <w:abstractNumId w:val="16"/>
   </w:num>
   <w:num w:numId="15">
-    <w:abstractNumId w:val="29"/>
+    <w:abstractNumId w:val="30"/>
   </w:num>
   <w:num w:numId="16">
     <w:abstractNumId w:val="3"/>
@@ -6686,10 +6901,10 @@
     <w:abstractNumId w:val="1"/>
   </w:num>
   <w:num w:numId="22">
-    <w:abstractNumId w:val="27"/>
+    <w:abstractNumId w:val="28"/>
   </w:num>
   <w:num w:numId="23">
-    <w:abstractNumId w:val="30"/>
+    <w:abstractNumId w:val="31"/>
   </w:num>
   <w:num w:numId="24">
     <w:abstractNumId w:val="8"/>
@@ -6701,10 +6916,10 @@
     <w:abstractNumId w:val="4"/>
   </w:num>
   <w:num w:numId="27">
-    <w:abstractNumId w:val="25"/>
+    <w:abstractNumId w:val="26"/>
   </w:num>
   <w:num w:numId="28">
-    <w:abstractNumId w:val="19"/>
+    <w:abstractNumId w:val="20"/>
   </w:num>
   <w:num w:numId="29">
     <w:abstractNumId w:val="11"/>
@@ -6716,10 +6931,13 @@
     <w:abstractNumId w:val="15"/>
   </w:num>
   <w:num w:numId="32">
-    <w:abstractNumId w:val="28"/>
+    <w:abstractNumId w:val="29"/>
   </w:num>
   <w:num w:numId="33">
-    <w:abstractNumId w:val="31"/>
+    <w:abstractNumId w:val="32"/>
+  </w:num>
+  <w:num w:numId="34">
+    <w:abstractNumId w:val="17"/>
   </w:num>
 </w:numbering>
 </file>

</xml_diff>

<commit_message>
- added ability to save forecast to a DB to be retrieved by excel
</commit_message>
<xml_diff>
--- a/BluePrints/Views/ChangeLog.docx
+++ b/BluePrints/Views/ChangeLog.docx
@@ -12,6 +12,147 @@
         <w:rPr>
           <w:lang w:val="en-US"/>
         </w:rPr>
+        <w:t>Change Log 27</w:t>
+      </w:r>
+      <w:r>
+        <w:rPr>
+          <w:vertAlign w:val="superscript"/>
+          <w:lang w:val="en-US"/>
+        </w:rPr>
+        <w:t>th</w:t>
+      </w:r>
+      <w:r>
+        <w:rPr>
+          <w:lang w:val="en-US"/>
+        </w:rPr>
+        <w:t xml:space="preserve"> Jan </w:t>
+      </w:r>
+      <w:proofErr w:type="gramStart"/>
+      <w:r>
+        <w:rPr>
+          <w:lang w:val="en-US"/>
+        </w:rPr>
+        <w:t>2021</w:t>
+      </w:r>
+      <w:proofErr w:type="gramEnd"/>
+    </w:p>
+    <w:p>
+      <w:pPr>
+        <w:pStyle w:val="ListParagraph"/>
+        <w:numPr>
+          <w:ilvl w:val="0"/>
+          <w:numId w:val="35"/>
+        </w:numPr>
+        <w:rPr>
+          <w:lang w:val="en-US"/>
+        </w:rPr>
+      </w:pPr>
+      <w:r>
+        <w:rPr>
+          <w:lang w:val="en-US"/>
+        </w:rPr>
+        <w:t>Forecast</w:t>
+      </w:r>
+    </w:p>
+    <w:p>
+      <w:pPr>
+        <w:pStyle w:val="ListParagraph"/>
+        <w:numPr>
+          <w:ilvl w:val="1"/>
+          <w:numId w:val="35"/>
+        </w:numPr>
+        <w:rPr>
+          <w:lang w:val="en-US"/>
+        </w:rPr>
+      </w:pPr>
+      <w:r>
+        <w:rPr>
+          <w:lang w:val="en-US"/>
+        </w:rPr>
+        <w:t xml:space="preserve">Added ability to save forecast data to be retrieved by </w:t>
+      </w:r>
+      <w:proofErr w:type="gramStart"/>
+      <w:r>
+        <w:rPr>
+          <w:lang w:val="en-US"/>
+        </w:rPr>
+        <w:t>excel</w:t>
+      </w:r>
+      <w:proofErr w:type="gramEnd"/>
+    </w:p>
+    <w:p>
+      <w:pPr>
+        <w:pStyle w:val="ListParagraph"/>
+        <w:ind w:left="1440"/>
+        <w:rPr>
+          <w:lang w:val="en-US"/>
+        </w:rPr>
+      </w:pPr>
+      <w:r>
+        <w:rPr>
+          <w:noProof/>
+          <w:lang w:val="en-US"/>
+        </w:rPr>
+        <w:drawing>
+          <wp:inline distT="0" distB="0" distL="0" distR="0" wp14:anchorId="581FFC66" wp14:editId="4D3B6946">
+            <wp:extent cx="5731510" cy="1273810"/>
+            <wp:effectExtent l="0" t="0" r="2540" b="2540"/>
+            <wp:docPr id="9" name="Picture 9"/>
+            <wp:cNvGraphicFramePr>
+              <a:graphicFrameLocks xmlns:a="http://schemas.openxmlformats.org/drawingml/2006/main" noChangeAspect="1"/>
+            </wp:cNvGraphicFramePr>
+            <a:graphic xmlns:a="http://schemas.openxmlformats.org/drawingml/2006/main">
+              <a:graphicData uri="http://schemas.openxmlformats.org/drawingml/2006/picture">
+                <pic:pic xmlns:pic="http://schemas.openxmlformats.org/drawingml/2006/picture">
+                  <pic:nvPicPr>
+                    <pic:cNvPr id="0" name="Picture 1"/>
+                    <pic:cNvPicPr>
+                      <a:picLocks noChangeAspect="1" noChangeArrowheads="1"/>
+                    </pic:cNvPicPr>
+                  </pic:nvPicPr>
+                  <pic:blipFill>
+                    <a:blip r:embed="rId5">
+                      <a:extLst>
+                        <a:ext uri="{28A0092B-C50C-407E-A947-70E740481C1C}">
+                          <a14:useLocalDpi xmlns:a14="http://schemas.microsoft.com/office/drawing/2010/main" val="0"/>
+                        </a:ext>
+                      </a:extLst>
+                    </a:blip>
+                    <a:srcRect/>
+                    <a:stretch>
+                      <a:fillRect/>
+                    </a:stretch>
+                  </pic:blipFill>
+                  <pic:spPr bwMode="auto">
+                    <a:xfrm>
+                      <a:off x="0" y="0"/>
+                      <a:ext cx="5731510" cy="1273810"/>
+                    </a:xfrm>
+                    <a:prstGeom prst="rect">
+                      <a:avLst/>
+                    </a:prstGeom>
+                    <a:noFill/>
+                    <a:ln>
+                      <a:noFill/>
+                    </a:ln>
+                  </pic:spPr>
+                </pic:pic>
+              </a:graphicData>
+            </a:graphic>
+          </wp:inline>
+        </w:drawing>
+      </w:r>
+    </w:p>
+    <w:p>
+      <w:pPr>
+        <w:rPr>
+          <w:lang w:val="en-US"/>
+        </w:rPr>
+      </w:pPr>
+      <w:r>
+        <w:rPr>
+          <w:lang w:val="en-US"/>
+        </w:rPr>
         <w:t>Change Log 25</w:t>
       </w:r>
       <w:r>
@@ -25,8 +166,16 @@
         <w:rPr>
           <w:lang w:val="en-US"/>
         </w:rPr>
-        <w:t xml:space="preserve"> Jan 2021</w:t>
-      </w:r>
+        <w:t xml:space="preserve"> Jan </w:t>
+      </w:r>
+      <w:proofErr w:type="gramStart"/>
+      <w:r>
+        <w:rPr>
+          <w:lang w:val="en-US"/>
+        </w:rPr>
+        <w:t>2021</w:t>
+      </w:r>
+      <w:proofErr w:type="gramEnd"/>
     </w:p>
     <w:p>
       <w:pPr>
@@ -61,8 +210,16 @@
         <w:rPr>
           <w:lang w:val="en-US"/>
         </w:rPr>
-        <w:t>Added ability to move data date forward/backward</w:t>
-      </w:r>
+        <w:t>Added ability to move data date forward/</w:t>
+      </w:r>
+      <w:proofErr w:type="gramStart"/>
+      <w:r>
+        <w:rPr>
+          <w:lang w:val="en-US"/>
+        </w:rPr>
+        <w:t>backward</w:t>
+      </w:r>
+      <w:proofErr w:type="gramEnd"/>
     </w:p>
     <w:p>
       <w:pPr>
@@ -79,8 +236,16 @@
         <w:rPr>
           <w:lang w:val="en-US"/>
         </w:rPr>
-        <w:t>Added ability to disable report date auto change to previous period ending</w:t>
-      </w:r>
+        <w:t xml:space="preserve">Added ability to disable report date auto change to previous period </w:t>
+      </w:r>
+      <w:proofErr w:type="gramStart"/>
+      <w:r>
+        <w:rPr>
+          <w:lang w:val="en-US"/>
+        </w:rPr>
+        <w:t>ending</w:t>
+      </w:r>
+      <w:proofErr w:type="gramEnd"/>
     </w:p>
     <w:p>
       <w:pPr>
@@ -113,7 +278,7 @@
                     </pic:cNvPicPr>
                   </pic:nvPicPr>
                   <pic:blipFill>
-                    <a:blip r:embed="rId5">
+                    <a:blip r:embed="rId6">
                       <a:extLst>
                         <a:ext uri="{28A0092B-C50C-407E-A947-70E740481C1C}">
                           <a14:useLocalDpi xmlns:a14="http://schemas.microsoft.com/office/drawing/2010/main" val="0"/>
@@ -178,8 +343,16 @@
         <w:rPr>
           <w:lang w:val="en-US"/>
         </w:rPr>
-        <w:t>Added ability to disable report date auto change to previous period ending</w:t>
-      </w:r>
+        <w:t xml:space="preserve">Added ability to disable report date auto change to previous period </w:t>
+      </w:r>
+      <w:proofErr w:type="gramStart"/>
+      <w:r>
+        <w:rPr>
+          <w:lang w:val="en-US"/>
+        </w:rPr>
+        <w:t>ending</w:t>
+      </w:r>
+      <w:proofErr w:type="gramEnd"/>
     </w:p>
     <w:p>
       <w:pPr>
@@ -212,7 +385,7 @@
                     </pic:cNvPicPr>
                   </pic:nvPicPr>
                   <pic:blipFill>
-                    <a:blip r:embed="rId6">
+                    <a:blip r:embed="rId7">
                       <a:extLst>
                         <a:ext uri="{28A0092B-C50C-407E-A947-70E740481C1C}">
                           <a14:useLocalDpi xmlns:a14="http://schemas.microsoft.com/office/drawing/2010/main" val="0"/>
@@ -267,8 +440,16 @@
         <w:rPr>
           <w:lang w:val="en-US"/>
         </w:rPr>
-        <w:t xml:space="preserve"> Jan 2021</w:t>
-      </w:r>
+        <w:t xml:space="preserve"> Jan </w:t>
+      </w:r>
+      <w:proofErr w:type="gramStart"/>
+      <w:r>
+        <w:rPr>
+          <w:lang w:val="en-US"/>
+        </w:rPr>
+        <w:t>2021</w:t>
+      </w:r>
+      <w:proofErr w:type="gramEnd"/>
     </w:p>
     <w:p>
       <w:pPr>
@@ -285,8 +466,16 @@
         <w:rPr>
           <w:lang w:val="en-US"/>
         </w:rPr>
-        <w:t>Register -&gt; Change Register</w:t>
-      </w:r>
+        <w:t xml:space="preserve">Register -&gt; Change </w:t>
+      </w:r>
+      <w:proofErr w:type="gramStart"/>
+      <w:r>
+        <w:rPr>
+          <w:lang w:val="en-US"/>
+        </w:rPr>
+        <w:t>Register</w:t>
+      </w:r>
+      <w:proofErr w:type="gramEnd"/>
     </w:p>
     <w:p>
       <w:pPr>
@@ -303,8 +492,16 @@
         <w:rPr>
           <w:lang w:val="en-US"/>
         </w:rPr>
-        <w:t>Added design change notice</w:t>
-      </w:r>
+        <w:t xml:space="preserve">Added design change </w:t>
+      </w:r>
+      <w:proofErr w:type="gramStart"/>
+      <w:r>
+        <w:rPr>
+          <w:lang w:val="en-US"/>
+        </w:rPr>
+        <w:t>notice</w:t>
+      </w:r>
+      <w:proofErr w:type="gramEnd"/>
     </w:p>
     <w:p>
       <w:pPr>
@@ -337,7 +534,7 @@
                     </pic:cNvPicPr>
                   </pic:nvPicPr>
                   <pic:blipFill>
-                    <a:blip r:embed="rId7" cstate="print">
+                    <a:blip r:embed="rId8" cstate="print">
                       <a:extLst>
                         <a:ext uri="{28A0092B-C50C-407E-A947-70E740481C1C}">
                           <a14:useLocalDpi xmlns:a14="http://schemas.microsoft.com/office/drawing/2010/main" val="0"/>
@@ -400,7 +597,7 @@
                     </pic:cNvPicPr>
                   </pic:nvPicPr>
                   <pic:blipFill>
-                    <a:blip r:embed="rId8">
+                    <a:blip r:embed="rId9">
                       <a:extLst>
                         <a:ext uri="{28A0092B-C50C-407E-A947-70E740481C1C}">
                           <a14:useLocalDpi xmlns:a14="http://schemas.microsoft.com/office/drawing/2010/main" val="0"/>
@@ -455,8 +652,16 @@
         <w:rPr>
           <w:lang w:val="en-US"/>
         </w:rPr>
-        <w:t xml:space="preserve"> Jan 2021</w:t>
-      </w:r>
+        <w:t xml:space="preserve"> Jan </w:t>
+      </w:r>
+      <w:proofErr w:type="gramStart"/>
+      <w:r>
+        <w:rPr>
+          <w:lang w:val="en-US"/>
+        </w:rPr>
+        <w:t>2021</w:t>
+      </w:r>
+      <w:proofErr w:type="gramEnd"/>
     </w:p>
     <w:p>
       <w:pPr>
@@ -491,8 +696,16 @@
         <w:rPr>
           <w:lang w:val="en-US"/>
         </w:rPr>
-        <w:t>Added user remaining units to add discretionary remaining units</w:t>
-      </w:r>
+        <w:t xml:space="preserve">Added user remaining units to add discretionary remaining </w:t>
+      </w:r>
+      <w:proofErr w:type="gramStart"/>
+      <w:r>
+        <w:rPr>
+          <w:lang w:val="en-US"/>
+        </w:rPr>
+        <w:t>units</w:t>
+      </w:r>
+      <w:proofErr w:type="gramEnd"/>
     </w:p>
     <w:p>
       <w:pPr>
@@ -525,7 +738,7 @@
                     </pic:cNvPicPr>
                   </pic:nvPicPr>
                   <pic:blipFill>
-                    <a:blip r:embed="rId9">
+                    <a:blip r:embed="rId10">
                       <a:extLst>
                         <a:ext uri="{28A0092B-C50C-407E-A947-70E740481C1C}">
                           <a14:useLocalDpi xmlns:a14="http://schemas.microsoft.com/office/drawing/2010/main" val="0"/>
@@ -625,7 +838,7 @@
                     </pic:cNvPicPr>
                   </pic:nvPicPr>
                   <pic:blipFill>
-                    <a:blip r:embed="rId10">
+                    <a:blip r:embed="rId11">
                       <a:extLst>
                         <a:ext uri="{28A0092B-C50C-407E-A947-70E740481C1C}">
                           <a14:useLocalDpi xmlns:a14="http://schemas.microsoft.com/office/drawing/2010/main" val="0"/>
@@ -688,7 +901,7 @@
                     </pic:cNvPicPr>
                   </pic:nvPicPr>
                   <pic:blipFill>
-                    <a:blip r:embed="rId11">
+                    <a:blip r:embed="rId12">
                       <a:extLst>
                         <a:ext uri="{28A0092B-C50C-407E-A947-70E740481C1C}">
                           <a14:useLocalDpi xmlns:a14="http://schemas.microsoft.com/office/drawing/2010/main" val="0"/>
@@ -743,8 +956,16 @@
         <w:rPr>
           <w:lang w:val="en-US"/>
         </w:rPr>
-        <w:t xml:space="preserve"> Nov 2020</w:t>
-      </w:r>
+        <w:t xml:space="preserve"> Nov </w:t>
+      </w:r>
+      <w:proofErr w:type="gramStart"/>
+      <w:r>
+        <w:rPr>
+          <w:lang w:val="en-US"/>
+        </w:rPr>
+        <w:t>2020</w:t>
+      </w:r>
+      <w:proofErr w:type="gramEnd"/>
     </w:p>
     <w:p>
       <w:pPr>
@@ -785,7 +1006,21 @@
         <w:rPr>
           <w:lang w:val="en-US"/>
         </w:rPr>
-        <w:t xml:space="preserve"> gates goes by phases to support differentiation between D1, D2</w:t>
+        <w:t xml:space="preserve"> gates </w:t>
+      </w:r>
+      <w:proofErr w:type="gramStart"/>
+      <w:r>
+        <w:rPr>
+          <w:lang w:val="en-US"/>
+        </w:rPr>
+        <w:t>goes</w:t>
+      </w:r>
+      <w:proofErr w:type="gramEnd"/>
+      <w:r>
+        <w:rPr>
+          <w:lang w:val="en-US"/>
+        </w:rPr>
+        <w:t xml:space="preserve"> by phases to support differentiation between D1, D2</w:t>
       </w:r>
     </w:p>
     <w:p>
@@ -811,8 +1046,16 @@
         <w:rPr>
           <w:lang w:val="en-US"/>
         </w:rPr>
-        <w:t xml:space="preserve"> Oct 2020</w:t>
-      </w:r>
+        <w:t xml:space="preserve"> Oct </w:t>
+      </w:r>
+      <w:proofErr w:type="gramStart"/>
+      <w:r>
+        <w:rPr>
+          <w:lang w:val="en-US"/>
+        </w:rPr>
+        <w:t>2020</w:t>
+      </w:r>
+      <w:proofErr w:type="gramEnd"/>
     </w:p>
     <w:p>
       <w:pPr>
@@ -871,8 +1114,16 @@
         <w:rPr>
           <w:lang w:val="en-US"/>
         </w:rPr>
-        <w:t>The permission is as follows</w:t>
-      </w:r>
+        <w:t xml:space="preserve">The permission is as </w:t>
+      </w:r>
+      <w:proofErr w:type="gramStart"/>
+      <w:r>
+        <w:rPr>
+          <w:lang w:val="en-US"/>
+        </w:rPr>
+        <w:t>follows</w:t>
+      </w:r>
+      <w:proofErr w:type="gramEnd"/>
     </w:p>
     <w:p>
       <w:pPr>
@@ -906,7 +1157,7 @@
                     </pic:cNvPicPr>
                   </pic:nvPicPr>
                   <pic:blipFill>
-                    <a:blip r:embed="rId12">
+                    <a:blip r:embed="rId13">
                       <a:extLst>
                         <a:ext uri="{28A0092B-C50C-407E-A947-70E740481C1C}">
                           <a14:useLocalDpi xmlns:a14="http://schemas.microsoft.com/office/drawing/2010/main" val="0"/>
@@ -961,8 +1212,16 @@
         <w:rPr>
           <w:lang w:val="en-US"/>
         </w:rPr>
-        <w:t xml:space="preserve"> September 2020</w:t>
-      </w:r>
+        <w:t xml:space="preserve"> September </w:t>
+      </w:r>
+      <w:proofErr w:type="gramStart"/>
+      <w:r>
+        <w:rPr>
+          <w:lang w:val="en-US"/>
+        </w:rPr>
+        <w:t>2020</w:t>
+      </w:r>
+      <w:proofErr w:type="gramEnd"/>
     </w:p>
     <w:p>
       <w:pPr>
@@ -1015,8 +1274,16 @@
         <w:rPr>
           <w:lang w:val="en-US"/>
         </w:rPr>
-        <w:t xml:space="preserve"> cost group and cost type error when stock code is VA001</w:t>
-      </w:r>
+        <w:t xml:space="preserve"> cost group and cost type error when stock code is </w:t>
+      </w:r>
+      <w:proofErr w:type="gramStart"/>
+      <w:r>
+        <w:rPr>
+          <w:lang w:val="en-US"/>
+        </w:rPr>
+        <w:t>VA001</w:t>
+      </w:r>
+      <w:proofErr w:type="gramEnd"/>
     </w:p>
     <w:p>
       <w:pPr>
@@ -1105,8 +1372,16 @@
         <w:rPr>
           <w:lang w:val="en-US"/>
         </w:rPr>
-        <w:t xml:space="preserve"> so that it doesn’t clutter up forecast view</w:t>
-      </w:r>
+        <w:t xml:space="preserve"> so that it doesn’t clutter up forecast </w:t>
+      </w:r>
+      <w:proofErr w:type="gramStart"/>
+      <w:r>
+        <w:rPr>
+          <w:lang w:val="en-US"/>
+        </w:rPr>
+        <w:t>view</w:t>
+      </w:r>
+      <w:proofErr w:type="gramEnd"/>
     </w:p>
     <w:p>
       <w:pPr>
@@ -1131,8 +1406,16 @@
         <w:rPr>
           <w:lang w:val="en-US"/>
         </w:rPr>
-        <w:t xml:space="preserve"> September 2020</w:t>
-      </w:r>
+        <w:t xml:space="preserve"> September </w:t>
+      </w:r>
+      <w:proofErr w:type="gramStart"/>
+      <w:r>
+        <w:rPr>
+          <w:lang w:val="en-US"/>
+        </w:rPr>
+        <w:t>2020</w:t>
+      </w:r>
+      <w:proofErr w:type="gramEnd"/>
     </w:p>
     <w:p>
       <w:pPr>
@@ -1173,8 +1456,16 @@
         <w:rPr>
           <w:lang w:val="en-US"/>
         </w:rPr>
-        <w:t>llow negative values for revenue</w:t>
-      </w:r>
+        <w:t xml:space="preserve">llow negative values for </w:t>
+      </w:r>
+      <w:proofErr w:type="gramStart"/>
+      <w:r>
+        <w:rPr>
+          <w:lang w:val="en-US"/>
+        </w:rPr>
+        <w:t>revenue</w:t>
+      </w:r>
+      <w:proofErr w:type="gramEnd"/>
     </w:p>
     <w:p>
       <w:pPr>
@@ -1215,8 +1506,16 @@
         <w:rPr>
           <w:lang w:val="en-US"/>
         </w:rPr>
-        <w:t>emove cost group and cost type</w:t>
-      </w:r>
+        <w:t xml:space="preserve">emove cost group and cost </w:t>
+      </w:r>
+      <w:proofErr w:type="gramStart"/>
+      <w:r>
+        <w:rPr>
+          <w:lang w:val="en-US"/>
+        </w:rPr>
+        <w:t>type</w:t>
+      </w:r>
+      <w:proofErr w:type="gramEnd"/>
     </w:p>
     <w:p>
       <w:pPr>
@@ -1251,8 +1550,16 @@
         <w:rPr>
           <w:lang w:val="en-US"/>
         </w:rPr>
-        <w:t>job in construction variation to show valid sub job codes only</w:t>
-      </w:r>
+        <w:t xml:space="preserve">job in construction variation to show valid sub job codes </w:t>
+      </w:r>
+      <w:proofErr w:type="gramStart"/>
+      <w:r>
+        <w:rPr>
+          <w:lang w:val="en-US"/>
+        </w:rPr>
+        <w:t>only</w:t>
+      </w:r>
+      <w:proofErr w:type="gramEnd"/>
     </w:p>
     <w:p>
       <w:pPr>
@@ -1275,7 +1582,21 @@
         <w:rPr>
           <w:lang w:val="en-US"/>
         </w:rPr>
-        <w:t>how cell error when sub job codes isn't valid for chosen type</w:t>
+        <w:t xml:space="preserve">how cell error when sub job codes </w:t>
+      </w:r>
+      <w:proofErr w:type="gramStart"/>
+      <w:r>
+        <w:rPr>
+          <w:lang w:val="en-US"/>
+        </w:rPr>
+        <w:t>isn't</w:t>
+      </w:r>
+      <w:proofErr w:type="gramEnd"/>
+      <w:r>
+        <w:rPr>
+          <w:lang w:val="en-US"/>
+        </w:rPr>
+        <w:t xml:space="preserve"> valid for chosen type</w:t>
       </w:r>
     </w:p>
     <w:p>
@@ -1301,8 +1622,16 @@
         <w:rPr>
           <w:lang w:val="en-US"/>
         </w:rPr>
-        <w:t xml:space="preserve"> September 2020</w:t>
-      </w:r>
+        <w:t xml:space="preserve"> September </w:t>
+      </w:r>
+      <w:proofErr w:type="gramStart"/>
+      <w:r>
+        <w:rPr>
+          <w:lang w:val="en-US"/>
+        </w:rPr>
+        <w:t>2020</w:t>
+      </w:r>
+      <w:proofErr w:type="gramEnd"/>
     </w:p>
     <w:p>
       <w:pPr>
@@ -1320,8 +1649,16 @@
           <w:lang w:val="en-US"/>
         </w:rPr>
         <w:lastRenderedPageBreak/>
-        <w:t>Forecast -&gt; Forecast</w:t>
-      </w:r>
+        <w:t xml:space="preserve">Forecast -&gt; </w:t>
+      </w:r>
+      <w:proofErr w:type="gramStart"/>
+      <w:r>
+        <w:rPr>
+          <w:lang w:val="en-US"/>
+        </w:rPr>
+        <w:t>Forecast</w:t>
+      </w:r>
+      <w:proofErr w:type="gramEnd"/>
     </w:p>
     <w:p>
       <w:pPr>
@@ -1344,8 +1681,30 @@
         <w:rPr>
           <w:lang w:val="en-US"/>
         </w:rPr>
-        <w:t>how empty cost group and cost type in forecast to accomodate variations without cost group and cost type coming from construction variation module</w:t>
-      </w:r>
+        <w:t xml:space="preserve">how empty cost group and cost type in forecast to </w:t>
+      </w:r>
+      <w:proofErr w:type="spellStart"/>
+      <w:r>
+        <w:rPr>
+          <w:lang w:val="en-US"/>
+        </w:rPr>
+        <w:t>accomodate</w:t>
+      </w:r>
+      <w:proofErr w:type="spellEnd"/>
+      <w:r>
+        <w:rPr>
+          <w:lang w:val="en-US"/>
+        </w:rPr>
+        <w:t xml:space="preserve"> variations without cost group and cost type coming from construction variation </w:t>
+      </w:r>
+      <w:proofErr w:type="gramStart"/>
+      <w:r>
+        <w:rPr>
+          <w:lang w:val="en-US"/>
+        </w:rPr>
+        <w:t>module</w:t>
+      </w:r>
+      <w:proofErr w:type="gramEnd"/>
     </w:p>
     <w:p>
       <w:pPr>
@@ -1370,8 +1729,16 @@
         <w:rPr>
           <w:lang w:val="en-US"/>
         </w:rPr>
-        <w:t xml:space="preserve"> September 2020</w:t>
-      </w:r>
+        <w:t xml:space="preserve"> September </w:t>
+      </w:r>
+      <w:proofErr w:type="gramStart"/>
+      <w:r>
+        <w:rPr>
+          <w:lang w:val="en-US"/>
+        </w:rPr>
+        <w:t>2020</w:t>
+      </w:r>
+      <w:proofErr w:type="gramEnd"/>
     </w:p>
     <w:p>
       <w:pPr>
@@ -1412,7 +1779,21 @@
         <w:rPr>
           <w:lang w:val="en-US"/>
         </w:rPr>
-        <w:t xml:space="preserve">ixed an issue where committing to </w:t>
+        <w:t xml:space="preserve">ixed an issue </w:t>
+      </w:r>
+      <w:proofErr w:type="gramStart"/>
+      <w:r>
+        <w:rPr>
+          <w:lang w:val="en-US"/>
+        </w:rPr>
+        <w:t>where</w:t>
+      </w:r>
+      <w:proofErr w:type="gramEnd"/>
+      <w:r>
+        <w:rPr>
+          <w:lang w:val="en-US"/>
+        </w:rPr>
+        <w:t xml:space="preserve"> committing to </w:t>
       </w:r>
       <w:r>
         <w:rPr>
@@ -1495,8 +1876,16 @@
         <w:rPr>
           <w:lang w:val="en-US"/>
         </w:rPr>
-        <w:t xml:space="preserve"> September 2020</w:t>
-      </w:r>
+        <w:t xml:space="preserve"> September </w:t>
+      </w:r>
+      <w:proofErr w:type="gramStart"/>
+      <w:r>
+        <w:rPr>
+          <w:lang w:val="en-US"/>
+        </w:rPr>
+        <w:t>2020</w:t>
+      </w:r>
+      <w:proofErr w:type="gramEnd"/>
     </w:p>
     <w:p>
       <w:pPr>
@@ -1531,8 +1920,16 @@
         <w:rPr>
           <w:lang w:val="en-US"/>
         </w:rPr>
-        <w:t>Fixed an issue where at completion units doesn’t match budgeted units when pushing to P6</w:t>
-      </w:r>
+        <w:t xml:space="preserve">Fixed an issue where at completion units doesn’t match budgeted units when pushing to </w:t>
+      </w:r>
+      <w:proofErr w:type="gramStart"/>
+      <w:r>
+        <w:rPr>
+          <w:lang w:val="en-US"/>
+        </w:rPr>
+        <w:t>P6</w:t>
+      </w:r>
+      <w:proofErr w:type="gramEnd"/>
     </w:p>
     <w:p>
       <w:pPr>
@@ -1549,8 +1946,16 @@
         <w:rPr>
           <w:lang w:val="en-US"/>
         </w:rPr>
-        <w:t>Add a checkbox to allow certain projects to have current week ending data date</w:t>
-      </w:r>
+        <w:t xml:space="preserve">Add a checkbox to allow certain projects to have current week ending data </w:t>
+      </w:r>
+      <w:proofErr w:type="gramStart"/>
+      <w:r>
+        <w:rPr>
+          <w:lang w:val="en-US"/>
+        </w:rPr>
+        <w:t>date</w:t>
+      </w:r>
+      <w:proofErr w:type="gramEnd"/>
     </w:p>
     <w:p>
       <w:pPr>
@@ -1567,8 +1972,16 @@
         <w:rPr>
           <w:lang w:val="en-US"/>
         </w:rPr>
-        <w:t>Added a button to copy start date to target start date and due date to target end date</w:t>
-      </w:r>
+        <w:t xml:space="preserve">Added a button to copy start date to target start date and due date to target end </w:t>
+      </w:r>
+      <w:proofErr w:type="gramStart"/>
+      <w:r>
+        <w:rPr>
+          <w:lang w:val="en-US"/>
+        </w:rPr>
+        <w:t>date</w:t>
+      </w:r>
+      <w:proofErr w:type="gramEnd"/>
     </w:p>
     <w:p>
       <w:pPr>
@@ -1593,8 +2006,16 @@
         <w:rPr>
           <w:lang w:val="en-US"/>
         </w:rPr>
-        <w:t xml:space="preserve"> September 2020</w:t>
-      </w:r>
+        <w:t xml:space="preserve"> September </w:t>
+      </w:r>
+      <w:proofErr w:type="gramStart"/>
+      <w:r>
+        <w:rPr>
+          <w:lang w:val="en-US"/>
+        </w:rPr>
+        <w:t>2020</w:t>
+      </w:r>
+      <w:proofErr w:type="gramEnd"/>
     </w:p>
     <w:p>
       <w:pPr>
@@ -1642,8 +2063,16 @@
         <w:rPr>
           <w:lang w:val="en-US"/>
         </w:rPr>
-        <w:t>change to current week data date when current day is the day of week for current week’s data date</w:t>
-      </w:r>
+        <w:t xml:space="preserve">change to current week data date when current day is the day of week for current week’s data </w:t>
+      </w:r>
+      <w:proofErr w:type="gramStart"/>
+      <w:r>
+        <w:rPr>
+          <w:lang w:val="en-US"/>
+        </w:rPr>
+        <w:t>date</w:t>
+      </w:r>
+      <w:proofErr w:type="gramEnd"/>
     </w:p>
     <w:bookmarkEnd w:id="0"/>
     <w:p>
@@ -1669,8 +2098,16 @@
         <w:rPr>
           <w:lang w:val="en-US"/>
         </w:rPr>
-        <w:t xml:space="preserve"> September 2020</w:t>
-      </w:r>
+        <w:t xml:space="preserve"> September </w:t>
+      </w:r>
+      <w:proofErr w:type="gramStart"/>
+      <w:r>
+        <w:rPr>
+          <w:lang w:val="en-US"/>
+        </w:rPr>
+        <w:t>2020</w:t>
+      </w:r>
+      <w:proofErr w:type="gramEnd"/>
     </w:p>
     <w:p>
       <w:pPr>
@@ -1747,8 +2184,16 @@
         <w:rPr>
           <w:lang w:val="en-US"/>
         </w:rPr>
-        <w:t xml:space="preserve"> code is used</w:t>
-      </w:r>
+        <w:t xml:space="preserve"> code is </w:t>
+      </w:r>
+      <w:proofErr w:type="gramStart"/>
+      <w:r>
+        <w:rPr>
+          <w:lang w:val="en-US"/>
+        </w:rPr>
+        <w:t>used</w:t>
+      </w:r>
+      <w:proofErr w:type="gramEnd"/>
     </w:p>
     <w:p>
       <w:pPr>
@@ -1846,8 +2291,16 @@
         <w:rPr>
           <w:lang w:val="en-US"/>
         </w:rPr>
-        <w:t xml:space="preserve"> code</w:t>
-      </w:r>
+        <w:t xml:space="preserve"> </w:t>
+      </w:r>
+      <w:proofErr w:type="gramStart"/>
+      <w:r>
+        <w:rPr>
+          <w:lang w:val="en-US"/>
+        </w:rPr>
+        <w:t>code</w:t>
+      </w:r>
+      <w:proofErr w:type="gramEnd"/>
     </w:p>
     <w:p>
       <w:pPr>
@@ -1873,8 +2326,16 @@
         <w:rPr>
           <w:lang w:val="en-US"/>
         </w:rPr>
-        <w:t>Forecast -&gt; Forecast</w:t>
-      </w:r>
+        <w:t xml:space="preserve">Forecast -&gt; </w:t>
+      </w:r>
+      <w:proofErr w:type="gramStart"/>
+      <w:r>
+        <w:rPr>
+          <w:lang w:val="en-US"/>
+        </w:rPr>
+        <w:t>Forecast</w:t>
+      </w:r>
+      <w:proofErr w:type="gramEnd"/>
     </w:p>
     <w:p>
       <w:pPr>
@@ -1891,8 +2352,16 @@
         <w:rPr>
           <w:lang w:val="en-US"/>
         </w:rPr>
-        <w:t>Use total unapproved variation revenue to show unapproved revenue in forecast view</w:t>
-      </w:r>
+        <w:t xml:space="preserve">Use total unapproved variation revenue to show unapproved revenue in forecast </w:t>
+      </w:r>
+      <w:proofErr w:type="gramStart"/>
+      <w:r>
+        <w:rPr>
+          <w:lang w:val="en-US"/>
+        </w:rPr>
+        <w:t>view</w:t>
+      </w:r>
+      <w:proofErr w:type="gramEnd"/>
     </w:p>
     <w:p>
       <w:pPr>
@@ -1917,8 +2386,16 @@
         <w:rPr>
           <w:lang w:val="en-US"/>
         </w:rPr>
-        <w:t xml:space="preserve"> August 2020</w:t>
-      </w:r>
+        <w:t xml:space="preserve"> August </w:t>
+      </w:r>
+      <w:proofErr w:type="gramStart"/>
+      <w:r>
+        <w:rPr>
+          <w:lang w:val="en-US"/>
+        </w:rPr>
+        <w:t>2020</w:t>
+      </w:r>
+      <w:proofErr w:type="gramEnd"/>
     </w:p>
     <w:p>
       <w:pPr>
@@ -1953,8 +2430,16 @@
         <w:rPr>
           <w:lang w:val="en-US"/>
         </w:rPr>
-        <w:t>Added construction variation module</w:t>
-      </w:r>
+        <w:t xml:space="preserve">Added construction variation </w:t>
+      </w:r>
+      <w:proofErr w:type="gramStart"/>
+      <w:r>
+        <w:rPr>
+          <w:lang w:val="en-US"/>
+        </w:rPr>
+        <w:t>module</w:t>
+      </w:r>
+      <w:proofErr w:type="gramEnd"/>
     </w:p>
     <w:p>
       <w:pPr>
@@ -1964,7 +2449,7 @@
           <w:lang w:val="en-US"/>
         </w:rPr>
       </w:pPr>
-      <w:hyperlink r:id="rId13" w:history="1">
+      <w:hyperlink r:id="rId14" w:history="1">
         <w:r>
           <w:rPr>
             <w:rStyle w:val="Hyperlink"/>
@@ -1997,8 +2482,16 @@
         <w:rPr>
           <w:lang w:val="en-US"/>
         </w:rPr>
-        <w:t xml:space="preserve"> July 2020</w:t>
-      </w:r>
+        <w:t xml:space="preserve"> July </w:t>
+      </w:r>
+      <w:proofErr w:type="gramStart"/>
+      <w:r>
+        <w:rPr>
+          <w:lang w:val="en-US"/>
+        </w:rPr>
+        <w:t>2020</w:t>
+      </w:r>
+      <w:proofErr w:type="gramEnd"/>
     </w:p>
     <w:p>
       <w:pPr>
@@ -2015,8 +2508,16 @@
         <w:rPr>
           <w:lang w:val="en-US"/>
         </w:rPr>
-        <w:t>Forecast -&gt; Forecast</w:t>
-      </w:r>
+        <w:t xml:space="preserve">Forecast -&gt; </w:t>
+      </w:r>
+      <w:proofErr w:type="gramStart"/>
+      <w:r>
+        <w:rPr>
+          <w:lang w:val="en-US"/>
+        </w:rPr>
+        <w:t>Forecast</w:t>
+      </w:r>
+      <w:proofErr w:type="gramEnd"/>
     </w:p>
     <w:p>
       <w:pPr>
@@ -2034,8 +2535,30 @@
           <w:lang w:val="en-US"/>
         </w:rPr>
         <w:lastRenderedPageBreak/>
-        <w:t>Added column to show actual labour units post data date</w:t>
-      </w:r>
+        <w:t xml:space="preserve">Added column to show actual </w:t>
+      </w:r>
+      <w:proofErr w:type="spellStart"/>
+      <w:r>
+        <w:rPr>
+          <w:lang w:val="en-US"/>
+        </w:rPr>
+        <w:t>labour</w:t>
+      </w:r>
+      <w:proofErr w:type="spellEnd"/>
+      <w:r>
+        <w:rPr>
+          <w:lang w:val="en-US"/>
+        </w:rPr>
+        <w:t xml:space="preserve"> units post data </w:t>
+      </w:r>
+      <w:proofErr w:type="gramStart"/>
+      <w:r>
+        <w:rPr>
+          <w:lang w:val="en-US"/>
+        </w:rPr>
+        <w:t>date</w:t>
+      </w:r>
+      <w:proofErr w:type="gramEnd"/>
     </w:p>
     <w:p>
       <w:pPr>
@@ -2060,8 +2583,16 @@
         <w:rPr>
           <w:lang w:val="en-US"/>
         </w:rPr>
-        <w:t xml:space="preserve"> July 2020</w:t>
-      </w:r>
+        <w:t xml:space="preserve"> July </w:t>
+      </w:r>
+      <w:proofErr w:type="gramStart"/>
+      <w:r>
+        <w:rPr>
+          <w:lang w:val="en-US"/>
+        </w:rPr>
+        <w:t>2020</w:t>
+      </w:r>
+      <w:proofErr w:type="gramEnd"/>
     </w:p>
     <w:p>
       <w:pPr>
@@ -2078,8 +2609,16 @@
         <w:rPr>
           <w:lang w:val="en-US"/>
         </w:rPr>
-        <w:t>Forecast -&gt; Forecast</w:t>
-      </w:r>
+        <w:t xml:space="preserve">Forecast -&gt; </w:t>
+      </w:r>
+      <w:proofErr w:type="gramStart"/>
+      <w:r>
+        <w:rPr>
+          <w:lang w:val="en-US"/>
+        </w:rPr>
+        <w:t>Forecast</w:t>
+      </w:r>
+      <w:proofErr w:type="gramEnd"/>
     </w:p>
     <w:p>
       <w:pPr>
@@ -2096,8 +2635,16 @@
         <w:rPr>
           <w:lang w:val="en-US"/>
         </w:rPr>
-        <w:t>Removed colors from actuals history</w:t>
-      </w:r>
+        <w:t xml:space="preserve">Removed colors from actuals </w:t>
+      </w:r>
+      <w:proofErr w:type="gramStart"/>
+      <w:r>
+        <w:rPr>
+          <w:lang w:val="en-US"/>
+        </w:rPr>
+        <w:t>history</w:t>
+      </w:r>
+      <w:proofErr w:type="gramEnd"/>
     </w:p>
     <w:p>
       <w:pPr>
@@ -2122,8 +2669,16 @@
         <w:rPr>
           <w:lang w:val="en-US"/>
         </w:rPr>
-        <w:t xml:space="preserve"> July 2020</w:t>
-      </w:r>
+        <w:t xml:space="preserve"> July </w:t>
+      </w:r>
+      <w:proofErr w:type="gramStart"/>
+      <w:r>
+        <w:rPr>
+          <w:lang w:val="en-US"/>
+        </w:rPr>
+        <w:t>2020</w:t>
+      </w:r>
+      <w:proofErr w:type="gramEnd"/>
     </w:p>
     <w:p>
       <w:pPr>
@@ -2158,8 +2713,16 @@
         <w:rPr>
           <w:lang w:val="en-US"/>
         </w:rPr>
-        <w:t>Added stock code</w:t>
-      </w:r>
+        <w:t xml:space="preserve">Added stock </w:t>
+      </w:r>
+      <w:proofErr w:type="gramStart"/>
+      <w:r>
+        <w:rPr>
+          <w:lang w:val="en-US"/>
+        </w:rPr>
+        <w:t>code</w:t>
+      </w:r>
+      <w:proofErr w:type="gramEnd"/>
     </w:p>
     <w:p>
       <w:pPr>
@@ -2184,8 +2747,16 @@
         <w:rPr>
           <w:lang w:val="en-US"/>
         </w:rPr>
-        <w:t xml:space="preserve"> July 2020</w:t>
-      </w:r>
+        <w:t xml:space="preserve"> July </w:t>
+      </w:r>
+      <w:proofErr w:type="gramStart"/>
+      <w:r>
+        <w:rPr>
+          <w:lang w:val="en-US"/>
+        </w:rPr>
+        <w:t>2020</w:t>
+      </w:r>
+      <w:proofErr w:type="gramEnd"/>
     </w:p>
     <w:p>
       <w:pPr>
@@ -2220,8 +2791,16 @@
         <w:rPr>
           <w:lang w:val="en-US"/>
         </w:rPr>
-        <w:t>Added show variation name and approve units column</w:t>
-      </w:r>
+        <w:t xml:space="preserve">Added show variation name and approve units </w:t>
+      </w:r>
+      <w:proofErr w:type="gramStart"/>
+      <w:r>
+        <w:rPr>
+          <w:lang w:val="en-US"/>
+        </w:rPr>
+        <w:t>column</w:t>
+      </w:r>
+      <w:proofErr w:type="gramEnd"/>
     </w:p>
     <w:p>
       <w:pPr>
@@ -2230,7 +2809,7 @@
           <w:lang w:val="en-US"/>
         </w:rPr>
       </w:pPr>
-      <w:hyperlink r:id="rId14" w:history="1">
+      <w:hyperlink r:id="rId15" w:history="1">
         <w:r>
           <w:rPr>
             <w:rStyle w:val="Hyperlink"/>
@@ -2263,8 +2842,16 @@
         <w:rPr>
           <w:lang w:val="en-US"/>
         </w:rPr>
-        <w:t xml:space="preserve"> July 2020</w:t>
-      </w:r>
+        <w:t xml:space="preserve"> July </w:t>
+      </w:r>
+      <w:proofErr w:type="gramStart"/>
+      <w:r>
+        <w:rPr>
+          <w:lang w:val="en-US"/>
+        </w:rPr>
+        <w:t>2020</w:t>
+      </w:r>
+      <w:proofErr w:type="gramEnd"/>
     </w:p>
     <w:p>
       <w:pPr>
@@ -2299,8 +2886,16 @@
         <w:rPr>
           <w:lang w:val="en-US"/>
         </w:rPr>
-        <w:t>Added hidden column to allow subcontract hours to be excluded from forecast</w:t>
-      </w:r>
+        <w:t xml:space="preserve">Added hidden column to allow subcontract hours to be excluded from </w:t>
+      </w:r>
+      <w:proofErr w:type="gramStart"/>
+      <w:r>
+        <w:rPr>
+          <w:lang w:val="en-US"/>
+        </w:rPr>
+        <w:t>forecast</w:t>
+      </w:r>
+      <w:proofErr w:type="gramEnd"/>
     </w:p>
     <w:p>
       <w:pPr>
@@ -2310,7 +2905,7 @@
           <w:lang w:val="en-US"/>
         </w:rPr>
       </w:pPr>
-      <w:hyperlink r:id="rId15" w:history="1">
+      <w:hyperlink r:id="rId16" w:history="1">
         <w:r>
           <w:rPr>
             <w:rStyle w:val="Hyperlink"/>
@@ -2352,8 +2947,16 @@
         <w:rPr>
           <w:lang w:val="en-US"/>
         </w:rPr>
-        <w:t xml:space="preserve"> July 2020</w:t>
-      </w:r>
+        <w:t xml:space="preserve"> July </w:t>
+      </w:r>
+      <w:proofErr w:type="gramStart"/>
+      <w:r>
+        <w:rPr>
+          <w:lang w:val="en-US"/>
+        </w:rPr>
+        <w:t>2020</w:t>
+      </w:r>
+      <w:proofErr w:type="gramEnd"/>
     </w:p>
     <w:p>
       <w:pPr>
@@ -2370,8 +2973,16 @@
         <w:rPr>
           <w:lang w:val="en-US"/>
         </w:rPr>
-        <w:t>Forecast -&gt; Forecast</w:t>
-      </w:r>
+        <w:t xml:space="preserve">Forecast -&gt; </w:t>
+      </w:r>
+      <w:proofErr w:type="gramStart"/>
+      <w:r>
+        <w:rPr>
+          <w:lang w:val="en-US"/>
+        </w:rPr>
+        <w:t>Forecast</w:t>
+      </w:r>
+      <w:proofErr w:type="gramEnd"/>
     </w:p>
     <w:p>
       <w:pPr>
@@ -2388,8 +2999,16 @@
         <w:rPr>
           <w:lang w:val="en-US"/>
         </w:rPr>
-        <w:t>Added permission to allow user to edit construction forecast as uncommitted</w:t>
-      </w:r>
+        <w:t xml:space="preserve">Added permission to allow user to edit construction forecast as </w:t>
+      </w:r>
+      <w:proofErr w:type="gramStart"/>
+      <w:r>
+        <w:rPr>
+          <w:lang w:val="en-US"/>
+        </w:rPr>
+        <w:t>uncommitted</w:t>
+      </w:r>
+      <w:proofErr w:type="gramEnd"/>
     </w:p>
     <w:p>
       <w:pPr>
@@ -2414,8 +3033,16 @@
         <w:rPr>
           <w:lang w:val="en-US"/>
         </w:rPr>
-        <w:t xml:space="preserve"> July 2020</w:t>
-      </w:r>
+        <w:t xml:space="preserve"> July </w:t>
+      </w:r>
+      <w:proofErr w:type="gramStart"/>
+      <w:r>
+        <w:rPr>
+          <w:lang w:val="en-US"/>
+        </w:rPr>
+        <w:t>2020</w:t>
+      </w:r>
+      <w:proofErr w:type="gramEnd"/>
     </w:p>
     <w:p>
       <w:pPr>
@@ -2462,8 +3089,16 @@
         <w:rPr>
           <w:lang w:val="en-US"/>
         </w:rPr>
-        <w:t>shown after refresh</w:t>
-      </w:r>
+        <w:t xml:space="preserve">shown after </w:t>
+      </w:r>
+      <w:proofErr w:type="gramStart"/>
+      <w:r>
+        <w:rPr>
+          <w:lang w:val="en-US"/>
+        </w:rPr>
+        <w:t>refresh</w:t>
+      </w:r>
+      <w:proofErr w:type="gramEnd"/>
     </w:p>
     <w:p>
       <w:pPr>
@@ -2486,8 +3121,16 @@
         <w:rPr>
           <w:lang w:val="en-US"/>
         </w:rPr>
-        <w:t>how only active users</w:t>
-      </w:r>
+        <w:t xml:space="preserve">how only active </w:t>
+      </w:r>
+      <w:proofErr w:type="gramStart"/>
+      <w:r>
+        <w:rPr>
+          <w:lang w:val="en-US"/>
+        </w:rPr>
+        <w:t>users</w:t>
+      </w:r>
+      <w:proofErr w:type="gramEnd"/>
     </w:p>
     <w:p>
       <w:pPr>
@@ -2512,8 +3155,16 @@
         <w:rPr>
           <w:lang w:val="en-US"/>
         </w:rPr>
-        <w:t xml:space="preserve"> July 2020</w:t>
-      </w:r>
+        <w:t xml:space="preserve"> July </w:t>
+      </w:r>
+      <w:proofErr w:type="gramStart"/>
+      <w:r>
+        <w:rPr>
+          <w:lang w:val="en-US"/>
+        </w:rPr>
+        <w:t>2020</w:t>
+      </w:r>
+      <w:proofErr w:type="gramEnd"/>
     </w:p>
     <w:p>
       <w:pPr>
@@ -2554,8 +3205,30 @@
         <w:rPr>
           <w:lang w:val="en-US"/>
         </w:rPr>
-        <w:t>ixed an issue where subjob variation code doesn't show up in book time</w:t>
-      </w:r>
+        <w:t xml:space="preserve">ixed an issue where </w:t>
+      </w:r>
+      <w:proofErr w:type="spellStart"/>
+      <w:r>
+        <w:rPr>
+          <w:lang w:val="en-US"/>
+        </w:rPr>
+        <w:t>subjob</w:t>
+      </w:r>
+      <w:proofErr w:type="spellEnd"/>
+      <w:r>
+        <w:rPr>
+          <w:lang w:val="en-US"/>
+        </w:rPr>
+        <w:t xml:space="preserve"> variation code doesn't show up in book </w:t>
+      </w:r>
+      <w:proofErr w:type="gramStart"/>
+      <w:r>
+        <w:rPr>
+          <w:lang w:val="en-US"/>
+        </w:rPr>
+        <w:t>time</w:t>
+      </w:r>
+      <w:proofErr w:type="gramEnd"/>
     </w:p>
     <w:p>
       <w:pPr>
@@ -2580,8 +3253,16 @@
         <w:rPr>
           <w:lang w:val="en-US"/>
         </w:rPr>
-        <w:t xml:space="preserve"> July 2020</w:t>
-      </w:r>
+        <w:t xml:space="preserve"> July </w:t>
+      </w:r>
+      <w:proofErr w:type="gramStart"/>
+      <w:r>
+        <w:rPr>
+          <w:lang w:val="en-US"/>
+        </w:rPr>
+        <w:t>2020</w:t>
+      </w:r>
+      <w:proofErr w:type="gramEnd"/>
     </w:p>
     <w:p>
       <w:pPr>
@@ -2598,8 +3279,16 @@
         <w:rPr>
           <w:lang w:val="en-US"/>
         </w:rPr>
-        <w:t>Forecast -&gt; Forecast</w:t>
-      </w:r>
+        <w:t xml:space="preserve">Forecast -&gt; </w:t>
+      </w:r>
+      <w:proofErr w:type="gramStart"/>
+      <w:r>
+        <w:rPr>
+          <w:lang w:val="en-US"/>
+        </w:rPr>
+        <w:t>Forecast</w:t>
+      </w:r>
+      <w:proofErr w:type="gramEnd"/>
     </w:p>
     <w:p>
       <w:pPr>
@@ -2616,8 +3305,16 @@
         <w:rPr>
           <w:lang w:val="en-US"/>
         </w:rPr>
-        <w:t>Try to fix an issue where module loads partial data</w:t>
-      </w:r>
+        <w:t xml:space="preserve">Try to fix an issue where module loads partial </w:t>
+      </w:r>
+      <w:proofErr w:type="gramStart"/>
+      <w:r>
+        <w:rPr>
+          <w:lang w:val="en-US"/>
+        </w:rPr>
+        <w:t>data</w:t>
+      </w:r>
+      <w:proofErr w:type="gramEnd"/>
     </w:p>
     <w:p>
       <w:pPr>
@@ -2676,8 +3373,16 @@
         <w:rPr>
           <w:lang w:val="en-US"/>
         </w:rPr>
-        <w:t xml:space="preserve"> is caused by PF changes</w:t>
-      </w:r>
+        <w:t xml:space="preserve"> is caused by PF </w:t>
+      </w:r>
+      <w:proofErr w:type="gramStart"/>
+      <w:r>
+        <w:rPr>
+          <w:lang w:val="en-US"/>
+        </w:rPr>
+        <w:t>changes</w:t>
+      </w:r>
+      <w:proofErr w:type="gramEnd"/>
     </w:p>
     <w:p>
       <w:pPr>
@@ -2700,8 +3405,16 @@
         <w:rPr>
           <w:lang w:val="en-US"/>
         </w:rPr>
-        <w:t xml:space="preserve"> double up</w:t>
-      </w:r>
+        <w:t xml:space="preserve"> double </w:t>
+      </w:r>
+      <w:proofErr w:type="gramStart"/>
+      <w:r>
+        <w:rPr>
+          <w:lang w:val="en-US"/>
+        </w:rPr>
+        <w:t>up</w:t>
+      </w:r>
+      <w:proofErr w:type="gramEnd"/>
     </w:p>
     <w:p>
       <w:pPr>
@@ -2736,8 +3449,16 @@
         <w:rPr>
           <w:lang w:val="en-US"/>
         </w:rPr>
-        <w:t xml:space="preserve"> in green/red</w:t>
-      </w:r>
+        <w:t xml:space="preserve"> in green/</w:t>
+      </w:r>
+      <w:proofErr w:type="gramStart"/>
+      <w:r>
+        <w:rPr>
+          <w:lang w:val="en-US"/>
+        </w:rPr>
+        <w:t>red</w:t>
+      </w:r>
+      <w:proofErr w:type="gramEnd"/>
     </w:p>
     <w:p>
       <w:pPr>
@@ -2760,8 +3481,16 @@
         <w:rPr>
           <w:lang w:val="en-US"/>
         </w:rPr>
-        <w:t>llow construction jobs cells to be edited when P6 project doesn't exists</w:t>
-      </w:r>
+        <w:t xml:space="preserve">llow construction jobs cells to be edited when P6 project doesn't </w:t>
+      </w:r>
+      <w:proofErr w:type="gramStart"/>
+      <w:r>
+        <w:rPr>
+          <w:lang w:val="en-US"/>
+        </w:rPr>
+        <w:t>exists</w:t>
+      </w:r>
+      <w:proofErr w:type="gramEnd"/>
     </w:p>
     <w:p>
       <w:pPr>
@@ -2787,8 +3516,16 @@
         <w:rPr>
           <w:lang w:val="en-US"/>
         </w:rPr>
-        <w:t xml:space="preserve"> July 2020</w:t>
-      </w:r>
+        <w:t xml:space="preserve"> July </w:t>
+      </w:r>
+      <w:proofErr w:type="gramStart"/>
+      <w:r>
+        <w:rPr>
+          <w:lang w:val="en-US"/>
+        </w:rPr>
+        <w:t>2020</w:t>
+      </w:r>
+      <w:proofErr w:type="gramEnd"/>
     </w:p>
     <w:p>
       <w:pPr>
@@ -2802,8 +3539,16 @@
         <w:rPr>
           <w:rFonts w:cs="Calibri"/>
         </w:rPr>
-        <w:t>Allow user with permission to edit Exo -&gt; Transaction quantity</w:t>
-      </w:r>
+        <w:t xml:space="preserve">Allow user with permission to edit Exo -&gt; Transaction </w:t>
+      </w:r>
+      <w:proofErr w:type="gramStart"/>
+      <w:r>
+        <w:rPr>
+          <w:rFonts w:cs="Calibri"/>
+        </w:rPr>
+        <w:t>quantity</w:t>
+      </w:r>
+      <w:proofErr w:type="gramEnd"/>
     </w:p>
     <w:p>
       <w:pPr>
@@ -2817,7 +3562,35 @@
         <w:rPr>
           <w:rFonts w:cs="Calibri"/>
         </w:rPr>
-        <w:t>Editing Exo -&gt; Transaction quantity will adjust line cost, line charge, line total, line total tax, line tax and linetotal incl tax in EXO</w:t>
+        <w:t xml:space="preserve">Editing Exo -&gt; Transaction quantity will adjust line cost, line charge, line total, line total tax, line tax and </w:t>
+      </w:r>
+      <w:proofErr w:type="spellStart"/>
+      <w:r>
+        <w:rPr>
+          <w:rFonts w:cs="Calibri"/>
+        </w:rPr>
+        <w:t>linetotal</w:t>
+      </w:r>
+      <w:proofErr w:type="spellEnd"/>
+      <w:r>
+        <w:rPr>
+          <w:rFonts w:cs="Calibri"/>
+        </w:rPr>
+        <w:t xml:space="preserve"> </w:t>
+      </w:r>
+      <w:proofErr w:type="spellStart"/>
+      <w:r>
+        <w:rPr>
+          <w:rFonts w:cs="Calibri"/>
+        </w:rPr>
+        <w:t>incl</w:t>
+      </w:r>
+      <w:proofErr w:type="spellEnd"/>
+      <w:r>
+        <w:rPr>
+          <w:rFonts w:cs="Calibri"/>
+        </w:rPr>
+        <w:t xml:space="preserve"> tax in EXO</w:t>
       </w:r>
     </w:p>
     <w:p>
@@ -2835,7 +3608,21 @@
         <w:rPr>
           <w:rFonts w:cs="Calibri"/>
         </w:rPr>
-        <w:t>narrative will be saved on day with hours so that when it’s approved the narrative will be transferred over</w:t>
+        <w:t xml:space="preserve">narrative will be saved on day with hours so that when </w:t>
+      </w:r>
+      <w:proofErr w:type="gramStart"/>
+      <w:r>
+        <w:rPr>
+          <w:rFonts w:cs="Calibri"/>
+        </w:rPr>
+        <w:t>it’s</w:t>
+      </w:r>
+      <w:proofErr w:type="gramEnd"/>
+      <w:r>
+        <w:rPr>
+          <w:rFonts w:cs="Calibri"/>
+        </w:rPr>
+        <w:t xml:space="preserve"> approved the narrative will be transferred over</w:t>
       </w:r>
     </w:p>
     <w:p>
@@ -2861,8 +3648,16 @@
         <w:rPr>
           <w:lang w:val="en-US"/>
         </w:rPr>
-        <w:t xml:space="preserve"> June 2020</w:t>
-      </w:r>
+        <w:t xml:space="preserve"> June </w:t>
+      </w:r>
+      <w:proofErr w:type="gramStart"/>
+      <w:r>
+        <w:rPr>
+          <w:lang w:val="en-US"/>
+        </w:rPr>
+        <w:t>2020</w:t>
+      </w:r>
+      <w:proofErr w:type="gramEnd"/>
     </w:p>
     <w:p>
       <w:pPr>
@@ -2897,8 +3692,16 @@
         <w:rPr>
           <w:lang w:val="en-US"/>
         </w:rPr>
-        <w:t>Highlight duplicate client number in red</w:t>
-      </w:r>
+        <w:t xml:space="preserve">Highlight duplicate client number in </w:t>
+      </w:r>
+      <w:proofErr w:type="gramStart"/>
+      <w:r>
+        <w:rPr>
+          <w:lang w:val="en-US"/>
+        </w:rPr>
+        <w:t>red</w:t>
+      </w:r>
+      <w:proofErr w:type="gramEnd"/>
     </w:p>
     <w:p>
       <w:pPr>
@@ -2915,8 +3718,16 @@
         <w:rPr>
           <w:lang w:val="en-US"/>
         </w:rPr>
-        <w:t>Book Time dialog loads faster for user that doesn’t have authority to book time for other users</w:t>
-      </w:r>
+        <w:t xml:space="preserve">Book Time dialog loads faster for user that doesn’t have authority to book time for other </w:t>
+      </w:r>
+      <w:proofErr w:type="gramStart"/>
+      <w:r>
+        <w:rPr>
+          <w:lang w:val="en-US"/>
+        </w:rPr>
+        <w:t>users</w:t>
+      </w:r>
+      <w:proofErr w:type="gramEnd"/>
     </w:p>
     <w:p>
       <w:pPr>
@@ -2954,8 +3765,16 @@
         <w:rPr>
           <w:lang w:val="en-US"/>
         </w:rPr>
-        <w:t xml:space="preserve"> June 2020</w:t>
-      </w:r>
+        <w:t xml:space="preserve"> June </w:t>
+      </w:r>
+      <w:proofErr w:type="gramStart"/>
+      <w:r>
+        <w:rPr>
+          <w:lang w:val="en-US"/>
+        </w:rPr>
+        <w:t>2020</w:t>
+      </w:r>
+      <w:proofErr w:type="gramEnd"/>
     </w:p>
     <w:p>
       <w:pPr>
@@ -2990,8 +3809,16 @@
         <w:rPr>
           <w:lang w:val="en-US"/>
         </w:rPr>
-        <w:t>Uncommitted values can only be entered on procurement jobs</w:t>
-      </w:r>
+        <w:t xml:space="preserve">Uncommitted values can only be entered on procurement </w:t>
+      </w:r>
+      <w:proofErr w:type="gramStart"/>
+      <w:r>
+        <w:rPr>
+          <w:lang w:val="en-US"/>
+        </w:rPr>
+        <w:t>jobs</w:t>
+      </w:r>
+      <w:proofErr w:type="gramEnd"/>
     </w:p>
     <w:p>
       <w:pPr>
@@ -3008,8 +3835,16 @@
         <w:rPr>
           <w:lang w:val="en-US"/>
         </w:rPr>
-        <w:t>Pasting uncommitted values on non-procurement jobs will show no results</w:t>
-      </w:r>
+        <w:t xml:space="preserve">Pasting uncommitted values on non-procurement jobs will show no </w:t>
+      </w:r>
+      <w:proofErr w:type="gramStart"/>
+      <w:r>
+        <w:rPr>
+          <w:lang w:val="en-US"/>
+        </w:rPr>
+        <w:t>results</w:t>
+      </w:r>
+      <w:proofErr w:type="gramEnd"/>
     </w:p>
     <w:p>
       <w:pPr>
@@ -3028,7 +3863,7 @@
           <w:lang w:val="en-US"/>
         </w:rPr>
       </w:pPr>
-      <w:hyperlink r:id="rId16" w:history="1">
+      <w:hyperlink r:id="rId17" w:history="1">
         <w:r>
           <w:rPr>
             <w:rStyle w:val="Hyperlink"/>
@@ -5070,6 +5905,118 @@
     </w:lvl>
   </w:abstractNum>
   <w:abstractNum w:abstractNumId="18" w15:restartNumberingAfterBreak="0">
+    <w:nsid w:val="3F573A8E"/>
+    <w:multiLevelType w:val="hybridMultilevel"/>
+    <w:tmpl w:val="6C6CD2D4"/>
+    <w:lvl w:ilvl="0" w:tplc="C62ABD4A">
+      <w:numFmt w:val="bullet"/>
+      <w:lvlText w:val="-"/>
+      <w:lvlJc w:val="left"/>
+      <w:pPr>
+        <w:ind w:left="720" w:hanging="360"/>
+      </w:pPr>
+      <w:rPr>
+        <w:rFonts w:ascii="Calibri" w:eastAsiaTheme="minorEastAsia" w:hAnsi="Calibri" w:cs="Calibri" w:hint="default"/>
+      </w:rPr>
+    </w:lvl>
+    <w:lvl w:ilvl="1" w:tplc="44090003">
+      <w:start w:val="1"/>
+      <w:numFmt w:val="bullet"/>
+      <w:lvlText w:val="o"/>
+      <w:lvlJc w:val="left"/>
+      <w:pPr>
+        <w:ind w:left="1440" w:hanging="360"/>
+      </w:pPr>
+      <w:rPr>
+        <w:rFonts w:ascii="Courier New" w:hAnsi="Courier New" w:cs="Courier New" w:hint="default"/>
+      </w:rPr>
+    </w:lvl>
+    <w:lvl w:ilvl="2" w:tplc="44090005">
+      <w:start w:val="1"/>
+      <w:numFmt w:val="bullet"/>
+      <w:lvlText w:val=""/>
+      <w:lvlJc w:val="left"/>
+      <w:pPr>
+        <w:ind w:left="2160" w:hanging="360"/>
+      </w:pPr>
+      <w:rPr>
+        <w:rFonts w:ascii="Wingdings" w:hAnsi="Wingdings" w:hint="default"/>
+      </w:rPr>
+    </w:lvl>
+    <w:lvl w:ilvl="3" w:tplc="44090001" w:tentative="1">
+      <w:start w:val="1"/>
+      <w:numFmt w:val="bullet"/>
+      <w:lvlText w:val=""/>
+      <w:lvlJc w:val="left"/>
+      <w:pPr>
+        <w:ind w:left="2880" w:hanging="360"/>
+      </w:pPr>
+      <w:rPr>
+        <w:rFonts w:ascii="Symbol" w:hAnsi="Symbol" w:hint="default"/>
+      </w:rPr>
+    </w:lvl>
+    <w:lvl w:ilvl="4" w:tplc="44090003" w:tentative="1">
+      <w:start w:val="1"/>
+      <w:numFmt w:val="bullet"/>
+      <w:lvlText w:val="o"/>
+      <w:lvlJc w:val="left"/>
+      <w:pPr>
+        <w:ind w:left="3600" w:hanging="360"/>
+      </w:pPr>
+      <w:rPr>
+        <w:rFonts w:ascii="Courier New" w:hAnsi="Courier New" w:cs="Courier New" w:hint="default"/>
+      </w:rPr>
+    </w:lvl>
+    <w:lvl w:ilvl="5" w:tplc="44090005" w:tentative="1">
+      <w:start w:val="1"/>
+      <w:numFmt w:val="bullet"/>
+      <w:lvlText w:val=""/>
+      <w:lvlJc w:val="left"/>
+      <w:pPr>
+        <w:ind w:left="4320" w:hanging="360"/>
+      </w:pPr>
+      <w:rPr>
+        <w:rFonts w:ascii="Wingdings" w:hAnsi="Wingdings" w:hint="default"/>
+      </w:rPr>
+    </w:lvl>
+    <w:lvl w:ilvl="6" w:tplc="44090001" w:tentative="1">
+      <w:start w:val="1"/>
+      <w:numFmt w:val="bullet"/>
+      <w:lvlText w:val=""/>
+      <w:lvlJc w:val="left"/>
+      <w:pPr>
+        <w:ind w:left="5040" w:hanging="360"/>
+      </w:pPr>
+      <w:rPr>
+        <w:rFonts w:ascii="Symbol" w:hAnsi="Symbol" w:hint="default"/>
+      </w:rPr>
+    </w:lvl>
+    <w:lvl w:ilvl="7" w:tplc="44090003" w:tentative="1">
+      <w:start w:val="1"/>
+      <w:numFmt w:val="bullet"/>
+      <w:lvlText w:val="o"/>
+      <w:lvlJc w:val="left"/>
+      <w:pPr>
+        <w:ind w:left="5760" w:hanging="360"/>
+      </w:pPr>
+      <w:rPr>
+        <w:rFonts w:ascii="Courier New" w:hAnsi="Courier New" w:cs="Courier New" w:hint="default"/>
+      </w:rPr>
+    </w:lvl>
+    <w:lvl w:ilvl="8" w:tplc="44090005" w:tentative="1">
+      <w:start w:val="1"/>
+      <w:numFmt w:val="bullet"/>
+      <w:lvlText w:val=""/>
+      <w:lvlJc w:val="left"/>
+      <w:pPr>
+        <w:ind w:left="6480" w:hanging="360"/>
+      </w:pPr>
+      <w:rPr>
+        <w:rFonts w:ascii="Wingdings" w:hAnsi="Wingdings" w:hint="default"/>
+      </w:rPr>
+    </w:lvl>
+  </w:abstractNum>
+  <w:abstractNum w:abstractNumId="19" w15:restartNumberingAfterBreak="0">
     <w:nsid w:val="4691596C"/>
     <w:multiLevelType w:val="hybridMultilevel"/>
     <w:tmpl w:val="ECEEF302"/>
@@ -5181,7 +6128,7 @@
       </w:rPr>
     </w:lvl>
   </w:abstractNum>
-  <w:abstractNum w:abstractNumId="19" w15:restartNumberingAfterBreak="0">
+  <w:abstractNum w:abstractNumId="20" w15:restartNumberingAfterBreak="0">
     <w:nsid w:val="47F951B0"/>
     <w:multiLevelType w:val="multilevel"/>
     <w:tmpl w:val="00D8A7E8"/>
@@ -5267,7 +6214,7 @@
       </w:pPr>
     </w:lvl>
   </w:abstractNum>
-  <w:abstractNum w:abstractNumId="20" w15:restartNumberingAfterBreak="0">
+  <w:abstractNum w:abstractNumId="21" w15:restartNumberingAfterBreak="0">
     <w:nsid w:val="4A9D1EBF"/>
     <w:multiLevelType w:val="hybridMultilevel"/>
     <w:tmpl w:val="3DEACDCC"/>
@@ -5379,7 +6326,7 @@
       </w:rPr>
     </w:lvl>
   </w:abstractNum>
-  <w:abstractNum w:abstractNumId="21" w15:restartNumberingAfterBreak="0">
+  <w:abstractNum w:abstractNumId="22" w15:restartNumberingAfterBreak="0">
     <w:nsid w:val="4D6E34D5"/>
     <w:multiLevelType w:val="hybridMultilevel"/>
     <w:tmpl w:val="6BC866D0"/>
@@ -5491,7 +6438,7 @@
       </w:rPr>
     </w:lvl>
   </w:abstractNum>
-  <w:abstractNum w:abstractNumId="22" w15:restartNumberingAfterBreak="0">
+  <w:abstractNum w:abstractNumId="23" w15:restartNumberingAfterBreak="0">
     <w:nsid w:val="52606647"/>
     <w:multiLevelType w:val="hybridMultilevel"/>
     <w:tmpl w:val="34FAD1A0"/>
@@ -5603,7 +6550,7 @@
       </w:rPr>
     </w:lvl>
   </w:abstractNum>
-  <w:abstractNum w:abstractNumId="23" w15:restartNumberingAfterBreak="0">
+  <w:abstractNum w:abstractNumId="24" w15:restartNumberingAfterBreak="0">
     <w:nsid w:val="557D5C95"/>
     <w:multiLevelType w:val="hybridMultilevel"/>
     <w:tmpl w:val="DC122E1C"/>
@@ -5715,7 +6662,7 @@
       </w:rPr>
     </w:lvl>
   </w:abstractNum>
-  <w:abstractNum w:abstractNumId="24" w15:restartNumberingAfterBreak="0">
+  <w:abstractNum w:abstractNumId="25" w15:restartNumberingAfterBreak="0">
     <w:nsid w:val="589D37B7"/>
     <w:multiLevelType w:val="hybridMultilevel"/>
     <w:tmpl w:val="9262429A"/>
@@ -5827,7 +6774,7 @@
       </w:rPr>
     </w:lvl>
   </w:abstractNum>
-  <w:abstractNum w:abstractNumId="25" w15:restartNumberingAfterBreak="0">
+  <w:abstractNum w:abstractNumId="26" w15:restartNumberingAfterBreak="0">
     <w:nsid w:val="58AA443D"/>
     <w:multiLevelType w:val="hybridMultilevel"/>
     <w:tmpl w:val="56F0D18E"/>
@@ -5940,7 +6887,7 @@
       </w:rPr>
     </w:lvl>
   </w:abstractNum>
-  <w:abstractNum w:abstractNumId="26" w15:restartNumberingAfterBreak="0">
+  <w:abstractNum w:abstractNumId="27" w15:restartNumberingAfterBreak="0">
     <w:nsid w:val="5B4B0EE2"/>
     <w:multiLevelType w:val="hybridMultilevel"/>
     <w:tmpl w:val="E8129FD8"/>
@@ -6052,7 +6999,7 @@
       </w:rPr>
     </w:lvl>
   </w:abstractNum>
-  <w:abstractNum w:abstractNumId="27" w15:restartNumberingAfterBreak="0">
+  <w:abstractNum w:abstractNumId="28" w15:restartNumberingAfterBreak="0">
     <w:nsid w:val="5C8347BF"/>
     <w:multiLevelType w:val="hybridMultilevel"/>
     <w:tmpl w:val="D2F46B88"/>
@@ -6164,7 +7111,7 @@
       </w:rPr>
     </w:lvl>
   </w:abstractNum>
-  <w:abstractNum w:abstractNumId="28" w15:restartNumberingAfterBreak="0">
+  <w:abstractNum w:abstractNumId="29" w15:restartNumberingAfterBreak="0">
     <w:nsid w:val="6A047A76"/>
     <w:multiLevelType w:val="hybridMultilevel"/>
     <w:tmpl w:val="50CADEB2"/>
@@ -6276,7 +7223,7 @@
       </w:rPr>
     </w:lvl>
   </w:abstractNum>
-  <w:abstractNum w:abstractNumId="29" w15:restartNumberingAfterBreak="0">
+  <w:abstractNum w:abstractNumId="30" w15:restartNumberingAfterBreak="0">
     <w:nsid w:val="6A3A0B6E"/>
     <w:multiLevelType w:val="hybridMultilevel"/>
     <w:tmpl w:val="759C482E"/>
@@ -6388,7 +7335,7 @@
       </w:rPr>
     </w:lvl>
   </w:abstractNum>
-  <w:abstractNum w:abstractNumId="30" w15:restartNumberingAfterBreak="0">
+  <w:abstractNum w:abstractNumId="31" w15:restartNumberingAfterBreak="0">
     <w:nsid w:val="6AC268F7"/>
     <w:multiLevelType w:val="hybridMultilevel"/>
     <w:tmpl w:val="12F21194"/>
@@ -6500,7 +7447,7 @@
       </w:rPr>
     </w:lvl>
   </w:abstractNum>
-  <w:abstractNum w:abstractNumId="31" w15:restartNumberingAfterBreak="0">
+  <w:abstractNum w:abstractNumId="32" w15:restartNumberingAfterBreak="0">
     <w:nsid w:val="6CE7392E"/>
     <w:multiLevelType w:val="hybridMultilevel"/>
     <w:tmpl w:val="2E2C9BDE"/>
@@ -6612,7 +7559,7 @@
       </w:rPr>
     </w:lvl>
   </w:abstractNum>
-  <w:abstractNum w:abstractNumId="32" w15:restartNumberingAfterBreak="0">
+  <w:abstractNum w:abstractNumId="33" w15:restartNumberingAfterBreak="0">
     <w:nsid w:val="6E3F3F9F"/>
     <w:multiLevelType w:val="hybridMultilevel"/>
     <w:tmpl w:val="A13CFC48"/>
@@ -6724,7 +7671,7 @@
       </w:rPr>
     </w:lvl>
   </w:abstractNum>
-  <w:abstractNum w:abstractNumId="33" w15:restartNumberingAfterBreak="0">
+  <w:abstractNum w:abstractNumId="34" w15:restartNumberingAfterBreak="0">
     <w:nsid w:val="7D5B508C"/>
     <w:multiLevelType w:val="hybridMultilevel"/>
     <w:tmpl w:val="7FAC5656"/>
@@ -6838,49 +7785,49 @@
     </w:lvl>
   </w:abstractNum>
   <w:num w:numId="1">
-    <w:abstractNumId w:val="19"/>
+    <w:abstractNumId w:val="20"/>
   </w:num>
   <w:num w:numId="2">
     <w:abstractNumId w:val="14"/>
   </w:num>
   <w:num w:numId="3">
-    <w:abstractNumId w:val="21"/>
+    <w:abstractNumId w:val="22"/>
   </w:num>
   <w:num w:numId="4">
     <w:abstractNumId w:val="2"/>
   </w:num>
   <w:num w:numId="5">
-    <w:abstractNumId w:val="27"/>
+    <w:abstractNumId w:val="28"/>
   </w:num>
   <w:num w:numId="6">
-    <w:abstractNumId w:val="24"/>
+    <w:abstractNumId w:val="25"/>
   </w:num>
   <w:num w:numId="7">
     <w:abstractNumId w:val="9"/>
   </w:num>
   <w:num w:numId="8">
-    <w:abstractNumId w:val="22"/>
+    <w:abstractNumId w:val="23"/>
   </w:num>
   <w:num w:numId="9">
     <w:abstractNumId w:val="12"/>
   </w:num>
   <w:num w:numId="10">
-    <w:abstractNumId w:val="23"/>
+    <w:abstractNumId w:val="24"/>
   </w:num>
   <w:num w:numId="11">
-    <w:abstractNumId w:val="25"/>
+    <w:abstractNumId w:val="26"/>
   </w:num>
   <w:num w:numId="12">
-    <w:abstractNumId w:val="18"/>
+    <w:abstractNumId w:val="19"/>
   </w:num>
   <w:num w:numId="13">
-    <w:abstractNumId w:val="33"/>
+    <w:abstractNumId w:val="34"/>
   </w:num>
   <w:num w:numId="14">
     <w:abstractNumId w:val="16"/>
   </w:num>
   <w:num w:numId="15">
-    <w:abstractNumId w:val="30"/>
+    <w:abstractNumId w:val="31"/>
   </w:num>
   <w:num w:numId="16">
     <w:abstractNumId w:val="3"/>
@@ -6901,10 +7848,10 @@
     <w:abstractNumId w:val="1"/>
   </w:num>
   <w:num w:numId="22">
-    <w:abstractNumId w:val="28"/>
+    <w:abstractNumId w:val="29"/>
   </w:num>
   <w:num w:numId="23">
-    <w:abstractNumId w:val="31"/>
+    <w:abstractNumId w:val="32"/>
   </w:num>
   <w:num w:numId="24">
     <w:abstractNumId w:val="8"/>
@@ -6916,10 +7863,10 @@
     <w:abstractNumId w:val="4"/>
   </w:num>
   <w:num w:numId="27">
-    <w:abstractNumId w:val="26"/>
+    <w:abstractNumId w:val="27"/>
   </w:num>
   <w:num w:numId="28">
-    <w:abstractNumId w:val="20"/>
+    <w:abstractNumId w:val="21"/>
   </w:num>
   <w:num w:numId="29">
     <w:abstractNumId w:val="11"/>
@@ -6931,13 +7878,16 @@
     <w:abstractNumId w:val="15"/>
   </w:num>
   <w:num w:numId="32">
-    <w:abstractNumId w:val="29"/>
+    <w:abstractNumId w:val="30"/>
   </w:num>
   <w:num w:numId="33">
-    <w:abstractNumId w:val="32"/>
+    <w:abstractNumId w:val="33"/>
   </w:num>
   <w:num w:numId="34">
     <w:abstractNumId w:val="17"/>
+  </w:num>
+  <w:num w:numId="35">
+    <w:abstractNumId w:val="18"/>
   </w:num>
 </w:numbering>
 </file>

</xml_diff>

<commit_message>
- remove ribbon caption - update changelog
</commit_message>
<xml_diff>
--- a/BluePrints/Views/ChangeLog.docx
+++ b/BluePrints/Views/ChangeLog.docx
@@ -2,6 +2,482 @@
 <file path=word/document.xml><?xml version="1.0" encoding="utf-8"?>
 <w:document xmlns:wpc="http://schemas.microsoft.com/office/word/2010/wordprocessingCanvas" xmlns:cx="http://schemas.microsoft.com/office/drawing/2014/chartex" xmlns:cx1="http://schemas.microsoft.com/office/drawing/2015/9/8/chartex" xmlns:cx2="http://schemas.microsoft.com/office/drawing/2015/10/21/chartex" xmlns:cx3="http://schemas.microsoft.com/office/drawing/2016/5/9/chartex" xmlns:cx4="http://schemas.microsoft.com/office/drawing/2016/5/10/chartex" xmlns:cx5="http://schemas.microsoft.com/office/drawing/2016/5/11/chartex" xmlns:cx6="http://schemas.microsoft.com/office/drawing/2016/5/12/chartex" xmlns:cx7="http://schemas.microsoft.com/office/drawing/2016/5/13/chartex" xmlns:cx8="http://schemas.microsoft.com/office/drawing/2016/5/14/chartex" xmlns:mc="http://schemas.openxmlformats.org/markup-compatibility/2006" xmlns:aink="http://schemas.microsoft.com/office/drawing/2016/ink" xmlns:am3d="http://schemas.microsoft.com/office/drawing/2017/model3d" xmlns:o="urn:schemas-microsoft-com:office:office" xmlns:r="http://schemas.openxmlformats.org/officeDocument/2006/relationships" xmlns:m="http://schemas.openxmlformats.org/officeDocument/2006/math" xmlns:v="urn:schemas-microsoft-com:vml" xmlns:wp14="http://schemas.microsoft.com/office/word/2010/wordprocessingDrawing" xmlns:wp="http://schemas.openxmlformats.org/drawingml/2006/wordprocessingDrawing" xmlns:w10="urn:schemas-microsoft-com:office:word" xmlns:w="http://schemas.openxmlformats.org/wordprocessingml/2006/main" xmlns:w14="http://schemas.microsoft.com/office/word/2010/wordml" xmlns:w15="http://schemas.microsoft.com/office/word/2012/wordml" xmlns:w16cex="http://schemas.microsoft.com/office/word/2018/wordml/cex" xmlns:w16cid="http://schemas.microsoft.com/office/word/2016/wordml/cid" xmlns:w16="http://schemas.microsoft.com/office/word/2018/wordml" xmlns:w16se="http://schemas.microsoft.com/office/word/2015/wordml/symex" xmlns:wpg="http://schemas.microsoft.com/office/word/2010/wordprocessingGroup" xmlns:wpi="http://schemas.microsoft.com/office/word/2010/wordprocessingInk" xmlns:wne="http://schemas.microsoft.com/office/word/2006/wordml" xmlns:wps="http://schemas.microsoft.com/office/word/2010/wordprocessingShape" mc:Ignorable="w14 w15 w16se w16cid w16 w16cex wp14">
   <w:body>
+    <w:p>
+      <w:pPr>
+        <w:rPr>
+          <w:lang w:val="en-US"/>
+        </w:rPr>
+      </w:pPr>
+      <w:r>
+        <w:rPr>
+          <w:lang w:val="en-US"/>
+        </w:rPr>
+        <w:t>Change Log 8</w:t>
+      </w:r>
+      <w:r>
+        <w:rPr>
+          <w:vertAlign w:val="superscript"/>
+          <w:lang w:val="en-US"/>
+        </w:rPr>
+        <w:t>th</w:t>
+      </w:r>
+      <w:r>
+        <w:rPr>
+          <w:lang w:val="en-US"/>
+        </w:rPr>
+        <w:t xml:space="preserve"> Feb </w:t>
+      </w:r>
+      <w:proofErr w:type="gramStart"/>
+      <w:r>
+        <w:rPr>
+          <w:lang w:val="en-US"/>
+        </w:rPr>
+        <w:t>2021</w:t>
+      </w:r>
+      <w:proofErr w:type="gramEnd"/>
+    </w:p>
+    <w:p>
+      <w:pPr>
+        <w:pStyle w:val="ListParagraph"/>
+        <w:numPr>
+          <w:ilvl w:val="0"/>
+          <w:numId w:val="36"/>
+        </w:numPr>
+        <w:rPr>
+          <w:lang w:val="en-US"/>
+        </w:rPr>
+      </w:pPr>
+      <w:r>
+        <w:rPr>
+          <w:lang w:val="en-US"/>
+        </w:rPr>
+        <w:t>Design -&gt; Variation</w:t>
+      </w:r>
+    </w:p>
+    <w:p>
+      <w:pPr>
+        <w:pStyle w:val="ListParagraph"/>
+        <w:numPr>
+          <w:ilvl w:val="1"/>
+          <w:numId w:val="36"/>
+        </w:numPr>
+        <w:rPr>
+          <w:lang w:val="en-US"/>
+        </w:rPr>
+      </w:pPr>
+      <w:r>
+        <w:rPr>
+          <w:lang w:val="en-US"/>
+        </w:rPr>
+        <w:t xml:space="preserve">Added ability to auto reduce earned hours from latest date onwards to accommodate negative variation </w:t>
+      </w:r>
+      <w:proofErr w:type="gramStart"/>
+      <w:r>
+        <w:rPr>
+          <w:lang w:val="en-US"/>
+        </w:rPr>
+        <w:t>hours</w:t>
+      </w:r>
+      <w:proofErr w:type="gramEnd"/>
+    </w:p>
+    <w:p>
+      <w:pPr>
+        <w:pStyle w:val="ListParagraph"/>
+        <w:ind w:left="1440"/>
+        <w:rPr>
+          <w:lang w:val="en-US"/>
+        </w:rPr>
+      </w:pPr>
+      <w:r>
+        <w:rPr>
+          <w:noProof/>
+          <w:lang w:val="en-US"/>
+        </w:rPr>
+        <w:drawing>
+          <wp:inline distT="0" distB="0" distL="0" distR="0" wp14:anchorId="4C048616" wp14:editId="0F04B790">
+            <wp:extent cx="5730875" cy="3870325"/>
+            <wp:effectExtent l="0" t="0" r="3175" b="0"/>
+            <wp:docPr id="10" name="Picture 10"/>
+            <wp:cNvGraphicFramePr>
+              <a:graphicFrameLocks xmlns:a="http://schemas.openxmlformats.org/drawingml/2006/main" noChangeAspect="1"/>
+            </wp:cNvGraphicFramePr>
+            <a:graphic xmlns:a="http://schemas.openxmlformats.org/drawingml/2006/main">
+              <a:graphicData uri="http://schemas.openxmlformats.org/drawingml/2006/picture">
+                <pic:pic xmlns:pic="http://schemas.openxmlformats.org/drawingml/2006/picture">
+                  <pic:nvPicPr>
+                    <pic:cNvPr id="0" name="Picture 1"/>
+                    <pic:cNvPicPr>
+                      <a:picLocks noChangeAspect="1" noChangeArrowheads="1"/>
+                    </pic:cNvPicPr>
+                  </pic:nvPicPr>
+                  <pic:blipFill>
+                    <a:blip r:embed="rId5">
+                      <a:extLst>
+                        <a:ext uri="{28A0092B-C50C-407E-A947-70E740481C1C}">
+                          <a14:useLocalDpi xmlns:a14="http://schemas.microsoft.com/office/drawing/2010/main" val="0"/>
+                        </a:ext>
+                      </a:extLst>
+                    </a:blip>
+                    <a:srcRect/>
+                    <a:stretch>
+                      <a:fillRect/>
+                    </a:stretch>
+                  </pic:blipFill>
+                  <pic:spPr bwMode="auto">
+                    <a:xfrm>
+                      <a:off x="0" y="0"/>
+                      <a:ext cx="5730875" cy="3870325"/>
+                    </a:xfrm>
+                    <a:prstGeom prst="rect">
+                      <a:avLst/>
+                    </a:prstGeom>
+                    <a:noFill/>
+                    <a:ln>
+                      <a:noFill/>
+                    </a:ln>
+                  </pic:spPr>
+                </pic:pic>
+              </a:graphicData>
+            </a:graphic>
+          </wp:inline>
+        </w:drawing>
+      </w:r>
+    </w:p>
+    <w:p>
+      <w:pPr>
+        <w:ind w:left="1440"/>
+        <w:rPr>
+          <w:lang w:val="en-US"/>
+        </w:rPr>
+      </w:pPr>
+      <w:r>
+        <w:rPr>
+          <w:lang w:val="en-US"/>
+        </w:rPr>
+        <w:t xml:space="preserve">In this instance, deliverable have 100 total hours and 50 hours already earned, but variation defines a 75 </w:t>
+      </w:r>
+      <w:proofErr w:type="gramStart"/>
+      <w:r>
+        <w:rPr>
+          <w:lang w:val="en-US"/>
+        </w:rPr>
+        <w:t>hours</w:t>
+      </w:r>
+      <w:proofErr w:type="gramEnd"/>
+      <w:r>
+        <w:rPr>
+          <w:lang w:val="en-US"/>
+        </w:rPr>
+        <w:t xml:space="preserve"> reduction, two options are available during approval</w:t>
+      </w:r>
+    </w:p>
+    <w:p>
+      <w:pPr>
+        <w:pStyle w:val="ListParagraph"/>
+        <w:numPr>
+          <w:ilvl w:val="2"/>
+          <w:numId w:val="36"/>
+        </w:numPr>
+        <w:rPr>
+          <w:lang w:val="en-US"/>
+        </w:rPr>
+      </w:pPr>
+      <w:r>
+        <w:rPr>
+          <w:lang w:val="en-US"/>
+        </w:rPr>
+        <w:t xml:space="preserve">Reduce earned hours ticked – Earned units will be reduced to 25 so that 75 hours reduction can be </w:t>
+      </w:r>
+      <w:proofErr w:type="gramStart"/>
+      <w:r>
+        <w:rPr>
+          <w:lang w:val="en-US"/>
+        </w:rPr>
+        <w:t>applied</w:t>
+      </w:r>
+      <w:proofErr w:type="gramEnd"/>
+    </w:p>
+    <w:p>
+      <w:pPr>
+        <w:pStyle w:val="ListParagraph"/>
+        <w:numPr>
+          <w:ilvl w:val="2"/>
+          <w:numId w:val="36"/>
+        </w:numPr>
+        <w:rPr>
+          <w:lang w:val="en-US"/>
+        </w:rPr>
+      </w:pPr>
+      <w:r>
+        <w:rPr>
+          <w:lang w:val="en-US"/>
+        </w:rPr>
+        <w:t xml:space="preserve">Reduce earned hours not ticked – Variation hours will be changed to 50 hours reduction instead of 75, as defined by maximum reducible units </w:t>
+      </w:r>
+      <w:proofErr w:type="gramStart"/>
+      <w:r>
+        <w:rPr>
+          <w:lang w:val="en-US"/>
+        </w:rPr>
+        <w:t>column</w:t>
+      </w:r>
+      <w:proofErr w:type="gramEnd"/>
+    </w:p>
+    <w:p>
+      <w:pPr>
+        <w:rPr>
+          <w:lang w:val="en-US"/>
+        </w:rPr>
+      </w:pPr>
+      <w:r>
+        <w:rPr>
+          <w:lang w:val="en-US"/>
+        </w:rPr>
+        <w:br w:type="page"/>
+      </w:r>
+    </w:p>
+    <w:p>
+      <w:pPr>
+        <w:rPr>
+          <w:lang w:val="en-US"/>
+        </w:rPr>
+      </w:pPr>
+      <w:r>
+        <w:rPr>
+          <w:lang w:val="en-US"/>
+        </w:rPr>
+        <w:lastRenderedPageBreak/>
+        <w:t>Cont. Change Log 8</w:t>
+      </w:r>
+      <w:r>
+        <w:rPr>
+          <w:vertAlign w:val="superscript"/>
+          <w:lang w:val="en-US"/>
+        </w:rPr>
+        <w:t>th</w:t>
+      </w:r>
+      <w:r>
+        <w:rPr>
+          <w:lang w:val="en-US"/>
+        </w:rPr>
+        <w:t xml:space="preserve"> Feb 2021</w:t>
+      </w:r>
+    </w:p>
+    <w:p>
+      <w:pPr>
+        <w:pStyle w:val="ListParagraph"/>
+        <w:numPr>
+          <w:ilvl w:val="1"/>
+          <w:numId w:val="36"/>
+        </w:numPr>
+        <w:rPr>
+          <w:lang w:val="en-US"/>
+        </w:rPr>
+      </w:pPr>
+      <w:r>
+        <w:rPr>
+          <w:lang w:val="en-US"/>
+        </w:rPr>
+        <w:t xml:space="preserve">Added ability to reduce earned units when variations are </w:t>
+      </w:r>
+      <w:proofErr w:type="gramStart"/>
+      <w:r>
+        <w:rPr>
+          <w:lang w:val="en-US"/>
+        </w:rPr>
+        <w:t>unapproved</w:t>
+      </w:r>
+      <w:proofErr w:type="gramEnd"/>
+    </w:p>
+    <w:p>
+      <w:pPr>
+        <w:pStyle w:val="ListParagraph"/>
+        <w:ind w:left="1440"/>
+        <w:rPr>
+          <w:lang w:val="en-US"/>
+        </w:rPr>
+      </w:pPr>
+      <w:r>
+        <w:rPr>
+          <w:noProof/>
+          <w:lang w:val="en-US"/>
+        </w:rPr>
+        <w:drawing>
+          <wp:inline distT="0" distB="0" distL="0" distR="0" wp14:anchorId="2674E29E" wp14:editId="0A9EBCC1">
+            <wp:extent cx="5730875" cy="3870325"/>
+            <wp:effectExtent l="0" t="0" r="3175" b="0"/>
+            <wp:docPr id="11" name="Picture 11"/>
+            <wp:cNvGraphicFramePr>
+              <a:graphicFrameLocks xmlns:a="http://schemas.openxmlformats.org/drawingml/2006/main" noChangeAspect="1"/>
+            </wp:cNvGraphicFramePr>
+            <a:graphic xmlns:a="http://schemas.openxmlformats.org/drawingml/2006/main">
+              <a:graphicData uri="http://schemas.openxmlformats.org/drawingml/2006/picture">
+                <pic:pic xmlns:pic="http://schemas.openxmlformats.org/drawingml/2006/picture">
+                  <pic:nvPicPr>
+                    <pic:cNvPr id="0" name="Picture 2"/>
+                    <pic:cNvPicPr>
+                      <a:picLocks noChangeAspect="1" noChangeArrowheads="1"/>
+                    </pic:cNvPicPr>
+                  </pic:nvPicPr>
+                  <pic:blipFill>
+                    <a:blip r:embed="rId6">
+                      <a:extLst>
+                        <a:ext uri="{28A0092B-C50C-407E-A947-70E740481C1C}">
+                          <a14:useLocalDpi xmlns:a14="http://schemas.microsoft.com/office/drawing/2010/main" val="0"/>
+                        </a:ext>
+                      </a:extLst>
+                    </a:blip>
+                    <a:srcRect/>
+                    <a:stretch>
+                      <a:fillRect/>
+                    </a:stretch>
+                  </pic:blipFill>
+                  <pic:spPr bwMode="auto">
+                    <a:xfrm>
+                      <a:off x="0" y="0"/>
+                      <a:ext cx="5730875" cy="3870325"/>
+                    </a:xfrm>
+                    <a:prstGeom prst="rect">
+                      <a:avLst/>
+                    </a:prstGeom>
+                    <a:noFill/>
+                    <a:ln>
+                      <a:noFill/>
+                    </a:ln>
+                  </pic:spPr>
+                </pic:pic>
+              </a:graphicData>
+            </a:graphic>
+          </wp:inline>
+        </w:drawing>
+      </w:r>
+    </w:p>
+    <w:p>
+      <w:pPr>
+        <w:pStyle w:val="ListParagraph"/>
+        <w:ind w:left="1440"/>
+        <w:rPr>
+          <w:lang w:val="en-US"/>
+        </w:rPr>
+      </w:pPr>
+      <w:r>
+        <w:rPr>
+          <w:lang w:val="en-US"/>
+        </w:rPr>
+        <w:t xml:space="preserve">For instance, a variation that was previously approved with 100 hours is now in the process of </w:t>
+      </w:r>
+      <w:proofErr w:type="spellStart"/>
+      <w:r>
+        <w:rPr>
+          <w:lang w:val="en-US"/>
+        </w:rPr>
+        <w:t>unapproval</w:t>
+      </w:r>
+      <w:proofErr w:type="spellEnd"/>
+      <w:r>
+        <w:rPr>
+          <w:lang w:val="en-US"/>
+        </w:rPr>
+        <w:t xml:space="preserve">. </w:t>
+      </w:r>
+      <w:proofErr w:type="gramStart"/>
+      <w:r>
+        <w:rPr>
+          <w:lang w:val="en-US"/>
+        </w:rPr>
+        <w:t>Since</w:t>
+      </w:r>
+      <w:proofErr w:type="gramEnd"/>
+      <w:r>
+        <w:rPr>
+          <w:lang w:val="en-US"/>
+        </w:rPr>
+        <w:t xml:space="preserve"> 50 hours has already been earned, 2 options are available during </w:t>
+      </w:r>
+      <w:proofErr w:type="spellStart"/>
+      <w:r>
+        <w:rPr>
+          <w:lang w:val="en-US"/>
+        </w:rPr>
+        <w:t>unapproval</w:t>
+      </w:r>
+      <w:proofErr w:type="spellEnd"/>
+    </w:p>
+    <w:p>
+      <w:pPr>
+        <w:pStyle w:val="ListParagraph"/>
+        <w:numPr>
+          <w:ilvl w:val="0"/>
+          <w:numId w:val="37"/>
+        </w:numPr>
+        <w:rPr>
+          <w:lang w:val="en-US"/>
+        </w:rPr>
+      </w:pPr>
+      <w:r>
+        <w:rPr>
+          <w:lang w:val="en-US"/>
+        </w:rPr>
+        <w:t xml:space="preserve">Reduce earned hours ticked – Earned units will be reduced to 0 so that </w:t>
+      </w:r>
+      <w:proofErr w:type="spellStart"/>
+      <w:r>
+        <w:rPr>
+          <w:lang w:val="en-US"/>
+        </w:rPr>
+        <w:t>unapproval</w:t>
+      </w:r>
+      <w:proofErr w:type="spellEnd"/>
+      <w:r>
+        <w:rPr>
+          <w:lang w:val="en-US"/>
+        </w:rPr>
+        <w:t xml:space="preserve"> with 100 hours taken away from the deliverable can take </w:t>
+      </w:r>
+      <w:proofErr w:type="gramStart"/>
+      <w:r>
+        <w:rPr>
+          <w:lang w:val="en-US"/>
+        </w:rPr>
+        <w:t>place</w:t>
+      </w:r>
+      <w:proofErr w:type="gramEnd"/>
+    </w:p>
+    <w:p>
+      <w:pPr>
+        <w:pStyle w:val="ListParagraph"/>
+        <w:numPr>
+          <w:ilvl w:val="0"/>
+          <w:numId w:val="37"/>
+        </w:numPr>
+        <w:rPr>
+          <w:lang w:val="en-US"/>
+        </w:rPr>
+      </w:pPr>
+      <w:r>
+        <w:rPr>
+          <w:lang w:val="en-US"/>
+        </w:rPr>
+        <w:t xml:space="preserve">Reduce earned hours unticked – Earned units will not be reduced, but user will see negative 100 hours remaining in </w:t>
+      </w:r>
+      <w:proofErr w:type="gramStart"/>
+      <w:r>
+        <w:rPr>
+          <w:lang w:val="en-US"/>
+        </w:rPr>
+        <w:t>progress</w:t>
+      </w:r>
+      <w:proofErr w:type="gramEnd"/>
+    </w:p>
+    <w:p>
+      <w:pPr>
+        <w:pStyle w:val="ListParagraph"/>
+        <w:ind w:left="2160"/>
+        <w:rPr>
+          <w:lang w:val="en-US"/>
+        </w:rPr>
+      </w:pPr>
+    </w:p>
     <w:p>
       <w:pPr>
         <w:rPr>
@@ -111,7 +587,7 @@
                     </pic:cNvPicPr>
                   </pic:nvPicPr>
                   <pic:blipFill>
-                    <a:blip r:embed="rId5">
+                    <a:blip r:embed="rId7">
                       <a:extLst>
                         <a:ext uri="{28A0092B-C50C-407E-A947-70E740481C1C}">
                           <a14:useLocalDpi xmlns:a14="http://schemas.microsoft.com/office/drawing/2010/main" val="0"/>
@@ -153,6 +629,20 @@
         <w:rPr>
           <w:lang w:val="en-US"/>
         </w:rPr>
+        <w:br w:type="page"/>
+      </w:r>
+    </w:p>
+    <w:p>
+      <w:pPr>
+        <w:rPr>
+          <w:lang w:val="en-US"/>
+        </w:rPr>
+      </w:pPr>
+      <w:r>
+        <w:rPr>
+          <w:lang w:val="en-US"/>
+        </w:rPr>
+        <w:lastRenderedPageBreak/>
         <w:t>Change Log 25</w:t>
       </w:r>
       <w:r>
@@ -278,7 +768,7 @@
                     </pic:cNvPicPr>
                   </pic:nvPicPr>
                   <pic:blipFill>
-                    <a:blip r:embed="rId6">
+                    <a:blip r:embed="rId8">
                       <a:extLst>
                         <a:ext uri="{28A0092B-C50C-407E-A947-70E740481C1C}">
                           <a14:useLocalDpi xmlns:a14="http://schemas.microsoft.com/office/drawing/2010/main" val="0"/>
@@ -385,7 +875,7 @@
                     </pic:cNvPicPr>
                   </pic:nvPicPr>
                   <pic:blipFill>
-                    <a:blip r:embed="rId7">
+                    <a:blip r:embed="rId9">
                       <a:extLst>
                         <a:ext uri="{28A0092B-C50C-407E-A947-70E740481C1C}">
                           <a14:useLocalDpi xmlns:a14="http://schemas.microsoft.com/office/drawing/2010/main" val="0"/>
@@ -534,7 +1024,7 @@
                     </pic:cNvPicPr>
                   </pic:nvPicPr>
                   <pic:blipFill>
-                    <a:blip r:embed="rId8" cstate="print">
+                    <a:blip r:embed="rId10" cstate="print">
                       <a:extLst>
                         <a:ext uri="{28A0092B-C50C-407E-A947-70E740481C1C}">
                           <a14:useLocalDpi xmlns:a14="http://schemas.microsoft.com/office/drawing/2010/main" val="0"/>
@@ -597,7 +1087,7 @@
                     </pic:cNvPicPr>
                   </pic:nvPicPr>
                   <pic:blipFill>
-                    <a:blip r:embed="rId9">
+                    <a:blip r:embed="rId11">
                       <a:extLst>
                         <a:ext uri="{28A0092B-C50C-407E-A947-70E740481C1C}">
                           <a14:useLocalDpi xmlns:a14="http://schemas.microsoft.com/office/drawing/2010/main" val="0"/>
@@ -738,7 +1228,7 @@
                     </pic:cNvPicPr>
                   </pic:nvPicPr>
                   <pic:blipFill>
-                    <a:blip r:embed="rId10">
+                    <a:blip r:embed="rId12">
                       <a:extLst>
                         <a:ext uri="{28A0092B-C50C-407E-A947-70E740481C1C}">
                           <a14:useLocalDpi xmlns:a14="http://schemas.microsoft.com/office/drawing/2010/main" val="0"/>
@@ -838,7 +1328,7 @@
                     </pic:cNvPicPr>
                   </pic:nvPicPr>
                   <pic:blipFill>
-                    <a:blip r:embed="rId11">
+                    <a:blip r:embed="rId13">
                       <a:extLst>
                         <a:ext uri="{28A0092B-C50C-407E-A947-70E740481C1C}">
                           <a14:useLocalDpi xmlns:a14="http://schemas.microsoft.com/office/drawing/2010/main" val="0"/>
@@ -901,7 +1391,7 @@
                     </pic:cNvPicPr>
                   </pic:nvPicPr>
                   <pic:blipFill>
-                    <a:blip r:embed="rId12">
+                    <a:blip r:embed="rId14">
                       <a:extLst>
                         <a:ext uri="{28A0092B-C50C-407E-A947-70E740481C1C}">
                           <a14:useLocalDpi xmlns:a14="http://schemas.microsoft.com/office/drawing/2010/main" val="0"/>
@@ -1157,7 +1647,7 @@
                     </pic:cNvPicPr>
                   </pic:nvPicPr>
                   <pic:blipFill>
-                    <a:blip r:embed="rId13">
+                    <a:blip r:embed="rId15">
                       <a:extLst>
                         <a:ext uri="{28A0092B-C50C-407E-A947-70E740481C1C}">
                           <a14:useLocalDpi xmlns:a14="http://schemas.microsoft.com/office/drawing/2010/main" val="0"/>
@@ -2449,7 +2939,7 @@
           <w:lang w:val="en-US"/>
         </w:rPr>
       </w:pPr>
-      <w:hyperlink r:id="rId14" w:history="1">
+      <w:hyperlink r:id="rId16" w:history="1">
         <w:r>
           <w:rPr>
             <w:rStyle w:val="Hyperlink"/>
@@ -2809,7 +3299,7 @@
           <w:lang w:val="en-US"/>
         </w:rPr>
       </w:pPr>
-      <w:hyperlink r:id="rId15" w:history="1">
+      <w:hyperlink r:id="rId17" w:history="1">
         <w:r>
           <w:rPr>
             <w:rStyle w:val="Hyperlink"/>
@@ -2905,7 +3395,7 @@
           <w:lang w:val="en-US"/>
         </w:rPr>
       </w:pPr>
-      <w:hyperlink r:id="rId16" w:history="1">
+      <w:hyperlink r:id="rId18" w:history="1">
         <w:r>
           <w:rPr>
             <w:rStyle w:val="Hyperlink"/>
@@ -3863,7 +4353,7 @@
           <w:lang w:val="en-US"/>
         </w:rPr>
       </w:pPr>
-      <w:hyperlink r:id="rId17" w:history="1">
+      <w:hyperlink r:id="rId19" w:history="1">
         <w:r>
           <w:rPr>
             <w:rStyle w:val="Hyperlink"/>
@@ -7112,6 +7602,119 @@
     </w:lvl>
   </w:abstractNum>
   <w:abstractNum w:abstractNumId="29" w15:restartNumberingAfterBreak="0">
+    <w:nsid w:val="61693A7A"/>
+    <w:multiLevelType w:val="hybridMultilevel"/>
+    <w:tmpl w:val="580AF2C6"/>
+    <w:lvl w:ilvl="0" w:tplc="44090005">
+      <w:start w:val="1"/>
+      <w:numFmt w:val="bullet"/>
+      <w:lvlText w:val=""/>
+      <w:lvlJc w:val="left"/>
+      <w:pPr>
+        <w:ind w:left="2160" w:hanging="360"/>
+      </w:pPr>
+      <w:rPr>
+        <w:rFonts w:ascii="Wingdings" w:hAnsi="Wingdings" w:hint="default"/>
+      </w:rPr>
+    </w:lvl>
+    <w:lvl w:ilvl="1" w:tplc="44090003" w:tentative="1">
+      <w:start w:val="1"/>
+      <w:numFmt w:val="bullet"/>
+      <w:lvlText w:val="o"/>
+      <w:lvlJc w:val="left"/>
+      <w:pPr>
+        <w:ind w:left="2880" w:hanging="360"/>
+      </w:pPr>
+      <w:rPr>
+        <w:rFonts w:ascii="Courier New" w:hAnsi="Courier New" w:cs="Courier New" w:hint="default"/>
+      </w:rPr>
+    </w:lvl>
+    <w:lvl w:ilvl="2" w:tplc="44090005" w:tentative="1">
+      <w:start w:val="1"/>
+      <w:numFmt w:val="bullet"/>
+      <w:lvlText w:val=""/>
+      <w:lvlJc w:val="left"/>
+      <w:pPr>
+        <w:ind w:left="3600" w:hanging="360"/>
+      </w:pPr>
+      <w:rPr>
+        <w:rFonts w:ascii="Wingdings" w:hAnsi="Wingdings" w:hint="default"/>
+      </w:rPr>
+    </w:lvl>
+    <w:lvl w:ilvl="3" w:tplc="44090001" w:tentative="1">
+      <w:start w:val="1"/>
+      <w:numFmt w:val="bullet"/>
+      <w:lvlText w:val=""/>
+      <w:lvlJc w:val="left"/>
+      <w:pPr>
+        <w:ind w:left="4320" w:hanging="360"/>
+      </w:pPr>
+      <w:rPr>
+        <w:rFonts w:ascii="Symbol" w:hAnsi="Symbol" w:hint="default"/>
+      </w:rPr>
+    </w:lvl>
+    <w:lvl w:ilvl="4" w:tplc="44090003" w:tentative="1">
+      <w:start w:val="1"/>
+      <w:numFmt w:val="bullet"/>
+      <w:lvlText w:val="o"/>
+      <w:lvlJc w:val="left"/>
+      <w:pPr>
+        <w:ind w:left="5040" w:hanging="360"/>
+      </w:pPr>
+      <w:rPr>
+        <w:rFonts w:ascii="Courier New" w:hAnsi="Courier New" w:cs="Courier New" w:hint="default"/>
+      </w:rPr>
+    </w:lvl>
+    <w:lvl w:ilvl="5" w:tplc="44090005" w:tentative="1">
+      <w:start w:val="1"/>
+      <w:numFmt w:val="bullet"/>
+      <w:lvlText w:val=""/>
+      <w:lvlJc w:val="left"/>
+      <w:pPr>
+        <w:ind w:left="5760" w:hanging="360"/>
+      </w:pPr>
+      <w:rPr>
+        <w:rFonts w:ascii="Wingdings" w:hAnsi="Wingdings" w:hint="default"/>
+      </w:rPr>
+    </w:lvl>
+    <w:lvl w:ilvl="6" w:tplc="44090001" w:tentative="1">
+      <w:start w:val="1"/>
+      <w:numFmt w:val="bullet"/>
+      <w:lvlText w:val=""/>
+      <w:lvlJc w:val="left"/>
+      <w:pPr>
+        <w:ind w:left="6480" w:hanging="360"/>
+      </w:pPr>
+      <w:rPr>
+        <w:rFonts w:ascii="Symbol" w:hAnsi="Symbol" w:hint="default"/>
+      </w:rPr>
+    </w:lvl>
+    <w:lvl w:ilvl="7" w:tplc="44090003" w:tentative="1">
+      <w:start w:val="1"/>
+      <w:numFmt w:val="bullet"/>
+      <w:lvlText w:val="o"/>
+      <w:lvlJc w:val="left"/>
+      <w:pPr>
+        <w:ind w:left="7200" w:hanging="360"/>
+      </w:pPr>
+      <w:rPr>
+        <w:rFonts w:ascii="Courier New" w:hAnsi="Courier New" w:cs="Courier New" w:hint="default"/>
+      </w:rPr>
+    </w:lvl>
+    <w:lvl w:ilvl="8" w:tplc="44090005" w:tentative="1">
+      <w:start w:val="1"/>
+      <w:numFmt w:val="bullet"/>
+      <w:lvlText w:val=""/>
+      <w:lvlJc w:val="left"/>
+      <w:pPr>
+        <w:ind w:left="7920" w:hanging="360"/>
+      </w:pPr>
+      <w:rPr>
+        <w:rFonts w:ascii="Wingdings" w:hAnsi="Wingdings" w:hint="default"/>
+      </w:rPr>
+    </w:lvl>
+  </w:abstractNum>
+  <w:abstractNum w:abstractNumId="30" w15:restartNumberingAfterBreak="0">
     <w:nsid w:val="6A047A76"/>
     <w:multiLevelType w:val="hybridMultilevel"/>
     <w:tmpl w:val="50CADEB2"/>
@@ -7223,7 +7826,7 @@
       </w:rPr>
     </w:lvl>
   </w:abstractNum>
-  <w:abstractNum w:abstractNumId="30" w15:restartNumberingAfterBreak="0">
+  <w:abstractNum w:abstractNumId="31" w15:restartNumberingAfterBreak="0">
     <w:nsid w:val="6A3A0B6E"/>
     <w:multiLevelType w:val="hybridMultilevel"/>
     <w:tmpl w:val="759C482E"/>
@@ -7335,7 +7938,7 @@
       </w:rPr>
     </w:lvl>
   </w:abstractNum>
-  <w:abstractNum w:abstractNumId="31" w15:restartNumberingAfterBreak="0">
+  <w:abstractNum w:abstractNumId="32" w15:restartNumberingAfterBreak="0">
     <w:nsid w:val="6AC268F7"/>
     <w:multiLevelType w:val="hybridMultilevel"/>
     <w:tmpl w:val="12F21194"/>
@@ -7447,7 +8050,7 @@
       </w:rPr>
     </w:lvl>
   </w:abstractNum>
-  <w:abstractNum w:abstractNumId="32" w15:restartNumberingAfterBreak="0">
+  <w:abstractNum w:abstractNumId="33" w15:restartNumberingAfterBreak="0">
     <w:nsid w:val="6CE7392E"/>
     <w:multiLevelType w:val="hybridMultilevel"/>
     <w:tmpl w:val="2E2C9BDE"/>
@@ -7559,7 +8162,7 @@
       </w:rPr>
     </w:lvl>
   </w:abstractNum>
-  <w:abstractNum w:abstractNumId="33" w15:restartNumberingAfterBreak="0">
+  <w:abstractNum w:abstractNumId="34" w15:restartNumberingAfterBreak="0">
     <w:nsid w:val="6E3F3F9F"/>
     <w:multiLevelType w:val="hybridMultilevel"/>
     <w:tmpl w:val="A13CFC48"/>
@@ -7671,7 +8274,7 @@
       </w:rPr>
     </w:lvl>
   </w:abstractNum>
-  <w:abstractNum w:abstractNumId="34" w15:restartNumberingAfterBreak="0">
+  <w:abstractNum w:abstractNumId="35" w15:restartNumberingAfterBreak="0">
     <w:nsid w:val="7D5B508C"/>
     <w:multiLevelType w:val="hybridMultilevel"/>
     <w:tmpl w:val="7FAC5656"/>
@@ -7778,6 +8381,118 @@
       <w:lvlJc w:val="left"/>
       <w:pPr>
         <w:ind w:left="6840" w:hanging="360"/>
+      </w:pPr>
+      <w:rPr>
+        <w:rFonts w:ascii="Wingdings" w:hAnsi="Wingdings" w:hint="default"/>
+      </w:rPr>
+    </w:lvl>
+  </w:abstractNum>
+  <w:abstractNum w:abstractNumId="36" w15:restartNumberingAfterBreak="0">
+    <w:nsid w:val="7E7D5380"/>
+    <w:multiLevelType w:val="hybridMultilevel"/>
+    <w:tmpl w:val="7668ED14"/>
+    <w:lvl w:ilvl="0" w:tplc="759A2336">
+      <w:numFmt w:val="bullet"/>
+      <w:lvlText w:val="-"/>
+      <w:lvlJc w:val="left"/>
+      <w:pPr>
+        <w:ind w:left="720" w:hanging="360"/>
+      </w:pPr>
+      <w:rPr>
+        <w:rFonts w:ascii="Calibri" w:eastAsiaTheme="minorEastAsia" w:hAnsi="Calibri" w:cs="Calibri" w:hint="default"/>
+      </w:rPr>
+    </w:lvl>
+    <w:lvl w:ilvl="1" w:tplc="44090003">
+      <w:start w:val="1"/>
+      <w:numFmt w:val="bullet"/>
+      <w:lvlText w:val="o"/>
+      <w:lvlJc w:val="left"/>
+      <w:pPr>
+        <w:ind w:left="1440" w:hanging="360"/>
+      </w:pPr>
+      <w:rPr>
+        <w:rFonts w:ascii="Courier New" w:hAnsi="Courier New" w:cs="Courier New" w:hint="default"/>
+      </w:rPr>
+    </w:lvl>
+    <w:lvl w:ilvl="2" w:tplc="44090005">
+      <w:start w:val="1"/>
+      <w:numFmt w:val="bullet"/>
+      <w:lvlText w:val=""/>
+      <w:lvlJc w:val="left"/>
+      <w:pPr>
+        <w:ind w:left="2160" w:hanging="360"/>
+      </w:pPr>
+      <w:rPr>
+        <w:rFonts w:ascii="Wingdings" w:hAnsi="Wingdings" w:hint="default"/>
+      </w:rPr>
+    </w:lvl>
+    <w:lvl w:ilvl="3" w:tplc="44090001" w:tentative="1">
+      <w:start w:val="1"/>
+      <w:numFmt w:val="bullet"/>
+      <w:lvlText w:val=""/>
+      <w:lvlJc w:val="left"/>
+      <w:pPr>
+        <w:ind w:left="2880" w:hanging="360"/>
+      </w:pPr>
+      <w:rPr>
+        <w:rFonts w:ascii="Symbol" w:hAnsi="Symbol" w:hint="default"/>
+      </w:rPr>
+    </w:lvl>
+    <w:lvl w:ilvl="4" w:tplc="44090003" w:tentative="1">
+      <w:start w:val="1"/>
+      <w:numFmt w:val="bullet"/>
+      <w:lvlText w:val="o"/>
+      <w:lvlJc w:val="left"/>
+      <w:pPr>
+        <w:ind w:left="3600" w:hanging="360"/>
+      </w:pPr>
+      <w:rPr>
+        <w:rFonts w:ascii="Courier New" w:hAnsi="Courier New" w:cs="Courier New" w:hint="default"/>
+      </w:rPr>
+    </w:lvl>
+    <w:lvl w:ilvl="5" w:tplc="44090005" w:tentative="1">
+      <w:start w:val="1"/>
+      <w:numFmt w:val="bullet"/>
+      <w:lvlText w:val=""/>
+      <w:lvlJc w:val="left"/>
+      <w:pPr>
+        <w:ind w:left="4320" w:hanging="360"/>
+      </w:pPr>
+      <w:rPr>
+        <w:rFonts w:ascii="Wingdings" w:hAnsi="Wingdings" w:hint="default"/>
+      </w:rPr>
+    </w:lvl>
+    <w:lvl w:ilvl="6" w:tplc="44090001" w:tentative="1">
+      <w:start w:val="1"/>
+      <w:numFmt w:val="bullet"/>
+      <w:lvlText w:val=""/>
+      <w:lvlJc w:val="left"/>
+      <w:pPr>
+        <w:ind w:left="5040" w:hanging="360"/>
+      </w:pPr>
+      <w:rPr>
+        <w:rFonts w:ascii="Symbol" w:hAnsi="Symbol" w:hint="default"/>
+      </w:rPr>
+    </w:lvl>
+    <w:lvl w:ilvl="7" w:tplc="44090003" w:tentative="1">
+      <w:start w:val="1"/>
+      <w:numFmt w:val="bullet"/>
+      <w:lvlText w:val="o"/>
+      <w:lvlJc w:val="left"/>
+      <w:pPr>
+        <w:ind w:left="5760" w:hanging="360"/>
+      </w:pPr>
+      <w:rPr>
+        <w:rFonts w:ascii="Courier New" w:hAnsi="Courier New" w:cs="Courier New" w:hint="default"/>
+      </w:rPr>
+    </w:lvl>
+    <w:lvl w:ilvl="8" w:tplc="44090005" w:tentative="1">
+      <w:start w:val="1"/>
+      <w:numFmt w:val="bullet"/>
+      <w:lvlText w:val=""/>
+      <w:lvlJc w:val="left"/>
+      <w:pPr>
+        <w:ind w:left="6480" w:hanging="360"/>
       </w:pPr>
       <w:rPr>
         <w:rFonts w:ascii="Wingdings" w:hAnsi="Wingdings" w:hint="default"/>
@@ -7821,13 +8536,13 @@
     <w:abstractNumId w:val="19"/>
   </w:num>
   <w:num w:numId="13">
-    <w:abstractNumId w:val="34"/>
+    <w:abstractNumId w:val="35"/>
   </w:num>
   <w:num w:numId="14">
     <w:abstractNumId w:val="16"/>
   </w:num>
   <w:num w:numId="15">
-    <w:abstractNumId w:val="31"/>
+    <w:abstractNumId w:val="32"/>
   </w:num>
   <w:num w:numId="16">
     <w:abstractNumId w:val="3"/>
@@ -7848,10 +8563,10 @@
     <w:abstractNumId w:val="1"/>
   </w:num>
   <w:num w:numId="22">
-    <w:abstractNumId w:val="29"/>
+    <w:abstractNumId w:val="30"/>
   </w:num>
   <w:num w:numId="23">
-    <w:abstractNumId w:val="32"/>
+    <w:abstractNumId w:val="33"/>
   </w:num>
   <w:num w:numId="24">
     <w:abstractNumId w:val="8"/>
@@ -7878,16 +8593,22 @@
     <w:abstractNumId w:val="15"/>
   </w:num>
   <w:num w:numId="32">
-    <w:abstractNumId w:val="30"/>
+    <w:abstractNumId w:val="31"/>
   </w:num>
   <w:num w:numId="33">
-    <w:abstractNumId w:val="33"/>
+    <w:abstractNumId w:val="34"/>
   </w:num>
   <w:num w:numId="34">
     <w:abstractNumId w:val="17"/>
   </w:num>
   <w:num w:numId="35">
     <w:abstractNumId w:val="18"/>
+  </w:num>
+  <w:num w:numId="36">
+    <w:abstractNumId w:val="36"/>
+  </w:num>
+  <w:num w:numId="37">
+    <w:abstractNumId w:val="29"/>
   </w:num>
 </w:numbering>
 </file>

</xml_diff>

<commit_message>
- include start date when retrieving true p6 dates
</commit_message>
<xml_diff>
--- a/BluePrints/Views/ChangeLog.docx
+++ b/BluePrints/Views/ChangeLog.docx
@@ -1,6 +1,6 @@
 
 <file path=word/document.xml><?xml version="1.0" encoding="utf-8"?>
-<w:document xmlns:wpc="http://schemas.microsoft.com/office/word/2010/wordprocessingCanvas" xmlns:cx="http://schemas.microsoft.com/office/drawing/2014/chartex" xmlns:cx1="http://schemas.microsoft.com/office/drawing/2015/9/8/chartex" xmlns:cx2="http://schemas.microsoft.com/office/drawing/2015/10/21/chartex" xmlns:cx3="http://schemas.microsoft.com/office/drawing/2016/5/9/chartex" xmlns:cx4="http://schemas.microsoft.com/office/drawing/2016/5/10/chartex" xmlns:cx5="http://schemas.microsoft.com/office/drawing/2016/5/11/chartex" xmlns:cx6="http://schemas.microsoft.com/office/drawing/2016/5/12/chartex" xmlns:cx7="http://schemas.microsoft.com/office/drawing/2016/5/13/chartex" xmlns:cx8="http://schemas.microsoft.com/office/drawing/2016/5/14/chartex" xmlns:mc="http://schemas.openxmlformats.org/markup-compatibility/2006" xmlns:aink="http://schemas.microsoft.com/office/drawing/2016/ink" xmlns:am3d="http://schemas.microsoft.com/office/drawing/2017/model3d" xmlns:o="urn:schemas-microsoft-com:office:office" xmlns:r="http://schemas.openxmlformats.org/officeDocument/2006/relationships" xmlns:m="http://schemas.openxmlformats.org/officeDocument/2006/math" xmlns:v="urn:schemas-microsoft-com:vml" xmlns:wp14="http://schemas.microsoft.com/office/word/2010/wordprocessingDrawing" xmlns:wp="http://schemas.openxmlformats.org/drawingml/2006/wordprocessingDrawing" xmlns:w10="urn:schemas-microsoft-com:office:word" xmlns:w="http://schemas.openxmlformats.org/wordprocessingml/2006/main" xmlns:w14="http://schemas.microsoft.com/office/word/2010/wordml" xmlns:w15="http://schemas.microsoft.com/office/word/2012/wordml" xmlns:w16cex="http://schemas.microsoft.com/office/word/2018/wordml/cex" xmlns:w16cid="http://schemas.microsoft.com/office/word/2016/wordml/cid" xmlns:w16="http://schemas.microsoft.com/office/word/2018/wordml" xmlns:w16sdtdh="http://schemas.microsoft.com/office/word/2020/wordml/sdtdatahash" xmlns:w16se="http://schemas.microsoft.com/office/word/2015/wordml/symex" xmlns:wpg="http://schemas.microsoft.com/office/word/2010/wordprocessingGroup" xmlns:wpi="http://schemas.microsoft.com/office/word/2010/wordprocessingInk" xmlns:wne="http://schemas.microsoft.com/office/word/2006/wordml" xmlns:wps="http://schemas.microsoft.com/office/word/2010/wordprocessingShape" mc:Ignorable="w14 w15 w16se w16cid w16 w16cex w16sdtdh wp14">
+<w:document xmlns:wpc="http://schemas.microsoft.com/office/word/2010/wordprocessingCanvas" xmlns:cx="http://schemas.microsoft.com/office/drawing/2014/chartex" xmlns:cx1="http://schemas.microsoft.com/office/drawing/2015/9/8/chartex" xmlns:cx2="http://schemas.microsoft.com/office/drawing/2015/10/21/chartex" xmlns:cx3="http://schemas.microsoft.com/office/drawing/2016/5/9/chartex" xmlns:cx4="http://schemas.microsoft.com/office/drawing/2016/5/10/chartex" xmlns:cx5="http://schemas.microsoft.com/office/drawing/2016/5/11/chartex" xmlns:cx6="http://schemas.microsoft.com/office/drawing/2016/5/12/chartex" xmlns:cx7="http://schemas.microsoft.com/office/drawing/2016/5/13/chartex" xmlns:cx8="http://schemas.microsoft.com/office/drawing/2016/5/14/chartex" xmlns:mc="http://schemas.openxmlformats.org/markup-compatibility/2006" xmlns:aink="http://schemas.microsoft.com/office/drawing/2016/ink" xmlns:am3d="http://schemas.microsoft.com/office/drawing/2017/model3d" xmlns:o="urn:schemas-microsoft-com:office:office" xmlns:r="http://schemas.openxmlformats.org/officeDocument/2006/relationships" xmlns:m="http://schemas.openxmlformats.org/officeDocument/2006/math" xmlns:v="urn:schemas-microsoft-com:vml" xmlns:wp14="http://schemas.microsoft.com/office/word/2010/wordprocessingDrawing" xmlns:wp="http://schemas.openxmlformats.org/drawingml/2006/wordprocessingDrawing" xmlns:w10="urn:schemas-microsoft-com:office:word" xmlns:w="http://schemas.openxmlformats.org/wordprocessingml/2006/main" xmlns:w14="http://schemas.microsoft.com/office/word/2010/wordml" xmlns:w15="http://schemas.microsoft.com/office/word/2012/wordml" xmlns:w16cex="http://schemas.microsoft.com/office/word/2018/wordml/cex" xmlns:w16cid="http://schemas.microsoft.com/office/word/2016/wordml/cid" xmlns:w16="http://schemas.microsoft.com/office/word/2018/wordml" xmlns:w16se="http://schemas.microsoft.com/office/word/2015/wordml/symex" xmlns:wpg="http://schemas.microsoft.com/office/word/2010/wordprocessingGroup" xmlns:wpi="http://schemas.microsoft.com/office/word/2010/wordprocessingInk" xmlns:wne="http://schemas.microsoft.com/office/word/2006/wordml" xmlns:wps="http://schemas.microsoft.com/office/word/2010/wordprocessingShape" mc:Ignorable="w14 w15 w16se w16cid w16 w16cex wp14">
   <w:body>
     <w:p>
       <w:pPr>
@@ -61,34 +61,8 @@
         <w:rPr>
           <w:lang w:val="en-US"/>
         </w:rPr>
-        <w:t xml:space="preserve">Due date is changed to show planned P6 end date instead of </w:t>
-      </w:r>
-      <w:r>
-        <w:rPr>
-          <w:lang w:val="en-US"/>
-        </w:rPr>
-        <w:t xml:space="preserve">summarized to </w:t>
-      </w:r>
-      <w:r>
-        <w:rPr>
-          <w:lang w:val="en-US"/>
-        </w:rPr>
-        <w:t>w/e</w:t>
-      </w:r>
-      <w:r>
-        <w:rPr>
-          <w:lang w:val="en-US"/>
-        </w:rPr>
-        <w:t xml:space="preserve"> </w:t>
-      </w:r>
-      <w:proofErr w:type="gramStart"/>
-      <w:r>
-        <w:rPr>
-          <w:lang w:val="en-US"/>
-        </w:rPr>
-        <w:t>date</w:t>
-      </w:r>
-      <w:proofErr w:type="gramEnd"/>
+        <w:t>Start date is changed to show planned P6 start date instead of summarized to w/e</w:t>
+      </w:r>
     </w:p>
     <w:p>
       <w:pPr>
@@ -105,6 +79,36 @@
         <w:rPr>
           <w:lang w:val="en-US"/>
         </w:rPr>
+        <w:t xml:space="preserve">Due date is changed to show planned P6 end date instead of </w:t>
+      </w:r>
+      <w:r>
+        <w:rPr>
+          <w:lang w:val="en-US"/>
+        </w:rPr>
+        <w:t xml:space="preserve">summarized to </w:t>
+      </w:r>
+      <w:r>
+        <w:rPr>
+          <w:lang w:val="en-US"/>
+        </w:rPr>
+        <w:t>w/e</w:t>
+      </w:r>
+    </w:p>
+    <w:p>
+      <w:pPr>
+        <w:pStyle w:val="ListParagraph"/>
+        <w:numPr>
+          <w:ilvl w:val="1"/>
+          <w:numId w:val="47"/>
+        </w:numPr>
+        <w:rPr>
+          <w:lang w:val="en-US"/>
+        </w:rPr>
+      </w:pPr>
+      <w:r>
+        <w:rPr>
+          <w:lang w:val="en-US"/>
+        </w:rPr>
         <w:t xml:space="preserve">Forecast Finish date is changed to show remaining P6 end date instead of </w:t>
       </w:r>
       <w:r>
@@ -117,16 +121,8 @@
         <w:rPr>
           <w:lang w:val="en-US"/>
         </w:rPr>
-        <w:t xml:space="preserve">w/e </w:t>
-      </w:r>
-      <w:proofErr w:type="gramStart"/>
-      <w:r>
-        <w:rPr>
-          <w:lang w:val="en-US"/>
-        </w:rPr>
-        <w:t>date</w:t>
-      </w:r>
-      <w:proofErr w:type="gramEnd"/>
+        <w:t>w/e</w:t>
+      </w:r>
     </w:p>
     <w:p>
       <w:pPr>
@@ -250,16 +246,8 @@
         <w:rPr>
           <w:lang w:val="en-US"/>
         </w:rPr>
-        <w:t xml:space="preserve">Added button to add variation code to EXO without submitting </w:t>
-      </w:r>
-      <w:proofErr w:type="gramStart"/>
-      <w:r>
-        <w:rPr>
-          <w:lang w:val="en-US"/>
-        </w:rPr>
-        <w:t>variation</w:t>
-      </w:r>
-      <w:proofErr w:type="gramEnd"/>
+        <w:t>Added button to add variation code to EXO without submitting variation</w:t>
+      </w:r>
     </w:p>
     <w:p>
       <w:pPr>
@@ -496,16 +484,8 @@
         <w:rPr>
           <w:lang w:val="en-US"/>
         </w:rPr>
-        <w:t xml:space="preserve">Allow slower load times but faster edit/sort/filter operation by clicking “Download Data”, preference is saved for all </w:t>
-      </w:r>
-      <w:proofErr w:type="gramStart"/>
-      <w:r>
-        <w:rPr>
-          <w:lang w:val="en-US"/>
-        </w:rPr>
-        <w:t>projects</w:t>
-      </w:r>
-      <w:proofErr w:type="gramEnd"/>
+        <w:t>Allow slower load times but faster edit/sort/filter operation by clicking “Download Data”, preference is saved for all projects</w:t>
+      </w:r>
     </w:p>
     <w:p>
       <w:pPr>
@@ -611,16 +591,8 @@
         <w:rPr>
           <w:lang w:val="en-US"/>
         </w:rPr>
-        <w:t xml:space="preserve">Added option to trim inactive users by referencing EXO (according to user’s office). Trimmed users will have “Leave Date” set as </w:t>
-      </w:r>
-      <w:proofErr w:type="gramStart"/>
-      <w:r>
-        <w:rPr>
-          <w:lang w:val="en-US"/>
-        </w:rPr>
-        <w:t>today</w:t>
-      </w:r>
-      <w:proofErr w:type="gramEnd"/>
+        <w:t>Added option to trim inactive users by referencing EXO (according to user’s office). Trimmed users will have “Leave Date” set as today</w:t>
+      </w:r>
     </w:p>
     <w:p>
       <w:pPr>
@@ -725,16 +697,8 @@
         <w:rPr>
           <w:lang w:val="en-US"/>
         </w:rPr>
-        <w:t xml:space="preserve">Transactions to date is changed to All </w:t>
-      </w:r>
-      <w:proofErr w:type="gramStart"/>
-      <w:r>
-        <w:rPr>
-          <w:lang w:val="en-US"/>
-        </w:rPr>
-        <w:t>Transactions</w:t>
-      </w:r>
-      <w:proofErr w:type="gramEnd"/>
+        <w:t>Transactions to date is changed to All Transactions</w:t>
+      </w:r>
     </w:p>
     <w:p>
       <w:pPr>
@@ -832,16 +796,8 @@
         <w:rPr>
           <w:lang w:val="en-US"/>
         </w:rPr>
-        <w:t xml:space="preserve">Changed back end to server mode so that data is streamed from </w:t>
-      </w:r>
-      <w:proofErr w:type="gramStart"/>
-      <w:r>
-        <w:rPr>
-          <w:lang w:val="en-US"/>
-        </w:rPr>
-        <w:t>server</w:t>
-      </w:r>
-      <w:proofErr w:type="gramEnd"/>
+        <w:t>Changed back end to server mode so that data is streamed from server</w:t>
+      </w:r>
     </w:p>
     <w:p>
       <w:pPr>
@@ -858,16 +814,8 @@
         <w:rPr>
           <w:lang w:val="en-US"/>
         </w:rPr>
-        <w:t xml:space="preserve">Only issue is program will blink when updating </w:t>
-      </w:r>
-      <w:proofErr w:type="gramStart"/>
-      <w:r>
-        <w:rPr>
-          <w:lang w:val="en-US"/>
-        </w:rPr>
-        <w:t>records</w:t>
-      </w:r>
-      <w:proofErr w:type="gramEnd"/>
+        <w:t>Only issue is program will blink when updating records</w:t>
+      </w:r>
     </w:p>
     <w:p>
       <w:pPr>
@@ -1076,21 +1024,7 @@
         <w:rPr>
           <w:lang w:val="en-US"/>
         </w:rPr>
-        <w:t xml:space="preserve"> gets calculated incorrectly when P6 schedule data date </w:t>
-      </w:r>
-      <w:proofErr w:type="gramStart"/>
-      <w:r>
-        <w:rPr>
-          <w:lang w:val="en-US"/>
-        </w:rPr>
-        <w:t>is  less</w:t>
-      </w:r>
-      <w:proofErr w:type="gramEnd"/>
-      <w:r>
-        <w:rPr>
-          <w:lang w:val="en-US"/>
-        </w:rPr>
-        <w:t xml:space="preserve"> than forecast data date</w:t>
+        <w:t xml:space="preserve"> gets calculated incorrectly when P6 schedule data date is  less than forecast data date</w:t>
       </w:r>
     </w:p>
     <w:p>
@@ -1201,16 +1135,8 @@
         <w:rPr>
           <w:lang w:val="en-US"/>
         </w:rPr>
-        <w:t xml:space="preserve">Added area and subarea </w:t>
-      </w:r>
-      <w:proofErr w:type="gramStart"/>
-      <w:r>
-        <w:rPr>
-          <w:lang w:val="en-US"/>
-        </w:rPr>
-        <w:t>category</w:t>
-      </w:r>
-      <w:proofErr w:type="gramEnd"/>
+        <w:t>Added area and subarea category</w:t>
+      </w:r>
     </w:p>
     <w:p>
       <w:pPr>
@@ -1308,16 +1234,8 @@
         <w:rPr>
           <w:lang w:val="en-US"/>
         </w:rPr>
-        <w:t xml:space="preserve">Added area, subarea and variation </w:t>
-      </w:r>
-      <w:proofErr w:type="gramStart"/>
-      <w:r>
-        <w:rPr>
-          <w:lang w:val="en-US"/>
-        </w:rPr>
-        <w:t>category</w:t>
-      </w:r>
-      <w:proofErr w:type="gramEnd"/>
+        <w:t>Added area, subarea and variation category</w:t>
+      </w:r>
     </w:p>
     <w:p>
       <w:pPr>
@@ -1436,21 +1354,7 @@
         <w:rPr>
           <w:lang w:val="en-US"/>
         </w:rPr>
-        <w:t xml:space="preserve">Changed all “Cost Group” column header description to “Discipline </w:t>
-      </w:r>
-      <w:proofErr w:type="gramStart"/>
-      <w:r>
-        <w:rPr>
-          <w:lang w:val="en-US"/>
-        </w:rPr>
-        <w:t>Code</w:t>
-      </w:r>
-      <w:proofErr w:type="gramEnd"/>
-      <w:r>
-        <w:rPr>
-          <w:lang w:val="en-US"/>
-        </w:rPr>
-        <w:t>”</w:t>
+        <w:t>Changed all “Cost Group” column header description to “Discipline Code”</w:t>
       </w:r>
     </w:p>
     <w:p>
@@ -1468,21 +1372,7 @@
         <w:rPr>
           <w:lang w:val="en-US"/>
         </w:rPr>
-        <w:t xml:space="preserve">Changed all “Cost Type” column header description to “Commodity </w:t>
-      </w:r>
-      <w:proofErr w:type="gramStart"/>
-      <w:r>
-        <w:rPr>
-          <w:lang w:val="en-US"/>
-        </w:rPr>
-        <w:t>Code</w:t>
-      </w:r>
-      <w:proofErr w:type="gramEnd"/>
-      <w:r>
-        <w:rPr>
-          <w:lang w:val="en-US"/>
-        </w:rPr>
-        <w:t>”</w:t>
+        <w:t>Changed all “Cost Type” column header description to “Commodity Code”</w:t>
       </w:r>
     </w:p>
     <w:p>
@@ -2045,16 +1935,8 @@
         <w:rPr>
           <w:lang w:val="en-US"/>
         </w:rPr>
-        <w:t xml:space="preserve">Added department column, department column is a function of looking up doc types for default department, some doc types might be used across different department and thus might be </w:t>
-      </w:r>
-      <w:proofErr w:type="gramStart"/>
-      <w:r>
-        <w:rPr>
-          <w:lang w:val="en-US"/>
-        </w:rPr>
-        <w:t>inaccurate</w:t>
-      </w:r>
-      <w:proofErr w:type="gramEnd"/>
+        <w:t>Added department column, department column is a function of looking up doc types for default department, some doc types might be used across different department and thus might be inaccurate</w:t>
+      </w:r>
     </w:p>
     <w:p>
       <w:pPr>
@@ -2132,16 +2014,8 @@
         <w:rPr>
           <w:lang w:val="en-US"/>
         </w:rPr>
-        <w:t xml:space="preserve">Excel export also shows lookup </w:t>
-      </w:r>
-      <w:proofErr w:type="gramStart"/>
-      <w:r>
-        <w:rPr>
-          <w:lang w:val="en-US"/>
-        </w:rPr>
-        <w:t>department</w:t>
-      </w:r>
-      <w:proofErr w:type="gramEnd"/>
+        <w:t>Excel export also shows lookup department</w:t>
+      </w:r>
     </w:p>
     <w:p>
       <w:pPr>
@@ -2263,16 +2137,8 @@
         <w:rPr>
           <w:lang w:val="en-US"/>
         </w:rPr>
-        <w:t xml:space="preserve">Added ability to auto reduce earned hours from latest date onwards to accommodate negative variation </w:t>
-      </w:r>
-      <w:proofErr w:type="gramStart"/>
-      <w:r>
-        <w:rPr>
-          <w:lang w:val="en-US"/>
-        </w:rPr>
-        <w:t>hours</w:t>
-      </w:r>
-      <w:proofErr w:type="gramEnd"/>
+        <w:t>Added ability to auto reduce earned hours from latest date onwards to accommodate negative variation hours</w:t>
+      </w:r>
     </w:p>
     <w:p>
       <w:pPr>
@@ -2349,21 +2215,7 @@
         <w:rPr>
           <w:lang w:val="en-US"/>
         </w:rPr>
-        <w:t xml:space="preserve">In this instance, deliverable have 100 total hours and 50 hours already earned, but variation defines a 75 </w:t>
-      </w:r>
-      <w:proofErr w:type="gramStart"/>
-      <w:r>
-        <w:rPr>
-          <w:lang w:val="en-US"/>
-        </w:rPr>
-        <w:t>hours</w:t>
-      </w:r>
-      <w:proofErr w:type="gramEnd"/>
-      <w:r>
-        <w:rPr>
-          <w:lang w:val="en-US"/>
-        </w:rPr>
-        <w:t xml:space="preserve"> reduction, two options are available during approval</w:t>
+        <w:t>In this instance, deliverable have 100 total hours and 50 hours already earned, but variation defines a 75 hours reduction, two options are available during approval</w:t>
       </w:r>
     </w:p>
     <w:p>
@@ -2381,16 +2233,8 @@
         <w:rPr>
           <w:lang w:val="en-US"/>
         </w:rPr>
-        <w:t xml:space="preserve">Reduce earned hours ticked – Earned units will be reduced to 25 so that 75 hours reduction can be </w:t>
-      </w:r>
-      <w:proofErr w:type="gramStart"/>
-      <w:r>
-        <w:rPr>
-          <w:lang w:val="en-US"/>
-        </w:rPr>
-        <w:t>applied</w:t>
-      </w:r>
-      <w:proofErr w:type="gramEnd"/>
+        <w:t>Reduce earned hours ticked – Earned units will be reduced to 25 so that 75 hours reduction can be applied</w:t>
+      </w:r>
     </w:p>
     <w:p>
       <w:pPr>
@@ -2407,16 +2251,8 @@
         <w:rPr>
           <w:lang w:val="en-US"/>
         </w:rPr>
-        <w:t xml:space="preserve">Reduce earned hours not ticked – Variation hours will be changed to 50 hours reduction instead of 75, as defined by maximum reducible units </w:t>
-      </w:r>
-      <w:proofErr w:type="gramStart"/>
-      <w:r>
-        <w:rPr>
-          <w:lang w:val="en-US"/>
-        </w:rPr>
-        <w:t>column</w:t>
-      </w:r>
-      <w:proofErr w:type="gramEnd"/>
+        <w:t>Reduce earned hours not ticked – Variation hours will be changed to 50 hours reduction instead of 75, as defined by maximum reducible units column</w:t>
+      </w:r>
     </w:p>
     <w:p>
       <w:pPr>
@@ -2473,16 +2309,8 @@
         <w:rPr>
           <w:lang w:val="en-US"/>
         </w:rPr>
-        <w:t xml:space="preserve">Added ability to reduce earned units when variations are </w:t>
-      </w:r>
-      <w:proofErr w:type="gramStart"/>
-      <w:r>
-        <w:rPr>
-          <w:lang w:val="en-US"/>
-        </w:rPr>
-        <w:t>unapproved</w:t>
-      </w:r>
-      <w:proofErr w:type="gramEnd"/>
+        <w:t>Added ability to reduce earned units when variations are unapproved</w:t>
+      </w:r>
     </w:p>
     <w:p>
       <w:pPr>
@@ -2559,44 +2387,8 @@
         <w:rPr>
           <w:lang w:val="en-US"/>
         </w:rPr>
-        <w:t xml:space="preserve">For instance, a variation that was previously approved with 100 hours is now in the process of </w:t>
-      </w:r>
-      <w:proofErr w:type="spellStart"/>
-      <w:r>
-        <w:rPr>
-          <w:lang w:val="en-US"/>
-        </w:rPr>
-        <w:t>unapproval</w:t>
-      </w:r>
-      <w:proofErr w:type="spellEnd"/>
-      <w:r>
-        <w:rPr>
-          <w:lang w:val="en-US"/>
-        </w:rPr>
-        <w:t xml:space="preserve">. </w:t>
-      </w:r>
-      <w:proofErr w:type="gramStart"/>
-      <w:r>
-        <w:rPr>
-          <w:lang w:val="en-US"/>
-        </w:rPr>
-        <w:t>Since</w:t>
-      </w:r>
-      <w:proofErr w:type="gramEnd"/>
-      <w:r>
-        <w:rPr>
-          <w:lang w:val="en-US"/>
-        </w:rPr>
-        <w:t xml:space="preserve"> 50 hours has already been earned, 2 options are available during </w:t>
-      </w:r>
-      <w:proofErr w:type="spellStart"/>
-      <w:r>
-        <w:rPr>
-          <w:lang w:val="en-US"/>
-        </w:rPr>
-        <w:t>unapproval</w:t>
-      </w:r>
-      <w:proofErr w:type="spellEnd"/>
+        <w:t>For instance, a variation that was previously approved with 100 hours is now in the process of unapproval. Since 50 hours has already been earned, 2 options are available during unapproval</w:t>
+      </w:r>
     </w:p>
     <w:p>
       <w:pPr>
@@ -2613,30 +2405,8 @@
         <w:rPr>
           <w:lang w:val="en-US"/>
         </w:rPr>
-        <w:t xml:space="preserve">Reduce earned hours ticked – Earned units will be reduced to 0 so that </w:t>
-      </w:r>
-      <w:proofErr w:type="spellStart"/>
-      <w:r>
-        <w:rPr>
-          <w:lang w:val="en-US"/>
-        </w:rPr>
-        <w:t>unapproval</w:t>
-      </w:r>
-      <w:proofErr w:type="spellEnd"/>
-      <w:r>
-        <w:rPr>
-          <w:lang w:val="en-US"/>
-        </w:rPr>
-        <w:t xml:space="preserve"> with 100 hours taken away from the deliverable can take </w:t>
-      </w:r>
-      <w:proofErr w:type="gramStart"/>
-      <w:r>
-        <w:rPr>
-          <w:lang w:val="en-US"/>
-        </w:rPr>
-        <w:t>place</w:t>
-      </w:r>
-      <w:proofErr w:type="gramEnd"/>
+        <w:t>Reduce earned hours ticked – Earned units will be reduced to 0 so that unapproval with 100 hours taken away from the deliverable can take place</w:t>
+      </w:r>
     </w:p>
     <w:p>
       <w:pPr>
@@ -2653,16 +2423,8 @@
         <w:rPr>
           <w:lang w:val="en-US"/>
         </w:rPr>
-        <w:t xml:space="preserve">Reduce earned hours unticked – Earned units will not be reduced, but user will see negative 100 hours remaining in </w:t>
-      </w:r>
-      <w:proofErr w:type="gramStart"/>
-      <w:r>
-        <w:rPr>
-          <w:lang w:val="en-US"/>
-        </w:rPr>
-        <w:t>progress</w:t>
-      </w:r>
-      <w:proofErr w:type="gramEnd"/>
+        <w:t>Reduce earned hours unticked – Earned units will not be reduced, but user will see negative 100 hours remaining in progress</w:t>
+      </w:r>
     </w:p>
     <w:p>
       <w:pPr>
@@ -2732,16 +2494,8 @@
         <w:rPr>
           <w:lang w:val="en-US"/>
         </w:rPr>
-        <w:t xml:space="preserve">Added ability to save forecast data to be retrieved by </w:t>
-      </w:r>
-      <w:proofErr w:type="gramStart"/>
-      <w:r>
-        <w:rPr>
-          <w:lang w:val="en-US"/>
-        </w:rPr>
-        <w:t>excel</w:t>
-      </w:r>
-      <w:proofErr w:type="gramEnd"/>
+        <w:t>Added ability to save forecast data to be retrieved by excel</w:t>
+      </w:r>
     </w:p>
     <w:p>
       <w:pPr>
@@ -2879,16 +2633,8 @@
         <w:rPr>
           <w:lang w:val="en-US"/>
         </w:rPr>
-        <w:t>Added ability to move data date forward/</w:t>
-      </w:r>
-      <w:proofErr w:type="gramStart"/>
-      <w:r>
-        <w:rPr>
-          <w:lang w:val="en-US"/>
-        </w:rPr>
-        <w:t>backward</w:t>
-      </w:r>
-      <w:proofErr w:type="gramEnd"/>
+        <w:t>Added ability to move data date forward/backward</w:t>
+      </w:r>
     </w:p>
     <w:p>
       <w:pPr>
@@ -2905,16 +2651,8 @@
         <w:rPr>
           <w:lang w:val="en-US"/>
         </w:rPr>
-        <w:t xml:space="preserve">Added ability to disable report date auto change to previous period </w:t>
-      </w:r>
-      <w:proofErr w:type="gramStart"/>
-      <w:r>
-        <w:rPr>
-          <w:lang w:val="en-US"/>
-        </w:rPr>
-        <w:t>ending</w:t>
-      </w:r>
-      <w:proofErr w:type="gramEnd"/>
+        <w:t>Added ability to disable report date auto change to previous period ending</w:t>
+      </w:r>
     </w:p>
     <w:p>
       <w:pPr>
@@ -3012,16 +2750,8 @@
         <w:rPr>
           <w:lang w:val="en-US"/>
         </w:rPr>
-        <w:t xml:space="preserve">Added ability to disable report date auto change to previous period </w:t>
-      </w:r>
-      <w:proofErr w:type="gramStart"/>
-      <w:r>
-        <w:rPr>
-          <w:lang w:val="en-US"/>
-        </w:rPr>
-        <w:t>ending</w:t>
-      </w:r>
-      <w:proofErr w:type="gramEnd"/>
+        <w:t>Added ability to disable report date auto change to previous period ending</w:t>
+      </w:r>
     </w:p>
     <w:p>
       <w:pPr>
@@ -3145,16 +2875,8 @@
         <w:rPr>
           <w:lang w:val="en-US"/>
         </w:rPr>
-        <w:t xml:space="preserve">Added design change </w:t>
-      </w:r>
-      <w:proofErr w:type="gramStart"/>
-      <w:r>
-        <w:rPr>
-          <w:lang w:val="en-US"/>
-        </w:rPr>
-        <w:t>notice</w:t>
-      </w:r>
-      <w:proofErr w:type="gramEnd"/>
+        <w:t>Added design change notice</w:t>
+      </w:r>
     </w:p>
     <w:p>
       <w:pPr>
@@ -3341,16 +3063,8 @@
         <w:rPr>
           <w:lang w:val="en-US"/>
         </w:rPr>
-        <w:t xml:space="preserve">Added user remaining units to add discretionary remaining </w:t>
-      </w:r>
-      <w:proofErr w:type="gramStart"/>
-      <w:r>
-        <w:rPr>
-          <w:lang w:val="en-US"/>
-        </w:rPr>
-        <w:t>units</w:t>
-      </w:r>
-      <w:proofErr w:type="gramEnd"/>
+        <w:t>Added user remaining units to add discretionary remaining units</w:t>
+      </w:r>
     </w:p>
     <w:p>
       <w:pPr>
@@ -3643,21 +3357,7 @@
         <w:rPr>
           <w:lang w:val="en-US"/>
         </w:rPr>
-        <w:t xml:space="preserve"> gates </w:t>
-      </w:r>
-      <w:proofErr w:type="gramStart"/>
-      <w:r>
-        <w:rPr>
-          <w:lang w:val="en-US"/>
-        </w:rPr>
-        <w:t>goes</w:t>
-      </w:r>
-      <w:proofErr w:type="gramEnd"/>
-      <w:r>
-        <w:rPr>
-          <w:lang w:val="en-US"/>
-        </w:rPr>
-        <w:t xml:space="preserve"> by phases to support differentiation between D1, D2</w:t>
+        <w:t xml:space="preserve"> gates goes by phases to support differentiation between D1, D2</w:t>
       </w:r>
     </w:p>
     <w:p>
@@ -3743,16 +3443,8 @@
         <w:rPr>
           <w:lang w:val="en-US"/>
         </w:rPr>
-        <w:t xml:space="preserve">The permission is as </w:t>
-      </w:r>
-      <w:proofErr w:type="gramStart"/>
-      <w:r>
-        <w:rPr>
-          <w:lang w:val="en-US"/>
-        </w:rPr>
-        <w:t>follows</w:t>
-      </w:r>
-      <w:proofErr w:type="gramEnd"/>
+        <w:t>The permission is as follows</w:t>
+      </w:r>
     </w:p>
     <w:p>
       <w:pPr>
@@ -3895,16 +3587,8 @@
         <w:rPr>
           <w:lang w:val="en-US"/>
         </w:rPr>
-        <w:t xml:space="preserve"> cost group and cost type error when stock code is </w:t>
-      </w:r>
-      <w:proofErr w:type="gramStart"/>
-      <w:r>
-        <w:rPr>
-          <w:lang w:val="en-US"/>
-        </w:rPr>
-        <w:t>VA001</w:t>
-      </w:r>
-      <w:proofErr w:type="gramEnd"/>
+        <w:t xml:space="preserve"> cost group and cost type error when stock code is VA001</w:t>
+      </w:r>
     </w:p>
     <w:p>
       <w:pPr>
@@ -3993,16 +3677,8 @@
         <w:rPr>
           <w:lang w:val="en-US"/>
         </w:rPr>
-        <w:t xml:space="preserve"> so that it doesn’t clutter up forecast </w:t>
-      </w:r>
-      <w:proofErr w:type="gramStart"/>
-      <w:r>
-        <w:rPr>
-          <w:lang w:val="en-US"/>
-        </w:rPr>
-        <w:t>view</w:t>
-      </w:r>
-      <w:proofErr w:type="gramEnd"/>
+        <w:t xml:space="preserve"> so that it doesn’t clutter up forecast view</w:t>
+      </w:r>
     </w:p>
     <w:p>
       <w:pPr>
@@ -4069,16 +3745,8 @@
         <w:rPr>
           <w:lang w:val="en-US"/>
         </w:rPr>
-        <w:t xml:space="preserve">llow negative values for </w:t>
-      </w:r>
-      <w:proofErr w:type="gramStart"/>
-      <w:r>
-        <w:rPr>
-          <w:lang w:val="en-US"/>
-        </w:rPr>
-        <w:t>revenue</w:t>
-      </w:r>
-      <w:proofErr w:type="gramEnd"/>
+        <w:t>llow negative values for revenue</w:t>
+      </w:r>
     </w:p>
     <w:p>
       <w:pPr>
@@ -4119,16 +3787,8 @@
         <w:rPr>
           <w:lang w:val="en-US"/>
         </w:rPr>
-        <w:t xml:space="preserve">emove cost group and cost </w:t>
-      </w:r>
-      <w:proofErr w:type="gramStart"/>
-      <w:r>
-        <w:rPr>
-          <w:lang w:val="en-US"/>
-        </w:rPr>
-        <w:t>type</w:t>
-      </w:r>
-      <w:proofErr w:type="gramEnd"/>
+        <w:t>emove cost group and cost type</w:t>
+      </w:r>
     </w:p>
     <w:p>
       <w:pPr>
@@ -4163,16 +3823,8 @@
         <w:rPr>
           <w:lang w:val="en-US"/>
         </w:rPr>
-        <w:t xml:space="preserve">job in construction variation to show valid sub job codes </w:t>
-      </w:r>
-      <w:proofErr w:type="gramStart"/>
-      <w:r>
-        <w:rPr>
-          <w:lang w:val="en-US"/>
-        </w:rPr>
-        <w:t>only</w:t>
-      </w:r>
-      <w:proofErr w:type="gramEnd"/>
+        <w:t>job in construction variation to show valid sub job codes only</w:t>
+      </w:r>
     </w:p>
     <w:p>
       <w:pPr>
@@ -4195,21 +3847,7 @@
         <w:rPr>
           <w:lang w:val="en-US"/>
         </w:rPr>
-        <w:t xml:space="preserve">how cell error when sub job codes </w:t>
-      </w:r>
-      <w:proofErr w:type="gramStart"/>
-      <w:r>
-        <w:rPr>
-          <w:lang w:val="en-US"/>
-        </w:rPr>
-        <w:t>isn't</w:t>
-      </w:r>
-      <w:proofErr w:type="gramEnd"/>
-      <w:r>
-        <w:rPr>
-          <w:lang w:val="en-US"/>
-        </w:rPr>
-        <w:t xml:space="preserve"> valid for chosen type</w:t>
+        <w:t>how cell error when sub job codes isn't valid for chosen type</w:t>
       </w:r>
     </w:p>
     <w:p>
@@ -4278,30 +3916,8 @@
         <w:rPr>
           <w:lang w:val="en-US"/>
         </w:rPr>
-        <w:t xml:space="preserve">how empty cost group and cost type in forecast to </w:t>
-      </w:r>
-      <w:proofErr w:type="spellStart"/>
-      <w:r>
-        <w:rPr>
-          <w:lang w:val="en-US"/>
-        </w:rPr>
-        <w:t>accomodate</w:t>
-      </w:r>
-      <w:proofErr w:type="spellEnd"/>
-      <w:r>
-        <w:rPr>
-          <w:lang w:val="en-US"/>
-        </w:rPr>
-        <w:t xml:space="preserve"> variations without cost group and cost type coming from construction variation </w:t>
-      </w:r>
-      <w:proofErr w:type="gramStart"/>
-      <w:r>
-        <w:rPr>
-          <w:lang w:val="en-US"/>
-        </w:rPr>
-        <w:t>module</w:t>
-      </w:r>
-      <w:proofErr w:type="gramEnd"/>
+        <w:t>how empty cost group and cost type in forecast to accomodate variations without cost group and cost type coming from construction variation module</w:t>
+      </w:r>
     </w:p>
     <w:p>
       <w:pPr>
@@ -4368,21 +3984,7 @@
         <w:rPr>
           <w:lang w:val="en-US"/>
         </w:rPr>
-        <w:t xml:space="preserve">ixed an issue </w:t>
-      </w:r>
-      <w:proofErr w:type="gramStart"/>
-      <w:r>
-        <w:rPr>
-          <w:lang w:val="en-US"/>
-        </w:rPr>
-        <w:t>where</w:t>
-      </w:r>
-      <w:proofErr w:type="gramEnd"/>
-      <w:r>
-        <w:rPr>
-          <w:lang w:val="en-US"/>
-        </w:rPr>
-        <w:t xml:space="preserve"> committing to </w:t>
+        <w:t xml:space="preserve">ixed an issue where committing to </w:t>
       </w:r>
       <w:r>
         <w:rPr>
@@ -4501,16 +4103,8 @@
         <w:rPr>
           <w:lang w:val="en-US"/>
         </w:rPr>
-        <w:t xml:space="preserve">Fixed an issue where at completion units doesn’t match budgeted units when pushing to </w:t>
-      </w:r>
-      <w:proofErr w:type="gramStart"/>
-      <w:r>
-        <w:rPr>
-          <w:lang w:val="en-US"/>
-        </w:rPr>
-        <w:t>P6</w:t>
-      </w:r>
-      <w:proofErr w:type="gramEnd"/>
+        <w:t>Fixed an issue where at completion units doesn’t match budgeted units when pushing to P6</w:t>
+      </w:r>
     </w:p>
     <w:p>
       <w:pPr>
@@ -4527,16 +4121,8 @@
         <w:rPr>
           <w:lang w:val="en-US"/>
         </w:rPr>
-        <w:t xml:space="preserve">Add a checkbox to allow certain projects to have current week ending data </w:t>
-      </w:r>
-      <w:proofErr w:type="gramStart"/>
-      <w:r>
-        <w:rPr>
-          <w:lang w:val="en-US"/>
-        </w:rPr>
-        <w:t>date</w:t>
-      </w:r>
-      <w:proofErr w:type="gramEnd"/>
+        <w:t>Add a checkbox to allow certain projects to have current week ending data date</w:t>
+      </w:r>
     </w:p>
     <w:p>
       <w:pPr>
@@ -4553,16 +4139,8 @@
         <w:rPr>
           <w:lang w:val="en-US"/>
         </w:rPr>
-        <w:t xml:space="preserve">Added a button to copy start date to target start date and due date to target end </w:t>
-      </w:r>
-      <w:proofErr w:type="gramStart"/>
-      <w:r>
-        <w:rPr>
-          <w:lang w:val="en-US"/>
-        </w:rPr>
-        <w:t>date</w:t>
-      </w:r>
-      <w:proofErr w:type="gramEnd"/>
+        <w:t>Added a button to copy start date to target start date and due date to target end date</w:t>
+      </w:r>
     </w:p>
     <w:p>
       <w:pPr>
@@ -4636,16 +4214,8 @@
         <w:rPr>
           <w:lang w:val="en-US"/>
         </w:rPr>
-        <w:t xml:space="preserve">change to current week data date when current day is the day of week for current week’s data </w:t>
-      </w:r>
-      <w:proofErr w:type="gramStart"/>
-      <w:r>
-        <w:rPr>
-          <w:lang w:val="en-US"/>
-        </w:rPr>
-        <w:t>date</w:t>
-      </w:r>
-      <w:proofErr w:type="gramEnd"/>
+        <w:t>change to current week data date when current day is the day of week for current week’s data date</w:t>
+      </w:r>
     </w:p>
     <w:bookmarkEnd w:id="0"/>
     <w:p>
@@ -4749,16 +4319,8 @@
         <w:rPr>
           <w:lang w:val="en-US"/>
         </w:rPr>
-        <w:t xml:space="preserve"> code is </w:t>
-      </w:r>
-      <w:proofErr w:type="gramStart"/>
-      <w:r>
-        <w:rPr>
-          <w:lang w:val="en-US"/>
-        </w:rPr>
-        <w:t>used</w:t>
-      </w:r>
-      <w:proofErr w:type="gramEnd"/>
+        <w:t xml:space="preserve"> code is used</w:t>
+      </w:r>
     </w:p>
     <w:p>
       <w:pPr>
@@ -4856,16 +4418,8 @@
         <w:rPr>
           <w:lang w:val="en-US"/>
         </w:rPr>
-        <w:t xml:space="preserve"> </w:t>
-      </w:r>
-      <w:proofErr w:type="gramStart"/>
-      <w:r>
-        <w:rPr>
-          <w:lang w:val="en-US"/>
-        </w:rPr>
-        <w:t>code</w:t>
-      </w:r>
-      <w:proofErr w:type="gramEnd"/>
+        <w:t xml:space="preserve"> code</w:t>
+      </w:r>
     </w:p>
     <w:p>
       <w:pPr>
@@ -4909,16 +4463,8 @@
         <w:rPr>
           <w:lang w:val="en-US"/>
         </w:rPr>
-        <w:t xml:space="preserve">Use total unapproved variation revenue to show unapproved revenue in forecast </w:t>
-      </w:r>
-      <w:proofErr w:type="gramStart"/>
-      <w:r>
-        <w:rPr>
-          <w:lang w:val="en-US"/>
-        </w:rPr>
-        <w:t>view</w:t>
-      </w:r>
-      <w:proofErr w:type="gramEnd"/>
+        <w:t>Use total unapproved variation revenue to show unapproved revenue in forecast view</w:t>
+      </w:r>
     </w:p>
     <w:p>
       <w:pPr>
@@ -4979,16 +4525,8 @@
         <w:rPr>
           <w:lang w:val="en-US"/>
         </w:rPr>
-        <w:t xml:space="preserve">Added construction variation </w:t>
-      </w:r>
-      <w:proofErr w:type="gramStart"/>
-      <w:r>
-        <w:rPr>
-          <w:lang w:val="en-US"/>
-        </w:rPr>
-        <w:t>module</w:t>
-      </w:r>
-      <w:proofErr w:type="gramEnd"/>
+        <w:t>Added construction variation module</w:t>
+      </w:r>
     </w:p>
     <w:p>
       <w:pPr>
@@ -5068,30 +4606,8 @@
           <w:lang w:val="en-US"/>
         </w:rPr>
         <w:lastRenderedPageBreak/>
-        <w:t xml:space="preserve">Added column to show actual </w:t>
-      </w:r>
-      <w:proofErr w:type="spellStart"/>
-      <w:r>
-        <w:rPr>
-          <w:lang w:val="en-US"/>
-        </w:rPr>
-        <w:t>labour</w:t>
-      </w:r>
-      <w:proofErr w:type="spellEnd"/>
-      <w:r>
-        <w:rPr>
-          <w:lang w:val="en-US"/>
-        </w:rPr>
-        <w:t xml:space="preserve"> units post data </w:t>
-      </w:r>
-      <w:proofErr w:type="gramStart"/>
-      <w:r>
-        <w:rPr>
-          <w:lang w:val="en-US"/>
-        </w:rPr>
-        <w:t>date</w:t>
-      </w:r>
-      <w:proofErr w:type="gramEnd"/>
+        <w:t>Added column to show actual labour units post data date</w:t>
+      </w:r>
     </w:p>
     <w:p>
       <w:pPr>
@@ -5152,16 +4668,8 @@
         <w:rPr>
           <w:lang w:val="en-US"/>
         </w:rPr>
-        <w:t xml:space="preserve">Removed colors from actuals </w:t>
-      </w:r>
-      <w:proofErr w:type="gramStart"/>
-      <w:r>
-        <w:rPr>
-          <w:lang w:val="en-US"/>
-        </w:rPr>
-        <w:t>history</w:t>
-      </w:r>
-      <w:proofErr w:type="gramEnd"/>
+        <w:t>Removed colors from actuals history</w:t>
+      </w:r>
     </w:p>
     <w:p>
       <w:pPr>
@@ -5222,16 +4730,8 @@
         <w:rPr>
           <w:lang w:val="en-US"/>
         </w:rPr>
-        <w:t xml:space="preserve">Added stock </w:t>
-      </w:r>
-      <w:proofErr w:type="gramStart"/>
-      <w:r>
-        <w:rPr>
-          <w:lang w:val="en-US"/>
-        </w:rPr>
-        <w:t>code</w:t>
-      </w:r>
-      <w:proofErr w:type="gramEnd"/>
+        <w:t>Added stock code</w:t>
+      </w:r>
     </w:p>
     <w:p>
       <w:pPr>
@@ -5292,16 +4792,8 @@
         <w:rPr>
           <w:lang w:val="en-US"/>
         </w:rPr>
-        <w:t xml:space="preserve">Added show variation name and approve units </w:t>
-      </w:r>
-      <w:proofErr w:type="gramStart"/>
-      <w:r>
-        <w:rPr>
-          <w:lang w:val="en-US"/>
-        </w:rPr>
-        <w:t>column</w:t>
-      </w:r>
-      <w:proofErr w:type="gramEnd"/>
+        <w:t>Added show variation name and approve units column</w:t>
+      </w:r>
     </w:p>
     <w:p>
       <w:pPr>
@@ -5379,16 +4871,8 @@
         <w:rPr>
           <w:lang w:val="en-US"/>
         </w:rPr>
-        <w:t xml:space="preserve">Added hidden column to allow subcontract hours to be excluded from </w:t>
-      </w:r>
-      <w:proofErr w:type="gramStart"/>
-      <w:r>
-        <w:rPr>
-          <w:lang w:val="en-US"/>
-        </w:rPr>
-        <w:t>forecast</w:t>
-      </w:r>
-      <w:proofErr w:type="gramEnd"/>
+        <w:t>Added hidden column to allow subcontract hours to be excluded from forecast</w:t>
+      </w:r>
     </w:p>
     <w:p>
       <w:pPr>
@@ -5476,16 +4960,8 @@
         <w:rPr>
           <w:lang w:val="en-US"/>
         </w:rPr>
-        <w:t xml:space="preserve">Added permission to allow user to edit construction forecast as </w:t>
-      </w:r>
-      <w:proofErr w:type="gramStart"/>
-      <w:r>
-        <w:rPr>
-          <w:lang w:val="en-US"/>
-        </w:rPr>
-        <w:t>uncommitted</w:t>
-      </w:r>
-      <w:proofErr w:type="gramEnd"/>
+        <w:t>Added permission to allow user to edit construction forecast as uncommitted</w:t>
+      </w:r>
     </w:p>
     <w:p>
       <w:pPr>
@@ -5558,16 +5034,8 @@
         <w:rPr>
           <w:lang w:val="en-US"/>
         </w:rPr>
-        <w:t xml:space="preserve">shown after </w:t>
-      </w:r>
-      <w:proofErr w:type="gramStart"/>
-      <w:r>
-        <w:rPr>
-          <w:lang w:val="en-US"/>
-        </w:rPr>
-        <w:t>refresh</w:t>
-      </w:r>
-      <w:proofErr w:type="gramEnd"/>
+        <w:t>shown after refresh</w:t>
+      </w:r>
     </w:p>
     <w:p>
       <w:pPr>
@@ -5590,16 +5058,8 @@
         <w:rPr>
           <w:lang w:val="en-US"/>
         </w:rPr>
-        <w:t xml:space="preserve">how only active </w:t>
-      </w:r>
-      <w:proofErr w:type="gramStart"/>
-      <w:r>
-        <w:rPr>
-          <w:lang w:val="en-US"/>
-        </w:rPr>
-        <w:t>users</w:t>
-      </w:r>
-      <w:proofErr w:type="gramEnd"/>
+        <w:t>how only active users</w:t>
+      </w:r>
     </w:p>
     <w:p>
       <w:pPr>
@@ -5666,30 +5126,8 @@
         <w:rPr>
           <w:lang w:val="en-US"/>
         </w:rPr>
-        <w:t xml:space="preserve">ixed an issue where </w:t>
-      </w:r>
-      <w:proofErr w:type="spellStart"/>
-      <w:r>
-        <w:rPr>
-          <w:lang w:val="en-US"/>
-        </w:rPr>
-        <w:t>subjob</w:t>
-      </w:r>
-      <w:proofErr w:type="spellEnd"/>
-      <w:r>
-        <w:rPr>
-          <w:lang w:val="en-US"/>
-        </w:rPr>
-        <w:t xml:space="preserve"> variation code doesn't show up in book </w:t>
-      </w:r>
-      <w:proofErr w:type="gramStart"/>
-      <w:r>
-        <w:rPr>
-          <w:lang w:val="en-US"/>
-        </w:rPr>
-        <w:t>time</w:t>
-      </w:r>
-      <w:proofErr w:type="gramEnd"/>
+        <w:t>ixed an issue where subjob variation code doesn't show up in book time</w:t>
+      </w:r>
     </w:p>
     <w:p>
       <w:pPr>
@@ -5750,16 +5188,8 @@
         <w:rPr>
           <w:lang w:val="en-US"/>
         </w:rPr>
-        <w:t xml:space="preserve">Try to fix an issue where module loads partial </w:t>
-      </w:r>
-      <w:proofErr w:type="gramStart"/>
-      <w:r>
-        <w:rPr>
-          <w:lang w:val="en-US"/>
-        </w:rPr>
-        <w:t>data</w:t>
-      </w:r>
-      <w:proofErr w:type="gramEnd"/>
+        <w:t>Try to fix an issue where module loads partial data</w:t>
+      </w:r>
     </w:p>
     <w:p>
       <w:pPr>
@@ -5818,16 +5248,8 @@
         <w:rPr>
           <w:lang w:val="en-US"/>
         </w:rPr>
-        <w:t xml:space="preserve"> is caused by PF </w:t>
-      </w:r>
-      <w:proofErr w:type="gramStart"/>
-      <w:r>
-        <w:rPr>
-          <w:lang w:val="en-US"/>
-        </w:rPr>
-        <w:t>changes</w:t>
-      </w:r>
-      <w:proofErr w:type="gramEnd"/>
+        <w:t xml:space="preserve"> is caused by PF changes</w:t>
+      </w:r>
     </w:p>
     <w:p>
       <w:pPr>
@@ -5850,16 +5272,8 @@
         <w:rPr>
           <w:lang w:val="en-US"/>
         </w:rPr>
-        <w:t xml:space="preserve"> double </w:t>
-      </w:r>
-      <w:proofErr w:type="gramStart"/>
-      <w:r>
-        <w:rPr>
-          <w:lang w:val="en-US"/>
-        </w:rPr>
-        <w:t>up</w:t>
-      </w:r>
-      <w:proofErr w:type="gramEnd"/>
+        <w:t xml:space="preserve"> double up</w:t>
+      </w:r>
     </w:p>
     <w:p>
       <w:pPr>
@@ -5918,16 +5332,8 @@
         <w:rPr>
           <w:lang w:val="en-US"/>
         </w:rPr>
-        <w:t xml:space="preserve">llow construction jobs cells to be edited when P6 project doesn't </w:t>
-      </w:r>
-      <w:proofErr w:type="gramStart"/>
-      <w:r>
-        <w:rPr>
-          <w:lang w:val="en-US"/>
-        </w:rPr>
-        <w:t>exists</w:t>
-      </w:r>
-      <w:proofErr w:type="gramEnd"/>
+        <w:t>llow construction jobs cells to be edited when P6 project doesn't exists</w:t>
+      </w:r>
     </w:p>
     <w:p>
       <w:pPr>
@@ -5968,16 +5374,8 @@
         <w:rPr>
           <w:rFonts w:cs="Calibri"/>
         </w:rPr>
-        <w:t xml:space="preserve">Allow user with permission to edit Exo -&gt; Transaction </w:t>
-      </w:r>
-      <w:proofErr w:type="gramStart"/>
-      <w:r>
-        <w:rPr>
-          <w:rFonts w:cs="Calibri"/>
-        </w:rPr>
-        <w:t>quantity</w:t>
-      </w:r>
-      <w:proofErr w:type="gramEnd"/>
+        <w:t>Allow user with permission to edit Exo -&gt; Transaction quantity</w:t>
+      </w:r>
     </w:p>
     <w:p>
       <w:pPr>
@@ -5991,35 +5389,7 @@
         <w:rPr>
           <w:rFonts w:cs="Calibri"/>
         </w:rPr>
-        <w:t xml:space="preserve">Editing Exo -&gt; Transaction quantity will adjust line cost, line charge, line total, line total tax, line tax and </w:t>
-      </w:r>
-      <w:proofErr w:type="spellStart"/>
-      <w:r>
-        <w:rPr>
-          <w:rFonts w:cs="Calibri"/>
-        </w:rPr>
-        <w:t>linetotal</w:t>
-      </w:r>
-      <w:proofErr w:type="spellEnd"/>
-      <w:r>
-        <w:rPr>
-          <w:rFonts w:cs="Calibri"/>
-        </w:rPr>
-        <w:t xml:space="preserve"> </w:t>
-      </w:r>
-      <w:proofErr w:type="spellStart"/>
-      <w:r>
-        <w:rPr>
-          <w:rFonts w:cs="Calibri"/>
-        </w:rPr>
-        <w:t>incl</w:t>
-      </w:r>
-      <w:proofErr w:type="spellEnd"/>
-      <w:r>
-        <w:rPr>
-          <w:rFonts w:cs="Calibri"/>
-        </w:rPr>
-        <w:t xml:space="preserve"> tax in EXO</w:t>
+        <w:t>Editing Exo -&gt; Transaction quantity will adjust line cost, line charge, line total, line total tax, line tax and linetotal incl tax in EXO</w:t>
       </w:r>
     </w:p>
     <w:p>
@@ -6037,21 +5407,7 @@
         <w:rPr>
           <w:rFonts w:cs="Calibri"/>
         </w:rPr>
-        <w:t xml:space="preserve">narrative will be saved on day with hours so that when </w:t>
-      </w:r>
-      <w:proofErr w:type="gramStart"/>
-      <w:r>
-        <w:rPr>
-          <w:rFonts w:cs="Calibri"/>
-        </w:rPr>
-        <w:t>it’s</w:t>
-      </w:r>
-      <w:proofErr w:type="gramEnd"/>
-      <w:r>
-        <w:rPr>
-          <w:rFonts w:cs="Calibri"/>
-        </w:rPr>
-        <w:t xml:space="preserve"> approved the narrative will be transferred over</w:t>
+        <w:t>narrative will be saved on day with hours so that when it’s approved the narrative will be transferred over</w:t>
       </w:r>
     </w:p>
     <w:p>
@@ -6113,16 +5469,8 @@
         <w:rPr>
           <w:lang w:val="en-US"/>
         </w:rPr>
-        <w:t xml:space="preserve">Highlight duplicate client number in </w:t>
-      </w:r>
-      <w:proofErr w:type="gramStart"/>
-      <w:r>
-        <w:rPr>
-          <w:lang w:val="en-US"/>
-        </w:rPr>
-        <w:t>red</w:t>
-      </w:r>
-      <w:proofErr w:type="gramEnd"/>
+        <w:t>Highlight duplicate client number in red</w:t>
+      </w:r>
     </w:p>
     <w:p>
       <w:pPr>
@@ -6139,16 +5487,8 @@
         <w:rPr>
           <w:lang w:val="en-US"/>
         </w:rPr>
-        <w:t xml:space="preserve">Book Time dialog loads faster for user that doesn’t have authority to book time for other </w:t>
-      </w:r>
-      <w:proofErr w:type="gramStart"/>
-      <w:r>
-        <w:rPr>
-          <w:lang w:val="en-US"/>
-        </w:rPr>
-        <w:t>users</w:t>
-      </w:r>
-      <w:proofErr w:type="gramEnd"/>
+        <w:t>Book Time dialog loads faster for user that doesn’t have authority to book time for other users</w:t>
+      </w:r>
     </w:p>
     <w:p>
       <w:pPr>
@@ -6222,16 +5562,8 @@
         <w:rPr>
           <w:lang w:val="en-US"/>
         </w:rPr>
-        <w:t xml:space="preserve">Uncommitted values can only be entered on procurement </w:t>
-      </w:r>
-      <w:proofErr w:type="gramStart"/>
-      <w:r>
-        <w:rPr>
-          <w:lang w:val="en-US"/>
-        </w:rPr>
-        <w:t>jobs</w:t>
-      </w:r>
-      <w:proofErr w:type="gramEnd"/>
+        <w:t>Uncommitted values can only be entered on procurement jobs</w:t>
+      </w:r>
     </w:p>
     <w:p>
       <w:pPr>
@@ -6248,16 +5580,8 @@
         <w:rPr>
           <w:lang w:val="en-US"/>
         </w:rPr>
-        <w:t xml:space="preserve">Pasting uncommitted values on non-procurement jobs will show no </w:t>
-      </w:r>
-      <w:proofErr w:type="gramStart"/>
-      <w:r>
-        <w:rPr>
-          <w:lang w:val="en-US"/>
-        </w:rPr>
-        <w:t>results</w:t>
-      </w:r>
-      <w:proofErr w:type="gramEnd"/>
+        <w:t>Pasting uncommitted values on non-procurement jobs will show no results</w:t>
+      </w:r>
     </w:p>
     <w:p>
       <w:pPr>
@@ -6297,7 +5621,7 @@
 </file>
 
 <file path=word/numbering.xml><?xml version="1.0" encoding="utf-8"?>
-<w:numbering xmlns:wpc="http://schemas.microsoft.com/office/word/2010/wordprocessingCanvas" xmlns:cx="http://schemas.microsoft.com/office/drawing/2014/chartex" xmlns:cx1="http://schemas.microsoft.com/office/drawing/2015/9/8/chartex" xmlns:cx2="http://schemas.microsoft.com/office/drawing/2015/10/21/chartex" xmlns:cx3="http://schemas.microsoft.com/office/drawing/2016/5/9/chartex" xmlns:cx4="http://schemas.microsoft.com/office/drawing/2016/5/10/chartex" xmlns:cx5="http://schemas.microsoft.com/office/drawing/2016/5/11/chartex" xmlns:cx6="http://schemas.microsoft.com/office/drawing/2016/5/12/chartex" xmlns:cx7="http://schemas.microsoft.com/office/drawing/2016/5/13/chartex" xmlns:cx8="http://schemas.microsoft.com/office/drawing/2016/5/14/chartex" xmlns:mc="http://schemas.openxmlformats.org/markup-compatibility/2006" xmlns:aink="http://schemas.microsoft.com/office/drawing/2016/ink" xmlns:am3d="http://schemas.microsoft.com/office/drawing/2017/model3d" xmlns:o="urn:schemas-microsoft-com:office:office" xmlns:r="http://schemas.openxmlformats.org/officeDocument/2006/relationships" xmlns:m="http://schemas.openxmlformats.org/officeDocument/2006/math" xmlns:v="urn:schemas-microsoft-com:vml" xmlns:wp14="http://schemas.microsoft.com/office/word/2010/wordprocessingDrawing" xmlns:wp="http://schemas.openxmlformats.org/drawingml/2006/wordprocessingDrawing" xmlns:w10="urn:schemas-microsoft-com:office:word" xmlns:w="http://schemas.openxmlformats.org/wordprocessingml/2006/main" xmlns:w14="http://schemas.microsoft.com/office/word/2010/wordml" xmlns:w15="http://schemas.microsoft.com/office/word/2012/wordml" xmlns:w16cex="http://schemas.microsoft.com/office/word/2018/wordml/cex" xmlns:w16cid="http://schemas.microsoft.com/office/word/2016/wordml/cid" xmlns:w16="http://schemas.microsoft.com/office/word/2018/wordml" xmlns:w16sdtdh="http://schemas.microsoft.com/office/word/2020/wordml/sdtdatahash" xmlns:w16se="http://schemas.microsoft.com/office/word/2015/wordml/symex" xmlns:wpg="http://schemas.microsoft.com/office/word/2010/wordprocessingGroup" xmlns:wpi="http://schemas.microsoft.com/office/word/2010/wordprocessingInk" xmlns:wne="http://schemas.microsoft.com/office/word/2006/wordml" xmlns:wps="http://schemas.microsoft.com/office/word/2010/wordprocessingShape" mc:Ignorable="w14 w15 w16se w16cid w16 w16cex w16sdtdh wp14">
+<w:numbering xmlns:wpc="http://schemas.microsoft.com/office/word/2010/wordprocessingCanvas" xmlns:cx="http://schemas.microsoft.com/office/drawing/2014/chartex" xmlns:cx1="http://schemas.microsoft.com/office/drawing/2015/9/8/chartex" xmlns:cx2="http://schemas.microsoft.com/office/drawing/2015/10/21/chartex" xmlns:cx3="http://schemas.microsoft.com/office/drawing/2016/5/9/chartex" xmlns:cx4="http://schemas.microsoft.com/office/drawing/2016/5/10/chartex" xmlns:cx5="http://schemas.microsoft.com/office/drawing/2016/5/11/chartex" xmlns:cx6="http://schemas.microsoft.com/office/drawing/2016/5/12/chartex" xmlns:cx7="http://schemas.microsoft.com/office/drawing/2016/5/13/chartex" xmlns:cx8="http://schemas.microsoft.com/office/drawing/2016/5/14/chartex" xmlns:mc="http://schemas.openxmlformats.org/markup-compatibility/2006" xmlns:aink="http://schemas.microsoft.com/office/drawing/2016/ink" xmlns:am3d="http://schemas.microsoft.com/office/drawing/2017/model3d" xmlns:o="urn:schemas-microsoft-com:office:office" xmlns:r="http://schemas.openxmlformats.org/officeDocument/2006/relationships" xmlns:m="http://schemas.openxmlformats.org/officeDocument/2006/math" xmlns:v="urn:schemas-microsoft-com:vml" xmlns:wp14="http://schemas.microsoft.com/office/word/2010/wordprocessingDrawing" xmlns:wp="http://schemas.openxmlformats.org/drawingml/2006/wordprocessingDrawing" xmlns:w10="urn:schemas-microsoft-com:office:word" xmlns:w="http://schemas.openxmlformats.org/wordprocessingml/2006/main" xmlns:w14="http://schemas.microsoft.com/office/word/2010/wordml" xmlns:w15="http://schemas.microsoft.com/office/word/2012/wordml" xmlns:w16cex="http://schemas.microsoft.com/office/word/2018/wordml/cex" xmlns:w16cid="http://schemas.microsoft.com/office/word/2016/wordml/cid" xmlns:w16="http://schemas.microsoft.com/office/word/2018/wordml" xmlns:w16se="http://schemas.microsoft.com/office/word/2015/wordml/symex" xmlns:wpg="http://schemas.microsoft.com/office/word/2010/wordprocessingGroup" xmlns:wpi="http://schemas.microsoft.com/office/word/2010/wordprocessingInk" xmlns:wne="http://schemas.microsoft.com/office/word/2006/wordml" xmlns:wps="http://schemas.microsoft.com/office/word/2010/wordprocessingShape" mc:Ignorable="w14 w15 w16se w16cid w16 w16cex wp14">
   <w:abstractNum w:abstractNumId="0" w15:restartNumberingAfterBreak="0">
     <w:nsid w:val="02FA5961"/>
     <w:multiLevelType w:val="hybridMultilevel"/>
@@ -11687,7 +11011,7 @@
 </file>
 
 <file path=word/styles.xml><?xml version="1.0" encoding="utf-8"?>
-<w:styles xmlns:mc="http://schemas.openxmlformats.org/markup-compatibility/2006" xmlns:r="http://schemas.openxmlformats.org/officeDocument/2006/relationships" xmlns:w="http://schemas.openxmlformats.org/wordprocessingml/2006/main" xmlns:w14="http://schemas.microsoft.com/office/word/2010/wordml" xmlns:w15="http://schemas.microsoft.com/office/word/2012/wordml" xmlns:w16cex="http://schemas.microsoft.com/office/word/2018/wordml/cex" xmlns:w16cid="http://schemas.microsoft.com/office/word/2016/wordml/cid" xmlns:w16="http://schemas.microsoft.com/office/word/2018/wordml" xmlns:w16sdtdh="http://schemas.microsoft.com/office/word/2020/wordml/sdtdatahash" xmlns:w16se="http://schemas.microsoft.com/office/word/2015/wordml/symex" mc:Ignorable="w14 w15 w16se w16cid w16 w16cex w16sdtdh">
+<w:styles xmlns:mc="http://schemas.openxmlformats.org/markup-compatibility/2006" xmlns:r="http://schemas.openxmlformats.org/officeDocument/2006/relationships" xmlns:w="http://schemas.openxmlformats.org/wordprocessingml/2006/main" xmlns:w14="http://schemas.microsoft.com/office/word/2010/wordml" xmlns:w15="http://schemas.microsoft.com/office/word/2012/wordml" xmlns:w16cex="http://schemas.microsoft.com/office/word/2018/wordml/cex" xmlns:w16cid="http://schemas.microsoft.com/office/word/2016/wordml/cid" xmlns:w16="http://schemas.microsoft.com/office/word/2018/wordml" xmlns:w16se="http://schemas.microsoft.com/office/word/2015/wordml/symex" mc:Ignorable="w14 w15 w16se w16cid w16 w16cex">
   <w:docDefaults>
     <w:rPrDefault>
       <w:rPr>

</xml_diff>

<commit_message>
- revert to DevExpress 19.2 to remedy issue with missing panel in certain devices
</commit_message>
<xml_diff>
--- a/BluePrints/Views/ChangeLog.docx
+++ b/BluePrints/Views/ChangeLog.docx
@@ -1,6 +1,6 @@
 
 <file path=word/document.xml><?xml version="1.0" encoding="utf-8"?>
-<w:document xmlns:wpc="http://schemas.microsoft.com/office/word/2010/wordprocessingCanvas" xmlns:cx="http://schemas.microsoft.com/office/drawing/2014/chartex" xmlns:cx1="http://schemas.microsoft.com/office/drawing/2015/9/8/chartex" xmlns:cx2="http://schemas.microsoft.com/office/drawing/2015/10/21/chartex" xmlns:cx3="http://schemas.microsoft.com/office/drawing/2016/5/9/chartex" xmlns:cx4="http://schemas.microsoft.com/office/drawing/2016/5/10/chartex" xmlns:cx5="http://schemas.microsoft.com/office/drawing/2016/5/11/chartex" xmlns:cx6="http://schemas.microsoft.com/office/drawing/2016/5/12/chartex" xmlns:cx7="http://schemas.microsoft.com/office/drawing/2016/5/13/chartex" xmlns:cx8="http://schemas.microsoft.com/office/drawing/2016/5/14/chartex" xmlns:mc="http://schemas.openxmlformats.org/markup-compatibility/2006" xmlns:aink="http://schemas.microsoft.com/office/drawing/2016/ink" xmlns:am3d="http://schemas.microsoft.com/office/drawing/2017/model3d" xmlns:o="urn:schemas-microsoft-com:office:office" xmlns:r="http://schemas.openxmlformats.org/officeDocument/2006/relationships" xmlns:m="http://schemas.openxmlformats.org/officeDocument/2006/math" xmlns:v="urn:schemas-microsoft-com:vml" xmlns:wp14="http://schemas.microsoft.com/office/word/2010/wordprocessingDrawing" xmlns:wp="http://schemas.openxmlformats.org/drawingml/2006/wordprocessingDrawing" xmlns:w10="urn:schemas-microsoft-com:office:word" xmlns:w="http://schemas.openxmlformats.org/wordprocessingml/2006/main" xmlns:w14="http://schemas.microsoft.com/office/word/2010/wordml" xmlns:w15="http://schemas.microsoft.com/office/word/2012/wordml" xmlns:w16cex="http://schemas.microsoft.com/office/word/2018/wordml/cex" xmlns:w16cid="http://schemas.microsoft.com/office/word/2016/wordml/cid" xmlns:w16="http://schemas.microsoft.com/office/word/2018/wordml" xmlns:w16se="http://schemas.microsoft.com/office/word/2015/wordml/symex" xmlns:wpg="http://schemas.microsoft.com/office/word/2010/wordprocessingGroup" xmlns:wpi="http://schemas.microsoft.com/office/word/2010/wordprocessingInk" xmlns:wne="http://schemas.microsoft.com/office/word/2006/wordml" xmlns:wps="http://schemas.microsoft.com/office/word/2010/wordprocessingShape" mc:Ignorable="w14 w15 w16se w16cid w16 w16cex wp14">
+<w:document xmlns:wpc="http://schemas.microsoft.com/office/word/2010/wordprocessingCanvas" xmlns:cx="http://schemas.microsoft.com/office/drawing/2014/chartex" xmlns:cx1="http://schemas.microsoft.com/office/drawing/2015/9/8/chartex" xmlns:cx2="http://schemas.microsoft.com/office/drawing/2015/10/21/chartex" xmlns:cx3="http://schemas.microsoft.com/office/drawing/2016/5/9/chartex" xmlns:cx4="http://schemas.microsoft.com/office/drawing/2016/5/10/chartex" xmlns:cx5="http://schemas.microsoft.com/office/drawing/2016/5/11/chartex" xmlns:cx6="http://schemas.microsoft.com/office/drawing/2016/5/12/chartex" xmlns:cx7="http://schemas.microsoft.com/office/drawing/2016/5/13/chartex" xmlns:cx8="http://schemas.microsoft.com/office/drawing/2016/5/14/chartex" xmlns:mc="http://schemas.openxmlformats.org/markup-compatibility/2006" xmlns:aink="http://schemas.microsoft.com/office/drawing/2016/ink" xmlns:am3d="http://schemas.microsoft.com/office/drawing/2017/model3d" xmlns:o="urn:schemas-microsoft-com:office:office" xmlns:r="http://schemas.openxmlformats.org/officeDocument/2006/relationships" xmlns:m="http://schemas.openxmlformats.org/officeDocument/2006/math" xmlns:v="urn:schemas-microsoft-com:vml" xmlns:wp14="http://schemas.microsoft.com/office/word/2010/wordprocessingDrawing" xmlns:wp="http://schemas.openxmlformats.org/drawingml/2006/wordprocessingDrawing" xmlns:w10="urn:schemas-microsoft-com:office:word" xmlns:w="http://schemas.openxmlformats.org/wordprocessingml/2006/main" xmlns:w14="http://schemas.microsoft.com/office/word/2010/wordml" xmlns:w15="http://schemas.microsoft.com/office/word/2012/wordml" xmlns:w16cex="http://schemas.microsoft.com/office/word/2018/wordml/cex" xmlns:w16cid="http://schemas.microsoft.com/office/word/2016/wordml/cid" xmlns:w16="http://schemas.microsoft.com/office/word/2018/wordml" xmlns:w16sdtdh="http://schemas.microsoft.com/office/word/2020/wordml/sdtdatahash" xmlns:w16se="http://schemas.microsoft.com/office/word/2015/wordml/symex" xmlns:wpg="http://schemas.microsoft.com/office/word/2010/wordprocessingGroup" xmlns:wpi="http://schemas.microsoft.com/office/word/2010/wordprocessingInk" xmlns:wne="http://schemas.microsoft.com/office/word/2006/wordml" xmlns:wps="http://schemas.microsoft.com/office/word/2010/wordprocessingShape" mc:Ignorable="w14 w15 w16se w16cid w16 w16cex w16sdtdh wp14">
   <w:body>
     <w:p>
       <w:pPr>
@@ -12,6 +12,354 @@
         <w:rPr>
           <w:lang w:val="en-US"/>
         </w:rPr>
+        <w:t>Change Log 1</w:t>
+      </w:r>
+      <w:r>
+        <w:rPr>
+          <w:vertAlign w:val="superscript"/>
+          <w:lang w:val="en-US"/>
+        </w:rPr>
+        <w:t>st</w:t>
+      </w:r>
+      <w:r>
+        <w:rPr>
+          <w:lang w:val="en-US"/>
+        </w:rPr>
+        <w:t xml:space="preserve"> Sep 2021</w:t>
+      </w:r>
+    </w:p>
+    <w:p>
+      <w:pPr>
+        <w:pStyle w:val="ListParagraph"/>
+        <w:numPr>
+          <w:ilvl w:val="0"/>
+          <w:numId w:val="48"/>
+        </w:numPr>
+        <w:rPr>
+          <w:lang w:val="en-US"/>
+        </w:rPr>
+      </w:pPr>
+      <w:r>
+        <w:rPr>
+          <w:lang w:val="en-US"/>
+        </w:rPr>
+        <w:t>Rates</w:t>
+      </w:r>
+    </w:p>
+    <w:p>
+      <w:pPr>
+        <w:pStyle w:val="ListParagraph"/>
+        <w:numPr>
+          <w:ilvl w:val="1"/>
+          <w:numId w:val="48"/>
+        </w:numPr>
+        <w:rPr>
+          <w:lang w:val="en-US"/>
+        </w:rPr>
+      </w:pPr>
+      <w:r>
+        <w:rPr>
+          <w:lang w:val="en-US"/>
+        </w:rPr>
+        <w:t>Rates for design has been moved into design category</w:t>
+      </w:r>
+    </w:p>
+    <w:p>
+      <w:pPr>
+        <w:pStyle w:val="ListParagraph"/>
+        <w:numPr>
+          <w:ilvl w:val="1"/>
+          <w:numId w:val="48"/>
+        </w:numPr>
+        <w:rPr>
+          <w:lang w:val="en-US"/>
+        </w:rPr>
+      </w:pPr>
+      <w:r>
+        <w:rPr>
+          <w:lang w:val="en-US"/>
+        </w:rPr>
+        <w:t>Old</w:t>
+      </w:r>
+    </w:p>
+    <w:p>
+      <w:pPr>
+        <w:pStyle w:val="ListParagraph"/>
+        <w:ind w:left="1440"/>
+        <w:rPr>
+          <w:lang w:val="en-US"/>
+        </w:rPr>
+      </w:pPr>
+      <w:r>
+        <w:rPr>
+          <w:noProof/>
+          <w:lang w:val="en-US"/>
+        </w:rPr>
+        <w:drawing>
+          <wp:inline distT="0" distB="0" distL="0" distR="0" wp14:anchorId="2AEDFE7C" wp14:editId="47A57862">
+            <wp:extent cx="3710940" cy="3665220"/>
+            <wp:effectExtent l="0" t="0" r="3810" b="0"/>
+            <wp:docPr id="29" name="Picture 29"/>
+            <wp:cNvGraphicFramePr>
+              <a:graphicFrameLocks xmlns:a="http://schemas.openxmlformats.org/drawingml/2006/main" noChangeAspect="1"/>
+            </wp:cNvGraphicFramePr>
+            <a:graphic xmlns:a="http://schemas.openxmlformats.org/drawingml/2006/main">
+              <a:graphicData uri="http://schemas.openxmlformats.org/drawingml/2006/picture">
+                <pic:pic xmlns:pic="http://schemas.openxmlformats.org/drawingml/2006/picture">
+                  <pic:nvPicPr>
+                    <pic:cNvPr id="0" name="Picture 1"/>
+                    <pic:cNvPicPr>
+                      <a:picLocks noChangeAspect="1" noChangeArrowheads="1"/>
+                    </pic:cNvPicPr>
+                  </pic:nvPicPr>
+                  <pic:blipFill>
+                    <a:blip r:embed="rId5">
+                      <a:extLst>
+                        <a:ext uri="{28A0092B-C50C-407E-A947-70E740481C1C}">
+                          <a14:useLocalDpi xmlns:a14="http://schemas.microsoft.com/office/drawing/2010/main" val="0"/>
+                        </a:ext>
+                      </a:extLst>
+                    </a:blip>
+                    <a:srcRect/>
+                    <a:stretch>
+                      <a:fillRect/>
+                    </a:stretch>
+                  </pic:blipFill>
+                  <pic:spPr bwMode="auto">
+                    <a:xfrm>
+                      <a:off x="0" y="0"/>
+                      <a:ext cx="3710940" cy="3665220"/>
+                    </a:xfrm>
+                    <a:prstGeom prst="rect">
+                      <a:avLst/>
+                    </a:prstGeom>
+                    <a:noFill/>
+                    <a:ln>
+                      <a:noFill/>
+                    </a:ln>
+                  </pic:spPr>
+                </pic:pic>
+              </a:graphicData>
+            </a:graphic>
+          </wp:inline>
+        </w:drawing>
+      </w:r>
+    </w:p>
+    <w:p>
+      <w:pPr>
+        <w:pStyle w:val="ListParagraph"/>
+        <w:numPr>
+          <w:ilvl w:val="1"/>
+          <w:numId w:val="48"/>
+        </w:numPr>
+        <w:rPr>
+          <w:lang w:val="en-US"/>
+        </w:rPr>
+      </w:pPr>
+      <w:r>
+        <w:rPr>
+          <w:lang w:val="en-US"/>
+        </w:rPr>
+        <w:t>New</w:t>
+      </w:r>
+    </w:p>
+    <w:p>
+      <w:pPr>
+        <w:pStyle w:val="ListParagraph"/>
+        <w:numPr>
+          <w:ilvl w:val="1"/>
+          <w:numId w:val="48"/>
+        </w:numPr>
+        <w:rPr>
+          <w:lang w:val="en-US"/>
+        </w:rPr>
+      </w:pPr>
+      <w:r>
+        <w:rPr>
+          <w:noProof/>
+          <w:lang w:val="en-US"/>
+        </w:rPr>
+        <w:drawing>
+          <wp:inline distT="0" distB="0" distL="0" distR="0" wp14:anchorId="6031ADD3" wp14:editId="4CE149EC">
+            <wp:extent cx="2458098" cy="3489960"/>
+            <wp:effectExtent l="0" t="0" r="0" b="0"/>
+            <wp:docPr id="30" name="Picture 30"/>
+            <wp:cNvGraphicFramePr>
+              <a:graphicFrameLocks xmlns:a="http://schemas.openxmlformats.org/drawingml/2006/main" noChangeAspect="1"/>
+            </wp:cNvGraphicFramePr>
+            <a:graphic xmlns:a="http://schemas.openxmlformats.org/drawingml/2006/main">
+              <a:graphicData uri="http://schemas.openxmlformats.org/drawingml/2006/picture">
+                <pic:pic xmlns:pic="http://schemas.openxmlformats.org/drawingml/2006/picture">
+                  <pic:nvPicPr>
+                    <pic:cNvPr id="0" name="Picture 2"/>
+                    <pic:cNvPicPr>
+                      <a:picLocks noChangeAspect="1" noChangeArrowheads="1"/>
+                    </pic:cNvPicPr>
+                  </pic:nvPicPr>
+                  <pic:blipFill>
+                    <a:blip r:embed="rId6">
+                      <a:extLst>
+                        <a:ext uri="{28A0092B-C50C-407E-A947-70E740481C1C}">
+                          <a14:useLocalDpi xmlns:a14="http://schemas.microsoft.com/office/drawing/2010/main" val="0"/>
+                        </a:ext>
+                      </a:extLst>
+                    </a:blip>
+                    <a:srcRect/>
+                    <a:stretch>
+                      <a:fillRect/>
+                    </a:stretch>
+                  </pic:blipFill>
+                  <pic:spPr bwMode="auto">
+                    <a:xfrm>
+                      <a:off x="0" y="0"/>
+                      <a:ext cx="2461760" cy="3495159"/>
+                    </a:xfrm>
+                    <a:prstGeom prst="rect">
+                      <a:avLst/>
+                    </a:prstGeom>
+                    <a:noFill/>
+                    <a:ln>
+                      <a:noFill/>
+                    </a:ln>
+                  </pic:spPr>
+                </pic:pic>
+              </a:graphicData>
+            </a:graphic>
+          </wp:inline>
+        </w:drawing>
+      </w:r>
+    </w:p>
+    <w:p>
+      <w:pPr>
+        <w:pStyle w:val="ListParagraph"/>
+        <w:numPr>
+          <w:ilvl w:val="0"/>
+          <w:numId w:val="48"/>
+        </w:numPr>
+        <w:rPr>
+          <w:lang w:val="en-US"/>
+        </w:rPr>
+      </w:pPr>
+      <w:r>
+        <w:rPr>
+          <w:lang w:val="en-US"/>
+        </w:rPr>
+        <w:t>Improved S-Curve/Forecast loading</w:t>
+      </w:r>
+    </w:p>
+    <w:p>
+      <w:pPr>
+        <w:ind w:left="360"/>
+        <w:rPr>
+          <w:lang w:val="en-US"/>
+        </w:rPr>
+      </w:pPr>
+    </w:p>
+    <w:p>
+      <w:pPr>
+        <w:pStyle w:val="ListParagraph"/>
+        <w:numPr>
+          <w:ilvl w:val="0"/>
+          <w:numId w:val="48"/>
+        </w:numPr>
+        <w:rPr>
+          <w:lang w:val="en-US"/>
+        </w:rPr>
+      </w:pPr>
+      <w:r>
+        <w:rPr>
+          <w:lang w:val="en-US"/>
+        </w:rPr>
+        <w:lastRenderedPageBreak/>
+        <w:t>Added Equipment Hire PO forecast which allows forecasting by stock code</w:t>
+      </w:r>
+    </w:p>
+    <w:p>
+      <w:pPr>
+        <w:pStyle w:val="ListParagraph"/>
+        <w:rPr>
+          <w:lang w:val="en-US"/>
+        </w:rPr>
+      </w:pPr>
+      <w:r>
+        <w:rPr>
+          <w:noProof/>
+          <w:lang w:val="en-US"/>
+        </w:rPr>
+        <w:drawing>
+          <wp:inline distT="0" distB="0" distL="0" distR="0" wp14:anchorId="0C0D0C34" wp14:editId="6809D0B1">
+            <wp:extent cx="5715000" cy="4000500"/>
+            <wp:effectExtent l="0" t="0" r="0" b="0"/>
+            <wp:docPr id="31" name="Picture 31"/>
+            <wp:cNvGraphicFramePr>
+              <a:graphicFrameLocks xmlns:a="http://schemas.openxmlformats.org/drawingml/2006/main" noChangeAspect="1"/>
+            </wp:cNvGraphicFramePr>
+            <a:graphic xmlns:a="http://schemas.openxmlformats.org/drawingml/2006/main">
+              <a:graphicData uri="http://schemas.openxmlformats.org/drawingml/2006/picture">
+                <pic:pic xmlns:pic="http://schemas.openxmlformats.org/drawingml/2006/picture">
+                  <pic:nvPicPr>
+                    <pic:cNvPr id="0" name="Picture 3"/>
+                    <pic:cNvPicPr>
+                      <a:picLocks noChangeAspect="1" noChangeArrowheads="1"/>
+                    </pic:cNvPicPr>
+                  </pic:nvPicPr>
+                  <pic:blipFill>
+                    <a:blip r:embed="rId7" cstate="print">
+                      <a:extLst>
+                        <a:ext uri="{28A0092B-C50C-407E-A947-70E740481C1C}">
+                          <a14:useLocalDpi xmlns:a14="http://schemas.microsoft.com/office/drawing/2010/main" val="0"/>
+                        </a:ext>
+                      </a:extLst>
+                    </a:blip>
+                    <a:srcRect/>
+                    <a:stretch>
+                      <a:fillRect/>
+                    </a:stretch>
+                  </pic:blipFill>
+                  <pic:spPr bwMode="auto">
+                    <a:xfrm>
+                      <a:off x="0" y="0"/>
+                      <a:ext cx="5715000" cy="4000500"/>
+                    </a:xfrm>
+                    <a:prstGeom prst="rect">
+                      <a:avLst/>
+                    </a:prstGeom>
+                    <a:noFill/>
+                    <a:ln>
+                      <a:noFill/>
+                    </a:ln>
+                  </pic:spPr>
+                </pic:pic>
+              </a:graphicData>
+            </a:graphic>
+          </wp:inline>
+        </w:drawing>
+      </w:r>
+    </w:p>
+    <w:p>
+      <w:pPr>
+        <w:rPr>
+          <w:lang w:val="en-US"/>
+        </w:rPr>
+      </w:pPr>
+      <w:r>
+        <w:rPr>
+          <w:lang w:val="en-US"/>
+        </w:rPr>
+        <w:br w:type="page"/>
+      </w:r>
+    </w:p>
+    <w:p>
+      <w:pPr>
+        <w:rPr>
+          <w:lang w:val="en-US"/>
+        </w:rPr>
+      </w:pPr>
+      <w:r>
+        <w:rPr>
+          <w:lang w:val="en-US"/>
+        </w:rPr>
+        <w:lastRenderedPageBreak/>
         <w:t>Change Log 8</w:t>
       </w:r>
       <w:r>
@@ -155,7 +503,7 @@
                     </pic:cNvPicPr>
                   </pic:nvPicPr>
                   <pic:blipFill>
-                    <a:blip r:embed="rId5" cstate="print">
+                    <a:blip r:embed="rId8" cstate="print">
                       <a:extLst>
                         <a:ext uri="{28A0092B-C50C-407E-A947-70E740481C1C}">
                           <a14:useLocalDpi xmlns:a14="http://schemas.microsoft.com/office/drawing/2010/main" val="0"/>
@@ -280,7 +628,7 @@
                     </pic:cNvPicPr>
                   </pic:nvPicPr>
                   <pic:blipFill>
-                    <a:blip r:embed="rId6" cstate="print">
+                    <a:blip r:embed="rId9" cstate="print">
                       <a:extLst>
                         <a:ext uri="{28A0092B-C50C-407E-A947-70E740481C1C}">
                           <a14:useLocalDpi xmlns:a14="http://schemas.microsoft.com/office/drawing/2010/main" val="0"/>
@@ -419,7 +767,7 @@
                     </pic:cNvPicPr>
                   </pic:nvPicPr>
                   <pic:blipFill>
-                    <a:blip r:embed="rId7" cstate="print">
+                    <a:blip r:embed="rId10" cstate="print">
                       <a:extLst>
                         <a:ext uri="{28A0092B-C50C-407E-A947-70E740481C1C}">
                           <a14:useLocalDpi xmlns:a14="http://schemas.microsoft.com/office/drawing/2010/main" val="0"/>
@@ -518,7 +866,7 @@
                     </pic:cNvPicPr>
                   </pic:nvPicPr>
                   <pic:blipFill>
-                    <a:blip r:embed="rId8" cstate="print">
+                    <a:blip r:embed="rId11" cstate="print">
                       <a:extLst>
                         <a:ext uri="{28A0092B-C50C-407E-A947-70E740481C1C}">
                           <a14:useLocalDpi xmlns:a14="http://schemas.microsoft.com/office/drawing/2010/main" val="0"/>
@@ -624,7 +972,7 @@
                     </pic:cNvPicPr>
                   </pic:nvPicPr>
                   <pic:blipFill>
-                    <a:blip r:embed="rId9" cstate="print">
+                    <a:blip r:embed="rId12" cstate="print">
                       <a:extLst>
                         <a:ext uri="{28A0092B-C50C-407E-A947-70E740481C1C}">
                           <a14:useLocalDpi xmlns:a14="http://schemas.microsoft.com/office/drawing/2010/main" val="0"/>
@@ -731,7 +1079,7 @@
                     </pic:cNvPicPr>
                   </pic:nvPicPr>
                   <pic:blipFill>
-                    <a:blip r:embed="rId10">
+                    <a:blip r:embed="rId13">
                       <a:extLst>
                         <a:ext uri="{28A0092B-C50C-407E-A947-70E740481C1C}">
                           <a14:useLocalDpi xmlns:a14="http://schemas.microsoft.com/office/drawing/2010/main" val="0"/>
@@ -903,7 +1251,7 @@
                     </pic:cNvPicPr>
                   </pic:nvPicPr>
                   <pic:blipFill>
-                    <a:blip r:embed="rId11">
+                    <a:blip r:embed="rId14">
                       <a:extLst>
                         <a:ext uri="{28A0092B-C50C-407E-A947-70E740481C1C}">
                           <a14:useLocalDpi xmlns:a14="http://schemas.microsoft.com/office/drawing/2010/main" val="0"/>
@@ -971,7 +1319,7 @@
                     </pic:cNvPicPr>
                   </pic:nvPicPr>
                   <pic:blipFill>
-                    <a:blip r:embed="rId12">
+                    <a:blip r:embed="rId15">
                       <a:extLst>
                         <a:ext uri="{28A0092B-C50C-407E-A947-70E740481C1C}">
                           <a14:useLocalDpi xmlns:a14="http://schemas.microsoft.com/office/drawing/2010/main" val="0"/>
@@ -1169,7 +1517,7 @@
                     </pic:cNvPicPr>
                   </pic:nvPicPr>
                   <pic:blipFill>
-                    <a:blip r:embed="rId13">
+                    <a:blip r:embed="rId16">
                       <a:extLst>
                         <a:ext uri="{28A0092B-C50C-407E-A947-70E740481C1C}">
                           <a14:useLocalDpi xmlns:a14="http://schemas.microsoft.com/office/drawing/2010/main" val="0"/>
@@ -1267,7 +1615,7 @@
                     </pic:cNvPicPr>
                   </pic:nvPicPr>
                   <pic:blipFill>
-                    <a:blip r:embed="rId14">
+                    <a:blip r:embed="rId17">
                       <a:extLst>
                         <a:ext uri="{28A0092B-C50C-407E-A947-70E740481C1C}">
                           <a14:useLocalDpi xmlns:a14="http://schemas.microsoft.com/office/drawing/2010/main" val="0"/>
@@ -1441,7 +1789,7 @@
                     </pic:cNvPicPr>
                   </pic:nvPicPr>
                   <pic:blipFill>
-                    <a:blip r:embed="rId15">
+                    <a:blip r:embed="rId18">
                       <a:extLst>
                         <a:ext uri="{28A0092B-C50C-407E-A947-70E740481C1C}">
                           <a14:useLocalDpi xmlns:a14="http://schemas.microsoft.com/office/drawing/2010/main" val="0"/>
@@ -1549,7 +1897,7 @@
                     </pic:cNvPicPr>
                   </pic:nvPicPr>
                   <pic:blipFill>
-                    <a:blip r:embed="rId16">
+                    <a:blip r:embed="rId19">
                       <a:extLst>
                         <a:ext uri="{28A0092B-C50C-407E-A947-70E740481C1C}">
                           <a14:useLocalDpi xmlns:a14="http://schemas.microsoft.com/office/drawing/2010/main" val="0"/>
@@ -1669,7 +2017,7 @@
                     </pic:cNvPicPr>
                   </pic:nvPicPr>
                   <pic:blipFill>
-                    <a:blip r:embed="rId17">
+                    <a:blip r:embed="rId20">
                       <a:extLst>
                         <a:ext uri="{28A0092B-C50C-407E-A947-70E740481C1C}">
                           <a14:useLocalDpi xmlns:a14="http://schemas.microsoft.com/office/drawing/2010/main" val="0"/>
@@ -1730,7 +2078,7 @@
                     </pic:cNvPicPr>
                   </pic:nvPicPr>
                   <pic:blipFill>
-                    <a:blip r:embed="rId18">
+                    <a:blip r:embed="rId21">
                       <a:extLst>
                         <a:ext uri="{28A0092B-C50C-407E-A947-70E740481C1C}">
                           <a14:useLocalDpi xmlns:a14="http://schemas.microsoft.com/office/drawing/2010/main" val="0"/>
@@ -1830,7 +2178,7 @@
                     </pic:cNvPicPr>
                   </pic:nvPicPr>
                   <pic:blipFill>
-                    <a:blip r:embed="rId19">
+                    <a:blip r:embed="rId22">
                       <a:extLst>
                         <a:ext uri="{28A0092B-C50C-407E-A947-70E740481C1C}">
                           <a14:useLocalDpi xmlns:a14="http://schemas.microsoft.com/office/drawing/2010/main" val="0"/>
@@ -1967,7 +2315,7 @@
                     </pic:cNvPicPr>
                   </pic:nvPicPr>
                   <pic:blipFill>
-                    <a:blip r:embed="rId20" cstate="print">
+                    <a:blip r:embed="rId23" cstate="print">
                       <a:extLst>
                         <a:ext uri="{28A0092B-C50C-407E-A947-70E740481C1C}">
                           <a14:useLocalDpi xmlns:a14="http://schemas.microsoft.com/office/drawing/2010/main" val="0"/>
@@ -2046,7 +2394,7 @@
                     </pic:cNvPicPr>
                   </pic:nvPicPr>
                   <pic:blipFill>
-                    <a:blip r:embed="rId21">
+                    <a:blip r:embed="rId24">
                       <a:extLst>
                         <a:ext uri="{28A0092B-C50C-407E-A947-70E740481C1C}">
                           <a14:useLocalDpi xmlns:a14="http://schemas.microsoft.com/office/drawing/2010/main" val="0"/>
@@ -2172,7 +2520,7 @@
                     </pic:cNvPicPr>
                   </pic:nvPicPr>
                   <pic:blipFill>
-                    <a:blip r:embed="rId22">
+                    <a:blip r:embed="rId25">
                       <a:extLst>
                         <a:ext uri="{28A0092B-C50C-407E-A947-70E740481C1C}">
                           <a14:useLocalDpi xmlns:a14="http://schemas.microsoft.com/office/drawing/2010/main" val="0"/>
@@ -2343,7 +2691,7 @@
                     </pic:cNvPicPr>
                   </pic:nvPicPr>
                   <pic:blipFill>
-                    <a:blip r:embed="rId23">
+                    <a:blip r:embed="rId26">
                       <a:extLst>
                         <a:ext uri="{28A0092B-C50C-407E-A947-70E740481C1C}">
                           <a14:useLocalDpi xmlns:a14="http://schemas.microsoft.com/office/drawing/2010/main" val="0"/>
@@ -2387,8 +2735,30 @@
         <w:rPr>
           <w:lang w:val="en-US"/>
         </w:rPr>
-        <w:t>For instance, a variation that was previously approved with 100 hours is now in the process of unapproval. Since 50 hours has already been earned, 2 options are available during unapproval</w:t>
-      </w:r>
+        <w:t xml:space="preserve">For instance, a variation that was previously approved with 100 hours is now in the process of </w:t>
+      </w:r>
+      <w:proofErr w:type="spellStart"/>
+      <w:r>
+        <w:rPr>
+          <w:lang w:val="en-US"/>
+        </w:rPr>
+        <w:t>unapproval</w:t>
+      </w:r>
+      <w:proofErr w:type="spellEnd"/>
+      <w:r>
+        <w:rPr>
+          <w:lang w:val="en-US"/>
+        </w:rPr>
+        <w:t xml:space="preserve">. Since 50 hours has already been earned, 2 options are available during </w:t>
+      </w:r>
+      <w:proofErr w:type="spellStart"/>
+      <w:r>
+        <w:rPr>
+          <w:lang w:val="en-US"/>
+        </w:rPr>
+        <w:t>unapproval</w:t>
+      </w:r>
+      <w:proofErr w:type="spellEnd"/>
     </w:p>
     <w:p>
       <w:pPr>
@@ -2405,7 +2775,21 @@
         <w:rPr>
           <w:lang w:val="en-US"/>
         </w:rPr>
-        <w:t>Reduce earned hours ticked – Earned units will be reduced to 0 so that unapproval with 100 hours taken away from the deliverable can take place</w:t>
+        <w:t xml:space="preserve">Reduce earned hours ticked – Earned units will be reduced to 0 so that </w:t>
+      </w:r>
+      <w:proofErr w:type="spellStart"/>
+      <w:r>
+        <w:rPr>
+          <w:lang w:val="en-US"/>
+        </w:rPr>
+        <w:t>unapproval</w:t>
+      </w:r>
+      <w:proofErr w:type="spellEnd"/>
+      <w:r>
+        <w:rPr>
+          <w:lang w:val="en-US"/>
+        </w:rPr>
+        <w:t xml:space="preserve"> with 100 hours taken away from the deliverable can take place</w:t>
       </w:r>
     </w:p>
     <w:p>
@@ -2528,7 +2912,7 @@
                     </pic:cNvPicPr>
                   </pic:nvPicPr>
                   <pic:blipFill>
-                    <a:blip r:embed="rId24">
+                    <a:blip r:embed="rId27">
                       <a:extLst>
                         <a:ext uri="{28A0092B-C50C-407E-A947-70E740481C1C}">
                           <a14:useLocalDpi xmlns:a14="http://schemas.microsoft.com/office/drawing/2010/main" val="0"/>
@@ -2685,7 +3069,7 @@
                     </pic:cNvPicPr>
                   </pic:nvPicPr>
                   <pic:blipFill>
-                    <a:blip r:embed="rId25">
+                    <a:blip r:embed="rId28">
                       <a:extLst>
                         <a:ext uri="{28A0092B-C50C-407E-A947-70E740481C1C}">
                           <a14:useLocalDpi xmlns:a14="http://schemas.microsoft.com/office/drawing/2010/main" val="0"/>
@@ -2784,7 +3168,7 @@
                     </pic:cNvPicPr>
                   </pic:nvPicPr>
                   <pic:blipFill>
-                    <a:blip r:embed="rId26">
+                    <a:blip r:embed="rId29">
                       <a:extLst>
                         <a:ext uri="{28A0092B-C50C-407E-A947-70E740481C1C}">
                           <a14:useLocalDpi xmlns:a14="http://schemas.microsoft.com/office/drawing/2010/main" val="0"/>
@@ -2909,7 +3293,7 @@
                     </pic:cNvPicPr>
                   </pic:nvPicPr>
                   <pic:blipFill>
-                    <a:blip r:embed="rId27" cstate="print">
+                    <a:blip r:embed="rId30" cstate="print">
                       <a:extLst>
                         <a:ext uri="{28A0092B-C50C-407E-A947-70E740481C1C}">
                           <a14:useLocalDpi xmlns:a14="http://schemas.microsoft.com/office/drawing/2010/main" val="0"/>
@@ -2972,7 +3356,7 @@
                     </pic:cNvPicPr>
                   </pic:nvPicPr>
                   <pic:blipFill>
-                    <a:blip r:embed="rId28">
+                    <a:blip r:embed="rId31">
                       <a:extLst>
                         <a:ext uri="{28A0092B-C50C-407E-A947-70E740481C1C}">
                           <a14:useLocalDpi xmlns:a14="http://schemas.microsoft.com/office/drawing/2010/main" val="0"/>
@@ -3097,7 +3481,7 @@
                     </pic:cNvPicPr>
                   </pic:nvPicPr>
                   <pic:blipFill>
-                    <a:blip r:embed="rId29">
+                    <a:blip r:embed="rId32">
                       <a:extLst>
                         <a:ext uri="{28A0092B-C50C-407E-A947-70E740481C1C}">
                           <a14:useLocalDpi xmlns:a14="http://schemas.microsoft.com/office/drawing/2010/main" val="0"/>
@@ -3197,7 +3581,7 @@
                     </pic:cNvPicPr>
                   </pic:nvPicPr>
                   <pic:blipFill>
-                    <a:blip r:embed="rId30">
+                    <a:blip r:embed="rId33">
                       <a:extLst>
                         <a:ext uri="{28A0092B-C50C-407E-A947-70E740481C1C}">
                           <a14:useLocalDpi xmlns:a14="http://schemas.microsoft.com/office/drawing/2010/main" val="0"/>
@@ -3260,7 +3644,7 @@
                     </pic:cNvPicPr>
                   </pic:nvPicPr>
                   <pic:blipFill>
-                    <a:blip r:embed="rId31">
+                    <a:blip r:embed="rId34">
                       <a:extLst>
                         <a:ext uri="{28A0092B-C50C-407E-A947-70E740481C1C}">
                           <a14:useLocalDpi xmlns:a14="http://schemas.microsoft.com/office/drawing/2010/main" val="0"/>
@@ -3478,7 +3862,7 @@
                     </pic:cNvPicPr>
                   </pic:nvPicPr>
                   <pic:blipFill>
-                    <a:blip r:embed="rId32">
+                    <a:blip r:embed="rId35">
                       <a:extLst>
                         <a:ext uri="{28A0092B-C50C-407E-A947-70E740481C1C}">
                           <a14:useLocalDpi xmlns:a14="http://schemas.microsoft.com/office/drawing/2010/main" val="0"/>
@@ -3916,7 +4300,21 @@
         <w:rPr>
           <w:lang w:val="en-US"/>
         </w:rPr>
-        <w:t>how empty cost group and cost type in forecast to accomodate variations without cost group and cost type coming from construction variation module</w:t>
+        <w:t xml:space="preserve">how empty cost group and cost type in forecast to </w:t>
+      </w:r>
+      <w:proofErr w:type="spellStart"/>
+      <w:r>
+        <w:rPr>
+          <w:lang w:val="en-US"/>
+        </w:rPr>
+        <w:t>accomodate</w:t>
+      </w:r>
+      <w:proofErr w:type="spellEnd"/>
+      <w:r>
+        <w:rPr>
+          <w:lang w:val="en-US"/>
+        </w:rPr>
+        <w:t xml:space="preserve"> variations without cost group and cost type coming from construction variation module</w:t>
       </w:r>
     </w:p>
     <w:p>
@@ -4536,7 +4934,7 @@
           <w:lang w:val="en-US"/>
         </w:rPr>
       </w:pPr>
-      <w:hyperlink r:id="rId33" w:history="1">
+      <w:hyperlink r:id="rId36" w:history="1">
         <w:r>
           <w:rPr>
             <w:rStyle w:val="Hyperlink"/>
@@ -4606,7 +5004,21 @@
           <w:lang w:val="en-US"/>
         </w:rPr>
         <w:lastRenderedPageBreak/>
-        <w:t>Added column to show actual labour units post data date</w:t>
+        <w:t xml:space="preserve">Added column to show actual </w:t>
+      </w:r>
+      <w:proofErr w:type="spellStart"/>
+      <w:r>
+        <w:rPr>
+          <w:lang w:val="en-US"/>
+        </w:rPr>
+        <w:t>labour</w:t>
+      </w:r>
+      <w:proofErr w:type="spellEnd"/>
+      <w:r>
+        <w:rPr>
+          <w:lang w:val="en-US"/>
+        </w:rPr>
+        <w:t xml:space="preserve"> units post data date</w:t>
       </w:r>
     </w:p>
     <w:p>
@@ -4802,7 +5214,7 @@
           <w:lang w:val="en-US"/>
         </w:rPr>
       </w:pPr>
-      <w:hyperlink r:id="rId34" w:history="1">
+      <w:hyperlink r:id="rId37" w:history="1">
         <w:r>
           <w:rPr>
             <w:rStyle w:val="Hyperlink"/>
@@ -4882,7 +5294,7 @@
           <w:lang w:val="en-US"/>
         </w:rPr>
       </w:pPr>
-      <w:hyperlink r:id="rId35" w:history="1">
+      <w:hyperlink r:id="rId38" w:history="1">
         <w:r>
           <w:rPr>
             <w:rStyle w:val="Hyperlink"/>
@@ -5126,7 +5538,21 @@
         <w:rPr>
           <w:lang w:val="en-US"/>
         </w:rPr>
-        <w:t>ixed an issue where subjob variation code doesn't show up in book time</w:t>
+        <w:t xml:space="preserve">ixed an issue where </w:t>
+      </w:r>
+      <w:proofErr w:type="spellStart"/>
+      <w:r>
+        <w:rPr>
+          <w:lang w:val="en-US"/>
+        </w:rPr>
+        <w:t>subjob</w:t>
+      </w:r>
+      <w:proofErr w:type="spellEnd"/>
+      <w:r>
+        <w:rPr>
+          <w:lang w:val="en-US"/>
+        </w:rPr>
+        <w:t xml:space="preserve"> variation code doesn't show up in book time</w:t>
       </w:r>
     </w:p>
     <w:p>
@@ -5389,7 +5815,35 @@
         <w:rPr>
           <w:rFonts w:cs="Calibri"/>
         </w:rPr>
-        <w:t>Editing Exo -&gt; Transaction quantity will adjust line cost, line charge, line total, line total tax, line tax and linetotal incl tax in EXO</w:t>
+        <w:t xml:space="preserve">Editing Exo -&gt; Transaction quantity will adjust line cost, line charge, line total, line total tax, line tax and </w:t>
+      </w:r>
+      <w:proofErr w:type="spellStart"/>
+      <w:r>
+        <w:rPr>
+          <w:rFonts w:cs="Calibri"/>
+        </w:rPr>
+        <w:t>linetotal</w:t>
+      </w:r>
+      <w:proofErr w:type="spellEnd"/>
+      <w:r>
+        <w:rPr>
+          <w:rFonts w:cs="Calibri"/>
+        </w:rPr>
+        <w:t xml:space="preserve"> </w:t>
+      </w:r>
+      <w:proofErr w:type="spellStart"/>
+      <w:r>
+        <w:rPr>
+          <w:rFonts w:cs="Calibri"/>
+        </w:rPr>
+        <w:t>incl</w:t>
+      </w:r>
+      <w:proofErr w:type="spellEnd"/>
+      <w:r>
+        <w:rPr>
+          <w:rFonts w:cs="Calibri"/>
+        </w:rPr>
+        <w:t xml:space="preserve"> tax in EXO</w:t>
       </w:r>
     </w:p>
     <w:p>
@@ -5600,7 +6054,7 @@
           <w:lang w:val="en-US"/>
         </w:rPr>
       </w:pPr>
-      <w:hyperlink r:id="rId36" w:history="1">
+      <w:hyperlink r:id="rId39" w:history="1">
         <w:r>
           <w:rPr>
             <w:rStyle w:val="Hyperlink"/>
@@ -5621,7 +6075,7 @@
 </file>
 
 <file path=word/numbering.xml><?xml version="1.0" encoding="utf-8"?>
-<w:numbering xmlns:wpc="http://schemas.microsoft.com/office/word/2010/wordprocessingCanvas" xmlns:cx="http://schemas.microsoft.com/office/drawing/2014/chartex" xmlns:cx1="http://schemas.microsoft.com/office/drawing/2015/9/8/chartex" xmlns:cx2="http://schemas.microsoft.com/office/drawing/2015/10/21/chartex" xmlns:cx3="http://schemas.microsoft.com/office/drawing/2016/5/9/chartex" xmlns:cx4="http://schemas.microsoft.com/office/drawing/2016/5/10/chartex" xmlns:cx5="http://schemas.microsoft.com/office/drawing/2016/5/11/chartex" xmlns:cx6="http://schemas.microsoft.com/office/drawing/2016/5/12/chartex" xmlns:cx7="http://schemas.microsoft.com/office/drawing/2016/5/13/chartex" xmlns:cx8="http://schemas.microsoft.com/office/drawing/2016/5/14/chartex" xmlns:mc="http://schemas.openxmlformats.org/markup-compatibility/2006" xmlns:aink="http://schemas.microsoft.com/office/drawing/2016/ink" xmlns:am3d="http://schemas.microsoft.com/office/drawing/2017/model3d" xmlns:o="urn:schemas-microsoft-com:office:office" xmlns:r="http://schemas.openxmlformats.org/officeDocument/2006/relationships" xmlns:m="http://schemas.openxmlformats.org/officeDocument/2006/math" xmlns:v="urn:schemas-microsoft-com:vml" xmlns:wp14="http://schemas.microsoft.com/office/word/2010/wordprocessingDrawing" xmlns:wp="http://schemas.openxmlformats.org/drawingml/2006/wordprocessingDrawing" xmlns:w10="urn:schemas-microsoft-com:office:word" xmlns:w="http://schemas.openxmlformats.org/wordprocessingml/2006/main" xmlns:w14="http://schemas.microsoft.com/office/word/2010/wordml" xmlns:w15="http://schemas.microsoft.com/office/word/2012/wordml" xmlns:w16cex="http://schemas.microsoft.com/office/word/2018/wordml/cex" xmlns:w16cid="http://schemas.microsoft.com/office/word/2016/wordml/cid" xmlns:w16="http://schemas.microsoft.com/office/word/2018/wordml" xmlns:w16se="http://schemas.microsoft.com/office/word/2015/wordml/symex" xmlns:wpg="http://schemas.microsoft.com/office/word/2010/wordprocessingGroup" xmlns:wpi="http://schemas.microsoft.com/office/word/2010/wordprocessingInk" xmlns:wne="http://schemas.microsoft.com/office/word/2006/wordml" xmlns:wps="http://schemas.microsoft.com/office/word/2010/wordprocessingShape" mc:Ignorable="w14 w15 w16se w16cid w16 w16cex wp14">
+<w:numbering xmlns:wpc="http://schemas.microsoft.com/office/word/2010/wordprocessingCanvas" xmlns:cx="http://schemas.microsoft.com/office/drawing/2014/chartex" xmlns:cx1="http://schemas.microsoft.com/office/drawing/2015/9/8/chartex" xmlns:cx2="http://schemas.microsoft.com/office/drawing/2015/10/21/chartex" xmlns:cx3="http://schemas.microsoft.com/office/drawing/2016/5/9/chartex" xmlns:cx4="http://schemas.microsoft.com/office/drawing/2016/5/10/chartex" xmlns:cx5="http://schemas.microsoft.com/office/drawing/2016/5/11/chartex" xmlns:cx6="http://schemas.microsoft.com/office/drawing/2016/5/12/chartex" xmlns:cx7="http://schemas.microsoft.com/office/drawing/2016/5/13/chartex" xmlns:cx8="http://schemas.microsoft.com/office/drawing/2016/5/14/chartex" xmlns:mc="http://schemas.openxmlformats.org/markup-compatibility/2006" xmlns:aink="http://schemas.microsoft.com/office/drawing/2016/ink" xmlns:am3d="http://schemas.microsoft.com/office/drawing/2017/model3d" xmlns:o="urn:schemas-microsoft-com:office:office" xmlns:r="http://schemas.openxmlformats.org/officeDocument/2006/relationships" xmlns:m="http://schemas.openxmlformats.org/officeDocument/2006/math" xmlns:v="urn:schemas-microsoft-com:vml" xmlns:wp14="http://schemas.microsoft.com/office/word/2010/wordprocessingDrawing" xmlns:wp="http://schemas.openxmlformats.org/drawingml/2006/wordprocessingDrawing" xmlns:w10="urn:schemas-microsoft-com:office:word" xmlns:w="http://schemas.openxmlformats.org/wordprocessingml/2006/main" xmlns:w14="http://schemas.microsoft.com/office/word/2010/wordml" xmlns:w15="http://schemas.microsoft.com/office/word/2012/wordml" xmlns:w16cex="http://schemas.microsoft.com/office/word/2018/wordml/cex" xmlns:w16cid="http://schemas.microsoft.com/office/word/2016/wordml/cid" xmlns:w16="http://schemas.microsoft.com/office/word/2018/wordml" xmlns:w16sdtdh="http://schemas.microsoft.com/office/word/2020/wordml/sdtdatahash" xmlns:w16se="http://schemas.microsoft.com/office/word/2015/wordml/symex" xmlns:wpg="http://schemas.microsoft.com/office/word/2010/wordprocessingGroup" xmlns:wpi="http://schemas.microsoft.com/office/word/2010/wordprocessingInk" xmlns:wne="http://schemas.microsoft.com/office/word/2006/wordml" xmlns:wps="http://schemas.microsoft.com/office/word/2010/wordprocessingShape" mc:Ignorable="w14 w15 w16se w16cid w16 w16cex w16sdtdh wp14">
   <w:abstractNum w:abstractNumId="0" w15:restartNumberingAfterBreak="0">
     <w:nsid w:val="02FA5961"/>
     <w:multiLevelType w:val="hybridMultilevel"/>
@@ -5735,6 +6189,118 @@
     </w:lvl>
   </w:abstractNum>
   <w:abstractNum w:abstractNumId="1" w15:restartNumberingAfterBreak="0">
+    <w:nsid w:val="063136D9"/>
+    <w:multiLevelType w:val="hybridMultilevel"/>
+    <w:tmpl w:val="1692415C"/>
+    <w:lvl w:ilvl="0" w:tplc="2C563EE0">
+      <w:numFmt w:val="bullet"/>
+      <w:lvlText w:val="-"/>
+      <w:lvlJc w:val="left"/>
+      <w:pPr>
+        <w:ind w:left="720" w:hanging="360"/>
+      </w:pPr>
+      <w:rPr>
+        <w:rFonts w:ascii="Calibri" w:eastAsiaTheme="minorEastAsia" w:hAnsi="Calibri" w:cs="Calibri" w:hint="default"/>
+      </w:rPr>
+    </w:lvl>
+    <w:lvl w:ilvl="1" w:tplc="44090003">
+      <w:start w:val="1"/>
+      <w:numFmt w:val="bullet"/>
+      <w:lvlText w:val="o"/>
+      <w:lvlJc w:val="left"/>
+      <w:pPr>
+        <w:ind w:left="1440" w:hanging="360"/>
+      </w:pPr>
+      <w:rPr>
+        <w:rFonts w:ascii="Courier New" w:hAnsi="Courier New" w:cs="Courier New" w:hint="default"/>
+      </w:rPr>
+    </w:lvl>
+    <w:lvl w:ilvl="2" w:tplc="44090005" w:tentative="1">
+      <w:start w:val="1"/>
+      <w:numFmt w:val="bullet"/>
+      <w:lvlText w:val=""/>
+      <w:lvlJc w:val="left"/>
+      <w:pPr>
+        <w:ind w:left="2160" w:hanging="360"/>
+      </w:pPr>
+      <w:rPr>
+        <w:rFonts w:ascii="Wingdings" w:hAnsi="Wingdings" w:hint="default"/>
+      </w:rPr>
+    </w:lvl>
+    <w:lvl w:ilvl="3" w:tplc="44090001" w:tentative="1">
+      <w:start w:val="1"/>
+      <w:numFmt w:val="bullet"/>
+      <w:lvlText w:val=""/>
+      <w:lvlJc w:val="left"/>
+      <w:pPr>
+        <w:ind w:left="2880" w:hanging="360"/>
+      </w:pPr>
+      <w:rPr>
+        <w:rFonts w:ascii="Symbol" w:hAnsi="Symbol" w:hint="default"/>
+      </w:rPr>
+    </w:lvl>
+    <w:lvl w:ilvl="4" w:tplc="44090003" w:tentative="1">
+      <w:start w:val="1"/>
+      <w:numFmt w:val="bullet"/>
+      <w:lvlText w:val="o"/>
+      <w:lvlJc w:val="left"/>
+      <w:pPr>
+        <w:ind w:left="3600" w:hanging="360"/>
+      </w:pPr>
+      <w:rPr>
+        <w:rFonts w:ascii="Courier New" w:hAnsi="Courier New" w:cs="Courier New" w:hint="default"/>
+      </w:rPr>
+    </w:lvl>
+    <w:lvl w:ilvl="5" w:tplc="44090005" w:tentative="1">
+      <w:start w:val="1"/>
+      <w:numFmt w:val="bullet"/>
+      <w:lvlText w:val=""/>
+      <w:lvlJc w:val="left"/>
+      <w:pPr>
+        <w:ind w:left="4320" w:hanging="360"/>
+      </w:pPr>
+      <w:rPr>
+        <w:rFonts w:ascii="Wingdings" w:hAnsi="Wingdings" w:hint="default"/>
+      </w:rPr>
+    </w:lvl>
+    <w:lvl w:ilvl="6" w:tplc="44090001" w:tentative="1">
+      <w:start w:val="1"/>
+      <w:numFmt w:val="bullet"/>
+      <w:lvlText w:val=""/>
+      <w:lvlJc w:val="left"/>
+      <w:pPr>
+        <w:ind w:left="5040" w:hanging="360"/>
+      </w:pPr>
+      <w:rPr>
+        <w:rFonts w:ascii="Symbol" w:hAnsi="Symbol" w:hint="default"/>
+      </w:rPr>
+    </w:lvl>
+    <w:lvl w:ilvl="7" w:tplc="44090003" w:tentative="1">
+      <w:start w:val="1"/>
+      <w:numFmt w:val="bullet"/>
+      <w:lvlText w:val="o"/>
+      <w:lvlJc w:val="left"/>
+      <w:pPr>
+        <w:ind w:left="5760" w:hanging="360"/>
+      </w:pPr>
+      <w:rPr>
+        <w:rFonts w:ascii="Courier New" w:hAnsi="Courier New" w:cs="Courier New" w:hint="default"/>
+      </w:rPr>
+    </w:lvl>
+    <w:lvl w:ilvl="8" w:tplc="44090005" w:tentative="1">
+      <w:start w:val="1"/>
+      <w:numFmt w:val="bullet"/>
+      <w:lvlText w:val=""/>
+      <w:lvlJc w:val="left"/>
+      <w:pPr>
+        <w:ind w:left="6480" w:hanging="360"/>
+      </w:pPr>
+      <w:rPr>
+        <w:rFonts w:ascii="Wingdings" w:hAnsi="Wingdings" w:hint="default"/>
+      </w:rPr>
+    </w:lvl>
+  </w:abstractNum>
+  <w:abstractNum w:abstractNumId="2" w15:restartNumberingAfterBreak="0">
     <w:nsid w:val="06E2467D"/>
     <w:multiLevelType w:val="hybridMultilevel"/>
     <w:tmpl w:val="F6804664"/>
@@ -5846,7 +6412,7 @@
       </w:rPr>
     </w:lvl>
   </w:abstractNum>
-  <w:abstractNum w:abstractNumId="2" w15:restartNumberingAfterBreak="0">
+  <w:abstractNum w:abstractNumId="3" w15:restartNumberingAfterBreak="0">
     <w:nsid w:val="08997AC4"/>
     <w:multiLevelType w:val="hybridMultilevel"/>
     <w:tmpl w:val="754444C6"/>
@@ -5958,7 +6524,7 @@
       </w:rPr>
     </w:lvl>
   </w:abstractNum>
-  <w:abstractNum w:abstractNumId="3" w15:restartNumberingAfterBreak="0">
+  <w:abstractNum w:abstractNumId="4" w15:restartNumberingAfterBreak="0">
     <w:nsid w:val="0B4E5795"/>
     <w:multiLevelType w:val="hybridMultilevel"/>
     <w:tmpl w:val="F8C43A90"/>
@@ -6070,7 +6636,7 @@
       </w:rPr>
     </w:lvl>
   </w:abstractNum>
-  <w:abstractNum w:abstractNumId="4" w15:restartNumberingAfterBreak="0">
+  <w:abstractNum w:abstractNumId="5" w15:restartNumberingAfterBreak="0">
     <w:nsid w:val="0C8444BB"/>
     <w:multiLevelType w:val="hybridMultilevel"/>
     <w:tmpl w:val="54966D00"/>
@@ -6182,7 +6748,7 @@
       </w:rPr>
     </w:lvl>
   </w:abstractNum>
-  <w:abstractNum w:abstractNumId="5" w15:restartNumberingAfterBreak="0">
+  <w:abstractNum w:abstractNumId="6" w15:restartNumberingAfterBreak="0">
     <w:nsid w:val="0CC522C5"/>
     <w:multiLevelType w:val="hybridMultilevel"/>
     <w:tmpl w:val="6AD4C95C"/>
@@ -6294,7 +6860,7 @@
       </w:rPr>
     </w:lvl>
   </w:abstractNum>
-  <w:abstractNum w:abstractNumId="6" w15:restartNumberingAfterBreak="0">
+  <w:abstractNum w:abstractNumId="7" w15:restartNumberingAfterBreak="0">
     <w:nsid w:val="0CF53711"/>
     <w:multiLevelType w:val="hybridMultilevel"/>
     <w:tmpl w:val="980C9F1A"/>
@@ -6406,7 +6972,7 @@
       </w:rPr>
     </w:lvl>
   </w:abstractNum>
-  <w:abstractNum w:abstractNumId="7" w15:restartNumberingAfterBreak="0">
+  <w:abstractNum w:abstractNumId="8" w15:restartNumberingAfterBreak="0">
     <w:nsid w:val="0FC80B97"/>
     <w:multiLevelType w:val="hybridMultilevel"/>
     <w:tmpl w:val="DFECF1EE"/>
@@ -6518,7 +7084,7 @@
       </w:rPr>
     </w:lvl>
   </w:abstractNum>
-  <w:abstractNum w:abstractNumId="8" w15:restartNumberingAfterBreak="0">
+  <w:abstractNum w:abstractNumId="9" w15:restartNumberingAfterBreak="0">
     <w:nsid w:val="141357FF"/>
     <w:multiLevelType w:val="hybridMultilevel"/>
     <w:tmpl w:val="9E6653E4"/>
@@ -6630,7 +7196,7 @@
       </w:rPr>
     </w:lvl>
   </w:abstractNum>
-  <w:abstractNum w:abstractNumId="9" w15:restartNumberingAfterBreak="0">
+  <w:abstractNum w:abstractNumId="10" w15:restartNumberingAfterBreak="0">
     <w:nsid w:val="178E49A5"/>
     <w:multiLevelType w:val="hybridMultilevel"/>
     <w:tmpl w:val="40880C56"/>
@@ -6742,7 +7308,7 @@
       </w:rPr>
     </w:lvl>
   </w:abstractNum>
-  <w:abstractNum w:abstractNumId="10" w15:restartNumberingAfterBreak="0">
+  <w:abstractNum w:abstractNumId="11" w15:restartNumberingAfterBreak="0">
     <w:nsid w:val="1D377B89"/>
     <w:multiLevelType w:val="hybridMultilevel"/>
     <w:tmpl w:val="1744FA72"/>
@@ -6855,7 +7421,7 @@
       </w:rPr>
     </w:lvl>
   </w:abstractNum>
-  <w:abstractNum w:abstractNumId="11" w15:restartNumberingAfterBreak="0">
+  <w:abstractNum w:abstractNumId="12" w15:restartNumberingAfterBreak="0">
     <w:nsid w:val="1DCB2786"/>
     <w:multiLevelType w:val="hybridMultilevel"/>
     <w:tmpl w:val="DA046A8A"/>
@@ -6967,7 +7533,7 @@
       </w:rPr>
     </w:lvl>
   </w:abstractNum>
-  <w:abstractNum w:abstractNumId="12" w15:restartNumberingAfterBreak="0">
+  <w:abstractNum w:abstractNumId="13" w15:restartNumberingAfterBreak="0">
     <w:nsid w:val="1E2528E1"/>
     <w:multiLevelType w:val="hybridMultilevel"/>
     <w:tmpl w:val="04B6187A"/>
@@ -7079,7 +7645,7 @@
       </w:rPr>
     </w:lvl>
   </w:abstractNum>
-  <w:abstractNum w:abstractNumId="13" w15:restartNumberingAfterBreak="0">
+  <w:abstractNum w:abstractNumId="14" w15:restartNumberingAfterBreak="0">
     <w:nsid w:val="1F4D0C5A"/>
     <w:multiLevelType w:val="hybridMultilevel"/>
     <w:tmpl w:val="58644CA6"/>
@@ -7191,7 +7757,7 @@
       </w:rPr>
     </w:lvl>
   </w:abstractNum>
-  <w:abstractNum w:abstractNumId="14" w15:restartNumberingAfterBreak="0">
+  <w:abstractNum w:abstractNumId="15" w15:restartNumberingAfterBreak="0">
     <w:nsid w:val="1FCD45E8"/>
     <w:multiLevelType w:val="hybridMultilevel"/>
     <w:tmpl w:val="F280A010"/>
@@ -7303,7 +7869,7 @@
       </w:rPr>
     </w:lvl>
   </w:abstractNum>
-  <w:abstractNum w:abstractNumId="15" w15:restartNumberingAfterBreak="0">
+  <w:abstractNum w:abstractNumId="16" w15:restartNumberingAfterBreak="0">
     <w:nsid w:val="21223E97"/>
     <w:multiLevelType w:val="hybridMultilevel"/>
     <w:tmpl w:val="68E6E128"/>
@@ -7415,7 +7981,7 @@
       </w:rPr>
     </w:lvl>
   </w:abstractNum>
-  <w:abstractNum w:abstractNumId="16" w15:restartNumberingAfterBreak="0">
+  <w:abstractNum w:abstractNumId="17" w15:restartNumberingAfterBreak="0">
     <w:nsid w:val="22100513"/>
     <w:multiLevelType w:val="multilevel"/>
     <w:tmpl w:val="9DA06E12"/>
@@ -7528,7 +8094,7 @@
       </w:pPr>
     </w:lvl>
   </w:abstractNum>
-  <w:abstractNum w:abstractNumId="17" w15:restartNumberingAfterBreak="0">
+  <w:abstractNum w:abstractNumId="18" w15:restartNumberingAfterBreak="0">
     <w:nsid w:val="22E26764"/>
     <w:multiLevelType w:val="hybridMultilevel"/>
     <w:tmpl w:val="C518B74A"/>
@@ -7640,7 +8206,7 @@
       </w:rPr>
     </w:lvl>
   </w:abstractNum>
-  <w:abstractNum w:abstractNumId="18" w15:restartNumberingAfterBreak="0">
+  <w:abstractNum w:abstractNumId="19" w15:restartNumberingAfterBreak="0">
     <w:nsid w:val="24E10BB5"/>
     <w:multiLevelType w:val="hybridMultilevel"/>
     <w:tmpl w:val="F8FEBADA"/>
@@ -7752,7 +8318,7 @@
       </w:rPr>
     </w:lvl>
   </w:abstractNum>
-  <w:abstractNum w:abstractNumId="19" w15:restartNumberingAfterBreak="0">
+  <w:abstractNum w:abstractNumId="20" w15:restartNumberingAfterBreak="0">
     <w:nsid w:val="3C5C6580"/>
     <w:multiLevelType w:val="hybridMultilevel"/>
     <w:tmpl w:val="6874B70A"/>
@@ -7865,7 +8431,7 @@
       </w:rPr>
     </w:lvl>
   </w:abstractNum>
-  <w:abstractNum w:abstractNumId="20" w15:restartNumberingAfterBreak="0">
+  <w:abstractNum w:abstractNumId="21" w15:restartNumberingAfterBreak="0">
     <w:nsid w:val="3C704EE1"/>
     <w:multiLevelType w:val="hybridMultilevel"/>
     <w:tmpl w:val="41A6D382"/>
@@ -7977,7 +8543,7 @@
       </w:rPr>
     </w:lvl>
   </w:abstractNum>
-  <w:abstractNum w:abstractNumId="21" w15:restartNumberingAfterBreak="0">
+  <w:abstractNum w:abstractNumId="22" w15:restartNumberingAfterBreak="0">
     <w:nsid w:val="3E6B597B"/>
     <w:multiLevelType w:val="hybridMultilevel"/>
     <w:tmpl w:val="C0DAF682"/>
@@ -8089,7 +8655,7 @@
       </w:rPr>
     </w:lvl>
   </w:abstractNum>
-  <w:abstractNum w:abstractNumId="22" w15:restartNumberingAfterBreak="0">
+  <w:abstractNum w:abstractNumId="23" w15:restartNumberingAfterBreak="0">
     <w:nsid w:val="3F573A8E"/>
     <w:multiLevelType w:val="hybridMultilevel"/>
     <w:tmpl w:val="6C6CD2D4"/>
@@ -8201,7 +8767,7 @@
       </w:rPr>
     </w:lvl>
   </w:abstractNum>
-  <w:abstractNum w:abstractNumId="23" w15:restartNumberingAfterBreak="0">
+  <w:abstractNum w:abstractNumId="24" w15:restartNumberingAfterBreak="0">
     <w:nsid w:val="40720D0C"/>
     <w:multiLevelType w:val="hybridMultilevel"/>
     <w:tmpl w:val="A370A62A"/>
@@ -8313,7 +8879,7 @@
       </w:rPr>
     </w:lvl>
   </w:abstractNum>
-  <w:abstractNum w:abstractNumId="24" w15:restartNumberingAfterBreak="0">
+  <w:abstractNum w:abstractNumId="25" w15:restartNumberingAfterBreak="0">
     <w:nsid w:val="4691596C"/>
     <w:multiLevelType w:val="hybridMultilevel"/>
     <w:tmpl w:val="ECEEF302"/>
@@ -8425,7 +8991,7 @@
       </w:rPr>
     </w:lvl>
   </w:abstractNum>
-  <w:abstractNum w:abstractNumId="25" w15:restartNumberingAfterBreak="0">
+  <w:abstractNum w:abstractNumId="26" w15:restartNumberingAfterBreak="0">
     <w:nsid w:val="47F951B0"/>
     <w:multiLevelType w:val="multilevel"/>
     <w:tmpl w:val="00D8A7E8"/>
@@ -8511,7 +9077,7 @@
       </w:pPr>
     </w:lvl>
   </w:abstractNum>
-  <w:abstractNum w:abstractNumId="26" w15:restartNumberingAfterBreak="0">
+  <w:abstractNum w:abstractNumId="27" w15:restartNumberingAfterBreak="0">
     <w:nsid w:val="4A9D1EBF"/>
     <w:multiLevelType w:val="hybridMultilevel"/>
     <w:tmpl w:val="3DEACDCC"/>
@@ -8623,7 +9189,7 @@
       </w:rPr>
     </w:lvl>
   </w:abstractNum>
-  <w:abstractNum w:abstractNumId="27" w15:restartNumberingAfterBreak="0">
+  <w:abstractNum w:abstractNumId="28" w15:restartNumberingAfterBreak="0">
     <w:nsid w:val="4D6E34D5"/>
     <w:multiLevelType w:val="hybridMultilevel"/>
     <w:tmpl w:val="6BC866D0"/>
@@ -8735,7 +9301,7 @@
       </w:rPr>
     </w:lvl>
   </w:abstractNum>
-  <w:abstractNum w:abstractNumId="28" w15:restartNumberingAfterBreak="0">
+  <w:abstractNum w:abstractNumId="29" w15:restartNumberingAfterBreak="0">
     <w:nsid w:val="52606647"/>
     <w:multiLevelType w:val="hybridMultilevel"/>
     <w:tmpl w:val="34FAD1A0"/>
@@ -8847,7 +9413,7 @@
       </w:rPr>
     </w:lvl>
   </w:abstractNum>
-  <w:abstractNum w:abstractNumId="29" w15:restartNumberingAfterBreak="0">
+  <w:abstractNum w:abstractNumId="30" w15:restartNumberingAfterBreak="0">
     <w:nsid w:val="557D5C95"/>
     <w:multiLevelType w:val="hybridMultilevel"/>
     <w:tmpl w:val="DC122E1C"/>
@@ -8959,7 +9525,7 @@
       </w:rPr>
     </w:lvl>
   </w:abstractNum>
-  <w:abstractNum w:abstractNumId="30" w15:restartNumberingAfterBreak="0">
+  <w:abstractNum w:abstractNumId="31" w15:restartNumberingAfterBreak="0">
     <w:nsid w:val="589D37B7"/>
     <w:multiLevelType w:val="hybridMultilevel"/>
     <w:tmpl w:val="9262429A"/>
@@ -9071,7 +9637,7 @@
       </w:rPr>
     </w:lvl>
   </w:abstractNum>
-  <w:abstractNum w:abstractNumId="31" w15:restartNumberingAfterBreak="0">
+  <w:abstractNum w:abstractNumId="32" w15:restartNumberingAfterBreak="0">
     <w:nsid w:val="58AA443D"/>
     <w:multiLevelType w:val="hybridMultilevel"/>
     <w:tmpl w:val="56F0D18E"/>
@@ -9184,7 +9750,7 @@
       </w:rPr>
     </w:lvl>
   </w:abstractNum>
-  <w:abstractNum w:abstractNumId="32" w15:restartNumberingAfterBreak="0">
+  <w:abstractNum w:abstractNumId="33" w15:restartNumberingAfterBreak="0">
     <w:nsid w:val="5B4B0EE2"/>
     <w:multiLevelType w:val="hybridMultilevel"/>
     <w:tmpl w:val="E8129FD8"/>
@@ -9296,7 +9862,7 @@
       </w:rPr>
     </w:lvl>
   </w:abstractNum>
-  <w:abstractNum w:abstractNumId="33" w15:restartNumberingAfterBreak="0">
+  <w:abstractNum w:abstractNumId="34" w15:restartNumberingAfterBreak="0">
     <w:nsid w:val="5BF34BEE"/>
     <w:multiLevelType w:val="hybridMultilevel"/>
     <w:tmpl w:val="1D48A376"/>
@@ -9408,7 +9974,7 @@
       </w:rPr>
     </w:lvl>
   </w:abstractNum>
-  <w:abstractNum w:abstractNumId="34" w15:restartNumberingAfterBreak="0">
+  <w:abstractNum w:abstractNumId="35" w15:restartNumberingAfterBreak="0">
     <w:nsid w:val="5C8347BF"/>
     <w:multiLevelType w:val="hybridMultilevel"/>
     <w:tmpl w:val="D2F46B88"/>
@@ -9520,7 +10086,7 @@
       </w:rPr>
     </w:lvl>
   </w:abstractNum>
-  <w:abstractNum w:abstractNumId="35" w15:restartNumberingAfterBreak="0">
+  <w:abstractNum w:abstractNumId="36" w15:restartNumberingAfterBreak="0">
     <w:nsid w:val="61693A7A"/>
     <w:multiLevelType w:val="hybridMultilevel"/>
     <w:tmpl w:val="580AF2C6"/>
@@ -9633,7 +10199,7 @@
       </w:rPr>
     </w:lvl>
   </w:abstractNum>
-  <w:abstractNum w:abstractNumId="36" w15:restartNumberingAfterBreak="0">
+  <w:abstractNum w:abstractNumId="37" w15:restartNumberingAfterBreak="0">
     <w:nsid w:val="63C54BFA"/>
     <w:multiLevelType w:val="hybridMultilevel"/>
     <w:tmpl w:val="8122740C"/>
@@ -9745,7 +10311,7 @@
       </w:rPr>
     </w:lvl>
   </w:abstractNum>
-  <w:abstractNum w:abstractNumId="37" w15:restartNumberingAfterBreak="0">
+  <w:abstractNum w:abstractNumId="38" w15:restartNumberingAfterBreak="0">
     <w:nsid w:val="6A047A76"/>
     <w:multiLevelType w:val="hybridMultilevel"/>
     <w:tmpl w:val="50CADEB2"/>
@@ -9857,7 +10423,7 @@
       </w:rPr>
     </w:lvl>
   </w:abstractNum>
-  <w:abstractNum w:abstractNumId="38" w15:restartNumberingAfterBreak="0">
+  <w:abstractNum w:abstractNumId="39" w15:restartNumberingAfterBreak="0">
     <w:nsid w:val="6A3A0B6E"/>
     <w:multiLevelType w:val="hybridMultilevel"/>
     <w:tmpl w:val="759C482E"/>
@@ -9969,7 +10535,7 @@
       </w:rPr>
     </w:lvl>
   </w:abstractNum>
-  <w:abstractNum w:abstractNumId="39" w15:restartNumberingAfterBreak="0">
+  <w:abstractNum w:abstractNumId="40" w15:restartNumberingAfterBreak="0">
     <w:nsid w:val="6AC268F7"/>
     <w:multiLevelType w:val="hybridMultilevel"/>
     <w:tmpl w:val="12F21194"/>
@@ -10081,7 +10647,7 @@
       </w:rPr>
     </w:lvl>
   </w:abstractNum>
-  <w:abstractNum w:abstractNumId="40" w15:restartNumberingAfterBreak="0">
+  <w:abstractNum w:abstractNumId="41" w15:restartNumberingAfterBreak="0">
     <w:nsid w:val="6CE7392E"/>
     <w:multiLevelType w:val="hybridMultilevel"/>
     <w:tmpl w:val="2E2C9BDE"/>
@@ -10193,7 +10759,7 @@
       </w:rPr>
     </w:lvl>
   </w:abstractNum>
-  <w:abstractNum w:abstractNumId="41" w15:restartNumberingAfterBreak="0">
+  <w:abstractNum w:abstractNumId="42" w15:restartNumberingAfterBreak="0">
     <w:nsid w:val="6E3F3F9F"/>
     <w:multiLevelType w:val="hybridMultilevel"/>
     <w:tmpl w:val="A13CFC48"/>
@@ -10305,7 +10871,7 @@
       </w:rPr>
     </w:lvl>
   </w:abstractNum>
-  <w:abstractNum w:abstractNumId="42" w15:restartNumberingAfterBreak="0">
+  <w:abstractNum w:abstractNumId="43" w15:restartNumberingAfterBreak="0">
     <w:nsid w:val="74A1190D"/>
     <w:multiLevelType w:val="hybridMultilevel"/>
     <w:tmpl w:val="D5387ACA"/>
@@ -10417,7 +10983,7 @@
       </w:rPr>
     </w:lvl>
   </w:abstractNum>
-  <w:abstractNum w:abstractNumId="43" w15:restartNumberingAfterBreak="0">
+  <w:abstractNum w:abstractNumId="44" w15:restartNumberingAfterBreak="0">
     <w:nsid w:val="7D5B508C"/>
     <w:multiLevelType w:val="hybridMultilevel"/>
     <w:tmpl w:val="7FAC5656"/>
@@ -10530,7 +11096,7 @@
       </w:rPr>
     </w:lvl>
   </w:abstractNum>
-  <w:abstractNum w:abstractNumId="44" w15:restartNumberingAfterBreak="0">
+  <w:abstractNum w:abstractNumId="45" w15:restartNumberingAfterBreak="0">
     <w:nsid w:val="7E7D5380"/>
     <w:multiLevelType w:val="hybridMultilevel"/>
     <w:tmpl w:val="7668ED14"/>
@@ -10642,7 +11208,7 @@
       </w:rPr>
     </w:lvl>
   </w:abstractNum>
-  <w:abstractNum w:abstractNumId="45" w15:restartNumberingAfterBreak="0">
+  <w:abstractNum w:abstractNumId="46" w15:restartNumberingAfterBreak="0">
     <w:nsid w:val="7EAA14ED"/>
     <w:multiLevelType w:val="hybridMultilevel"/>
     <w:tmpl w:val="AF783BA4"/>
@@ -10754,7 +11320,7 @@
       </w:rPr>
     </w:lvl>
   </w:abstractNum>
-  <w:abstractNum w:abstractNumId="46" w15:restartNumberingAfterBreak="0">
+  <w:abstractNum w:abstractNumId="47" w15:restartNumberingAfterBreak="0">
     <w:nsid w:val="7FD565FA"/>
     <w:multiLevelType w:val="hybridMultilevel"/>
     <w:tmpl w:val="E5906ACC"/>
@@ -10867,151 +11433,154 @@
     </w:lvl>
   </w:abstractNum>
   <w:num w:numId="1">
+    <w:abstractNumId w:val="26"/>
+  </w:num>
+  <w:num w:numId="2">
+    <w:abstractNumId w:val="17"/>
+  </w:num>
+  <w:num w:numId="3">
+    <w:abstractNumId w:val="28"/>
+  </w:num>
+  <w:num w:numId="4">
+    <w:abstractNumId w:val="3"/>
+  </w:num>
+  <w:num w:numId="5">
+    <w:abstractNumId w:val="35"/>
+  </w:num>
+  <w:num w:numId="6">
+    <w:abstractNumId w:val="31"/>
+  </w:num>
+  <w:num w:numId="7">
+    <w:abstractNumId w:val="11"/>
+  </w:num>
+  <w:num w:numId="8">
+    <w:abstractNumId w:val="29"/>
+  </w:num>
+  <w:num w:numId="9">
+    <w:abstractNumId w:val="14"/>
+  </w:num>
+  <w:num w:numId="10">
+    <w:abstractNumId w:val="30"/>
+  </w:num>
+  <w:num w:numId="11">
+    <w:abstractNumId w:val="32"/>
+  </w:num>
+  <w:num w:numId="12">
     <w:abstractNumId w:val="25"/>
   </w:num>
-  <w:num w:numId="2">
+  <w:num w:numId="13">
+    <w:abstractNumId w:val="44"/>
+  </w:num>
+  <w:num w:numId="14">
+    <w:abstractNumId w:val="20"/>
+  </w:num>
+  <w:num w:numId="15">
+    <w:abstractNumId w:val="40"/>
+  </w:num>
+  <w:num w:numId="16">
+    <w:abstractNumId w:val="4"/>
+  </w:num>
+  <w:num w:numId="17">
+    <w:abstractNumId w:val="12"/>
+  </w:num>
+  <w:num w:numId="18">
     <w:abstractNumId w:val="16"/>
   </w:num>
-  <w:num w:numId="3">
-    <w:abstractNumId w:val="27"/>
+  <w:num w:numId="19">
+    <w:abstractNumId w:val="8"/>
   </w:num>
-  <w:num w:numId="4">
+  <w:num w:numId="20">
+    <w:abstractNumId w:val="7"/>
+  </w:num>
+  <w:num w:numId="21">
     <w:abstractNumId w:val="2"/>
   </w:num>
-  <w:num w:numId="5">
-    <w:abstractNumId w:val="34"/>
-  </w:num>
-  <w:num w:numId="6">
-    <w:abstractNumId w:val="30"/>
-  </w:num>
-  <w:num w:numId="7">
-    <w:abstractNumId w:val="10"/>
-  </w:num>
-  <w:num w:numId="8">
-    <w:abstractNumId w:val="28"/>
-  </w:num>
-  <w:num w:numId="9">
-    <w:abstractNumId w:val="13"/>
-  </w:num>
-  <w:num w:numId="10">
-    <w:abstractNumId w:val="29"/>
-  </w:num>
-  <w:num w:numId="11">
-    <w:abstractNumId w:val="31"/>
-  </w:num>
-  <w:num w:numId="12">
-    <w:abstractNumId w:val="24"/>
-  </w:num>
-  <w:num w:numId="13">
-    <w:abstractNumId w:val="43"/>
-  </w:num>
-  <w:num w:numId="14">
-    <w:abstractNumId w:val="19"/>
-  </w:num>
-  <w:num w:numId="15">
-    <w:abstractNumId w:val="39"/>
-  </w:num>
-  <w:num w:numId="16">
-    <w:abstractNumId w:val="3"/>
-  </w:num>
-  <w:num w:numId="17">
-    <w:abstractNumId w:val="11"/>
-  </w:num>
-  <w:num w:numId="18">
-    <w:abstractNumId w:val="15"/>
-  </w:num>
-  <w:num w:numId="19">
-    <w:abstractNumId w:val="7"/>
-  </w:num>
-  <w:num w:numId="20">
-    <w:abstractNumId w:val="6"/>
-  </w:num>
-  <w:num w:numId="21">
-    <w:abstractNumId w:val="1"/>
-  </w:num>
   <w:num w:numId="22">
-    <w:abstractNumId w:val="37"/>
+    <w:abstractNumId w:val="38"/>
   </w:num>
   <w:num w:numId="23">
-    <w:abstractNumId w:val="40"/>
+    <w:abstractNumId w:val="41"/>
   </w:num>
   <w:num w:numId="24">
-    <w:abstractNumId w:val="9"/>
+    <w:abstractNumId w:val="10"/>
   </w:num>
   <w:num w:numId="25">
     <w:abstractNumId w:val="0"/>
   </w:num>
   <w:num w:numId="26">
+    <w:abstractNumId w:val="6"/>
+  </w:num>
+  <w:num w:numId="27">
+    <w:abstractNumId w:val="33"/>
+  </w:num>
+  <w:num w:numId="28">
+    <w:abstractNumId w:val="27"/>
+  </w:num>
+  <w:num w:numId="29">
+    <w:abstractNumId w:val="13"/>
+  </w:num>
+  <w:num w:numId="30">
+    <w:abstractNumId w:val="9"/>
+  </w:num>
+  <w:num w:numId="31">
+    <w:abstractNumId w:val="19"/>
+  </w:num>
+  <w:num w:numId="32">
+    <w:abstractNumId w:val="39"/>
+  </w:num>
+  <w:num w:numId="33">
+    <w:abstractNumId w:val="42"/>
+  </w:num>
+  <w:num w:numId="34">
+    <w:abstractNumId w:val="21"/>
+  </w:num>
+  <w:num w:numId="35">
+    <w:abstractNumId w:val="23"/>
+  </w:num>
+  <w:num w:numId="36">
+    <w:abstractNumId w:val="45"/>
+  </w:num>
+  <w:num w:numId="37">
+    <w:abstractNumId w:val="36"/>
+  </w:num>
+  <w:num w:numId="38">
     <w:abstractNumId w:val="5"/>
   </w:num>
-  <w:num w:numId="27">
-    <w:abstractNumId w:val="32"/>
+  <w:num w:numId="39">
+    <w:abstractNumId w:val="22"/>
   </w:num>
-  <w:num w:numId="28">
-    <w:abstractNumId w:val="26"/>
+  <w:num w:numId="40">
+    <w:abstractNumId w:val="15"/>
   </w:num>
-  <w:num w:numId="29">
-    <w:abstractNumId w:val="12"/>
+  <w:num w:numId="41">
+    <w:abstractNumId w:val="37"/>
   </w:num>
-  <w:num w:numId="30">
-    <w:abstractNumId w:val="8"/>
+  <w:num w:numId="42">
+    <w:abstractNumId w:val="34"/>
   </w:num>
-  <w:num w:numId="31">
+  <w:num w:numId="43">
+    <w:abstractNumId w:val="46"/>
+  </w:num>
+  <w:num w:numId="44">
+    <w:abstractNumId w:val="24"/>
+  </w:num>
+  <w:num w:numId="45">
+    <w:abstractNumId w:val="43"/>
+  </w:num>
+  <w:num w:numId="46">
+    <w:abstractNumId w:val="47"/>
+  </w:num>
+  <w:num w:numId="47">
     <w:abstractNumId w:val="18"/>
   </w:num>
-  <w:num w:numId="32">
-    <w:abstractNumId w:val="38"/>
-  </w:num>
-  <w:num w:numId="33">
-    <w:abstractNumId w:val="41"/>
-  </w:num>
-  <w:num w:numId="34">
-    <w:abstractNumId w:val="20"/>
-  </w:num>
-  <w:num w:numId="35">
-    <w:abstractNumId w:val="22"/>
-  </w:num>
-  <w:num w:numId="36">
-    <w:abstractNumId w:val="44"/>
-  </w:num>
-  <w:num w:numId="37">
-    <w:abstractNumId w:val="35"/>
-  </w:num>
-  <w:num w:numId="38">
-    <w:abstractNumId w:val="4"/>
-  </w:num>
-  <w:num w:numId="39">
-    <w:abstractNumId w:val="21"/>
-  </w:num>
-  <w:num w:numId="40">
-    <w:abstractNumId w:val="14"/>
-  </w:num>
-  <w:num w:numId="41">
-    <w:abstractNumId w:val="36"/>
-  </w:num>
-  <w:num w:numId="42">
-    <w:abstractNumId w:val="33"/>
-  </w:num>
-  <w:num w:numId="43">
-    <w:abstractNumId w:val="45"/>
-  </w:num>
-  <w:num w:numId="44">
-    <w:abstractNumId w:val="23"/>
-  </w:num>
-  <w:num w:numId="45">
-    <w:abstractNumId w:val="42"/>
-  </w:num>
-  <w:num w:numId="46">
-    <w:abstractNumId w:val="46"/>
-  </w:num>
-  <w:num w:numId="47">
-    <w:abstractNumId w:val="17"/>
+  <w:num w:numId="48">
+    <w:abstractNumId w:val="1"/>
   </w:num>
 </w:numbering>
 </file>
 
 <file path=word/styles.xml><?xml version="1.0" encoding="utf-8"?>
-<w:styles xmlns:mc="http://schemas.openxmlformats.org/markup-compatibility/2006" xmlns:r="http://schemas.openxmlformats.org/officeDocument/2006/relationships" xmlns:w="http://schemas.openxmlformats.org/wordprocessingml/2006/main" xmlns:w14="http://schemas.microsoft.com/office/word/2010/wordml" xmlns:w15="http://schemas.microsoft.com/office/word/2012/wordml" xmlns:w16cex="http://schemas.microsoft.com/office/word/2018/wordml/cex" xmlns:w16cid="http://schemas.microsoft.com/office/word/2016/wordml/cid" xmlns:w16="http://schemas.microsoft.com/office/word/2018/wordml" xmlns:w16se="http://schemas.microsoft.com/office/word/2015/wordml/symex" mc:Ignorable="w14 w15 w16se w16cid w16 w16cex">
+<w:styles xmlns:mc="http://schemas.openxmlformats.org/markup-compatibility/2006" xmlns:r="http://schemas.openxmlformats.org/officeDocument/2006/relationships" xmlns:w="http://schemas.openxmlformats.org/wordprocessingml/2006/main" xmlns:w14="http://schemas.microsoft.com/office/word/2010/wordml" xmlns:w15="http://schemas.microsoft.com/office/word/2012/wordml" xmlns:w16cex="http://schemas.microsoft.com/office/word/2018/wordml/cex" xmlns:w16cid="http://schemas.microsoft.com/office/word/2016/wordml/cid" xmlns:w16="http://schemas.microsoft.com/office/word/2018/wordml" xmlns:w16sdtdh="http://schemas.microsoft.com/office/word/2020/wordml/sdtdatahash" xmlns:w16se="http://schemas.microsoft.com/office/word/2015/wordml/symex" mc:Ignorable="w14 w15 w16se w16cid w16 w16cex w16sdtdh">
   <w:docDefaults>
     <w:rPrDefault>
       <w:rPr>

</xml_diff>

<commit_message>
- Edited Job Setup ToolTip - Update Change Log
</commit_message>
<xml_diff>
--- a/BluePrints/Views/ChangeLog.docx
+++ b/BluePrints/Views/ChangeLog.docx
@@ -12,6 +12,154 @@
         <w:rPr>
           <w:lang w:val="en-US"/>
         </w:rPr>
+        <w:t>Change Log 29</w:t>
+      </w:r>
+      <w:r>
+        <w:rPr>
+          <w:vertAlign w:val="superscript"/>
+          <w:lang w:val="en-US"/>
+        </w:rPr>
+        <w:t>th</w:t>
+      </w:r>
+      <w:r>
+        <w:rPr>
+          <w:lang w:val="en-US"/>
+        </w:rPr>
+        <w:t xml:space="preserve"> Sep 2021</w:t>
+      </w:r>
+    </w:p>
+    <w:p>
+      <w:pPr>
+        <w:pStyle w:val="ListParagraph"/>
+        <w:numPr>
+          <w:ilvl w:val="0"/>
+          <w:numId w:val="43"/>
+        </w:numPr>
+        <w:rPr>
+          <w:lang w:val="en-US"/>
+        </w:rPr>
+      </w:pPr>
+      <w:r>
+        <w:rPr>
+          <w:lang w:val="en-US"/>
+        </w:rPr>
+        <w:t>Timesheet Entry</w:t>
+      </w:r>
+    </w:p>
+    <w:p>
+      <w:pPr>
+        <w:pStyle w:val="ListParagraph"/>
+        <w:numPr>
+          <w:ilvl w:val="1"/>
+          <w:numId w:val="43"/>
+        </w:numPr>
+        <w:rPr>
+          <w:lang w:val="en-US"/>
+        </w:rPr>
+      </w:pPr>
+      <w:r>
+        <w:rPr>
+          <w:lang w:val="en-US"/>
+        </w:rPr>
+        <w:t>Restricted to only querying a single week. With start date automatically adjusted to Monday to avoid duplicate records</w:t>
+      </w:r>
+    </w:p>
+    <w:p>
+      <w:pPr>
+        <w:pStyle w:val="ListParagraph"/>
+        <w:ind w:left="1440"/>
+        <w:rPr>
+          <w:lang w:val="en-US"/>
+        </w:rPr>
+      </w:pPr>
+    </w:p>
+    <w:p>
+      <w:pPr>
+        <w:pStyle w:val="ListParagraph"/>
+        <w:ind w:left="1440"/>
+        <w:rPr>
+          <w:lang w:val="en-US"/>
+        </w:rPr>
+      </w:pPr>
+      <w:r>
+        <w:rPr>
+          <w:noProof/>
+          <w:lang w:val="en-US"/>
+        </w:rPr>
+        <w:drawing>
+          <wp:inline distT="0" distB="0" distL="0" distR="0" wp14:anchorId="69EF9836" wp14:editId="3B41A417">
+            <wp:extent cx="5715000" cy="2209800"/>
+            <wp:effectExtent l="0" t="0" r="0" b="0"/>
+            <wp:docPr id="35" name="Picture 35"/>
+            <wp:cNvGraphicFramePr>
+              <a:graphicFrameLocks xmlns:a="http://schemas.openxmlformats.org/drawingml/2006/main" noChangeAspect="1"/>
+            </wp:cNvGraphicFramePr>
+            <a:graphic xmlns:a="http://schemas.openxmlformats.org/drawingml/2006/main">
+              <a:graphicData uri="http://schemas.openxmlformats.org/drawingml/2006/picture">
+                <pic:pic xmlns:pic="http://schemas.openxmlformats.org/drawingml/2006/picture">
+                  <pic:nvPicPr>
+                    <pic:cNvPr id="0" name="Picture 1"/>
+                    <pic:cNvPicPr>
+                      <a:picLocks noChangeAspect="1" noChangeArrowheads="1"/>
+                    </pic:cNvPicPr>
+                  </pic:nvPicPr>
+                  <pic:blipFill>
+                    <a:blip r:embed="rId5">
+                      <a:extLst>
+                        <a:ext uri="{28A0092B-C50C-407E-A947-70E740481C1C}">
+                          <a14:useLocalDpi xmlns:a14="http://schemas.microsoft.com/office/drawing/2010/main" val="0"/>
+                        </a:ext>
+                      </a:extLst>
+                    </a:blip>
+                    <a:srcRect/>
+                    <a:stretch>
+                      <a:fillRect/>
+                    </a:stretch>
+                  </pic:blipFill>
+                  <pic:spPr bwMode="auto">
+                    <a:xfrm>
+                      <a:off x="0" y="0"/>
+                      <a:ext cx="5715000" cy="2209800"/>
+                    </a:xfrm>
+                    <a:prstGeom prst="rect">
+                      <a:avLst/>
+                    </a:prstGeom>
+                    <a:noFill/>
+                    <a:ln>
+                      <a:noFill/>
+                    </a:ln>
+                  </pic:spPr>
+                </pic:pic>
+              </a:graphicData>
+            </a:graphic>
+          </wp:inline>
+        </w:drawing>
+      </w:r>
+    </w:p>
+    <w:p>
+      <w:pPr>
+        <w:rPr>
+          <w:lang w:val="en-US"/>
+        </w:rPr>
+      </w:pPr>
+      <w:r>
+        <w:rPr>
+          <w:lang w:val="en-US"/>
+        </w:rPr>
+        <w:br w:type="page"/>
+      </w:r>
+    </w:p>
+    <w:p>
+      <w:pPr>
+        <w:rPr>
+          <w:lang w:val="en-US"/>
+        </w:rPr>
+      </w:pPr>
+      <w:r>
+        <w:rPr>
+          <w:lang w:val="en-US"/>
+        </w:rPr>
+        <w:lastRenderedPageBreak/>
         <w:t>Change Log 17</w:t>
       </w:r>
       <w:r>
@@ -88,7 +236,7 @@
                     </pic:cNvPicPr>
                   </pic:nvPicPr>
                   <pic:blipFill>
-                    <a:blip r:embed="rId5" cstate="print">
+                    <a:blip r:embed="rId6" cstate="print">
                       <a:extLst>
                         <a:ext uri="{28A0092B-C50C-407E-A947-70E740481C1C}">
                           <a14:useLocalDpi xmlns:a14="http://schemas.microsoft.com/office/drawing/2010/main" val="0"/>
@@ -198,7 +346,7 @@
                     </pic:cNvPicPr>
                   </pic:nvPicPr>
                   <pic:blipFill>
-                    <a:blip r:embed="rId6">
+                    <a:blip r:embed="rId7">
                       <a:extLst>
                         <a:ext uri="{28A0092B-C50C-407E-A947-70E740481C1C}">
                           <a14:useLocalDpi xmlns:a14="http://schemas.microsoft.com/office/drawing/2010/main" val="0"/>
@@ -343,7 +491,7 @@
                     </pic:cNvPicPr>
                   </pic:nvPicPr>
                   <pic:blipFill>
-                    <a:blip r:embed="rId7" cstate="print">
+                    <a:blip r:embed="rId8" cstate="print">
                       <a:extLst>
                         <a:ext uri="{28A0092B-C50C-407E-A947-70E740481C1C}">
                           <a14:useLocalDpi xmlns:a14="http://schemas.microsoft.com/office/drawing/2010/main" val="0"/>
@@ -511,7 +659,7 @@
                     </pic:cNvPicPr>
                   </pic:nvPicPr>
                   <pic:blipFill>
-                    <a:blip r:embed="rId8">
+                    <a:blip r:embed="rId9">
                       <a:extLst>
                         <a:ext uri="{28A0092B-C50C-407E-A947-70E740481C1C}">
                           <a14:useLocalDpi xmlns:a14="http://schemas.microsoft.com/office/drawing/2010/main" val="0"/>
@@ -595,7 +743,7 @@
                     </pic:cNvPicPr>
                   </pic:nvPicPr>
                   <pic:blipFill>
-                    <a:blip r:embed="rId9">
+                    <a:blip r:embed="rId10">
                       <a:extLst>
                         <a:ext uri="{28A0092B-C50C-407E-A947-70E740481C1C}">
                           <a14:useLocalDpi xmlns:a14="http://schemas.microsoft.com/office/drawing/2010/main" val="0"/>
@@ -702,7 +850,7 @@
                     </pic:cNvPicPr>
                   </pic:nvPicPr>
                   <pic:blipFill>
-                    <a:blip r:embed="rId10" cstate="print">
+                    <a:blip r:embed="rId11" cstate="print">
                       <a:extLst>
                         <a:ext uri="{28A0092B-C50C-407E-A947-70E740481C1C}">
                           <a14:useLocalDpi xmlns:a14="http://schemas.microsoft.com/office/drawing/2010/main" val="0"/>
@@ -901,7 +1049,7 @@
                     </pic:cNvPicPr>
                   </pic:nvPicPr>
                   <pic:blipFill>
-                    <a:blip r:embed="rId11" cstate="print">
+                    <a:blip r:embed="rId12" cstate="print">
                       <a:extLst>
                         <a:ext uri="{28A0092B-C50C-407E-A947-70E740481C1C}">
                           <a14:useLocalDpi xmlns:a14="http://schemas.microsoft.com/office/drawing/2010/main" val="0"/>
@@ -1026,7 +1174,7 @@
                     </pic:cNvPicPr>
                   </pic:nvPicPr>
                   <pic:blipFill>
-                    <a:blip r:embed="rId12" cstate="print">
+                    <a:blip r:embed="rId13" cstate="print">
                       <a:extLst>
                         <a:ext uri="{28A0092B-C50C-407E-A947-70E740481C1C}">
                           <a14:useLocalDpi xmlns:a14="http://schemas.microsoft.com/office/drawing/2010/main" val="0"/>
@@ -1165,7 +1313,7 @@
                     </pic:cNvPicPr>
                   </pic:nvPicPr>
                   <pic:blipFill>
-                    <a:blip r:embed="rId13" cstate="print">
+                    <a:blip r:embed="rId14" cstate="print">
                       <a:extLst>
                         <a:ext uri="{28A0092B-C50C-407E-A947-70E740481C1C}">
                           <a14:useLocalDpi xmlns:a14="http://schemas.microsoft.com/office/drawing/2010/main" val="0"/>
@@ -1264,7 +1412,7 @@
                     </pic:cNvPicPr>
                   </pic:nvPicPr>
                   <pic:blipFill>
-                    <a:blip r:embed="rId14" cstate="print">
+                    <a:blip r:embed="rId15" cstate="print">
                       <a:extLst>
                         <a:ext uri="{28A0092B-C50C-407E-A947-70E740481C1C}">
                           <a14:useLocalDpi xmlns:a14="http://schemas.microsoft.com/office/drawing/2010/main" val="0"/>
@@ -1370,7 +1518,7 @@
                     </pic:cNvPicPr>
                   </pic:nvPicPr>
                   <pic:blipFill>
-                    <a:blip r:embed="rId15" cstate="print">
+                    <a:blip r:embed="rId16" cstate="print">
                       <a:extLst>
                         <a:ext uri="{28A0092B-C50C-407E-A947-70E740481C1C}">
                           <a14:useLocalDpi xmlns:a14="http://schemas.microsoft.com/office/drawing/2010/main" val="0"/>
@@ -1477,7 +1625,7 @@
                     </pic:cNvPicPr>
                   </pic:nvPicPr>
                   <pic:blipFill>
-                    <a:blip r:embed="rId16">
+                    <a:blip r:embed="rId17">
                       <a:extLst>
                         <a:ext uri="{28A0092B-C50C-407E-A947-70E740481C1C}">
                           <a14:useLocalDpi xmlns:a14="http://schemas.microsoft.com/office/drawing/2010/main" val="0"/>
@@ -1649,7 +1797,7 @@
                     </pic:cNvPicPr>
                   </pic:nvPicPr>
                   <pic:blipFill>
-                    <a:blip r:embed="rId17">
+                    <a:blip r:embed="rId18">
                       <a:extLst>
                         <a:ext uri="{28A0092B-C50C-407E-A947-70E740481C1C}">
                           <a14:useLocalDpi xmlns:a14="http://schemas.microsoft.com/office/drawing/2010/main" val="0"/>
@@ -1717,7 +1865,7 @@
                     </pic:cNvPicPr>
                   </pic:nvPicPr>
                   <pic:blipFill>
-                    <a:blip r:embed="rId18">
+                    <a:blip r:embed="rId19">
                       <a:extLst>
                         <a:ext uri="{28A0092B-C50C-407E-A947-70E740481C1C}">
                           <a14:useLocalDpi xmlns:a14="http://schemas.microsoft.com/office/drawing/2010/main" val="0"/>
@@ -1770,21 +1918,7 @@
         <w:rPr>
           <w:lang w:val="en-US"/>
         </w:rPr>
-        <w:t xml:space="preserve"> gets calculated incorrectly when P6 schedule data date </w:t>
-      </w:r>
-      <w:proofErr w:type="gramStart"/>
-      <w:r>
-        <w:rPr>
-          <w:lang w:val="en-US"/>
-        </w:rPr>
-        <w:t>is  less</w:t>
-      </w:r>
-      <w:proofErr w:type="gramEnd"/>
-      <w:r>
-        <w:rPr>
-          <w:lang w:val="en-US"/>
-        </w:rPr>
-        <w:t xml:space="preserve"> than forecast data date</w:t>
+        <w:t xml:space="preserve"> gets calculated incorrectly when P6 schedule data date is  less than forecast data date</w:t>
       </w:r>
     </w:p>
     <w:p>
@@ -1929,7 +2063,7 @@
                     </pic:cNvPicPr>
                   </pic:nvPicPr>
                   <pic:blipFill>
-                    <a:blip r:embed="rId19">
+                    <a:blip r:embed="rId20">
                       <a:extLst>
                         <a:ext uri="{28A0092B-C50C-407E-A947-70E740481C1C}">
                           <a14:useLocalDpi xmlns:a14="http://schemas.microsoft.com/office/drawing/2010/main" val="0"/>
@@ -1994,21 +2128,7 @@
         <w:rPr>
           <w:lang w:val="en-US"/>
         </w:rPr>
-        <w:t xml:space="preserve">Added area, </w:t>
-      </w:r>
-      <w:proofErr w:type="gramStart"/>
-      <w:r>
-        <w:rPr>
-          <w:lang w:val="en-US"/>
-        </w:rPr>
-        <w:t>subarea</w:t>
-      </w:r>
-      <w:proofErr w:type="gramEnd"/>
-      <w:r>
-        <w:rPr>
-          <w:lang w:val="en-US"/>
-        </w:rPr>
-        <w:t xml:space="preserve"> and variation category</w:t>
+        <w:t>Added area, subarea and variation category</w:t>
       </w:r>
     </w:p>
     <w:p>
@@ -2041,7 +2161,7 @@
                     </pic:cNvPicPr>
                   </pic:nvPicPr>
                   <pic:blipFill>
-                    <a:blip r:embed="rId20">
+                    <a:blip r:embed="rId21">
                       <a:extLst>
                         <a:ext uri="{28A0092B-C50C-407E-A947-70E740481C1C}">
                           <a14:useLocalDpi xmlns:a14="http://schemas.microsoft.com/office/drawing/2010/main" val="0"/>
@@ -2215,7 +2335,7 @@
                     </pic:cNvPicPr>
                   </pic:nvPicPr>
                   <pic:blipFill>
-                    <a:blip r:embed="rId21">
+                    <a:blip r:embed="rId22">
                       <a:extLst>
                         <a:ext uri="{28A0092B-C50C-407E-A947-70E740481C1C}">
                           <a14:useLocalDpi xmlns:a14="http://schemas.microsoft.com/office/drawing/2010/main" val="0"/>
@@ -2323,7 +2443,7 @@
                     </pic:cNvPicPr>
                   </pic:nvPicPr>
                   <pic:blipFill>
-                    <a:blip r:embed="rId22">
+                    <a:blip r:embed="rId23">
                       <a:extLst>
                         <a:ext uri="{28A0092B-C50C-407E-A947-70E740481C1C}">
                           <a14:useLocalDpi xmlns:a14="http://schemas.microsoft.com/office/drawing/2010/main" val="0"/>
@@ -2443,7 +2563,7 @@
                     </pic:cNvPicPr>
                   </pic:nvPicPr>
                   <pic:blipFill>
-                    <a:blip r:embed="rId23">
+                    <a:blip r:embed="rId24">
                       <a:extLst>
                         <a:ext uri="{28A0092B-C50C-407E-A947-70E740481C1C}">
                           <a14:useLocalDpi xmlns:a14="http://schemas.microsoft.com/office/drawing/2010/main" val="0"/>
@@ -2504,7 +2624,7 @@
                     </pic:cNvPicPr>
                   </pic:nvPicPr>
                   <pic:blipFill>
-                    <a:blip r:embed="rId24">
+                    <a:blip r:embed="rId25">
                       <a:extLst>
                         <a:ext uri="{28A0092B-C50C-407E-A947-70E740481C1C}">
                           <a14:useLocalDpi xmlns:a14="http://schemas.microsoft.com/office/drawing/2010/main" val="0"/>
@@ -2604,7 +2724,7 @@
                     </pic:cNvPicPr>
                   </pic:nvPicPr>
                   <pic:blipFill>
-                    <a:blip r:embed="rId25">
+                    <a:blip r:embed="rId26">
                       <a:extLst>
                         <a:ext uri="{28A0092B-C50C-407E-A947-70E740481C1C}">
                           <a14:useLocalDpi xmlns:a14="http://schemas.microsoft.com/office/drawing/2010/main" val="0"/>
@@ -2741,7 +2861,7 @@
                     </pic:cNvPicPr>
                   </pic:nvPicPr>
                   <pic:blipFill>
-                    <a:blip r:embed="rId26" cstate="print">
+                    <a:blip r:embed="rId27" cstate="print">
                       <a:extLst>
                         <a:ext uri="{28A0092B-C50C-407E-A947-70E740481C1C}">
                           <a14:useLocalDpi xmlns:a14="http://schemas.microsoft.com/office/drawing/2010/main" val="0"/>
@@ -2820,7 +2940,7 @@
                     </pic:cNvPicPr>
                   </pic:nvPicPr>
                   <pic:blipFill>
-                    <a:blip r:embed="rId27">
+                    <a:blip r:embed="rId28">
                       <a:extLst>
                         <a:ext uri="{28A0092B-C50C-407E-A947-70E740481C1C}">
                           <a14:useLocalDpi xmlns:a14="http://schemas.microsoft.com/office/drawing/2010/main" val="0"/>
@@ -2941,205 +3061,6 @@
                 <pic:pic xmlns:pic="http://schemas.openxmlformats.org/drawingml/2006/picture">
                   <pic:nvPicPr>
                     <pic:cNvPr id="0" name="Picture 1"/>
-                    <pic:cNvPicPr>
-                      <a:picLocks noChangeAspect="1" noChangeArrowheads="1"/>
-                    </pic:cNvPicPr>
-                  </pic:nvPicPr>
-                  <pic:blipFill>
-                    <a:blip r:embed="rId28">
-                      <a:extLst>
-                        <a:ext uri="{28A0092B-C50C-407E-A947-70E740481C1C}">
-                          <a14:useLocalDpi xmlns:a14="http://schemas.microsoft.com/office/drawing/2010/main" val="0"/>
-                        </a:ext>
-                      </a:extLst>
-                    </a:blip>
-                    <a:srcRect/>
-                    <a:stretch>
-                      <a:fillRect/>
-                    </a:stretch>
-                  </pic:blipFill>
-                  <pic:spPr bwMode="auto">
-                    <a:xfrm>
-                      <a:off x="0" y="0"/>
-                      <a:ext cx="5730875" cy="3870325"/>
-                    </a:xfrm>
-                    <a:prstGeom prst="rect">
-                      <a:avLst/>
-                    </a:prstGeom>
-                    <a:noFill/>
-                    <a:ln>
-                      <a:noFill/>
-                    </a:ln>
-                  </pic:spPr>
-                </pic:pic>
-              </a:graphicData>
-            </a:graphic>
-          </wp:inline>
-        </w:drawing>
-      </w:r>
-    </w:p>
-    <w:p>
-      <w:pPr>
-        <w:ind w:left="1440"/>
-        <w:rPr>
-          <w:lang w:val="en-US"/>
-        </w:rPr>
-      </w:pPr>
-      <w:r>
-        <w:rPr>
-          <w:lang w:val="en-US"/>
-        </w:rPr>
-        <w:t xml:space="preserve">In this instance, deliverable have 100 total hours and 50 hours already earned, but variation defines a 75 </w:t>
-      </w:r>
-      <w:proofErr w:type="gramStart"/>
-      <w:r>
-        <w:rPr>
-          <w:lang w:val="en-US"/>
-        </w:rPr>
-        <w:t>hours</w:t>
-      </w:r>
-      <w:proofErr w:type="gramEnd"/>
-      <w:r>
-        <w:rPr>
-          <w:lang w:val="en-US"/>
-        </w:rPr>
-        <w:t xml:space="preserve"> reduction, two options are available during approval</w:t>
-      </w:r>
-    </w:p>
-    <w:p>
-      <w:pPr>
-        <w:pStyle w:val="ListParagraph"/>
-        <w:numPr>
-          <w:ilvl w:val="2"/>
-          <w:numId w:val="28"/>
-        </w:numPr>
-        <w:rPr>
-          <w:lang w:val="en-US"/>
-        </w:rPr>
-      </w:pPr>
-      <w:r>
-        <w:rPr>
-          <w:lang w:val="en-US"/>
-        </w:rPr>
-        <w:t>Reduce earned hours ticked – Earned units will be reduced to 25 so that 75 hours reduction can be applied</w:t>
-      </w:r>
-    </w:p>
-    <w:p>
-      <w:pPr>
-        <w:pStyle w:val="ListParagraph"/>
-        <w:numPr>
-          <w:ilvl w:val="2"/>
-          <w:numId w:val="28"/>
-        </w:numPr>
-        <w:rPr>
-          <w:lang w:val="en-US"/>
-        </w:rPr>
-      </w:pPr>
-      <w:r>
-        <w:rPr>
-          <w:lang w:val="en-US"/>
-        </w:rPr>
-        <w:t xml:space="preserve">Reduce earned hours not ticked – Variation hours will be changed to 50 hours reduction instead of 75, as defined by maximum reducible </w:t>
-      </w:r>
-      <w:proofErr w:type="gramStart"/>
-      <w:r>
-        <w:rPr>
-          <w:lang w:val="en-US"/>
-        </w:rPr>
-        <w:t>units</w:t>
-      </w:r>
-      <w:proofErr w:type="gramEnd"/>
-      <w:r>
-        <w:rPr>
-          <w:lang w:val="en-US"/>
-        </w:rPr>
-        <w:t xml:space="preserve"> column</w:t>
-      </w:r>
-    </w:p>
-    <w:p>
-      <w:pPr>
-        <w:rPr>
-          <w:lang w:val="en-US"/>
-        </w:rPr>
-      </w:pPr>
-      <w:r>
-        <w:rPr>
-          <w:lang w:val="en-US"/>
-        </w:rPr>
-        <w:br w:type="page"/>
-      </w:r>
-    </w:p>
-    <w:p>
-      <w:pPr>
-        <w:rPr>
-          <w:lang w:val="en-US"/>
-        </w:rPr>
-      </w:pPr>
-      <w:r>
-        <w:rPr>
-          <w:lang w:val="en-US"/>
-        </w:rPr>
-        <w:lastRenderedPageBreak/>
-        <w:t>Cont. Change Log 8</w:t>
-      </w:r>
-      <w:r>
-        <w:rPr>
-          <w:vertAlign w:val="superscript"/>
-          <w:lang w:val="en-US"/>
-        </w:rPr>
-        <w:t>th</w:t>
-      </w:r>
-      <w:r>
-        <w:rPr>
-          <w:lang w:val="en-US"/>
-        </w:rPr>
-        <w:t xml:space="preserve"> Feb 2021</w:t>
-      </w:r>
-    </w:p>
-    <w:p>
-      <w:pPr>
-        <w:pStyle w:val="ListParagraph"/>
-        <w:numPr>
-          <w:ilvl w:val="1"/>
-          <w:numId w:val="28"/>
-        </w:numPr>
-        <w:rPr>
-          <w:lang w:val="en-US"/>
-        </w:rPr>
-      </w:pPr>
-      <w:r>
-        <w:rPr>
-          <w:lang w:val="en-US"/>
-        </w:rPr>
-        <w:t>Added ability to reduce earned units when variations are unapproved</w:t>
-      </w:r>
-    </w:p>
-    <w:p>
-      <w:pPr>
-        <w:pStyle w:val="ListParagraph"/>
-        <w:ind w:left="1440"/>
-        <w:rPr>
-          <w:lang w:val="en-US"/>
-        </w:rPr>
-      </w:pPr>
-      <w:r>
-        <w:rPr>
-          <w:noProof/>
-          <w:lang w:val="en-US"/>
-        </w:rPr>
-        <w:drawing>
-          <wp:inline distT="0" distB="0" distL="0" distR="0" wp14:anchorId="2674E29E" wp14:editId="0A9EBCC1">
-            <wp:extent cx="5730875" cy="3870325"/>
-            <wp:effectExtent l="0" t="0" r="3175" b="0"/>
-            <wp:docPr id="11" name="Picture 11"/>
-            <wp:cNvGraphicFramePr>
-              <a:graphicFrameLocks xmlns:a="http://schemas.openxmlformats.org/drawingml/2006/main" noChangeAspect="1"/>
-            </wp:cNvGraphicFramePr>
-            <a:graphic xmlns:a="http://schemas.openxmlformats.org/drawingml/2006/main">
-              <a:graphicData uri="http://schemas.openxmlformats.org/drawingml/2006/picture">
-                <pic:pic xmlns:pic="http://schemas.openxmlformats.org/drawingml/2006/picture">
-                  <pic:nvPicPr>
-                    <pic:cNvPr id="0" name="Picture 2"/>
                     <pic:cNvPicPr>
                       <a:picLocks noChangeAspect="1" noChangeArrowheads="1"/>
                     </pic:cNvPicPr>
@@ -3179,7 +3100,6 @@
     </w:p>
     <w:p>
       <w:pPr>
-        <w:pStyle w:val="ListParagraph"/>
         <w:ind w:left="1440"/>
         <w:rPr>
           <w:lang w:val="en-US"/>
@@ -3189,44 +3109,180 @@
         <w:rPr>
           <w:lang w:val="en-US"/>
         </w:rPr>
-        <w:t xml:space="preserve">For instance, a variation that was previously approved with 100 hours is now in the process of </w:t>
-      </w:r>
-      <w:proofErr w:type="spellStart"/>
-      <w:r>
-        <w:rPr>
-          <w:lang w:val="en-US"/>
-        </w:rPr>
-        <w:t>unapproval</w:t>
-      </w:r>
-      <w:proofErr w:type="spellEnd"/>
-      <w:r>
-        <w:rPr>
-          <w:lang w:val="en-US"/>
-        </w:rPr>
-        <w:t xml:space="preserve">. </w:t>
-      </w:r>
-      <w:proofErr w:type="gramStart"/>
-      <w:r>
-        <w:rPr>
-          <w:lang w:val="en-US"/>
-        </w:rPr>
-        <w:t>Since</w:t>
-      </w:r>
-      <w:proofErr w:type="gramEnd"/>
-      <w:r>
-        <w:rPr>
-          <w:lang w:val="en-US"/>
-        </w:rPr>
-        <w:t xml:space="preserve"> 50 hours has already been earned, 2 options are available during </w:t>
-      </w:r>
-      <w:proofErr w:type="spellStart"/>
-      <w:r>
-        <w:rPr>
-          <w:lang w:val="en-US"/>
-        </w:rPr>
-        <w:t>unapproval</w:t>
-      </w:r>
-      <w:proofErr w:type="spellEnd"/>
+        <w:t>In this instance, deliverable have 100 total hours and 50 hours already earned, but variation defines a 75 hours reduction, two options are available during approval</w:t>
+      </w:r>
+    </w:p>
+    <w:p>
+      <w:pPr>
+        <w:pStyle w:val="ListParagraph"/>
+        <w:numPr>
+          <w:ilvl w:val="2"/>
+          <w:numId w:val="28"/>
+        </w:numPr>
+        <w:rPr>
+          <w:lang w:val="en-US"/>
+        </w:rPr>
+      </w:pPr>
+      <w:r>
+        <w:rPr>
+          <w:lang w:val="en-US"/>
+        </w:rPr>
+        <w:t>Reduce earned hours ticked – Earned units will be reduced to 25 so that 75 hours reduction can be applied</w:t>
+      </w:r>
+    </w:p>
+    <w:p>
+      <w:pPr>
+        <w:pStyle w:val="ListParagraph"/>
+        <w:numPr>
+          <w:ilvl w:val="2"/>
+          <w:numId w:val="28"/>
+        </w:numPr>
+        <w:rPr>
+          <w:lang w:val="en-US"/>
+        </w:rPr>
+      </w:pPr>
+      <w:r>
+        <w:rPr>
+          <w:lang w:val="en-US"/>
+        </w:rPr>
+        <w:t>Reduce earned hours not ticked – Variation hours will be changed to 50 hours reduction instead of 75, as defined by maximum reducible units column</w:t>
+      </w:r>
+    </w:p>
+    <w:p>
+      <w:pPr>
+        <w:rPr>
+          <w:lang w:val="en-US"/>
+        </w:rPr>
+      </w:pPr>
+      <w:r>
+        <w:rPr>
+          <w:lang w:val="en-US"/>
+        </w:rPr>
+        <w:br w:type="page"/>
+      </w:r>
+    </w:p>
+    <w:p>
+      <w:pPr>
+        <w:rPr>
+          <w:lang w:val="en-US"/>
+        </w:rPr>
+      </w:pPr>
+      <w:r>
+        <w:rPr>
+          <w:lang w:val="en-US"/>
+        </w:rPr>
+        <w:lastRenderedPageBreak/>
+        <w:t>Cont. Change Log 8</w:t>
+      </w:r>
+      <w:r>
+        <w:rPr>
+          <w:vertAlign w:val="superscript"/>
+          <w:lang w:val="en-US"/>
+        </w:rPr>
+        <w:t>th</w:t>
+      </w:r>
+      <w:r>
+        <w:rPr>
+          <w:lang w:val="en-US"/>
+        </w:rPr>
+        <w:t xml:space="preserve"> Feb 2021</w:t>
+      </w:r>
+    </w:p>
+    <w:p>
+      <w:pPr>
+        <w:pStyle w:val="ListParagraph"/>
+        <w:numPr>
+          <w:ilvl w:val="1"/>
+          <w:numId w:val="28"/>
+        </w:numPr>
+        <w:rPr>
+          <w:lang w:val="en-US"/>
+        </w:rPr>
+      </w:pPr>
+      <w:r>
+        <w:rPr>
+          <w:lang w:val="en-US"/>
+        </w:rPr>
+        <w:t>Added ability to reduce earned units when variations are unapproved</w:t>
+      </w:r>
+    </w:p>
+    <w:p>
+      <w:pPr>
+        <w:pStyle w:val="ListParagraph"/>
+        <w:ind w:left="1440"/>
+        <w:rPr>
+          <w:lang w:val="en-US"/>
+        </w:rPr>
+      </w:pPr>
+      <w:r>
+        <w:rPr>
+          <w:noProof/>
+          <w:lang w:val="en-US"/>
+        </w:rPr>
+        <w:drawing>
+          <wp:inline distT="0" distB="0" distL="0" distR="0" wp14:anchorId="2674E29E" wp14:editId="0A9EBCC1">
+            <wp:extent cx="5730875" cy="3870325"/>
+            <wp:effectExtent l="0" t="0" r="3175" b="0"/>
+            <wp:docPr id="11" name="Picture 11"/>
+            <wp:cNvGraphicFramePr>
+              <a:graphicFrameLocks xmlns:a="http://schemas.openxmlformats.org/drawingml/2006/main" noChangeAspect="1"/>
+            </wp:cNvGraphicFramePr>
+            <a:graphic xmlns:a="http://schemas.openxmlformats.org/drawingml/2006/main">
+              <a:graphicData uri="http://schemas.openxmlformats.org/drawingml/2006/picture">
+                <pic:pic xmlns:pic="http://schemas.openxmlformats.org/drawingml/2006/picture">
+                  <pic:nvPicPr>
+                    <pic:cNvPr id="0" name="Picture 2"/>
+                    <pic:cNvPicPr>
+                      <a:picLocks noChangeAspect="1" noChangeArrowheads="1"/>
+                    </pic:cNvPicPr>
+                  </pic:nvPicPr>
+                  <pic:blipFill>
+                    <a:blip r:embed="rId30">
+                      <a:extLst>
+                        <a:ext uri="{28A0092B-C50C-407E-A947-70E740481C1C}">
+                          <a14:useLocalDpi xmlns:a14="http://schemas.microsoft.com/office/drawing/2010/main" val="0"/>
+                        </a:ext>
+                      </a:extLst>
+                    </a:blip>
+                    <a:srcRect/>
+                    <a:stretch>
+                      <a:fillRect/>
+                    </a:stretch>
+                  </pic:blipFill>
+                  <pic:spPr bwMode="auto">
+                    <a:xfrm>
+                      <a:off x="0" y="0"/>
+                      <a:ext cx="5730875" cy="3870325"/>
+                    </a:xfrm>
+                    <a:prstGeom prst="rect">
+                      <a:avLst/>
+                    </a:prstGeom>
+                    <a:noFill/>
+                    <a:ln>
+                      <a:noFill/>
+                    </a:ln>
+                  </pic:spPr>
+                </pic:pic>
+              </a:graphicData>
+            </a:graphic>
+          </wp:inline>
+        </w:drawing>
+      </w:r>
+    </w:p>
+    <w:p>
+      <w:pPr>
+        <w:pStyle w:val="ListParagraph"/>
+        <w:ind w:left="1440"/>
+        <w:rPr>
+          <w:lang w:val="en-US"/>
+        </w:rPr>
+      </w:pPr>
+      <w:r>
+        <w:rPr>
+          <w:lang w:val="en-US"/>
+        </w:rPr>
+        <w:t>For instance, a variation that was previously approved with 100 hours is now in the process of unapproval. Since 50 hours has already been earned, 2 options are available during unapproval</w:t>
+      </w:r>
     </w:p>
     <w:p>
       <w:pPr>
@@ -3243,21 +3299,7 @@
         <w:rPr>
           <w:lang w:val="en-US"/>
         </w:rPr>
-        <w:t xml:space="preserve">Reduce earned hours ticked – Earned units will be reduced to 0 so that </w:t>
-      </w:r>
-      <w:proofErr w:type="spellStart"/>
-      <w:r>
-        <w:rPr>
-          <w:lang w:val="en-US"/>
-        </w:rPr>
-        <w:t>unapproval</w:t>
-      </w:r>
-      <w:proofErr w:type="spellEnd"/>
-      <w:r>
-        <w:rPr>
-          <w:lang w:val="en-US"/>
-        </w:rPr>
-        <w:t xml:space="preserve"> with 100 hours taken away from the deliverable can take place</w:t>
+        <w:t>Reduce earned hours ticked – Earned units will be reduced to 0 so that unapproval with 100 hours taken away from the deliverable can take place</w:t>
       </w:r>
     </w:p>
     <w:p>
@@ -3380,7 +3422,7 @@
                     </pic:cNvPicPr>
                   </pic:nvPicPr>
                   <pic:blipFill>
-                    <a:blip r:embed="rId30">
+                    <a:blip r:embed="rId31">
                       <a:extLst>
                         <a:ext uri="{28A0092B-C50C-407E-A947-70E740481C1C}">
                           <a14:useLocalDpi xmlns:a14="http://schemas.microsoft.com/office/drawing/2010/main" val="0"/>
@@ -3537,7 +3579,7 @@
                     </pic:cNvPicPr>
                   </pic:nvPicPr>
                   <pic:blipFill>
-                    <a:blip r:embed="rId31">
+                    <a:blip r:embed="rId32">
                       <a:extLst>
                         <a:ext uri="{28A0092B-C50C-407E-A947-70E740481C1C}">
                           <a14:useLocalDpi xmlns:a14="http://schemas.microsoft.com/office/drawing/2010/main" val="0"/>
@@ -3636,7 +3678,7 @@
                     </pic:cNvPicPr>
                   </pic:nvPicPr>
                   <pic:blipFill>
-                    <a:blip r:embed="rId32">
+                    <a:blip r:embed="rId33">
                       <a:extLst>
                         <a:ext uri="{28A0092B-C50C-407E-A947-70E740481C1C}">
                           <a14:useLocalDpi xmlns:a14="http://schemas.microsoft.com/office/drawing/2010/main" val="0"/>
@@ -3761,7 +3803,7 @@
                     </pic:cNvPicPr>
                   </pic:nvPicPr>
                   <pic:blipFill>
-                    <a:blip r:embed="rId33" cstate="print">
+                    <a:blip r:embed="rId34" cstate="print">
                       <a:extLst>
                         <a:ext uri="{28A0092B-C50C-407E-A947-70E740481C1C}">
                           <a14:useLocalDpi xmlns:a14="http://schemas.microsoft.com/office/drawing/2010/main" val="0"/>
@@ -3824,7 +3866,7 @@
                     </pic:cNvPicPr>
                   </pic:nvPicPr>
                   <pic:blipFill>
-                    <a:blip r:embed="rId34">
+                    <a:blip r:embed="rId35">
                       <a:extLst>
                         <a:ext uri="{28A0092B-C50C-407E-A947-70E740481C1C}">
                           <a14:useLocalDpi xmlns:a14="http://schemas.microsoft.com/office/drawing/2010/main" val="0"/>
@@ -3949,7 +3991,7 @@
                     </pic:cNvPicPr>
                   </pic:nvPicPr>
                   <pic:blipFill>
-                    <a:blip r:embed="rId35">
+                    <a:blip r:embed="rId36">
                       <a:extLst>
                         <a:ext uri="{28A0092B-C50C-407E-A947-70E740481C1C}">
                           <a14:useLocalDpi xmlns:a14="http://schemas.microsoft.com/office/drawing/2010/main" val="0"/>
@@ -4049,7 +4091,7 @@
                     </pic:cNvPicPr>
                   </pic:nvPicPr>
                   <pic:blipFill>
-                    <a:blip r:embed="rId36">
+                    <a:blip r:embed="rId37">
                       <a:extLst>
                         <a:ext uri="{28A0092B-C50C-407E-A947-70E740481C1C}">
                           <a14:useLocalDpi xmlns:a14="http://schemas.microsoft.com/office/drawing/2010/main" val="0"/>
@@ -4112,7 +4154,7 @@
                     </pic:cNvPicPr>
                   </pic:nvPicPr>
                   <pic:blipFill>
-                    <a:blip r:embed="rId37">
+                    <a:blip r:embed="rId38">
                       <a:extLst>
                         <a:ext uri="{28A0092B-C50C-407E-A947-70E740481C1C}">
                           <a14:useLocalDpi xmlns:a14="http://schemas.microsoft.com/office/drawing/2010/main" val="0"/>
@@ -4209,21 +4251,7 @@
         <w:rPr>
           <w:lang w:val="en-US"/>
         </w:rPr>
-        <w:t xml:space="preserve"> gates </w:t>
-      </w:r>
-      <w:proofErr w:type="gramStart"/>
-      <w:r>
-        <w:rPr>
-          <w:lang w:val="en-US"/>
-        </w:rPr>
-        <w:t>goes</w:t>
-      </w:r>
-      <w:proofErr w:type="gramEnd"/>
-      <w:r>
-        <w:rPr>
-          <w:lang w:val="en-US"/>
-        </w:rPr>
-        <w:t xml:space="preserve"> by phases to support differentiation between D1, D2</w:t>
+        <w:t xml:space="preserve"> gates goes by phases to support differentiation between D1, D2</w:t>
       </w:r>
     </w:p>
     <w:p>
@@ -4344,7 +4372,7 @@
                     </pic:cNvPicPr>
                   </pic:nvPicPr>
                   <pic:blipFill>
-                    <a:blip r:embed="rId38">
+                    <a:blip r:embed="rId39">
                       <a:extLst>
                         <a:ext uri="{28A0092B-C50C-407E-A947-70E740481C1C}">
                           <a14:useLocalDpi xmlns:a14="http://schemas.microsoft.com/office/drawing/2010/main" val="0"/>
@@ -4713,21 +4741,7 @@
         <w:rPr>
           <w:lang w:val="en-US"/>
         </w:rPr>
-        <w:t xml:space="preserve">how cell error when sub job codes </w:t>
-      </w:r>
-      <w:proofErr w:type="gramStart"/>
-      <w:r>
-        <w:rPr>
-          <w:lang w:val="en-US"/>
-        </w:rPr>
-        <w:t>isn't</w:t>
-      </w:r>
-      <w:proofErr w:type="gramEnd"/>
-      <w:r>
-        <w:rPr>
-          <w:lang w:val="en-US"/>
-        </w:rPr>
-        <w:t xml:space="preserve"> valid for chosen type</w:t>
+        <w:t>how cell error when sub job codes isn't valid for chosen type</w:t>
       </w:r>
     </w:p>
     <w:p>
@@ -4796,21 +4810,7 @@
         <w:rPr>
           <w:lang w:val="en-US"/>
         </w:rPr>
-        <w:t xml:space="preserve">how empty cost group and cost type in forecast to </w:t>
-      </w:r>
-      <w:proofErr w:type="spellStart"/>
-      <w:r>
-        <w:rPr>
-          <w:lang w:val="en-US"/>
-        </w:rPr>
-        <w:t>accomodate</w:t>
-      </w:r>
-      <w:proofErr w:type="spellEnd"/>
-      <w:r>
-        <w:rPr>
-          <w:lang w:val="en-US"/>
-        </w:rPr>
-        <w:t xml:space="preserve"> variations without cost group and cost type coming from construction variation module</w:t>
+        <w:t>how empty cost group and cost type in forecast to accomodate variations without cost group and cost type coming from construction variation module</w:t>
       </w:r>
     </w:p>
     <w:p>
@@ -4878,21 +4878,7 @@
         <w:rPr>
           <w:lang w:val="en-US"/>
         </w:rPr>
-        <w:t xml:space="preserve">ixed an issue </w:t>
-      </w:r>
-      <w:proofErr w:type="gramStart"/>
-      <w:r>
-        <w:rPr>
-          <w:lang w:val="en-US"/>
-        </w:rPr>
-        <w:t>where</w:t>
-      </w:r>
-      <w:proofErr w:type="gramEnd"/>
-      <w:r>
-        <w:rPr>
-          <w:lang w:val="en-US"/>
-        </w:rPr>
-        <w:t xml:space="preserve"> committing to </w:t>
+        <w:t xml:space="preserve">ixed an issue where committing to </w:t>
       </w:r>
       <w:r>
         <w:rPr>
@@ -5444,7 +5430,7 @@
           <w:lang w:val="en-US"/>
         </w:rPr>
       </w:pPr>
-      <w:hyperlink r:id="rId39" w:history="1">
+      <w:hyperlink r:id="rId40" w:history="1">
         <w:r>
           <w:rPr>
             <w:rStyle w:val="Hyperlink"/>
@@ -5514,21 +5500,7 @@
           <w:lang w:val="en-US"/>
         </w:rPr>
         <w:lastRenderedPageBreak/>
-        <w:t xml:space="preserve">Added column to show actual </w:t>
-      </w:r>
-      <w:proofErr w:type="spellStart"/>
-      <w:r>
-        <w:rPr>
-          <w:lang w:val="en-US"/>
-        </w:rPr>
-        <w:t>labour</w:t>
-      </w:r>
-      <w:proofErr w:type="spellEnd"/>
-      <w:r>
-        <w:rPr>
-          <w:lang w:val="en-US"/>
-        </w:rPr>
-        <w:t xml:space="preserve"> units post data date</w:t>
+        <w:t>Added column to show actual labour units post data date</w:t>
       </w:r>
     </w:p>
     <w:p>
@@ -5714,21 +5686,7 @@
         <w:rPr>
           <w:lang w:val="en-US"/>
         </w:rPr>
-        <w:t xml:space="preserve">Added show variation name and approve </w:t>
-      </w:r>
-      <w:proofErr w:type="gramStart"/>
-      <w:r>
-        <w:rPr>
-          <w:lang w:val="en-US"/>
-        </w:rPr>
-        <w:t>units</w:t>
-      </w:r>
-      <w:proofErr w:type="gramEnd"/>
-      <w:r>
-        <w:rPr>
-          <w:lang w:val="en-US"/>
-        </w:rPr>
-        <w:t xml:space="preserve"> column</w:t>
+        <w:t>Added show variation name and approve units column</w:t>
       </w:r>
     </w:p>
     <w:p>
@@ -5738,7 +5696,7 @@
           <w:lang w:val="en-US"/>
         </w:rPr>
       </w:pPr>
-      <w:hyperlink r:id="rId40" w:history="1">
+      <w:hyperlink r:id="rId41" w:history="1">
         <w:r>
           <w:rPr>
             <w:rStyle w:val="Hyperlink"/>
@@ -5818,7 +5776,7 @@
           <w:lang w:val="en-US"/>
         </w:rPr>
       </w:pPr>
-      <w:hyperlink r:id="rId41" w:history="1">
+      <w:hyperlink r:id="rId42" w:history="1">
         <w:r>
           <w:rPr>
             <w:rStyle w:val="Hyperlink"/>
@@ -6062,21 +6020,7 @@
         <w:rPr>
           <w:lang w:val="en-US"/>
         </w:rPr>
-        <w:t xml:space="preserve">ixed an issue where </w:t>
-      </w:r>
-      <w:proofErr w:type="spellStart"/>
-      <w:r>
-        <w:rPr>
-          <w:lang w:val="en-US"/>
-        </w:rPr>
-        <w:t>subjob</w:t>
-      </w:r>
-      <w:proofErr w:type="spellEnd"/>
-      <w:r>
-        <w:rPr>
-          <w:lang w:val="en-US"/>
-        </w:rPr>
-        <w:t xml:space="preserve"> variation code doesn't show up in book time</w:t>
+        <w:t>ixed an issue where subjob variation code doesn't show up in book time</w:t>
       </w:r>
     </w:p>
     <w:p>
@@ -6339,35 +6283,7 @@
         <w:rPr>
           <w:rFonts w:cs="Calibri"/>
         </w:rPr>
-        <w:t xml:space="preserve">Editing Exo -&gt; Transaction quantity will adjust line cost, line charge, line total, line total tax, line tax and </w:t>
-      </w:r>
-      <w:proofErr w:type="spellStart"/>
-      <w:r>
-        <w:rPr>
-          <w:rFonts w:cs="Calibri"/>
-        </w:rPr>
-        <w:t>linetotal</w:t>
-      </w:r>
-      <w:proofErr w:type="spellEnd"/>
-      <w:r>
-        <w:rPr>
-          <w:rFonts w:cs="Calibri"/>
-        </w:rPr>
-        <w:t xml:space="preserve"> </w:t>
-      </w:r>
-      <w:proofErr w:type="spellStart"/>
-      <w:r>
-        <w:rPr>
-          <w:rFonts w:cs="Calibri"/>
-        </w:rPr>
-        <w:t>incl</w:t>
-      </w:r>
-      <w:proofErr w:type="spellEnd"/>
-      <w:r>
-        <w:rPr>
-          <w:rFonts w:cs="Calibri"/>
-        </w:rPr>
-        <w:t xml:space="preserve"> tax in EXO</w:t>
+        <w:t>Editing Exo -&gt; Transaction quantity will adjust line cost, line charge, line total, line total tax, line tax and linetotal incl tax in EXO</w:t>
       </w:r>
     </w:p>
     <w:p>
@@ -6578,7 +6494,7 @@
           <w:lang w:val="en-US"/>
         </w:rPr>
       </w:pPr>
-      <w:hyperlink r:id="rId42" w:history="1">
+      <w:hyperlink r:id="rId43" w:history="1">
         <w:r>
           <w:rPr>
             <w:rStyle w:val="Hyperlink"/>
@@ -9065,6 +8981,118 @@
     </w:lvl>
   </w:abstractNum>
   <w:abstractNum w:abstractNumId="22" w15:restartNumberingAfterBreak="0">
+    <w:nsid w:val="48B91C47"/>
+    <w:multiLevelType w:val="hybridMultilevel"/>
+    <w:tmpl w:val="56F693FA"/>
+    <w:lvl w:ilvl="0" w:tplc="AC327D0A">
+      <w:numFmt w:val="bullet"/>
+      <w:lvlText w:val="-"/>
+      <w:lvlJc w:val="left"/>
+      <w:pPr>
+        <w:ind w:left="720" w:hanging="360"/>
+      </w:pPr>
+      <w:rPr>
+        <w:rFonts w:ascii="Calibri" w:eastAsiaTheme="minorEastAsia" w:hAnsi="Calibri" w:cs="Calibri" w:hint="default"/>
+      </w:rPr>
+    </w:lvl>
+    <w:lvl w:ilvl="1" w:tplc="44090003">
+      <w:start w:val="1"/>
+      <w:numFmt w:val="bullet"/>
+      <w:lvlText w:val="o"/>
+      <w:lvlJc w:val="left"/>
+      <w:pPr>
+        <w:ind w:left="1440" w:hanging="360"/>
+      </w:pPr>
+      <w:rPr>
+        <w:rFonts w:ascii="Courier New" w:hAnsi="Courier New" w:cs="Courier New" w:hint="default"/>
+      </w:rPr>
+    </w:lvl>
+    <w:lvl w:ilvl="2" w:tplc="44090005" w:tentative="1">
+      <w:start w:val="1"/>
+      <w:numFmt w:val="bullet"/>
+      <w:lvlText w:val=""/>
+      <w:lvlJc w:val="left"/>
+      <w:pPr>
+        <w:ind w:left="2160" w:hanging="360"/>
+      </w:pPr>
+      <w:rPr>
+        <w:rFonts w:ascii="Wingdings" w:hAnsi="Wingdings" w:hint="default"/>
+      </w:rPr>
+    </w:lvl>
+    <w:lvl w:ilvl="3" w:tplc="44090001" w:tentative="1">
+      <w:start w:val="1"/>
+      <w:numFmt w:val="bullet"/>
+      <w:lvlText w:val=""/>
+      <w:lvlJc w:val="left"/>
+      <w:pPr>
+        <w:ind w:left="2880" w:hanging="360"/>
+      </w:pPr>
+      <w:rPr>
+        <w:rFonts w:ascii="Symbol" w:hAnsi="Symbol" w:hint="default"/>
+      </w:rPr>
+    </w:lvl>
+    <w:lvl w:ilvl="4" w:tplc="44090003" w:tentative="1">
+      <w:start w:val="1"/>
+      <w:numFmt w:val="bullet"/>
+      <w:lvlText w:val="o"/>
+      <w:lvlJc w:val="left"/>
+      <w:pPr>
+        <w:ind w:left="3600" w:hanging="360"/>
+      </w:pPr>
+      <w:rPr>
+        <w:rFonts w:ascii="Courier New" w:hAnsi="Courier New" w:cs="Courier New" w:hint="default"/>
+      </w:rPr>
+    </w:lvl>
+    <w:lvl w:ilvl="5" w:tplc="44090005" w:tentative="1">
+      <w:start w:val="1"/>
+      <w:numFmt w:val="bullet"/>
+      <w:lvlText w:val=""/>
+      <w:lvlJc w:val="left"/>
+      <w:pPr>
+        <w:ind w:left="4320" w:hanging="360"/>
+      </w:pPr>
+      <w:rPr>
+        <w:rFonts w:ascii="Wingdings" w:hAnsi="Wingdings" w:hint="default"/>
+      </w:rPr>
+    </w:lvl>
+    <w:lvl w:ilvl="6" w:tplc="44090001" w:tentative="1">
+      <w:start w:val="1"/>
+      <w:numFmt w:val="bullet"/>
+      <w:lvlText w:val=""/>
+      <w:lvlJc w:val="left"/>
+      <w:pPr>
+        <w:ind w:left="5040" w:hanging="360"/>
+      </w:pPr>
+      <w:rPr>
+        <w:rFonts w:ascii="Symbol" w:hAnsi="Symbol" w:hint="default"/>
+      </w:rPr>
+    </w:lvl>
+    <w:lvl w:ilvl="7" w:tplc="44090003" w:tentative="1">
+      <w:start w:val="1"/>
+      <w:numFmt w:val="bullet"/>
+      <w:lvlText w:val="o"/>
+      <w:lvlJc w:val="left"/>
+      <w:pPr>
+        <w:ind w:left="5760" w:hanging="360"/>
+      </w:pPr>
+      <w:rPr>
+        <w:rFonts w:ascii="Courier New" w:hAnsi="Courier New" w:cs="Courier New" w:hint="default"/>
+      </w:rPr>
+    </w:lvl>
+    <w:lvl w:ilvl="8" w:tplc="44090005" w:tentative="1">
+      <w:start w:val="1"/>
+      <w:numFmt w:val="bullet"/>
+      <w:lvlText w:val=""/>
+      <w:lvlJc w:val="left"/>
+      <w:pPr>
+        <w:ind w:left="6480" w:hanging="360"/>
+      </w:pPr>
+      <w:rPr>
+        <w:rFonts w:ascii="Wingdings" w:hAnsi="Wingdings" w:hint="default"/>
+      </w:rPr>
+    </w:lvl>
+  </w:abstractNum>
+  <w:abstractNum w:abstractNumId="23" w15:restartNumberingAfterBreak="0">
     <w:nsid w:val="4A9D1EBF"/>
     <w:multiLevelType w:val="hybridMultilevel"/>
     <w:tmpl w:val="3DEACDCC"/>
@@ -9176,7 +9204,7 @@
       </w:rPr>
     </w:lvl>
   </w:abstractNum>
-  <w:abstractNum w:abstractNumId="23" w15:restartNumberingAfterBreak="0">
+  <w:abstractNum w:abstractNumId="24" w15:restartNumberingAfterBreak="0">
     <w:nsid w:val="52606647"/>
     <w:multiLevelType w:val="hybridMultilevel"/>
     <w:tmpl w:val="34FAD1A0"/>
@@ -9288,7 +9316,7 @@
       </w:rPr>
     </w:lvl>
   </w:abstractNum>
-  <w:abstractNum w:abstractNumId="24" w15:restartNumberingAfterBreak="0">
+  <w:abstractNum w:abstractNumId="25" w15:restartNumberingAfterBreak="0">
     <w:nsid w:val="557D5C95"/>
     <w:multiLevelType w:val="hybridMultilevel"/>
     <w:tmpl w:val="DC122E1C"/>
@@ -9400,7 +9428,7 @@
       </w:rPr>
     </w:lvl>
   </w:abstractNum>
-  <w:abstractNum w:abstractNumId="25" w15:restartNumberingAfterBreak="0">
+  <w:abstractNum w:abstractNumId="26" w15:restartNumberingAfterBreak="0">
     <w:nsid w:val="589D37B7"/>
     <w:multiLevelType w:val="hybridMultilevel"/>
     <w:tmpl w:val="9262429A"/>
@@ -9512,7 +9540,7 @@
       </w:rPr>
     </w:lvl>
   </w:abstractNum>
-  <w:abstractNum w:abstractNumId="26" w15:restartNumberingAfterBreak="0">
+  <w:abstractNum w:abstractNumId="27" w15:restartNumberingAfterBreak="0">
     <w:nsid w:val="58AA443D"/>
     <w:multiLevelType w:val="hybridMultilevel"/>
     <w:tmpl w:val="56F0D18E"/>
@@ -9625,7 +9653,7 @@
       </w:rPr>
     </w:lvl>
   </w:abstractNum>
-  <w:abstractNum w:abstractNumId="27" w15:restartNumberingAfterBreak="0">
+  <w:abstractNum w:abstractNumId="28" w15:restartNumberingAfterBreak="0">
     <w:nsid w:val="59EE4063"/>
     <w:multiLevelType w:val="hybridMultilevel"/>
     <w:tmpl w:val="0482313C"/>
@@ -9737,7 +9765,7 @@
       </w:rPr>
     </w:lvl>
   </w:abstractNum>
-  <w:abstractNum w:abstractNumId="28" w15:restartNumberingAfterBreak="0">
+  <w:abstractNum w:abstractNumId="29" w15:restartNumberingAfterBreak="0">
     <w:nsid w:val="5B4B0EE2"/>
     <w:multiLevelType w:val="hybridMultilevel"/>
     <w:tmpl w:val="E8129FD8"/>
@@ -9849,7 +9877,7 @@
       </w:rPr>
     </w:lvl>
   </w:abstractNum>
-  <w:abstractNum w:abstractNumId="29" w15:restartNumberingAfterBreak="0">
+  <w:abstractNum w:abstractNumId="30" w15:restartNumberingAfterBreak="0">
     <w:nsid w:val="5BF34BEE"/>
     <w:multiLevelType w:val="hybridMultilevel"/>
     <w:tmpl w:val="1D48A376"/>
@@ -9961,7 +9989,7 @@
       </w:rPr>
     </w:lvl>
   </w:abstractNum>
-  <w:abstractNum w:abstractNumId="30" w15:restartNumberingAfterBreak="0">
+  <w:abstractNum w:abstractNumId="31" w15:restartNumberingAfterBreak="0">
     <w:nsid w:val="5C8347BF"/>
     <w:multiLevelType w:val="hybridMultilevel"/>
     <w:tmpl w:val="D2F46B88"/>
@@ -10073,7 +10101,7 @@
       </w:rPr>
     </w:lvl>
   </w:abstractNum>
-  <w:abstractNum w:abstractNumId="31" w15:restartNumberingAfterBreak="0">
+  <w:abstractNum w:abstractNumId="32" w15:restartNumberingAfterBreak="0">
     <w:nsid w:val="61693A7A"/>
     <w:multiLevelType w:val="hybridMultilevel"/>
     <w:tmpl w:val="580AF2C6"/>
@@ -10186,7 +10214,7 @@
       </w:rPr>
     </w:lvl>
   </w:abstractNum>
-  <w:abstractNum w:abstractNumId="32" w15:restartNumberingAfterBreak="0">
+  <w:abstractNum w:abstractNumId="33" w15:restartNumberingAfterBreak="0">
     <w:nsid w:val="63C54BFA"/>
     <w:multiLevelType w:val="hybridMultilevel"/>
     <w:tmpl w:val="8122740C"/>
@@ -10298,7 +10326,7 @@
       </w:rPr>
     </w:lvl>
   </w:abstractNum>
-  <w:abstractNum w:abstractNumId="33" w15:restartNumberingAfterBreak="0">
+  <w:abstractNum w:abstractNumId="34" w15:restartNumberingAfterBreak="0">
     <w:nsid w:val="6A047A76"/>
     <w:multiLevelType w:val="hybridMultilevel"/>
     <w:tmpl w:val="50CADEB2"/>
@@ -10410,7 +10438,7 @@
       </w:rPr>
     </w:lvl>
   </w:abstractNum>
-  <w:abstractNum w:abstractNumId="34" w15:restartNumberingAfterBreak="0">
+  <w:abstractNum w:abstractNumId="35" w15:restartNumberingAfterBreak="0">
     <w:nsid w:val="6A3A0B6E"/>
     <w:multiLevelType w:val="hybridMultilevel"/>
     <w:tmpl w:val="759C482E"/>
@@ -10522,7 +10550,7 @@
       </w:rPr>
     </w:lvl>
   </w:abstractNum>
-  <w:abstractNum w:abstractNumId="35" w15:restartNumberingAfterBreak="0">
+  <w:abstractNum w:abstractNumId="36" w15:restartNumberingAfterBreak="0">
     <w:nsid w:val="6AC268F7"/>
     <w:multiLevelType w:val="hybridMultilevel"/>
     <w:tmpl w:val="12F21194"/>
@@ -10634,7 +10662,7 @@
       </w:rPr>
     </w:lvl>
   </w:abstractNum>
-  <w:abstractNum w:abstractNumId="36" w15:restartNumberingAfterBreak="0">
+  <w:abstractNum w:abstractNumId="37" w15:restartNumberingAfterBreak="0">
     <w:nsid w:val="6CE7392E"/>
     <w:multiLevelType w:val="hybridMultilevel"/>
     <w:tmpl w:val="2E2C9BDE"/>
@@ -10746,7 +10774,7 @@
       </w:rPr>
     </w:lvl>
   </w:abstractNum>
-  <w:abstractNum w:abstractNumId="37" w15:restartNumberingAfterBreak="0">
+  <w:abstractNum w:abstractNumId="38" w15:restartNumberingAfterBreak="0">
     <w:nsid w:val="6E3F3F9F"/>
     <w:multiLevelType w:val="hybridMultilevel"/>
     <w:tmpl w:val="A13CFC48"/>
@@ -10858,7 +10886,7 @@
       </w:rPr>
     </w:lvl>
   </w:abstractNum>
-  <w:abstractNum w:abstractNumId="38" w15:restartNumberingAfterBreak="0">
+  <w:abstractNum w:abstractNumId="39" w15:restartNumberingAfterBreak="0">
     <w:nsid w:val="74A1190D"/>
     <w:multiLevelType w:val="hybridMultilevel"/>
     <w:tmpl w:val="D5387ACA"/>
@@ -10970,7 +10998,7 @@
       </w:rPr>
     </w:lvl>
   </w:abstractNum>
-  <w:abstractNum w:abstractNumId="39" w15:restartNumberingAfterBreak="0">
+  <w:abstractNum w:abstractNumId="40" w15:restartNumberingAfterBreak="0">
     <w:nsid w:val="7E7D5380"/>
     <w:multiLevelType w:val="hybridMultilevel"/>
     <w:tmpl w:val="7668ED14"/>
@@ -11082,7 +11110,7 @@
       </w:rPr>
     </w:lvl>
   </w:abstractNum>
-  <w:abstractNum w:abstractNumId="40" w15:restartNumberingAfterBreak="0">
+  <w:abstractNum w:abstractNumId="41" w15:restartNumberingAfterBreak="0">
     <w:nsid w:val="7EAA14ED"/>
     <w:multiLevelType w:val="hybridMultilevel"/>
     <w:tmpl w:val="AF783BA4"/>
@@ -11194,7 +11222,7 @@
       </w:rPr>
     </w:lvl>
   </w:abstractNum>
-  <w:abstractNum w:abstractNumId="41" w15:restartNumberingAfterBreak="0">
+  <w:abstractNum w:abstractNumId="42" w15:restartNumberingAfterBreak="0">
     <w:nsid w:val="7FD565FA"/>
     <w:multiLevelType w:val="hybridMultilevel"/>
     <w:tmpl w:val="E5906ACC"/>
@@ -11310,25 +11338,25 @@
     <w:abstractNumId w:val="3"/>
   </w:num>
   <w:num w:numId="2">
-    <w:abstractNumId w:val="30"/>
+    <w:abstractNumId w:val="31"/>
   </w:num>
   <w:num w:numId="3">
-    <w:abstractNumId w:val="25"/>
+    <w:abstractNumId w:val="26"/>
   </w:num>
   <w:num w:numId="4">
-    <w:abstractNumId w:val="23"/>
+    <w:abstractNumId w:val="24"/>
   </w:num>
   <w:num w:numId="5">
     <w:abstractNumId w:val="12"/>
   </w:num>
   <w:num w:numId="6">
-    <w:abstractNumId w:val="24"/>
+    <w:abstractNumId w:val="25"/>
   </w:num>
   <w:num w:numId="7">
-    <w:abstractNumId w:val="26"/>
+    <w:abstractNumId w:val="27"/>
   </w:num>
   <w:num w:numId="8">
-    <w:abstractNumId w:val="35"/>
+    <w:abstractNumId w:val="36"/>
   </w:num>
   <w:num w:numId="9">
     <w:abstractNumId w:val="10"/>
@@ -11346,10 +11374,10 @@
     <w:abstractNumId w:val="2"/>
   </w:num>
   <w:num w:numId="14">
-    <w:abstractNumId w:val="33"/>
+    <w:abstractNumId w:val="34"/>
   </w:num>
   <w:num w:numId="15">
-    <w:abstractNumId w:val="36"/>
+    <w:abstractNumId w:val="37"/>
   </w:num>
   <w:num w:numId="16">
     <w:abstractNumId w:val="9"/>
@@ -11361,10 +11389,10 @@
     <w:abstractNumId w:val="5"/>
   </w:num>
   <w:num w:numId="19">
-    <w:abstractNumId w:val="28"/>
+    <w:abstractNumId w:val="29"/>
   </w:num>
   <w:num w:numId="20">
-    <w:abstractNumId w:val="22"/>
+    <w:abstractNumId w:val="23"/>
   </w:num>
   <w:num w:numId="21">
     <w:abstractNumId w:val="11"/>
@@ -11376,10 +11404,10 @@
     <w:abstractNumId w:val="16"/>
   </w:num>
   <w:num w:numId="24">
-    <w:abstractNumId w:val="34"/>
+    <w:abstractNumId w:val="35"/>
   </w:num>
   <w:num w:numId="25">
-    <w:abstractNumId w:val="37"/>
+    <w:abstractNumId w:val="38"/>
   </w:num>
   <w:num w:numId="26">
     <w:abstractNumId w:val="18"/>
@@ -11388,10 +11416,10 @@
     <w:abstractNumId w:val="20"/>
   </w:num>
   <w:num w:numId="28">
-    <w:abstractNumId w:val="39"/>
+    <w:abstractNumId w:val="40"/>
   </w:num>
   <w:num w:numId="29">
-    <w:abstractNumId w:val="31"/>
+    <w:abstractNumId w:val="32"/>
   </w:num>
   <w:num w:numId="30">
     <w:abstractNumId w:val="4"/>
@@ -11403,22 +11431,22 @@
     <w:abstractNumId w:val="13"/>
   </w:num>
   <w:num w:numId="33">
-    <w:abstractNumId w:val="32"/>
+    <w:abstractNumId w:val="33"/>
   </w:num>
   <w:num w:numId="34">
-    <w:abstractNumId w:val="29"/>
+    <w:abstractNumId w:val="30"/>
   </w:num>
   <w:num w:numId="35">
-    <w:abstractNumId w:val="40"/>
+    <w:abstractNumId w:val="41"/>
   </w:num>
   <w:num w:numId="36">
     <w:abstractNumId w:val="21"/>
   </w:num>
   <w:num w:numId="37">
-    <w:abstractNumId w:val="38"/>
+    <w:abstractNumId w:val="39"/>
   </w:num>
   <w:num w:numId="38">
-    <w:abstractNumId w:val="41"/>
+    <w:abstractNumId w:val="42"/>
   </w:num>
   <w:num w:numId="39">
     <w:abstractNumId w:val="15"/>
@@ -11427,10 +11455,13 @@
     <w:abstractNumId w:val="1"/>
   </w:num>
   <w:num w:numId="41">
-    <w:abstractNumId w:val="27"/>
+    <w:abstractNumId w:val="28"/>
   </w:num>
   <w:num w:numId="42">
     <w:abstractNumId w:val="17"/>
+  </w:num>
+  <w:num w:numId="43">
+    <w:abstractNumId w:val="22"/>
   </w:num>
   <w:numIdMacAtCleanup w:val="42"/>
 </w:numbering>

</xml_diff>

<commit_message>
- Exo resources no longer updates both locale
</commit_message>
<xml_diff>
--- a/BluePrints/Views/ChangeLog.docx
+++ b/BluePrints/Views/ChangeLog.docx
@@ -12,6 +12,96 @@
         <w:rPr>
           <w:lang w:val="en-US"/>
         </w:rPr>
+        <w:t>Change Log 18</w:t>
+      </w:r>
+      <w:r>
+        <w:rPr>
+          <w:vertAlign w:val="superscript"/>
+          <w:lang w:val="en-US"/>
+        </w:rPr>
+        <w:t>th</w:t>
+      </w:r>
+      <w:r>
+        <w:rPr>
+          <w:lang w:val="en-US"/>
+        </w:rPr>
+        <w:t xml:space="preserve"> Oct 201</w:t>
+      </w:r>
+    </w:p>
+    <w:p>
+      <w:pPr>
+        <w:pStyle w:val="ListParagraph"/>
+        <w:numPr>
+          <w:ilvl w:val="0"/>
+          <w:numId w:val="44"/>
+        </w:numPr>
+        <w:rPr>
+          <w:lang w:val="en-US"/>
+        </w:rPr>
+      </w:pPr>
+      <w:r>
+        <w:rPr>
+          <w:lang w:val="en-US"/>
+        </w:rPr>
+        <w:t xml:space="preserve"> Exo Resources</w:t>
+      </w:r>
+    </w:p>
+    <w:p>
+      <w:pPr>
+        <w:pStyle w:val="ListParagraph"/>
+        <w:numPr>
+          <w:ilvl w:val="1"/>
+          <w:numId w:val="44"/>
+        </w:numPr>
+        <w:rPr>
+          <w:lang w:val="en-US"/>
+        </w:rPr>
+      </w:pPr>
+      <w:r>
+        <w:rPr>
+          <w:lang w:val="en-US"/>
+        </w:rPr>
+        <w:t xml:space="preserve">Add/Edit no longer affect both locale (Perth/Montreal) and only updates depending on which version of </w:t>
+      </w:r>
+      <w:proofErr w:type="spellStart"/>
+      <w:r>
+        <w:rPr>
+          <w:lang w:val="en-US"/>
+        </w:rPr>
+        <w:t>BluePrints</w:t>
+      </w:r>
+      <w:proofErr w:type="spellEnd"/>
+      <w:r>
+        <w:rPr>
+          <w:lang w:val="en-US"/>
+        </w:rPr>
+        <w:t xml:space="preserve"> is installed (Perth/Montreal)</w:t>
+      </w:r>
+    </w:p>
+    <w:p>
+      <w:pPr>
+        <w:rPr>
+          <w:lang w:val="en-US"/>
+        </w:rPr>
+      </w:pPr>
+      <w:r>
+        <w:rPr>
+          <w:lang w:val="en-US"/>
+        </w:rPr>
+        <w:br w:type="page"/>
+      </w:r>
+    </w:p>
+    <w:p>
+      <w:pPr>
+        <w:rPr>
+          <w:lang w:val="en-US"/>
+        </w:rPr>
+      </w:pPr>
+      <w:r>
+        <w:rPr>
+          <w:lang w:val="en-US"/>
+        </w:rPr>
+        <w:lastRenderedPageBreak/>
         <w:t>Change Log 29</w:t>
       </w:r>
       <w:r>
@@ -3281,8 +3371,30 @@
         <w:rPr>
           <w:lang w:val="en-US"/>
         </w:rPr>
-        <w:t>For instance, a variation that was previously approved with 100 hours is now in the process of unapproval. Since 50 hours has already been earned, 2 options are available during unapproval</w:t>
-      </w:r>
+        <w:t xml:space="preserve">For instance, a variation that was previously approved with 100 hours is now in the process of </w:t>
+      </w:r>
+      <w:proofErr w:type="spellStart"/>
+      <w:r>
+        <w:rPr>
+          <w:lang w:val="en-US"/>
+        </w:rPr>
+        <w:t>unapproval</w:t>
+      </w:r>
+      <w:proofErr w:type="spellEnd"/>
+      <w:r>
+        <w:rPr>
+          <w:lang w:val="en-US"/>
+        </w:rPr>
+        <w:t xml:space="preserve">. Since 50 hours has already been earned, 2 options are available during </w:t>
+      </w:r>
+      <w:proofErr w:type="spellStart"/>
+      <w:r>
+        <w:rPr>
+          <w:lang w:val="en-US"/>
+        </w:rPr>
+        <w:t>unapproval</w:t>
+      </w:r>
+      <w:proofErr w:type="spellEnd"/>
     </w:p>
     <w:p>
       <w:pPr>
@@ -3299,7 +3411,21 @@
         <w:rPr>
           <w:lang w:val="en-US"/>
         </w:rPr>
-        <w:t>Reduce earned hours ticked – Earned units will be reduced to 0 so that unapproval with 100 hours taken away from the deliverable can take place</w:t>
+        <w:t xml:space="preserve">Reduce earned hours ticked – Earned units will be reduced to 0 so that </w:t>
+      </w:r>
+      <w:proofErr w:type="spellStart"/>
+      <w:r>
+        <w:rPr>
+          <w:lang w:val="en-US"/>
+        </w:rPr>
+        <w:t>unapproval</w:t>
+      </w:r>
+      <w:proofErr w:type="spellEnd"/>
+      <w:r>
+        <w:rPr>
+          <w:lang w:val="en-US"/>
+        </w:rPr>
+        <w:t xml:space="preserve"> with 100 hours taken away from the deliverable can take place</w:t>
       </w:r>
     </w:p>
     <w:p>
@@ -4810,7 +4936,21 @@
         <w:rPr>
           <w:lang w:val="en-US"/>
         </w:rPr>
-        <w:t>how empty cost group and cost type in forecast to accomodate variations without cost group and cost type coming from construction variation module</w:t>
+        <w:t xml:space="preserve">how empty cost group and cost type in forecast to </w:t>
+      </w:r>
+      <w:proofErr w:type="spellStart"/>
+      <w:r>
+        <w:rPr>
+          <w:lang w:val="en-US"/>
+        </w:rPr>
+        <w:t>accomodate</w:t>
+      </w:r>
+      <w:proofErr w:type="spellEnd"/>
+      <w:r>
+        <w:rPr>
+          <w:lang w:val="en-US"/>
+        </w:rPr>
+        <w:t xml:space="preserve"> variations without cost group and cost type coming from construction variation module</w:t>
       </w:r>
     </w:p>
     <w:p>
@@ -5500,7 +5640,21 @@
           <w:lang w:val="en-US"/>
         </w:rPr>
         <w:lastRenderedPageBreak/>
-        <w:t>Added column to show actual labour units post data date</w:t>
+        <w:t xml:space="preserve">Added column to show actual </w:t>
+      </w:r>
+      <w:proofErr w:type="spellStart"/>
+      <w:r>
+        <w:rPr>
+          <w:lang w:val="en-US"/>
+        </w:rPr>
+        <w:t>labour</w:t>
+      </w:r>
+      <w:proofErr w:type="spellEnd"/>
+      <w:r>
+        <w:rPr>
+          <w:lang w:val="en-US"/>
+        </w:rPr>
+        <w:t xml:space="preserve"> units post data date</w:t>
       </w:r>
     </w:p>
     <w:p>
@@ -6020,7 +6174,21 @@
         <w:rPr>
           <w:lang w:val="en-US"/>
         </w:rPr>
-        <w:t>ixed an issue where subjob variation code doesn't show up in book time</w:t>
+        <w:t xml:space="preserve">ixed an issue where </w:t>
+      </w:r>
+      <w:proofErr w:type="spellStart"/>
+      <w:r>
+        <w:rPr>
+          <w:lang w:val="en-US"/>
+        </w:rPr>
+        <w:t>subjob</w:t>
+      </w:r>
+      <w:proofErr w:type="spellEnd"/>
+      <w:r>
+        <w:rPr>
+          <w:lang w:val="en-US"/>
+        </w:rPr>
+        <w:t xml:space="preserve"> variation code doesn't show up in book time</w:t>
       </w:r>
     </w:p>
     <w:p>
@@ -6283,7 +6451,35 @@
         <w:rPr>
           <w:rFonts w:cs="Calibri"/>
         </w:rPr>
-        <w:t>Editing Exo -&gt; Transaction quantity will adjust line cost, line charge, line total, line total tax, line tax and linetotal incl tax in EXO</w:t>
+        <w:t xml:space="preserve">Editing Exo -&gt; Transaction quantity will adjust line cost, line charge, line total, line total tax, line tax and </w:t>
+      </w:r>
+      <w:proofErr w:type="spellStart"/>
+      <w:r>
+        <w:rPr>
+          <w:rFonts w:cs="Calibri"/>
+        </w:rPr>
+        <w:t>linetotal</w:t>
+      </w:r>
+      <w:proofErr w:type="spellEnd"/>
+      <w:r>
+        <w:rPr>
+          <w:rFonts w:cs="Calibri"/>
+        </w:rPr>
+        <w:t xml:space="preserve"> </w:t>
+      </w:r>
+      <w:proofErr w:type="spellStart"/>
+      <w:r>
+        <w:rPr>
+          <w:rFonts w:cs="Calibri"/>
+        </w:rPr>
+        <w:t>incl</w:t>
+      </w:r>
+      <w:proofErr w:type="spellEnd"/>
+      <w:r>
+        <w:rPr>
+          <w:rFonts w:cs="Calibri"/>
+        </w:rPr>
+        <w:t xml:space="preserve"> tax in EXO</w:t>
       </w:r>
     </w:p>
     <w:p>
@@ -7301,6 +7497,118 @@
     </w:lvl>
   </w:abstractNum>
   <w:abstractNum w:abstractNumId="7" w15:restartNumberingAfterBreak="0">
+    <w:nsid w:val="0E144E47"/>
+    <w:multiLevelType w:val="hybridMultilevel"/>
+    <w:tmpl w:val="F25EBB5C"/>
+    <w:lvl w:ilvl="0" w:tplc="0B3C399E">
+      <w:numFmt w:val="bullet"/>
+      <w:lvlText w:val="-"/>
+      <w:lvlJc w:val="left"/>
+      <w:pPr>
+        <w:ind w:left="720" w:hanging="360"/>
+      </w:pPr>
+      <w:rPr>
+        <w:rFonts w:ascii="Calibri" w:eastAsiaTheme="minorEastAsia" w:hAnsi="Calibri" w:cs="Calibri" w:hint="default"/>
+      </w:rPr>
+    </w:lvl>
+    <w:lvl w:ilvl="1" w:tplc="44090003">
+      <w:start w:val="1"/>
+      <w:numFmt w:val="bullet"/>
+      <w:lvlText w:val="o"/>
+      <w:lvlJc w:val="left"/>
+      <w:pPr>
+        <w:ind w:left="1440" w:hanging="360"/>
+      </w:pPr>
+      <w:rPr>
+        <w:rFonts w:ascii="Courier New" w:hAnsi="Courier New" w:cs="Courier New" w:hint="default"/>
+      </w:rPr>
+    </w:lvl>
+    <w:lvl w:ilvl="2" w:tplc="44090005" w:tentative="1">
+      <w:start w:val="1"/>
+      <w:numFmt w:val="bullet"/>
+      <w:lvlText w:val=""/>
+      <w:lvlJc w:val="left"/>
+      <w:pPr>
+        <w:ind w:left="2160" w:hanging="360"/>
+      </w:pPr>
+      <w:rPr>
+        <w:rFonts w:ascii="Wingdings" w:hAnsi="Wingdings" w:hint="default"/>
+      </w:rPr>
+    </w:lvl>
+    <w:lvl w:ilvl="3" w:tplc="44090001" w:tentative="1">
+      <w:start w:val="1"/>
+      <w:numFmt w:val="bullet"/>
+      <w:lvlText w:val=""/>
+      <w:lvlJc w:val="left"/>
+      <w:pPr>
+        <w:ind w:left="2880" w:hanging="360"/>
+      </w:pPr>
+      <w:rPr>
+        <w:rFonts w:ascii="Symbol" w:hAnsi="Symbol" w:hint="default"/>
+      </w:rPr>
+    </w:lvl>
+    <w:lvl w:ilvl="4" w:tplc="44090003" w:tentative="1">
+      <w:start w:val="1"/>
+      <w:numFmt w:val="bullet"/>
+      <w:lvlText w:val="o"/>
+      <w:lvlJc w:val="left"/>
+      <w:pPr>
+        <w:ind w:left="3600" w:hanging="360"/>
+      </w:pPr>
+      <w:rPr>
+        <w:rFonts w:ascii="Courier New" w:hAnsi="Courier New" w:cs="Courier New" w:hint="default"/>
+      </w:rPr>
+    </w:lvl>
+    <w:lvl w:ilvl="5" w:tplc="44090005" w:tentative="1">
+      <w:start w:val="1"/>
+      <w:numFmt w:val="bullet"/>
+      <w:lvlText w:val=""/>
+      <w:lvlJc w:val="left"/>
+      <w:pPr>
+        <w:ind w:left="4320" w:hanging="360"/>
+      </w:pPr>
+      <w:rPr>
+        <w:rFonts w:ascii="Wingdings" w:hAnsi="Wingdings" w:hint="default"/>
+      </w:rPr>
+    </w:lvl>
+    <w:lvl w:ilvl="6" w:tplc="44090001" w:tentative="1">
+      <w:start w:val="1"/>
+      <w:numFmt w:val="bullet"/>
+      <w:lvlText w:val=""/>
+      <w:lvlJc w:val="left"/>
+      <w:pPr>
+        <w:ind w:left="5040" w:hanging="360"/>
+      </w:pPr>
+      <w:rPr>
+        <w:rFonts w:ascii="Symbol" w:hAnsi="Symbol" w:hint="default"/>
+      </w:rPr>
+    </w:lvl>
+    <w:lvl w:ilvl="7" w:tplc="44090003" w:tentative="1">
+      <w:start w:val="1"/>
+      <w:numFmt w:val="bullet"/>
+      <w:lvlText w:val="o"/>
+      <w:lvlJc w:val="left"/>
+      <w:pPr>
+        <w:ind w:left="5760" w:hanging="360"/>
+      </w:pPr>
+      <w:rPr>
+        <w:rFonts w:ascii="Courier New" w:hAnsi="Courier New" w:cs="Courier New" w:hint="default"/>
+      </w:rPr>
+    </w:lvl>
+    <w:lvl w:ilvl="8" w:tplc="44090005" w:tentative="1">
+      <w:start w:val="1"/>
+      <w:numFmt w:val="bullet"/>
+      <w:lvlText w:val=""/>
+      <w:lvlJc w:val="left"/>
+      <w:pPr>
+        <w:ind w:left="6480" w:hanging="360"/>
+      </w:pPr>
+      <w:rPr>
+        <w:rFonts w:ascii="Wingdings" w:hAnsi="Wingdings" w:hint="default"/>
+      </w:rPr>
+    </w:lvl>
+  </w:abstractNum>
+  <w:abstractNum w:abstractNumId="8" w15:restartNumberingAfterBreak="0">
     <w:nsid w:val="0FC80B97"/>
     <w:multiLevelType w:val="hybridMultilevel"/>
     <w:tmpl w:val="DFECF1EE"/>
@@ -7412,7 +7720,7 @@
       </w:rPr>
     </w:lvl>
   </w:abstractNum>
-  <w:abstractNum w:abstractNumId="8" w15:restartNumberingAfterBreak="0">
+  <w:abstractNum w:abstractNumId="9" w15:restartNumberingAfterBreak="0">
     <w:nsid w:val="141357FF"/>
     <w:multiLevelType w:val="hybridMultilevel"/>
     <w:tmpl w:val="9E6653E4"/>
@@ -7524,7 +7832,7 @@
       </w:rPr>
     </w:lvl>
   </w:abstractNum>
-  <w:abstractNum w:abstractNumId="9" w15:restartNumberingAfterBreak="0">
+  <w:abstractNum w:abstractNumId="10" w15:restartNumberingAfterBreak="0">
     <w:nsid w:val="178E49A5"/>
     <w:multiLevelType w:val="hybridMultilevel"/>
     <w:tmpl w:val="40880C56"/>
@@ -7636,7 +7944,7 @@
       </w:rPr>
     </w:lvl>
   </w:abstractNum>
-  <w:abstractNum w:abstractNumId="10" w15:restartNumberingAfterBreak="0">
+  <w:abstractNum w:abstractNumId="11" w15:restartNumberingAfterBreak="0">
     <w:nsid w:val="1DCB2786"/>
     <w:multiLevelType w:val="hybridMultilevel"/>
     <w:tmpl w:val="DA046A8A"/>
@@ -7748,7 +8056,7 @@
       </w:rPr>
     </w:lvl>
   </w:abstractNum>
-  <w:abstractNum w:abstractNumId="11" w15:restartNumberingAfterBreak="0">
+  <w:abstractNum w:abstractNumId="12" w15:restartNumberingAfterBreak="0">
     <w:nsid w:val="1E2528E1"/>
     <w:multiLevelType w:val="hybridMultilevel"/>
     <w:tmpl w:val="04B6187A"/>
@@ -7860,7 +8168,7 @@
       </w:rPr>
     </w:lvl>
   </w:abstractNum>
-  <w:abstractNum w:abstractNumId="12" w15:restartNumberingAfterBreak="0">
+  <w:abstractNum w:abstractNumId="13" w15:restartNumberingAfterBreak="0">
     <w:nsid w:val="1F4D0C5A"/>
     <w:multiLevelType w:val="hybridMultilevel"/>
     <w:tmpl w:val="58644CA6"/>
@@ -7972,7 +8280,7 @@
       </w:rPr>
     </w:lvl>
   </w:abstractNum>
-  <w:abstractNum w:abstractNumId="13" w15:restartNumberingAfterBreak="0">
+  <w:abstractNum w:abstractNumId="14" w15:restartNumberingAfterBreak="0">
     <w:nsid w:val="1FCD45E8"/>
     <w:multiLevelType w:val="hybridMultilevel"/>
     <w:tmpl w:val="F280A010"/>
@@ -8084,7 +8392,7 @@
       </w:rPr>
     </w:lvl>
   </w:abstractNum>
-  <w:abstractNum w:abstractNumId="14" w15:restartNumberingAfterBreak="0">
+  <w:abstractNum w:abstractNumId="15" w15:restartNumberingAfterBreak="0">
     <w:nsid w:val="21223E97"/>
     <w:multiLevelType w:val="hybridMultilevel"/>
     <w:tmpl w:val="68E6E128"/>
@@ -8196,7 +8504,7 @@
       </w:rPr>
     </w:lvl>
   </w:abstractNum>
-  <w:abstractNum w:abstractNumId="15" w15:restartNumberingAfterBreak="0">
+  <w:abstractNum w:abstractNumId="16" w15:restartNumberingAfterBreak="0">
     <w:nsid w:val="22E26764"/>
     <w:multiLevelType w:val="hybridMultilevel"/>
     <w:tmpl w:val="C518B74A"/>
@@ -8308,7 +8616,7 @@
       </w:rPr>
     </w:lvl>
   </w:abstractNum>
-  <w:abstractNum w:abstractNumId="16" w15:restartNumberingAfterBreak="0">
+  <w:abstractNum w:abstractNumId="17" w15:restartNumberingAfterBreak="0">
     <w:nsid w:val="24E10BB5"/>
     <w:multiLevelType w:val="hybridMultilevel"/>
     <w:tmpl w:val="F8FEBADA"/>
@@ -8420,7 +8728,7 @@
       </w:rPr>
     </w:lvl>
   </w:abstractNum>
-  <w:abstractNum w:abstractNumId="17" w15:restartNumberingAfterBreak="0">
+  <w:abstractNum w:abstractNumId="18" w15:restartNumberingAfterBreak="0">
     <w:nsid w:val="3A4E02DC"/>
     <w:multiLevelType w:val="hybridMultilevel"/>
     <w:tmpl w:val="410CCFF6"/>
@@ -8532,7 +8840,7 @@
       </w:rPr>
     </w:lvl>
   </w:abstractNum>
-  <w:abstractNum w:abstractNumId="18" w15:restartNumberingAfterBreak="0">
+  <w:abstractNum w:abstractNumId="19" w15:restartNumberingAfterBreak="0">
     <w:nsid w:val="3C704EE1"/>
     <w:multiLevelType w:val="hybridMultilevel"/>
     <w:tmpl w:val="41A6D382"/>
@@ -8644,7 +8952,7 @@
       </w:rPr>
     </w:lvl>
   </w:abstractNum>
-  <w:abstractNum w:abstractNumId="19" w15:restartNumberingAfterBreak="0">
+  <w:abstractNum w:abstractNumId="20" w15:restartNumberingAfterBreak="0">
     <w:nsid w:val="3E6B597B"/>
     <w:multiLevelType w:val="hybridMultilevel"/>
     <w:tmpl w:val="C0DAF682"/>
@@ -8756,7 +9064,7 @@
       </w:rPr>
     </w:lvl>
   </w:abstractNum>
-  <w:abstractNum w:abstractNumId="20" w15:restartNumberingAfterBreak="0">
+  <w:abstractNum w:abstractNumId="21" w15:restartNumberingAfterBreak="0">
     <w:nsid w:val="3F573A8E"/>
     <w:multiLevelType w:val="hybridMultilevel"/>
     <w:tmpl w:val="6C6CD2D4"/>
@@ -8868,7 +9176,7 @@
       </w:rPr>
     </w:lvl>
   </w:abstractNum>
-  <w:abstractNum w:abstractNumId="21" w15:restartNumberingAfterBreak="0">
+  <w:abstractNum w:abstractNumId="22" w15:restartNumberingAfterBreak="0">
     <w:nsid w:val="40720D0C"/>
     <w:multiLevelType w:val="hybridMultilevel"/>
     <w:tmpl w:val="A370A62A"/>
@@ -8980,7 +9288,7 @@
       </w:rPr>
     </w:lvl>
   </w:abstractNum>
-  <w:abstractNum w:abstractNumId="22" w15:restartNumberingAfterBreak="0">
+  <w:abstractNum w:abstractNumId="23" w15:restartNumberingAfterBreak="0">
     <w:nsid w:val="48B91C47"/>
     <w:multiLevelType w:val="hybridMultilevel"/>
     <w:tmpl w:val="56F693FA"/>
@@ -9092,7 +9400,7 @@
       </w:rPr>
     </w:lvl>
   </w:abstractNum>
-  <w:abstractNum w:abstractNumId="23" w15:restartNumberingAfterBreak="0">
+  <w:abstractNum w:abstractNumId="24" w15:restartNumberingAfterBreak="0">
     <w:nsid w:val="4A9D1EBF"/>
     <w:multiLevelType w:val="hybridMultilevel"/>
     <w:tmpl w:val="3DEACDCC"/>
@@ -9204,7 +9512,7 @@
       </w:rPr>
     </w:lvl>
   </w:abstractNum>
-  <w:abstractNum w:abstractNumId="24" w15:restartNumberingAfterBreak="0">
+  <w:abstractNum w:abstractNumId="25" w15:restartNumberingAfterBreak="0">
     <w:nsid w:val="52606647"/>
     <w:multiLevelType w:val="hybridMultilevel"/>
     <w:tmpl w:val="34FAD1A0"/>
@@ -9316,7 +9624,7 @@
       </w:rPr>
     </w:lvl>
   </w:abstractNum>
-  <w:abstractNum w:abstractNumId="25" w15:restartNumberingAfterBreak="0">
+  <w:abstractNum w:abstractNumId="26" w15:restartNumberingAfterBreak="0">
     <w:nsid w:val="557D5C95"/>
     <w:multiLevelType w:val="hybridMultilevel"/>
     <w:tmpl w:val="DC122E1C"/>
@@ -9428,7 +9736,7 @@
       </w:rPr>
     </w:lvl>
   </w:abstractNum>
-  <w:abstractNum w:abstractNumId="26" w15:restartNumberingAfterBreak="0">
+  <w:abstractNum w:abstractNumId="27" w15:restartNumberingAfterBreak="0">
     <w:nsid w:val="589D37B7"/>
     <w:multiLevelType w:val="hybridMultilevel"/>
     <w:tmpl w:val="9262429A"/>
@@ -9540,7 +9848,7 @@
       </w:rPr>
     </w:lvl>
   </w:abstractNum>
-  <w:abstractNum w:abstractNumId="27" w15:restartNumberingAfterBreak="0">
+  <w:abstractNum w:abstractNumId="28" w15:restartNumberingAfterBreak="0">
     <w:nsid w:val="58AA443D"/>
     <w:multiLevelType w:val="hybridMultilevel"/>
     <w:tmpl w:val="56F0D18E"/>
@@ -9653,7 +9961,7 @@
       </w:rPr>
     </w:lvl>
   </w:abstractNum>
-  <w:abstractNum w:abstractNumId="28" w15:restartNumberingAfterBreak="0">
+  <w:abstractNum w:abstractNumId="29" w15:restartNumberingAfterBreak="0">
     <w:nsid w:val="59EE4063"/>
     <w:multiLevelType w:val="hybridMultilevel"/>
     <w:tmpl w:val="0482313C"/>
@@ -9765,7 +10073,7 @@
       </w:rPr>
     </w:lvl>
   </w:abstractNum>
-  <w:abstractNum w:abstractNumId="29" w15:restartNumberingAfterBreak="0">
+  <w:abstractNum w:abstractNumId="30" w15:restartNumberingAfterBreak="0">
     <w:nsid w:val="5B4B0EE2"/>
     <w:multiLevelType w:val="hybridMultilevel"/>
     <w:tmpl w:val="E8129FD8"/>
@@ -9877,7 +10185,7 @@
       </w:rPr>
     </w:lvl>
   </w:abstractNum>
-  <w:abstractNum w:abstractNumId="30" w15:restartNumberingAfterBreak="0">
+  <w:abstractNum w:abstractNumId="31" w15:restartNumberingAfterBreak="0">
     <w:nsid w:val="5BF34BEE"/>
     <w:multiLevelType w:val="hybridMultilevel"/>
     <w:tmpl w:val="1D48A376"/>
@@ -9989,7 +10297,7 @@
       </w:rPr>
     </w:lvl>
   </w:abstractNum>
-  <w:abstractNum w:abstractNumId="31" w15:restartNumberingAfterBreak="0">
+  <w:abstractNum w:abstractNumId="32" w15:restartNumberingAfterBreak="0">
     <w:nsid w:val="5C8347BF"/>
     <w:multiLevelType w:val="hybridMultilevel"/>
     <w:tmpl w:val="D2F46B88"/>
@@ -10101,7 +10409,7 @@
       </w:rPr>
     </w:lvl>
   </w:abstractNum>
-  <w:abstractNum w:abstractNumId="32" w15:restartNumberingAfterBreak="0">
+  <w:abstractNum w:abstractNumId="33" w15:restartNumberingAfterBreak="0">
     <w:nsid w:val="61693A7A"/>
     <w:multiLevelType w:val="hybridMultilevel"/>
     <w:tmpl w:val="580AF2C6"/>
@@ -10214,7 +10522,7 @@
       </w:rPr>
     </w:lvl>
   </w:abstractNum>
-  <w:abstractNum w:abstractNumId="33" w15:restartNumberingAfterBreak="0">
+  <w:abstractNum w:abstractNumId="34" w15:restartNumberingAfterBreak="0">
     <w:nsid w:val="63C54BFA"/>
     <w:multiLevelType w:val="hybridMultilevel"/>
     <w:tmpl w:val="8122740C"/>
@@ -10326,7 +10634,7 @@
       </w:rPr>
     </w:lvl>
   </w:abstractNum>
-  <w:abstractNum w:abstractNumId="34" w15:restartNumberingAfterBreak="0">
+  <w:abstractNum w:abstractNumId="35" w15:restartNumberingAfterBreak="0">
     <w:nsid w:val="6A047A76"/>
     <w:multiLevelType w:val="hybridMultilevel"/>
     <w:tmpl w:val="50CADEB2"/>
@@ -10438,7 +10746,7 @@
       </w:rPr>
     </w:lvl>
   </w:abstractNum>
-  <w:abstractNum w:abstractNumId="35" w15:restartNumberingAfterBreak="0">
+  <w:abstractNum w:abstractNumId="36" w15:restartNumberingAfterBreak="0">
     <w:nsid w:val="6A3A0B6E"/>
     <w:multiLevelType w:val="hybridMultilevel"/>
     <w:tmpl w:val="759C482E"/>
@@ -10550,7 +10858,7 @@
       </w:rPr>
     </w:lvl>
   </w:abstractNum>
-  <w:abstractNum w:abstractNumId="36" w15:restartNumberingAfterBreak="0">
+  <w:abstractNum w:abstractNumId="37" w15:restartNumberingAfterBreak="0">
     <w:nsid w:val="6AC268F7"/>
     <w:multiLevelType w:val="hybridMultilevel"/>
     <w:tmpl w:val="12F21194"/>
@@ -10662,7 +10970,7 @@
       </w:rPr>
     </w:lvl>
   </w:abstractNum>
-  <w:abstractNum w:abstractNumId="37" w15:restartNumberingAfterBreak="0">
+  <w:abstractNum w:abstractNumId="38" w15:restartNumberingAfterBreak="0">
     <w:nsid w:val="6CE7392E"/>
     <w:multiLevelType w:val="hybridMultilevel"/>
     <w:tmpl w:val="2E2C9BDE"/>
@@ -10774,7 +11082,7 @@
       </w:rPr>
     </w:lvl>
   </w:abstractNum>
-  <w:abstractNum w:abstractNumId="38" w15:restartNumberingAfterBreak="0">
+  <w:abstractNum w:abstractNumId="39" w15:restartNumberingAfterBreak="0">
     <w:nsid w:val="6E3F3F9F"/>
     <w:multiLevelType w:val="hybridMultilevel"/>
     <w:tmpl w:val="A13CFC48"/>
@@ -10886,7 +11194,7 @@
       </w:rPr>
     </w:lvl>
   </w:abstractNum>
-  <w:abstractNum w:abstractNumId="39" w15:restartNumberingAfterBreak="0">
+  <w:abstractNum w:abstractNumId="40" w15:restartNumberingAfterBreak="0">
     <w:nsid w:val="74A1190D"/>
     <w:multiLevelType w:val="hybridMultilevel"/>
     <w:tmpl w:val="D5387ACA"/>
@@ -10998,7 +11306,7 @@
       </w:rPr>
     </w:lvl>
   </w:abstractNum>
-  <w:abstractNum w:abstractNumId="40" w15:restartNumberingAfterBreak="0">
+  <w:abstractNum w:abstractNumId="41" w15:restartNumberingAfterBreak="0">
     <w:nsid w:val="7E7D5380"/>
     <w:multiLevelType w:val="hybridMultilevel"/>
     <w:tmpl w:val="7668ED14"/>
@@ -11110,7 +11418,7 @@
       </w:rPr>
     </w:lvl>
   </w:abstractNum>
-  <w:abstractNum w:abstractNumId="41" w15:restartNumberingAfterBreak="0">
+  <w:abstractNum w:abstractNumId="42" w15:restartNumberingAfterBreak="0">
     <w:nsid w:val="7EAA14ED"/>
     <w:multiLevelType w:val="hybridMultilevel"/>
     <w:tmpl w:val="AF783BA4"/>
@@ -11222,7 +11530,7 @@
       </w:rPr>
     </w:lvl>
   </w:abstractNum>
-  <w:abstractNum w:abstractNumId="42" w15:restartNumberingAfterBreak="0">
+  <w:abstractNum w:abstractNumId="43" w15:restartNumberingAfterBreak="0">
     <w:nsid w:val="7FD565FA"/>
     <w:multiLevelType w:val="hybridMultilevel"/>
     <w:tmpl w:val="E5906ACC"/>
@@ -11338,34 +11646,34 @@
     <w:abstractNumId w:val="3"/>
   </w:num>
   <w:num w:numId="2">
-    <w:abstractNumId w:val="31"/>
+    <w:abstractNumId w:val="32"/>
   </w:num>
   <w:num w:numId="3">
+    <w:abstractNumId w:val="27"/>
+  </w:num>
+  <w:num w:numId="4">
+    <w:abstractNumId w:val="25"/>
+  </w:num>
+  <w:num w:numId="5">
+    <w:abstractNumId w:val="13"/>
+  </w:num>
+  <w:num w:numId="6">
     <w:abstractNumId w:val="26"/>
   </w:num>
-  <w:num w:numId="4">
-    <w:abstractNumId w:val="24"/>
-  </w:num>
-  <w:num w:numId="5">
-    <w:abstractNumId w:val="12"/>
-  </w:num>
-  <w:num w:numId="6">
-    <w:abstractNumId w:val="25"/>
-  </w:num>
   <w:num w:numId="7">
-    <w:abstractNumId w:val="27"/>
+    <w:abstractNumId w:val="28"/>
   </w:num>
   <w:num w:numId="8">
-    <w:abstractNumId w:val="36"/>
+    <w:abstractNumId w:val="37"/>
   </w:num>
   <w:num w:numId="9">
-    <w:abstractNumId w:val="10"/>
+    <w:abstractNumId w:val="11"/>
   </w:num>
   <w:num w:numId="10">
-    <w:abstractNumId w:val="14"/>
+    <w:abstractNumId w:val="15"/>
   </w:num>
   <w:num w:numId="11">
-    <w:abstractNumId w:val="7"/>
+    <w:abstractNumId w:val="8"/>
   </w:num>
   <w:num w:numId="12">
     <w:abstractNumId w:val="6"/>
@@ -11374,13 +11682,13 @@
     <w:abstractNumId w:val="2"/>
   </w:num>
   <w:num w:numId="14">
-    <w:abstractNumId w:val="34"/>
+    <w:abstractNumId w:val="35"/>
   </w:num>
   <w:num w:numId="15">
-    <w:abstractNumId w:val="37"/>
+    <w:abstractNumId w:val="38"/>
   </w:num>
   <w:num w:numId="16">
-    <w:abstractNumId w:val="9"/>
+    <w:abstractNumId w:val="10"/>
   </w:num>
   <w:num w:numId="17">
     <w:abstractNumId w:val="0"/>
@@ -11389,79 +11697,82 @@
     <w:abstractNumId w:val="5"/>
   </w:num>
   <w:num w:numId="19">
-    <w:abstractNumId w:val="29"/>
+    <w:abstractNumId w:val="30"/>
   </w:num>
   <w:num w:numId="20">
-    <w:abstractNumId w:val="23"/>
+    <w:abstractNumId w:val="24"/>
   </w:num>
   <w:num w:numId="21">
-    <w:abstractNumId w:val="11"/>
+    <w:abstractNumId w:val="12"/>
   </w:num>
   <w:num w:numId="22">
-    <w:abstractNumId w:val="8"/>
+    <w:abstractNumId w:val="9"/>
   </w:num>
   <w:num w:numId="23">
-    <w:abstractNumId w:val="16"/>
+    <w:abstractNumId w:val="17"/>
   </w:num>
   <w:num w:numId="24">
-    <w:abstractNumId w:val="35"/>
+    <w:abstractNumId w:val="36"/>
   </w:num>
   <w:num w:numId="25">
-    <w:abstractNumId w:val="38"/>
+    <w:abstractNumId w:val="39"/>
   </w:num>
   <w:num w:numId="26">
-    <w:abstractNumId w:val="18"/>
+    <w:abstractNumId w:val="19"/>
   </w:num>
   <w:num w:numId="27">
-    <w:abstractNumId w:val="20"/>
+    <w:abstractNumId w:val="21"/>
   </w:num>
   <w:num w:numId="28">
-    <w:abstractNumId w:val="40"/>
+    <w:abstractNumId w:val="41"/>
   </w:num>
   <w:num w:numId="29">
-    <w:abstractNumId w:val="32"/>
+    <w:abstractNumId w:val="33"/>
   </w:num>
   <w:num w:numId="30">
     <w:abstractNumId w:val="4"/>
   </w:num>
   <w:num w:numId="31">
-    <w:abstractNumId w:val="19"/>
+    <w:abstractNumId w:val="20"/>
   </w:num>
   <w:num w:numId="32">
-    <w:abstractNumId w:val="13"/>
+    <w:abstractNumId w:val="14"/>
   </w:num>
   <w:num w:numId="33">
-    <w:abstractNumId w:val="33"/>
+    <w:abstractNumId w:val="34"/>
   </w:num>
   <w:num w:numId="34">
-    <w:abstractNumId w:val="30"/>
+    <w:abstractNumId w:val="31"/>
   </w:num>
   <w:num w:numId="35">
-    <w:abstractNumId w:val="41"/>
+    <w:abstractNumId w:val="42"/>
   </w:num>
   <w:num w:numId="36">
-    <w:abstractNumId w:val="21"/>
+    <w:abstractNumId w:val="22"/>
   </w:num>
   <w:num w:numId="37">
-    <w:abstractNumId w:val="39"/>
+    <w:abstractNumId w:val="40"/>
   </w:num>
   <w:num w:numId="38">
-    <w:abstractNumId w:val="42"/>
+    <w:abstractNumId w:val="43"/>
   </w:num>
   <w:num w:numId="39">
-    <w:abstractNumId w:val="15"/>
+    <w:abstractNumId w:val="16"/>
   </w:num>
   <w:num w:numId="40">
     <w:abstractNumId w:val="1"/>
   </w:num>
   <w:num w:numId="41">
-    <w:abstractNumId w:val="28"/>
+    <w:abstractNumId w:val="29"/>
   </w:num>
   <w:num w:numId="42">
-    <w:abstractNumId w:val="17"/>
+    <w:abstractNumId w:val="18"/>
   </w:num>
   <w:num w:numId="43">
-    <w:abstractNumId w:val="22"/>
+    <w:abstractNumId w:val="23"/>
+  </w:num>
+  <w:num w:numId="44">
+    <w:abstractNumId w:val="7"/>
   </w:num>
   <w:numIdMacAtCleanup w:val="42"/>
 </w:numbering>

</xml_diff>

<commit_message>
- added export/import contractor's progress
</commit_message>
<xml_diff>
--- a/BluePrints/Views/ChangeLog.docx
+++ b/BluePrints/Views/ChangeLog.docx
@@ -12,6 +12,100 @@
         <w:rPr>
           <w:lang w:val="en-US"/>
         </w:rPr>
+        <w:t>Change Log 12</w:t>
+      </w:r>
+      <w:r>
+        <w:rPr>
+          <w:vertAlign w:val="superscript"/>
+          <w:lang w:val="en-US"/>
+        </w:rPr>
+        <w:t>th</w:t>
+      </w:r>
+      <w:r>
+        <w:rPr>
+          <w:lang w:val="en-US"/>
+        </w:rPr>
+        <w:t xml:space="preserve"> Nov 2021</w:t>
+      </w:r>
+    </w:p>
+    <w:p>
+      <w:pPr>
+        <w:pStyle w:val="ListParagraph"/>
+        <w:numPr>
+          <w:ilvl w:val="0"/>
+          <w:numId w:val="45"/>
+        </w:numPr>
+        <w:rPr>
+          <w:lang w:val="en-US"/>
+        </w:rPr>
+      </w:pPr>
+      <w:r>
+        <w:rPr>
+          <w:lang w:val="en-US"/>
+        </w:rPr>
+        <w:t>Design -&gt; Progress</w:t>
+      </w:r>
+    </w:p>
+    <w:p>
+      <w:pPr>
+        <w:pStyle w:val="ListParagraph"/>
+        <w:numPr>
+          <w:ilvl w:val="1"/>
+          <w:numId w:val="45"/>
+        </w:numPr>
+        <w:rPr>
+          <w:lang w:val="en-US"/>
+        </w:rPr>
+      </w:pPr>
+      <w:r>
+        <w:rPr>
+          <w:lang w:val="en-US"/>
+        </w:rPr>
+        <w:t>Added contractor progress update export/import</w:t>
+      </w:r>
+    </w:p>
+    <w:p>
+      <w:pPr>
+        <w:pStyle w:val="ListParagraph"/>
+        <w:ind w:left="1440"/>
+        <w:rPr>
+          <w:lang w:val="en-US"/>
+        </w:rPr>
+      </w:pPr>
+      <w:hyperlink r:id="rId5" w:history="1">
+        <w:r>
+          <w:rPr>
+            <w:rStyle w:val="Hyperlink"/>
+            <w:lang w:val="en-US"/>
+          </w:rPr>
+          <w:t>Tutorial</w:t>
+        </w:r>
+      </w:hyperlink>
+    </w:p>
+    <w:p>
+      <w:pPr>
+        <w:rPr>
+          <w:lang w:val="en-US"/>
+        </w:rPr>
+      </w:pPr>
+      <w:r>
+        <w:rPr>
+          <w:lang w:val="en-US"/>
+        </w:rPr>
+        <w:br w:type="page"/>
+      </w:r>
+    </w:p>
+    <w:p>
+      <w:pPr>
+        <w:rPr>
+          <w:lang w:val="en-US"/>
+        </w:rPr>
+      </w:pPr>
+      <w:r>
+        <w:rPr>
+          <w:lang w:val="en-US"/>
+        </w:rPr>
+        <w:lastRenderedPageBreak/>
         <w:t>Change Log 18</w:t>
       </w:r>
       <w:r>
@@ -25,7 +119,13 @@
         <w:rPr>
           <w:lang w:val="en-US"/>
         </w:rPr>
-        <w:t xml:space="preserve"> Oct 201</w:t>
+        <w:t xml:space="preserve"> Oct 20</w:t>
+      </w:r>
+      <w:r>
+        <w:rPr>
+          <w:lang w:val="en-US"/>
+        </w:rPr>
+        <w:t>21</w:t>
       </w:r>
     </w:p>
     <w:p>
@@ -194,7 +294,7 @@
                     </pic:cNvPicPr>
                   </pic:nvPicPr>
                   <pic:blipFill>
-                    <a:blip r:embed="rId5">
+                    <a:blip r:embed="rId6">
                       <a:extLst>
                         <a:ext uri="{28A0092B-C50C-407E-A947-70E740481C1C}">
                           <a14:useLocalDpi xmlns:a14="http://schemas.microsoft.com/office/drawing/2010/main" val="0"/>
@@ -326,7 +426,7 @@
                     </pic:cNvPicPr>
                   </pic:nvPicPr>
                   <pic:blipFill>
-                    <a:blip r:embed="rId6" cstate="print">
+                    <a:blip r:embed="rId7" cstate="print">
                       <a:extLst>
                         <a:ext uri="{28A0092B-C50C-407E-A947-70E740481C1C}">
                           <a14:useLocalDpi xmlns:a14="http://schemas.microsoft.com/office/drawing/2010/main" val="0"/>
@@ -436,7 +536,7 @@
                     </pic:cNvPicPr>
                   </pic:nvPicPr>
                   <pic:blipFill>
-                    <a:blip r:embed="rId7">
+                    <a:blip r:embed="rId8">
                       <a:extLst>
                         <a:ext uri="{28A0092B-C50C-407E-A947-70E740481C1C}">
                           <a14:useLocalDpi xmlns:a14="http://schemas.microsoft.com/office/drawing/2010/main" val="0"/>
@@ -581,7 +681,7 @@
                     </pic:cNvPicPr>
                   </pic:nvPicPr>
                   <pic:blipFill>
-                    <a:blip r:embed="rId8" cstate="print">
+                    <a:blip r:embed="rId9" cstate="print">
                       <a:extLst>
                         <a:ext uri="{28A0092B-C50C-407E-A947-70E740481C1C}">
                           <a14:useLocalDpi xmlns:a14="http://schemas.microsoft.com/office/drawing/2010/main" val="0"/>
@@ -749,7 +849,7 @@
                     </pic:cNvPicPr>
                   </pic:nvPicPr>
                   <pic:blipFill>
-                    <a:blip r:embed="rId9">
+                    <a:blip r:embed="rId10">
                       <a:extLst>
                         <a:ext uri="{28A0092B-C50C-407E-A947-70E740481C1C}">
                           <a14:useLocalDpi xmlns:a14="http://schemas.microsoft.com/office/drawing/2010/main" val="0"/>
@@ -833,7 +933,7 @@
                     </pic:cNvPicPr>
                   </pic:nvPicPr>
                   <pic:blipFill>
-                    <a:blip r:embed="rId10">
+                    <a:blip r:embed="rId11">
                       <a:extLst>
                         <a:ext uri="{28A0092B-C50C-407E-A947-70E740481C1C}">
                           <a14:useLocalDpi xmlns:a14="http://schemas.microsoft.com/office/drawing/2010/main" val="0"/>
@@ -940,7 +1040,7 @@
                     </pic:cNvPicPr>
                   </pic:nvPicPr>
                   <pic:blipFill>
-                    <a:blip r:embed="rId11" cstate="print">
+                    <a:blip r:embed="rId12" cstate="print">
                       <a:extLst>
                         <a:ext uri="{28A0092B-C50C-407E-A947-70E740481C1C}">
                           <a14:useLocalDpi xmlns:a14="http://schemas.microsoft.com/office/drawing/2010/main" val="0"/>
@@ -1139,7 +1239,7 @@
                     </pic:cNvPicPr>
                   </pic:nvPicPr>
                   <pic:blipFill>
-                    <a:blip r:embed="rId12" cstate="print">
+                    <a:blip r:embed="rId13" cstate="print">
                       <a:extLst>
                         <a:ext uri="{28A0092B-C50C-407E-A947-70E740481C1C}">
                           <a14:useLocalDpi xmlns:a14="http://schemas.microsoft.com/office/drawing/2010/main" val="0"/>
@@ -1264,7 +1364,7 @@
                     </pic:cNvPicPr>
                   </pic:nvPicPr>
                   <pic:blipFill>
-                    <a:blip r:embed="rId13" cstate="print">
+                    <a:blip r:embed="rId14" cstate="print">
                       <a:extLst>
                         <a:ext uri="{28A0092B-C50C-407E-A947-70E740481C1C}">
                           <a14:useLocalDpi xmlns:a14="http://schemas.microsoft.com/office/drawing/2010/main" val="0"/>
@@ -1403,7 +1503,7 @@
                     </pic:cNvPicPr>
                   </pic:nvPicPr>
                   <pic:blipFill>
-                    <a:blip r:embed="rId14" cstate="print">
+                    <a:blip r:embed="rId15" cstate="print">
                       <a:extLst>
                         <a:ext uri="{28A0092B-C50C-407E-A947-70E740481C1C}">
                           <a14:useLocalDpi xmlns:a14="http://schemas.microsoft.com/office/drawing/2010/main" val="0"/>
@@ -1502,7 +1602,7 @@
                     </pic:cNvPicPr>
                   </pic:nvPicPr>
                   <pic:blipFill>
-                    <a:blip r:embed="rId15" cstate="print">
+                    <a:blip r:embed="rId16" cstate="print">
                       <a:extLst>
                         <a:ext uri="{28A0092B-C50C-407E-A947-70E740481C1C}">
                           <a14:useLocalDpi xmlns:a14="http://schemas.microsoft.com/office/drawing/2010/main" val="0"/>
@@ -1608,7 +1708,7 @@
                     </pic:cNvPicPr>
                   </pic:nvPicPr>
                   <pic:blipFill>
-                    <a:blip r:embed="rId16" cstate="print">
+                    <a:blip r:embed="rId17" cstate="print">
                       <a:extLst>
                         <a:ext uri="{28A0092B-C50C-407E-A947-70E740481C1C}">
                           <a14:useLocalDpi xmlns:a14="http://schemas.microsoft.com/office/drawing/2010/main" val="0"/>
@@ -1715,7 +1815,7 @@
                     </pic:cNvPicPr>
                   </pic:nvPicPr>
                   <pic:blipFill>
-                    <a:blip r:embed="rId17">
+                    <a:blip r:embed="rId18">
                       <a:extLst>
                         <a:ext uri="{28A0092B-C50C-407E-A947-70E740481C1C}">
                           <a14:useLocalDpi xmlns:a14="http://schemas.microsoft.com/office/drawing/2010/main" val="0"/>
@@ -1887,7 +1987,7 @@
                     </pic:cNvPicPr>
                   </pic:nvPicPr>
                   <pic:blipFill>
-                    <a:blip r:embed="rId18">
+                    <a:blip r:embed="rId19">
                       <a:extLst>
                         <a:ext uri="{28A0092B-C50C-407E-A947-70E740481C1C}">
                           <a14:useLocalDpi xmlns:a14="http://schemas.microsoft.com/office/drawing/2010/main" val="0"/>
@@ -1955,7 +2055,7 @@
                     </pic:cNvPicPr>
                   </pic:nvPicPr>
                   <pic:blipFill>
-                    <a:blip r:embed="rId19">
+                    <a:blip r:embed="rId20">
                       <a:extLst>
                         <a:ext uri="{28A0092B-C50C-407E-A947-70E740481C1C}">
                           <a14:useLocalDpi xmlns:a14="http://schemas.microsoft.com/office/drawing/2010/main" val="0"/>
@@ -2153,7 +2253,7 @@
                     </pic:cNvPicPr>
                   </pic:nvPicPr>
                   <pic:blipFill>
-                    <a:blip r:embed="rId20">
+                    <a:blip r:embed="rId21">
                       <a:extLst>
                         <a:ext uri="{28A0092B-C50C-407E-A947-70E740481C1C}">
                           <a14:useLocalDpi xmlns:a14="http://schemas.microsoft.com/office/drawing/2010/main" val="0"/>
@@ -2251,7 +2351,7 @@
                     </pic:cNvPicPr>
                   </pic:nvPicPr>
                   <pic:blipFill>
-                    <a:blip r:embed="rId21">
+                    <a:blip r:embed="rId22">
                       <a:extLst>
                         <a:ext uri="{28A0092B-C50C-407E-A947-70E740481C1C}">
                           <a14:useLocalDpi xmlns:a14="http://schemas.microsoft.com/office/drawing/2010/main" val="0"/>
@@ -2425,7 +2525,7 @@
                     </pic:cNvPicPr>
                   </pic:nvPicPr>
                   <pic:blipFill>
-                    <a:blip r:embed="rId22">
+                    <a:blip r:embed="rId23">
                       <a:extLst>
                         <a:ext uri="{28A0092B-C50C-407E-A947-70E740481C1C}">
                           <a14:useLocalDpi xmlns:a14="http://schemas.microsoft.com/office/drawing/2010/main" val="0"/>
@@ -2533,7 +2633,7 @@
                     </pic:cNvPicPr>
                   </pic:nvPicPr>
                   <pic:blipFill>
-                    <a:blip r:embed="rId23">
+                    <a:blip r:embed="rId24">
                       <a:extLst>
                         <a:ext uri="{28A0092B-C50C-407E-A947-70E740481C1C}">
                           <a14:useLocalDpi xmlns:a14="http://schemas.microsoft.com/office/drawing/2010/main" val="0"/>
@@ -2653,7 +2753,7 @@
                     </pic:cNvPicPr>
                   </pic:nvPicPr>
                   <pic:blipFill>
-                    <a:blip r:embed="rId24">
+                    <a:blip r:embed="rId25">
                       <a:extLst>
                         <a:ext uri="{28A0092B-C50C-407E-A947-70E740481C1C}">
                           <a14:useLocalDpi xmlns:a14="http://schemas.microsoft.com/office/drawing/2010/main" val="0"/>
@@ -2714,7 +2814,7 @@
                     </pic:cNvPicPr>
                   </pic:nvPicPr>
                   <pic:blipFill>
-                    <a:blip r:embed="rId25">
+                    <a:blip r:embed="rId26">
                       <a:extLst>
                         <a:ext uri="{28A0092B-C50C-407E-A947-70E740481C1C}">
                           <a14:useLocalDpi xmlns:a14="http://schemas.microsoft.com/office/drawing/2010/main" val="0"/>
@@ -2814,7 +2914,7 @@
                     </pic:cNvPicPr>
                   </pic:nvPicPr>
                   <pic:blipFill>
-                    <a:blip r:embed="rId26">
+                    <a:blip r:embed="rId27">
                       <a:extLst>
                         <a:ext uri="{28A0092B-C50C-407E-A947-70E740481C1C}">
                           <a14:useLocalDpi xmlns:a14="http://schemas.microsoft.com/office/drawing/2010/main" val="0"/>
@@ -2951,7 +3051,7 @@
                     </pic:cNvPicPr>
                   </pic:nvPicPr>
                   <pic:blipFill>
-                    <a:blip r:embed="rId27" cstate="print">
+                    <a:blip r:embed="rId28" cstate="print">
                       <a:extLst>
                         <a:ext uri="{28A0092B-C50C-407E-A947-70E740481C1C}">
                           <a14:useLocalDpi xmlns:a14="http://schemas.microsoft.com/office/drawing/2010/main" val="0"/>
@@ -3030,7 +3130,7 @@
                     </pic:cNvPicPr>
                   </pic:nvPicPr>
                   <pic:blipFill>
-                    <a:blip r:embed="rId28">
+                    <a:blip r:embed="rId29">
                       <a:extLst>
                         <a:ext uri="{28A0092B-C50C-407E-A947-70E740481C1C}">
                           <a14:useLocalDpi xmlns:a14="http://schemas.microsoft.com/office/drawing/2010/main" val="0"/>
@@ -3151,177 +3251,6 @@
                 <pic:pic xmlns:pic="http://schemas.openxmlformats.org/drawingml/2006/picture">
                   <pic:nvPicPr>
                     <pic:cNvPr id="0" name="Picture 1"/>
-                    <pic:cNvPicPr>
-                      <a:picLocks noChangeAspect="1" noChangeArrowheads="1"/>
-                    </pic:cNvPicPr>
-                  </pic:nvPicPr>
-                  <pic:blipFill>
-                    <a:blip r:embed="rId29">
-                      <a:extLst>
-                        <a:ext uri="{28A0092B-C50C-407E-A947-70E740481C1C}">
-                          <a14:useLocalDpi xmlns:a14="http://schemas.microsoft.com/office/drawing/2010/main" val="0"/>
-                        </a:ext>
-                      </a:extLst>
-                    </a:blip>
-                    <a:srcRect/>
-                    <a:stretch>
-                      <a:fillRect/>
-                    </a:stretch>
-                  </pic:blipFill>
-                  <pic:spPr bwMode="auto">
-                    <a:xfrm>
-                      <a:off x="0" y="0"/>
-                      <a:ext cx="5730875" cy="3870325"/>
-                    </a:xfrm>
-                    <a:prstGeom prst="rect">
-                      <a:avLst/>
-                    </a:prstGeom>
-                    <a:noFill/>
-                    <a:ln>
-                      <a:noFill/>
-                    </a:ln>
-                  </pic:spPr>
-                </pic:pic>
-              </a:graphicData>
-            </a:graphic>
-          </wp:inline>
-        </w:drawing>
-      </w:r>
-    </w:p>
-    <w:p>
-      <w:pPr>
-        <w:ind w:left="1440"/>
-        <w:rPr>
-          <w:lang w:val="en-US"/>
-        </w:rPr>
-      </w:pPr>
-      <w:r>
-        <w:rPr>
-          <w:lang w:val="en-US"/>
-        </w:rPr>
-        <w:t>In this instance, deliverable have 100 total hours and 50 hours already earned, but variation defines a 75 hours reduction, two options are available during approval</w:t>
-      </w:r>
-    </w:p>
-    <w:p>
-      <w:pPr>
-        <w:pStyle w:val="ListParagraph"/>
-        <w:numPr>
-          <w:ilvl w:val="2"/>
-          <w:numId w:val="28"/>
-        </w:numPr>
-        <w:rPr>
-          <w:lang w:val="en-US"/>
-        </w:rPr>
-      </w:pPr>
-      <w:r>
-        <w:rPr>
-          <w:lang w:val="en-US"/>
-        </w:rPr>
-        <w:t>Reduce earned hours ticked – Earned units will be reduced to 25 so that 75 hours reduction can be applied</w:t>
-      </w:r>
-    </w:p>
-    <w:p>
-      <w:pPr>
-        <w:pStyle w:val="ListParagraph"/>
-        <w:numPr>
-          <w:ilvl w:val="2"/>
-          <w:numId w:val="28"/>
-        </w:numPr>
-        <w:rPr>
-          <w:lang w:val="en-US"/>
-        </w:rPr>
-      </w:pPr>
-      <w:r>
-        <w:rPr>
-          <w:lang w:val="en-US"/>
-        </w:rPr>
-        <w:t>Reduce earned hours not ticked – Variation hours will be changed to 50 hours reduction instead of 75, as defined by maximum reducible units column</w:t>
-      </w:r>
-    </w:p>
-    <w:p>
-      <w:pPr>
-        <w:rPr>
-          <w:lang w:val="en-US"/>
-        </w:rPr>
-      </w:pPr>
-      <w:r>
-        <w:rPr>
-          <w:lang w:val="en-US"/>
-        </w:rPr>
-        <w:br w:type="page"/>
-      </w:r>
-    </w:p>
-    <w:p>
-      <w:pPr>
-        <w:rPr>
-          <w:lang w:val="en-US"/>
-        </w:rPr>
-      </w:pPr>
-      <w:r>
-        <w:rPr>
-          <w:lang w:val="en-US"/>
-        </w:rPr>
-        <w:lastRenderedPageBreak/>
-        <w:t>Cont. Change Log 8</w:t>
-      </w:r>
-      <w:r>
-        <w:rPr>
-          <w:vertAlign w:val="superscript"/>
-          <w:lang w:val="en-US"/>
-        </w:rPr>
-        <w:t>th</w:t>
-      </w:r>
-      <w:r>
-        <w:rPr>
-          <w:lang w:val="en-US"/>
-        </w:rPr>
-        <w:t xml:space="preserve"> Feb 2021</w:t>
-      </w:r>
-    </w:p>
-    <w:p>
-      <w:pPr>
-        <w:pStyle w:val="ListParagraph"/>
-        <w:numPr>
-          <w:ilvl w:val="1"/>
-          <w:numId w:val="28"/>
-        </w:numPr>
-        <w:rPr>
-          <w:lang w:val="en-US"/>
-        </w:rPr>
-      </w:pPr>
-      <w:r>
-        <w:rPr>
-          <w:lang w:val="en-US"/>
-        </w:rPr>
-        <w:t>Added ability to reduce earned units when variations are unapproved</w:t>
-      </w:r>
-    </w:p>
-    <w:p>
-      <w:pPr>
-        <w:pStyle w:val="ListParagraph"/>
-        <w:ind w:left="1440"/>
-        <w:rPr>
-          <w:lang w:val="en-US"/>
-        </w:rPr>
-      </w:pPr>
-      <w:r>
-        <w:rPr>
-          <w:noProof/>
-          <w:lang w:val="en-US"/>
-        </w:rPr>
-        <w:drawing>
-          <wp:inline distT="0" distB="0" distL="0" distR="0" wp14:anchorId="2674E29E" wp14:editId="0A9EBCC1">
-            <wp:extent cx="5730875" cy="3870325"/>
-            <wp:effectExtent l="0" t="0" r="3175" b="0"/>
-            <wp:docPr id="11" name="Picture 11"/>
-            <wp:cNvGraphicFramePr>
-              <a:graphicFrameLocks xmlns:a="http://schemas.openxmlformats.org/drawingml/2006/main" noChangeAspect="1"/>
-            </wp:cNvGraphicFramePr>
-            <a:graphic xmlns:a="http://schemas.openxmlformats.org/drawingml/2006/main">
-              <a:graphicData uri="http://schemas.openxmlformats.org/drawingml/2006/picture">
-                <pic:pic xmlns:pic="http://schemas.openxmlformats.org/drawingml/2006/picture">
-                  <pic:nvPicPr>
-                    <pic:cNvPr id="0" name="Picture 2"/>
                     <pic:cNvPicPr>
                       <a:picLocks noChangeAspect="1" noChangeArrowheads="1"/>
                     </pic:cNvPicPr>
@@ -3361,6 +3290,177 @@
     </w:p>
     <w:p>
       <w:pPr>
+        <w:ind w:left="1440"/>
+        <w:rPr>
+          <w:lang w:val="en-US"/>
+        </w:rPr>
+      </w:pPr>
+      <w:r>
+        <w:rPr>
+          <w:lang w:val="en-US"/>
+        </w:rPr>
+        <w:t>In this instance, deliverable have 100 total hours and 50 hours already earned, but variation defines a 75 hours reduction, two options are available during approval</w:t>
+      </w:r>
+    </w:p>
+    <w:p>
+      <w:pPr>
+        <w:pStyle w:val="ListParagraph"/>
+        <w:numPr>
+          <w:ilvl w:val="2"/>
+          <w:numId w:val="28"/>
+        </w:numPr>
+        <w:rPr>
+          <w:lang w:val="en-US"/>
+        </w:rPr>
+      </w:pPr>
+      <w:r>
+        <w:rPr>
+          <w:lang w:val="en-US"/>
+        </w:rPr>
+        <w:t>Reduce earned hours ticked – Earned units will be reduced to 25 so that 75 hours reduction can be applied</w:t>
+      </w:r>
+    </w:p>
+    <w:p>
+      <w:pPr>
+        <w:pStyle w:val="ListParagraph"/>
+        <w:numPr>
+          <w:ilvl w:val="2"/>
+          <w:numId w:val="28"/>
+        </w:numPr>
+        <w:rPr>
+          <w:lang w:val="en-US"/>
+        </w:rPr>
+      </w:pPr>
+      <w:r>
+        <w:rPr>
+          <w:lang w:val="en-US"/>
+        </w:rPr>
+        <w:t>Reduce earned hours not ticked – Variation hours will be changed to 50 hours reduction instead of 75, as defined by maximum reducible units column</w:t>
+      </w:r>
+    </w:p>
+    <w:p>
+      <w:pPr>
+        <w:rPr>
+          <w:lang w:val="en-US"/>
+        </w:rPr>
+      </w:pPr>
+      <w:r>
+        <w:rPr>
+          <w:lang w:val="en-US"/>
+        </w:rPr>
+        <w:br w:type="page"/>
+      </w:r>
+    </w:p>
+    <w:p>
+      <w:pPr>
+        <w:rPr>
+          <w:lang w:val="en-US"/>
+        </w:rPr>
+      </w:pPr>
+      <w:r>
+        <w:rPr>
+          <w:lang w:val="en-US"/>
+        </w:rPr>
+        <w:lastRenderedPageBreak/>
+        <w:t>Cont. Change Log 8</w:t>
+      </w:r>
+      <w:r>
+        <w:rPr>
+          <w:vertAlign w:val="superscript"/>
+          <w:lang w:val="en-US"/>
+        </w:rPr>
+        <w:t>th</w:t>
+      </w:r>
+      <w:r>
+        <w:rPr>
+          <w:lang w:val="en-US"/>
+        </w:rPr>
+        <w:t xml:space="preserve"> Feb 2021</w:t>
+      </w:r>
+    </w:p>
+    <w:p>
+      <w:pPr>
+        <w:pStyle w:val="ListParagraph"/>
+        <w:numPr>
+          <w:ilvl w:val="1"/>
+          <w:numId w:val="28"/>
+        </w:numPr>
+        <w:rPr>
+          <w:lang w:val="en-US"/>
+        </w:rPr>
+      </w:pPr>
+      <w:r>
+        <w:rPr>
+          <w:lang w:val="en-US"/>
+        </w:rPr>
+        <w:t>Added ability to reduce earned units when variations are unapproved</w:t>
+      </w:r>
+    </w:p>
+    <w:p>
+      <w:pPr>
+        <w:pStyle w:val="ListParagraph"/>
+        <w:ind w:left="1440"/>
+        <w:rPr>
+          <w:lang w:val="en-US"/>
+        </w:rPr>
+      </w:pPr>
+      <w:r>
+        <w:rPr>
+          <w:noProof/>
+          <w:lang w:val="en-US"/>
+        </w:rPr>
+        <w:drawing>
+          <wp:inline distT="0" distB="0" distL="0" distR="0" wp14:anchorId="2674E29E" wp14:editId="0A9EBCC1">
+            <wp:extent cx="5730875" cy="3870325"/>
+            <wp:effectExtent l="0" t="0" r="3175" b="0"/>
+            <wp:docPr id="11" name="Picture 11"/>
+            <wp:cNvGraphicFramePr>
+              <a:graphicFrameLocks xmlns:a="http://schemas.openxmlformats.org/drawingml/2006/main" noChangeAspect="1"/>
+            </wp:cNvGraphicFramePr>
+            <a:graphic xmlns:a="http://schemas.openxmlformats.org/drawingml/2006/main">
+              <a:graphicData uri="http://schemas.openxmlformats.org/drawingml/2006/picture">
+                <pic:pic xmlns:pic="http://schemas.openxmlformats.org/drawingml/2006/picture">
+                  <pic:nvPicPr>
+                    <pic:cNvPr id="0" name="Picture 2"/>
+                    <pic:cNvPicPr>
+                      <a:picLocks noChangeAspect="1" noChangeArrowheads="1"/>
+                    </pic:cNvPicPr>
+                  </pic:nvPicPr>
+                  <pic:blipFill>
+                    <a:blip r:embed="rId31">
+                      <a:extLst>
+                        <a:ext uri="{28A0092B-C50C-407E-A947-70E740481C1C}">
+                          <a14:useLocalDpi xmlns:a14="http://schemas.microsoft.com/office/drawing/2010/main" val="0"/>
+                        </a:ext>
+                      </a:extLst>
+                    </a:blip>
+                    <a:srcRect/>
+                    <a:stretch>
+                      <a:fillRect/>
+                    </a:stretch>
+                  </pic:blipFill>
+                  <pic:spPr bwMode="auto">
+                    <a:xfrm>
+                      <a:off x="0" y="0"/>
+                      <a:ext cx="5730875" cy="3870325"/>
+                    </a:xfrm>
+                    <a:prstGeom prst="rect">
+                      <a:avLst/>
+                    </a:prstGeom>
+                    <a:noFill/>
+                    <a:ln>
+                      <a:noFill/>
+                    </a:ln>
+                  </pic:spPr>
+                </pic:pic>
+              </a:graphicData>
+            </a:graphic>
+          </wp:inline>
+        </w:drawing>
+      </w:r>
+    </w:p>
+    <w:p>
+      <w:pPr>
         <w:pStyle w:val="ListParagraph"/>
         <w:ind w:left="1440"/>
         <w:rPr>
@@ -3548,7 +3648,7 @@
                     </pic:cNvPicPr>
                   </pic:nvPicPr>
                   <pic:blipFill>
-                    <a:blip r:embed="rId31">
+                    <a:blip r:embed="rId32">
                       <a:extLst>
                         <a:ext uri="{28A0092B-C50C-407E-A947-70E740481C1C}">
                           <a14:useLocalDpi xmlns:a14="http://schemas.microsoft.com/office/drawing/2010/main" val="0"/>
@@ -3705,7 +3805,7 @@
                     </pic:cNvPicPr>
                   </pic:nvPicPr>
                   <pic:blipFill>
-                    <a:blip r:embed="rId32">
+                    <a:blip r:embed="rId33">
                       <a:extLst>
                         <a:ext uri="{28A0092B-C50C-407E-A947-70E740481C1C}">
                           <a14:useLocalDpi xmlns:a14="http://schemas.microsoft.com/office/drawing/2010/main" val="0"/>
@@ -3804,7 +3904,7 @@
                     </pic:cNvPicPr>
                   </pic:nvPicPr>
                   <pic:blipFill>
-                    <a:blip r:embed="rId33">
+                    <a:blip r:embed="rId34">
                       <a:extLst>
                         <a:ext uri="{28A0092B-C50C-407E-A947-70E740481C1C}">
                           <a14:useLocalDpi xmlns:a14="http://schemas.microsoft.com/office/drawing/2010/main" val="0"/>
@@ -3929,7 +4029,7 @@
                     </pic:cNvPicPr>
                   </pic:nvPicPr>
                   <pic:blipFill>
-                    <a:blip r:embed="rId34" cstate="print">
+                    <a:blip r:embed="rId35" cstate="print">
                       <a:extLst>
                         <a:ext uri="{28A0092B-C50C-407E-A947-70E740481C1C}">
                           <a14:useLocalDpi xmlns:a14="http://schemas.microsoft.com/office/drawing/2010/main" val="0"/>
@@ -3992,7 +4092,7 @@
                     </pic:cNvPicPr>
                   </pic:nvPicPr>
                   <pic:blipFill>
-                    <a:blip r:embed="rId35">
+                    <a:blip r:embed="rId36">
                       <a:extLst>
                         <a:ext uri="{28A0092B-C50C-407E-A947-70E740481C1C}">
                           <a14:useLocalDpi xmlns:a14="http://schemas.microsoft.com/office/drawing/2010/main" val="0"/>
@@ -4117,7 +4217,7 @@
                     </pic:cNvPicPr>
                   </pic:nvPicPr>
                   <pic:blipFill>
-                    <a:blip r:embed="rId36">
+                    <a:blip r:embed="rId37">
                       <a:extLst>
                         <a:ext uri="{28A0092B-C50C-407E-A947-70E740481C1C}">
                           <a14:useLocalDpi xmlns:a14="http://schemas.microsoft.com/office/drawing/2010/main" val="0"/>
@@ -4217,7 +4317,7 @@
                     </pic:cNvPicPr>
                   </pic:nvPicPr>
                   <pic:blipFill>
-                    <a:blip r:embed="rId37">
+                    <a:blip r:embed="rId38">
                       <a:extLst>
                         <a:ext uri="{28A0092B-C50C-407E-A947-70E740481C1C}">
                           <a14:useLocalDpi xmlns:a14="http://schemas.microsoft.com/office/drawing/2010/main" val="0"/>
@@ -4280,7 +4380,7 @@
                     </pic:cNvPicPr>
                   </pic:nvPicPr>
                   <pic:blipFill>
-                    <a:blip r:embed="rId38">
+                    <a:blip r:embed="rId39">
                       <a:extLst>
                         <a:ext uri="{28A0092B-C50C-407E-A947-70E740481C1C}">
                           <a14:useLocalDpi xmlns:a14="http://schemas.microsoft.com/office/drawing/2010/main" val="0"/>
@@ -4498,7 +4598,7 @@
                     </pic:cNvPicPr>
                   </pic:nvPicPr>
                   <pic:blipFill>
-                    <a:blip r:embed="rId39">
+                    <a:blip r:embed="rId40">
                       <a:extLst>
                         <a:ext uri="{28A0092B-C50C-407E-A947-70E740481C1C}">
                           <a14:useLocalDpi xmlns:a14="http://schemas.microsoft.com/office/drawing/2010/main" val="0"/>
@@ -5570,7 +5670,7 @@
           <w:lang w:val="en-US"/>
         </w:rPr>
       </w:pPr>
-      <w:hyperlink r:id="rId40" w:history="1">
+      <w:hyperlink r:id="rId41" w:history="1">
         <w:r>
           <w:rPr>
             <w:rStyle w:val="Hyperlink"/>
@@ -5850,7 +5950,7 @@
           <w:lang w:val="en-US"/>
         </w:rPr>
       </w:pPr>
-      <w:hyperlink r:id="rId41" w:history="1">
+      <w:hyperlink r:id="rId42" w:history="1">
         <w:r>
           <w:rPr>
             <w:rStyle w:val="Hyperlink"/>
@@ -5930,7 +6030,7 @@
           <w:lang w:val="en-US"/>
         </w:rPr>
       </w:pPr>
-      <w:hyperlink r:id="rId42" w:history="1">
+      <w:hyperlink r:id="rId43" w:history="1">
         <w:r>
           <w:rPr>
             <w:rStyle w:val="Hyperlink"/>
@@ -6690,7 +6790,7 @@
           <w:lang w:val="en-US"/>
         </w:rPr>
       </w:pPr>
-      <w:hyperlink r:id="rId43" w:history="1">
+      <w:hyperlink r:id="rId44" w:history="1">
         <w:r>
           <w:rPr>
             <w:rStyle w:val="Hyperlink"/>
@@ -10635,6 +10735,118 @@
     </w:lvl>
   </w:abstractNum>
   <w:abstractNum w:abstractNumId="35" w15:restartNumberingAfterBreak="0">
+    <w:nsid w:val="68735AD0"/>
+    <w:multiLevelType w:val="hybridMultilevel"/>
+    <w:tmpl w:val="4EDE05FA"/>
+    <w:lvl w:ilvl="0" w:tplc="F3FA52A0">
+      <w:numFmt w:val="bullet"/>
+      <w:lvlText w:val="-"/>
+      <w:lvlJc w:val="left"/>
+      <w:pPr>
+        <w:ind w:left="720" w:hanging="360"/>
+      </w:pPr>
+      <w:rPr>
+        <w:rFonts w:ascii="Calibri" w:eastAsiaTheme="minorEastAsia" w:hAnsi="Calibri" w:cs="Calibri" w:hint="default"/>
+      </w:rPr>
+    </w:lvl>
+    <w:lvl w:ilvl="1" w:tplc="44090003">
+      <w:start w:val="1"/>
+      <w:numFmt w:val="bullet"/>
+      <w:lvlText w:val="o"/>
+      <w:lvlJc w:val="left"/>
+      <w:pPr>
+        <w:ind w:left="1440" w:hanging="360"/>
+      </w:pPr>
+      <w:rPr>
+        <w:rFonts w:ascii="Courier New" w:hAnsi="Courier New" w:cs="Courier New" w:hint="default"/>
+      </w:rPr>
+    </w:lvl>
+    <w:lvl w:ilvl="2" w:tplc="44090005" w:tentative="1">
+      <w:start w:val="1"/>
+      <w:numFmt w:val="bullet"/>
+      <w:lvlText w:val=""/>
+      <w:lvlJc w:val="left"/>
+      <w:pPr>
+        <w:ind w:left="2160" w:hanging="360"/>
+      </w:pPr>
+      <w:rPr>
+        <w:rFonts w:ascii="Wingdings" w:hAnsi="Wingdings" w:hint="default"/>
+      </w:rPr>
+    </w:lvl>
+    <w:lvl w:ilvl="3" w:tplc="44090001" w:tentative="1">
+      <w:start w:val="1"/>
+      <w:numFmt w:val="bullet"/>
+      <w:lvlText w:val=""/>
+      <w:lvlJc w:val="left"/>
+      <w:pPr>
+        <w:ind w:left="2880" w:hanging="360"/>
+      </w:pPr>
+      <w:rPr>
+        <w:rFonts w:ascii="Symbol" w:hAnsi="Symbol" w:hint="default"/>
+      </w:rPr>
+    </w:lvl>
+    <w:lvl w:ilvl="4" w:tplc="44090003" w:tentative="1">
+      <w:start w:val="1"/>
+      <w:numFmt w:val="bullet"/>
+      <w:lvlText w:val="o"/>
+      <w:lvlJc w:val="left"/>
+      <w:pPr>
+        <w:ind w:left="3600" w:hanging="360"/>
+      </w:pPr>
+      <w:rPr>
+        <w:rFonts w:ascii="Courier New" w:hAnsi="Courier New" w:cs="Courier New" w:hint="default"/>
+      </w:rPr>
+    </w:lvl>
+    <w:lvl w:ilvl="5" w:tplc="44090005" w:tentative="1">
+      <w:start w:val="1"/>
+      <w:numFmt w:val="bullet"/>
+      <w:lvlText w:val=""/>
+      <w:lvlJc w:val="left"/>
+      <w:pPr>
+        <w:ind w:left="4320" w:hanging="360"/>
+      </w:pPr>
+      <w:rPr>
+        <w:rFonts w:ascii="Wingdings" w:hAnsi="Wingdings" w:hint="default"/>
+      </w:rPr>
+    </w:lvl>
+    <w:lvl w:ilvl="6" w:tplc="44090001" w:tentative="1">
+      <w:start w:val="1"/>
+      <w:numFmt w:val="bullet"/>
+      <w:lvlText w:val=""/>
+      <w:lvlJc w:val="left"/>
+      <w:pPr>
+        <w:ind w:left="5040" w:hanging="360"/>
+      </w:pPr>
+      <w:rPr>
+        <w:rFonts w:ascii="Symbol" w:hAnsi="Symbol" w:hint="default"/>
+      </w:rPr>
+    </w:lvl>
+    <w:lvl w:ilvl="7" w:tplc="44090003" w:tentative="1">
+      <w:start w:val="1"/>
+      <w:numFmt w:val="bullet"/>
+      <w:lvlText w:val="o"/>
+      <w:lvlJc w:val="left"/>
+      <w:pPr>
+        <w:ind w:left="5760" w:hanging="360"/>
+      </w:pPr>
+      <w:rPr>
+        <w:rFonts w:ascii="Courier New" w:hAnsi="Courier New" w:cs="Courier New" w:hint="default"/>
+      </w:rPr>
+    </w:lvl>
+    <w:lvl w:ilvl="8" w:tplc="44090005" w:tentative="1">
+      <w:start w:val="1"/>
+      <w:numFmt w:val="bullet"/>
+      <w:lvlText w:val=""/>
+      <w:lvlJc w:val="left"/>
+      <w:pPr>
+        <w:ind w:left="6480" w:hanging="360"/>
+      </w:pPr>
+      <w:rPr>
+        <w:rFonts w:ascii="Wingdings" w:hAnsi="Wingdings" w:hint="default"/>
+      </w:rPr>
+    </w:lvl>
+  </w:abstractNum>
+  <w:abstractNum w:abstractNumId="36" w15:restartNumberingAfterBreak="0">
     <w:nsid w:val="6A047A76"/>
     <w:multiLevelType w:val="hybridMultilevel"/>
     <w:tmpl w:val="50CADEB2"/>
@@ -10746,7 +10958,7 @@
       </w:rPr>
     </w:lvl>
   </w:abstractNum>
-  <w:abstractNum w:abstractNumId="36" w15:restartNumberingAfterBreak="0">
+  <w:abstractNum w:abstractNumId="37" w15:restartNumberingAfterBreak="0">
     <w:nsid w:val="6A3A0B6E"/>
     <w:multiLevelType w:val="hybridMultilevel"/>
     <w:tmpl w:val="759C482E"/>
@@ -10858,7 +11070,7 @@
       </w:rPr>
     </w:lvl>
   </w:abstractNum>
-  <w:abstractNum w:abstractNumId="37" w15:restartNumberingAfterBreak="0">
+  <w:abstractNum w:abstractNumId="38" w15:restartNumberingAfterBreak="0">
     <w:nsid w:val="6AC268F7"/>
     <w:multiLevelType w:val="hybridMultilevel"/>
     <w:tmpl w:val="12F21194"/>
@@ -10970,7 +11182,7 @@
       </w:rPr>
     </w:lvl>
   </w:abstractNum>
-  <w:abstractNum w:abstractNumId="38" w15:restartNumberingAfterBreak="0">
+  <w:abstractNum w:abstractNumId="39" w15:restartNumberingAfterBreak="0">
     <w:nsid w:val="6CE7392E"/>
     <w:multiLevelType w:val="hybridMultilevel"/>
     <w:tmpl w:val="2E2C9BDE"/>
@@ -11082,7 +11294,7 @@
       </w:rPr>
     </w:lvl>
   </w:abstractNum>
-  <w:abstractNum w:abstractNumId="39" w15:restartNumberingAfterBreak="0">
+  <w:abstractNum w:abstractNumId="40" w15:restartNumberingAfterBreak="0">
     <w:nsid w:val="6E3F3F9F"/>
     <w:multiLevelType w:val="hybridMultilevel"/>
     <w:tmpl w:val="A13CFC48"/>
@@ -11194,7 +11406,7 @@
       </w:rPr>
     </w:lvl>
   </w:abstractNum>
-  <w:abstractNum w:abstractNumId="40" w15:restartNumberingAfterBreak="0">
+  <w:abstractNum w:abstractNumId="41" w15:restartNumberingAfterBreak="0">
     <w:nsid w:val="74A1190D"/>
     <w:multiLevelType w:val="hybridMultilevel"/>
     <w:tmpl w:val="D5387ACA"/>
@@ -11306,7 +11518,7 @@
       </w:rPr>
     </w:lvl>
   </w:abstractNum>
-  <w:abstractNum w:abstractNumId="41" w15:restartNumberingAfterBreak="0">
+  <w:abstractNum w:abstractNumId="42" w15:restartNumberingAfterBreak="0">
     <w:nsid w:val="7E7D5380"/>
     <w:multiLevelType w:val="hybridMultilevel"/>
     <w:tmpl w:val="7668ED14"/>
@@ -11418,7 +11630,7 @@
       </w:rPr>
     </w:lvl>
   </w:abstractNum>
-  <w:abstractNum w:abstractNumId="42" w15:restartNumberingAfterBreak="0">
+  <w:abstractNum w:abstractNumId="43" w15:restartNumberingAfterBreak="0">
     <w:nsid w:val="7EAA14ED"/>
     <w:multiLevelType w:val="hybridMultilevel"/>
     <w:tmpl w:val="AF783BA4"/>
@@ -11530,7 +11742,7 @@
       </w:rPr>
     </w:lvl>
   </w:abstractNum>
-  <w:abstractNum w:abstractNumId="43" w15:restartNumberingAfterBreak="0">
+  <w:abstractNum w:abstractNumId="44" w15:restartNumberingAfterBreak="0">
     <w:nsid w:val="7FD565FA"/>
     <w:multiLevelType w:val="hybridMultilevel"/>
     <w:tmpl w:val="E5906ACC"/>
@@ -11664,7 +11876,7 @@
     <w:abstractNumId w:val="28"/>
   </w:num>
   <w:num w:numId="8">
-    <w:abstractNumId w:val="37"/>
+    <w:abstractNumId w:val="38"/>
   </w:num>
   <w:num w:numId="9">
     <w:abstractNumId w:val="11"/>
@@ -11682,10 +11894,10 @@
     <w:abstractNumId w:val="2"/>
   </w:num>
   <w:num w:numId="14">
-    <w:abstractNumId w:val="35"/>
+    <w:abstractNumId w:val="36"/>
   </w:num>
   <w:num w:numId="15">
-    <w:abstractNumId w:val="38"/>
+    <w:abstractNumId w:val="39"/>
   </w:num>
   <w:num w:numId="16">
     <w:abstractNumId w:val="10"/>
@@ -11712,10 +11924,10 @@
     <w:abstractNumId w:val="17"/>
   </w:num>
   <w:num w:numId="24">
-    <w:abstractNumId w:val="36"/>
+    <w:abstractNumId w:val="37"/>
   </w:num>
   <w:num w:numId="25">
-    <w:abstractNumId w:val="39"/>
+    <w:abstractNumId w:val="40"/>
   </w:num>
   <w:num w:numId="26">
     <w:abstractNumId w:val="19"/>
@@ -11724,7 +11936,7 @@
     <w:abstractNumId w:val="21"/>
   </w:num>
   <w:num w:numId="28">
-    <w:abstractNumId w:val="41"/>
+    <w:abstractNumId w:val="42"/>
   </w:num>
   <w:num w:numId="29">
     <w:abstractNumId w:val="33"/>
@@ -11745,16 +11957,16 @@
     <w:abstractNumId w:val="31"/>
   </w:num>
   <w:num w:numId="35">
-    <w:abstractNumId w:val="42"/>
+    <w:abstractNumId w:val="43"/>
   </w:num>
   <w:num w:numId="36">
     <w:abstractNumId w:val="22"/>
   </w:num>
   <w:num w:numId="37">
-    <w:abstractNumId w:val="40"/>
+    <w:abstractNumId w:val="41"/>
   </w:num>
   <w:num w:numId="38">
-    <w:abstractNumId w:val="43"/>
+    <w:abstractNumId w:val="44"/>
   </w:num>
   <w:num w:numId="39">
     <w:abstractNumId w:val="16"/>
@@ -11773,6 +11985,9 @@
   </w:num>
   <w:num w:numId="44">
     <w:abstractNumId w:val="7"/>
+  </w:num>
+  <w:num w:numId="45">
+    <w:abstractNumId w:val="35"/>
   </w:num>
   <w:numIdMacAtCleanup w:val="42"/>
 </w:numbering>
@@ -12360,6 +12575,18 @@
       <w:lang w:bidi="th-TH"/>
     </w:rPr>
   </w:style>
+  <w:style w:type="character" w:styleId="UnresolvedMention">
+    <w:name w:val="Unresolved Mention"/>
+    <w:basedOn w:val="DefaultParagraphFont"/>
+    <w:uiPriority w:val="99"/>
+    <w:semiHidden/>
+    <w:unhideWhenUsed/>
+    <w:rsid w:val="0012102A"/>
+    <w:rPr>
+      <w:color w:val="605E5C"/>
+      <w:shd w:val="clear" w:color="auto" w:fill="E1DFDD"/>
+    </w:rPr>
+  </w:style>
 </w:styles>
 </file>
 

</xml_diff>

<commit_message>
- default STDCOST and SELLPRICE1 to zero when it's null in EXO -> Resources and EXO -> STOCK_ITEMS
</commit_message>
<xml_diff>
--- a/BluePrints/Views/ChangeLog.docx
+++ b/BluePrints/Views/ChangeLog.docx
@@ -69,6 +69,7 @@
         <w:pStyle w:val="ListParagraph"/>
         <w:ind w:left="1440"/>
         <w:rPr>
+          <w:rStyle w:val="Hyperlink"/>
           <w:lang w:val="en-US"/>
         </w:rPr>
       </w:pPr>
@@ -84,28 +85,23 @@
     </w:p>
     <w:p>
       <w:pPr>
-        <w:rPr>
-          <w:lang w:val="en-US"/>
-        </w:rPr>
-      </w:pPr>
-      <w:r>
-        <w:rPr>
-          <w:lang w:val="en-US"/>
-        </w:rPr>
-        <w:br w:type="page"/>
-      </w:r>
-    </w:p>
-    <w:p>
-      <w:pPr>
-        <w:rPr>
-          <w:lang w:val="en-US"/>
-        </w:rPr>
-      </w:pPr>
-      <w:r>
-        <w:rPr>
-          <w:lang w:val="en-US"/>
-        </w:rPr>
-        <w:lastRenderedPageBreak/>
+        <w:pStyle w:val="ListParagraph"/>
+        <w:ind w:left="1440"/>
+        <w:rPr>
+          <w:lang w:val="en-US"/>
+        </w:rPr>
+      </w:pPr>
+    </w:p>
+    <w:p>
+      <w:pPr>
+        <w:rPr>
+          <w:lang w:val="en-US"/>
+        </w:rPr>
+      </w:pPr>
+      <w:r>
+        <w:rPr>
+          <w:lang w:val="en-US"/>
+        </w:rPr>
         <w:t>Change Log 18</w:t>
       </w:r>
       <w:r>
@@ -188,20 +184,6 @@
         <w:rPr>
           <w:lang w:val="en-US"/>
         </w:rPr>
-        <w:br w:type="page"/>
-      </w:r>
-    </w:p>
-    <w:p>
-      <w:pPr>
-        <w:rPr>
-          <w:lang w:val="en-US"/>
-        </w:rPr>
-      </w:pPr>
-      <w:r>
-        <w:rPr>
-          <w:lang w:val="en-US"/>
-        </w:rPr>
-        <w:lastRenderedPageBreak/>
         <w:t>Change Log 29</w:t>
       </w:r>
       <w:r>
@@ -2108,7 +2090,21 @@
         <w:rPr>
           <w:lang w:val="en-US"/>
         </w:rPr>
-        <w:t xml:space="preserve"> gets calculated incorrectly when P6 schedule data date is  less than forecast data date</w:t>
+        <w:t xml:space="preserve"> gets calculated incorrectly when P6 schedule data date </w:t>
+      </w:r>
+      <w:proofErr w:type="gramStart"/>
+      <w:r>
+        <w:rPr>
+          <w:lang w:val="en-US"/>
+        </w:rPr>
+        <w:t>is  less</w:t>
+      </w:r>
+      <w:proofErr w:type="gramEnd"/>
+      <w:r>
+        <w:rPr>
+          <w:lang w:val="en-US"/>
+        </w:rPr>
+        <w:t xml:space="preserve"> than forecast data date</w:t>
       </w:r>
     </w:p>
     <w:p>
@@ -2318,7 +2314,21 @@
         <w:rPr>
           <w:lang w:val="en-US"/>
         </w:rPr>
-        <w:t>Added area, subarea and variation category</w:t>
+        <w:t xml:space="preserve">Added area, </w:t>
+      </w:r>
+      <w:proofErr w:type="gramStart"/>
+      <w:r>
+        <w:rPr>
+          <w:lang w:val="en-US"/>
+        </w:rPr>
+        <w:t>subarea</w:t>
+      </w:r>
+      <w:proofErr w:type="gramEnd"/>
+      <w:r>
+        <w:rPr>
+          <w:lang w:val="en-US"/>
+        </w:rPr>
+        <w:t xml:space="preserve"> and variation category</w:t>
       </w:r>
     </w:p>
     <w:p>
@@ -3299,7 +3309,21 @@
         <w:rPr>
           <w:lang w:val="en-US"/>
         </w:rPr>
-        <w:t>In this instance, deliverable have 100 total hours and 50 hours already earned, but variation defines a 75 hours reduction, two options are available during approval</w:t>
+        <w:t xml:space="preserve">In this instance, deliverable have 100 total hours and 50 hours already earned, but variation defines a 75 </w:t>
+      </w:r>
+      <w:proofErr w:type="gramStart"/>
+      <w:r>
+        <w:rPr>
+          <w:lang w:val="en-US"/>
+        </w:rPr>
+        <w:t>hours</w:t>
+      </w:r>
+      <w:proofErr w:type="gramEnd"/>
+      <w:r>
+        <w:rPr>
+          <w:lang w:val="en-US"/>
+        </w:rPr>
+        <w:t xml:space="preserve"> reduction, two options are available during approval</w:t>
       </w:r>
     </w:p>
     <w:p>
@@ -3335,7 +3359,21 @@
         <w:rPr>
           <w:lang w:val="en-US"/>
         </w:rPr>
-        <w:t>Reduce earned hours not ticked – Variation hours will be changed to 50 hours reduction instead of 75, as defined by maximum reducible units column</w:t>
+        <w:t xml:space="preserve">Reduce earned hours not ticked – Variation hours will be changed to 50 hours reduction instead of 75, as defined by maximum reducible </w:t>
+      </w:r>
+      <w:proofErr w:type="gramStart"/>
+      <w:r>
+        <w:rPr>
+          <w:lang w:val="en-US"/>
+        </w:rPr>
+        <w:t>units</w:t>
+      </w:r>
+      <w:proofErr w:type="gramEnd"/>
+      <w:r>
+        <w:rPr>
+          <w:lang w:val="en-US"/>
+        </w:rPr>
+        <w:t xml:space="preserve"> column</w:t>
       </w:r>
     </w:p>
     <w:p>
@@ -3485,7 +3523,21 @@
         <w:rPr>
           <w:lang w:val="en-US"/>
         </w:rPr>
-        <w:t xml:space="preserve">. Since 50 hours has already been earned, 2 options are available during </w:t>
+        <w:t xml:space="preserve">. </w:t>
+      </w:r>
+      <w:proofErr w:type="gramStart"/>
+      <w:r>
+        <w:rPr>
+          <w:lang w:val="en-US"/>
+        </w:rPr>
+        <w:t>Since</w:t>
+      </w:r>
+      <w:proofErr w:type="gramEnd"/>
+      <w:r>
+        <w:rPr>
+          <w:lang w:val="en-US"/>
+        </w:rPr>
+        <w:t xml:space="preserve"> 50 hours has already been earned, 2 options are available during </w:t>
       </w:r>
       <w:proofErr w:type="spellStart"/>
       <w:r>
@@ -4477,7 +4529,21 @@
         <w:rPr>
           <w:lang w:val="en-US"/>
         </w:rPr>
-        <w:t xml:space="preserve"> gates goes by phases to support differentiation between D1, D2</w:t>
+        <w:t xml:space="preserve"> gates </w:t>
+      </w:r>
+      <w:proofErr w:type="gramStart"/>
+      <w:r>
+        <w:rPr>
+          <w:lang w:val="en-US"/>
+        </w:rPr>
+        <w:t>goes</w:t>
+      </w:r>
+      <w:proofErr w:type="gramEnd"/>
+      <w:r>
+        <w:rPr>
+          <w:lang w:val="en-US"/>
+        </w:rPr>
+        <w:t xml:space="preserve"> by phases to support differentiation between D1, D2</w:t>
       </w:r>
     </w:p>
     <w:p>
@@ -4967,7 +5033,21 @@
         <w:rPr>
           <w:lang w:val="en-US"/>
         </w:rPr>
-        <w:t>how cell error when sub job codes isn't valid for chosen type</w:t>
+        <w:t xml:space="preserve">how cell error when sub job codes </w:t>
+      </w:r>
+      <w:proofErr w:type="gramStart"/>
+      <w:r>
+        <w:rPr>
+          <w:lang w:val="en-US"/>
+        </w:rPr>
+        <w:t>isn't</w:t>
+      </w:r>
+      <w:proofErr w:type="gramEnd"/>
+      <w:r>
+        <w:rPr>
+          <w:lang w:val="en-US"/>
+        </w:rPr>
+        <w:t xml:space="preserve"> valid for chosen type</w:t>
       </w:r>
     </w:p>
     <w:p>
@@ -5118,7 +5198,21 @@
         <w:rPr>
           <w:lang w:val="en-US"/>
         </w:rPr>
-        <w:t xml:space="preserve">ixed an issue where committing to </w:t>
+        <w:t xml:space="preserve">ixed an issue </w:t>
+      </w:r>
+      <w:proofErr w:type="gramStart"/>
+      <w:r>
+        <w:rPr>
+          <w:lang w:val="en-US"/>
+        </w:rPr>
+        <w:t>where</w:t>
+      </w:r>
+      <w:proofErr w:type="gramEnd"/>
+      <w:r>
+        <w:rPr>
+          <w:lang w:val="en-US"/>
+        </w:rPr>
+        <w:t xml:space="preserve"> committing to </w:t>
       </w:r>
       <w:r>
         <w:rPr>
@@ -5940,7 +6034,21 @@
         <w:rPr>
           <w:lang w:val="en-US"/>
         </w:rPr>
-        <w:t>Added show variation name and approve units column</w:t>
+        <w:t xml:space="preserve">Added show variation name and approve </w:t>
+      </w:r>
+      <w:proofErr w:type="gramStart"/>
+      <w:r>
+        <w:rPr>
+          <w:lang w:val="en-US"/>
+        </w:rPr>
+        <w:t>units</w:t>
+      </w:r>
+      <w:proofErr w:type="gramEnd"/>
+      <w:r>
+        <w:rPr>
+          <w:lang w:val="en-US"/>
+        </w:rPr>
+        <w:t xml:space="preserve"> column</w:t>
       </w:r>
     </w:p>
     <w:p>
@@ -8045,6 +8153,118 @@
     </w:lvl>
   </w:abstractNum>
   <w:abstractNum w:abstractNumId="11" w15:restartNumberingAfterBreak="0">
+    <w:nsid w:val="19405101"/>
+    <w:multiLevelType w:val="hybridMultilevel"/>
+    <w:tmpl w:val="F126C8B0"/>
+    <w:lvl w:ilvl="0" w:tplc="1BA87DA0">
+      <w:numFmt w:val="bullet"/>
+      <w:lvlText w:val="-"/>
+      <w:lvlJc w:val="left"/>
+      <w:pPr>
+        <w:ind w:left="720" w:hanging="360"/>
+      </w:pPr>
+      <w:rPr>
+        <w:rFonts w:ascii="Calibri" w:eastAsiaTheme="minorEastAsia" w:hAnsi="Calibri" w:cs="Calibri" w:hint="default"/>
+      </w:rPr>
+    </w:lvl>
+    <w:lvl w:ilvl="1" w:tplc="44090003">
+      <w:start w:val="1"/>
+      <w:numFmt w:val="bullet"/>
+      <w:lvlText w:val="o"/>
+      <w:lvlJc w:val="left"/>
+      <w:pPr>
+        <w:ind w:left="1440" w:hanging="360"/>
+      </w:pPr>
+      <w:rPr>
+        <w:rFonts w:ascii="Courier New" w:hAnsi="Courier New" w:cs="Courier New" w:hint="default"/>
+      </w:rPr>
+    </w:lvl>
+    <w:lvl w:ilvl="2" w:tplc="44090005" w:tentative="1">
+      <w:start w:val="1"/>
+      <w:numFmt w:val="bullet"/>
+      <w:lvlText w:val=""/>
+      <w:lvlJc w:val="left"/>
+      <w:pPr>
+        <w:ind w:left="2160" w:hanging="360"/>
+      </w:pPr>
+      <w:rPr>
+        <w:rFonts w:ascii="Wingdings" w:hAnsi="Wingdings" w:hint="default"/>
+      </w:rPr>
+    </w:lvl>
+    <w:lvl w:ilvl="3" w:tplc="44090001" w:tentative="1">
+      <w:start w:val="1"/>
+      <w:numFmt w:val="bullet"/>
+      <w:lvlText w:val=""/>
+      <w:lvlJc w:val="left"/>
+      <w:pPr>
+        <w:ind w:left="2880" w:hanging="360"/>
+      </w:pPr>
+      <w:rPr>
+        <w:rFonts w:ascii="Symbol" w:hAnsi="Symbol" w:hint="default"/>
+      </w:rPr>
+    </w:lvl>
+    <w:lvl w:ilvl="4" w:tplc="44090003" w:tentative="1">
+      <w:start w:val="1"/>
+      <w:numFmt w:val="bullet"/>
+      <w:lvlText w:val="o"/>
+      <w:lvlJc w:val="left"/>
+      <w:pPr>
+        <w:ind w:left="3600" w:hanging="360"/>
+      </w:pPr>
+      <w:rPr>
+        <w:rFonts w:ascii="Courier New" w:hAnsi="Courier New" w:cs="Courier New" w:hint="default"/>
+      </w:rPr>
+    </w:lvl>
+    <w:lvl w:ilvl="5" w:tplc="44090005" w:tentative="1">
+      <w:start w:val="1"/>
+      <w:numFmt w:val="bullet"/>
+      <w:lvlText w:val=""/>
+      <w:lvlJc w:val="left"/>
+      <w:pPr>
+        <w:ind w:left="4320" w:hanging="360"/>
+      </w:pPr>
+      <w:rPr>
+        <w:rFonts w:ascii="Wingdings" w:hAnsi="Wingdings" w:hint="default"/>
+      </w:rPr>
+    </w:lvl>
+    <w:lvl w:ilvl="6" w:tplc="44090001" w:tentative="1">
+      <w:start w:val="1"/>
+      <w:numFmt w:val="bullet"/>
+      <w:lvlText w:val=""/>
+      <w:lvlJc w:val="left"/>
+      <w:pPr>
+        <w:ind w:left="5040" w:hanging="360"/>
+      </w:pPr>
+      <w:rPr>
+        <w:rFonts w:ascii="Symbol" w:hAnsi="Symbol" w:hint="default"/>
+      </w:rPr>
+    </w:lvl>
+    <w:lvl w:ilvl="7" w:tplc="44090003" w:tentative="1">
+      <w:start w:val="1"/>
+      <w:numFmt w:val="bullet"/>
+      <w:lvlText w:val="o"/>
+      <w:lvlJc w:val="left"/>
+      <w:pPr>
+        <w:ind w:left="5760" w:hanging="360"/>
+      </w:pPr>
+      <w:rPr>
+        <w:rFonts w:ascii="Courier New" w:hAnsi="Courier New" w:cs="Courier New" w:hint="default"/>
+      </w:rPr>
+    </w:lvl>
+    <w:lvl w:ilvl="8" w:tplc="44090005" w:tentative="1">
+      <w:start w:val="1"/>
+      <w:numFmt w:val="bullet"/>
+      <w:lvlText w:val=""/>
+      <w:lvlJc w:val="left"/>
+      <w:pPr>
+        <w:ind w:left="6480" w:hanging="360"/>
+      </w:pPr>
+      <w:rPr>
+        <w:rFonts w:ascii="Wingdings" w:hAnsi="Wingdings" w:hint="default"/>
+      </w:rPr>
+    </w:lvl>
+  </w:abstractNum>
+  <w:abstractNum w:abstractNumId="12" w15:restartNumberingAfterBreak="0">
     <w:nsid w:val="1DCB2786"/>
     <w:multiLevelType w:val="hybridMultilevel"/>
     <w:tmpl w:val="DA046A8A"/>
@@ -8156,7 +8376,7 @@
       </w:rPr>
     </w:lvl>
   </w:abstractNum>
-  <w:abstractNum w:abstractNumId="12" w15:restartNumberingAfterBreak="0">
+  <w:abstractNum w:abstractNumId="13" w15:restartNumberingAfterBreak="0">
     <w:nsid w:val="1E2528E1"/>
     <w:multiLevelType w:val="hybridMultilevel"/>
     <w:tmpl w:val="04B6187A"/>
@@ -8268,7 +8488,7 @@
       </w:rPr>
     </w:lvl>
   </w:abstractNum>
-  <w:abstractNum w:abstractNumId="13" w15:restartNumberingAfterBreak="0">
+  <w:abstractNum w:abstractNumId="14" w15:restartNumberingAfterBreak="0">
     <w:nsid w:val="1F4D0C5A"/>
     <w:multiLevelType w:val="hybridMultilevel"/>
     <w:tmpl w:val="58644CA6"/>
@@ -8380,7 +8600,7 @@
       </w:rPr>
     </w:lvl>
   </w:abstractNum>
-  <w:abstractNum w:abstractNumId="14" w15:restartNumberingAfterBreak="0">
+  <w:abstractNum w:abstractNumId="15" w15:restartNumberingAfterBreak="0">
     <w:nsid w:val="1FCD45E8"/>
     <w:multiLevelType w:val="hybridMultilevel"/>
     <w:tmpl w:val="F280A010"/>
@@ -8492,7 +8712,7 @@
       </w:rPr>
     </w:lvl>
   </w:abstractNum>
-  <w:abstractNum w:abstractNumId="15" w15:restartNumberingAfterBreak="0">
+  <w:abstractNum w:abstractNumId="16" w15:restartNumberingAfterBreak="0">
     <w:nsid w:val="21223E97"/>
     <w:multiLevelType w:val="hybridMultilevel"/>
     <w:tmpl w:val="68E6E128"/>
@@ -8604,7 +8824,7 @@
       </w:rPr>
     </w:lvl>
   </w:abstractNum>
-  <w:abstractNum w:abstractNumId="16" w15:restartNumberingAfterBreak="0">
+  <w:abstractNum w:abstractNumId="17" w15:restartNumberingAfterBreak="0">
     <w:nsid w:val="22E26764"/>
     <w:multiLevelType w:val="hybridMultilevel"/>
     <w:tmpl w:val="C518B74A"/>
@@ -8716,7 +8936,7 @@
       </w:rPr>
     </w:lvl>
   </w:abstractNum>
-  <w:abstractNum w:abstractNumId="17" w15:restartNumberingAfterBreak="0">
+  <w:abstractNum w:abstractNumId="18" w15:restartNumberingAfterBreak="0">
     <w:nsid w:val="24E10BB5"/>
     <w:multiLevelType w:val="hybridMultilevel"/>
     <w:tmpl w:val="F8FEBADA"/>
@@ -8828,7 +9048,7 @@
       </w:rPr>
     </w:lvl>
   </w:abstractNum>
-  <w:abstractNum w:abstractNumId="18" w15:restartNumberingAfterBreak="0">
+  <w:abstractNum w:abstractNumId="19" w15:restartNumberingAfterBreak="0">
     <w:nsid w:val="3A4E02DC"/>
     <w:multiLevelType w:val="hybridMultilevel"/>
     <w:tmpl w:val="410CCFF6"/>
@@ -8940,7 +9160,7 @@
       </w:rPr>
     </w:lvl>
   </w:abstractNum>
-  <w:abstractNum w:abstractNumId="19" w15:restartNumberingAfterBreak="0">
+  <w:abstractNum w:abstractNumId="20" w15:restartNumberingAfterBreak="0">
     <w:nsid w:val="3C704EE1"/>
     <w:multiLevelType w:val="hybridMultilevel"/>
     <w:tmpl w:val="41A6D382"/>
@@ -9052,7 +9272,7 @@
       </w:rPr>
     </w:lvl>
   </w:abstractNum>
-  <w:abstractNum w:abstractNumId="20" w15:restartNumberingAfterBreak="0">
+  <w:abstractNum w:abstractNumId="21" w15:restartNumberingAfterBreak="0">
     <w:nsid w:val="3E6B597B"/>
     <w:multiLevelType w:val="hybridMultilevel"/>
     <w:tmpl w:val="C0DAF682"/>
@@ -9164,7 +9384,7 @@
       </w:rPr>
     </w:lvl>
   </w:abstractNum>
-  <w:abstractNum w:abstractNumId="21" w15:restartNumberingAfterBreak="0">
+  <w:abstractNum w:abstractNumId="22" w15:restartNumberingAfterBreak="0">
     <w:nsid w:val="3F573A8E"/>
     <w:multiLevelType w:val="hybridMultilevel"/>
     <w:tmpl w:val="6C6CD2D4"/>
@@ -9276,7 +9496,7 @@
       </w:rPr>
     </w:lvl>
   </w:abstractNum>
-  <w:abstractNum w:abstractNumId="22" w15:restartNumberingAfterBreak="0">
+  <w:abstractNum w:abstractNumId="23" w15:restartNumberingAfterBreak="0">
     <w:nsid w:val="40720D0C"/>
     <w:multiLevelType w:val="hybridMultilevel"/>
     <w:tmpl w:val="A370A62A"/>
@@ -9388,7 +9608,7 @@
       </w:rPr>
     </w:lvl>
   </w:abstractNum>
-  <w:abstractNum w:abstractNumId="23" w15:restartNumberingAfterBreak="0">
+  <w:abstractNum w:abstractNumId="24" w15:restartNumberingAfterBreak="0">
     <w:nsid w:val="48B91C47"/>
     <w:multiLevelType w:val="hybridMultilevel"/>
     <w:tmpl w:val="56F693FA"/>
@@ -9500,7 +9720,7 @@
       </w:rPr>
     </w:lvl>
   </w:abstractNum>
-  <w:abstractNum w:abstractNumId="24" w15:restartNumberingAfterBreak="0">
+  <w:abstractNum w:abstractNumId="25" w15:restartNumberingAfterBreak="0">
     <w:nsid w:val="4A9D1EBF"/>
     <w:multiLevelType w:val="hybridMultilevel"/>
     <w:tmpl w:val="3DEACDCC"/>
@@ -9612,7 +9832,7 @@
       </w:rPr>
     </w:lvl>
   </w:abstractNum>
-  <w:abstractNum w:abstractNumId="25" w15:restartNumberingAfterBreak="0">
+  <w:abstractNum w:abstractNumId="26" w15:restartNumberingAfterBreak="0">
     <w:nsid w:val="52606647"/>
     <w:multiLevelType w:val="hybridMultilevel"/>
     <w:tmpl w:val="34FAD1A0"/>
@@ -9724,7 +9944,7 @@
       </w:rPr>
     </w:lvl>
   </w:abstractNum>
-  <w:abstractNum w:abstractNumId="26" w15:restartNumberingAfterBreak="0">
+  <w:abstractNum w:abstractNumId="27" w15:restartNumberingAfterBreak="0">
     <w:nsid w:val="557D5C95"/>
     <w:multiLevelType w:val="hybridMultilevel"/>
     <w:tmpl w:val="DC122E1C"/>
@@ -9836,7 +10056,7 @@
       </w:rPr>
     </w:lvl>
   </w:abstractNum>
-  <w:abstractNum w:abstractNumId="27" w15:restartNumberingAfterBreak="0">
+  <w:abstractNum w:abstractNumId="28" w15:restartNumberingAfterBreak="0">
     <w:nsid w:val="589D37B7"/>
     <w:multiLevelType w:val="hybridMultilevel"/>
     <w:tmpl w:val="9262429A"/>
@@ -9948,7 +10168,7 @@
       </w:rPr>
     </w:lvl>
   </w:abstractNum>
-  <w:abstractNum w:abstractNumId="28" w15:restartNumberingAfterBreak="0">
+  <w:abstractNum w:abstractNumId="29" w15:restartNumberingAfterBreak="0">
     <w:nsid w:val="58AA443D"/>
     <w:multiLevelType w:val="hybridMultilevel"/>
     <w:tmpl w:val="56F0D18E"/>
@@ -10061,7 +10281,7 @@
       </w:rPr>
     </w:lvl>
   </w:abstractNum>
-  <w:abstractNum w:abstractNumId="29" w15:restartNumberingAfterBreak="0">
+  <w:abstractNum w:abstractNumId="30" w15:restartNumberingAfterBreak="0">
     <w:nsid w:val="59EE4063"/>
     <w:multiLevelType w:val="hybridMultilevel"/>
     <w:tmpl w:val="0482313C"/>
@@ -10173,7 +10393,7 @@
       </w:rPr>
     </w:lvl>
   </w:abstractNum>
-  <w:abstractNum w:abstractNumId="30" w15:restartNumberingAfterBreak="0">
+  <w:abstractNum w:abstractNumId="31" w15:restartNumberingAfterBreak="0">
     <w:nsid w:val="5B4B0EE2"/>
     <w:multiLevelType w:val="hybridMultilevel"/>
     <w:tmpl w:val="E8129FD8"/>
@@ -10285,7 +10505,7 @@
       </w:rPr>
     </w:lvl>
   </w:abstractNum>
-  <w:abstractNum w:abstractNumId="31" w15:restartNumberingAfterBreak="0">
+  <w:abstractNum w:abstractNumId="32" w15:restartNumberingAfterBreak="0">
     <w:nsid w:val="5BF34BEE"/>
     <w:multiLevelType w:val="hybridMultilevel"/>
     <w:tmpl w:val="1D48A376"/>
@@ -10397,7 +10617,7 @@
       </w:rPr>
     </w:lvl>
   </w:abstractNum>
-  <w:abstractNum w:abstractNumId="32" w15:restartNumberingAfterBreak="0">
+  <w:abstractNum w:abstractNumId="33" w15:restartNumberingAfterBreak="0">
     <w:nsid w:val="5C8347BF"/>
     <w:multiLevelType w:val="hybridMultilevel"/>
     <w:tmpl w:val="D2F46B88"/>
@@ -10509,7 +10729,7 @@
       </w:rPr>
     </w:lvl>
   </w:abstractNum>
-  <w:abstractNum w:abstractNumId="33" w15:restartNumberingAfterBreak="0">
+  <w:abstractNum w:abstractNumId="34" w15:restartNumberingAfterBreak="0">
     <w:nsid w:val="61693A7A"/>
     <w:multiLevelType w:val="hybridMultilevel"/>
     <w:tmpl w:val="580AF2C6"/>
@@ -10622,7 +10842,7 @@
       </w:rPr>
     </w:lvl>
   </w:abstractNum>
-  <w:abstractNum w:abstractNumId="34" w15:restartNumberingAfterBreak="0">
+  <w:abstractNum w:abstractNumId="35" w15:restartNumberingAfterBreak="0">
     <w:nsid w:val="63C54BFA"/>
     <w:multiLevelType w:val="hybridMultilevel"/>
     <w:tmpl w:val="8122740C"/>
@@ -10734,7 +10954,7 @@
       </w:rPr>
     </w:lvl>
   </w:abstractNum>
-  <w:abstractNum w:abstractNumId="35" w15:restartNumberingAfterBreak="0">
+  <w:abstractNum w:abstractNumId="36" w15:restartNumberingAfterBreak="0">
     <w:nsid w:val="68735AD0"/>
     <w:multiLevelType w:val="hybridMultilevel"/>
     <w:tmpl w:val="4EDE05FA"/>
@@ -10846,7 +11066,7 @@
       </w:rPr>
     </w:lvl>
   </w:abstractNum>
-  <w:abstractNum w:abstractNumId="36" w15:restartNumberingAfterBreak="0">
+  <w:abstractNum w:abstractNumId="37" w15:restartNumberingAfterBreak="0">
     <w:nsid w:val="6A047A76"/>
     <w:multiLevelType w:val="hybridMultilevel"/>
     <w:tmpl w:val="50CADEB2"/>
@@ -10958,7 +11178,7 @@
       </w:rPr>
     </w:lvl>
   </w:abstractNum>
-  <w:abstractNum w:abstractNumId="37" w15:restartNumberingAfterBreak="0">
+  <w:abstractNum w:abstractNumId="38" w15:restartNumberingAfterBreak="0">
     <w:nsid w:val="6A3A0B6E"/>
     <w:multiLevelType w:val="hybridMultilevel"/>
     <w:tmpl w:val="759C482E"/>
@@ -11070,7 +11290,7 @@
       </w:rPr>
     </w:lvl>
   </w:abstractNum>
-  <w:abstractNum w:abstractNumId="38" w15:restartNumberingAfterBreak="0">
+  <w:abstractNum w:abstractNumId="39" w15:restartNumberingAfterBreak="0">
     <w:nsid w:val="6AC268F7"/>
     <w:multiLevelType w:val="hybridMultilevel"/>
     <w:tmpl w:val="12F21194"/>
@@ -11182,7 +11402,7 @@
       </w:rPr>
     </w:lvl>
   </w:abstractNum>
-  <w:abstractNum w:abstractNumId="39" w15:restartNumberingAfterBreak="0">
+  <w:abstractNum w:abstractNumId="40" w15:restartNumberingAfterBreak="0">
     <w:nsid w:val="6CE7392E"/>
     <w:multiLevelType w:val="hybridMultilevel"/>
     <w:tmpl w:val="2E2C9BDE"/>
@@ -11294,7 +11514,7 @@
       </w:rPr>
     </w:lvl>
   </w:abstractNum>
-  <w:abstractNum w:abstractNumId="40" w15:restartNumberingAfterBreak="0">
+  <w:abstractNum w:abstractNumId="41" w15:restartNumberingAfterBreak="0">
     <w:nsid w:val="6E3F3F9F"/>
     <w:multiLevelType w:val="hybridMultilevel"/>
     <w:tmpl w:val="A13CFC48"/>
@@ -11406,7 +11626,7 @@
       </w:rPr>
     </w:lvl>
   </w:abstractNum>
-  <w:abstractNum w:abstractNumId="41" w15:restartNumberingAfterBreak="0">
+  <w:abstractNum w:abstractNumId="42" w15:restartNumberingAfterBreak="0">
     <w:nsid w:val="74A1190D"/>
     <w:multiLevelType w:val="hybridMultilevel"/>
     <w:tmpl w:val="D5387ACA"/>
@@ -11518,7 +11738,7 @@
       </w:rPr>
     </w:lvl>
   </w:abstractNum>
-  <w:abstractNum w:abstractNumId="42" w15:restartNumberingAfterBreak="0">
+  <w:abstractNum w:abstractNumId="43" w15:restartNumberingAfterBreak="0">
     <w:nsid w:val="7E7D5380"/>
     <w:multiLevelType w:val="hybridMultilevel"/>
     <w:tmpl w:val="7668ED14"/>
@@ -11630,7 +11850,7 @@
       </w:rPr>
     </w:lvl>
   </w:abstractNum>
-  <w:abstractNum w:abstractNumId="43" w15:restartNumberingAfterBreak="0">
+  <w:abstractNum w:abstractNumId="44" w15:restartNumberingAfterBreak="0">
     <w:nsid w:val="7EAA14ED"/>
     <w:multiLevelType w:val="hybridMultilevel"/>
     <w:tmpl w:val="AF783BA4"/>
@@ -11742,7 +11962,7 @@
       </w:rPr>
     </w:lvl>
   </w:abstractNum>
-  <w:abstractNum w:abstractNumId="44" w15:restartNumberingAfterBreak="0">
+  <w:abstractNum w:abstractNumId="45" w15:restartNumberingAfterBreak="0">
     <w:nsid w:val="7FD565FA"/>
     <w:multiLevelType w:val="hybridMultilevel"/>
     <w:tmpl w:val="E5906ACC"/>
@@ -11858,31 +12078,31 @@
     <w:abstractNumId w:val="3"/>
   </w:num>
   <w:num w:numId="2">
-    <w:abstractNumId w:val="32"/>
+    <w:abstractNumId w:val="33"/>
   </w:num>
   <w:num w:numId="3">
+    <w:abstractNumId w:val="28"/>
+  </w:num>
+  <w:num w:numId="4">
+    <w:abstractNumId w:val="26"/>
+  </w:num>
+  <w:num w:numId="5">
+    <w:abstractNumId w:val="14"/>
+  </w:num>
+  <w:num w:numId="6">
     <w:abstractNumId w:val="27"/>
   </w:num>
-  <w:num w:numId="4">
-    <w:abstractNumId w:val="25"/>
-  </w:num>
-  <w:num w:numId="5">
-    <w:abstractNumId w:val="13"/>
-  </w:num>
-  <w:num w:numId="6">
-    <w:abstractNumId w:val="26"/>
-  </w:num>
   <w:num w:numId="7">
-    <w:abstractNumId w:val="28"/>
+    <w:abstractNumId w:val="29"/>
   </w:num>
   <w:num w:numId="8">
-    <w:abstractNumId w:val="38"/>
+    <w:abstractNumId w:val="39"/>
   </w:num>
   <w:num w:numId="9">
-    <w:abstractNumId w:val="11"/>
+    <w:abstractNumId w:val="12"/>
   </w:num>
   <w:num w:numId="10">
-    <w:abstractNumId w:val="15"/>
+    <w:abstractNumId w:val="16"/>
   </w:num>
   <w:num w:numId="11">
     <w:abstractNumId w:val="8"/>
@@ -11894,10 +12114,10 @@
     <w:abstractNumId w:val="2"/>
   </w:num>
   <w:num w:numId="14">
-    <w:abstractNumId w:val="36"/>
+    <w:abstractNumId w:val="37"/>
   </w:num>
   <w:num w:numId="15">
-    <w:abstractNumId w:val="39"/>
+    <w:abstractNumId w:val="40"/>
   </w:num>
   <w:num w:numId="16">
     <w:abstractNumId w:val="10"/>
@@ -11909,85 +12129,88 @@
     <w:abstractNumId w:val="5"/>
   </w:num>
   <w:num w:numId="19">
-    <w:abstractNumId w:val="30"/>
+    <w:abstractNumId w:val="31"/>
   </w:num>
   <w:num w:numId="20">
-    <w:abstractNumId w:val="24"/>
+    <w:abstractNumId w:val="25"/>
   </w:num>
   <w:num w:numId="21">
-    <w:abstractNumId w:val="12"/>
+    <w:abstractNumId w:val="13"/>
   </w:num>
   <w:num w:numId="22">
     <w:abstractNumId w:val="9"/>
   </w:num>
   <w:num w:numId="23">
-    <w:abstractNumId w:val="17"/>
+    <w:abstractNumId w:val="18"/>
   </w:num>
   <w:num w:numId="24">
-    <w:abstractNumId w:val="37"/>
+    <w:abstractNumId w:val="38"/>
   </w:num>
   <w:num w:numId="25">
-    <w:abstractNumId w:val="40"/>
+    <w:abstractNumId w:val="41"/>
   </w:num>
   <w:num w:numId="26">
-    <w:abstractNumId w:val="19"/>
+    <w:abstractNumId w:val="20"/>
   </w:num>
   <w:num w:numId="27">
-    <w:abstractNumId w:val="21"/>
+    <w:abstractNumId w:val="22"/>
   </w:num>
   <w:num w:numId="28">
-    <w:abstractNumId w:val="42"/>
+    <w:abstractNumId w:val="43"/>
   </w:num>
   <w:num w:numId="29">
-    <w:abstractNumId w:val="33"/>
+    <w:abstractNumId w:val="34"/>
   </w:num>
   <w:num w:numId="30">
     <w:abstractNumId w:val="4"/>
   </w:num>
   <w:num w:numId="31">
-    <w:abstractNumId w:val="20"/>
+    <w:abstractNumId w:val="21"/>
   </w:num>
   <w:num w:numId="32">
-    <w:abstractNumId w:val="14"/>
+    <w:abstractNumId w:val="15"/>
   </w:num>
   <w:num w:numId="33">
-    <w:abstractNumId w:val="34"/>
+    <w:abstractNumId w:val="35"/>
   </w:num>
   <w:num w:numId="34">
-    <w:abstractNumId w:val="31"/>
+    <w:abstractNumId w:val="32"/>
   </w:num>
   <w:num w:numId="35">
-    <w:abstractNumId w:val="43"/>
+    <w:abstractNumId w:val="44"/>
   </w:num>
   <w:num w:numId="36">
-    <w:abstractNumId w:val="22"/>
+    <w:abstractNumId w:val="23"/>
   </w:num>
   <w:num w:numId="37">
-    <w:abstractNumId w:val="41"/>
+    <w:abstractNumId w:val="42"/>
   </w:num>
   <w:num w:numId="38">
-    <w:abstractNumId w:val="44"/>
+    <w:abstractNumId w:val="45"/>
   </w:num>
   <w:num w:numId="39">
-    <w:abstractNumId w:val="16"/>
+    <w:abstractNumId w:val="17"/>
   </w:num>
   <w:num w:numId="40">
     <w:abstractNumId w:val="1"/>
   </w:num>
   <w:num w:numId="41">
-    <w:abstractNumId w:val="29"/>
+    <w:abstractNumId w:val="30"/>
   </w:num>
   <w:num w:numId="42">
-    <w:abstractNumId w:val="18"/>
+    <w:abstractNumId w:val="19"/>
   </w:num>
   <w:num w:numId="43">
-    <w:abstractNumId w:val="23"/>
+    <w:abstractNumId w:val="24"/>
   </w:num>
   <w:num w:numId="44">
     <w:abstractNumId w:val="7"/>
   </w:num>
   <w:num w:numId="45">
-    <w:abstractNumId w:val="35"/>
+    <w:abstractNumId w:val="36"/>
+  </w:num>
+  <w:num w:numId="46">
+    <w:abstractNumId w:val="11"/>
   </w:num>
   <w:numIdMacAtCleanup w:val="42"/>
 </w:numbering>

</xml_diff>

<commit_message>
- update data date actuals to retrieve from forecast
</commit_message>
<xml_diff>
--- a/BluePrints/Views/ChangeLog.docx
+++ b/BluePrints/Views/ChangeLog.docx
@@ -2,6 +2,126 @@
 <file path=word/document.xml><?xml version="1.0" encoding="utf-8"?>
 <w:document xmlns:wpc="http://schemas.microsoft.com/office/word/2010/wordprocessingCanvas" xmlns:cx="http://schemas.microsoft.com/office/drawing/2014/chartex" xmlns:cx1="http://schemas.microsoft.com/office/drawing/2015/9/8/chartex" xmlns:cx2="http://schemas.microsoft.com/office/drawing/2015/10/21/chartex" xmlns:cx3="http://schemas.microsoft.com/office/drawing/2016/5/9/chartex" xmlns:cx4="http://schemas.microsoft.com/office/drawing/2016/5/10/chartex" xmlns:cx5="http://schemas.microsoft.com/office/drawing/2016/5/11/chartex" xmlns:cx6="http://schemas.microsoft.com/office/drawing/2016/5/12/chartex" xmlns:cx7="http://schemas.microsoft.com/office/drawing/2016/5/13/chartex" xmlns:cx8="http://schemas.microsoft.com/office/drawing/2016/5/14/chartex" xmlns:mc="http://schemas.openxmlformats.org/markup-compatibility/2006" xmlns:aink="http://schemas.microsoft.com/office/drawing/2016/ink" xmlns:am3d="http://schemas.microsoft.com/office/drawing/2017/model3d" xmlns:o="urn:schemas-microsoft-com:office:office" xmlns:r="http://schemas.openxmlformats.org/officeDocument/2006/relationships" xmlns:m="http://schemas.openxmlformats.org/officeDocument/2006/math" xmlns:v="urn:schemas-microsoft-com:vml" xmlns:wp14="http://schemas.microsoft.com/office/word/2010/wordprocessingDrawing" xmlns:wp="http://schemas.openxmlformats.org/drawingml/2006/wordprocessingDrawing" xmlns:w10="urn:schemas-microsoft-com:office:word" xmlns:w="http://schemas.openxmlformats.org/wordprocessingml/2006/main" xmlns:w14="http://schemas.microsoft.com/office/word/2010/wordml" xmlns:w15="http://schemas.microsoft.com/office/word/2012/wordml" xmlns:w16cex="http://schemas.microsoft.com/office/word/2018/wordml/cex" xmlns:w16cid="http://schemas.microsoft.com/office/word/2016/wordml/cid" xmlns:w16="http://schemas.microsoft.com/office/word/2018/wordml" xmlns:w16sdtdh="http://schemas.microsoft.com/office/word/2020/wordml/sdtdatahash" xmlns:w16se="http://schemas.microsoft.com/office/word/2015/wordml/symex" xmlns:wpg="http://schemas.microsoft.com/office/word/2010/wordprocessingGroup" xmlns:wpi="http://schemas.microsoft.com/office/word/2010/wordprocessingInk" xmlns:wne="http://schemas.microsoft.com/office/word/2006/wordml" xmlns:wps="http://schemas.microsoft.com/office/word/2010/wordprocessingShape" mc:Ignorable="w14 w15 w16se w16cid w16 w16cex w16sdtdh wp14">
   <w:body>
+    <w:p>
+      <w:pPr>
+        <w:rPr>
+          <w:lang w:val="en-US"/>
+        </w:rPr>
+      </w:pPr>
+      <w:r>
+        <w:rPr>
+          <w:lang w:val="en-US"/>
+        </w:rPr>
+        <w:t>Change Log 26</w:t>
+      </w:r>
+      <w:r>
+        <w:rPr>
+          <w:vertAlign w:val="superscript"/>
+          <w:lang w:val="en-US"/>
+        </w:rPr>
+        <w:t>th</w:t>
+      </w:r>
+      <w:r>
+        <w:rPr>
+          <w:lang w:val="en-US"/>
+        </w:rPr>
+        <w:t xml:space="preserve"> April 2021</w:t>
+      </w:r>
+    </w:p>
+    <w:p>
+      <w:pPr>
+        <w:pStyle w:val="ListParagraph"/>
+        <w:numPr>
+          <w:ilvl w:val="0"/>
+          <w:numId w:val="51"/>
+        </w:numPr>
+        <w:rPr>
+          <w:lang w:val="en-US"/>
+        </w:rPr>
+      </w:pPr>
+      <w:r>
+        <w:rPr>
+          <w:lang w:val="en-US"/>
+        </w:rPr>
+        <w:t>Added ability to add comments in forecast</w:t>
+      </w:r>
+    </w:p>
+    <w:p>
+      <w:pPr>
+        <w:pStyle w:val="ListParagraph"/>
+        <w:rPr>
+          <w:lang w:val="en-US"/>
+        </w:rPr>
+      </w:pPr>
+      <w:r>
+        <w:rPr>
+          <w:noProof/>
+          <w:lang w:val="en-US"/>
+        </w:rPr>
+        <w:drawing>
+          <wp:inline distT="0" distB="0" distL="0" distR="0" wp14:anchorId="7D8FD570" wp14:editId="79ADD143">
+            <wp:extent cx="2139950" cy="2000250"/>
+            <wp:effectExtent l="0" t="0" r="0" b="0"/>
+            <wp:docPr id="49" name="Picture 49"/>
+            <wp:cNvGraphicFramePr>
+              <a:graphicFrameLocks xmlns:a="http://schemas.openxmlformats.org/drawingml/2006/main" noChangeAspect="1"/>
+            </wp:cNvGraphicFramePr>
+            <a:graphic xmlns:a="http://schemas.openxmlformats.org/drawingml/2006/main">
+              <a:graphicData uri="http://schemas.openxmlformats.org/drawingml/2006/picture">
+                <pic:pic xmlns:pic="http://schemas.openxmlformats.org/drawingml/2006/picture">
+                  <pic:nvPicPr>
+                    <pic:cNvPr id="0" name="Picture 2"/>
+                    <pic:cNvPicPr>
+                      <a:picLocks noChangeAspect="1" noChangeArrowheads="1"/>
+                    </pic:cNvPicPr>
+                  </pic:nvPicPr>
+                  <pic:blipFill>
+                    <a:blip r:embed="rId5">
+                      <a:extLst>
+                        <a:ext uri="{28A0092B-C50C-407E-A947-70E740481C1C}">
+                          <a14:useLocalDpi xmlns:a14="http://schemas.microsoft.com/office/drawing/2010/main" val="0"/>
+                        </a:ext>
+                      </a:extLst>
+                    </a:blip>
+                    <a:srcRect/>
+                    <a:stretch>
+                      <a:fillRect/>
+                    </a:stretch>
+                  </pic:blipFill>
+                  <pic:spPr bwMode="auto">
+                    <a:xfrm>
+                      <a:off x="0" y="0"/>
+                      <a:ext cx="2139950" cy="2000250"/>
+                    </a:xfrm>
+                    <a:prstGeom prst="rect">
+                      <a:avLst/>
+                    </a:prstGeom>
+                    <a:noFill/>
+                    <a:ln>
+                      <a:noFill/>
+                    </a:ln>
+                  </pic:spPr>
+                </pic:pic>
+              </a:graphicData>
+            </a:graphic>
+          </wp:inline>
+        </w:drawing>
+      </w:r>
+    </w:p>
+    <w:p>
+      <w:pPr>
+        <w:rPr>
+          <w:lang w:val="en-US"/>
+        </w:rPr>
+      </w:pPr>
+    </w:p>
+    <w:p>
+      <w:pPr>
+        <w:rPr>
+          <w:lang w:val="en-US"/>
+        </w:rPr>
+      </w:pPr>
+    </w:p>
     <w:p>
       <w:pPr>
         <w:rPr>
@@ -119,7 +239,7 @@
                     </pic:cNvPicPr>
                   </pic:nvPicPr>
                   <pic:blipFill>
-                    <a:blip r:embed="rId5">
+                    <a:blip r:embed="rId6">
                       <a:extLst>
                         <a:ext uri="{28A0092B-C50C-407E-A947-70E740481C1C}">
                           <a14:useLocalDpi xmlns:a14="http://schemas.microsoft.com/office/drawing/2010/main" val="0"/>
@@ -200,7 +320,7 @@
                     </pic:cNvPicPr>
                   </pic:nvPicPr>
                   <pic:blipFill>
-                    <a:blip r:embed="rId6">
+                    <a:blip r:embed="rId7">
                       <a:extLst>
                         <a:ext uri="{28A0092B-C50C-407E-A947-70E740481C1C}">
                           <a14:useLocalDpi xmlns:a14="http://schemas.microsoft.com/office/drawing/2010/main" val="0"/>
@@ -287,6 +407,7 @@
           <w:noProof/>
           <w:lang w:val="en-US"/>
         </w:rPr>
+        <w:lastRenderedPageBreak/>
         <w:drawing>
           <wp:inline distT="0" distB="0" distL="0" distR="0" wp14:anchorId="3A05851A" wp14:editId="33982B56">
             <wp:extent cx="5721350" cy="933450"/>
@@ -305,7 +426,7 @@
                     </pic:cNvPicPr>
                   </pic:nvPicPr>
                   <pic:blipFill>
-                    <a:blip r:embed="rId7" cstate="print">
+                    <a:blip r:embed="rId8" cstate="print">
                       <a:extLst>
                         <a:ext uri="{28A0092B-C50C-407E-A947-70E740481C1C}">
                           <a14:useLocalDpi xmlns:a14="http://schemas.microsoft.com/office/drawing/2010/main" val="0"/>
@@ -444,7 +565,7 @@
                     </pic:cNvPicPr>
                   </pic:nvPicPr>
                   <pic:blipFill>
-                    <a:blip r:embed="rId8">
+                    <a:blip r:embed="rId9">
                       <a:extLst>
                         <a:ext uri="{28A0092B-C50C-407E-A947-70E740481C1C}">
                           <a14:useLocalDpi xmlns:a14="http://schemas.microsoft.com/office/drawing/2010/main" val="0"/>
@@ -534,7 +655,7 @@
                     </pic:cNvPicPr>
                   </pic:nvPicPr>
                   <pic:blipFill>
-                    <a:blip r:embed="rId9" cstate="print">
+                    <a:blip r:embed="rId10" cstate="print">
                       <a:extLst>
                         <a:ext uri="{28A0092B-C50C-407E-A947-70E740481C1C}">
                           <a14:useLocalDpi xmlns:a14="http://schemas.microsoft.com/office/drawing/2010/main" val="0"/>
@@ -642,7 +763,7 @@
                     </pic:cNvPicPr>
                   </pic:nvPicPr>
                   <pic:blipFill>
-                    <a:blip r:embed="rId10">
+                    <a:blip r:embed="rId11">
                       <a:extLst>
                         <a:ext uri="{28A0092B-C50C-407E-A947-70E740481C1C}">
                           <a14:useLocalDpi xmlns:a14="http://schemas.microsoft.com/office/drawing/2010/main" val="0"/>
@@ -714,7 +835,7 @@
                     </pic:cNvPicPr>
                   </pic:nvPicPr>
                   <pic:blipFill>
-                    <a:blip r:embed="rId11">
+                    <a:blip r:embed="rId12">
                       <a:extLst>
                         <a:ext uri="{28A0092B-C50C-407E-A947-70E740481C1C}">
                           <a14:useLocalDpi xmlns:a14="http://schemas.microsoft.com/office/drawing/2010/main" val="0"/>
@@ -846,7 +967,7 @@
                     </pic:cNvPicPr>
                   </pic:nvPicPr>
                   <pic:blipFill>
-                    <a:blip r:embed="rId12">
+                    <a:blip r:embed="rId13">
                       <a:extLst>
                         <a:ext uri="{28A0092B-C50C-407E-A947-70E740481C1C}">
                           <a14:useLocalDpi xmlns:a14="http://schemas.microsoft.com/office/drawing/2010/main" val="0"/>
@@ -945,7 +1066,7 @@
                     </pic:cNvPicPr>
                   </pic:nvPicPr>
                   <pic:blipFill>
-                    <a:blip r:embed="rId13">
+                    <a:blip r:embed="rId14">
                       <a:extLst>
                         <a:ext uri="{28A0092B-C50C-407E-A947-70E740481C1C}">
                           <a14:useLocalDpi xmlns:a14="http://schemas.microsoft.com/office/drawing/2010/main" val="0"/>
@@ -1084,7 +1205,7 @@
                     </pic:cNvPicPr>
                   </pic:nvPicPr>
                   <pic:blipFill>
-                    <a:blip r:embed="rId14" cstate="print">
+                    <a:blip r:embed="rId15" cstate="print">
                       <a:extLst>
                         <a:ext uri="{28A0092B-C50C-407E-A947-70E740481C1C}">
                           <a14:useLocalDpi xmlns:a14="http://schemas.microsoft.com/office/drawing/2010/main" val="0"/>
@@ -1186,7 +1307,7 @@
                     </pic:cNvPicPr>
                   </pic:nvPicPr>
                   <pic:blipFill>
-                    <a:blip r:embed="rId15">
+                    <a:blip r:embed="rId16">
                       <a:extLst>
                         <a:ext uri="{28A0092B-C50C-407E-A947-70E740481C1C}">
                           <a14:useLocalDpi xmlns:a14="http://schemas.microsoft.com/office/drawing/2010/main" val="0"/>
@@ -1303,7 +1424,7 @@
           <w:lang w:val="en-US"/>
         </w:rPr>
       </w:pPr>
-      <w:hyperlink r:id="rId16" w:history="1">
+      <w:hyperlink r:id="rId17" w:history="1">
         <w:r>
           <w:rPr>
             <w:rStyle w:val="Hyperlink"/>
@@ -1492,7 +1613,7 @@
                     </pic:cNvPicPr>
                   </pic:nvPicPr>
                   <pic:blipFill>
-                    <a:blip r:embed="rId17">
+                    <a:blip r:embed="rId18">
                       <a:extLst>
                         <a:ext uri="{28A0092B-C50C-407E-A947-70E740481C1C}">
                           <a14:useLocalDpi xmlns:a14="http://schemas.microsoft.com/office/drawing/2010/main" val="0"/>
@@ -1624,7 +1745,7 @@
                     </pic:cNvPicPr>
                   </pic:nvPicPr>
                   <pic:blipFill>
-                    <a:blip r:embed="rId18" cstate="print">
+                    <a:blip r:embed="rId19" cstate="print">
                       <a:extLst>
                         <a:ext uri="{28A0092B-C50C-407E-A947-70E740481C1C}">
                           <a14:useLocalDpi xmlns:a14="http://schemas.microsoft.com/office/drawing/2010/main" val="0"/>
@@ -1734,7 +1855,7 @@
                     </pic:cNvPicPr>
                   </pic:nvPicPr>
                   <pic:blipFill>
-                    <a:blip r:embed="rId19">
+                    <a:blip r:embed="rId20">
                       <a:extLst>
                         <a:ext uri="{28A0092B-C50C-407E-A947-70E740481C1C}">
                           <a14:useLocalDpi xmlns:a14="http://schemas.microsoft.com/office/drawing/2010/main" val="0"/>
@@ -1879,7 +2000,7 @@
                     </pic:cNvPicPr>
                   </pic:nvPicPr>
                   <pic:blipFill>
-                    <a:blip r:embed="rId20" cstate="print">
+                    <a:blip r:embed="rId21" cstate="print">
                       <a:extLst>
                         <a:ext uri="{28A0092B-C50C-407E-A947-70E740481C1C}">
                           <a14:useLocalDpi xmlns:a14="http://schemas.microsoft.com/office/drawing/2010/main" val="0"/>
@@ -2047,7 +2168,7 @@
                     </pic:cNvPicPr>
                   </pic:nvPicPr>
                   <pic:blipFill>
-                    <a:blip r:embed="rId21">
+                    <a:blip r:embed="rId22">
                       <a:extLst>
                         <a:ext uri="{28A0092B-C50C-407E-A947-70E740481C1C}">
                           <a14:useLocalDpi xmlns:a14="http://schemas.microsoft.com/office/drawing/2010/main" val="0"/>
@@ -2131,7 +2252,7 @@
                     </pic:cNvPicPr>
                   </pic:nvPicPr>
                   <pic:blipFill>
-                    <a:blip r:embed="rId22">
+                    <a:blip r:embed="rId23">
                       <a:extLst>
                         <a:ext uri="{28A0092B-C50C-407E-A947-70E740481C1C}">
                           <a14:useLocalDpi xmlns:a14="http://schemas.microsoft.com/office/drawing/2010/main" val="0"/>
@@ -2238,7 +2359,7 @@
                     </pic:cNvPicPr>
                   </pic:nvPicPr>
                   <pic:blipFill>
-                    <a:blip r:embed="rId23" cstate="print">
+                    <a:blip r:embed="rId24" cstate="print">
                       <a:extLst>
                         <a:ext uri="{28A0092B-C50C-407E-A947-70E740481C1C}">
                           <a14:useLocalDpi xmlns:a14="http://schemas.microsoft.com/office/drawing/2010/main" val="0"/>
@@ -2437,7 +2558,7 @@
                     </pic:cNvPicPr>
                   </pic:nvPicPr>
                   <pic:blipFill>
-                    <a:blip r:embed="rId24" cstate="print">
+                    <a:blip r:embed="rId25" cstate="print">
                       <a:extLst>
                         <a:ext uri="{28A0092B-C50C-407E-A947-70E740481C1C}">
                           <a14:useLocalDpi xmlns:a14="http://schemas.microsoft.com/office/drawing/2010/main" val="0"/>
@@ -2562,7 +2683,7 @@
                     </pic:cNvPicPr>
                   </pic:nvPicPr>
                   <pic:blipFill>
-                    <a:blip r:embed="rId25" cstate="print">
+                    <a:blip r:embed="rId26" cstate="print">
                       <a:extLst>
                         <a:ext uri="{28A0092B-C50C-407E-A947-70E740481C1C}">
                           <a14:useLocalDpi xmlns:a14="http://schemas.microsoft.com/office/drawing/2010/main" val="0"/>
@@ -2701,7 +2822,7 @@
                     </pic:cNvPicPr>
                   </pic:nvPicPr>
                   <pic:blipFill>
-                    <a:blip r:embed="rId26" cstate="print">
+                    <a:blip r:embed="rId27" cstate="print">
                       <a:extLst>
                         <a:ext uri="{28A0092B-C50C-407E-A947-70E740481C1C}">
                           <a14:useLocalDpi xmlns:a14="http://schemas.microsoft.com/office/drawing/2010/main" val="0"/>
@@ -2800,7 +2921,7 @@
                     </pic:cNvPicPr>
                   </pic:nvPicPr>
                   <pic:blipFill>
-                    <a:blip r:embed="rId27" cstate="print">
+                    <a:blip r:embed="rId28" cstate="print">
                       <a:extLst>
                         <a:ext uri="{28A0092B-C50C-407E-A947-70E740481C1C}">
                           <a14:useLocalDpi xmlns:a14="http://schemas.microsoft.com/office/drawing/2010/main" val="0"/>
@@ -2906,7 +3027,7 @@
                     </pic:cNvPicPr>
                   </pic:nvPicPr>
                   <pic:blipFill>
-                    <a:blip r:embed="rId28" cstate="print">
+                    <a:blip r:embed="rId29" cstate="print">
                       <a:extLst>
                         <a:ext uri="{28A0092B-C50C-407E-A947-70E740481C1C}">
                           <a14:useLocalDpi xmlns:a14="http://schemas.microsoft.com/office/drawing/2010/main" val="0"/>
@@ -3013,7 +3134,7 @@
                     </pic:cNvPicPr>
                   </pic:nvPicPr>
                   <pic:blipFill>
-                    <a:blip r:embed="rId29">
+                    <a:blip r:embed="rId30">
                       <a:extLst>
                         <a:ext uri="{28A0092B-C50C-407E-A947-70E740481C1C}">
                           <a14:useLocalDpi xmlns:a14="http://schemas.microsoft.com/office/drawing/2010/main" val="0"/>
@@ -3185,7 +3306,7 @@
                     </pic:cNvPicPr>
                   </pic:nvPicPr>
                   <pic:blipFill>
-                    <a:blip r:embed="rId30">
+                    <a:blip r:embed="rId31">
                       <a:extLst>
                         <a:ext uri="{28A0092B-C50C-407E-A947-70E740481C1C}">
                           <a14:useLocalDpi xmlns:a14="http://schemas.microsoft.com/office/drawing/2010/main" val="0"/>
@@ -3253,7 +3374,7 @@
                     </pic:cNvPicPr>
                   </pic:nvPicPr>
                   <pic:blipFill>
-                    <a:blip r:embed="rId31">
+                    <a:blip r:embed="rId32">
                       <a:extLst>
                         <a:ext uri="{28A0092B-C50C-407E-A947-70E740481C1C}">
                           <a14:useLocalDpi xmlns:a14="http://schemas.microsoft.com/office/drawing/2010/main" val="0"/>
@@ -3451,7 +3572,7 @@
                     </pic:cNvPicPr>
                   </pic:nvPicPr>
                   <pic:blipFill>
-                    <a:blip r:embed="rId32">
+                    <a:blip r:embed="rId33">
                       <a:extLst>
                         <a:ext uri="{28A0092B-C50C-407E-A947-70E740481C1C}">
                           <a14:useLocalDpi xmlns:a14="http://schemas.microsoft.com/office/drawing/2010/main" val="0"/>
@@ -3549,7 +3670,7 @@
                     </pic:cNvPicPr>
                   </pic:nvPicPr>
                   <pic:blipFill>
-                    <a:blip r:embed="rId33">
+                    <a:blip r:embed="rId34">
                       <a:extLst>
                         <a:ext uri="{28A0092B-C50C-407E-A947-70E740481C1C}">
                           <a14:useLocalDpi xmlns:a14="http://schemas.microsoft.com/office/drawing/2010/main" val="0"/>
@@ -3723,7 +3844,7 @@
                     </pic:cNvPicPr>
                   </pic:nvPicPr>
                   <pic:blipFill>
-                    <a:blip r:embed="rId34">
+                    <a:blip r:embed="rId35">
                       <a:extLst>
                         <a:ext uri="{28A0092B-C50C-407E-A947-70E740481C1C}">
                           <a14:useLocalDpi xmlns:a14="http://schemas.microsoft.com/office/drawing/2010/main" val="0"/>
@@ -3831,7 +3952,7 @@
                     </pic:cNvPicPr>
                   </pic:nvPicPr>
                   <pic:blipFill>
-                    <a:blip r:embed="rId35">
+                    <a:blip r:embed="rId36">
                       <a:extLst>
                         <a:ext uri="{28A0092B-C50C-407E-A947-70E740481C1C}">
                           <a14:useLocalDpi xmlns:a14="http://schemas.microsoft.com/office/drawing/2010/main" val="0"/>
@@ -3951,7 +4072,7 @@
                     </pic:cNvPicPr>
                   </pic:nvPicPr>
                   <pic:blipFill>
-                    <a:blip r:embed="rId36">
+                    <a:blip r:embed="rId37">
                       <a:extLst>
                         <a:ext uri="{28A0092B-C50C-407E-A947-70E740481C1C}">
                           <a14:useLocalDpi xmlns:a14="http://schemas.microsoft.com/office/drawing/2010/main" val="0"/>
@@ -4012,7 +4133,7 @@
                     </pic:cNvPicPr>
                   </pic:nvPicPr>
                   <pic:blipFill>
-                    <a:blip r:embed="rId37">
+                    <a:blip r:embed="rId38">
                       <a:extLst>
                         <a:ext uri="{28A0092B-C50C-407E-A947-70E740481C1C}">
                           <a14:useLocalDpi xmlns:a14="http://schemas.microsoft.com/office/drawing/2010/main" val="0"/>
@@ -4112,7 +4233,7 @@
                     </pic:cNvPicPr>
                   </pic:nvPicPr>
                   <pic:blipFill>
-                    <a:blip r:embed="rId38">
+                    <a:blip r:embed="rId39">
                       <a:extLst>
                         <a:ext uri="{28A0092B-C50C-407E-A947-70E740481C1C}">
                           <a14:useLocalDpi xmlns:a14="http://schemas.microsoft.com/office/drawing/2010/main" val="0"/>
@@ -4249,7 +4370,7 @@
                     </pic:cNvPicPr>
                   </pic:nvPicPr>
                   <pic:blipFill>
-                    <a:blip r:embed="rId39" cstate="print">
+                    <a:blip r:embed="rId40" cstate="print">
                       <a:extLst>
                         <a:ext uri="{28A0092B-C50C-407E-A947-70E740481C1C}">
                           <a14:useLocalDpi xmlns:a14="http://schemas.microsoft.com/office/drawing/2010/main" val="0"/>
@@ -4328,7 +4449,7 @@
                     </pic:cNvPicPr>
                   </pic:nvPicPr>
                   <pic:blipFill>
-                    <a:blip r:embed="rId40">
+                    <a:blip r:embed="rId41">
                       <a:extLst>
                         <a:ext uri="{28A0092B-C50C-407E-A947-70E740481C1C}">
                           <a14:useLocalDpi xmlns:a14="http://schemas.microsoft.com/office/drawing/2010/main" val="0"/>
@@ -4449,177 +4570,6 @@
                 <pic:pic xmlns:pic="http://schemas.openxmlformats.org/drawingml/2006/picture">
                   <pic:nvPicPr>
                     <pic:cNvPr id="0" name="Picture 1"/>
-                    <pic:cNvPicPr>
-                      <a:picLocks noChangeAspect="1" noChangeArrowheads="1"/>
-                    </pic:cNvPicPr>
-                  </pic:nvPicPr>
-                  <pic:blipFill>
-                    <a:blip r:embed="rId41">
-                      <a:extLst>
-                        <a:ext uri="{28A0092B-C50C-407E-A947-70E740481C1C}">
-                          <a14:useLocalDpi xmlns:a14="http://schemas.microsoft.com/office/drawing/2010/main" val="0"/>
-                        </a:ext>
-                      </a:extLst>
-                    </a:blip>
-                    <a:srcRect/>
-                    <a:stretch>
-                      <a:fillRect/>
-                    </a:stretch>
-                  </pic:blipFill>
-                  <pic:spPr bwMode="auto">
-                    <a:xfrm>
-                      <a:off x="0" y="0"/>
-                      <a:ext cx="5730875" cy="3870325"/>
-                    </a:xfrm>
-                    <a:prstGeom prst="rect">
-                      <a:avLst/>
-                    </a:prstGeom>
-                    <a:noFill/>
-                    <a:ln>
-                      <a:noFill/>
-                    </a:ln>
-                  </pic:spPr>
-                </pic:pic>
-              </a:graphicData>
-            </a:graphic>
-          </wp:inline>
-        </w:drawing>
-      </w:r>
-    </w:p>
-    <w:p>
-      <w:pPr>
-        <w:ind w:left="1440"/>
-        <w:rPr>
-          <w:lang w:val="en-US"/>
-        </w:rPr>
-      </w:pPr>
-      <w:r>
-        <w:rPr>
-          <w:lang w:val="en-US"/>
-        </w:rPr>
-        <w:t>In this instance, deliverable have 100 total hours and 50 hours already earned, but variation defines a 75 hours reduction, two options are available during approval</w:t>
-      </w:r>
-    </w:p>
-    <w:p>
-      <w:pPr>
-        <w:pStyle w:val="ListParagraph"/>
-        <w:numPr>
-          <w:ilvl w:val="2"/>
-          <w:numId w:val="28"/>
-        </w:numPr>
-        <w:rPr>
-          <w:lang w:val="en-US"/>
-        </w:rPr>
-      </w:pPr>
-      <w:r>
-        <w:rPr>
-          <w:lang w:val="en-US"/>
-        </w:rPr>
-        <w:t>Reduce earned hours ticked – Earned units will be reduced to 25 so that 75 hours reduction can be applied</w:t>
-      </w:r>
-    </w:p>
-    <w:p>
-      <w:pPr>
-        <w:pStyle w:val="ListParagraph"/>
-        <w:numPr>
-          <w:ilvl w:val="2"/>
-          <w:numId w:val="28"/>
-        </w:numPr>
-        <w:rPr>
-          <w:lang w:val="en-US"/>
-        </w:rPr>
-      </w:pPr>
-      <w:r>
-        <w:rPr>
-          <w:lang w:val="en-US"/>
-        </w:rPr>
-        <w:t>Reduce earned hours not ticked – Variation hours will be changed to 50 hours reduction instead of 75, as defined by maximum reducible units column</w:t>
-      </w:r>
-    </w:p>
-    <w:p>
-      <w:pPr>
-        <w:rPr>
-          <w:lang w:val="en-US"/>
-        </w:rPr>
-      </w:pPr>
-      <w:r>
-        <w:rPr>
-          <w:lang w:val="en-US"/>
-        </w:rPr>
-        <w:br w:type="page"/>
-      </w:r>
-    </w:p>
-    <w:p>
-      <w:pPr>
-        <w:rPr>
-          <w:lang w:val="en-US"/>
-        </w:rPr>
-      </w:pPr>
-      <w:r>
-        <w:rPr>
-          <w:lang w:val="en-US"/>
-        </w:rPr>
-        <w:lastRenderedPageBreak/>
-        <w:t>Cont. Change Log 8</w:t>
-      </w:r>
-      <w:r>
-        <w:rPr>
-          <w:vertAlign w:val="superscript"/>
-          <w:lang w:val="en-US"/>
-        </w:rPr>
-        <w:t>th</w:t>
-      </w:r>
-      <w:r>
-        <w:rPr>
-          <w:lang w:val="en-US"/>
-        </w:rPr>
-        <w:t xml:space="preserve"> Feb 2021</w:t>
-      </w:r>
-    </w:p>
-    <w:p>
-      <w:pPr>
-        <w:pStyle w:val="ListParagraph"/>
-        <w:numPr>
-          <w:ilvl w:val="1"/>
-          <w:numId w:val="28"/>
-        </w:numPr>
-        <w:rPr>
-          <w:lang w:val="en-US"/>
-        </w:rPr>
-      </w:pPr>
-      <w:r>
-        <w:rPr>
-          <w:lang w:val="en-US"/>
-        </w:rPr>
-        <w:t>Added ability to reduce earned units when variations are unapproved</w:t>
-      </w:r>
-    </w:p>
-    <w:p>
-      <w:pPr>
-        <w:pStyle w:val="ListParagraph"/>
-        <w:ind w:left="1440"/>
-        <w:rPr>
-          <w:lang w:val="en-US"/>
-        </w:rPr>
-      </w:pPr>
-      <w:r>
-        <w:rPr>
-          <w:noProof/>
-          <w:lang w:val="en-US"/>
-        </w:rPr>
-        <w:drawing>
-          <wp:inline distT="0" distB="0" distL="0" distR="0" wp14:anchorId="2674E29E" wp14:editId="0A9EBCC1">
-            <wp:extent cx="5730875" cy="3870325"/>
-            <wp:effectExtent l="0" t="0" r="3175" b="0"/>
-            <wp:docPr id="11" name="Picture 11"/>
-            <wp:cNvGraphicFramePr>
-              <a:graphicFrameLocks xmlns:a="http://schemas.openxmlformats.org/drawingml/2006/main" noChangeAspect="1"/>
-            </wp:cNvGraphicFramePr>
-            <a:graphic xmlns:a="http://schemas.openxmlformats.org/drawingml/2006/main">
-              <a:graphicData uri="http://schemas.openxmlformats.org/drawingml/2006/picture">
-                <pic:pic xmlns:pic="http://schemas.openxmlformats.org/drawingml/2006/picture">
-                  <pic:nvPicPr>
-                    <pic:cNvPr id="0" name="Picture 2"/>
                     <pic:cNvPicPr>
                       <a:picLocks noChangeAspect="1" noChangeArrowheads="1"/>
                     </pic:cNvPicPr>
@@ -4659,6 +4609,177 @@
     </w:p>
     <w:p>
       <w:pPr>
+        <w:ind w:left="1440"/>
+        <w:rPr>
+          <w:lang w:val="en-US"/>
+        </w:rPr>
+      </w:pPr>
+      <w:r>
+        <w:rPr>
+          <w:lang w:val="en-US"/>
+        </w:rPr>
+        <w:t>In this instance, deliverable have 100 total hours and 50 hours already earned, but variation defines a 75 hours reduction, two options are available during approval</w:t>
+      </w:r>
+    </w:p>
+    <w:p>
+      <w:pPr>
+        <w:pStyle w:val="ListParagraph"/>
+        <w:numPr>
+          <w:ilvl w:val="2"/>
+          <w:numId w:val="28"/>
+        </w:numPr>
+        <w:rPr>
+          <w:lang w:val="en-US"/>
+        </w:rPr>
+      </w:pPr>
+      <w:r>
+        <w:rPr>
+          <w:lang w:val="en-US"/>
+        </w:rPr>
+        <w:t>Reduce earned hours ticked – Earned units will be reduced to 25 so that 75 hours reduction can be applied</w:t>
+      </w:r>
+    </w:p>
+    <w:p>
+      <w:pPr>
+        <w:pStyle w:val="ListParagraph"/>
+        <w:numPr>
+          <w:ilvl w:val="2"/>
+          <w:numId w:val="28"/>
+        </w:numPr>
+        <w:rPr>
+          <w:lang w:val="en-US"/>
+        </w:rPr>
+      </w:pPr>
+      <w:r>
+        <w:rPr>
+          <w:lang w:val="en-US"/>
+        </w:rPr>
+        <w:t>Reduce earned hours not ticked – Variation hours will be changed to 50 hours reduction instead of 75, as defined by maximum reducible units column</w:t>
+      </w:r>
+    </w:p>
+    <w:p>
+      <w:pPr>
+        <w:rPr>
+          <w:lang w:val="en-US"/>
+        </w:rPr>
+      </w:pPr>
+      <w:r>
+        <w:rPr>
+          <w:lang w:val="en-US"/>
+        </w:rPr>
+        <w:br w:type="page"/>
+      </w:r>
+    </w:p>
+    <w:p>
+      <w:pPr>
+        <w:rPr>
+          <w:lang w:val="en-US"/>
+        </w:rPr>
+      </w:pPr>
+      <w:r>
+        <w:rPr>
+          <w:lang w:val="en-US"/>
+        </w:rPr>
+        <w:lastRenderedPageBreak/>
+        <w:t>Cont. Change Log 8</w:t>
+      </w:r>
+      <w:r>
+        <w:rPr>
+          <w:vertAlign w:val="superscript"/>
+          <w:lang w:val="en-US"/>
+        </w:rPr>
+        <w:t>th</w:t>
+      </w:r>
+      <w:r>
+        <w:rPr>
+          <w:lang w:val="en-US"/>
+        </w:rPr>
+        <w:t xml:space="preserve"> Feb 2021</w:t>
+      </w:r>
+    </w:p>
+    <w:p>
+      <w:pPr>
+        <w:pStyle w:val="ListParagraph"/>
+        <w:numPr>
+          <w:ilvl w:val="1"/>
+          <w:numId w:val="28"/>
+        </w:numPr>
+        <w:rPr>
+          <w:lang w:val="en-US"/>
+        </w:rPr>
+      </w:pPr>
+      <w:r>
+        <w:rPr>
+          <w:lang w:val="en-US"/>
+        </w:rPr>
+        <w:t>Added ability to reduce earned units when variations are unapproved</w:t>
+      </w:r>
+    </w:p>
+    <w:p>
+      <w:pPr>
+        <w:pStyle w:val="ListParagraph"/>
+        <w:ind w:left="1440"/>
+        <w:rPr>
+          <w:lang w:val="en-US"/>
+        </w:rPr>
+      </w:pPr>
+      <w:r>
+        <w:rPr>
+          <w:noProof/>
+          <w:lang w:val="en-US"/>
+        </w:rPr>
+        <w:drawing>
+          <wp:inline distT="0" distB="0" distL="0" distR="0" wp14:anchorId="2674E29E" wp14:editId="0A9EBCC1">
+            <wp:extent cx="5730875" cy="3870325"/>
+            <wp:effectExtent l="0" t="0" r="3175" b="0"/>
+            <wp:docPr id="11" name="Picture 11"/>
+            <wp:cNvGraphicFramePr>
+              <a:graphicFrameLocks xmlns:a="http://schemas.openxmlformats.org/drawingml/2006/main" noChangeAspect="1"/>
+            </wp:cNvGraphicFramePr>
+            <a:graphic xmlns:a="http://schemas.openxmlformats.org/drawingml/2006/main">
+              <a:graphicData uri="http://schemas.openxmlformats.org/drawingml/2006/picture">
+                <pic:pic xmlns:pic="http://schemas.openxmlformats.org/drawingml/2006/picture">
+                  <pic:nvPicPr>
+                    <pic:cNvPr id="0" name="Picture 2"/>
+                    <pic:cNvPicPr>
+                      <a:picLocks noChangeAspect="1" noChangeArrowheads="1"/>
+                    </pic:cNvPicPr>
+                  </pic:nvPicPr>
+                  <pic:blipFill>
+                    <a:blip r:embed="rId43">
+                      <a:extLst>
+                        <a:ext uri="{28A0092B-C50C-407E-A947-70E740481C1C}">
+                          <a14:useLocalDpi xmlns:a14="http://schemas.microsoft.com/office/drawing/2010/main" val="0"/>
+                        </a:ext>
+                      </a:extLst>
+                    </a:blip>
+                    <a:srcRect/>
+                    <a:stretch>
+                      <a:fillRect/>
+                    </a:stretch>
+                  </pic:blipFill>
+                  <pic:spPr bwMode="auto">
+                    <a:xfrm>
+                      <a:off x="0" y="0"/>
+                      <a:ext cx="5730875" cy="3870325"/>
+                    </a:xfrm>
+                    <a:prstGeom prst="rect">
+                      <a:avLst/>
+                    </a:prstGeom>
+                    <a:noFill/>
+                    <a:ln>
+                      <a:noFill/>
+                    </a:ln>
+                  </pic:spPr>
+                </pic:pic>
+              </a:graphicData>
+            </a:graphic>
+          </wp:inline>
+        </w:drawing>
+      </w:r>
+    </w:p>
+    <w:p>
+      <w:pPr>
         <w:pStyle w:val="ListParagraph"/>
         <w:ind w:left="1440"/>
         <w:rPr>
@@ -4810,7 +4931,7 @@
                     </pic:cNvPicPr>
                   </pic:nvPicPr>
                   <pic:blipFill>
-                    <a:blip r:embed="rId43">
+                    <a:blip r:embed="rId44">
                       <a:extLst>
                         <a:ext uri="{28A0092B-C50C-407E-A947-70E740481C1C}">
                           <a14:useLocalDpi xmlns:a14="http://schemas.microsoft.com/office/drawing/2010/main" val="0"/>
@@ -4967,7 +5088,7 @@
                     </pic:cNvPicPr>
                   </pic:nvPicPr>
                   <pic:blipFill>
-                    <a:blip r:embed="rId44">
+                    <a:blip r:embed="rId45">
                       <a:extLst>
                         <a:ext uri="{28A0092B-C50C-407E-A947-70E740481C1C}">
                           <a14:useLocalDpi xmlns:a14="http://schemas.microsoft.com/office/drawing/2010/main" val="0"/>
@@ -5066,7 +5187,7 @@
                     </pic:cNvPicPr>
                   </pic:nvPicPr>
                   <pic:blipFill>
-                    <a:blip r:embed="rId45">
+                    <a:blip r:embed="rId46">
                       <a:extLst>
                         <a:ext uri="{28A0092B-C50C-407E-A947-70E740481C1C}">
                           <a14:useLocalDpi xmlns:a14="http://schemas.microsoft.com/office/drawing/2010/main" val="0"/>
@@ -5191,7 +5312,7 @@
                     </pic:cNvPicPr>
                   </pic:nvPicPr>
                   <pic:blipFill>
-                    <a:blip r:embed="rId46" cstate="print">
+                    <a:blip r:embed="rId47" cstate="print">
                       <a:extLst>
                         <a:ext uri="{28A0092B-C50C-407E-A947-70E740481C1C}">
                           <a14:useLocalDpi xmlns:a14="http://schemas.microsoft.com/office/drawing/2010/main" val="0"/>
@@ -5254,7 +5375,7 @@
                     </pic:cNvPicPr>
                   </pic:nvPicPr>
                   <pic:blipFill>
-                    <a:blip r:embed="rId47">
+                    <a:blip r:embed="rId48">
                       <a:extLst>
                         <a:ext uri="{28A0092B-C50C-407E-A947-70E740481C1C}">
                           <a14:useLocalDpi xmlns:a14="http://schemas.microsoft.com/office/drawing/2010/main" val="0"/>
@@ -5379,7 +5500,7 @@
                     </pic:cNvPicPr>
                   </pic:nvPicPr>
                   <pic:blipFill>
-                    <a:blip r:embed="rId48">
+                    <a:blip r:embed="rId49">
                       <a:extLst>
                         <a:ext uri="{28A0092B-C50C-407E-A947-70E740481C1C}">
                           <a14:useLocalDpi xmlns:a14="http://schemas.microsoft.com/office/drawing/2010/main" val="0"/>
@@ -5479,7 +5600,7 @@
                     </pic:cNvPicPr>
                   </pic:nvPicPr>
                   <pic:blipFill>
-                    <a:blip r:embed="rId49">
+                    <a:blip r:embed="rId50">
                       <a:extLst>
                         <a:ext uri="{28A0092B-C50C-407E-A947-70E740481C1C}">
                           <a14:useLocalDpi xmlns:a14="http://schemas.microsoft.com/office/drawing/2010/main" val="0"/>
@@ -5542,7 +5663,7 @@
                     </pic:cNvPicPr>
                   </pic:nvPicPr>
                   <pic:blipFill>
-                    <a:blip r:embed="rId50">
+                    <a:blip r:embed="rId51">
                       <a:extLst>
                         <a:ext uri="{28A0092B-C50C-407E-A947-70E740481C1C}">
                           <a14:useLocalDpi xmlns:a14="http://schemas.microsoft.com/office/drawing/2010/main" val="0"/>
@@ -5760,7 +5881,7 @@
                     </pic:cNvPicPr>
                   </pic:nvPicPr>
                   <pic:blipFill>
-                    <a:blip r:embed="rId51">
+                    <a:blip r:embed="rId52">
                       <a:extLst>
                         <a:ext uri="{28A0092B-C50C-407E-A947-70E740481C1C}">
                           <a14:useLocalDpi xmlns:a14="http://schemas.microsoft.com/office/drawing/2010/main" val="0"/>
@@ -6818,7 +6939,7 @@
           <w:lang w:val="en-US"/>
         </w:rPr>
       </w:pPr>
-      <w:hyperlink r:id="rId52" w:history="1">
+      <w:hyperlink r:id="rId53" w:history="1">
         <w:r>
           <w:rPr>
             <w:rStyle w:val="Hyperlink"/>
@@ -7084,7 +7205,7 @@
           <w:lang w:val="en-US"/>
         </w:rPr>
       </w:pPr>
-      <w:hyperlink r:id="rId53" w:history="1">
+      <w:hyperlink r:id="rId54" w:history="1">
         <w:r>
           <w:rPr>
             <w:rStyle w:val="Hyperlink"/>
@@ -7164,7 +7285,7 @@
           <w:lang w:val="en-US"/>
         </w:rPr>
       </w:pPr>
-      <w:hyperlink r:id="rId54" w:history="1">
+      <w:hyperlink r:id="rId55" w:history="1">
         <w:r>
           <w:rPr>
             <w:rStyle w:val="Hyperlink"/>
@@ -7882,7 +8003,7 @@
           <w:lang w:val="en-US"/>
         </w:rPr>
       </w:pPr>
-      <w:hyperlink r:id="rId55" w:history="1">
+      <w:hyperlink r:id="rId56" w:history="1">
         <w:r>
           <w:rPr>
             <w:rStyle w:val="Hyperlink"/>
@@ -11265,6 +11386,118 @@
     </w:lvl>
   </w:abstractNum>
   <w:abstractNum w:abstractNumId="30" w15:restartNumberingAfterBreak="0">
+    <w:nsid w:val="5172593D"/>
+    <w:multiLevelType w:val="hybridMultilevel"/>
+    <w:tmpl w:val="54C692DC"/>
+    <w:lvl w:ilvl="0" w:tplc="1DC442C0">
+      <w:numFmt w:val="bullet"/>
+      <w:lvlText w:val="-"/>
+      <w:lvlJc w:val="left"/>
+      <w:pPr>
+        <w:ind w:left="720" w:hanging="360"/>
+      </w:pPr>
+      <w:rPr>
+        <w:rFonts w:ascii="Calibri" w:eastAsiaTheme="minorEastAsia" w:hAnsi="Calibri" w:cs="Calibri" w:hint="default"/>
+      </w:rPr>
+    </w:lvl>
+    <w:lvl w:ilvl="1" w:tplc="44090003" w:tentative="1">
+      <w:start w:val="1"/>
+      <w:numFmt w:val="bullet"/>
+      <w:lvlText w:val="o"/>
+      <w:lvlJc w:val="left"/>
+      <w:pPr>
+        <w:ind w:left="1440" w:hanging="360"/>
+      </w:pPr>
+      <w:rPr>
+        <w:rFonts w:ascii="Courier New" w:hAnsi="Courier New" w:cs="Courier New" w:hint="default"/>
+      </w:rPr>
+    </w:lvl>
+    <w:lvl w:ilvl="2" w:tplc="44090005" w:tentative="1">
+      <w:start w:val="1"/>
+      <w:numFmt w:val="bullet"/>
+      <w:lvlText w:val=""/>
+      <w:lvlJc w:val="left"/>
+      <w:pPr>
+        <w:ind w:left="2160" w:hanging="360"/>
+      </w:pPr>
+      <w:rPr>
+        <w:rFonts w:ascii="Wingdings" w:hAnsi="Wingdings" w:hint="default"/>
+      </w:rPr>
+    </w:lvl>
+    <w:lvl w:ilvl="3" w:tplc="44090001" w:tentative="1">
+      <w:start w:val="1"/>
+      <w:numFmt w:val="bullet"/>
+      <w:lvlText w:val=""/>
+      <w:lvlJc w:val="left"/>
+      <w:pPr>
+        <w:ind w:left="2880" w:hanging="360"/>
+      </w:pPr>
+      <w:rPr>
+        <w:rFonts w:ascii="Symbol" w:hAnsi="Symbol" w:hint="default"/>
+      </w:rPr>
+    </w:lvl>
+    <w:lvl w:ilvl="4" w:tplc="44090003" w:tentative="1">
+      <w:start w:val="1"/>
+      <w:numFmt w:val="bullet"/>
+      <w:lvlText w:val="o"/>
+      <w:lvlJc w:val="left"/>
+      <w:pPr>
+        <w:ind w:left="3600" w:hanging="360"/>
+      </w:pPr>
+      <w:rPr>
+        <w:rFonts w:ascii="Courier New" w:hAnsi="Courier New" w:cs="Courier New" w:hint="default"/>
+      </w:rPr>
+    </w:lvl>
+    <w:lvl w:ilvl="5" w:tplc="44090005" w:tentative="1">
+      <w:start w:val="1"/>
+      <w:numFmt w:val="bullet"/>
+      <w:lvlText w:val=""/>
+      <w:lvlJc w:val="left"/>
+      <w:pPr>
+        <w:ind w:left="4320" w:hanging="360"/>
+      </w:pPr>
+      <w:rPr>
+        <w:rFonts w:ascii="Wingdings" w:hAnsi="Wingdings" w:hint="default"/>
+      </w:rPr>
+    </w:lvl>
+    <w:lvl w:ilvl="6" w:tplc="44090001" w:tentative="1">
+      <w:start w:val="1"/>
+      <w:numFmt w:val="bullet"/>
+      <w:lvlText w:val=""/>
+      <w:lvlJc w:val="left"/>
+      <w:pPr>
+        <w:ind w:left="5040" w:hanging="360"/>
+      </w:pPr>
+      <w:rPr>
+        <w:rFonts w:ascii="Symbol" w:hAnsi="Symbol" w:hint="default"/>
+      </w:rPr>
+    </w:lvl>
+    <w:lvl w:ilvl="7" w:tplc="44090003" w:tentative="1">
+      <w:start w:val="1"/>
+      <w:numFmt w:val="bullet"/>
+      <w:lvlText w:val="o"/>
+      <w:lvlJc w:val="left"/>
+      <w:pPr>
+        <w:ind w:left="5760" w:hanging="360"/>
+      </w:pPr>
+      <w:rPr>
+        <w:rFonts w:ascii="Courier New" w:hAnsi="Courier New" w:cs="Courier New" w:hint="default"/>
+      </w:rPr>
+    </w:lvl>
+    <w:lvl w:ilvl="8" w:tplc="44090005" w:tentative="1">
+      <w:start w:val="1"/>
+      <w:numFmt w:val="bullet"/>
+      <w:lvlText w:val=""/>
+      <w:lvlJc w:val="left"/>
+      <w:pPr>
+        <w:ind w:left="6480" w:hanging="360"/>
+      </w:pPr>
+      <w:rPr>
+        <w:rFonts w:ascii="Wingdings" w:hAnsi="Wingdings" w:hint="default"/>
+      </w:rPr>
+    </w:lvl>
+  </w:abstractNum>
+  <w:abstractNum w:abstractNumId="31" w15:restartNumberingAfterBreak="0">
     <w:nsid w:val="52606647"/>
     <w:multiLevelType w:val="hybridMultilevel"/>
     <w:tmpl w:val="34FAD1A0"/>
@@ -11376,7 +11609,7 @@
       </w:rPr>
     </w:lvl>
   </w:abstractNum>
-  <w:abstractNum w:abstractNumId="31" w15:restartNumberingAfterBreak="0">
+  <w:abstractNum w:abstractNumId="32" w15:restartNumberingAfterBreak="0">
     <w:nsid w:val="557D5C95"/>
     <w:multiLevelType w:val="hybridMultilevel"/>
     <w:tmpl w:val="DC122E1C"/>
@@ -11488,7 +11721,7 @@
       </w:rPr>
     </w:lvl>
   </w:abstractNum>
-  <w:abstractNum w:abstractNumId="32" w15:restartNumberingAfterBreak="0">
+  <w:abstractNum w:abstractNumId="33" w15:restartNumberingAfterBreak="0">
     <w:nsid w:val="589D37B7"/>
     <w:multiLevelType w:val="hybridMultilevel"/>
     <w:tmpl w:val="9262429A"/>
@@ -11600,7 +11833,7 @@
       </w:rPr>
     </w:lvl>
   </w:abstractNum>
-  <w:abstractNum w:abstractNumId="33" w15:restartNumberingAfterBreak="0">
+  <w:abstractNum w:abstractNumId="34" w15:restartNumberingAfterBreak="0">
     <w:nsid w:val="58AA443D"/>
     <w:multiLevelType w:val="hybridMultilevel"/>
     <w:tmpl w:val="56F0D18E"/>
@@ -11713,7 +11946,7 @@
       </w:rPr>
     </w:lvl>
   </w:abstractNum>
-  <w:abstractNum w:abstractNumId="34" w15:restartNumberingAfterBreak="0">
+  <w:abstractNum w:abstractNumId="35" w15:restartNumberingAfterBreak="0">
     <w:nsid w:val="59EE4063"/>
     <w:multiLevelType w:val="hybridMultilevel"/>
     <w:tmpl w:val="0482313C"/>
@@ -11825,7 +12058,7 @@
       </w:rPr>
     </w:lvl>
   </w:abstractNum>
-  <w:abstractNum w:abstractNumId="35" w15:restartNumberingAfterBreak="0">
+  <w:abstractNum w:abstractNumId="36" w15:restartNumberingAfterBreak="0">
     <w:nsid w:val="5B4B0EE2"/>
     <w:multiLevelType w:val="hybridMultilevel"/>
     <w:tmpl w:val="E8129FD8"/>
@@ -11937,7 +12170,7 @@
       </w:rPr>
     </w:lvl>
   </w:abstractNum>
-  <w:abstractNum w:abstractNumId="36" w15:restartNumberingAfterBreak="0">
+  <w:abstractNum w:abstractNumId="37" w15:restartNumberingAfterBreak="0">
     <w:nsid w:val="5BF34BEE"/>
     <w:multiLevelType w:val="hybridMultilevel"/>
     <w:tmpl w:val="1D48A376"/>
@@ -12049,7 +12282,7 @@
       </w:rPr>
     </w:lvl>
   </w:abstractNum>
-  <w:abstractNum w:abstractNumId="37" w15:restartNumberingAfterBreak="0">
+  <w:abstractNum w:abstractNumId="38" w15:restartNumberingAfterBreak="0">
     <w:nsid w:val="5C8347BF"/>
     <w:multiLevelType w:val="hybridMultilevel"/>
     <w:tmpl w:val="D2F46B88"/>
@@ -12161,7 +12394,7 @@
       </w:rPr>
     </w:lvl>
   </w:abstractNum>
-  <w:abstractNum w:abstractNumId="38" w15:restartNumberingAfterBreak="0">
+  <w:abstractNum w:abstractNumId="39" w15:restartNumberingAfterBreak="0">
     <w:nsid w:val="61693A7A"/>
     <w:multiLevelType w:val="hybridMultilevel"/>
     <w:tmpl w:val="580AF2C6"/>
@@ -12274,7 +12507,7 @@
       </w:rPr>
     </w:lvl>
   </w:abstractNum>
-  <w:abstractNum w:abstractNumId="39" w15:restartNumberingAfterBreak="0">
+  <w:abstractNum w:abstractNumId="40" w15:restartNumberingAfterBreak="0">
     <w:nsid w:val="63C54BFA"/>
     <w:multiLevelType w:val="hybridMultilevel"/>
     <w:tmpl w:val="8122740C"/>
@@ -12386,7 +12619,7 @@
       </w:rPr>
     </w:lvl>
   </w:abstractNum>
-  <w:abstractNum w:abstractNumId="40" w15:restartNumberingAfterBreak="0">
+  <w:abstractNum w:abstractNumId="41" w15:restartNumberingAfterBreak="0">
     <w:nsid w:val="68735AD0"/>
     <w:multiLevelType w:val="hybridMultilevel"/>
     <w:tmpl w:val="4EDE05FA"/>
@@ -12498,7 +12731,7 @@
       </w:rPr>
     </w:lvl>
   </w:abstractNum>
-  <w:abstractNum w:abstractNumId="41" w15:restartNumberingAfterBreak="0">
+  <w:abstractNum w:abstractNumId="42" w15:restartNumberingAfterBreak="0">
     <w:nsid w:val="6A047A76"/>
     <w:multiLevelType w:val="hybridMultilevel"/>
     <w:tmpl w:val="50CADEB2"/>
@@ -12610,7 +12843,7 @@
       </w:rPr>
     </w:lvl>
   </w:abstractNum>
-  <w:abstractNum w:abstractNumId="42" w15:restartNumberingAfterBreak="0">
+  <w:abstractNum w:abstractNumId="43" w15:restartNumberingAfterBreak="0">
     <w:nsid w:val="6A3A0B6E"/>
     <w:multiLevelType w:val="hybridMultilevel"/>
     <w:tmpl w:val="759C482E"/>
@@ -12722,7 +12955,7 @@
       </w:rPr>
     </w:lvl>
   </w:abstractNum>
-  <w:abstractNum w:abstractNumId="43" w15:restartNumberingAfterBreak="0">
+  <w:abstractNum w:abstractNumId="44" w15:restartNumberingAfterBreak="0">
     <w:nsid w:val="6AC268F7"/>
     <w:multiLevelType w:val="hybridMultilevel"/>
     <w:tmpl w:val="12F21194"/>
@@ -12834,7 +13067,7 @@
       </w:rPr>
     </w:lvl>
   </w:abstractNum>
-  <w:abstractNum w:abstractNumId="44" w15:restartNumberingAfterBreak="0">
+  <w:abstractNum w:abstractNumId="45" w15:restartNumberingAfterBreak="0">
     <w:nsid w:val="6CE7392E"/>
     <w:multiLevelType w:val="hybridMultilevel"/>
     <w:tmpl w:val="2E2C9BDE"/>
@@ -12946,7 +13179,7 @@
       </w:rPr>
     </w:lvl>
   </w:abstractNum>
-  <w:abstractNum w:abstractNumId="45" w15:restartNumberingAfterBreak="0">
+  <w:abstractNum w:abstractNumId="46" w15:restartNumberingAfterBreak="0">
     <w:nsid w:val="6E3F3F9F"/>
     <w:multiLevelType w:val="hybridMultilevel"/>
     <w:tmpl w:val="A13CFC48"/>
@@ -13058,7 +13291,7 @@
       </w:rPr>
     </w:lvl>
   </w:abstractNum>
-  <w:abstractNum w:abstractNumId="46" w15:restartNumberingAfterBreak="0">
+  <w:abstractNum w:abstractNumId="47" w15:restartNumberingAfterBreak="0">
     <w:nsid w:val="74A1190D"/>
     <w:multiLevelType w:val="hybridMultilevel"/>
     <w:tmpl w:val="D5387ACA"/>
@@ -13170,7 +13403,7 @@
       </w:rPr>
     </w:lvl>
   </w:abstractNum>
-  <w:abstractNum w:abstractNumId="47" w15:restartNumberingAfterBreak="0">
+  <w:abstractNum w:abstractNumId="48" w15:restartNumberingAfterBreak="0">
     <w:nsid w:val="7E7D5380"/>
     <w:multiLevelType w:val="hybridMultilevel"/>
     <w:tmpl w:val="7668ED14"/>
@@ -13282,7 +13515,7 @@
       </w:rPr>
     </w:lvl>
   </w:abstractNum>
-  <w:abstractNum w:abstractNumId="48" w15:restartNumberingAfterBreak="0">
+  <w:abstractNum w:abstractNumId="49" w15:restartNumberingAfterBreak="0">
     <w:nsid w:val="7EAA14ED"/>
     <w:multiLevelType w:val="hybridMultilevel"/>
     <w:tmpl w:val="AF783BA4"/>
@@ -13394,7 +13627,7 @@
       </w:rPr>
     </w:lvl>
   </w:abstractNum>
-  <w:abstractNum w:abstractNumId="49" w15:restartNumberingAfterBreak="0">
+  <w:abstractNum w:abstractNumId="50" w15:restartNumberingAfterBreak="0">
     <w:nsid w:val="7FD565FA"/>
     <w:multiLevelType w:val="hybridMultilevel"/>
     <w:tmpl w:val="E5906ACC"/>
@@ -13506,155 +13739,158 @@
       </w:rPr>
     </w:lvl>
   </w:abstractNum>
-  <w:num w:numId="1">
+  <w:num w:numId="1" w16cid:durableId="2065525182">
     <w:abstractNumId w:val="4"/>
   </w:num>
-  <w:num w:numId="2">
+  <w:num w:numId="2" w16cid:durableId="1214587089">
+    <w:abstractNumId w:val="38"/>
+  </w:num>
+  <w:num w:numId="3" w16cid:durableId="1187982406">
+    <w:abstractNumId w:val="33"/>
+  </w:num>
+  <w:num w:numId="4" w16cid:durableId="1484008219">
+    <w:abstractNumId w:val="31"/>
+  </w:num>
+  <w:num w:numId="5" w16cid:durableId="821894591">
+    <w:abstractNumId w:val="16"/>
+  </w:num>
+  <w:num w:numId="6" w16cid:durableId="1127045157">
+    <w:abstractNumId w:val="32"/>
+  </w:num>
+  <w:num w:numId="7" w16cid:durableId="140923916">
+    <w:abstractNumId w:val="34"/>
+  </w:num>
+  <w:num w:numId="8" w16cid:durableId="904072471">
+    <w:abstractNumId w:val="44"/>
+  </w:num>
+  <w:num w:numId="9" w16cid:durableId="1138299621">
+    <w:abstractNumId w:val="13"/>
+  </w:num>
+  <w:num w:numId="10" w16cid:durableId="1161702919">
+    <w:abstractNumId w:val="18"/>
+  </w:num>
+  <w:num w:numId="11" w16cid:durableId="1755397653">
+    <w:abstractNumId w:val="9"/>
+  </w:num>
+  <w:num w:numId="12" w16cid:durableId="62722672">
+    <w:abstractNumId w:val="7"/>
+  </w:num>
+  <w:num w:numId="13" w16cid:durableId="4552283">
+    <w:abstractNumId w:val="3"/>
+  </w:num>
+  <w:num w:numId="14" w16cid:durableId="140540776">
+    <w:abstractNumId w:val="42"/>
+  </w:num>
+  <w:num w:numId="15" w16cid:durableId="1136294007">
+    <w:abstractNumId w:val="45"/>
+  </w:num>
+  <w:num w:numId="16" w16cid:durableId="225802216">
+    <w:abstractNumId w:val="11"/>
+  </w:num>
+  <w:num w:numId="17" w16cid:durableId="313412663">
+    <w:abstractNumId w:val="0"/>
+  </w:num>
+  <w:num w:numId="18" w16cid:durableId="1232960799">
+    <w:abstractNumId w:val="6"/>
+  </w:num>
+  <w:num w:numId="19" w16cid:durableId="314800888">
+    <w:abstractNumId w:val="36"/>
+  </w:num>
+  <w:num w:numId="20" w16cid:durableId="131557165">
+    <w:abstractNumId w:val="29"/>
+  </w:num>
+  <w:num w:numId="21" w16cid:durableId="1251617534">
+    <w:abstractNumId w:val="14"/>
+  </w:num>
+  <w:num w:numId="22" w16cid:durableId="1286502441">
+    <w:abstractNumId w:val="10"/>
+  </w:num>
+  <w:num w:numId="23" w16cid:durableId="337587092">
+    <w:abstractNumId w:val="20"/>
+  </w:num>
+  <w:num w:numId="24" w16cid:durableId="1395472260">
+    <w:abstractNumId w:val="43"/>
+  </w:num>
+  <w:num w:numId="25" w16cid:durableId="119689676">
+    <w:abstractNumId w:val="46"/>
+  </w:num>
+  <w:num w:numId="26" w16cid:durableId="1053193271">
+    <w:abstractNumId w:val="23"/>
+  </w:num>
+  <w:num w:numId="27" w16cid:durableId="1465998411">
+    <w:abstractNumId w:val="25"/>
+  </w:num>
+  <w:num w:numId="28" w16cid:durableId="1905949706">
+    <w:abstractNumId w:val="48"/>
+  </w:num>
+  <w:num w:numId="29" w16cid:durableId="1532962544">
+    <w:abstractNumId w:val="39"/>
+  </w:num>
+  <w:num w:numId="30" w16cid:durableId="615647766">
+    <w:abstractNumId w:val="5"/>
+  </w:num>
+  <w:num w:numId="31" w16cid:durableId="625937958">
+    <w:abstractNumId w:val="24"/>
+  </w:num>
+  <w:num w:numId="32" w16cid:durableId="913978576">
+    <w:abstractNumId w:val="17"/>
+  </w:num>
+  <w:num w:numId="33" w16cid:durableId="326784986">
+    <w:abstractNumId w:val="40"/>
+  </w:num>
+  <w:num w:numId="34" w16cid:durableId="875772441">
     <w:abstractNumId w:val="37"/>
   </w:num>
-  <w:num w:numId="3">
-    <w:abstractNumId w:val="32"/>
+  <w:num w:numId="35" w16cid:durableId="84083948">
+    <w:abstractNumId w:val="49"/>
   </w:num>
-  <w:num w:numId="4">
-    <w:abstractNumId w:val="30"/>
+  <w:num w:numId="36" w16cid:durableId="852763910">
+    <w:abstractNumId w:val="26"/>
   </w:num>
-  <w:num w:numId="5">
-    <w:abstractNumId w:val="16"/>
+  <w:num w:numId="37" w16cid:durableId="74910426">
+    <w:abstractNumId w:val="47"/>
   </w:num>
-  <w:num w:numId="6">
-    <w:abstractNumId w:val="31"/>
+  <w:num w:numId="38" w16cid:durableId="565603567">
+    <w:abstractNumId w:val="50"/>
   </w:num>
-  <w:num w:numId="7">
-    <w:abstractNumId w:val="33"/>
+  <w:num w:numId="39" w16cid:durableId="1006638275">
+    <w:abstractNumId w:val="19"/>
   </w:num>
-  <w:num w:numId="8">
-    <w:abstractNumId w:val="43"/>
+  <w:num w:numId="40" w16cid:durableId="1974749760">
+    <w:abstractNumId w:val="2"/>
   </w:num>
-  <w:num w:numId="9">
-    <w:abstractNumId w:val="13"/>
+  <w:num w:numId="41" w16cid:durableId="109319442">
+    <w:abstractNumId w:val="35"/>
   </w:num>
-  <w:num w:numId="10">
-    <w:abstractNumId w:val="18"/>
+  <w:num w:numId="42" w16cid:durableId="621032675">
+    <w:abstractNumId w:val="22"/>
   </w:num>
-  <w:num w:numId="11">
-    <w:abstractNumId w:val="9"/>
+  <w:num w:numId="43" w16cid:durableId="1824344854">
+    <w:abstractNumId w:val="28"/>
   </w:num>
-  <w:num w:numId="12">
-    <w:abstractNumId w:val="7"/>
+  <w:num w:numId="44" w16cid:durableId="170265096">
+    <w:abstractNumId w:val="8"/>
   </w:num>
-  <w:num w:numId="13">
-    <w:abstractNumId w:val="3"/>
-  </w:num>
-  <w:num w:numId="14">
+  <w:num w:numId="45" w16cid:durableId="68770248">
     <w:abstractNumId w:val="41"/>
   </w:num>
-  <w:num w:numId="15">
-    <w:abstractNumId w:val="44"/>
-  </w:num>
-  <w:num w:numId="16">
-    <w:abstractNumId w:val="11"/>
-  </w:num>
-  <w:num w:numId="17">
-    <w:abstractNumId w:val="0"/>
-  </w:num>
-  <w:num w:numId="18">
-    <w:abstractNumId w:val="6"/>
-  </w:num>
-  <w:num w:numId="19">
-    <w:abstractNumId w:val="35"/>
-  </w:num>
-  <w:num w:numId="20">
-    <w:abstractNumId w:val="29"/>
-  </w:num>
-  <w:num w:numId="21">
-    <w:abstractNumId w:val="14"/>
-  </w:num>
-  <w:num w:numId="22">
-    <w:abstractNumId w:val="10"/>
-  </w:num>
-  <w:num w:numId="23">
-    <w:abstractNumId w:val="20"/>
-  </w:num>
-  <w:num w:numId="24">
-    <w:abstractNumId w:val="42"/>
-  </w:num>
-  <w:num w:numId="25">
-    <w:abstractNumId w:val="45"/>
-  </w:num>
-  <w:num w:numId="26">
-    <w:abstractNumId w:val="23"/>
-  </w:num>
-  <w:num w:numId="27">
-    <w:abstractNumId w:val="25"/>
-  </w:num>
-  <w:num w:numId="28">
-    <w:abstractNumId w:val="47"/>
-  </w:num>
-  <w:num w:numId="29">
-    <w:abstractNumId w:val="38"/>
-  </w:num>
-  <w:num w:numId="30">
-    <w:abstractNumId w:val="5"/>
-  </w:num>
-  <w:num w:numId="31">
-    <w:abstractNumId w:val="24"/>
-  </w:num>
-  <w:num w:numId="32">
-    <w:abstractNumId w:val="17"/>
-  </w:num>
-  <w:num w:numId="33">
-    <w:abstractNumId w:val="39"/>
-  </w:num>
-  <w:num w:numId="34">
-    <w:abstractNumId w:val="36"/>
-  </w:num>
-  <w:num w:numId="35">
-    <w:abstractNumId w:val="48"/>
-  </w:num>
-  <w:num w:numId="36">
-    <w:abstractNumId w:val="26"/>
-  </w:num>
-  <w:num w:numId="37">
-    <w:abstractNumId w:val="46"/>
-  </w:num>
-  <w:num w:numId="38">
-    <w:abstractNumId w:val="49"/>
-  </w:num>
-  <w:num w:numId="39">
-    <w:abstractNumId w:val="19"/>
-  </w:num>
-  <w:num w:numId="40">
-    <w:abstractNumId w:val="2"/>
-  </w:num>
-  <w:num w:numId="41">
-    <w:abstractNumId w:val="34"/>
-  </w:num>
-  <w:num w:numId="42">
-    <w:abstractNumId w:val="22"/>
-  </w:num>
-  <w:num w:numId="43">
-    <w:abstractNumId w:val="28"/>
-  </w:num>
-  <w:num w:numId="44">
-    <w:abstractNumId w:val="8"/>
-  </w:num>
-  <w:num w:numId="45">
-    <w:abstractNumId w:val="40"/>
-  </w:num>
-  <w:num w:numId="46">
+  <w:num w:numId="46" w16cid:durableId="1044478388">
     <w:abstractNumId w:val="12"/>
   </w:num>
-  <w:num w:numId="47">
+  <w:num w:numId="47" w16cid:durableId="1855344781">
     <w:abstractNumId w:val="15"/>
   </w:num>
-  <w:num w:numId="48">
+  <w:num w:numId="48" w16cid:durableId="34040034">
     <w:abstractNumId w:val="27"/>
   </w:num>
-  <w:num w:numId="49">
+  <w:num w:numId="49" w16cid:durableId="2006011155">
     <w:abstractNumId w:val="21"/>
   </w:num>
-  <w:num w:numId="50">
+  <w:num w:numId="50" w16cid:durableId="1636371975">
     <w:abstractNumId w:val="1"/>
+  </w:num>
+  <w:num w:numId="51" w16cid:durableId="242029061">
+    <w:abstractNumId w:val="30"/>
   </w:num>
   <w:numIdMacAtCleanup w:val="42"/>
 </w:numbering>

</xml_diff>

<commit_message>
Revert "- update data date actuals to retrieve from forecast"
This reverts commit 2f4cc55a23a227a520c9a9ea85c92c6f7b2509c2.
</commit_message>
<xml_diff>
--- a/BluePrints/Views/ChangeLog.docx
+++ b/BluePrints/Views/ChangeLog.docx
@@ -2,126 +2,6 @@
 <file path=word/document.xml><?xml version="1.0" encoding="utf-8"?>
 <w:document xmlns:wpc="http://schemas.microsoft.com/office/word/2010/wordprocessingCanvas" xmlns:cx="http://schemas.microsoft.com/office/drawing/2014/chartex" xmlns:cx1="http://schemas.microsoft.com/office/drawing/2015/9/8/chartex" xmlns:cx2="http://schemas.microsoft.com/office/drawing/2015/10/21/chartex" xmlns:cx3="http://schemas.microsoft.com/office/drawing/2016/5/9/chartex" xmlns:cx4="http://schemas.microsoft.com/office/drawing/2016/5/10/chartex" xmlns:cx5="http://schemas.microsoft.com/office/drawing/2016/5/11/chartex" xmlns:cx6="http://schemas.microsoft.com/office/drawing/2016/5/12/chartex" xmlns:cx7="http://schemas.microsoft.com/office/drawing/2016/5/13/chartex" xmlns:cx8="http://schemas.microsoft.com/office/drawing/2016/5/14/chartex" xmlns:mc="http://schemas.openxmlformats.org/markup-compatibility/2006" xmlns:aink="http://schemas.microsoft.com/office/drawing/2016/ink" xmlns:am3d="http://schemas.microsoft.com/office/drawing/2017/model3d" xmlns:o="urn:schemas-microsoft-com:office:office" xmlns:r="http://schemas.openxmlformats.org/officeDocument/2006/relationships" xmlns:m="http://schemas.openxmlformats.org/officeDocument/2006/math" xmlns:v="urn:schemas-microsoft-com:vml" xmlns:wp14="http://schemas.microsoft.com/office/word/2010/wordprocessingDrawing" xmlns:wp="http://schemas.openxmlformats.org/drawingml/2006/wordprocessingDrawing" xmlns:w10="urn:schemas-microsoft-com:office:word" xmlns:w="http://schemas.openxmlformats.org/wordprocessingml/2006/main" xmlns:w14="http://schemas.microsoft.com/office/word/2010/wordml" xmlns:w15="http://schemas.microsoft.com/office/word/2012/wordml" xmlns:w16cex="http://schemas.microsoft.com/office/word/2018/wordml/cex" xmlns:w16cid="http://schemas.microsoft.com/office/word/2016/wordml/cid" xmlns:w16="http://schemas.microsoft.com/office/word/2018/wordml" xmlns:w16sdtdh="http://schemas.microsoft.com/office/word/2020/wordml/sdtdatahash" xmlns:w16se="http://schemas.microsoft.com/office/word/2015/wordml/symex" xmlns:wpg="http://schemas.microsoft.com/office/word/2010/wordprocessingGroup" xmlns:wpi="http://schemas.microsoft.com/office/word/2010/wordprocessingInk" xmlns:wne="http://schemas.microsoft.com/office/word/2006/wordml" xmlns:wps="http://schemas.microsoft.com/office/word/2010/wordprocessingShape" mc:Ignorable="w14 w15 w16se w16cid w16 w16cex w16sdtdh wp14">
   <w:body>
-    <w:p>
-      <w:pPr>
-        <w:rPr>
-          <w:lang w:val="en-US"/>
-        </w:rPr>
-      </w:pPr>
-      <w:r>
-        <w:rPr>
-          <w:lang w:val="en-US"/>
-        </w:rPr>
-        <w:t>Change Log 26</w:t>
-      </w:r>
-      <w:r>
-        <w:rPr>
-          <w:vertAlign w:val="superscript"/>
-          <w:lang w:val="en-US"/>
-        </w:rPr>
-        <w:t>th</w:t>
-      </w:r>
-      <w:r>
-        <w:rPr>
-          <w:lang w:val="en-US"/>
-        </w:rPr>
-        <w:t xml:space="preserve"> April 2021</w:t>
-      </w:r>
-    </w:p>
-    <w:p>
-      <w:pPr>
-        <w:pStyle w:val="ListParagraph"/>
-        <w:numPr>
-          <w:ilvl w:val="0"/>
-          <w:numId w:val="51"/>
-        </w:numPr>
-        <w:rPr>
-          <w:lang w:val="en-US"/>
-        </w:rPr>
-      </w:pPr>
-      <w:r>
-        <w:rPr>
-          <w:lang w:val="en-US"/>
-        </w:rPr>
-        <w:t>Added ability to add comments in forecast</w:t>
-      </w:r>
-    </w:p>
-    <w:p>
-      <w:pPr>
-        <w:pStyle w:val="ListParagraph"/>
-        <w:rPr>
-          <w:lang w:val="en-US"/>
-        </w:rPr>
-      </w:pPr>
-      <w:r>
-        <w:rPr>
-          <w:noProof/>
-          <w:lang w:val="en-US"/>
-        </w:rPr>
-        <w:drawing>
-          <wp:inline distT="0" distB="0" distL="0" distR="0" wp14:anchorId="7D8FD570" wp14:editId="79ADD143">
-            <wp:extent cx="2139950" cy="2000250"/>
-            <wp:effectExtent l="0" t="0" r="0" b="0"/>
-            <wp:docPr id="49" name="Picture 49"/>
-            <wp:cNvGraphicFramePr>
-              <a:graphicFrameLocks xmlns:a="http://schemas.openxmlformats.org/drawingml/2006/main" noChangeAspect="1"/>
-            </wp:cNvGraphicFramePr>
-            <a:graphic xmlns:a="http://schemas.openxmlformats.org/drawingml/2006/main">
-              <a:graphicData uri="http://schemas.openxmlformats.org/drawingml/2006/picture">
-                <pic:pic xmlns:pic="http://schemas.openxmlformats.org/drawingml/2006/picture">
-                  <pic:nvPicPr>
-                    <pic:cNvPr id="0" name="Picture 2"/>
-                    <pic:cNvPicPr>
-                      <a:picLocks noChangeAspect="1" noChangeArrowheads="1"/>
-                    </pic:cNvPicPr>
-                  </pic:nvPicPr>
-                  <pic:blipFill>
-                    <a:blip r:embed="rId5">
-                      <a:extLst>
-                        <a:ext uri="{28A0092B-C50C-407E-A947-70E740481C1C}">
-                          <a14:useLocalDpi xmlns:a14="http://schemas.microsoft.com/office/drawing/2010/main" val="0"/>
-                        </a:ext>
-                      </a:extLst>
-                    </a:blip>
-                    <a:srcRect/>
-                    <a:stretch>
-                      <a:fillRect/>
-                    </a:stretch>
-                  </pic:blipFill>
-                  <pic:spPr bwMode="auto">
-                    <a:xfrm>
-                      <a:off x="0" y="0"/>
-                      <a:ext cx="2139950" cy="2000250"/>
-                    </a:xfrm>
-                    <a:prstGeom prst="rect">
-                      <a:avLst/>
-                    </a:prstGeom>
-                    <a:noFill/>
-                    <a:ln>
-                      <a:noFill/>
-                    </a:ln>
-                  </pic:spPr>
-                </pic:pic>
-              </a:graphicData>
-            </a:graphic>
-          </wp:inline>
-        </w:drawing>
-      </w:r>
-    </w:p>
-    <w:p>
-      <w:pPr>
-        <w:rPr>
-          <w:lang w:val="en-US"/>
-        </w:rPr>
-      </w:pPr>
-    </w:p>
-    <w:p>
-      <w:pPr>
-        <w:rPr>
-          <w:lang w:val="en-US"/>
-        </w:rPr>
-      </w:pPr>
-    </w:p>
     <w:p>
       <w:pPr>
         <w:rPr>
@@ -239,7 +119,7 @@
                     </pic:cNvPicPr>
                   </pic:nvPicPr>
                   <pic:blipFill>
-                    <a:blip r:embed="rId6">
+                    <a:blip r:embed="rId5">
                       <a:extLst>
                         <a:ext uri="{28A0092B-C50C-407E-A947-70E740481C1C}">
                           <a14:useLocalDpi xmlns:a14="http://schemas.microsoft.com/office/drawing/2010/main" val="0"/>
@@ -320,7 +200,7 @@
                     </pic:cNvPicPr>
                   </pic:nvPicPr>
                   <pic:blipFill>
-                    <a:blip r:embed="rId7">
+                    <a:blip r:embed="rId6">
                       <a:extLst>
                         <a:ext uri="{28A0092B-C50C-407E-A947-70E740481C1C}">
                           <a14:useLocalDpi xmlns:a14="http://schemas.microsoft.com/office/drawing/2010/main" val="0"/>
@@ -407,7 +287,6 @@
           <w:noProof/>
           <w:lang w:val="en-US"/>
         </w:rPr>
-        <w:lastRenderedPageBreak/>
         <w:drawing>
           <wp:inline distT="0" distB="0" distL="0" distR="0" wp14:anchorId="3A05851A" wp14:editId="33982B56">
             <wp:extent cx="5721350" cy="933450"/>
@@ -426,7 +305,7 @@
                     </pic:cNvPicPr>
                   </pic:nvPicPr>
                   <pic:blipFill>
-                    <a:blip r:embed="rId8" cstate="print">
+                    <a:blip r:embed="rId7" cstate="print">
                       <a:extLst>
                         <a:ext uri="{28A0092B-C50C-407E-A947-70E740481C1C}">
                           <a14:useLocalDpi xmlns:a14="http://schemas.microsoft.com/office/drawing/2010/main" val="0"/>
@@ -565,7 +444,7 @@
                     </pic:cNvPicPr>
                   </pic:nvPicPr>
                   <pic:blipFill>
-                    <a:blip r:embed="rId9">
+                    <a:blip r:embed="rId8">
                       <a:extLst>
                         <a:ext uri="{28A0092B-C50C-407E-A947-70E740481C1C}">
                           <a14:useLocalDpi xmlns:a14="http://schemas.microsoft.com/office/drawing/2010/main" val="0"/>
@@ -655,7 +534,7 @@
                     </pic:cNvPicPr>
                   </pic:nvPicPr>
                   <pic:blipFill>
-                    <a:blip r:embed="rId10" cstate="print">
+                    <a:blip r:embed="rId9" cstate="print">
                       <a:extLst>
                         <a:ext uri="{28A0092B-C50C-407E-A947-70E740481C1C}">
                           <a14:useLocalDpi xmlns:a14="http://schemas.microsoft.com/office/drawing/2010/main" val="0"/>
@@ -763,7 +642,7 @@
                     </pic:cNvPicPr>
                   </pic:nvPicPr>
                   <pic:blipFill>
-                    <a:blip r:embed="rId11">
+                    <a:blip r:embed="rId10">
                       <a:extLst>
                         <a:ext uri="{28A0092B-C50C-407E-A947-70E740481C1C}">
                           <a14:useLocalDpi xmlns:a14="http://schemas.microsoft.com/office/drawing/2010/main" val="0"/>
@@ -835,7 +714,7 @@
                     </pic:cNvPicPr>
                   </pic:nvPicPr>
                   <pic:blipFill>
-                    <a:blip r:embed="rId12">
+                    <a:blip r:embed="rId11">
                       <a:extLst>
                         <a:ext uri="{28A0092B-C50C-407E-A947-70E740481C1C}">
                           <a14:useLocalDpi xmlns:a14="http://schemas.microsoft.com/office/drawing/2010/main" val="0"/>
@@ -967,7 +846,7 @@
                     </pic:cNvPicPr>
                   </pic:nvPicPr>
                   <pic:blipFill>
-                    <a:blip r:embed="rId13">
+                    <a:blip r:embed="rId12">
                       <a:extLst>
                         <a:ext uri="{28A0092B-C50C-407E-A947-70E740481C1C}">
                           <a14:useLocalDpi xmlns:a14="http://schemas.microsoft.com/office/drawing/2010/main" val="0"/>
@@ -1066,7 +945,7 @@
                     </pic:cNvPicPr>
                   </pic:nvPicPr>
                   <pic:blipFill>
-                    <a:blip r:embed="rId14">
+                    <a:blip r:embed="rId13">
                       <a:extLst>
                         <a:ext uri="{28A0092B-C50C-407E-A947-70E740481C1C}">
                           <a14:useLocalDpi xmlns:a14="http://schemas.microsoft.com/office/drawing/2010/main" val="0"/>
@@ -1205,7 +1084,7 @@
                     </pic:cNvPicPr>
                   </pic:nvPicPr>
                   <pic:blipFill>
-                    <a:blip r:embed="rId15" cstate="print">
+                    <a:blip r:embed="rId14" cstate="print">
                       <a:extLst>
                         <a:ext uri="{28A0092B-C50C-407E-A947-70E740481C1C}">
                           <a14:useLocalDpi xmlns:a14="http://schemas.microsoft.com/office/drawing/2010/main" val="0"/>
@@ -1307,7 +1186,7 @@
                     </pic:cNvPicPr>
                   </pic:nvPicPr>
                   <pic:blipFill>
-                    <a:blip r:embed="rId16">
+                    <a:blip r:embed="rId15">
                       <a:extLst>
                         <a:ext uri="{28A0092B-C50C-407E-A947-70E740481C1C}">
                           <a14:useLocalDpi xmlns:a14="http://schemas.microsoft.com/office/drawing/2010/main" val="0"/>
@@ -1424,7 +1303,7 @@
           <w:lang w:val="en-US"/>
         </w:rPr>
       </w:pPr>
-      <w:hyperlink r:id="rId17" w:history="1">
+      <w:hyperlink r:id="rId16" w:history="1">
         <w:r>
           <w:rPr>
             <w:rStyle w:val="Hyperlink"/>
@@ -1613,7 +1492,7 @@
                     </pic:cNvPicPr>
                   </pic:nvPicPr>
                   <pic:blipFill>
-                    <a:blip r:embed="rId18">
+                    <a:blip r:embed="rId17">
                       <a:extLst>
                         <a:ext uri="{28A0092B-C50C-407E-A947-70E740481C1C}">
                           <a14:useLocalDpi xmlns:a14="http://schemas.microsoft.com/office/drawing/2010/main" val="0"/>
@@ -1745,7 +1624,7 @@
                     </pic:cNvPicPr>
                   </pic:nvPicPr>
                   <pic:blipFill>
-                    <a:blip r:embed="rId19" cstate="print">
+                    <a:blip r:embed="rId18" cstate="print">
                       <a:extLst>
                         <a:ext uri="{28A0092B-C50C-407E-A947-70E740481C1C}">
                           <a14:useLocalDpi xmlns:a14="http://schemas.microsoft.com/office/drawing/2010/main" val="0"/>
@@ -1855,7 +1734,7 @@
                     </pic:cNvPicPr>
                   </pic:nvPicPr>
                   <pic:blipFill>
-                    <a:blip r:embed="rId20">
+                    <a:blip r:embed="rId19">
                       <a:extLst>
                         <a:ext uri="{28A0092B-C50C-407E-A947-70E740481C1C}">
                           <a14:useLocalDpi xmlns:a14="http://schemas.microsoft.com/office/drawing/2010/main" val="0"/>
@@ -2000,7 +1879,7 @@
                     </pic:cNvPicPr>
                   </pic:nvPicPr>
                   <pic:blipFill>
-                    <a:blip r:embed="rId21" cstate="print">
+                    <a:blip r:embed="rId20" cstate="print">
                       <a:extLst>
                         <a:ext uri="{28A0092B-C50C-407E-A947-70E740481C1C}">
                           <a14:useLocalDpi xmlns:a14="http://schemas.microsoft.com/office/drawing/2010/main" val="0"/>
@@ -2168,7 +2047,7 @@
                     </pic:cNvPicPr>
                   </pic:nvPicPr>
                   <pic:blipFill>
-                    <a:blip r:embed="rId22">
+                    <a:blip r:embed="rId21">
                       <a:extLst>
                         <a:ext uri="{28A0092B-C50C-407E-A947-70E740481C1C}">
                           <a14:useLocalDpi xmlns:a14="http://schemas.microsoft.com/office/drawing/2010/main" val="0"/>
@@ -2252,7 +2131,7 @@
                     </pic:cNvPicPr>
                   </pic:nvPicPr>
                   <pic:blipFill>
-                    <a:blip r:embed="rId23">
+                    <a:blip r:embed="rId22">
                       <a:extLst>
                         <a:ext uri="{28A0092B-C50C-407E-A947-70E740481C1C}">
                           <a14:useLocalDpi xmlns:a14="http://schemas.microsoft.com/office/drawing/2010/main" val="0"/>
@@ -2359,7 +2238,7 @@
                     </pic:cNvPicPr>
                   </pic:nvPicPr>
                   <pic:blipFill>
-                    <a:blip r:embed="rId24" cstate="print">
+                    <a:blip r:embed="rId23" cstate="print">
                       <a:extLst>
                         <a:ext uri="{28A0092B-C50C-407E-A947-70E740481C1C}">
                           <a14:useLocalDpi xmlns:a14="http://schemas.microsoft.com/office/drawing/2010/main" val="0"/>
@@ -2558,7 +2437,7 @@
                     </pic:cNvPicPr>
                   </pic:nvPicPr>
                   <pic:blipFill>
-                    <a:blip r:embed="rId25" cstate="print">
+                    <a:blip r:embed="rId24" cstate="print">
                       <a:extLst>
                         <a:ext uri="{28A0092B-C50C-407E-A947-70E740481C1C}">
                           <a14:useLocalDpi xmlns:a14="http://schemas.microsoft.com/office/drawing/2010/main" val="0"/>
@@ -2683,7 +2562,7 @@
                     </pic:cNvPicPr>
                   </pic:nvPicPr>
                   <pic:blipFill>
-                    <a:blip r:embed="rId26" cstate="print">
+                    <a:blip r:embed="rId25" cstate="print">
                       <a:extLst>
                         <a:ext uri="{28A0092B-C50C-407E-A947-70E740481C1C}">
                           <a14:useLocalDpi xmlns:a14="http://schemas.microsoft.com/office/drawing/2010/main" val="0"/>
@@ -2822,7 +2701,7 @@
                     </pic:cNvPicPr>
                   </pic:nvPicPr>
                   <pic:blipFill>
-                    <a:blip r:embed="rId27" cstate="print">
+                    <a:blip r:embed="rId26" cstate="print">
                       <a:extLst>
                         <a:ext uri="{28A0092B-C50C-407E-A947-70E740481C1C}">
                           <a14:useLocalDpi xmlns:a14="http://schemas.microsoft.com/office/drawing/2010/main" val="0"/>
@@ -2921,7 +2800,7 @@
                     </pic:cNvPicPr>
                   </pic:nvPicPr>
                   <pic:blipFill>
-                    <a:blip r:embed="rId28" cstate="print">
+                    <a:blip r:embed="rId27" cstate="print">
                       <a:extLst>
                         <a:ext uri="{28A0092B-C50C-407E-A947-70E740481C1C}">
                           <a14:useLocalDpi xmlns:a14="http://schemas.microsoft.com/office/drawing/2010/main" val="0"/>
@@ -3027,7 +2906,7 @@
                     </pic:cNvPicPr>
                   </pic:nvPicPr>
                   <pic:blipFill>
-                    <a:blip r:embed="rId29" cstate="print">
+                    <a:blip r:embed="rId28" cstate="print">
                       <a:extLst>
                         <a:ext uri="{28A0092B-C50C-407E-A947-70E740481C1C}">
                           <a14:useLocalDpi xmlns:a14="http://schemas.microsoft.com/office/drawing/2010/main" val="0"/>
@@ -3134,7 +3013,7 @@
                     </pic:cNvPicPr>
                   </pic:nvPicPr>
                   <pic:blipFill>
-                    <a:blip r:embed="rId30">
+                    <a:blip r:embed="rId29">
                       <a:extLst>
                         <a:ext uri="{28A0092B-C50C-407E-A947-70E740481C1C}">
                           <a14:useLocalDpi xmlns:a14="http://schemas.microsoft.com/office/drawing/2010/main" val="0"/>
@@ -3306,7 +3185,7 @@
                     </pic:cNvPicPr>
                   </pic:nvPicPr>
                   <pic:blipFill>
-                    <a:blip r:embed="rId31">
+                    <a:blip r:embed="rId30">
                       <a:extLst>
                         <a:ext uri="{28A0092B-C50C-407E-A947-70E740481C1C}">
                           <a14:useLocalDpi xmlns:a14="http://schemas.microsoft.com/office/drawing/2010/main" val="0"/>
@@ -3374,7 +3253,7 @@
                     </pic:cNvPicPr>
                   </pic:nvPicPr>
                   <pic:blipFill>
-                    <a:blip r:embed="rId32">
+                    <a:blip r:embed="rId31">
                       <a:extLst>
                         <a:ext uri="{28A0092B-C50C-407E-A947-70E740481C1C}">
                           <a14:useLocalDpi xmlns:a14="http://schemas.microsoft.com/office/drawing/2010/main" val="0"/>
@@ -3572,7 +3451,7 @@
                     </pic:cNvPicPr>
                   </pic:nvPicPr>
                   <pic:blipFill>
-                    <a:blip r:embed="rId33">
+                    <a:blip r:embed="rId32">
                       <a:extLst>
                         <a:ext uri="{28A0092B-C50C-407E-A947-70E740481C1C}">
                           <a14:useLocalDpi xmlns:a14="http://schemas.microsoft.com/office/drawing/2010/main" val="0"/>
@@ -3670,7 +3549,7 @@
                     </pic:cNvPicPr>
                   </pic:nvPicPr>
                   <pic:blipFill>
-                    <a:blip r:embed="rId34">
+                    <a:blip r:embed="rId33">
                       <a:extLst>
                         <a:ext uri="{28A0092B-C50C-407E-A947-70E740481C1C}">
                           <a14:useLocalDpi xmlns:a14="http://schemas.microsoft.com/office/drawing/2010/main" val="0"/>
@@ -3844,7 +3723,7 @@
                     </pic:cNvPicPr>
                   </pic:nvPicPr>
                   <pic:blipFill>
-                    <a:blip r:embed="rId35">
+                    <a:blip r:embed="rId34">
                       <a:extLst>
                         <a:ext uri="{28A0092B-C50C-407E-A947-70E740481C1C}">
                           <a14:useLocalDpi xmlns:a14="http://schemas.microsoft.com/office/drawing/2010/main" val="0"/>
@@ -3952,7 +3831,7 @@
                     </pic:cNvPicPr>
                   </pic:nvPicPr>
                   <pic:blipFill>
-                    <a:blip r:embed="rId36">
+                    <a:blip r:embed="rId35">
                       <a:extLst>
                         <a:ext uri="{28A0092B-C50C-407E-A947-70E740481C1C}">
                           <a14:useLocalDpi xmlns:a14="http://schemas.microsoft.com/office/drawing/2010/main" val="0"/>
@@ -4072,7 +3951,7 @@
                     </pic:cNvPicPr>
                   </pic:nvPicPr>
                   <pic:blipFill>
-                    <a:blip r:embed="rId37">
+                    <a:blip r:embed="rId36">
                       <a:extLst>
                         <a:ext uri="{28A0092B-C50C-407E-A947-70E740481C1C}">
                           <a14:useLocalDpi xmlns:a14="http://schemas.microsoft.com/office/drawing/2010/main" val="0"/>
@@ -4133,7 +4012,7 @@
                     </pic:cNvPicPr>
                   </pic:nvPicPr>
                   <pic:blipFill>
-                    <a:blip r:embed="rId38">
+                    <a:blip r:embed="rId37">
                       <a:extLst>
                         <a:ext uri="{28A0092B-C50C-407E-A947-70E740481C1C}">
                           <a14:useLocalDpi xmlns:a14="http://schemas.microsoft.com/office/drawing/2010/main" val="0"/>
@@ -4233,7 +4112,7 @@
                     </pic:cNvPicPr>
                   </pic:nvPicPr>
                   <pic:blipFill>
-                    <a:blip r:embed="rId39">
+                    <a:blip r:embed="rId38">
                       <a:extLst>
                         <a:ext uri="{28A0092B-C50C-407E-A947-70E740481C1C}">
                           <a14:useLocalDpi xmlns:a14="http://schemas.microsoft.com/office/drawing/2010/main" val="0"/>
@@ -4370,7 +4249,7 @@
                     </pic:cNvPicPr>
                   </pic:nvPicPr>
                   <pic:blipFill>
-                    <a:blip r:embed="rId40" cstate="print">
+                    <a:blip r:embed="rId39" cstate="print">
                       <a:extLst>
                         <a:ext uri="{28A0092B-C50C-407E-A947-70E740481C1C}">
                           <a14:useLocalDpi xmlns:a14="http://schemas.microsoft.com/office/drawing/2010/main" val="0"/>
@@ -4449,7 +4328,7 @@
                     </pic:cNvPicPr>
                   </pic:nvPicPr>
                   <pic:blipFill>
-                    <a:blip r:embed="rId41">
+                    <a:blip r:embed="rId40">
                       <a:extLst>
                         <a:ext uri="{28A0092B-C50C-407E-A947-70E740481C1C}">
                           <a14:useLocalDpi xmlns:a14="http://schemas.microsoft.com/office/drawing/2010/main" val="0"/>
@@ -4570,6 +4449,177 @@
                 <pic:pic xmlns:pic="http://schemas.openxmlformats.org/drawingml/2006/picture">
                   <pic:nvPicPr>
                     <pic:cNvPr id="0" name="Picture 1"/>
+                    <pic:cNvPicPr>
+                      <a:picLocks noChangeAspect="1" noChangeArrowheads="1"/>
+                    </pic:cNvPicPr>
+                  </pic:nvPicPr>
+                  <pic:blipFill>
+                    <a:blip r:embed="rId41">
+                      <a:extLst>
+                        <a:ext uri="{28A0092B-C50C-407E-A947-70E740481C1C}">
+                          <a14:useLocalDpi xmlns:a14="http://schemas.microsoft.com/office/drawing/2010/main" val="0"/>
+                        </a:ext>
+                      </a:extLst>
+                    </a:blip>
+                    <a:srcRect/>
+                    <a:stretch>
+                      <a:fillRect/>
+                    </a:stretch>
+                  </pic:blipFill>
+                  <pic:spPr bwMode="auto">
+                    <a:xfrm>
+                      <a:off x="0" y="0"/>
+                      <a:ext cx="5730875" cy="3870325"/>
+                    </a:xfrm>
+                    <a:prstGeom prst="rect">
+                      <a:avLst/>
+                    </a:prstGeom>
+                    <a:noFill/>
+                    <a:ln>
+                      <a:noFill/>
+                    </a:ln>
+                  </pic:spPr>
+                </pic:pic>
+              </a:graphicData>
+            </a:graphic>
+          </wp:inline>
+        </w:drawing>
+      </w:r>
+    </w:p>
+    <w:p>
+      <w:pPr>
+        <w:ind w:left="1440"/>
+        <w:rPr>
+          <w:lang w:val="en-US"/>
+        </w:rPr>
+      </w:pPr>
+      <w:r>
+        <w:rPr>
+          <w:lang w:val="en-US"/>
+        </w:rPr>
+        <w:t>In this instance, deliverable have 100 total hours and 50 hours already earned, but variation defines a 75 hours reduction, two options are available during approval</w:t>
+      </w:r>
+    </w:p>
+    <w:p>
+      <w:pPr>
+        <w:pStyle w:val="ListParagraph"/>
+        <w:numPr>
+          <w:ilvl w:val="2"/>
+          <w:numId w:val="28"/>
+        </w:numPr>
+        <w:rPr>
+          <w:lang w:val="en-US"/>
+        </w:rPr>
+      </w:pPr>
+      <w:r>
+        <w:rPr>
+          <w:lang w:val="en-US"/>
+        </w:rPr>
+        <w:t>Reduce earned hours ticked – Earned units will be reduced to 25 so that 75 hours reduction can be applied</w:t>
+      </w:r>
+    </w:p>
+    <w:p>
+      <w:pPr>
+        <w:pStyle w:val="ListParagraph"/>
+        <w:numPr>
+          <w:ilvl w:val="2"/>
+          <w:numId w:val="28"/>
+        </w:numPr>
+        <w:rPr>
+          <w:lang w:val="en-US"/>
+        </w:rPr>
+      </w:pPr>
+      <w:r>
+        <w:rPr>
+          <w:lang w:val="en-US"/>
+        </w:rPr>
+        <w:t>Reduce earned hours not ticked – Variation hours will be changed to 50 hours reduction instead of 75, as defined by maximum reducible units column</w:t>
+      </w:r>
+    </w:p>
+    <w:p>
+      <w:pPr>
+        <w:rPr>
+          <w:lang w:val="en-US"/>
+        </w:rPr>
+      </w:pPr>
+      <w:r>
+        <w:rPr>
+          <w:lang w:val="en-US"/>
+        </w:rPr>
+        <w:br w:type="page"/>
+      </w:r>
+    </w:p>
+    <w:p>
+      <w:pPr>
+        <w:rPr>
+          <w:lang w:val="en-US"/>
+        </w:rPr>
+      </w:pPr>
+      <w:r>
+        <w:rPr>
+          <w:lang w:val="en-US"/>
+        </w:rPr>
+        <w:lastRenderedPageBreak/>
+        <w:t>Cont. Change Log 8</w:t>
+      </w:r>
+      <w:r>
+        <w:rPr>
+          <w:vertAlign w:val="superscript"/>
+          <w:lang w:val="en-US"/>
+        </w:rPr>
+        <w:t>th</w:t>
+      </w:r>
+      <w:r>
+        <w:rPr>
+          <w:lang w:val="en-US"/>
+        </w:rPr>
+        <w:t xml:space="preserve"> Feb 2021</w:t>
+      </w:r>
+    </w:p>
+    <w:p>
+      <w:pPr>
+        <w:pStyle w:val="ListParagraph"/>
+        <w:numPr>
+          <w:ilvl w:val="1"/>
+          <w:numId w:val="28"/>
+        </w:numPr>
+        <w:rPr>
+          <w:lang w:val="en-US"/>
+        </w:rPr>
+      </w:pPr>
+      <w:r>
+        <w:rPr>
+          <w:lang w:val="en-US"/>
+        </w:rPr>
+        <w:t>Added ability to reduce earned units when variations are unapproved</w:t>
+      </w:r>
+    </w:p>
+    <w:p>
+      <w:pPr>
+        <w:pStyle w:val="ListParagraph"/>
+        <w:ind w:left="1440"/>
+        <w:rPr>
+          <w:lang w:val="en-US"/>
+        </w:rPr>
+      </w:pPr>
+      <w:r>
+        <w:rPr>
+          <w:noProof/>
+          <w:lang w:val="en-US"/>
+        </w:rPr>
+        <w:drawing>
+          <wp:inline distT="0" distB="0" distL="0" distR="0" wp14:anchorId="2674E29E" wp14:editId="0A9EBCC1">
+            <wp:extent cx="5730875" cy="3870325"/>
+            <wp:effectExtent l="0" t="0" r="3175" b="0"/>
+            <wp:docPr id="11" name="Picture 11"/>
+            <wp:cNvGraphicFramePr>
+              <a:graphicFrameLocks xmlns:a="http://schemas.openxmlformats.org/drawingml/2006/main" noChangeAspect="1"/>
+            </wp:cNvGraphicFramePr>
+            <a:graphic xmlns:a="http://schemas.openxmlformats.org/drawingml/2006/main">
+              <a:graphicData uri="http://schemas.openxmlformats.org/drawingml/2006/picture">
+                <pic:pic xmlns:pic="http://schemas.openxmlformats.org/drawingml/2006/picture">
+                  <pic:nvPicPr>
+                    <pic:cNvPr id="0" name="Picture 2"/>
                     <pic:cNvPicPr>
                       <a:picLocks noChangeAspect="1" noChangeArrowheads="1"/>
                     </pic:cNvPicPr>
@@ -4609,177 +4659,6 @@
     </w:p>
     <w:p>
       <w:pPr>
-        <w:ind w:left="1440"/>
-        <w:rPr>
-          <w:lang w:val="en-US"/>
-        </w:rPr>
-      </w:pPr>
-      <w:r>
-        <w:rPr>
-          <w:lang w:val="en-US"/>
-        </w:rPr>
-        <w:t>In this instance, deliverable have 100 total hours and 50 hours already earned, but variation defines a 75 hours reduction, two options are available during approval</w:t>
-      </w:r>
-    </w:p>
-    <w:p>
-      <w:pPr>
-        <w:pStyle w:val="ListParagraph"/>
-        <w:numPr>
-          <w:ilvl w:val="2"/>
-          <w:numId w:val="28"/>
-        </w:numPr>
-        <w:rPr>
-          <w:lang w:val="en-US"/>
-        </w:rPr>
-      </w:pPr>
-      <w:r>
-        <w:rPr>
-          <w:lang w:val="en-US"/>
-        </w:rPr>
-        <w:t>Reduce earned hours ticked – Earned units will be reduced to 25 so that 75 hours reduction can be applied</w:t>
-      </w:r>
-    </w:p>
-    <w:p>
-      <w:pPr>
-        <w:pStyle w:val="ListParagraph"/>
-        <w:numPr>
-          <w:ilvl w:val="2"/>
-          <w:numId w:val="28"/>
-        </w:numPr>
-        <w:rPr>
-          <w:lang w:val="en-US"/>
-        </w:rPr>
-      </w:pPr>
-      <w:r>
-        <w:rPr>
-          <w:lang w:val="en-US"/>
-        </w:rPr>
-        <w:t>Reduce earned hours not ticked – Variation hours will be changed to 50 hours reduction instead of 75, as defined by maximum reducible units column</w:t>
-      </w:r>
-    </w:p>
-    <w:p>
-      <w:pPr>
-        <w:rPr>
-          <w:lang w:val="en-US"/>
-        </w:rPr>
-      </w:pPr>
-      <w:r>
-        <w:rPr>
-          <w:lang w:val="en-US"/>
-        </w:rPr>
-        <w:br w:type="page"/>
-      </w:r>
-    </w:p>
-    <w:p>
-      <w:pPr>
-        <w:rPr>
-          <w:lang w:val="en-US"/>
-        </w:rPr>
-      </w:pPr>
-      <w:r>
-        <w:rPr>
-          <w:lang w:val="en-US"/>
-        </w:rPr>
-        <w:lastRenderedPageBreak/>
-        <w:t>Cont. Change Log 8</w:t>
-      </w:r>
-      <w:r>
-        <w:rPr>
-          <w:vertAlign w:val="superscript"/>
-          <w:lang w:val="en-US"/>
-        </w:rPr>
-        <w:t>th</w:t>
-      </w:r>
-      <w:r>
-        <w:rPr>
-          <w:lang w:val="en-US"/>
-        </w:rPr>
-        <w:t xml:space="preserve"> Feb 2021</w:t>
-      </w:r>
-    </w:p>
-    <w:p>
-      <w:pPr>
-        <w:pStyle w:val="ListParagraph"/>
-        <w:numPr>
-          <w:ilvl w:val="1"/>
-          <w:numId w:val="28"/>
-        </w:numPr>
-        <w:rPr>
-          <w:lang w:val="en-US"/>
-        </w:rPr>
-      </w:pPr>
-      <w:r>
-        <w:rPr>
-          <w:lang w:val="en-US"/>
-        </w:rPr>
-        <w:t>Added ability to reduce earned units when variations are unapproved</w:t>
-      </w:r>
-    </w:p>
-    <w:p>
-      <w:pPr>
-        <w:pStyle w:val="ListParagraph"/>
-        <w:ind w:left="1440"/>
-        <w:rPr>
-          <w:lang w:val="en-US"/>
-        </w:rPr>
-      </w:pPr>
-      <w:r>
-        <w:rPr>
-          <w:noProof/>
-          <w:lang w:val="en-US"/>
-        </w:rPr>
-        <w:drawing>
-          <wp:inline distT="0" distB="0" distL="0" distR="0" wp14:anchorId="2674E29E" wp14:editId="0A9EBCC1">
-            <wp:extent cx="5730875" cy="3870325"/>
-            <wp:effectExtent l="0" t="0" r="3175" b="0"/>
-            <wp:docPr id="11" name="Picture 11"/>
-            <wp:cNvGraphicFramePr>
-              <a:graphicFrameLocks xmlns:a="http://schemas.openxmlformats.org/drawingml/2006/main" noChangeAspect="1"/>
-            </wp:cNvGraphicFramePr>
-            <a:graphic xmlns:a="http://schemas.openxmlformats.org/drawingml/2006/main">
-              <a:graphicData uri="http://schemas.openxmlformats.org/drawingml/2006/picture">
-                <pic:pic xmlns:pic="http://schemas.openxmlformats.org/drawingml/2006/picture">
-                  <pic:nvPicPr>
-                    <pic:cNvPr id="0" name="Picture 2"/>
-                    <pic:cNvPicPr>
-                      <a:picLocks noChangeAspect="1" noChangeArrowheads="1"/>
-                    </pic:cNvPicPr>
-                  </pic:nvPicPr>
-                  <pic:blipFill>
-                    <a:blip r:embed="rId43">
-                      <a:extLst>
-                        <a:ext uri="{28A0092B-C50C-407E-A947-70E740481C1C}">
-                          <a14:useLocalDpi xmlns:a14="http://schemas.microsoft.com/office/drawing/2010/main" val="0"/>
-                        </a:ext>
-                      </a:extLst>
-                    </a:blip>
-                    <a:srcRect/>
-                    <a:stretch>
-                      <a:fillRect/>
-                    </a:stretch>
-                  </pic:blipFill>
-                  <pic:spPr bwMode="auto">
-                    <a:xfrm>
-                      <a:off x="0" y="0"/>
-                      <a:ext cx="5730875" cy="3870325"/>
-                    </a:xfrm>
-                    <a:prstGeom prst="rect">
-                      <a:avLst/>
-                    </a:prstGeom>
-                    <a:noFill/>
-                    <a:ln>
-                      <a:noFill/>
-                    </a:ln>
-                  </pic:spPr>
-                </pic:pic>
-              </a:graphicData>
-            </a:graphic>
-          </wp:inline>
-        </w:drawing>
-      </w:r>
-    </w:p>
-    <w:p>
-      <w:pPr>
         <w:pStyle w:val="ListParagraph"/>
         <w:ind w:left="1440"/>
         <w:rPr>
@@ -4931,7 +4810,7 @@
                     </pic:cNvPicPr>
                   </pic:nvPicPr>
                   <pic:blipFill>
-                    <a:blip r:embed="rId44">
+                    <a:blip r:embed="rId43">
                       <a:extLst>
                         <a:ext uri="{28A0092B-C50C-407E-A947-70E740481C1C}">
                           <a14:useLocalDpi xmlns:a14="http://schemas.microsoft.com/office/drawing/2010/main" val="0"/>
@@ -5088,7 +4967,7 @@
                     </pic:cNvPicPr>
                   </pic:nvPicPr>
                   <pic:blipFill>
-                    <a:blip r:embed="rId45">
+                    <a:blip r:embed="rId44">
                       <a:extLst>
                         <a:ext uri="{28A0092B-C50C-407E-A947-70E740481C1C}">
                           <a14:useLocalDpi xmlns:a14="http://schemas.microsoft.com/office/drawing/2010/main" val="0"/>
@@ -5187,7 +5066,7 @@
                     </pic:cNvPicPr>
                   </pic:nvPicPr>
                   <pic:blipFill>
-                    <a:blip r:embed="rId46">
+                    <a:blip r:embed="rId45">
                       <a:extLst>
                         <a:ext uri="{28A0092B-C50C-407E-A947-70E740481C1C}">
                           <a14:useLocalDpi xmlns:a14="http://schemas.microsoft.com/office/drawing/2010/main" val="0"/>
@@ -5312,7 +5191,7 @@
                     </pic:cNvPicPr>
                   </pic:nvPicPr>
                   <pic:blipFill>
-                    <a:blip r:embed="rId47" cstate="print">
+                    <a:blip r:embed="rId46" cstate="print">
                       <a:extLst>
                         <a:ext uri="{28A0092B-C50C-407E-A947-70E740481C1C}">
                           <a14:useLocalDpi xmlns:a14="http://schemas.microsoft.com/office/drawing/2010/main" val="0"/>
@@ -5375,7 +5254,7 @@
                     </pic:cNvPicPr>
                   </pic:nvPicPr>
                   <pic:blipFill>
-                    <a:blip r:embed="rId48">
+                    <a:blip r:embed="rId47">
                       <a:extLst>
                         <a:ext uri="{28A0092B-C50C-407E-A947-70E740481C1C}">
                           <a14:useLocalDpi xmlns:a14="http://schemas.microsoft.com/office/drawing/2010/main" val="0"/>
@@ -5500,7 +5379,7 @@
                     </pic:cNvPicPr>
                   </pic:nvPicPr>
                   <pic:blipFill>
-                    <a:blip r:embed="rId49">
+                    <a:blip r:embed="rId48">
                       <a:extLst>
                         <a:ext uri="{28A0092B-C50C-407E-A947-70E740481C1C}">
                           <a14:useLocalDpi xmlns:a14="http://schemas.microsoft.com/office/drawing/2010/main" val="0"/>
@@ -5600,7 +5479,7 @@
                     </pic:cNvPicPr>
                   </pic:nvPicPr>
                   <pic:blipFill>
-                    <a:blip r:embed="rId50">
+                    <a:blip r:embed="rId49">
                       <a:extLst>
                         <a:ext uri="{28A0092B-C50C-407E-A947-70E740481C1C}">
                           <a14:useLocalDpi xmlns:a14="http://schemas.microsoft.com/office/drawing/2010/main" val="0"/>
@@ -5663,7 +5542,7 @@
                     </pic:cNvPicPr>
                   </pic:nvPicPr>
                   <pic:blipFill>
-                    <a:blip r:embed="rId51">
+                    <a:blip r:embed="rId50">
                       <a:extLst>
                         <a:ext uri="{28A0092B-C50C-407E-A947-70E740481C1C}">
                           <a14:useLocalDpi xmlns:a14="http://schemas.microsoft.com/office/drawing/2010/main" val="0"/>
@@ -5881,7 +5760,7 @@
                     </pic:cNvPicPr>
                   </pic:nvPicPr>
                   <pic:blipFill>
-                    <a:blip r:embed="rId52">
+                    <a:blip r:embed="rId51">
                       <a:extLst>
                         <a:ext uri="{28A0092B-C50C-407E-A947-70E740481C1C}">
                           <a14:useLocalDpi xmlns:a14="http://schemas.microsoft.com/office/drawing/2010/main" val="0"/>
@@ -6939,7 +6818,7 @@
           <w:lang w:val="en-US"/>
         </w:rPr>
       </w:pPr>
-      <w:hyperlink r:id="rId53" w:history="1">
+      <w:hyperlink r:id="rId52" w:history="1">
         <w:r>
           <w:rPr>
             <w:rStyle w:val="Hyperlink"/>
@@ -7205,7 +7084,7 @@
           <w:lang w:val="en-US"/>
         </w:rPr>
       </w:pPr>
-      <w:hyperlink r:id="rId54" w:history="1">
+      <w:hyperlink r:id="rId53" w:history="1">
         <w:r>
           <w:rPr>
             <w:rStyle w:val="Hyperlink"/>
@@ -7285,7 +7164,7 @@
           <w:lang w:val="en-US"/>
         </w:rPr>
       </w:pPr>
-      <w:hyperlink r:id="rId55" w:history="1">
+      <w:hyperlink r:id="rId54" w:history="1">
         <w:r>
           <w:rPr>
             <w:rStyle w:val="Hyperlink"/>
@@ -8003,7 +7882,7 @@
           <w:lang w:val="en-US"/>
         </w:rPr>
       </w:pPr>
-      <w:hyperlink r:id="rId56" w:history="1">
+      <w:hyperlink r:id="rId55" w:history="1">
         <w:r>
           <w:rPr>
             <w:rStyle w:val="Hyperlink"/>
@@ -11386,118 +11265,6 @@
     </w:lvl>
   </w:abstractNum>
   <w:abstractNum w:abstractNumId="30" w15:restartNumberingAfterBreak="0">
-    <w:nsid w:val="5172593D"/>
-    <w:multiLevelType w:val="hybridMultilevel"/>
-    <w:tmpl w:val="54C692DC"/>
-    <w:lvl w:ilvl="0" w:tplc="1DC442C0">
-      <w:numFmt w:val="bullet"/>
-      <w:lvlText w:val="-"/>
-      <w:lvlJc w:val="left"/>
-      <w:pPr>
-        <w:ind w:left="720" w:hanging="360"/>
-      </w:pPr>
-      <w:rPr>
-        <w:rFonts w:ascii="Calibri" w:eastAsiaTheme="minorEastAsia" w:hAnsi="Calibri" w:cs="Calibri" w:hint="default"/>
-      </w:rPr>
-    </w:lvl>
-    <w:lvl w:ilvl="1" w:tplc="44090003" w:tentative="1">
-      <w:start w:val="1"/>
-      <w:numFmt w:val="bullet"/>
-      <w:lvlText w:val="o"/>
-      <w:lvlJc w:val="left"/>
-      <w:pPr>
-        <w:ind w:left="1440" w:hanging="360"/>
-      </w:pPr>
-      <w:rPr>
-        <w:rFonts w:ascii="Courier New" w:hAnsi="Courier New" w:cs="Courier New" w:hint="default"/>
-      </w:rPr>
-    </w:lvl>
-    <w:lvl w:ilvl="2" w:tplc="44090005" w:tentative="1">
-      <w:start w:val="1"/>
-      <w:numFmt w:val="bullet"/>
-      <w:lvlText w:val=""/>
-      <w:lvlJc w:val="left"/>
-      <w:pPr>
-        <w:ind w:left="2160" w:hanging="360"/>
-      </w:pPr>
-      <w:rPr>
-        <w:rFonts w:ascii="Wingdings" w:hAnsi="Wingdings" w:hint="default"/>
-      </w:rPr>
-    </w:lvl>
-    <w:lvl w:ilvl="3" w:tplc="44090001" w:tentative="1">
-      <w:start w:val="1"/>
-      <w:numFmt w:val="bullet"/>
-      <w:lvlText w:val=""/>
-      <w:lvlJc w:val="left"/>
-      <w:pPr>
-        <w:ind w:left="2880" w:hanging="360"/>
-      </w:pPr>
-      <w:rPr>
-        <w:rFonts w:ascii="Symbol" w:hAnsi="Symbol" w:hint="default"/>
-      </w:rPr>
-    </w:lvl>
-    <w:lvl w:ilvl="4" w:tplc="44090003" w:tentative="1">
-      <w:start w:val="1"/>
-      <w:numFmt w:val="bullet"/>
-      <w:lvlText w:val="o"/>
-      <w:lvlJc w:val="left"/>
-      <w:pPr>
-        <w:ind w:left="3600" w:hanging="360"/>
-      </w:pPr>
-      <w:rPr>
-        <w:rFonts w:ascii="Courier New" w:hAnsi="Courier New" w:cs="Courier New" w:hint="default"/>
-      </w:rPr>
-    </w:lvl>
-    <w:lvl w:ilvl="5" w:tplc="44090005" w:tentative="1">
-      <w:start w:val="1"/>
-      <w:numFmt w:val="bullet"/>
-      <w:lvlText w:val=""/>
-      <w:lvlJc w:val="left"/>
-      <w:pPr>
-        <w:ind w:left="4320" w:hanging="360"/>
-      </w:pPr>
-      <w:rPr>
-        <w:rFonts w:ascii="Wingdings" w:hAnsi="Wingdings" w:hint="default"/>
-      </w:rPr>
-    </w:lvl>
-    <w:lvl w:ilvl="6" w:tplc="44090001" w:tentative="1">
-      <w:start w:val="1"/>
-      <w:numFmt w:val="bullet"/>
-      <w:lvlText w:val=""/>
-      <w:lvlJc w:val="left"/>
-      <w:pPr>
-        <w:ind w:left="5040" w:hanging="360"/>
-      </w:pPr>
-      <w:rPr>
-        <w:rFonts w:ascii="Symbol" w:hAnsi="Symbol" w:hint="default"/>
-      </w:rPr>
-    </w:lvl>
-    <w:lvl w:ilvl="7" w:tplc="44090003" w:tentative="1">
-      <w:start w:val="1"/>
-      <w:numFmt w:val="bullet"/>
-      <w:lvlText w:val="o"/>
-      <w:lvlJc w:val="left"/>
-      <w:pPr>
-        <w:ind w:left="5760" w:hanging="360"/>
-      </w:pPr>
-      <w:rPr>
-        <w:rFonts w:ascii="Courier New" w:hAnsi="Courier New" w:cs="Courier New" w:hint="default"/>
-      </w:rPr>
-    </w:lvl>
-    <w:lvl w:ilvl="8" w:tplc="44090005" w:tentative="1">
-      <w:start w:val="1"/>
-      <w:numFmt w:val="bullet"/>
-      <w:lvlText w:val=""/>
-      <w:lvlJc w:val="left"/>
-      <w:pPr>
-        <w:ind w:left="6480" w:hanging="360"/>
-      </w:pPr>
-      <w:rPr>
-        <w:rFonts w:ascii="Wingdings" w:hAnsi="Wingdings" w:hint="default"/>
-      </w:rPr>
-    </w:lvl>
-  </w:abstractNum>
-  <w:abstractNum w:abstractNumId="31" w15:restartNumberingAfterBreak="0">
     <w:nsid w:val="52606647"/>
     <w:multiLevelType w:val="hybridMultilevel"/>
     <w:tmpl w:val="34FAD1A0"/>
@@ -11609,7 +11376,7 @@
       </w:rPr>
     </w:lvl>
   </w:abstractNum>
-  <w:abstractNum w:abstractNumId="32" w15:restartNumberingAfterBreak="0">
+  <w:abstractNum w:abstractNumId="31" w15:restartNumberingAfterBreak="0">
     <w:nsid w:val="557D5C95"/>
     <w:multiLevelType w:val="hybridMultilevel"/>
     <w:tmpl w:val="DC122E1C"/>
@@ -11721,7 +11488,7 @@
       </w:rPr>
     </w:lvl>
   </w:abstractNum>
-  <w:abstractNum w:abstractNumId="33" w15:restartNumberingAfterBreak="0">
+  <w:abstractNum w:abstractNumId="32" w15:restartNumberingAfterBreak="0">
     <w:nsid w:val="589D37B7"/>
     <w:multiLevelType w:val="hybridMultilevel"/>
     <w:tmpl w:val="9262429A"/>
@@ -11833,7 +11600,7 @@
       </w:rPr>
     </w:lvl>
   </w:abstractNum>
-  <w:abstractNum w:abstractNumId="34" w15:restartNumberingAfterBreak="0">
+  <w:abstractNum w:abstractNumId="33" w15:restartNumberingAfterBreak="0">
     <w:nsid w:val="58AA443D"/>
     <w:multiLevelType w:val="hybridMultilevel"/>
     <w:tmpl w:val="56F0D18E"/>
@@ -11946,7 +11713,7 @@
       </w:rPr>
     </w:lvl>
   </w:abstractNum>
-  <w:abstractNum w:abstractNumId="35" w15:restartNumberingAfterBreak="0">
+  <w:abstractNum w:abstractNumId="34" w15:restartNumberingAfterBreak="0">
     <w:nsid w:val="59EE4063"/>
     <w:multiLevelType w:val="hybridMultilevel"/>
     <w:tmpl w:val="0482313C"/>
@@ -12058,7 +11825,7 @@
       </w:rPr>
     </w:lvl>
   </w:abstractNum>
-  <w:abstractNum w:abstractNumId="36" w15:restartNumberingAfterBreak="0">
+  <w:abstractNum w:abstractNumId="35" w15:restartNumberingAfterBreak="0">
     <w:nsid w:val="5B4B0EE2"/>
     <w:multiLevelType w:val="hybridMultilevel"/>
     <w:tmpl w:val="E8129FD8"/>
@@ -12170,7 +11937,7 @@
       </w:rPr>
     </w:lvl>
   </w:abstractNum>
-  <w:abstractNum w:abstractNumId="37" w15:restartNumberingAfterBreak="0">
+  <w:abstractNum w:abstractNumId="36" w15:restartNumberingAfterBreak="0">
     <w:nsid w:val="5BF34BEE"/>
     <w:multiLevelType w:val="hybridMultilevel"/>
     <w:tmpl w:val="1D48A376"/>
@@ -12282,7 +12049,7 @@
       </w:rPr>
     </w:lvl>
   </w:abstractNum>
-  <w:abstractNum w:abstractNumId="38" w15:restartNumberingAfterBreak="0">
+  <w:abstractNum w:abstractNumId="37" w15:restartNumberingAfterBreak="0">
     <w:nsid w:val="5C8347BF"/>
     <w:multiLevelType w:val="hybridMultilevel"/>
     <w:tmpl w:val="D2F46B88"/>
@@ -12394,7 +12161,7 @@
       </w:rPr>
     </w:lvl>
   </w:abstractNum>
-  <w:abstractNum w:abstractNumId="39" w15:restartNumberingAfterBreak="0">
+  <w:abstractNum w:abstractNumId="38" w15:restartNumberingAfterBreak="0">
     <w:nsid w:val="61693A7A"/>
     <w:multiLevelType w:val="hybridMultilevel"/>
     <w:tmpl w:val="580AF2C6"/>
@@ -12507,7 +12274,7 @@
       </w:rPr>
     </w:lvl>
   </w:abstractNum>
-  <w:abstractNum w:abstractNumId="40" w15:restartNumberingAfterBreak="0">
+  <w:abstractNum w:abstractNumId="39" w15:restartNumberingAfterBreak="0">
     <w:nsid w:val="63C54BFA"/>
     <w:multiLevelType w:val="hybridMultilevel"/>
     <w:tmpl w:val="8122740C"/>
@@ -12619,7 +12386,7 @@
       </w:rPr>
     </w:lvl>
   </w:abstractNum>
-  <w:abstractNum w:abstractNumId="41" w15:restartNumberingAfterBreak="0">
+  <w:abstractNum w:abstractNumId="40" w15:restartNumberingAfterBreak="0">
     <w:nsid w:val="68735AD0"/>
     <w:multiLevelType w:val="hybridMultilevel"/>
     <w:tmpl w:val="4EDE05FA"/>
@@ -12731,7 +12498,7 @@
       </w:rPr>
     </w:lvl>
   </w:abstractNum>
-  <w:abstractNum w:abstractNumId="42" w15:restartNumberingAfterBreak="0">
+  <w:abstractNum w:abstractNumId="41" w15:restartNumberingAfterBreak="0">
     <w:nsid w:val="6A047A76"/>
     <w:multiLevelType w:val="hybridMultilevel"/>
     <w:tmpl w:val="50CADEB2"/>
@@ -12843,7 +12610,7 @@
       </w:rPr>
     </w:lvl>
   </w:abstractNum>
-  <w:abstractNum w:abstractNumId="43" w15:restartNumberingAfterBreak="0">
+  <w:abstractNum w:abstractNumId="42" w15:restartNumberingAfterBreak="0">
     <w:nsid w:val="6A3A0B6E"/>
     <w:multiLevelType w:val="hybridMultilevel"/>
     <w:tmpl w:val="759C482E"/>
@@ -12955,7 +12722,7 @@
       </w:rPr>
     </w:lvl>
   </w:abstractNum>
-  <w:abstractNum w:abstractNumId="44" w15:restartNumberingAfterBreak="0">
+  <w:abstractNum w:abstractNumId="43" w15:restartNumberingAfterBreak="0">
     <w:nsid w:val="6AC268F7"/>
     <w:multiLevelType w:val="hybridMultilevel"/>
     <w:tmpl w:val="12F21194"/>
@@ -13067,7 +12834,7 @@
       </w:rPr>
     </w:lvl>
   </w:abstractNum>
-  <w:abstractNum w:abstractNumId="45" w15:restartNumberingAfterBreak="0">
+  <w:abstractNum w:abstractNumId="44" w15:restartNumberingAfterBreak="0">
     <w:nsid w:val="6CE7392E"/>
     <w:multiLevelType w:val="hybridMultilevel"/>
     <w:tmpl w:val="2E2C9BDE"/>
@@ -13179,7 +12946,7 @@
       </w:rPr>
     </w:lvl>
   </w:abstractNum>
-  <w:abstractNum w:abstractNumId="46" w15:restartNumberingAfterBreak="0">
+  <w:abstractNum w:abstractNumId="45" w15:restartNumberingAfterBreak="0">
     <w:nsid w:val="6E3F3F9F"/>
     <w:multiLevelType w:val="hybridMultilevel"/>
     <w:tmpl w:val="A13CFC48"/>
@@ -13291,7 +13058,7 @@
       </w:rPr>
     </w:lvl>
   </w:abstractNum>
-  <w:abstractNum w:abstractNumId="47" w15:restartNumberingAfterBreak="0">
+  <w:abstractNum w:abstractNumId="46" w15:restartNumberingAfterBreak="0">
     <w:nsid w:val="74A1190D"/>
     <w:multiLevelType w:val="hybridMultilevel"/>
     <w:tmpl w:val="D5387ACA"/>
@@ -13403,7 +13170,7 @@
       </w:rPr>
     </w:lvl>
   </w:abstractNum>
-  <w:abstractNum w:abstractNumId="48" w15:restartNumberingAfterBreak="0">
+  <w:abstractNum w:abstractNumId="47" w15:restartNumberingAfterBreak="0">
     <w:nsid w:val="7E7D5380"/>
     <w:multiLevelType w:val="hybridMultilevel"/>
     <w:tmpl w:val="7668ED14"/>
@@ -13515,7 +13282,7 @@
       </w:rPr>
     </w:lvl>
   </w:abstractNum>
-  <w:abstractNum w:abstractNumId="49" w15:restartNumberingAfterBreak="0">
+  <w:abstractNum w:abstractNumId="48" w15:restartNumberingAfterBreak="0">
     <w:nsid w:val="7EAA14ED"/>
     <w:multiLevelType w:val="hybridMultilevel"/>
     <w:tmpl w:val="AF783BA4"/>
@@ -13627,7 +13394,7 @@
       </w:rPr>
     </w:lvl>
   </w:abstractNum>
-  <w:abstractNum w:abstractNumId="50" w15:restartNumberingAfterBreak="0">
+  <w:abstractNum w:abstractNumId="49" w15:restartNumberingAfterBreak="0">
     <w:nsid w:val="7FD565FA"/>
     <w:multiLevelType w:val="hybridMultilevel"/>
     <w:tmpl w:val="E5906ACC"/>
@@ -13739,158 +13506,155 @@
       </w:rPr>
     </w:lvl>
   </w:abstractNum>
-  <w:num w:numId="1" w16cid:durableId="2065525182">
+  <w:num w:numId="1">
     <w:abstractNumId w:val="4"/>
   </w:num>
-  <w:num w:numId="2" w16cid:durableId="1214587089">
+  <w:num w:numId="2">
+    <w:abstractNumId w:val="37"/>
+  </w:num>
+  <w:num w:numId="3">
+    <w:abstractNumId w:val="32"/>
+  </w:num>
+  <w:num w:numId="4">
+    <w:abstractNumId w:val="30"/>
+  </w:num>
+  <w:num w:numId="5">
+    <w:abstractNumId w:val="16"/>
+  </w:num>
+  <w:num w:numId="6">
+    <w:abstractNumId w:val="31"/>
+  </w:num>
+  <w:num w:numId="7">
+    <w:abstractNumId w:val="33"/>
+  </w:num>
+  <w:num w:numId="8">
+    <w:abstractNumId w:val="43"/>
+  </w:num>
+  <w:num w:numId="9">
+    <w:abstractNumId w:val="13"/>
+  </w:num>
+  <w:num w:numId="10">
+    <w:abstractNumId w:val="18"/>
+  </w:num>
+  <w:num w:numId="11">
+    <w:abstractNumId w:val="9"/>
+  </w:num>
+  <w:num w:numId="12">
+    <w:abstractNumId w:val="7"/>
+  </w:num>
+  <w:num w:numId="13">
+    <w:abstractNumId w:val="3"/>
+  </w:num>
+  <w:num w:numId="14">
+    <w:abstractNumId w:val="41"/>
+  </w:num>
+  <w:num w:numId="15">
+    <w:abstractNumId w:val="44"/>
+  </w:num>
+  <w:num w:numId="16">
+    <w:abstractNumId w:val="11"/>
+  </w:num>
+  <w:num w:numId="17">
+    <w:abstractNumId w:val="0"/>
+  </w:num>
+  <w:num w:numId="18">
+    <w:abstractNumId w:val="6"/>
+  </w:num>
+  <w:num w:numId="19">
+    <w:abstractNumId w:val="35"/>
+  </w:num>
+  <w:num w:numId="20">
+    <w:abstractNumId w:val="29"/>
+  </w:num>
+  <w:num w:numId="21">
+    <w:abstractNumId w:val="14"/>
+  </w:num>
+  <w:num w:numId="22">
+    <w:abstractNumId w:val="10"/>
+  </w:num>
+  <w:num w:numId="23">
+    <w:abstractNumId w:val="20"/>
+  </w:num>
+  <w:num w:numId="24">
+    <w:abstractNumId w:val="42"/>
+  </w:num>
+  <w:num w:numId="25">
+    <w:abstractNumId w:val="45"/>
+  </w:num>
+  <w:num w:numId="26">
+    <w:abstractNumId w:val="23"/>
+  </w:num>
+  <w:num w:numId="27">
+    <w:abstractNumId w:val="25"/>
+  </w:num>
+  <w:num w:numId="28">
+    <w:abstractNumId w:val="47"/>
+  </w:num>
+  <w:num w:numId="29">
     <w:abstractNumId w:val="38"/>
   </w:num>
-  <w:num w:numId="3" w16cid:durableId="1187982406">
-    <w:abstractNumId w:val="33"/>
+  <w:num w:numId="30">
+    <w:abstractNumId w:val="5"/>
   </w:num>
-  <w:num w:numId="4" w16cid:durableId="1484008219">
-    <w:abstractNumId w:val="31"/>
+  <w:num w:numId="31">
+    <w:abstractNumId w:val="24"/>
   </w:num>
-  <w:num w:numId="5" w16cid:durableId="821894591">
-    <w:abstractNumId w:val="16"/>
+  <w:num w:numId="32">
+    <w:abstractNumId w:val="17"/>
   </w:num>
-  <w:num w:numId="6" w16cid:durableId="1127045157">
-    <w:abstractNumId w:val="32"/>
+  <w:num w:numId="33">
+    <w:abstractNumId w:val="39"/>
   </w:num>
-  <w:num w:numId="7" w16cid:durableId="140923916">
+  <w:num w:numId="34">
+    <w:abstractNumId w:val="36"/>
+  </w:num>
+  <w:num w:numId="35">
+    <w:abstractNumId w:val="48"/>
+  </w:num>
+  <w:num w:numId="36">
+    <w:abstractNumId w:val="26"/>
+  </w:num>
+  <w:num w:numId="37">
+    <w:abstractNumId w:val="46"/>
+  </w:num>
+  <w:num w:numId="38">
+    <w:abstractNumId w:val="49"/>
+  </w:num>
+  <w:num w:numId="39">
+    <w:abstractNumId w:val="19"/>
+  </w:num>
+  <w:num w:numId="40">
+    <w:abstractNumId w:val="2"/>
+  </w:num>
+  <w:num w:numId="41">
     <w:abstractNumId w:val="34"/>
   </w:num>
-  <w:num w:numId="8" w16cid:durableId="904072471">
-    <w:abstractNumId w:val="44"/>
+  <w:num w:numId="42">
+    <w:abstractNumId w:val="22"/>
   </w:num>
-  <w:num w:numId="9" w16cid:durableId="1138299621">
-    <w:abstractNumId w:val="13"/>
+  <w:num w:numId="43">
+    <w:abstractNumId w:val="28"/>
   </w:num>
-  <w:num w:numId="10" w16cid:durableId="1161702919">
-    <w:abstractNumId w:val="18"/>
+  <w:num w:numId="44">
+    <w:abstractNumId w:val="8"/>
   </w:num>
-  <w:num w:numId="11" w16cid:durableId="1755397653">
-    <w:abstractNumId w:val="9"/>
-  </w:num>
-  <w:num w:numId="12" w16cid:durableId="62722672">
-    <w:abstractNumId w:val="7"/>
-  </w:num>
-  <w:num w:numId="13" w16cid:durableId="4552283">
-    <w:abstractNumId w:val="3"/>
-  </w:num>
-  <w:num w:numId="14" w16cid:durableId="140540776">
-    <w:abstractNumId w:val="42"/>
-  </w:num>
-  <w:num w:numId="15" w16cid:durableId="1136294007">
-    <w:abstractNumId w:val="45"/>
-  </w:num>
-  <w:num w:numId="16" w16cid:durableId="225802216">
-    <w:abstractNumId w:val="11"/>
-  </w:num>
-  <w:num w:numId="17" w16cid:durableId="313412663">
-    <w:abstractNumId w:val="0"/>
-  </w:num>
-  <w:num w:numId="18" w16cid:durableId="1232960799">
-    <w:abstractNumId w:val="6"/>
-  </w:num>
-  <w:num w:numId="19" w16cid:durableId="314800888">
-    <w:abstractNumId w:val="36"/>
-  </w:num>
-  <w:num w:numId="20" w16cid:durableId="131557165">
-    <w:abstractNumId w:val="29"/>
-  </w:num>
-  <w:num w:numId="21" w16cid:durableId="1251617534">
-    <w:abstractNumId w:val="14"/>
-  </w:num>
-  <w:num w:numId="22" w16cid:durableId="1286502441">
-    <w:abstractNumId w:val="10"/>
-  </w:num>
-  <w:num w:numId="23" w16cid:durableId="337587092">
-    <w:abstractNumId w:val="20"/>
-  </w:num>
-  <w:num w:numId="24" w16cid:durableId="1395472260">
-    <w:abstractNumId w:val="43"/>
-  </w:num>
-  <w:num w:numId="25" w16cid:durableId="119689676">
-    <w:abstractNumId w:val="46"/>
-  </w:num>
-  <w:num w:numId="26" w16cid:durableId="1053193271">
-    <w:abstractNumId w:val="23"/>
-  </w:num>
-  <w:num w:numId="27" w16cid:durableId="1465998411">
-    <w:abstractNumId w:val="25"/>
-  </w:num>
-  <w:num w:numId="28" w16cid:durableId="1905949706">
-    <w:abstractNumId w:val="48"/>
-  </w:num>
-  <w:num w:numId="29" w16cid:durableId="1532962544">
-    <w:abstractNumId w:val="39"/>
-  </w:num>
-  <w:num w:numId="30" w16cid:durableId="615647766">
-    <w:abstractNumId w:val="5"/>
-  </w:num>
-  <w:num w:numId="31" w16cid:durableId="625937958">
-    <w:abstractNumId w:val="24"/>
-  </w:num>
-  <w:num w:numId="32" w16cid:durableId="913978576">
-    <w:abstractNumId w:val="17"/>
-  </w:num>
-  <w:num w:numId="33" w16cid:durableId="326784986">
+  <w:num w:numId="45">
     <w:abstractNumId w:val="40"/>
   </w:num>
-  <w:num w:numId="34" w16cid:durableId="875772441">
-    <w:abstractNumId w:val="37"/>
-  </w:num>
-  <w:num w:numId="35" w16cid:durableId="84083948">
-    <w:abstractNumId w:val="49"/>
-  </w:num>
-  <w:num w:numId="36" w16cid:durableId="852763910">
-    <w:abstractNumId w:val="26"/>
-  </w:num>
-  <w:num w:numId="37" w16cid:durableId="74910426">
-    <w:abstractNumId w:val="47"/>
-  </w:num>
-  <w:num w:numId="38" w16cid:durableId="565603567">
-    <w:abstractNumId w:val="50"/>
-  </w:num>
-  <w:num w:numId="39" w16cid:durableId="1006638275">
-    <w:abstractNumId w:val="19"/>
-  </w:num>
-  <w:num w:numId="40" w16cid:durableId="1974749760">
-    <w:abstractNumId w:val="2"/>
-  </w:num>
-  <w:num w:numId="41" w16cid:durableId="109319442">
-    <w:abstractNumId w:val="35"/>
-  </w:num>
-  <w:num w:numId="42" w16cid:durableId="621032675">
-    <w:abstractNumId w:val="22"/>
-  </w:num>
-  <w:num w:numId="43" w16cid:durableId="1824344854">
-    <w:abstractNumId w:val="28"/>
-  </w:num>
-  <w:num w:numId="44" w16cid:durableId="170265096">
-    <w:abstractNumId w:val="8"/>
-  </w:num>
-  <w:num w:numId="45" w16cid:durableId="68770248">
-    <w:abstractNumId w:val="41"/>
-  </w:num>
-  <w:num w:numId="46" w16cid:durableId="1044478388">
+  <w:num w:numId="46">
     <w:abstractNumId w:val="12"/>
   </w:num>
-  <w:num w:numId="47" w16cid:durableId="1855344781">
+  <w:num w:numId="47">
     <w:abstractNumId w:val="15"/>
   </w:num>
-  <w:num w:numId="48" w16cid:durableId="34040034">
+  <w:num w:numId="48">
     <w:abstractNumId w:val="27"/>
   </w:num>
-  <w:num w:numId="49" w16cid:durableId="2006011155">
+  <w:num w:numId="49">
     <w:abstractNumId w:val="21"/>
   </w:num>
-  <w:num w:numId="50" w16cid:durableId="1636371975">
+  <w:num w:numId="50">
     <w:abstractNumId w:val="1"/>
-  </w:num>
-  <w:num w:numId="51" w16cid:durableId="242029061">
-    <w:abstractNumId w:val="30"/>
   </w:num>
   <w:numIdMacAtCleanup w:val="42"/>
 </w:numbering>

</xml_diff>